<commit_message>
vault backup: 2026-10-25 15:41:30
Affected files:
.obsidian/plugins/word-reader/data.json
docs/pdr-2027-165.docx
</commit_message>
<xml_diff>
--- a/docs/pdr-2027-165.docx
+++ b/docs/pdr-2027-165.docx
@@ -1527,7 +1527,7 @@
           <w:szCs w:val="22"/>
           <w:rtl w:val="1"/>
         </w:rPr>
-        <w:t xml:space="preserve"> בכוורן, המוזנת מפאנל סולארי, מזהה בריחת נחיל וחריגות המעידות על מצוקת המושבה, ומעבירה נתונים והתרעות דרך מודם סלולרי לממשק </w:t>
+        <w:t xml:space="preserve"> בכוורן, המוזנת מפאנל סולארי, מזהה סימנים לנחילה מתקרבת וחריגות המעידות על מצוקת המושבה, ומעבירה נתונים והתרעות דרך מודם סלולרי לממשק </w:t>
       </w:r>
       <w:r>
         <w:rPr>
@@ -1657,7 +1657,7 @@
           <w:szCs w:val="22"/>
           <w:rtl w:val="1"/>
         </w:rPr>
-        <w:t xml:space="preserve">) בזיהוי אירועי נחילה ואירועים מבוקרים (יעד: מעל </w:t>
+        <w:t xml:space="preserve">) בהתרעה על נחילה לפני היציאה (יעד: מעל </w:t>
       </w:r>
       <w:r>
         <w:rPr>
@@ -1683,7 +1683,7 @@
           <w:szCs w:val="22"/>
           <w:rtl w:val="1"/>
         </w:rPr>
-        <w:t xml:space="preserve">). חיזוי הנחילה בימים שלפני יציאת הנחיל, כלומר בשלב ההכנה, ואבחון מחלות ספציפיות ייבחנו כמחקר משלים, אך אינם יעדים מחייבים; היעד המחייב הוא זיהוי יציאת הנחיל ברגע שהיא מתרחשת.</w:t>
+        <w:t xml:space="preserve">). היעד המחייב הוא זיהוי הנחילה לפני יציאת הנחיל והתרעה למגדל; כמה זמן מראש ניתן להתריע הוא שאלת המחקר של הפרויקט. אבחון מחלות ספציפיות ייבחן כמחקר משלים ואינו יעד מחייב.</w:t>
       </w:r>
     </w:p>
     <w:p>
@@ -2013,7 +2013,7 @@
           <w:szCs w:val="22"/>
           <w:rtl w:val="0"/>
         </w:rPr>
-        <w:t xml:space="preserve">Honeybees are essential crop pollinators, yet colonies are still checked mainly by opening the hive every week or two, and between visits the beekeeper does not know what happens inside. Swarm preparation takes one to two weeks, and the swarm itself, which takes a large part of the colony away, leaves within minutes and is often discovered only at the next visit. BeeSense is an Internet of Things (IoT) system for continuous monitoring of hives at apiaries without mains power or network. Each hive carries a battery-powered ESP32-C3 node. A piezoelectric vibration sensor embedded in the central comb listens continuously at nanoampere current and wakes the node when vibration rises above the background; on every wake-up, and periodically every 15 minutes, the node records the piezo and a MEMS microphone, computes their spectra between 50 and 800 Hz, and fuses them with hive weight from four load cells and with temperature. A compact summary is sent over ESP-NOW to a solar-powered ESP32-S3 hub at the apiary, which detects swarm departures and anomalies that indicate colony distress, and forwards data and alerts over a cellular modem to a web dashboard. The innovation is an autonomous, low-cost system that brings a laboratory-proven capability to the field: event-driven wake-up, on-board spectral processing and fusion of vibration with weight, on battery, at thousands of times less power than research systems. We will evaluate the system at a working apiary through the spring swarming season and measure weighing accuracy (target: ±20 g), packet delivery ratio (target: above 95%), battery life (target: at least six months), and event-level precision and recall for swarms and controlled events (target: above 90%). Predicting a swarm during the days of preparation before it leaves, and diagnosing specific diseases, will be studied as complementary research but are not committed targets; the committed target is detecting the swarm departure as it happens.</w:t>
+        <w:t xml:space="preserve">Honeybees are essential crop pollinators, yet colonies are still checked mainly by opening the hive every week or two, and between visits the beekeeper does not know what happens inside. Swarm preparation takes one to two weeks, and the swarm itself, which takes a large part of the colony away, leaves within minutes and is often discovered only at the next visit. BeeSense is an Internet of Things (IoT) system for continuous monitoring of hives at apiaries without mains power or network. Each hive carries a battery-powered ESP32-C3 node. A piezoelectric vibration sensor embedded in the central comb listens continuously at nanoampere current and wakes the node when vibration rises above the background; on every wake-up, and periodically every 15 minutes, the node records the piezo and a MEMS microphone, computes their spectra between 50 and 800 Hz, and fuses them with hive weight from four load cells and with temperature. A compact summary is sent over ESP-NOW to a solar-powered ESP32-S3 hub at the apiary, which detects signs of an approaching swarm and anomalies that indicate colony distress, and forwards data and alerts over a cellular modem to a web dashboard. The innovation is an autonomous, low-cost system that brings a laboratory-proven capability to the field: event-driven wake-up, on-board spectral processing and fusion of vibration with weight, on battery, at thousands of times less power than research systems. We will evaluate the system at a working apiary through the spring swarming season and measure weighing accuracy (target: ±20 g), packet delivery ratio (target: above 95%), battery life (target: at least six months), and precision and recall of swarm alerts issued before departure (target: above 90%). The committed target is detecting swarming before the swarm leaves and alerting the beekeeper; how long in advance this is possible is the research question of the project. Diagnosis of specific diseases is complementary research, not a committed target.</w:t>
       </w:r>
     </w:p>
     <w:p>
@@ -2153,7 +2153,7 @@
           <w:szCs w:val="22"/>
           <w:rtl w:val="0"/>
         </w:rPr>
-        <w:t xml:space="preserve">Honeybee colonies are inspected mostly by opening the hive every one to two weeks; inspections disturb the colony, cost labour, and leave the beekeeper blind between visits. Precision beekeeping, i.e. monitoring colonies with sensors so that interventions are based on data, was proposed to close this gap [1]. Swarming is the costliest blind spot: the colony rears new queens for one to two weeks, the prime swarm leaves with the old queen once the queen cells are capped, clusters nearby for a few hours, and is then lost. Hive vibrations change measurably before swarming [2], [3], and continuous hive weight reveals foraging, consumption and swarm departures [4]. Initial use case: a beekeeper with many hives standing close together at a remote apiary without mains power or Wi-Fi, visiting weekly. The system must alert when a swarm leaves or a colony behaves abnormally, and show which hives need a visit first. Applications: commercial and hobby apiaries, pollination services, and research apiaries that need long continuous records.</w:t>
+        <w:t xml:space="preserve">Honeybee colonies are inspected mostly by opening the hive every one to two weeks; inspections disturb the colony, cost labour, and leave the beekeeper blind between visits. Precision beekeeping, i.e. monitoring colonies with sensors so that interventions are based on data, was proposed to close this gap [1]. Swarming is the costliest blind spot: the colony rears new queens for one to two weeks, the prime swarm leaves with the old queen once the queen cells are capped, clusters nearby for a few hours, and is then lost. Hive vibrations change measurably before swarming [2], [3], and continuous hive weight reveals foraging, consumption and swarm departures [4]. Initial use case: a beekeeper with many hives standing close together at a remote apiary without mains power or Wi-Fi, visiting weekly. The system must alert before a swarm leaves or a colony behaves abnormally, and show which hives need a visit first. Applications: commercial and hobby apiaries, pollination services, and research apiaries that need long continuous records.</w:t>
       </w:r>
     </w:p>
     <w:p>
@@ -2296,7 +2296,7 @@
           <w:szCs w:val="22"/>
           <w:rtl w:val="0"/>
         </w:rPr>
-        <w:t xml:space="preserve">(3) detection of swarm departures and colony anomalies with alerts, and an exploratory study of swarm-preparation indicators.</w:t>
+        <w:t xml:space="preserve">(3) alerts on approaching swarms before the swarm leaves, with the achievable lead time as the research question, and detection of colony anomalies.</w:t>
       </w:r>
     </w:p>
     <w:p>
@@ -4203,7 +4203,7 @@
           <w:szCs w:val="22"/>
           <w:rtl w:val="0"/>
         </w:rPr>
-        <w:t xml:space="preserve">| &gt; 3 for three consecutive reports. A swarm departure is declared when Δ</w:t>
+        <w:t xml:space="preserve">| &gt; 3 for three consecutive reports. A </w:t>
       </w:r>
       <w:r>
         <w:rPr>
@@ -4216,20 +4216,20 @@
           <w:szCs w:val="22"/>
           <w:rtl w:val="0"/>
         </w:rPr>
-        <w:t xml:space="preserve">W</w:t>
-      </w:r>
-      <w:r>
-        <w:rPr>
-          <w:rFonts w:ascii="Times New Roman" w:cs="Times New Roman" w:eastAsia="Times New Roman" w:hAnsi="Times New Roman"/>
-          <w:b w:val="0"/>
-          <w:bCs w:val="0"/>
-          <w:i w:val="0"/>
-          <w:iCs w:val="0"/>
-          <w:sz w:val="22"/>
-          <w:szCs w:val="22"/>
-          <w:rtl w:val="0"/>
-        </w:rPr>
-        <w:t xml:space="preserve"> &lt; −</w:t>
+        <w:t xml:space="preserve">pre-swarm alert</w:t>
+      </w:r>
+      <w:r>
+        <w:rPr>
+          <w:rFonts w:ascii="Times New Roman" w:cs="Times New Roman" w:eastAsia="Times New Roman" w:hAnsi="Times New Roman"/>
+          <w:b w:val="0"/>
+          <w:bCs w:val="0"/>
+          <w:i w:val="0"/>
+          <w:iCs w:val="0"/>
+          <w:sz w:val="22"/>
+          <w:szCs w:val="22"/>
+          <w:rtl w:val="0"/>
+        </w:rPr>
+        <w:t xml:space="preserve"> is raised when the band energies in the swarming band (≈100–300 Hz [2]) and the in-hive temperature rise persistently above the hive's own baseline, as reported before swarming in [2]; spectral trends as in [3] are added to extend the warning. A </w:t>
       </w:r>
       <w:r>
         <w:rPr>
@@ -4242,7 +4242,20 @@
           <w:szCs w:val="22"/>
           <w:rtl w:val="0"/>
         </w:rPr>
-        <w:t xml:space="preserve">W</w:t>
+        <w:t xml:space="preserve">departure</w:t>
+      </w:r>
+      <w:r>
+        <w:rPr>
+          <w:rFonts w:ascii="Times New Roman" w:cs="Times New Roman" w:eastAsia="Times New Roman" w:hAnsi="Times New Roman"/>
+          <w:b w:val="0"/>
+          <w:bCs w:val="0"/>
+          <w:i w:val="0"/>
+          <w:iCs w:val="0"/>
+          <w:sz w:val="22"/>
+          <w:szCs w:val="22"/>
+          <w:rtl w:val="0"/>
+        </w:rPr>
+        <w:t xml:space="preserve"> is confirmed when Δ</w:t>
       </w:r>
       <w:r>
         <w:rPr>
@@ -4253,23 +4266,22 @@
           <w:iCs w:val="1"/>
           <w:sz w:val="22"/>
           <w:szCs w:val="22"/>
-          <w:vertAlign w:val="subscript"/>
-          <w:rtl w:val="0"/>
-        </w:rPr>
-        <w:t xml:space="preserve">th</w:t>
-      </w:r>
-      <w:r>
-        <w:rPr>
-          <w:rFonts w:ascii="Times New Roman" w:cs="Times New Roman" w:eastAsia="Times New Roman" w:hAnsi="Times New Roman"/>
-          <w:b w:val="0"/>
-          <w:bCs w:val="0"/>
-          <w:i w:val="0"/>
-          <w:iCs w:val="0"/>
-          <w:sz w:val="22"/>
-          <w:szCs w:val="22"/>
-          <w:rtl w:val="0"/>
-        </w:rPr>
-        <w:t xml:space="preserve"> within </w:t>
+          <w:rtl w:val="0"/>
+        </w:rPr>
+        <w:t xml:space="preserve">W</w:t>
+      </w:r>
+      <w:r>
+        <w:rPr>
+          <w:rFonts w:ascii="Times New Roman" w:cs="Times New Roman" w:eastAsia="Times New Roman" w:hAnsi="Times New Roman"/>
+          <w:b w:val="0"/>
+          <w:bCs w:val="0"/>
+          <w:i w:val="0"/>
+          <w:iCs w:val="0"/>
+          <w:sz w:val="22"/>
+          <w:szCs w:val="22"/>
+          <w:rtl w:val="0"/>
+        </w:rPr>
+        <w:t xml:space="preserve"> &lt; −</w:t>
       </w:r>
       <w:r>
         <w:rPr>
@@ -4282,20 +4294,7 @@
           <w:szCs w:val="22"/>
           <w:rtl w:val="0"/>
         </w:rPr>
-        <w:t xml:space="preserve">τ</w:t>
-      </w:r>
-      <w:r>
-        <w:rPr>
-          <w:rFonts w:ascii="Times New Roman" w:cs="Times New Roman" w:eastAsia="Times New Roman" w:hAnsi="Times New Roman"/>
-          <w:b w:val="0"/>
-          <w:bCs w:val="0"/>
-          <w:i w:val="0"/>
-          <w:iCs w:val="0"/>
-          <w:sz w:val="22"/>
-          <w:szCs w:val="22"/>
-          <w:rtl w:val="0"/>
-        </w:rPr>
-        <w:t xml:space="preserve"> = 30 min in daytime, together with an event wake or vibration-power anomaly. A prime swarm carries roughly 10,000–20,000 bees, about 1–2 kg at ≈0.1 g per bee, so </w:t>
+        <w:t xml:space="preserve">W</w:t>
       </w:r>
       <w:r>
         <w:rPr>
@@ -4306,9 +4305,23 @@
           <w:iCs w:val="1"/>
           <w:sz w:val="22"/>
           <w:szCs w:val="22"/>
-          <w:rtl w:val="0"/>
-        </w:rPr>
-        <w:t xml:space="preserve">W</w:t>
+          <w:vertAlign w:val="subscript"/>
+          <w:rtl w:val="0"/>
+        </w:rPr>
+        <w:t xml:space="preserve">th</w:t>
+      </w:r>
+      <w:r>
+        <w:rPr>
+          <w:rFonts w:ascii="Times New Roman" w:cs="Times New Roman" w:eastAsia="Times New Roman" w:hAnsi="Times New Roman"/>
+          <w:b w:val="0"/>
+          <w:bCs w:val="0"/>
+          <w:i w:val="0"/>
+          <w:iCs w:val="0"/>
+          <w:sz w:val="22"/>
+          <w:szCs w:val="22"/>
+          <w:rtl w:val="0"/>
+        </w:rPr>
+        <w:t xml:space="preserve"> within </w:t>
       </w:r>
       <w:r>
         <w:rPr>
@@ -4319,6 +4332,45 @@
           <w:iCs w:val="1"/>
           <w:sz w:val="22"/>
           <w:szCs w:val="22"/>
+          <w:rtl w:val="0"/>
+        </w:rPr>
+        <w:t xml:space="preserve">τ</w:t>
+      </w:r>
+      <w:r>
+        <w:rPr>
+          <w:rFonts w:ascii="Times New Roman" w:cs="Times New Roman" w:eastAsia="Times New Roman" w:hAnsi="Times New Roman"/>
+          <w:b w:val="0"/>
+          <w:bCs w:val="0"/>
+          <w:i w:val="0"/>
+          <w:iCs w:val="0"/>
+          <w:sz w:val="22"/>
+          <w:szCs w:val="22"/>
+          <w:rtl w:val="0"/>
+        </w:rPr>
+        <w:t xml:space="preserve"> = 30 min together with an event wake; a prime swarm carries roughly 10,000–20,000 bees, about 1–2 kg at ≈0.1 g per bee, so </w:t>
+      </w:r>
+      <w:r>
+        <w:rPr>
+          <w:rFonts w:ascii="Times New Roman" w:cs="Times New Roman" w:eastAsia="Times New Roman" w:hAnsi="Times New Roman"/>
+          <w:b w:val="0"/>
+          <w:bCs w:val="0"/>
+          <w:i w:val="1"/>
+          <w:iCs w:val="1"/>
+          <w:sz w:val="22"/>
+          <w:szCs w:val="22"/>
+          <w:rtl w:val="0"/>
+        </w:rPr>
+        <w:t xml:space="preserve">W</w:t>
+      </w:r>
+      <w:r>
+        <w:rPr>
+          <w:rFonts w:ascii="Times New Roman" w:cs="Times New Roman" w:eastAsia="Times New Roman" w:hAnsi="Times New Roman"/>
+          <w:b w:val="0"/>
+          <w:bCs w:val="0"/>
+          <w:i w:val="1"/>
+          <w:iCs w:val="1"/>
+          <w:sz w:val="22"/>
+          <w:szCs w:val="22"/>
           <w:vertAlign w:val="subscript"/>
           <w:rtl w:val="0"/>
         </w:rPr>
@@ -4335,7 +4387,7 @@
           <w:szCs w:val="22"/>
           <w:rtl w:val="0"/>
         </w:rPr>
-        <w:t xml:space="preserve"> = 0.8 kg is an initial value, tuned on data. Logged inspections are excluded, and an empty-hive control platform separates rain and drift [4]. Swarm-preparation indicators, following the spectral-trend approach of [3], are studied offline against inspection records.</w:t>
+        <w:t xml:space="preserve"> = 0.8 kg is an initial value. The time from the first alert to the departure is the measured lead time. Logged inspections are excluded, and an empty-hive control platform separates rain and drift [4].</w:t>
       </w:r>
     </w:p>
     <w:p>
@@ -4408,7 +4460,7 @@
           <w:szCs w:val="22"/>
           <w:rtl w:val="0"/>
         </w:rPr>
-        <w:t xml:space="preserve"> comb vibration measured at night with laboratory accelerometers is only 1–5 µm/s² per spectral bin, and about ten times weaker on the hive wall [9]; a MEMS accelerometer (≈25 µg/√Hz, i.e. ≈4×10⁻⁴ m/s² per 3 Hz bin) would sit about a hundred times above it, which is why we use a piezoelectric sensor in the comb. A swarm departure is a large event (mass flight, 1–2 kg weight drop) and is the committed target; whether our piezo chain also resolves the quiet pre-swarm changes is measured in Stage 1, with the microphone, as used in [2], and an external audio ADC as fallbacks. </w:t>
+        <w:t xml:space="preserve"> comb vibration measured at night with laboratory accelerometers is only 1–5 µm/s² per spectral bin, and about ten times weaker on the hive wall [9]; a MEMS accelerometer (≈25 µg/√Hz, i.e. ≈4×10⁻⁴ m/s² per 3 Hz bin) would sit about a hundred times above it, which is why we use a piezoelectric sensor in the comb. The pre-swarm changes in [2] were found with ordinary in-hive microphones, so our microphone channel is expected to resolve them; whether the piezo chain also resolves the quieter comb vibrations is measured in Stage 1 (fallback: external audio ADC). The departure itself (mass flight, 1–2 kg) gives a robust confirmation. </w:t>
       </w:r>
       <w:r>
         <w:rPr>
@@ -5308,7 +5360,7 @@
           <w:szCs w:val="22"/>
           <w:rtl w:val="0"/>
         </w:rPr>
-        <w:t xml:space="preserve">, from installation through the spring swarming season, including a first night-time recording that compares hive signal with the circuit noise floor. Ground truth: weekly inspection records (queen cells, brood, queen presence), beekeeper reports and, where possible, an entrance camera. Natural swarms are rare, so detection is also tested with controlled events: removal of known masses (0.5–2 kg) and short disturbances. Each alert matches at most one labelled event within ±30 min, giving precision </w:t>
+        <w:t xml:space="preserve">, from installation through the spring swarming season, including a first night-time recording that compares hive signal with the circuit noise floor. Ground truth: weekly inspection records (queen cells, brood, queen presence), beekeeper reports and, where possible, an entrance camera. A swarm is labelled by an observed departure or by capped queen cells at inspection. A pre-swarm alert is a true positive if it precedes the swarm, giving precision </w:t>
       </w:r>
       <w:r>
         <w:rPr>
@@ -5360,7 +5412,7 @@
           <w:szCs w:val="22"/>
           <w:rtl w:val="0"/>
         </w:rPr>
-        <w:t xml:space="preserve"> = TP/(TP+FN); event wakes and false alarms are counted per hive-day. Thresholds are tuned on the first weeks and frozen before the evaluation period. The packet delivery ratio (PDR) is computed from sequence numbers, and the hub logs its battery voltage to check the solar energy balance.</w:t>
+        <w:t xml:space="preserve"> = TP/(TP+FN) per swarm, with the lead time reported; the departure rule is also tested with controlled removal of known masses (0.5–2 kg). Event wakes and false alarms are counted per hive-day. Thresholds are tuned on the first weeks and frozen before the evaluation period. The packet delivery ratio (PDR) is computed from sequence numbers, and the hub logs its battery voltage to check the solar energy balance.</w:t>
       </w:r>
     </w:p>
     <w:p>
@@ -5705,7 +5757,7 @@
                 <w:szCs w:val="20"/>
                 <w:rtl w:val="0"/>
               </w:rPr>
-              <w:t xml:space="preserve">Event detection</w:t>
+              <w:t xml:space="preserve">Swarm alert</w:t>
             </w:r>
           </w:p>
         </w:tc>
@@ -5732,7 +5784,7 @@
                 <w:szCs w:val="20"/>
                 <w:rtl w:val="0"/>
               </w:rPr>
-              <w:t xml:space="preserve">Precision / recall (swarms + controlled events)</w:t>
+              <w:t xml:space="preserve">Precision / recall of alerts before departure; lead time</w:t>
             </w:r>
           </w:p>
         </w:tc>
@@ -5759,7 +5811,7 @@
                 <w:szCs w:val="20"/>
                 <w:rtl w:val="0"/>
               </w:rPr>
-              <w:t xml:space="preserve">&gt; 90% / &gt; 90%</w:t>
+              <w:t xml:space="preserve">&gt; 90% / &gt; 90%; reported</w:t>
             </w:r>
           </w:p>
         </w:tc>

</xml_diff>

<commit_message>
vault backup: 2026-10-25 15:42:40
Affected files:
.obsidian/plugins/word-reader/data.json
TODO.md
docs/pdr-2027-165.docx
</commit_message>
<xml_diff>
--- a/docs/pdr-2027-165.docx
+++ b/docs/pdr-2027-165.docx
@@ -824,10 +824,9 @@
                 <w:iCs w:val="0"/>
                 <w:sz w:val="22"/>
                 <w:szCs w:val="22"/>
-                <w:highlight w:val="yellow"/>
                 <w:rtl w:val="0"/>
               </w:rPr>
-              <w:t xml:space="preserve">Student 1 name – ID</w:t>
+              <w:t xml:space="preserve">Dror Ben-Simon – 318187747</w:t>
             </w:r>
             <w:r>
               <w:rPr>
@@ -851,10 +850,9 @@
                 <w:iCs w:val="0"/>
                 <w:sz w:val="22"/>
                 <w:szCs w:val="22"/>
-                <w:highlight w:val="yellow"/>
                 <w:rtl w:val="0"/>
               </w:rPr>
-              <w:t xml:space="preserve">Student 2 name – ID</w:t>
+              <w:t xml:space="preserve">Dan Cooper – 319011102</w:t>
             </w:r>
           </w:p>
         </w:tc>
@@ -1135,76 +1133,7 @@
           <w:szCs w:val="22"/>
           <w:rtl w:val="1"/>
         </w:rPr>
-        <w:t xml:space="preserve">שמות הסטודנטים: </w:t>
-      </w:r>
-      <w:r>
-        <w:rPr>
-          <w:rFonts w:ascii="Times New Roman" w:cs="Times New Roman" w:eastAsia="Times New Roman" w:hAnsi="Times New Roman"/>
-          <w:b w:val="0"/>
-          <w:bCs w:val="0"/>
-          <w:i w:val="0"/>
-          <w:iCs w:val="0"/>
-          <w:sz w:val="22"/>
-          <w:szCs w:val="22"/>
-          <w:highlight w:val="yellow"/>
-          <w:rtl w:val="1"/>
-        </w:rPr>
-        <w:t xml:space="preserve">שם סטודנט/ית </w:t>
-      </w:r>
-      <w:r>
-        <w:rPr>
-          <w:rFonts w:ascii="Times New Roman" w:cs="Times New Roman" w:eastAsia="Times New Roman" w:hAnsi="Times New Roman"/>
-          <w:b w:val="0"/>
-          <w:bCs w:val="0"/>
-          <w:i w:val="0"/>
-          <w:iCs w:val="0"/>
-          <w:sz w:val="22"/>
-          <w:szCs w:val="22"/>
-          <w:highlight w:val="yellow"/>
-          <w:rtl w:val="0"/>
-        </w:rPr>
-        <w:t xml:space="preserve">1</w:t>
-      </w:r>
-      <w:r>
-        <w:rPr>
-          <w:rFonts w:ascii="Times New Roman" w:cs="Times New Roman" w:eastAsia="Times New Roman" w:hAnsi="Times New Roman"/>
-          <w:b w:val="0"/>
-          <w:bCs w:val="0"/>
-          <w:i w:val="0"/>
-          <w:iCs w:val="0"/>
-          <w:sz w:val="22"/>
-          <w:szCs w:val="22"/>
-          <w:rtl w:val="1"/>
-        </w:rPr>
-        <w:t xml:space="preserve">, </w:t>
-      </w:r>
-      <w:r>
-        <w:rPr>
-          <w:rFonts w:ascii="Times New Roman" w:cs="Times New Roman" w:eastAsia="Times New Roman" w:hAnsi="Times New Roman"/>
-          <w:b w:val="0"/>
-          <w:bCs w:val="0"/>
-          <w:i w:val="0"/>
-          <w:iCs w:val="0"/>
-          <w:sz w:val="22"/>
-          <w:szCs w:val="22"/>
-          <w:highlight w:val="yellow"/>
-          <w:rtl w:val="1"/>
-        </w:rPr>
-        <w:t xml:space="preserve">שם סטודנט/ית </w:t>
-      </w:r>
-      <w:r>
-        <w:rPr>
-          <w:rFonts w:ascii="Times New Roman" w:cs="Times New Roman" w:eastAsia="Times New Roman" w:hAnsi="Times New Roman"/>
-          <w:b w:val="0"/>
-          <w:bCs w:val="0"/>
-          <w:i w:val="0"/>
-          <w:iCs w:val="0"/>
-          <w:sz w:val="22"/>
-          <w:szCs w:val="22"/>
-          <w:highlight w:val="yellow"/>
-          <w:rtl w:val="0"/>
-        </w:rPr>
-        <w:t xml:space="preserve">2</w:t>
+        <w:t xml:space="preserve">שמות הסטודנטים: דרור בן סימון, דן קופר</w:t>
       </w:r>
     </w:p>
     <w:p>
@@ -1226,23 +1155,9 @@
           <w:iCs w:val="0"/>
           <w:sz w:val="22"/>
           <w:szCs w:val="22"/>
-          <w:highlight w:val="yellow"/>
-          <w:rtl w:val="0"/>
-        </w:rPr>
-        <w:t xml:space="preserve">user1</w:t>
-      </w:r>
-      <w:r>
-        <w:rPr>
-          <w:rFonts w:ascii="Times New Roman" w:cs="Times New Roman" w:eastAsia="Times New Roman" w:hAnsi="Times New Roman"/>
-          <w:b w:val="0"/>
-          <w:bCs w:val="0"/>
-          <w:i w:val="0"/>
-          <w:iCs w:val="0"/>
-          <w:sz w:val="22"/>
-          <w:szCs w:val="22"/>
-          <w:rtl w:val="0"/>
-        </w:rPr>
-        <w:t xml:space="preserve">@post.bgu.ac.il</w:t>
+          <w:rtl w:val="0"/>
+        </w:rPr>
+        <w:t xml:space="preserve">drorbe@post.bgu.ac.il</w:t>
       </w:r>
     </w:p>
     <w:p>
@@ -1264,23 +1179,9 @@
           <w:iCs w:val="0"/>
           <w:sz w:val="22"/>
           <w:szCs w:val="22"/>
-          <w:highlight w:val="yellow"/>
-          <w:rtl w:val="0"/>
-        </w:rPr>
-        <w:t xml:space="preserve">user2</w:t>
-      </w:r>
-      <w:r>
-        <w:rPr>
-          <w:rFonts w:ascii="Times New Roman" w:cs="Times New Roman" w:eastAsia="Times New Roman" w:hAnsi="Times New Roman"/>
-          <w:b w:val="0"/>
-          <w:bCs w:val="0"/>
-          <w:i w:val="0"/>
-          <w:iCs w:val="0"/>
-          <w:sz w:val="22"/>
-          <w:szCs w:val="22"/>
-          <w:rtl w:val="0"/>
-        </w:rPr>
-        <w:t xml:space="preserve">@post.bgu.ac.il</w:t>
+          <w:rtl w:val="0"/>
+        </w:rPr>
+        <w:t xml:space="preserve">dancoop@post.bgu.ac.il</w:t>
       </w:r>
     </w:p>
     <w:p>
@@ -1810,48 +1711,7 @@
           <w:szCs w:val="22"/>
           <w:rtl w:val="0"/>
         </w:rPr>
-        <w:t xml:space="preserve">Students Names: </w:t>
-      </w:r>
-      <w:r>
-        <w:rPr>
-          <w:rFonts w:ascii="Times New Roman" w:cs="Times New Roman" w:eastAsia="Times New Roman" w:hAnsi="Times New Roman"/>
-          <w:b w:val="0"/>
-          <w:bCs w:val="0"/>
-          <w:i w:val="0"/>
-          <w:iCs w:val="0"/>
-          <w:sz w:val="22"/>
-          <w:szCs w:val="22"/>
-          <w:highlight w:val="yellow"/>
-          <w:rtl w:val="0"/>
-        </w:rPr>
-        <w:t xml:space="preserve">Surname1 Name1</w:t>
-      </w:r>
-      <w:r>
-        <w:rPr>
-          <w:rFonts w:ascii="Times New Roman" w:cs="Times New Roman" w:eastAsia="Times New Roman" w:hAnsi="Times New Roman"/>
-          <w:b w:val="0"/>
-          <w:bCs w:val="0"/>
-          <w:i w:val="0"/>
-          <w:iCs w:val="0"/>
-          <w:sz w:val="22"/>
-          <w:szCs w:val="22"/>
-          <w:rtl w:val="0"/>
-        </w:rPr>
-        <w:t xml:space="preserve">, </w:t>
-      </w:r>
-      <w:r>
-        <w:rPr>
-          <w:rFonts w:ascii="Times New Roman" w:cs="Times New Roman" w:eastAsia="Times New Roman" w:hAnsi="Times New Roman"/>
-          <w:b w:val="0"/>
-          <w:bCs w:val="0"/>
-          <w:i w:val="0"/>
-          <w:iCs w:val="0"/>
-          <w:sz w:val="22"/>
-          <w:szCs w:val="22"/>
-          <w:highlight w:val="yellow"/>
-          <w:rtl w:val="0"/>
-        </w:rPr>
-        <w:t xml:space="preserve">Surname2 Name2</w:t>
+        <w:t xml:space="preserve">Students Names: Ben-Simon Dror, Cooper Dan</w:t>
       </w:r>
     </w:p>
     <w:p>
@@ -1872,23 +1732,9 @@
           <w:iCs w:val="0"/>
           <w:sz w:val="22"/>
           <w:szCs w:val="22"/>
-          <w:highlight w:val="yellow"/>
-          <w:rtl w:val="0"/>
-        </w:rPr>
-        <w:t xml:space="preserve">user1</w:t>
-      </w:r>
-      <w:r>
-        <w:rPr>
-          <w:rFonts w:ascii="Times New Roman" w:cs="Times New Roman" w:eastAsia="Times New Roman" w:hAnsi="Times New Roman"/>
-          <w:b w:val="0"/>
-          <w:bCs w:val="0"/>
-          <w:i w:val="0"/>
-          <w:iCs w:val="0"/>
-          <w:sz w:val="22"/>
-          <w:szCs w:val="22"/>
-          <w:rtl w:val="0"/>
-        </w:rPr>
-        <w:t xml:space="preserve">@post.bgu.ac.il</w:t>
+          <w:rtl w:val="0"/>
+        </w:rPr>
+        <w:t xml:space="preserve">drorbe@post.bgu.ac.il</w:t>
       </w:r>
     </w:p>
     <w:p>
@@ -1909,23 +1755,9 @@
           <w:iCs w:val="0"/>
           <w:sz w:val="22"/>
           <w:szCs w:val="22"/>
-          <w:highlight w:val="yellow"/>
-          <w:rtl w:val="0"/>
-        </w:rPr>
-        <w:t xml:space="preserve">user2</w:t>
-      </w:r>
-      <w:r>
-        <w:rPr>
-          <w:rFonts w:ascii="Times New Roman" w:cs="Times New Roman" w:eastAsia="Times New Roman" w:hAnsi="Times New Roman"/>
-          <w:b w:val="0"/>
-          <w:bCs w:val="0"/>
-          <w:i w:val="0"/>
-          <w:iCs w:val="0"/>
-          <w:sz w:val="22"/>
-          <w:szCs w:val="22"/>
-          <w:rtl w:val="0"/>
-        </w:rPr>
-        <w:t xml:space="preserve">@post.bgu.ac.il</w:t>
+          <w:rtl w:val="0"/>
+        </w:rPr>
+        <w:t xml:space="preserve">dancoop@post.bgu.ac.il</w:t>
       </w:r>
     </w:p>
     <w:p>
@@ -7236,62 +7068,20 @@
           <w:szCs w:val="22"/>
           <w:rtl w:val="1"/>
         </w:rPr>
-        <w:t xml:space="preserve">שם הסטודנט: </w:t>
-      </w:r>
-      <w:r>
-        <w:rPr>
-          <w:rFonts w:ascii="Times New Roman" w:cs="Times New Roman" w:eastAsia="Times New Roman" w:hAnsi="Times New Roman"/>
-          <w:b w:val="0"/>
-          <w:bCs w:val="0"/>
-          <w:i w:val="0"/>
-          <w:iCs w:val="0"/>
-          <w:sz w:val="22"/>
-          <w:szCs w:val="22"/>
-          <w:highlight w:val="yellow"/>
-          <w:rtl w:val="1"/>
-        </w:rPr>
-        <w:t xml:space="preserve">שם סטודנט/ית </w:t>
-      </w:r>
-      <w:r>
-        <w:rPr>
-          <w:rFonts w:ascii="Times New Roman" w:cs="Times New Roman" w:eastAsia="Times New Roman" w:hAnsi="Times New Roman"/>
-          <w:b w:val="0"/>
-          <w:bCs w:val="0"/>
-          <w:i w:val="0"/>
-          <w:iCs w:val="0"/>
-          <w:sz w:val="22"/>
-          <w:szCs w:val="22"/>
-          <w:highlight w:val="yellow"/>
-          <w:rtl w:val="0"/>
-        </w:rPr>
-        <w:t xml:space="preserve">1</w:t>
-      </w:r>
-      <w:r>
-        <w:rPr>
-          <w:rFonts w:ascii="Times New Roman" w:cs="Times New Roman" w:eastAsia="Times New Roman" w:hAnsi="Times New Roman"/>
-          <w:b w:val="0"/>
-          <w:bCs w:val="0"/>
-          <w:i w:val="0"/>
-          <w:iCs w:val="0"/>
-          <w:sz w:val="22"/>
-          <w:szCs w:val="22"/>
-          <w:rtl w:val="1"/>
-        </w:rPr>
-        <w:t xml:space="preserve">          ת.ז.: </w:t>
-      </w:r>
-      <w:r>
-        <w:rPr>
-          <w:rFonts w:ascii="Times New Roman" w:cs="Times New Roman" w:eastAsia="Times New Roman" w:hAnsi="Times New Roman"/>
-          <w:b w:val="0"/>
-          <w:bCs w:val="0"/>
-          <w:i w:val="0"/>
-          <w:iCs w:val="0"/>
-          <w:sz w:val="22"/>
-          <w:szCs w:val="22"/>
-          <w:highlight w:val="yellow"/>
-          <w:rtl w:val="1"/>
-        </w:rPr>
-        <w:t xml:space="preserve">מספר</w:t>
+        <w:t xml:space="preserve">שם הסטודנט: דרור בן סימון          ת.ז.: </w:t>
+      </w:r>
+      <w:r>
+        <w:rPr>
+          <w:rFonts w:ascii="Times New Roman" w:cs="Times New Roman" w:eastAsia="Times New Roman" w:hAnsi="Times New Roman"/>
+          <w:b w:val="0"/>
+          <w:bCs w:val="0"/>
+          <w:i w:val="0"/>
+          <w:iCs w:val="0"/>
+          <w:sz w:val="22"/>
+          <w:szCs w:val="22"/>
+          <w:rtl w:val="0"/>
+        </w:rPr>
+        <w:t xml:space="preserve">318187747</w:t>
       </w:r>
     </w:p>
     <w:p>
@@ -10150,62 +9940,20 @@
           <w:szCs w:val="22"/>
           <w:rtl w:val="1"/>
         </w:rPr>
-        <w:t xml:space="preserve">שם הסטודנט: </w:t>
-      </w:r>
-      <w:r>
-        <w:rPr>
-          <w:rFonts w:ascii="Times New Roman" w:cs="Times New Roman" w:eastAsia="Times New Roman" w:hAnsi="Times New Roman"/>
-          <w:b w:val="0"/>
-          <w:bCs w:val="0"/>
-          <w:i w:val="0"/>
-          <w:iCs w:val="0"/>
-          <w:sz w:val="22"/>
-          <w:szCs w:val="22"/>
-          <w:highlight w:val="yellow"/>
-          <w:rtl w:val="1"/>
-        </w:rPr>
-        <w:t xml:space="preserve">שם סטודנט/ית </w:t>
-      </w:r>
-      <w:r>
-        <w:rPr>
-          <w:rFonts w:ascii="Times New Roman" w:cs="Times New Roman" w:eastAsia="Times New Roman" w:hAnsi="Times New Roman"/>
-          <w:b w:val="0"/>
-          <w:bCs w:val="0"/>
-          <w:i w:val="0"/>
-          <w:iCs w:val="0"/>
-          <w:sz w:val="22"/>
-          <w:szCs w:val="22"/>
-          <w:highlight w:val="yellow"/>
-          <w:rtl w:val="0"/>
-        </w:rPr>
-        <w:t xml:space="preserve">2</w:t>
-      </w:r>
-      <w:r>
-        <w:rPr>
-          <w:rFonts w:ascii="Times New Roman" w:cs="Times New Roman" w:eastAsia="Times New Roman" w:hAnsi="Times New Roman"/>
-          <w:b w:val="0"/>
-          <w:bCs w:val="0"/>
-          <w:i w:val="0"/>
-          <w:iCs w:val="0"/>
-          <w:sz w:val="22"/>
-          <w:szCs w:val="22"/>
-          <w:rtl w:val="1"/>
-        </w:rPr>
-        <w:t xml:space="preserve">          ת.ז.: </w:t>
-      </w:r>
-      <w:r>
-        <w:rPr>
-          <w:rFonts w:ascii="Times New Roman" w:cs="Times New Roman" w:eastAsia="Times New Roman" w:hAnsi="Times New Roman"/>
-          <w:b w:val="0"/>
-          <w:bCs w:val="0"/>
-          <w:i w:val="0"/>
-          <w:iCs w:val="0"/>
-          <w:sz w:val="22"/>
-          <w:szCs w:val="22"/>
-          <w:highlight w:val="yellow"/>
-          <w:rtl w:val="1"/>
-        </w:rPr>
-        <w:t xml:space="preserve">מספר</w:t>
+        <w:t xml:space="preserve">שם הסטודנט: דן קופר          ת.ז.: </w:t>
+      </w:r>
+      <w:r>
+        <w:rPr>
+          <w:rFonts w:ascii="Times New Roman" w:cs="Times New Roman" w:eastAsia="Times New Roman" w:hAnsi="Times New Roman"/>
+          <w:b w:val="0"/>
+          <w:bCs w:val="0"/>
+          <w:i w:val="0"/>
+          <w:iCs w:val="0"/>
+          <w:sz w:val="22"/>
+          <w:szCs w:val="22"/>
+          <w:rtl w:val="0"/>
+        </w:rPr>
+        <w:t xml:space="preserve">319011102</w:t>
       </w:r>
     </w:p>
     <w:p>

</xml_diff>

<commit_message>
vault backup: 2026-10-25 15:45:36
Affected files:
.obsidian/plugins/word-reader/data.json
TODO.md
docs/pdr-2027-165.docx
</commit_message>
<xml_diff>
--- a/docs/pdr-2027-165.docx
+++ b/docs/pdr-2027-165.docx
@@ -915,10 +915,9 @@
                 <w:iCs w:val="0"/>
                 <w:sz w:val="22"/>
                 <w:szCs w:val="22"/>
-                <w:highlight w:val="yellow"/>
                 <w:rtl w:val="0"/>
               </w:rPr>
-              <w:t xml:space="preserve">Supervisor name</w:t>
+              <w:t xml:space="preserve">Dr. Dan Vilenchik</w:t>
             </w:r>
           </w:p>
         </w:tc>
@@ -1205,21 +1204,7 @@
           <w:szCs w:val="22"/>
           <w:rtl w:val="1"/>
         </w:rPr>
-        <w:t xml:space="preserve">שם המנחה: </w:t>
-      </w:r>
-      <w:r>
-        <w:rPr>
-          <w:rFonts w:ascii="Times New Roman" w:cs="Times New Roman" w:eastAsia="Times New Roman" w:hAnsi="Times New Roman"/>
-          <w:b w:val="0"/>
-          <w:bCs w:val="0"/>
-          <w:i w:val="0"/>
-          <w:iCs w:val="0"/>
-          <w:sz w:val="22"/>
-          <w:szCs w:val="22"/>
-          <w:highlight w:val="yellow"/>
-          <w:rtl w:val="1"/>
-        </w:rPr>
-        <w:t xml:space="preserve">שם המנחה</w:t>
+        <w:t xml:space="preserve">שם המנחה: ד"ר דן וילנצ'יק</w:t>
       </w:r>
     </w:p>
     <w:p>
@@ -1780,21 +1765,7 @@
           <w:szCs w:val="22"/>
           <w:rtl w:val="0"/>
         </w:rPr>
-        <w:t xml:space="preserve">Adviser Name: </w:t>
-      </w:r>
-      <w:r>
-        <w:rPr>
-          <w:rFonts w:ascii="Times New Roman" w:cs="Times New Roman" w:eastAsia="Times New Roman" w:hAnsi="Times New Roman"/>
-          <w:b w:val="0"/>
-          <w:bCs w:val="0"/>
-          <w:i w:val="0"/>
-          <w:iCs w:val="0"/>
-          <w:sz w:val="22"/>
-          <w:szCs w:val="22"/>
-          <w:highlight w:val="yellow"/>
-          <w:rtl w:val="0"/>
-        </w:rPr>
-        <w:t xml:space="preserve">Surname Name</w:t>
+        <w:t xml:space="preserve">Adviser Name: Vilenchik Dan</w:t>
       </w:r>
     </w:p>
     <w:p>
@@ -7030,21 +7001,7 @@
           <w:szCs w:val="22"/>
           <w:rtl w:val="1"/>
         </w:rPr>
-        <w:t xml:space="preserve">שם המנחה: </w:t>
-      </w:r>
-      <w:r>
-        <w:rPr>
-          <w:rFonts w:ascii="Times New Roman" w:cs="Times New Roman" w:eastAsia="Times New Roman" w:hAnsi="Times New Roman"/>
-          <w:b w:val="0"/>
-          <w:bCs w:val="0"/>
-          <w:i w:val="0"/>
-          <w:iCs w:val="0"/>
-          <w:sz w:val="22"/>
-          <w:szCs w:val="22"/>
-          <w:highlight w:val="yellow"/>
-          <w:rtl w:val="1"/>
-        </w:rPr>
-        <w:t xml:space="preserve">שם המנחה</w:t>
+        <w:t xml:space="preserve">שם המנחה: ד"ר דן וילנצ'יק</w:t>
       </w:r>
     </w:p>
     <w:p>
@@ -9902,21 +9859,7 @@
           <w:szCs w:val="22"/>
           <w:rtl w:val="1"/>
         </w:rPr>
-        <w:t xml:space="preserve">שם המנחה: </w:t>
-      </w:r>
-      <w:r>
-        <w:rPr>
-          <w:rFonts w:ascii="Times New Roman" w:cs="Times New Roman" w:eastAsia="Times New Roman" w:hAnsi="Times New Roman"/>
-          <w:b w:val="0"/>
-          <w:bCs w:val="0"/>
-          <w:i w:val="0"/>
-          <w:iCs w:val="0"/>
-          <w:sz w:val="22"/>
-          <w:szCs w:val="22"/>
-          <w:highlight w:val="yellow"/>
-          <w:rtl w:val="1"/>
-        </w:rPr>
-        <w:t xml:space="preserve">שם המנחה</w:t>
+        <w:t xml:space="preserve">שם המנחה: ד"ר דן וילנצ'יק</w:t>
       </w:r>
     </w:p>
     <w:p>

</xml_diff>

<commit_message>
vault backup: 2026-10-25 16:17:45
Affected files:
.obsidian/plugins/word-reader/data.json
docs/pdr-2027-165.docx
docs/~$r-2027-165.docx
docs/~WRL0003.tmp
</commit_message>
<xml_diff>
--- a/docs/pdr-2027-165.docx
+++ b/docs/pdr-2027-165.docx
@@ -264,16 +264,11 @@
         <w:rPr>
           <w:b/>
           <w:bCs/>
-          <w:rtl/>
-        </w:rPr>
-        <w:t xml:space="preserve">בי-סנס – ניטור אקוסטי ומשקלי של מושבות דבורי דבש מבוסס </w:t>
-      </w:r>
-      <w:r>
-        <w:rPr>
-          <w:b/>
-          <w:bCs/>
-        </w:rPr>
-        <w:t>IoT</w:t>
+          <w:i w:val="0"/>
+          <w:iCs w:val="0"/>
+          <w:rtl w:val="1"/>
+        </w:rPr>
+        <w:t xml:space="preserve">בי-סנס – ניטור אקוסטי ומשקלי של מושבות דבורי דבש מבוסס האינטרנט של הדברים</w:t>
       </w:r>
     </w:p>
     <w:p>
@@ -638,21 +633,13 @@
         <w:rPr>
           <w:b/>
           <w:bCs/>
+          <w:i w:val="0"/>
+          <w:iCs w:val="0"/>
           <w:sz w:val="26"/>
           <w:szCs w:val="26"/>
-          <w:rtl/>
-        </w:rPr>
-        <w:lastRenderedPageBreak/>
-        <w:t xml:space="preserve">בי-סנס – ניטור אקוסטי ומשקלי של מושבות דבורי דבש מבוסס </w:t>
-      </w:r>
-      <w:r>
-        <w:rPr>
-          <w:b/>
-          <w:bCs/>
-          <w:sz w:val="26"/>
-          <w:szCs w:val="26"/>
-        </w:rPr>
-        <w:t>IoT</w:t>
+          <w:rtl w:val="1"/>
+        </w:rPr>
+        <w:t xml:space="preserve">בי-סנס – ניטור אקוסטי ומשקלי של מושבות דבורי דבש מבוסס האינטרנט של הדברים</w:t>
       </w:r>
     </w:p>
     <w:p>
@@ -770,292 +757,315 @@
           <w:szCs w:val="22"/>
         </w:rPr>
       </w:pPr>
-      <w:r>
-        <w:rPr>
-          <w:sz w:val="22"/>
-          <w:szCs w:val="22"/>
-          <w:rtl/>
-        </w:rPr>
-        <w:t xml:space="preserve">דבורי הדבש חיוניות להאבקת גידולים חקלאיים, אך מצב הכוורת נבדק כיום בעיקר בפתיחה ידנית ותקופתית שלה, ובין ביקור לביקור המגדל אינו יודע מה מתרחש בכוורת. הכנה לבריחת נחיל נמשכת כשבוע עד שבועיים, והנחיל עצמו, שלוקח </w:t>
-      </w:r>
       <w:proofErr w:type="spellStart"/>
-      <w:r>
-        <w:rPr>
-          <w:sz w:val="22"/>
-          <w:szCs w:val="22"/>
-          <w:rtl/>
-        </w:rPr>
-        <w:t>איתו</w:t>
-      </w:r>
       <w:proofErr w:type="spellEnd"/>
-      <w:r>
-        <w:rPr>
-          <w:sz w:val="22"/>
-          <w:szCs w:val="22"/>
-          <w:rtl/>
-        </w:rPr>
-        <w:t xml:space="preserve"> חלק ניכר מאוכלוסיית המושבה, עוזב תוך דקות ולעיתים קרובות מתגלה רק בביקור הבא. בי-סנס היא מערכת </w:t>
-      </w:r>
-      <w:r>
-        <w:rPr>
-          <w:sz w:val="22"/>
-          <w:szCs w:val="22"/>
-        </w:rPr>
-        <w:t>IoT</w:t>
-      </w:r>
-      <w:r>
-        <w:rPr>
-          <w:sz w:val="22"/>
-          <w:szCs w:val="22"/>
-          <w:rtl/>
-        </w:rPr>
-        <w:t xml:space="preserve"> לניטור רציף של כוורות בכוורן ללא חשמל וללא רשת. בכל כוורת מותקן צומת </w:t>
-      </w:r>
       <w:proofErr w:type="spellStart"/>
-      <w:r>
-        <w:rPr>
-          <w:sz w:val="22"/>
-          <w:szCs w:val="22"/>
-          <w:rtl/>
-        </w:rPr>
-        <w:t>סוללתי</w:t>
-      </w:r>
       <w:proofErr w:type="spellEnd"/>
-      <w:r>
-        <w:rPr>
-          <w:sz w:val="22"/>
-          <w:szCs w:val="22"/>
-          <w:rtl/>
-        </w:rPr>
-        <w:t xml:space="preserve"> מבוסס </w:t>
-      </w:r>
-      <w:r>
-        <w:rPr>
-          <w:sz w:val="22"/>
-          <w:szCs w:val="22"/>
-        </w:rPr>
-        <w:t>ESP32-C3</w:t>
-      </w:r>
-      <w:r>
-        <w:rPr>
-          <w:sz w:val="22"/>
-          <w:szCs w:val="22"/>
-          <w:rtl/>
-        </w:rPr>
-        <w:t xml:space="preserve">. חיישן רטט </w:t>
-      </w:r>
       <w:proofErr w:type="spellStart"/>
-      <w:r>
-        <w:rPr>
-          <w:sz w:val="22"/>
-          <w:szCs w:val="22"/>
-          <w:rtl/>
-        </w:rPr>
-        <w:t>פיאזואלקטרי</w:t>
-      </w:r>
       <w:proofErr w:type="spellEnd"/>
-      <w:r>
-        <w:rPr>
-          <w:sz w:val="22"/>
-          <w:szCs w:val="22"/>
-          <w:rtl/>
-        </w:rPr>
-        <w:t xml:space="preserve">, הנעוץ בחלה שבמרכז הכוורת, מאזין ברציפות בצריכה של ננו-אמפרים ומעיר את הצומת כשהרטט חורג מרמת הרקע; בכל השכמה, וגם במדידה מחזורית כל רבע שעה, הצומת מקליט </w:t>
-      </w:r>
       <w:proofErr w:type="spellStart"/>
-      <w:r>
-        <w:rPr>
-          <w:sz w:val="22"/>
-          <w:szCs w:val="22"/>
-          <w:rtl/>
-        </w:rPr>
-        <w:t>מהפיאזו</w:t>
-      </w:r>
       <w:proofErr w:type="spellEnd"/>
-      <w:r>
-        <w:rPr>
-          <w:sz w:val="22"/>
-          <w:szCs w:val="22"/>
-          <w:rtl/>
-        </w:rPr>
-        <w:t xml:space="preserve"> וממיקרופון דיגיטלי זעיר, מחשב את ספקטרום התדרים בתחום </w:t>
-      </w:r>
-      <w:r>
-        <w:rPr>
-          <w:sz w:val="22"/>
-          <w:szCs w:val="22"/>
-        </w:rPr>
-        <w:t>50</w:t>
-      </w:r>
-      <w:r>
-        <w:rPr>
-          <w:sz w:val="22"/>
-          <w:szCs w:val="22"/>
-          <w:rtl/>
+      <w:proofErr w:type="spellStart"/>
+      <w:proofErr w:type="spellEnd"/>
+      <w:r>
+        <w:rPr>
+          <w:b w:val="0"/>
+          <w:bCs w:val="0"/>
+          <w:i w:val="0"/>
+          <w:iCs w:val="0"/>
+          <w:sz w:val="22"/>
+          <w:szCs w:val="22"/>
+          <w:rtl w:val="1"/>
+        </w:rPr>
+        <w:t xml:space="preserve">דבורי הדבש חיוניות להאבקת גידולים חקלאיים, אך מצב הכוורת נבדק כיום בעיקר בפתיחה ידנית ותקופתית שלה, ובין ביקור לביקור המגדל אינו יודע מה מתרחש בכוורת. הכנה לבריחת נחיל נמשכת כשבוע עד שבועיים, והנחיל עצמו, שלוקח איתו חלק ניכר מאוכלוסיית המושבה, עוזב תוך דקות ולעיתים קרובות מתגלה רק בביקור הבא. בי-סנס היא מערכת מבוססת האינטרנט של הדברים (</w:t>
+      </w:r>
+      <w:r>
+        <w:rPr>
+          <w:b w:val="0"/>
+          <w:bCs w:val="0"/>
+          <w:i w:val="0"/>
+          <w:iCs w:val="0"/>
+          <w:sz w:val="22"/>
+          <w:szCs w:val="22"/>
+          <w:rtl w:val="0"/>
+        </w:rPr>
+        <w:t xml:space="preserve">IoT</w:t>
+      </w:r>
+      <w:r>
+        <w:rPr>
+          <w:b w:val="0"/>
+          <w:bCs w:val="0"/>
+          <w:i w:val="0"/>
+          <w:iCs w:val="0"/>
+          <w:sz w:val="22"/>
+          <w:szCs w:val="22"/>
+          <w:rtl w:val="1"/>
+        </w:rPr>
+        <w:t xml:space="preserve">) לניטור רציף של כוורות בכוורן ללא חשמל וללא רשת. בכל כוורת מותקן צומת סוללתי מבוסס </w:t>
+      </w:r>
+      <w:r>
+        <w:rPr>
+          <w:b w:val="0"/>
+          <w:bCs w:val="0"/>
+          <w:i w:val="0"/>
+          <w:iCs w:val="0"/>
+          <w:sz w:val="22"/>
+          <w:szCs w:val="22"/>
+          <w:rtl w:val="0"/>
+        </w:rPr>
+        <w:t xml:space="preserve">ESP32-C3</w:t>
+      </w:r>
+      <w:r>
+        <w:rPr>
+          <w:b w:val="0"/>
+          <w:bCs w:val="0"/>
+          <w:i w:val="0"/>
+          <w:iCs w:val="0"/>
+          <w:sz w:val="22"/>
+          <w:szCs w:val="22"/>
+          <w:rtl w:val="1"/>
+        </w:rPr>
+        <w:t xml:space="preserve">. חיישן רטט פיאזואלקטרי, הנעוץ בחלה שבמרכז הכוורת, מאזין ברציפות בצריכה של ננו-אמפרים ומעיר את הצומת כשהרטט חורג מרמת הרקע; בכל השכמה, וגם במדידה מחזורית כל רבע שעה, הצומת מקליט מהפיאזו וממיקרופון דיגיטלי זעיר, מחשב את ספקטרום התדרים בתחום </w:t>
+      </w:r>
+      <w:r>
+        <w:rPr>
+          <w:b w:val="0"/>
+          <w:bCs w:val="0"/>
+          <w:i w:val="0"/>
+          <w:iCs w:val="0"/>
+          <w:sz w:val="22"/>
+          <w:szCs w:val="22"/>
+          <w:rtl w:val="0"/>
+        </w:rPr>
+        <w:t xml:space="preserve">50</w:t>
+      </w:r>
+      <w:r>
+        <w:rPr>
+          <w:b w:val="0"/>
+          <w:bCs w:val="0"/>
+          <w:i w:val="0"/>
+          <w:iCs w:val="0"/>
+          <w:sz w:val="22"/>
+          <w:szCs w:val="22"/>
+          <w:rtl w:val="1"/>
         </w:rPr>
         <w:t xml:space="preserve"> עד </w:t>
       </w:r>
       <w:r>
         <w:rPr>
-          <w:sz w:val="22"/>
-          <w:szCs w:val="22"/>
-        </w:rPr>
-        <w:t>800</w:t>
-      </w:r>
-      <w:r>
-        <w:rPr>
-          <w:sz w:val="22"/>
-          <w:szCs w:val="22"/>
-          <w:rtl/>
-        </w:rPr>
-        <w:t xml:space="preserve"> הרץ ומשלב אותו עם משקל הכוורת מארבעה תאי עומס ועם טמפרטורה. תמצית קטנה של הנתונים נשלחת בפרוטוקול </w:t>
-      </w:r>
-      <w:r>
-        <w:rPr>
-          <w:sz w:val="22"/>
-          <w:szCs w:val="22"/>
-        </w:rPr>
-        <w:t>ESP-NOW</w:t>
-      </w:r>
-      <w:r>
-        <w:rPr>
-          <w:sz w:val="22"/>
-          <w:szCs w:val="22"/>
-          <w:rtl/>
+          <w:b w:val="0"/>
+          <w:bCs w:val="0"/>
+          <w:i w:val="0"/>
+          <w:iCs w:val="0"/>
+          <w:sz w:val="22"/>
+          <w:szCs w:val="22"/>
+          <w:rtl w:val="0"/>
+        </w:rPr>
+        <w:t xml:space="preserve">800</w:t>
+      </w:r>
+      <w:r>
+        <w:rPr>
+          <w:b w:val="0"/>
+          <w:bCs w:val="0"/>
+          <w:i w:val="0"/>
+          <w:iCs w:val="0"/>
+          <w:sz w:val="22"/>
+          <w:szCs w:val="22"/>
+          <w:rtl w:val="1"/>
+        </w:rPr>
+        <w:t xml:space="preserve"> הרץ ומשלב אותו עם משקל הכוורת מארבעה תאי עומס ועם טמפרטורה. תמצית קטנה של הנתונים נשלחת בפרוטוקול התקשורת </w:t>
+      </w:r>
+      <w:r>
+        <w:rPr>
+          <w:b w:val="0"/>
+          <w:bCs w:val="0"/>
+          <w:i w:val="0"/>
+          <w:iCs w:val="0"/>
+          <w:sz w:val="22"/>
+          <w:szCs w:val="22"/>
+          <w:rtl w:val="0"/>
+        </w:rPr>
+        <w:t xml:space="preserve">ESP-NOW</w:t>
+      </w:r>
+      <w:r>
+        <w:rPr>
+          <w:b w:val="0"/>
+          <w:bCs w:val="0"/>
+          <w:i w:val="0"/>
+          <w:iCs w:val="0"/>
+          <w:sz w:val="22"/>
+          <w:szCs w:val="22"/>
+          <w:rtl w:val="1"/>
         </w:rPr>
         <w:t xml:space="preserve"> למרכזייה מבוססת </w:t>
       </w:r>
       <w:r>
         <w:rPr>
-          <w:sz w:val="22"/>
-          <w:szCs w:val="22"/>
-        </w:rPr>
-        <w:t>ESP32-S3</w:t>
-      </w:r>
-      <w:r>
-        <w:rPr>
-          <w:sz w:val="22"/>
-          <w:szCs w:val="22"/>
-          <w:rtl/>
-        </w:rPr>
-        <w:t xml:space="preserve"> בכוורן, המוזנת מפאנל סולארי, מזהה סימנים </w:t>
-      </w:r>
-      <w:proofErr w:type="spellStart"/>
-      <w:r>
-        <w:rPr>
-          <w:sz w:val="22"/>
-          <w:szCs w:val="22"/>
-          <w:rtl/>
-        </w:rPr>
-        <w:t>לנחילה</w:t>
-      </w:r>
-      <w:proofErr w:type="spellEnd"/>
-      <w:r>
-        <w:rPr>
-          <w:sz w:val="22"/>
-          <w:szCs w:val="22"/>
-          <w:rtl/>
-        </w:rPr>
-        <w:t xml:space="preserve"> מתקרבת וחריגות המעידות על מצוקת המושבה, ומעבירה נתונים והתרעות דרך מודם סלולרי לממשק </w:t>
-      </w:r>
-      <w:r>
-        <w:rPr>
-          <w:sz w:val="22"/>
-          <w:szCs w:val="22"/>
-        </w:rPr>
-        <w:t>Web</w:t>
-      </w:r>
-      <w:r>
-        <w:rPr>
-          <w:sz w:val="22"/>
-          <w:szCs w:val="22"/>
-          <w:rtl/>
-        </w:rPr>
-        <w:t xml:space="preserve">. החדשנות היא מערכת אוטונומית וזולה שמביאה לשטח יכולת שהוכחה במעבדה: השכמה מונעת-אירועים, עיבוד ספקטרלי בתוך הכוורת ושילוב רטט עם משקל, על סוללה ובצריכה נמוכה פי אלפים ממערכות המחקר. נבחן את המערכת בכוורן פעיל לאורך עונת הנחילה באביב, ונמדוד את דיוק השקילה (יעד: </w:t>
-      </w:r>
-      <w:r>
-        <w:rPr>
-          <w:sz w:val="22"/>
-          <w:szCs w:val="22"/>
-        </w:rPr>
-        <w:t>20</w:t>
-      </w:r>
-      <w:r>
-        <w:rPr>
-          <w:sz w:val="22"/>
-          <w:szCs w:val="22"/>
-          <w:rtl/>
+          <w:b w:val="0"/>
+          <w:bCs w:val="0"/>
+          <w:i w:val="0"/>
+          <w:iCs w:val="0"/>
+          <w:sz w:val="22"/>
+          <w:szCs w:val="22"/>
+          <w:rtl w:val="0"/>
+        </w:rPr>
+        <w:t xml:space="preserve">ESP32-S3</w:t>
+      </w:r>
+      <w:r>
+        <w:rPr>
+          <w:b w:val="0"/>
+          <w:bCs w:val="0"/>
+          <w:i w:val="0"/>
+          <w:iCs w:val="0"/>
+          <w:sz w:val="22"/>
+          <w:szCs w:val="22"/>
+          <w:rtl w:val="1"/>
+        </w:rPr>
+        <w:t xml:space="preserve"> בכוורן, המוזנת מפאנל סולארי, מזהה סימנים לנחילה מתקרבת וחריגות המעידות על מצוקת המושבה, ומעבירה נתונים והתרעות דרך מודם סלולרי לממשק אינטרנט (</w:t>
+      </w:r>
+      <w:r>
+        <w:rPr>
+          <w:b w:val="0"/>
+          <w:bCs w:val="0"/>
+          <w:i w:val="0"/>
+          <w:iCs w:val="0"/>
+          <w:sz w:val="22"/>
+          <w:szCs w:val="22"/>
+          <w:rtl w:val="0"/>
+        </w:rPr>
+        <w:t xml:space="preserve">Web</w:t>
+      </w:r>
+      <w:r>
+        <w:rPr>
+          <w:b w:val="0"/>
+          <w:bCs w:val="0"/>
+          <w:i w:val="0"/>
+          <w:iCs w:val="0"/>
+          <w:sz w:val="22"/>
+          <w:szCs w:val="22"/>
+          <w:rtl w:val="1"/>
+        </w:rPr>
+        <w:t xml:space="preserve">). החדשנות היא מערכת אוטונומית וזולה שמביאה לשטח יכולת שהוכחה במעבדה: השכמה מונעת-אירועים, עיבוד ספקטרלי בתוך הכוורת ושילוב רטט עם משקל, על סוללה ובצריכה נמוכה פי אלפים ממערכות המחקר. נבחן את המערכת בכוורן פעיל לאורך עונת הנחילה באביב, ונמדוד את דיוק השקילה (יעד: </w:t>
+      </w:r>
+      <w:r>
+        <w:rPr>
+          <w:b w:val="0"/>
+          <w:bCs w:val="0"/>
+          <w:i w:val="0"/>
+          <w:iCs w:val="0"/>
+          <w:sz w:val="22"/>
+          <w:szCs w:val="22"/>
+          <w:rtl w:val="0"/>
+        </w:rPr>
+        <w:t xml:space="preserve">20</w:t>
+      </w:r>
+      <w:r>
+        <w:rPr>
+          <w:b w:val="0"/>
+          <w:bCs w:val="0"/>
+          <w:i w:val="0"/>
+          <w:iCs w:val="0"/>
+          <w:sz w:val="22"/>
+          <w:szCs w:val="22"/>
+          <w:rtl w:val="1"/>
         </w:rPr>
         <w:t xml:space="preserve">± גרם), אחוז קליטת החבילות (יעד: מעל </w:t>
       </w:r>
       <w:r>
         <w:rPr>
-          <w:sz w:val="22"/>
-          <w:szCs w:val="22"/>
-        </w:rPr>
-        <w:t>95%</w:t>
-      </w:r>
-      <w:r>
-        <w:rPr>
-          <w:sz w:val="22"/>
-          <w:szCs w:val="22"/>
-          <w:rtl/>
-        </w:rPr>
-        <w:t>), זמן פעולה על סוללה (יעד: לפחות חצי שנה), ודיוק (</w:t>
-      </w:r>
-      <w:r>
-        <w:rPr>
-          <w:sz w:val="22"/>
-          <w:szCs w:val="22"/>
-        </w:rPr>
-        <w:t>Precision</w:t>
-      </w:r>
-      <w:r>
-        <w:rPr>
-          <w:sz w:val="22"/>
-          <w:szCs w:val="22"/>
-          <w:rtl/>
-        </w:rPr>
-        <w:t>) ורגישות (</w:t>
-      </w:r>
-      <w:r>
-        <w:rPr>
-          <w:sz w:val="22"/>
-          <w:szCs w:val="22"/>
-        </w:rPr>
-        <w:t>Recall</w:t>
-      </w:r>
-      <w:r>
-        <w:rPr>
-          <w:sz w:val="22"/>
-          <w:szCs w:val="22"/>
-          <w:rtl/>
+          <w:b w:val="0"/>
+          <w:bCs w:val="0"/>
+          <w:i w:val="0"/>
+          <w:iCs w:val="0"/>
+          <w:sz w:val="22"/>
+          <w:szCs w:val="22"/>
+          <w:rtl w:val="0"/>
+        </w:rPr>
+        <w:t xml:space="preserve">95%</w:t>
+      </w:r>
+      <w:r>
+        <w:rPr>
+          <w:b w:val="0"/>
+          <w:bCs w:val="0"/>
+          <w:i w:val="0"/>
+          <w:iCs w:val="0"/>
+          <w:sz w:val="22"/>
+          <w:szCs w:val="22"/>
+          <w:rtl w:val="1"/>
+        </w:rPr>
+        <w:t xml:space="preserve">), זמן פעולה על סוללה (יעד: לפחות חצי שנה), ודיוק (</w:t>
+      </w:r>
+      <w:r>
+        <w:rPr>
+          <w:b w:val="0"/>
+          <w:bCs w:val="0"/>
+          <w:i w:val="0"/>
+          <w:iCs w:val="0"/>
+          <w:sz w:val="22"/>
+          <w:szCs w:val="22"/>
+          <w:rtl w:val="0"/>
+        </w:rPr>
+        <w:t xml:space="preserve">Precision</w:t>
+      </w:r>
+      <w:r>
+        <w:rPr>
+          <w:b w:val="0"/>
+          <w:bCs w:val="0"/>
+          <w:i w:val="0"/>
+          <w:iCs w:val="0"/>
+          <w:sz w:val="22"/>
+          <w:szCs w:val="22"/>
+          <w:rtl w:val="1"/>
+        </w:rPr>
+        <w:t xml:space="preserve">) ורגישות (</w:t>
+      </w:r>
+      <w:r>
+        <w:rPr>
+          <w:b w:val="0"/>
+          <w:bCs w:val="0"/>
+          <w:i w:val="0"/>
+          <w:iCs w:val="0"/>
+          <w:sz w:val="22"/>
+          <w:szCs w:val="22"/>
+          <w:rtl w:val="0"/>
+        </w:rPr>
+        <w:t xml:space="preserve">Recall</w:t>
+      </w:r>
+      <w:r>
+        <w:rPr>
+          <w:b w:val="0"/>
+          <w:bCs w:val="0"/>
+          <w:i w:val="0"/>
+          <w:iCs w:val="0"/>
+          <w:sz w:val="22"/>
+          <w:szCs w:val="22"/>
+          <w:rtl w:val="1"/>
         </w:rPr>
         <w:t xml:space="preserve">) בהתרעה על נחילה לפני היציאה (יעד: מעל </w:t>
       </w:r>
       <w:r>
         <w:rPr>
-          <w:sz w:val="22"/>
-          <w:szCs w:val="22"/>
-        </w:rPr>
-        <w:t>90%</w:t>
-      </w:r>
-      <w:r>
-        <w:rPr>
-          <w:sz w:val="22"/>
-          <w:szCs w:val="22"/>
-          <w:rtl/>
-        </w:rPr>
-        <w:t>). היעד המחייב הוא זיהוי הנחילה לפני יציאת הנחיל והתרעה למגדל</w:t>
-      </w:r>
-      <w:r>
-        <w:rPr>
-          <w:rFonts w:hint="cs"/>
-          <w:sz w:val="22"/>
-          <w:szCs w:val="22"/>
-          <w:rtl/>
-        </w:rPr>
-        <w:t>.</w:t>
+          <w:b w:val="0"/>
+          <w:bCs w:val="0"/>
+          <w:i w:val="0"/>
+          <w:iCs w:val="0"/>
+          <w:sz w:val="22"/>
+          <w:szCs w:val="22"/>
+          <w:rtl w:val="0"/>
+        </w:rPr>
+        <w:t xml:space="preserve">90%</w:t>
+      </w:r>
+      <w:r>
+        <w:rPr>
+          <w:b w:val="0"/>
+          <w:bCs w:val="0"/>
+          <w:i w:val="0"/>
+          <w:iCs w:val="0"/>
+          <w:sz w:val="22"/>
+          <w:szCs w:val="22"/>
+          <w:rtl w:val="1"/>
+        </w:rPr>
+        <w:t xml:space="preserve">). היעד המחייב הוא זיהוי הנחילה לפני יציאת הנחיל והתרעה למגדל.</w:t>
       </w:r>
     </w:p>
     <w:p>
@@ -1276,44 +1286,21 @@
           <w:szCs w:val="22"/>
         </w:rPr>
       </w:pPr>
-      <w:r>
-        <w:rPr>
-          <w:sz w:val="22"/>
-          <w:szCs w:val="22"/>
-        </w:rPr>
-        <w:t xml:space="preserve">Honeybees are essential crop pollinators, yet colonies are still checked mainly by opening the hive every week or two, and between visits the beekeeper does not know what happens inside. Swarm preparation takes one to two weeks, and the swarm itself, which takes a large part of the colony away, leaves within minutes and is often discovered only </w:t>
-      </w:r>
       <w:proofErr w:type="gramStart"/>
-      <w:r>
-        <w:rPr>
-          <w:sz w:val="22"/>
-          <w:szCs w:val="22"/>
-        </w:rPr>
-        <w:t>at</w:t>
-      </w:r>
       <w:proofErr w:type="gramEnd"/>
-      <w:r>
-        <w:rPr>
-          <w:sz w:val="22"/>
-          <w:szCs w:val="22"/>
-        </w:rPr>
-        <w:t xml:space="preserve"> the next visit. </w:t>
-      </w:r>
       <w:proofErr w:type="spellStart"/>
-      <w:r>
-        <w:rPr>
-          <w:sz w:val="22"/>
-          <w:szCs w:val="22"/>
-        </w:rPr>
-        <w:t>BeeSense</w:t>
-      </w:r>
       <w:proofErr w:type="spellEnd"/>
       <w:r>
         <w:rPr>
-          <w:sz w:val="22"/>
-          <w:szCs w:val="22"/>
-        </w:rPr>
-        <w:t xml:space="preserve"> is an Internet of Things (IoT) system for continuous monitoring of hives at apiaries without mains power or network. Each hive carries a battery-powered ESP32-C3 node. A piezoelectric vibration sensor embedded in the central comb listens continuously at nanoampere current and wakes the node when vibration rises above the background; on every wake-up, and periodically every 15 minutes, the node records the piezo and a MEMS microphone, computes their spectra between 50 and 800 Hz, and fuses them with hive weight from four load cells and with temperature. A compact summary is sent over ESP-NOW to a solar-powered ESP32-S3 hub at the apiary, which detects signs of an approaching swarm and anomalies that indicate colony distress, and forwards data and alerts over a cellular modem to a web dashboard. The innovation is an autonomous, low-cost system that brings a laboratory-proven capability to the field: event-driven wake-up, on-board spectral processing and fusion of vibration with weight, on battery, at thousands of times less power than research systems. We will evaluate the system at a working apiary through the spring swarming season and measure weighing accuracy (target: ±20 g), packet delivery ratio (target: above 95%), battery life (target: at least six months), and precision and recall of swarm alerts issued before departure (target: above 90%). The committed target is detecting swarming before the swarm leaves and alerting the beekeeper; how long in advance this is possible is the research question of the project. Diagnosis of specific diseases is complementary research, not a committed target.</w:t>
+          <w:b w:val="0"/>
+          <w:bCs w:val="0"/>
+          <w:i w:val="0"/>
+          <w:iCs w:val="0"/>
+          <w:sz w:val="22"/>
+          <w:szCs w:val="22"/>
+          <w:rtl w:val="0"/>
+        </w:rPr>
+        <w:t xml:space="preserve">Honeybees are essential crop pollinators, yet colonies are still checked mainly by opening the hive every few weeks to months, and between visits the beekeeper does not know what happens inside. Swarm preparation takes one to two weeks, and the swarm itself, which takes a large part of the colony away, leaves within minutes and is often discovered only at the next visit. BeeSense is an Internet of Things (IoT) system for continuous monitoring of hives at apiaries without mains power or network. Each hive carries a battery-powered ESP32-C3 node. A piezoelectric vibration sensor embedded in the central comb listens continuously at nanoampere current and wakes the node when vibration rises above the background; on every wake-up, and periodically every 15 minutes, the node records the piezo and a MEMS microphone, computes their spectra between 50 and 800 Hz, and fuses them with hive weight from four load cells and with temperature. A compact summary is sent over ESP-NOW to a solar-powered ESP32-S3 hub at the apiary, which detects signs of an approaching swarm and anomalies that indicate colony distress, and forwards data and alerts over a cellular modem to a web dashboard. The innovation is an autonomous, low-cost system that brings a laboratory-proven capability to the field: event-driven wake-up, on-board spectral processing and fusion of vibration with weight, on battery, at thousands of times less power than research systems. We will evaluate the system at a working apiary through the spring swarming season and measure weighing accuracy (target: ±20 g), packet delivery ratio (target: above 95%), battery life (target: at least six months), and precision and recall of swarm alerts issued before departure (target: above 90%). The committed target is detecting swarming before the swarm leaves and alerting the beekeeper.</w:t>
       </w:r>
     </w:p>
     <w:p>
@@ -1325,26 +1312,37 @@
           <w:szCs w:val="22"/>
         </w:rPr>
         <w:sectPr>
+          <w:headerReference w:type="default" r:id="rId17"/>
+          <w:footerReference w:type="default" r:id="rId18"/>
           <w:pgSz w:w="11906" w:h="16838"/>
           <w:pgMar w:top="1417" w:right="1417" w:bottom="1417" w:left="1417" w:header="709" w:footer="709" w:gutter="0"/>
+          <w:pgNumType w:fmt="lowerRoman" w:start="1"/>
           <w:cols w:space="720"/>
         </w:sectPr>
       </w:pPr>
       <w:r>
         <w:rPr>
-          <w:b/>
-          <w:bCs/>
-          <w:sz w:val="22"/>
-          <w:szCs w:val="22"/>
-        </w:rPr>
-        <w:t>Keywords:</w:t>
-      </w:r>
-      <w:r>
-        <w:rPr>
-          <w:sz w:val="22"/>
-          <w:szCs w:val="22"/>
-        </w:rPr>
-        <w:t xml:space="preserve"> Internet of Things, Hive Monitoring, Honeybees, Piezoelectric Sensor, Event-Driven Wake-Up, Signal Processing, Power Spectral Density, Load Cells, Low-Power Embedded Systems, ESP32, ESP-NOW.</w:t>
+          <w:b w:val="1"/>
+          <w:bCs w:val="1"/>
+          <w:i w:val="0"/>
+          <w:iCs w:val="0"/>
+          <w:sz w:val="22"/>
+          <w:szCs w:val="22"/>
+          <w:rtl w:val="0"/>
+        </w:rPr>
+        <w:t xml:space="preserve">Keywords:</w:t>
+      </w:r>
+      <w:r>
+        <w:rPr>
+          <w:b w:val="0"/>
+          <w:bCs w:val="0"/>
+          <w:i w:val="0"/>
+          <w:iCs w:val="0"/>
+          <w:sz w:val="22"/>
+          <w:szCs w:val="22"/>
+          <w:rtl w:val="0"/>
+        </w:rPr>
+        <w:t xml:space="preserve"> Internet of Things, Hive Monitoring, Honeybees, Piezoelectric Sensor, Event-Driven Wake-Up, Signal Processing, Load Cells, Low-Power Embedded Systems, ESP32, ESP-NOW.</w:t>
       </w:r>
     </w:p>
     <w:p>
@@ -1425,58 +1423,21 @@
           <w:szCs w:val="22"/>
         </w:rPr>
       </w:pPr>
-      <w:r>
-        <w:rPr>
-          <w:sz w:val="22"/>
-          <w:szCs w:val="22"/>
-        </w:rPr>
-        <w:t>Honeybee colonies are inspected mostly by opening the hive</w:t>
-      </w:r>
-      <w:r>
-        <w:rPr>
-          <w:sz w:val="22"/>
-          <w:szCs w:val="22"/>
-        </w:rPr>
-        <w:t xml:space="preserve"> in weeks to months </w:t>
-      </w:r>
       <w:proofErr w:type="gramStart"/>
-      <w:r>
-        <w:rPr>
-          <w:sz w:val="22"/>
-          <w:szCs w:val="22"/>
-        </w:rPr>
-        <w:t xml:space="preserve">interval </w:t>
-      </w:r>
-      <w:r>
-        <w:rPr>
-          <w:sz w:val="22"/>
-          <w:szCs w:val="22"/>
-        </w:rPr>
-        <w:t>;</w:t>
-      </w:r>
       <w:proofErr w:type="gramEnd"/>
-      <w:r>
-        <w:rPr>
-          <w:sz w:val="22"/>
-          <w:szCs w:val="22"/>
-        </w:rPr>
-        <w:t xml:space="preserve"> inspections disturb the colony, cost </w:t>
-      </w:r>
       <w:proofErr w:type="spellStart"/>
-      <w:r>
-        <w:rPr>
-          <w:sz w:val="22"/>
-          <w:szCs w:val="22"/>
-        </w:rPr>
-        <w:t>labour</w:t>
-      </w:r>
       <w:proofErr w:type="spellEnd"/>
       <w:r>
         <w:rPr>
-          <w:sz w:val="22"/>
-          <w:szCs w:val="22"/>
-        </w:rPr>
-        <w:t>, and leave the beekeeper blind between visits. Precision beekeeping, i.e. monitoring colonies with sensors so that interventions are based on data, was proposed to close this gap [1]. Swarming is the costliest blind spot: the colony rears new queens for one to two weeks, the prime swarm leaves with the old queen once the queen cells are capped, clusters nearby for a few hours, and is then lost. Hive vibrations change measurably before swarming [2], [3], and continuous hive weight reveals foraging, consumption and swarm departures [4]. Initial use case: a beekeeper with many hives standing close together at a remote apiary without mains power or Wi-Fi, visiting weekly. The system must alert before a swarm leaves or a colony behaves abnormally, and show which hives need a visit first. Applications: commercial and hobby apiaries, pollination services, and research apiaries that need long continuous records.</w:t>
+          <w:b w:val="0"/>
+          <w:bCs w:val="0"/>
+          <w:i w:val="0"/>
+          <w:iCs w:val="0"/>
+          <w:sz w:val="22"/>
+          <w:szCs w:val="22"/>
+          <w:rtl w:val="0"/>
+        </w:rPr>
+        <w:t xml:space="preserve">Honeybee colonies are inspected mostly by opening the hive every few weeks to months; inspections disturb the colony, cost labour, and leave the beekeeper blind between visits. Precision beekeeping, i.e. monitoring colonies with sensors so that interventions are based on data, was proposed to close this gap [1]. Swarming is the costliest blind spot: the colony rears new queens for one to two weeks, the prime swarm leaves with the old queen once the queen cells are capped, clusters nearby for a few hours, and is then lost. Hive vibrations change measurably before swarming [2], [3], and continuous hive weight reveals foraging, consumption and swarm departures [4]. Initial use case: a beekeeper with many hives standing close together at a remote apiary without mains power or Wi-Fi, visiting every few weeks. The system must alert before a swarm leaves or a colony behaves abnormally, and show which hives need a visit first. Applications: commercial and hobby apiaries, pollination services, and research apiaries that need long continuous records.</w:t>
       </w:r>
     </w:p>
     <w:p>
@@ -4743,8 +4704,9 @@
         <w:tabs>
           <w:tab w:val="left" w:pos="510"/>
         </w:tabs>
-        <w:spacing w:after="80" w:line="240" w:lineRule="auto"/>
+        <w:spacing w:after="80" w:line="360" w:lineRule="auto"/>
         <w:ind w:left="510" w:hanging="510"/>
+        <w:jc w:val="both"/>
         <w:rPr>
           <w:sz w:val="22"/>
           <w:szCs w:val="22"/>
@@ -4846,8 +4808,9 @@
         <w:tabs>
           <w:tab w:val="left" w:pos="510"/>
         </w:tabs>
-        <w:spacing w:after="80" w:line="240" w:lineRule="auto"/>
+        <w:spacing w:after="80" w:line="360" w:lineRule="auto"/>
         <w:ind w:left="510" w:hanging="510"/>
+        <w:jc w:val="both"/>
         <w:rPr>
           <w:sz w:val="22"/>
           <w:szCs w:val="22"/>
@@ -4917,8 +4880,9 @@
         <w:tabs>
           <w:tab w:val="left" w:pos="510"/>
         </w:tabs>
-        <w:spacing w:after="80" w:line="240" w:lineRule="auto"/>
+        <w:spacing w:after="80" w:line="360" w:lineRule="auto"/>
         <w:ind w:left="510" w:hanging="510"/>
+        <w:jc w:val="both"/>
         <w:rPr>
           <w:sz w:val="22"/>
           <w:szCs w:val="22"/>
@@ -4993,8 +4957,9 @@
         <w:tabs>
           <w:tab w:val="left" w:pos="510"/>
         </w:tabs>
-        <w:spacing w:after="80" w:line="240" w:lineRule="auto"/>
+        <w:spacing w:after="80" w:line="360" w:lineRule="auto"/>
         <w:ind w:left="510" w:hanging="510"/>
+        <w:jc w:val="both"/>
         <w:rPr>
           <w:sz w:val="22"/>
           <w:szCs w:val="22"/>
@@ -5055,8 +5020,9 @@
         <w:tabs>
           <w:tab w:val="left" w:pos="510"/>
         </w:tabs>
-        <w:spacing w:after="80" w:line="240" w:lineRule="auto"/>
+        <w:spacing w:after="80" w:line="360" w:lineRule="auto"/>
         <w:ind w:left="510" w:hanging="510"/>
+        <w:jc w:val="both"/>
         <w:rPr>
           <w:sz w:val="22"/>
           <w:szCs w:val="22"/>
@@ -5158,8 +5124,9 @@
         <w:tabs>
           <w:tab w:val="left" w:pos="510"/>
         </w:tabs>
-        <w:spacing w:after="80" w:line="240" w:lineRule="auto"/>
+        <w:spacing w:after="80" w:line="360" w:lineRule="auto"/>
         <w:ind w:left="510" w:hanging="510"/>
+        <w:jc w:val="both"/>
         <w:rPr>
           <w:sz w:val="22"/>
           <w:szCs w:val="22"/>
@@ -5266,8 +5233,9 @@
         <w:tabs>
           <w:tab w:val="left" w:pos="510"/>
         </w:tabs>
-        <w:spacing w:after="80" w:line="240" w:lineRule="auto"/>
+        <w:spacing w:after="80" w:line="360" w:lineRule="auto"/>
         <w:ind w:left="510" w:hanging="510"/>
+        <w:jc w:val="both"/>
         <w:rPr>
           <w:sz w:val="22"/>
           <w:szCs w:val="22"/>
@@ -5325,8 +5293,9 @@
         <w:tabs>
           <w:tab w:val="left" w:pos="510"/>
         </w:tabs>
-        <w:spacing w:after="80" w:line="240" w:lineRule="auto"/>
+        <w:spacing w:after="80" w:line="360" w:lineRule="auto"/>
         <w:ind w:left="510" w:hanging="510"/>
+        <w:jc w:val="both"/>
         <w:rPr>
           <w:sz w:val="22"/>
           <w:szCs w:val="22"/>
@@ -5368,8 +5337,9 @@
         <w:tabs>
           <w:tab w:val="left" w:pos="510"/>
         </w:tabs>
-        <w:spacing w:after="80" w:line="240" w:lineRule="auto"/>
+        <w:spacing w:after="80" w:line="360" w:lineRule="auto"/>
         <w:ind w:left="510" w:hanging="510"/>
+        <w:jc w:val="both"/>
         <w:rPr>
           <w:sz w:val="22"/>
           <w:szCs w:val="22"/>
@@ -5455,8 +5425,9 @@
         <w:tabs>
           <w:tab w:val="left" w:pos="510"/>
         </w:tabs>
-        <w:spacing w:after="80" w:line="240" w:lineRule="auto"/>
+        <w:spacing w:after="80" w:line="360" w:lineRule="auto"/>
         <w:ind w:left="510" w:hanging="510"/>
+        <w:jc w:val="both"/>
         <w:rPr>
           <w:sz w:val="22"/>
           <w:szCs w:val="22"/>
@@ -5514,8 +5485,9 @@
         <w:tabs>
           <w:tab w:val="left" w:pos="510"/>
         </w:tabs>
-        <w:spacing w:after="80" w:line="240" w:lineRule="auto"/>
+        <w:spacing w:after="80" w:line="360" w:lineRule="auto"/>
         <w:ind w:left="510" w:hanging="510"/>
+        <w:jc w:val="both"/>
         <w:rPr>
           <w:sz w:val="22"/>
           <w:szCs w:val="22"/>
@@ -5542,8 +5514,9 @@
         <w:tabs>
           <w:tab w:val="left" w:pos="510"/>
         </w:tabs>
-        <w:spacing w:after="80" w:line="240" w:lineRule="auto"/>
+        <w:spacing w:after="80" w:line="360" w:lineRule="auto"/>
         <w:ind w:left="510" w:hanging="510"/>
+        <w:jc w:val="both"/>
         <w:rPr>
           <w:sz w:val="22"/>
           <w:szCs w:val="22"/>
@@ -7741,9 +7714,9 @@
       </w:r>
     </w:p>
     <w:sectPr>
-      <w:headerReference w:type="default" r:id="rId14"/>
       <w:pgSz w:w="11906" w:h="16838"/>
-      <w:pgMar w:top="1417" w:right="1417" w:bottom="1828" w:left="1417" w:header="709" w:footer="709" w:gutter="0"/>
+      <w:pgMar w:top="1417" w:right="1417" w:bottom="1417" w:left="1417" w:header="709" w:footer="709" w:gutter="0"/>
+      <w:pgNumType w:fmt="decimal" w:start="1"/>
       <w:cols w:space="720"/>
     </w:sectPr>
   </w:body>
@@ -7815,6 +7788,16 @@
 </w:ftr>
 </file>
 
+<file path=word/footer3.xml><?xml version="1.0" encoding="utf-8"?>
+<w:ftr xmlns:m="http://schemas.openxmlformats.org/officeDocument/2006/math" xmlns:mc="http://schemas.openxmlformats.org/markup-compatibility/2006" xmlns:mo="http://schemas.microsoft.com/office/mac/office/2008/main" xmlns:mv="urn:schemas-microsoft-com:mac:vml" xmlns:o="urn:schemas-microsoft-com:office:office" xmlns:r="http://schemas.openxmlformats.org/officeDocument/2006/relationships" xmlns:v="urn:schemas-microsoft-com:vml" xmlns:w10="urn:schemas-microsoft-com:office:word" xmlns:w14="http://schemas.microsoft.com/office/word/2010/wordml" xmlns:w="http://schemas.openxmlformats.org/wordprocessingml/2006/main" xmlns:wne="http://schemas.microsoft.com/office/word/2006/wordml" xmlns:wp14="http://schemas.microsoft.com/office/word/2010/wordprocessingDrawing" xmlns:wp="http://schemas.openxmlformats.org/drawingml/2006/wordprocessingDrawing" xmlns:wpc="http://schemas.microsoft.com/office/word/2010/wordprocessingCanvas" xmlns:wpg="http://schemas.microsoft.com/office/word/2010/wordprocessingGroup" xmlns:wpi="http://schemas.microsoft.com/office/word/2010/wordprocessingInk" xmlns:wps="http://schemas.microsoft.com/office/word/2010/wordprocessingShape" mc:Ignorable="w14 wp14">
+  <w:p>
+    <w:pPr>
+      <w:pStyle w:val="Footer"/>
+    </w:pPr>
+  </w:p>
+</w:ftr>
+</file>
+
 <file path=word/footnotes.xml><?xml version="1.0" encoding="utf-8"?>
 <w:footnotes xmlns:wpc="http://schemas.microsoft.com/office/word/2010/wordprocessingCanvas" xmlns:cx="http://schemas.microsoft.com/office/drawing/2014/chartex" xmlns:cx1="http://schemas.microsoft.com/office/drawing/2015/9/8/chartex" xmlns:cx2="http://schemas.microsoft.com/office/drawing/2015/10/21/chartex" xmlns:cx3="http://schemas.microsoft.com/office/drawing/2016/5/9/chartex" xmlns:cx4="http://schemas.microsoft.com/office/drawing/2016/5/10/chartex" xmlns:cx5="http://schemas.microsoft.com/office/drawing/2016/5/11/chartex" xmlns:cx6="http://schemas.microsoft.com/office/drawing/2016/5/12/chartex" xmlns:cx7="http://schemas.microsoft.com/office/drawing/2016/5/13/chartex" xmlns:cx8="http://schemas.microsoft.com/office/drawing/2016/5/14/chartex" xmlns:mc="http://schemas.openxmlformats.org/markup-compatibility/2006" xmlns:aink="http://schemas.microsoft.com/office/drawing/2016/ink" xmlns:am3d="http://schemas.microsoft.com/office/drawing/2017/model3d" xmlns:o="urn:schemas-microsoft-com:office:office" xmlns:oel="http://schemas.microsoft.com/office/2019/extlst" xmlns:r="http://schemas.openxmlformats.org/officeDocument/2006/relationships" xmlns:m="http://schemas.openxmlformats.org/officeDocument/2006/math" xmlns:v="urn:schemas-microsoft-com:vml" xmlns:wp14="http://schemas.microsoft.com/office/word/2010/wordprocessingDrawing" xmlns:wp="http://schemas.openxmlformats.org/drawingml/2006/wordprocessingDrawing" xmlns:w10="urn:schemas-microsoft-com:office:word" xmlns:w="http://schemas.openxmlformats.org/wordprocessingml/2006/main" xmlns:w14="http://schemas.microsoft.com/office/word/2010/wordml" xmlns:w15="http://schemas.microsoft.com/office/word/2012/wordml" xmlns:w16cex="http://schemas.microsoft.com/office/word/2018/wordml/cex" xmlns:w16cid="http://schemas.microsoft.com/office/word/2016/wordml/cid" xmlns:w16="http://schemas.microsoft.com/office/word/2018/wordml" xmlns:w16du="http://schemas.microsoft.com/office/word/2023/wordml/word16du" xmlns:w16sdtdh="http://schemas.microsoft.com/office/word/2020/wordml/sdtdatahash" xmlns:w16sdtfl="http://schemas.microsoft.com/office/word/2024/wordml/sdtformatlock" xmlns:w16se="http://schemas.microsoft.com/office/word/2015/wordml/symex" xmlns:wpg="http://schemas.microsoft.com/office/word/2010/wordprocessingGroup" xmlns:wpi="http://schemas.microsoft.com/office/word/2010/wordprocessingInk" xmlns:wne="http://schemas.microsoft.com/office/word/2006/wordml" xmlns:wps="http://schemas.microsoft.com/office/word/2010/wordprocessingShape" mc:Ignorable="w14 w15 w16se w16cid w16 w16cex w16sdtdh w16sdtfl w16du wp14">
   <w:footnote w:type="separator" w:id="-1">
@@ -7872,12 +7855,43 @@
 </w:hdr>
 </file>
 
-<file path=word/header3.xml><?xml version="1.0" encoding="utf-8"?>
-<w:hdr xmlns:wpc="http://schemas.microsoft.com/office/word/2010/wordprocessingCanvas" xmlns:cx="http://schemas.microsoft.com/office/drawing/2014/chartex" xmlns:cx1="http://schemas.microsoft.com/office/drawing/2015/9/8/chartex" xmlns:cx2="http://schemas.microsoft.com/office/drawing/2015/10/21/chartex" xmlns:cx3="http://schemas.microsoft.com/office/drawing/2016/5/9/chartex" xmlns:cx4="http://schemas.microsoft.com/office/drawing/2016/5/10/chartex" xmlns:cx5="http://schemas.microsoft.com/office/drawing/2016/5/11/chartex" xmlns:cx6="http://schemas.microsoft.com/office/drawing/2016/5/12/chartex" xmlns:cx7="http://schemas.microsoft.com/office/drawing/2016/5/13/chartex" xmlns:cx8="http://schemas.microsoft.com/office/drawing/2016/5/14/chartex" xmlns:mc="http://schemas.openxmlformats.org/markup-compatibility/2006" xmlns:aink="http://schemas.microsoft.com/office/drawing/2016/ink" xmlns:am3d="http://schemas.microsoft.com/office/drawing/2017/model3d" xmlns:o="urn:schemas-microsoft-com:office:office" xmlns:oel="http://schemas.microsoft.com/office/2019/extlst" xmlns:r="http://schemas.openxmlformats.org/officeDocument/2006/relationships" xmlns:m="http://schemas.openxmlformats.org/officeDocument/2006/math" xmlns:v="urn:schemas-microsoft-com:vml" xmlns:wp14="http://schemas.microsoft.com/office/word/2010/wordprocessingDrawing" xmlns:wp="http://schemas.openxmlformats.org/drawingml/2006/wordprocessingDrawing" xmlns:w10="urn:schemas-microsoft-com:office:word" xmlns:w="http://schemas.openxmlformats.org/wordprocessingml/2006/main" xmlns:w14="http://schemas.microsoft.com/office/word/2010/wordml" xmlns:w15="http://schemas.microsoft.com/office/word/2012/wordml" xmlns:w16cex="http://schemas.microsoft.com/office/word/2018/wordml/cex" xmlns:w16cid="http://schemas.microsoft.com/office/word/2016/wordml/cid" xmlns:w16="http://schemas.microsoft.com/office/word/2018/wordml" xmlns:w16du="http://schemas.microsoft.com/office/word/2023/wordml/word16du" xmlns:w16sdtdh="http://schemas.microsoft.com/office/word/2020/wordml/sdtdatahash" xmlns:w16sdtfl="http://schemas.microsoft.com/office/word/2024/wordml/sdtformatlock" xmlns:w16se="http://schemas.microsoft.com/office/word/2015/wordml/symex" xmlns:wpg="http://schemas.microsoft.com/office/word/2010/wordprocessingGroup" xmlns:wpi="http://schemas.microsoft.com/office/word/2010/wordprocessingInk" xmlns:wne="http://schemas.microsoft.com/office/word/2006/wordml" xmlns:wps="http://schemas.microsoft.com/office/word/2010/wordprocessingShape" mc:Ignorable="w14 w15 w16se w16cid w16 w16cex w16sdtdh w16sdtfl w16du wp14">
+<file path=word/header4.xml><?xml version="1.0" encoding="utf-8"?>
+<w:hdr xmlns:m="http://schemas.openxmlformats.org/officeDocument/2006/math" xmlns:mc="http://schemas.openxmlformats.org/markup-compatibility/2006" xmlns:mo="http://schemas.microsoft.com/office/mac/office/2008/main" xmlns:mv="urn:schemas-microsoft-com:mac:vml" xmlns:o="urn:schemas-microsoft-com:office:office" xmlns:r="http://schemas.openxmlformats.org/officeDocument/2006/relationships" xmlns:v="urn:schemas-microsoft-com:vml" xmlns:w10="urn:schemas-microsoft-com:office:word" xmlns:w14="http://schemas.microsoft.com/office/word/2010/wordml" xmlns:w="http://schemas.openxmlformats.org/wordprocessingml/2006/main" xmlns:wne="http://schemas.microsoft.com/office/word/2006/wordml" xmlns:wp14="http://schemas.microsoft.com/office/word/2010/wordprocessingDrawing" xmlns:wp="http://schemas.openxmlformats.org/drawingml/2006/wordprocessingDrawing" xmlns:wpc="http://schemas.microsoft.com/office/word/2010/wordprocessingCanvas" xmlns:wpg="http://schemas.microsoft.com/office/word/2010/wordprocessingGroup" xmlns:wpi="http://schemas.microsoft.com/office/word/2010/wordprocessingInk" xmlns:wps="http://schemas.microsoft.com/office/word/2010/wordprocessingShape" mc:Ignorable="w14 wp14">
   <w:p>
     <w:pPr>
-      <w:bidi/>
+      <w:pStyle w:val="Header"/>
+      <w:jc w:val="center"/>
     </w:pPr>
+    <w:r>
+      <w:rPr>
+        <w:rFonts w:ascii="Times New Roman" w:hAnsi="Times New Roman" w:cs="Times New Roman"/>
+      </w:rPr>
+      <w:fldChar w:fldCharType="begin"/>
+    </w:r>
+    <w:r>
+      <w:rPr>
+        <w:rFonts w:ascii="Times New Roman" w:hAnsi="Times New Roman" w:cs="Times New Roman"/>
+      </w:rPr>
+      <w:instrText xml:space="preserve"> PAGE </w:instrText>
+    </w:r>
+    <w:r>
+      <w:rPr>
+        <w:rFonts w:ascii="Times New Roman" w:hAnsi="Times New Roman" w:cs="Times New Roman"/>
+      </w:rPr>
+      <w:fldChar w:fldCharType="separate"/>
+    </w:r>
+    <w:r>
+      <w:rPr>
+        <w:rFonts w:ascii="Times New Roman" w:hAnsi="Times New Roman" w:cs="Times New Roman"/>
+      </w:rPr>
+      <w:t>1</w:t>
+    </w:r>
+    <w:r>
+      <w:rPr>
+        <w:rFonts w:ascii="Times New Roman" w:hAnsi="Times New Roman" w:cs="Times New Roman"/>
+      </w:rPr>
+      <w:fldChar w:fldCharType="end"/>
+    </w:r>
   </w:p>
 </w:hdr>
 </file>

</xml_diff>

<commit_message>
vault backup: 2026-10-25 16:26:24
Affected files:
.obsidian/plugins/word-reader/data.json
docs/pdr-2027-165.docx
</commit_message>
<xml_diff>
--- a/docs/pdr-2027-165.docx
+++ b/docs/pdr-2027-165.docx
@@ -622,7 +622,7 @@
     <w:p>
       <w:pPr>
         <w:bidi/>
-        <w:spacing w:after="40" w:line="360" w:lineRule="auto"/>
+        <w:spacing w:after="40" w:line="240" w:lineRule="auto"/>
         <w:jc w:val="center"/>
         <w:rPr>
           <w:sz w:val="22"/>
@@ -637,6 +637,7 @@
           <w:iCs w:val="0"/>
           <w:sz w:val="26"/>
           <w:szCs w:val="26"/>
+          <w:u w:val="single"/>
           <w:rtl w:val="1"/>
         </w:rPr>
         <w:t xml:space="preserve">בי-סנס – ניטור אקוסטי ומשקלי של מושבות דבורי דבש מבוסס האינטרנט של הדברים</w:t>
@@ -645,7 +646,7 @@
     <w:p>
       <w:pPr>
         <w:bidi/>
-        <w:spacing w:after="0" w:line="360" w:lineRule="auto"/>
+        <w:spacing w:after="0" w:line="240" w:lineRule="auto"/>
         <w:jc w:val="center"/>
         <w:rPr>
           <w:sz w:val="22"/>
@@ -664,7 +665,7 @@
     <w:p>
       <w:pPr>
         <w:bidi/>
-        <w:spacing w:after="0" w:line="360" w:lineRule="auto"/>
+        <w:spacing w:after="0" w:line="240" w:lineRule="auto"/>
         <w:jc w:val="center"/>
         <w:rPr>
           <w:sz w:val="22"/>
@@ -682,7 +683,7 @@
     <w:p>
       <w:pPr>
         <w:bidi/>
-        <w:spacing w:after="0" w:line="360" w:lineRule="auto"/>
+        <w:spacing w:after="200" w:line="240" w:lineRule="auto"/>
         <w:jc w:val="center"/>
         <w:rPr>
           <w:sz w:val="22"/>
@@ -693,43 +694,25 @@
         <w:rPr>
           <w:sz w:val="22"/>
           <w:szCs w:val="22"/>
-        </w:rPr>
-        <w:t>dancoop@post.bgu.ac.il</w:t>
-      </w:r>
+          <w:rtl/>
+        </w:rPr>
+        <w:t xml:space="preserve">שם המנחה: ד"ר דן </w:t>
+      </w:r>
+      <w:proofErr w:type="spellStart"/>
+      <w:r>
+        <w:rPr>
+          <w:sz w:val="22"/>
+          <w:szCs w:val="22"/>
+          <w:rtl/>
+        </w:rPr>
+        <w:t>וילנצ'יק</w:t>
+      </w:r>
+      <w:proofErr w:type="spellEnd"/>
     </w:p>
     <w:p>
       <w:pPr>
         <w:bidi/>
-        <w:spacing w:after="200" w:line="360" w:lineRule="auto"/>
-        <w:jc w:val="center"/>
-        <w:rPr>
-          <w:sz w:val="22"/>
-          <w:szCs w:val="22"/>
-        </w:rPr>
-      </w:pPr>
-      <w:r>
-        <w:rPr>
-          <w:sz w:val="22"/>
-          <w:szCs w:val="22"/>
-          <w:rtl/>
-        </w:rPr>
-        <w:t xml:space="preserve">שם המנחה: ד"ר דן </w:t>
-      </w:r>
-      <w:proofErr w:type="spellStart"/>
-      <w:r>
-        <w:rPr>
-          <w:sz w:val="22"/>
-          <w:szCs w:val="22"/>
-          <w:rtl/>
-        </w:rPr>
-        <w:t>וילנצ'יק</w:t>
-      </w:r>
-      <w:proofErr w:type="spellEnd"/>
-    </w:p>
-    <w:p>
-      <w:pPr>
-        <w:bidi/>
-        <w:spacing w:after="120" w:line="360" w:lineRule="auto"/>
+        <w:spacing w:after="120" w:line="240" w:lineRule="auto"/>
         <w:jc w:val="center"/>
         <w:rPr>
           <w:sz w:val="22"/>
@@ -777,7 +760,7 @@
           <w:szCs w:val="22"/>
           <w:rtl w:val="1"/>
         </w:rPr>
-        <w:t xml:space="preserve">דבורי הדבש חיוניות להאבקת גידולים חקלאיים, אך מצב הכוורת נבדק כיום בעיקר בפתיחה ידנית ותקופתית שלה, ובין ביקור לביקור המגדל אינו יודע מה מתרחש בכוורת. הכנה לבריחת נחיל נמשכת כשבוע עד שבועיים, והנחיל עצמו, שלוקח איתו חלק ניכר מאוכלוסיית המושבה, עוזב תוך דקות ולעיתים קרובות מתגלה רק בביקור הבא. בי-סנס היא מערכת מבוססת האינטרנט של הדברים (</w:t>
+        <w:t xml:space="preserve">מצב כוורות הדבורים נבדק כיום בעיקר בפתיחה ידנית של הכוורת אחת לכמה שבועות עד חודשים, ובין ביקור לביקור המגדל אינו יודע מה מתרחש בה. הכנה לבריחת נחיל נמשכת כשבוע עד שבועיים, והנחיל, שלוקח איתו חלק ניכר מהמושבה, עוזב תוך דקות ולעיתים קרובות מתגלה רק בביקור הבא. בי-סנס היא מערכת מבוססת האינטרנט של הדברים (</w:t>
       </w:r>
       <w:r>
         <w:rPr>
@@ -801,7 +784,7 @@
           <w:szCs w:val="22"/>
           <w:rtl w:val="1"/>
         </w:rPr>
-        <w:t xml:space="preserve">) לניטור רציף של כוורות בכוורן ללא חשמל וללא רשת. בכל כוורת מותקן צומת סוללתי מבוסס </w:t>
+        <w:t xml:space="preserve">) לניטור כוורות בכוורן ללא חשמל וללא רשת. בכל כוורת מותקן צומת סוללתי עם חיישן רטט פיאזואלקטרי, המאזין בצריכה של ננו-אמפרים ומעיר את הצומת כשהרטט חורג מרמת הרקע; הצומת מחשב את ספקטרום הרטט והקול ומשלב אותו עם משקל הכוורת והטמפרטורה. מרכזייה סולארית בכוורן אוספת את הנתונים, מזהה סימנים לנחילה מתקרבת וחריגות במושבה, ושולחת התרעות דרך הרשת הסלולרית. החדשנות היא מערכת אוטונומית וזולה שמביאה לשטח יכולת שהוכחה במעבדה, בצריכת הספק נמוכה פי אלפים ממערכות המחקר. היעדים: דיוק שקילה של </w:t>
       </w:r>
       <w:r>
         <w:rPr>
@@ -813,7 +796,7 @@
           <w:szCs w:val="22"/>
           <w:rtl w:val="0"/>
         </w:rPr>
-        <w:t xml:space="preserve">ESP32-C3</w:t>
+        <w:t xml:space="preserve">20</w:t>
       </w:r>
       <w:r>
         <w:rPr>
@@ -825,7 +808,7 @@
           <w:szCs w:val="22"/>
           <w:rtl w:val="1"/>
         </w:rPr>
-        <w:t xml:space="preserve">. חיישן רטט פיאזואלקטרי, הנעוץ בחלה שבמרכז הכוורת, מאזין ברציפות בצריכה של ננו-אמפרים ומעיר את הצומת כשהרטט חורג מרמת הרקע; בכל השכמה, וגם במדידה מחזורית כל רבע שעה, הצומת מקליט מהפיאזו וממיקרופון דיגיטלי זעיר, מחשב את ספקטרום התדרים בתחום </w:t>
+        <w:t xml:space="preserve">± גרם, קליטת חבילות מעל </w:t>
       </w:r>
       <w:r>
         <w:rPr>
@@ -837,7 +820,7 @@
           <w:szCs w:val="22"/>
           <w:rtl w:val="0"/>
         </w:rPr>
-        <w:t xml:space="preserve">50</w:t>
+        <w:t xml:space="preserve">95%</w:t>
       </w:r>
       <w:r>
         <w:rPr>
@@ -849,7 +832,7 @@
           <w:szCs w:val="22"/>
           <w:rtl w:val="1"/>
         </w:rPr>
-        <w:t xml:space="preserve"> עד </w:t>
+        <w:t xml:space="preserve">, לפחות חצי שנה על סוללה, וכיעד המחייב, דיוק (</w:t>
       </w:r>
       <w:r>
         <w:rPr>
@@ -861,7 +844,7 @@
           <w:szCs w:val="22"/>
           <w:rtl w:val="0"/>
         </w:rPr>
-        <w:t xml:space="preserve">800</w:t>
+        <w:t xml:space="preserve">Precision</w:t>
       </w:r>
       <w:r>
         <w:rPr>
@@ -873,7 +856,7 @@
           <w:szCs w:val="22"/>
           <w:rtl w:val="1"/>
         </w:rPr>
-        <w:t xml:space="preserve"> הרץ ומשלב אותו עם משקל הכוורת מארבעה תאי עומס ועם טמפרטורה. תמצית קטנה של הנתונים נשלחת בפרוטוקול התקשורת </w:t>
+        <w:t xml:space="preserve">) ורגישות (</w:t>
       </w:r>
       <w:r>
         <w:rPr>
@@ -885,7 +868,7 @@
           <w:szCs w:val="22"/>
           <w:rtl w:val="0"/>
         </w:rPr>
-        <w:t xml:space="preserve">ESP-NOW</w:t>
+        <w:t xml:space="preserve">Recall</w:t>
       </w:r>
       <w:r>
         <w:rPr>
@@ -897,7 +880,7 @@
           <w:szCs w:val="22"/>
           <w:rtl w:val="1"/>
         </w:rPr>
-        <w:t xml:space="preserve"> למרכזייה מבוססת </w:t>
+        <w:t xml:space="preserve">) מעל </w:t>
       </w:r>
       <w:r>
         <w:rPr>
@@ -909,7 +892,7 @@
           <w:szCs w:val="22"/>
           <w:rtl w:val="0"/>
         </w:rPr>
-        <w:t xml:space="preserve">ESP32-S3</w:t>
+        <w:t xml:space="preserve">90%</w:t>
       </w:r>
       <w:r>
         <w:rPr>
@@ -921,8 +904,203 @@
           <w:szCs w:val="22"/>
           <w:rtl w:val="1"/>
         </w:rPr>
-        <w:t xml:space="preserve"> בכוורן, המוזנת מפאנל סולארי, מזהה סימנים לנחילה מתקרבת וחריגות המעידות על מצוקת המושבה, ומעבירה נתונים והתרעות דרך מודם סלולרי לממשק אינטרנט (</w:t>
-      </w:r>
+        <w:t xml:space="preserve"> בהתרעה על נחילה לפני יציאת הנחיל.</w:t>
+      </w:r>
+    </w:p>
+    <w:p>
+      <w:pPr>
+        <w:bidi/>
+        <w:spacing w:before="120" w:after="20" w:line="360" w:lineRule="auto"/>
+        <w:jc w:val="both"/>
+        <w:rPr>
+          <w:sz w:val="22"/>
+          <w:szCs w:val="22"/>
+        </w:rPr>
+      </w:pPr>
+      <w:r>
+        <w:rPr>
+          <w:b/>
+          <w:bCs/>
+          <w:sz w:val="22"/>
+          <w:szCs w:val="22"/>
+          <w:rtl/>
+        </w:rPr>
+        <w:t>מילות מפתח:</w:t>
+      </w:r>
+      <w:r>
+        <w:rPr>
+          <w:sz w:val="22"/>
+          <w:szCs w:val="22"/>
+          <w:rtl/>
+        </w:rPr>
+        <w:t xml:space="preserve"> האינטרנט של הדברים, ניטור כוורות, דבורת הדבש, חיישן </w:t>
+      </w:r>
+      <w:proofErr w:type="spellStart"/>
+      <w:r>
+        <w:rPr>
+          <w:sz w:val="22"/>
+          <w:szCs w:val="22"/>
+          <w:rtl/>
+        </w:rPr>
+        <w:t>פיאזואלקטרי</w:t>
+      </w:r>
+      <w:proofErr w:type="spellEnd"/>
+      <w:r>
+        <w:rPr>
+          <w:sz w:val="22"/>
+          <w:szCs w:val="22"/>
+          <w:rtl/>
+        </w:rPr>
+        <w:t xml:space="preserve">, השכמה מונעת-אירועים, עיבוד אותות, תאי עומס, מערכות משובצות בהספק נמוך, </w:t>
+      </w:r>
+      <w:r>
+        <w:rPr>
+          <w:sz w:val="22"/>
+          <w:szCs w:val="22"/>
+        </w:rPr>
+        <w:t>ESP32, ESP-NOW</w:t>
+      </w:r>
+      <w:r>
+        <w:rPr>
+          <w:sz w:val="22"/>
+          <w:szCs w:val="22"/>
+          <w:rtl/>
+        </w:rPr>
+        <w:t>.</w:t>
+      </w:r>
+    </w:p>
+    <w:p>
+      <w:pPr>
+        <w:spacing w:after="40" w:line="240" w:lineRule="auto"/>
+        <w:jc w:val="center"/>
+        <w:rPr>
+          <w:sz w:val="22"/>
+          <w:szCs w:val="22"/>
+        </w:rPr>
+      </w:pPr>
+      <w:proofErr w:type="spellStart"/>
+      <w:r>
+        <w:rPr>
+          <w:b/>
+          <w:bCs/>
+          <w:sz w:val="26"/>
+          <w:szCs w:val="26"/>
+          <w:u w:val="single"/>
+        </w:rPr>
+        <w:lastRenderedPageBreak/>
+        <w:t>BeeSense</w:t>
+      </w:r>
+      <w:proofErr w:type="spellEnd"/>
+      <w:r>
+        <w:rPr>
+          <w:b/>
+          <w:bCs/>
+          <w:sz w:val="26"/>
+          <w:szCs w:val="26"/>
+          <w:u w:val="single"/>
+        </w:rPr>
+        <w:t xml:space="preserve"> — IoT-Based Acoustic and Weight Monitoring of Honeybee Colonies</w:t>
+      </w:r>
+    </w:p>
+    <w:p>
+      <w:pPr>
+        <w:spacing w:after="0" w:line="240" w:lineRule="auto"/>
+        <w:jc w:val="center"/>
+        <w:rPr>
+          <w:sz w:val="22"/>
+          <w:szCs w:val="22"/>
+        </w:rPr>
+      </w:pPr>
+      <w:r>
+        <w:rPr>
+          <w:sz w:val="22"/>
+          <w:szCs w:val="22"/>
+        </w:rPr>
+        <w:t>Students Names: Ben-Simon Dror, Cooper Dan</w:t>
+      </w:r>
+    </w:p>
+    <w:p>
+      <w:pPr>
+        <w:spacing w:after="0" w:line="240" w:lineRule="auto"/>
+        <w:jc w:val="center"/>
+        <w:rPr>
+          <w:sz w:val="22"/>
+          <w:szCs w:val="22"/>
+        </w:rPr>
+      </w:pPr>
+      <w:r>
+        <w:rPr>
+          <w:sz w:val="22"/>
+          <w:szCs w:val="22"/>
+        </w:rPr>
+        <w:t>drorbe@post.bgu.ac.il</w:t>
+      </w:r>
+    </w:p>
+    <w:p>
+      <w:pPr>
+        <w:spacing w:after="200" w:line="240" w:lineRule="auto"/>
+        <w:jc w:val="center"/>
+        <w:rPr>
+          <w:sz w:val="22"/>
+          <w:szCs w:val="22"/>
+        </w:rPr>
+      </w:pPr>
+      <w:r>
+        <w:rPr>
+          <w:sz w:val="22"/>
+          <w:szCs w:val="22"/>
+        </w:rPr>
+        <w:t xml:space="preserve">Adviser Name: </w:t>
+      </w:r>
+      <w:proofErr w:type="spellStart"/>
+      <w:r>
+        <w:rPr>
+          <w:sz w:val="22"/>
+          <w:szCs w:val="22"/>
+        </w:rPr>
+        <w:t>Vilenchik</w:t>
+      </w:r>
+      <w:proofErr w:type="spellEnd"/>
+      <w:r>
+        <w:rPr>
+          <w:sz w:val="22"/>
+          <w:szCs w:val="22"/>
+        </w:rPr>
+        <w:t xml:space="preserve"> Dan</w:t>
+      </w:r>
+    </w:p>
+    <w:p>
+      <w:pPr>
+        <w:spacing w:after="120" w:line="240" w:lineRule="auto"/>
+        <w:jc w:val="center"/>
+        <w:rPr>
+          <w:sz w:val="22"/>
+          <w:szCs w:val="22"/>
+        </w:rPr>
+      </w:pPr>
+      <w:r>
+        <w:rPr>
+          <w:b/>
+          <w:bCs/>
+          <w:sz w:val="26"/>
+          <w:szCs w:val="26"/>
+        </w:rPr>
+        <w:t>Abstract</w:t>
+      </w:r>
+    </w:p>
+    <w:p>
+      <w:pPr>
+        <w:spacing w:after="20" w:line="360" w:lineRule="auto"/>
+        <w:jc w:val="both"/>
+        <w:rPr>
+          <w:sz w:val="22"/>
+          <w:szCs w:val="22"/>
+        </w:rPr>
+      </w:pPr>
+      <w:proofErr w:type="gramStart"/>
+      <w:proofErr w:type="gramEnd"/>
+      <w:proofErr w:type="spellStart"/>
+      <w:proofErr w:type="spellEnd"/>
       <w:r>
         <w:rPr>
           <w:b w:val="0"/>
@@ -933,374 +1111,7 @@
           <w:szCs w:val="22"/>
           <w:rtl w:val="0"/>
         </w:rPr>
-        <w:t xml:space="preserve">Web</w:t>
-      </w:r>
-      <w:r>
-        <w:rPr>
-          <w:b w:val="0"/>
-          <w:bCs w:val="0"/>
-          <w:i w:val="0"/>
-          <w:iCs w:val="0"/>
-          <w:sz w:val="22"/>
-          <w:szCs w:val="22"/>
-          <w:rtl w:val="1"/>
-        </w:rPr>
-        <w:t xml:space="preserve">). החדשנות היא מערכת אוטונומית וזולה שמביאה לשטח יכולת שהוכחה במעבדה: השכמה מונעת-אירועים, עיבוד ספקטרלי בתוך הכוורת ושילוב רטט עם משקל, על סוללה ובצריכה נמוכה פי אלפים ממערכות המחקר. נבחן את המערכת בכוורן פעיל לאורך עונת הנחילה באביב, ונמדוד את דיוק השקילה (יעד: </w:t>
-      </w:r>
-      <w:r>
-        <w:rPr>
-          <w:b w:val="0"/>
-          <w:bCs w:val="0"/>
-          <w:i w:val="0"/>
-          <w:iCs w:val="0"/>
-          <w:sz w:val="22"/>
-          <w:szCs w:val="22"/>
-          <w:rtl w:val="0"/>
-        </w:rPr>
-        <w:t xml:space="preserve">20</w:t>
-      </w:r>
-      <w:r>
-        <w:rPr>
-          <w:b w:val="0"/>
-          <w:bCs w:val="0"/>
-          <w:i w:val="0"/>
-          <w:iCs w:val="0"/>
-          <w:sz w:val="22"/>
-          <w:szCs w:val="22"/>
-          <w:rtl w:val="1"/>
-        </w:rPr>
-        <w:t xml:space="preserve">± גרם), אחוז קליטת החבילות (יעד: מעל </w:t>
-      </w:r>
-      <w:r>
-        <w:rPr>
-          <w:b w:val="0"/>
-          <w:bCs w:val="0"/>
-          <w:i w:val="0"/>
-          <w:iCs w:val="0"/>
-          <w:sz w:val="22"/>
-          <w:szCs w:val="22"/>
-          <w:rtl w:val="0"/>
-        </w:rPr>
-        <w:t xml:space="preserve">95%</w:t>
-      </w:r>
-      <w:r>
-        <w:rPr>
-          <w:b w:val="0"/>
-          <w:bCs w:val="0"/>
-          <w:i w:val="0"/>
-          <w:iCs w:val="0"/>
-          <w:sz w:val="22"/>
-          <w:szCs w:val="22"/>
-          <w:rtl w:val="1"/>
-        </w:rPr>
-        <w:t xml:space="preserve">), זמן פעולה על סוללה (יעד: לפחות חצי שנה), ודיוק (</w:t>
-      </w:r>
-      <w:r>
-        <w:rPr>
-          <w:b w:val="0"/>
-          <w:bCs w:val="0"/>
-          <w:i w:val="0"/>
-          <w:iCs w:val="0"/>
-          <w:sz w:val="22"/>
-          <w:szCs w:val="22"/>
-          <w:rtl w:val="0"/>
-        </w:rPr>
-        <w:t xml:space="preserve">Precision</w:t>
-      </w:r>
-      <w:r>
-        <w:rPr>
-          <w:b w:val="0"/>
-          <w:bCs w:val="0"/>
-          <w:i w:val="0"/>
-          <w:iCs w:val="0"/>
-          <w:sz w:val="22"/>
-          <w:szCs w:val="22"/>
-          <w:rtl w:val="1"/>
-        </w:rPr>
-        <w:t xml:space="preserve">) ורגישות (</w:t>
-      </w:r>
-      <w:r>
-        <w:rPr>
-          <w:b w:val="0"/>
-          <w:bCs w:val="0"/>
-          <w:i w:val="0"/>
-          <w:iCs w:val="0"/>
-          <w:sz w:val="22"/>
-          <w:szCs w:val="22"/>
-          <w:rtl w:val="0"/>
-        </w:rPr>
-        <w:t xml:space="preserve">Recall</w:t>
-      </w:r>
-      <w:r>
-        <w:rPr>
-          <w:b w:val="0"/>
-          <w:bCs w:val="0"/>
-          <w:i w:val="0"/>
-          <w:iCs w:val="0"/>
-          <w:sz w:val="22"/>
-          <w:szCs w:val="22"/>
-          <w:rtl w:val="1"/>
-        </w:rPr>
-        <w:t xml:space="preserve">) בהתרעה על נחילה לפני היציאה (יעד: מעל </w:t>
-      </w:r>
-      <w:r>
-        <w:rPr>
-          <w:b w:val="0"/>
-          <w:bCs w:val="0"/>
-          <w:i w:val="0"/>
-          <w:iCs w:val="0"/>
-          <w:sz w:val="22"/>
-          <w:szCs w:val="22"/>
-          <w:rtl w:val="0"/>
-        </w:rPr>
-        <w:t xml:space="preserve">90%</w:t>
-      </w:r>
-      <w:r>
-        <w:rPr>
-          <w:b w:val="0"/>
-          <w:bCs w:val="0"/>
-          <w:i w:val="0"/>
-          <w:iCs w:val="0"/>
-          <w:sz w:val="22"/>
-          <w:szCs w:val="22"/>
-          <w:rtl w:val="1"/>
-        </w:rPr>
-        <w:t xml:space="preserve">). היעד המחייב הוא זיהוי הנחילה לפני יציאת הנחיל והתרעה למגדל.</w:t>
-      </w:r>
-    </w:p>
-    <w:p>
-      <w:pPr>
-        <w:bidi/>
-        <w:spacing w:before="120" w:after="20" w:line="360" w:lineRule="auto"/>
-        <w:jc w:val="both"/>
-        <w:rPr>
-          <w:sz w:val="22"/>
-          <w:szCs w:val="22"/>
-        </w:rPr>
-      </w:pPr>
-      <w:r>
-        <w:rPr>
-          <w:b/>
-          <w:bCs/>
-          <w:sz w:val="22"/>
-          <w:szCs w:val="22"/>
-          <w:rtl/>
-        </w:rPr>
-        <w:t>מילות מפתח:</w:t>
-      </w:r>
-      <w:r>
-        <w:rPr>
-          <w:sz w:val="22"/>
-          <w:szCs w:val="22"/>
-          <w:rtl/>
-        </w:rPr>
-        <w:t xml:space="preserve"> האינטרנט של הדברים, ניטור כוורות, דבורת הדבש, חיישן </w:t>
-      </w:r>
-      <w:proofErr w:type="spellStart"/>
-      <w:r>
-        <w:rPr>
-          <w:sz w:val="22"/>
-          <w:szCs w:val="22"/>
-          <w:rtl/>
-        </w:rPr>
-        <w:t>פיאזואלקטרי</w:t>
-      </w:r>
-      <w:proofErr w:type="spellEnd"/>
-      <w:r>
-        <w:rPr>
-          <w:sz w:val="22"/>
-          <w:szCs w:val="22"/>
-          <w:rtl/>
-        </w:rPr>
-        <w:t xml:space="preserve">, השכמה מונעת-אירועים, עיבוד אותות, תאי עומס, מערכות משובצות בהספק נמוך, </w:t>
-      </w:r>
-      <w:r>
-        <w:rPr>
-          <w:sz w:val="22"/>
-          <w:szCs w:val="22"/>
-        </w:rPr>
-        <w:t>ESP32, ESP-NOW</w:t>
-      </w:r>
-      <w:r>
-        <w:rPr>
-          <w:sz w:val="22"/>
-          <w:szCs w:val="22"/>
-          <w:rtl/>
-        </w:rPr>
-        <w:t>.</w:t>
-      </w:r>
-    </w:p>
-    <w:p>
-      <w:pPr>
-        <w:spacing w:after="0" w:line="360" w:lineRule="auto"/>
-        <w:jc w:val="both"/>
-        <w:rPr>
-          <w:sz w:val="22"/>
-          <w:szCs w:val="22"/>
-        </w:rPr>
-      </w:pPr>
-      <w:r>
-        <w:br w:type="page"/>
-      </w:r>
-    </w:p>
-    <w:p>
-      <w:pPr>
-        <w:spacing w:after="40" w:line="360" w:lineRule="auto"/>
-        <w:jc w:val="center"/>
-        <w:rPr>
-          <w:sz w:val="22"/>
-          <w:szCs w:val="22"/>
-        </w:rPr>
-      </w:pPr>
-      <w:proofErr w:type="spellStart"/>
-      <w:r>
-        <w:rPr>
-          <w:b/>
-          <w:bCs/>
-          <w:sz w:val="26"/>
-          <w:szCs w:val="26"/>
-        </w:rPr>
-        <w:lastRenderedPageBreak/>
-        <w:t>BeeSense</w:t>
-      </w:r>
-      <w:proofErr w:type="spellEnd"/>
-      <w:r>
-        <w:rPr>
-          <w:b/>
-          <w:bCs/>
-          <w:sz w:val="26"/>
-          <w:szCs w:val="26"/>
-        </w:rPr>
-        <w:t xml:space="preserve"> — IoT-Based Acoustic and Weight Monitoring of Honeybee Colonies</w:t>
-      </w:r>
-    </w:p>
-    <w:p>
-      <w:pPr>
-        <w:spacing w:after="0" w:line="360" w:lineRule="auto"/>
-        <w:jc w:val="center"/>
-        <w:rPr>
-          <w:sz w:val="22"/>
-          <w:szCs w:val="22"/>
-        </w:rPr>
-      </w:pPr>
-      <w:r>
-        <w:rPr>
-          <w:sz w:val="22"/>
-          <w:szCs w:val="22"/>
-        </w:rPr>
-        <w:t>Students Names: Ben-Simon Dror, Cooper Dan</w:t>
-      </w:r>
-    </w:p>
-    <w:p>
-      <w:pPr>
-        <w:spacing w:after="0" w:line="360" w:lineRule="auto"/>
-        <w:jc w:val="center"/>
-        <w:rPr>
-          <w:sz w:val="22"/>
-          <w:szCs w:val="22"/>
-        </w:rPr>
-      </w:pPr>
-      <w:r>
-        <w:rPr>
-          <w:sz w:val="22"/>
-          <w:szCs w:val="22"/>
-        </w:rPr>
-        <w:t>drorbe@post.bgu.ac.il</w:t>
-      </w:r>
-    </w:p>
-    <w:p>
-      <w:pPr>
-        <w:spacing w:after="0" w:line="360" w:lineRule="auto"/>
-        <w:jc w:val="center"/>
-        <w:rPr>
-          <w:sz w:val="22"/>
-          <w:szCs w:val="22"/>
-        </w:rPr>
-      </w:pPr>
-      <w:r>
-        <w:rPr>
-          <w:sz w:val="22"/>
-          <w:szCs w:val="22"/>
-        </w:rPr>
-        <w:t>dancoop@post.bgu.ac.il</w:t>
-      </w:r>
-    </w:p>
-    <w:p>
-      <w:pPr>
-        <w:spacing w:after="200" w:line="360" w:lineRule="auto"/>
-        <w:jc w:val="center"/>
-        <w:rPr>
-          <w:sz w:val="22"/>
-          <w:szCs w:val="22"/>
-        </w:rPr>
-      </w:pPr>
-      <w:r>
-        <w:rPr>
-          <w:sz w:val="22"/>
-          <w:szCs w:val="22"/>
-        </w:rPr>
-        <w:t xml:space="preserve">Adviser Name: </w:t>
-      </w:r>
-      <w:proofErr w:type="spellStart"/>
-      <w:r>
-        <w:rPr>
-          <w:sz w:val="22"/>
-          <w:szCs w:val="22"/>
-        </w:rPr>
-        <w:t>Vilenchik</w:t>
-      </w:r>
-      <w:proofErr w:type="spellEnd"/>
-      <w:r>
-        <w:rPr>
-          <w:sz w:val="22"/>
-          <w:szCs w:val="22"/>
-        </w:rPr>
-        <w:t xml:space="preserve"> Dan</w:t>
-      </w:r>
-    </w:p>
-    <w:p>
-      <w:pPr>
-        <w:spacing w:after="120" w:line="360" w:lineRule="auto"/>
-        <w:jc w:val="center"/>
-        <w:rPr>
-          <w:sz w:val="22"/>
-          <w:szCs w:val="22"/>
-        </w:rPr>
-      </w:pPr>
-      <w:r>
-        <w:rPr>
-          <w:b/>
-          <w:bCs/>
-          <w:sz w:val="26"/>
-          <w:szCs w:val="26"/>
-        </w:rPr>
-        <w:t>Abstract</w:t>
-      </w:r>
-    </w:p>
-    <w:p>
-      <w:pPr>
-        <w:spacing w:after="20" w:line="360" w:lineRule="auto"/>
-        <w:jc w:val="both"/>
-        <w:rPr>
-          <w:sz w:val="22"/>
-          <w:szCs w:val="22"/>
-        </w:rPr>
-      </w:pPr>
-      <w:proofErr w:type="gramStart"/>
-      <w:proofErr w:type="gramEnd"/>
-      <w:proofErr w:type="spellStart"/>
-      <w:proofErr w:type="spellEnd"/>
-      <w:r>
-        <w:rPr>
-          <w:b w:val="0"/>
-          <w:bCs w:val="0"/>
-          <w:i w:val="0"/>
-          <w:iCs w:val="0"/>
-          <w:sz w:val="22"/>
-          <w:szCs w:val="22"/>
-          <w:rtl w:val="0"/>
-        </w:rPr>
-        <w:t xml:space="preserve">Honeybees are essential crop pollinators, yet colonies are still checked mainly by opening the hive every few weeks to months, and between visits the beekeeper does not know what happens inside. Swarm preparation takes one to two weeks, and the swarm itself, which takes a large part of the colony away, leaves within minutes and is often discovered only at the next visit. BeeSense is an Internet of Things (IoT) system for continuous monitoring of hives at apiaries without mains power or network. Each hive carries a battery-powered ESP32-C3 node. A piezoelectric vibration sensor embedded in the central comb listens continuously at nanoampere current and wakes the node when vibration rises above the background; on every wake-up, and periodically every 15 minutes, the node records the piezo and a MEMS microphone, computes their spectra between 50 and 800 Hz, and fuses them with hive weight from four load cells and with temperature. A compact summary is sent over ESP-NOW to a solar-powered ESP32-S3 hub at the apiary, which detects signs of an approaching swarm and anomalies that indicate colony distress, and forwards data and alerts over a cellular modem to a web dashboard. The innovation is an autonomous, low-cost system that brings a laboratory-proven capability to the field: event-driven wake-up, on-board spectral processing and fusion of vibration with weight, on battery, at thousands of times less power than research systems. We will evaluate the system at a working apiary through the spring swarming season and measure weighing accuracy (target: ±20 g), packet delivery ratio (target: above 95%), battery life (target: at least six months), and precision and recall of swarm alerts issued before departure (target: above 90%). The committed target is detecting swarming before the swarm leaves and alerting the beekeeper.</w:t>
+        <w:t xml:space="preserve">Honeybee colonies are checked mainly by opening the hive every few weeks to months, leaving the beekeeper blind between visits. Swarm preparation takes one to two weeks, and the swarm, taking a large part of the colony, leaves within minutes and is often discovered only at the next visit. BeeSense is an Internet of Things (IoT) system for monitoring hives at apiaries without mains power or network. In each hive, a battery-powered node uses a piezoelectric vibration sensor that listens at nanoampere current and wakes the node when vibration rises above the background; the node then computes vibration and sound spectra and fuses them with hive weight and temperature. A solar-powered hub at the apiary collects the data, detects signs of an approaching swarm and colony anomalies, and sends alerts over the cellular network. The innovation is an autonomous, low-cost system that brings a laboratory-proven capability to the field, at thousands of times less power than research systems. Targets: weighing accuracy of ±20 g, packet delivery above 95%, at least six months per battery and, as the committed target, precision and recall above 90% for swarm alerts issued before the swarm leaves.</w:t>
       </w:r>
     </w:p>
     <w:p>
@@ -1468,21 +1279,31 @@
           <w:szCs w:val="22"/>
         </w:rPr>
       </w:pPr>
-      <w:r>
-        <w:rPr>
-          <w:b/>
-          <w:bCs/>
-          <w:sz w:val="22"/>
-          <w:szCs w:val="22"/>
-        </w:rPr>
-        <w:t>Objectives:</w:t>
-      </w:r>
-      <w:r>
-        <w:rPr>
-          <w:sz w:val="22"/>
-          <w:szCs w:val="22"/>
-        </w:rPr>
-        <w:t xml:space="preserve"> </w:t>
+      <w:proofErr w:type="gramStart"/>
+      <w:proofErr w:type="gramEnd"/>
+      <w:r>
+        <w:rPr>
+          <w:b w:val="1"/>
+          <w:bCs w:val="1"/>
+          <w:i w:val="0"/>
+          <w:iCs w:val="0"/>
+          <w:sz w:val="22"/>
+          <w:szCs w:val="22"/>
+          <w:rtl w:val="0"/>
+        </w:rPr>
+        <w:t xml:space="preserve">Objectives:</w:t>
+      </w:r>
+      <w:r>
+        <w:rPr>
+          <w:b w:val="0"/>
+          <w:bCs w:val="0"/>
+          <w:i w:val="0"/>
+          <w:iCs w:val="0"/>
+          <w:sz w:val="22"/>
+          <w:szCs w:val="22"/>
+          <w:rtl w:val="0"/>
+        </w:rPr>
+        <w:t xml:space="preserve"> (1) a battery-powered hive node with event-driven wake-up that measures vibration and sound spectra, weight and temperature, and runs at least six months per charge (targets in Section 3.3);</w:t>
       </w:r>
     </w:p>
     <w:p>
@@ -1499,23 +1320,7 @@
           <w:sz w:val="22"/>
           <w:szCs w:val="22"/>
         </w:rPr>
-        <w:t xml:space="preserve">(1) a battery-powered hive node with event-driven wake-up that measures vibration and sound </w:t>
-      </w:r>
-      <w:proofErr w:type="gramStart"/>
-      <w:r>
-        <w:rPr>
-          <w:sz w:val="22"/>
-          <w:szCs w:val="22"/>
-        </w:rPr>
-        <w:t>spectra</w:t>
-      </w:r>
-      <w:proofErr w:type="gramEnd"/>
-      <w:r>
-        <w:rPr>
-          <w:sz w:val="22"/>
-          <w:szCs w:val="22"/>
-        </w:rPr>
-        <w:t>, weight and temperature, and runs at least six months per charge (targets in Section 3.3);</w:t>
+        <w:t>(2) a reliable short-range link from the hives to a solar-powered hub with a cellular uplink, a cloud database and a web dashboard;</w:t>
       </w:r>
     </w:p>
     <w:p>
@@ -1532,7 +1337,7 @@
           <w:sz w:val="22"/>
           <w:szCs w:val="22"/>
         </w:rPr>
-        <w:t>(2) a reliable short-range link from the hives to a solar-powered hub with a cellular uplink, a cloud database and a web dashboard;</w:t>
+        <w:t>(3) alerts on approaching swarms before the swarm leaves, with the achievable lead time as the research question, and detection of colony anomalies.</w:t>
       </w:r>
     </w:p>
     <w:p>
@@ -1546,99 +1351,27 @@
       </w:pPr>
       <w:r>
         <w:rPr>
-          <w:sz w:val="22"/>
-          <w:szCs w:val="22"/>
-        </w:rPr>
-        <w:t>(3) alerts on approaching swarms before the swarm leaves, with the achievable lead time as the research question, and detection of colony anomalies.</w:t>
-      </w:r>
-    </w:p>
-    <w:p>
-      <w:pPr>
-        <w:spacing w:after="20" w:line="360" w:lineRule="auto"/>
-        <w:jc w:val="both"/>
-        <w:rPr>
-          <w:b/>
-          <w:bCs/>
-          <w:sz w:val="22"/>
-          <w:szCs w:val="22"/>
-        </w:rPr>
-      </w:pPr>
-      <w:r>
-        <w:rPr>
-          <w:b/>
-          <w:bCs/>
-          <w:sz w:val="22"/>
-          <w:szCs w:val="22"/>
-        </w:rPr>
-        <w:t xml:space="preserve">Stages: </w:t>
-      </w:r>
-    </w:p>
-    <w:p>
-      <w:pPr>
-        <w:spacing w:after="20" w:line="360" w:lineRule="auto"/>
-        <w:jc w:val="both"/>
-        <w:rPr>
-          <w:sz w:val="22"/>
-          <w:szCs w:val="22"/>
-        </w:rPr>
-      </w:pPr>
-      <w:r>
-        <w:rPr>
-          <w:sz w:val="22"/>
-          <w:szCs w:val="22"/>
-        </w:rPr>
-        <w:t>(1) define requirements with the cooperating beekeeper; bench-test the piezo and wake chains, the weighing chain and the FFT time on the ESP32-C3; record one hive at night to compare signal and noise floor.</w:t>
-      </w:r>
-    </w:p>
-    <w:p>
-      <w:pPr>
-        <w:spacing w:after="20" w:line="360" w:lineRule="auto"/>
-        <w:jc w:val="both"/>
-        <w:rPr>
-          <w:sz w:val="22"/>
-          <w:szCs w:val="22"/>
-        </w:rPr>
-      </w:pPr>
-      <w:r>
-        <w:rPr>
-          <w:sz w:val="22"/>
-          <w:szCs w:val="22"/>
-        </w:rPr>
-        <w:t>(2) build the node: wake circuit, acquisition, on-board spectra, power modes; compare piezo and microphone; measure ESP-NOW range at the apiary.</w:t>
-      </w:r>
-    </w:p>
-    <w:p>
-      <w:pPr>
-        <w:spacing w:after="20" w:line="360" w:lineRule="auto"/>
-        <w:jc w:val="both"/>
-        <w:rPr>
-          <w:sz w:val="22"/>
-          <w:szCs w:val="22"/>
-        </w:rPr>
-      </w:pPr>
-      <w:r>
-        <w:rPr>
-          <w:sz w:val="22"/>
-          <w:szCs w:val="22"/>
-        </w:rPr>
-        <w:t>(3) build the hub (cellular uplink, solar power, buffering), database, detection and dashboard; install on hives before the spring swarming season.</w:t>
-      </w:r>
-    </w:p>
-    <w:p>
-      <w:pPr>
-        <w:spacing w:after="20" w:line="360" w:lineRule="auto"/>
-        <w:jc w:val="both"/>
-        <w:rPr>
-          <w:sz w:val="22"/>
-          <w:szCs w:val="22"/>
-        </w:rPr>
-      </w:pPr>
-      <w:r>
-        <w:rPr>
-          <w:sz w:val="22"/>
-          <w:szCs w:val="22"/>
-        </w:rPr>
-        <w:t>(4) field evaluation and analysis.</w:t>
+          <w:b w:val="1"/>
+          <w:bCs w:val="1"/>
+          <w:i w:val="0"/>
+          <w:iCs w:val="0"/>
+          <w:sz w:val="22"/>
+          <w:szCs w:val="22"/>
+          <w:rtl w:val="0"/>
+        </w:rPr>
+        <w:t xml:space="preserve">Stages:</w:t>
+      </w:r>
+      <w:r>
+        <w:rPr>
+          <w:b w:val="0"/>
+          <w:bCs w:val="0"/>
+          <w:i w:val="0"/>
+          <w:iCs w:val="0"/>
+          <w:sz w:val="22"/>
+          <w:szCs w:val="22"/>
+          <w:rtl w:val="0"/>
+        </w:rPr>
+        <w:t xml:space="preserve"> (1) requirements with the beekeeper and bench tests: piezo and wake chains, weighing, FFT time on the C3, and one night-time hive recording; (2) node: wake circuit, acquisition, on-board spectra, power modes, piezo vs. microphone, ESP-NOW range on site; (3) hub, database, detection and dashboard, installed before the spring swarming season; (4) field evaluation.</w:t>
       </w:r>
     </w:p>
     <w:p>
@@ -1875,60 +1608,23 @@
           <w:szCs w:val="22"/>
         </w:rPr>
       </w:pPr>
-      <w:r>
-        <w:rPr>
-          <w:sz w:val="22"/>
-          <w:szCs w:val="22"/>
-        </w:rPr>
-        <w:t xml:space="preserve">Ferrari et al. recorded hive sounds with in-hive microphones and found that the power spectral density near 110 Hz rises, and shifts upward in frequency, before swarming [2]. Ramsey et al. placed accelerometers in the heart of the colony and, by tracking how the vibrational spectra evolve, separated colonies preparing to swarm with more than 90% accuracy, up to 30 days ahead [3]; Bencsik et al. predicted swarming several days ahead with a simple transducer on the outside hive wall [5]. Cecchi et al. built a multi-sensor hive with microphones, weighing to ±10 g and CO₂, but each hive used a Raspberry Pi drawing about 4 W from mains power [6]. Commercially, </w:t>
-      </w:r>
       <w:proofErr w:type="spellStart"/>
-      <w:r>
-        <w:rPr>
-          <w:sz w:val="22"/>
-          <w:szCs w:val="22"/>
-        </w:rPr>
-        <w:t>BroodMinder</w:t>
-      </w:r>
       <w:proofErr w:type="spellEnd"/>
-      <w:r>
-        <w:rPr>
-          <w:sz w:val="22"/>
-          <w:szCs w:val="22"/>
-        </w:rPr>
-        <w:t xml:space="preserve"> hive scales log weight only [7], and </w:t>
-      </w:r>
       <w:proofErr w:type="spellStart"/>
-      <w:r>
-        <w:rPr>
-          <w:sz w:val="22"/>
-          <w:szCs w:val="22"/>
-        </w:rPr>
-        <w:t>BeeHero</w:t>
-      </w:r>
       <w:proofErr w:type="spellEnd"/>
-      <w:r>
-        <w:rPr>
-          <w:sz w:val="22"/>
-          <w:szCs w:val="22"/>
-        </w:rPr>
-        <w:t xml:space="preserve"> in-hive sensors measure acoustics and climate and report over Bluetooth Low Energy to a cellular gateway in a closed system [8] (Table I). The research systems used laboratory-grade sensors, mains power and offline analysis; our contribution is engineering: event-driven, on-board processing that fuses vibration with weight on a node drawing ≈1 </w:t>
-      </w:r>
       <w:proofErr w:type="spellStart"/>
-      <w:r>
-        <w:rPr>
-          <w:sz w:val="22"/>
-          <w:szCs w:val="22"/>
-        </w:rPr>
-        <w:t>mW</w:t>
-      </w:r>
       <w:proofErr w:type="spellEnd"/>
       <w:r>
         <w:rPr>
-          <w:sz w:val="22"/>
-          <w:szCs w:val="22"/>
-        </w:rPr>
-        <w:t xml:space="preserve"> on average, with measured accuracy, link reliability and energy.</w:t>
+          <w:b w:val="0"/>
+          <w:bCs w:val="0"/>
+          <w:i w:val="0"/>
+          <w:iCs w:val="0"/>
+          <w:sz w:val="22"/>
+          <w:szCs w:val="22"/>
+          <w:rtl w:val="0"/>
+        </w:rPr>
+        <w:t xml:space="preserve">Ferrari et al. recorded hive sounds with in-hive microphones and found that the power spectral density near 110 Hz rises, and shifts upward in frequency, before swarming [2]. Ramsey et al. placed accelerometers in the heart of the colony and, by tracking how the vibrational spectra evolve, separated colonies preparing to swarm with more than 90% accuracy, up to 30 days ahead [3]; Bencsik et al. predicted swarming several days ahead with a simple transducer on the outside hive wall [5]. Cecchi et al. built a multi-sensor hive with microphones, weighing to ±10 g and CO₂, but each hive used a Raspberry Pi drawing about 4 W from mains power [6]. Commercially, BroodMinder hive scales log weight only [7], and BeeHero in-hive sensors measure acoustics and climate and report over Bluetooth Low Energy to a cellular gateway in a closed system [8] (Table I).</w:t>
       </w:r>
     </w:p>
     <w:p>
@@ -3283,214 +2979,256 @@
           <w:szCs w:val="22"/>
         </w:rPr>
       </w:pPr>
-      <w:r>
-        <w:rPr>
-          <w:sz w:val="22"/>
-          <w:szCs w:val="22"/>
-        </w:rPr>
-        <w:t xml:space="preserve">The parts are in </w:t>
-      </w:r>
       <w:proofErr w:type="gramStart"/>
-      <w:r>
-        <w:rPr>
-          <w:sz w:val="22"/>
-          <w:szCs w:val="22"/>
-        </w:rPr>
-        <w:t>hand</w:t>
-      </w:r>
       <w:proofErr w:type="gramEnd"/>
-      <w:r>
-        <w:rPr>
-          <w:sz w:val="22"/>
-          <w:szCs w:val="22"/>
-        </w:rPr>
-        <w:t xml:space="preserve"> but no node is built yet, so feasibility is shown from published measurements and datasheet values, each to be replaced by a bench measurement. </w:t>
-      </w:r>
-      <w:r>
-        <w:rPr>
-          <w:i/>
-          <w:iCs/>
-          <w:sz w:val="22"/>
-          <w:szCs w:val="22"/>
-        </w:rPr>
-        <w:t>Signal levels:</w:t>
-      </w:r>
-      <w:r>
-        <w:rPr>
-          <w:sz w:val="22"/>
-          <w:szCs w:val="22"/>
-        </w:rPr>
-        <w:t xml:space="preserve"> comb vibration measured at night with laboratory accelerometers is only 1–5 µm/s² per spectral bin, and about ten times weaker on the hive wall [9]; a MEMS accelerometer (≈25 µg/√Hz, i.e. ≈4×10⁻⁴ m/s² per 3 Hz bin) would sit about a hundred times above it, which is why we use a piezoelectric sensor in the comb. The pre-swarm </w:t>
-      </w:r>
-      <w:r>
-        <w:rPr>
-          <w:sz w:val="22"/>
-          <w:szCs w:val="22"/>
-        </w:rPr>
-        <w:lastRenderedPageBreak/>
-        <w:t xml:space="preserve">changes in [2] were found with ordinary in-hive microphones, so our microphone channel is expected to resolve them; whether the piezo chain also resolves the quieter comb vibrations is measured in Stage 1 (fallback: external audio ADC). The departure itself (mass flight, 1–2 kg) gives a robust confirmation. </w:t>
-      </w:r>
-      <w:r>
-        <w:rPr>
-          <w:i/>
-          <w:iCs/>
-          <w:sz w:val="22"/>
-          <w:szCs w:val="22"/>
-        </w:rPr>
-        <w:t>Data and link:</w:t>
-      </w:r>
-      <w:r>
-        <w:rPr>
-          <w:sz w:val="22"/>
-          <w:szCs w:val="22"/>
+      <w:proofErr w:type="spellStart"/>
+      <w:proofErr w:type="spellEnd"/>
+      <w:proofErr w:type="spellStart"/>
+      <w:proofErr w:type="spellEnd"/>
+      <w:proofErr w:type="spellStart"/>
+      <w:proofErr w:type="spellEnd"/>
+      <w:r>
+        <w:rPr>
+          <w:b w:val="0"/>
+          <w:bCs w:val="0"/>
+          <w:i w:val="0"/>
+          <w:iCs w:val="0"/>
+          <w:sz w:val="22"/>
+          <w:szCs w:val="22"/>
+          <w:rtl w:val="0"/>
+        </w:rPr>
+        <w:t xml:space="preserve">The parts are in hand but no node is built yet, so feasibility is shown from published measurements and datasheet values, each to be replaced by a bench measurement. </w:t>
+      </w:r>
+      <w:r>
+        <w:rPr>
+          <w:b w:val="0"/>
+          <w:bCs w:val="0"/>
+          <w:i w:val="1"/>
+          <w:iCs w:val="1"/>
+          <w:sz w:val="22"/>
+          <w:szCs w:val="22"/>
+          <w:rtl w:val="0"/>
+        </w:rPr>
+        <w:t xml:space="preserve">Signal levels:</w:t>
+      </w:r>
+      <w:r>
+        <w:rPr>
+          <w:b w:val="0"/>
+          <w:bCs w:val="0"/>
+          <w:i w:val="0"/>
+          <w:iCs w:val="0"/>
+          <w:sz w:val="22"/>
+          <w:szCs w:val="22"/>
+          <w:rtl w:val="0"/>
+        </w:rPr>
+        <w:t xml:space="preserve"> comb vibration measured at night with laboratory accelerometers is only 1–5 µm/s² per spectral bin, about ten times weaker on the hive wall [9], and far below the noise of a typical MEMS accelerometer (≈25 µg/√Hz), hence a piezoelectric sensor in the comb. The pre-swarm changes in [2] were found with ordinary in-hive microphones, so our microphone channel is expected to resolve them; whether the piezo chain also resolves the quieter comb vibrations is measured in Stage 1 (fallback: external audio ADC). The departure itself (mass flight, 1–2 kg) gives a robust confirmation. </w:t>
+      </w:r>
+      <w:r>
+        <w:rPr>
+          <w:b w:val="0"/>
+          <w:bCs w:val="0"/>
+          <w:i w:val="1"/>
+          <w:iCs w:val="1"/>
+          <w:sz w:val="22"/>
+          <w:szCs w:val="22"/>
+          <w:rtl w:val="0"/>
+        </w:rPr>
+        <w:t xml:space="preserve">Data and link:</w:t>
+      </w:r>
+      <w:r>
+        <w:rPr>
+          <w:b w:val="0"/>
+          <w:bCs w:val="0"/>
+          <w:i w:val="0"/>
+          <w:iCs w:val="0"/>
+          <w:sz w:val="22"/>
+          <w:szCs w:val="22"/>
+          <w:rtl w:val="0"/>
         </w:rPr>
         <w:t xml:space="preserve"> raw data is 4 kB/s per channel; features reduce it to ≈75 bytes per report, one ESP-NOW frame (≤250 bytes, 1 Mbps, MAC-level acknowledgement [10]), so 20 hives need ≈5 MB/month of cellular data. Wood, honey and bees attenuate 2.4 GHz, so the radio sits outside the hive body; range is measured on site first (fallback: LoRa on SPI). </w:t>
       </w:r>
       <w:r>
         <w:rPr>
-          <w:i/>
-          <w:iCs/>
-          <w:sz w:val="22"/>
-          <w:szCs w:val="22"/>
-        </w:rPr>
-        <w:t>Weighing:</w:t>
-      </w:r>
-      <w:r>
-        <w:rPr>
-          <w:sz w:val="22"/>
-          <w:szCs w:val="22"/>
-        </w:rPr>
-        <w:t xml:space="preserve"> four 50 kg cells at 1 mV/V and 3.3 V excitation give 16.5 µV/kg; the HX711 noise of 50 </w:t>
-      </w:r>
-      <w:proofErr w:type="spellStart"/>
-      <w:r>
-        <w:rPr>
-          <w:sz w:val="22"/>
-          <w:szCs w:val="22"/>
-        </w:rPr>
-        <w:t>nV</w:t>
-      </w:r>
-      <w:proofErr w:type="spellEnd"/>
-      <w:r>
-        <w:rPr>
-          <w:sz w:val="22"/>
-          <w:szCs w:val="22"/>
-        </w:rPr>
-        <w:t xml:space="preserve"> rms at 10 samples/s [11] equals ≈3 g, so load-cell temperature drift will set field accuracy. </w:t>
-      </w:r>
-      <w:r>
-        <w:rPr>
-          <w:i/>
-          <w:iCs/>
-          <w:sz w:val="22"/>
-          <w:szCs w:val="22"/>
-        </w:rPr>
-        <w:t>Node power:</w:t>
-      </w:r>
-      <w:r>
-        <w:rPr>
-          <w:sz w:val="22"/>
-          <w:szCs w:val="22"/>
+          <w:b w:val="0"/>
+          <w:bCs w:val="0"/>
+          <w:i w:val="1"/>
+          <w:iCs w:val="1"/>
+          <w:sz w:val="22"/>
+          <w:szCs w:val="22"/>
+          <w:rtl w:val="0"/>
+        </w:rPr>
+        <w:t xml:space="preserve">Weighing:</w:t>
+      </w:r>
+      <w:r>
+        <w:rPr>
+          <w:b w:val="0"/>
+          <w:bCs w:val="0"/>
+          <w:i w:val="0"/>
+          <w:iCs w:val="0"/>
+          <w:sz w:val="22"/>
+          <w:szCs w:val="22"/>
+          <w:rtl w:val="0"/>
+        </w:rPr>
+        <w:t xml:space="preserve"> four 50 kg cells at 1 mV/V and 3.3 V excitation give 16.5 µV/kg; the HX711 noise of 50 nV rms at 10 samples/s [11] equals ≈3 g, so load-cell temperature drift will set field accuracy. </w:t>
+      </w:r>
+      <w:r>
+        <w:rPr>
+          <w:b w:val="0"/>
+          <w:bCs w:val="0"/>
+          <w:i w:val="1"/>
+          <w:iCs w:val="1"/>
+          <w:sz w:val="22"/>
+          <w:szCs w:val="22"/>
+          <w:rtl w:val="0"/>
+        </w:rPr>
+        <w:t xml:space="preserve">Node power:</w:t>
+      </w:r>
+      <w:r>
+        <w:rPr>
+          <w:b w:val="0"/>
+          <w:bCs w:val="0"/>
+          <w:i w:val="0"/>
+          <w:iCs w:val="0"/>
+          <w:sz w:val="22"/>
+          <w:szCs w:val="22"/>
+          <w:rtl w:val="0"/>
         </w:rPr>
         <w:t xml:space="preserve"> for task currents </w:t>
       </w:r>
-      <w:proofErr w:type="spellStart"/>
-      <w:r>
-        <w:rPr>
-          <w:i/>
-          <w:iCs/>
-          <w:sz w:val="22"/>
-          <w:szCs w:val="22"/>
-        </w:rPr>
-        <w:t>I</w:t>
-      </w:r>
-      <w:r>
-        <w:rPr>
-          <w:i/>
-          <w:iCs/>
+      <w:r>
+        <w:rPr>
+          <w:b w:val="0"/>
+          <w:bCs w:val="0"/>
+          <w:i w:val="1"/>
+          <w:iCs w:val="1"/>
+          <w:sz w:val="22"/>
+          <w:szCs w:val="22"/>
+          <w:rtl w:val="0"/>
+        </w:rPr>
+        <w:t xml:space="preserve">I</w:t>
+      </w:r>
+      <w:r>
+        <w:rPr>
+          <w:b w:val="0"/>
+          <w:bCs w:val="0"/>
+          <w:i w:val="1"/>
+          <w:iCs w:val="1"/>
           <w:sz w:val="22"/>
           <w:szCs w:val="22"/>
           <w:vertAlign w:val="subscript"/>
-        </w:rPr>
-        <w:t>i</w:t>
-      </w:r>
-      <w:proofErr w:type="spellEnd"/>
-      <w:r>
-        <w:rPr>
-          <w:sz w:val="22"/>
-          <w:szCs w:val="22"/>
+          <w:rtl w:val="0"/>
+        </w:rPr>
+        <w:t xml:space="preserve">i</w:t>
+      </w:r>
+      <w:r>
+        <w:rPr>
+          <w:b w:val="0"/>
+          <w:bCs w:val="0"/>
+          <w:i w:val="0"/>
+          <w:iCs w:val="0"/>
+          <w:sz w:val="22"/>
+          <w:szCs w:val="22"/>
+          <w:rtl w:val="0"/>
         </w:rPr>
         <w:t xml:space="preserve"> lasting </w:t>
       </w:r>
-      <w:proofErr w:type="spellStart"/>
-      <w:r>
-        <w:rPr>
-          <w:i/>
-          <w:iCs/>
-          <w:sz w:val="22"/>
-          <w:szCs w:val="22"/>
-        </w:rPr>
-        <w:t>t</w:t>
-      </w:r>
-      <w:r>
-        <w:rPr>
-          <w:i/>
-          <w:iCs/>
+      <w:r>
+        <w:rPr>
+          <w:b w:val="0"/>
+          <w:bCs w:val="0"/>
+          <w:i w:val="1"/>
+          <w:iCs w:val="1"/>
+          <w:sz w:val="22"/>
+          <w:szCs w:val="22"/>
+          <w:rtl w:val="0"/>
+        </w:rPr>
+        <w:t xml:space="preserve">t</w:t>
+      </w:r>
+      <w:r>
+        <w:rPr>
+          <w:b w:val="0"/>
+          <w:bCs w:val="0"/>
+          <w:i w:val="1"/>
+          <w:iCs w:val="1"/>
           <w:sz w:val="22"/>
           <w:szCs w:val="22"/>
           <w:vertAlign w:val="subscript"/>
-        </w:rPr>
-        <w:t>i</w:t>
-      </w:r>
-      <w:proofErr w:type="spellEnd"/>
-      <w:r>
-        <w:rPr>
-          <w:sz w:val="22"/>
-          <w:szCs w:val="22"/>
+          <w:rtl w:val="0"/>
+        </w:rPr>
+        <w:t xml:space="preserve">i</w:t>
+      </w:r>
+      <w:r>
+        <w:rPr>
+          <w:b w:val="0"/>
+          <w:bCs w:val="0"/>
+          <w:i w:val="0"/>
+          <w:iCs w:val="0"/>
+          <w:sz w:val="22"/>
+          <w:szCs w:val="22"/>
+          <w:rtl w:val="0"/>
         </w:rPr>
         <w:t xml:space="preserve"> per acquisition, </w:t>
       </w:r>
       <w:r>
         <w:rPr>
-          <w:i/>
-          <w:iCs/>
-          <w:sz w:val="22"/>
-          <w:szCs w:val="22"/>
-        </w:rPr>
-        <w:t>A</w:t>
-      </w:r>
-      <w:r>
-        <w:rPr>
-          <w:sz w:val="22"/>
-          <w:szCs w:val="22"/>
+          <w:b w:val="0"/>
+          <w:bCs w:val="0"/>
+          <w:i w:val="1"/>
+          <w:iCs w:val="1"/>
+          <w:sz w:val="22"/>
+          <w:szCs w:val="22"/>
+          <w:rtl w:val="0"/>
+        </w:rPr>
+        <w:t xml:space="preserve">A</w:t>
+      </w:r>
+      <w:r>
+        <w:rPr>
+          <w:b w:val="0"/>
+          <w:bCs w:val="0"/>
+          <w:i w:val="0"/>
+          <w:iCs w:val="0"/>
+          <w:sz w:val="22"/>
+          <w:szCs w:val="22"/>
+          <w:rtl w:val="0"/>
         </w:rPr>
         <w:t xml:space="preserve"> acquisitions per day and a continuous current </w:t>
       </w:r>
       <w:r>
         <w:rPr>
-          <w:i/>
-          <w:iCs/>
-          <w:sz w:val="22"/>
-          <w:szCs w:val="22"/>
-        </w:rPr>
-        <w:t>I</w:t>
-      </w:r>
-      <w:r>
-        <w:rPr>
-          <w:i/>
-          <w:iCs/>
+          <w:b w:val="0"/>
+          <w:bCs w:val="0"/>
+          <w:i w:val="1"/>
+          <w:iCs w:val="1"/>
+          <w:sz w:val="22"/>
+          <w:szCs w:val="22"/>
+          <w:rtl w:val="0"/>
+        </w:rPr>
+        <w:t xml:space="preserve">I</w:t>
+      </w:r>
+      <w:r>
+        <w:rPr>
+          <w:b w:val="0"/>
+          <w:bCs w:val="0"/>
+          <w:i w:val="1"/>
+          <w:iCs w:val="1"/>
           <w:sz w:val="22"/>
           <w:szCs w:val="22"/>
           <w:vertAlign w:val="subscript"/>
-        </w:rPr>
-        <w:t>0</w:t>
-      </w:r>
-      <w:r>
-        <w:rPr>
-          <w:sz w:val="22"/>
-          <w:szCs w:val="22"/>
-        </w:rPr>
-        <w:t>,</w:t>
+          <w:rtl w:val="0"/>
+        </w:rPr>
+        <w:t xml:space="preserve">0</w:t>
+      </w:r>
+      <w:r>
+        <w:rPr>
+          <w:b w:val="0"/>
+          <w:bCs w:val="0"/>
+          <w:i w:val="0"/>
+          <w:iCs w:val="0"/>
+          <w:sz w:val="22"/>
+          <w:szCs w:val="22"/>
+          <w:rtl w:val="0"/>
+        </w:rPr>
+        <w:t xml:space="preserve">,</w:t>
       </w:r>
     </w:p>
     <w:p>
@@ -3730,150 +3468,134 @@
           <w:szCs w:val="22"/>
         </w:rPr>
       </w:pPr>
-      <w:r>
-        <w:rPr>
-          <w:sz w:val="22"/>
-          <w:szCs w:val="22"/>
-        </w:rPr>
-        <w:t xml:space="preserve">One acquisition </w:t>
-      </w:r>
       <w:proofErr w:type="gramStart"/>
-      <w:r>
-        <w:rPr>
-          <w:sz w:val="22"/>
-          <w:szCs w:val="22"/>
-        </w:rPr>
-        <w:t>costs</w:t>
-      </w:r>
       <w:proofErr w:type="gramEnd"/>
-      <w:r>
-        <w:rPr>
-          <w:sz w:val="22"/>
-          <w:szCs w:val="22"/>
-        </w:rPr>
-        <w:t xml:space="preserve"> ≈0.30 A·s: 22 mA at 80 MHz for the 10 s recording and 28 mA at 160 MHz for ≈1.5 s of FFTs [12], 0.15 s of radio at ≈120 mA average (335 mA TX peak [12]), and the microphone (≈1.4 mA), preamplifier and HX711. With </w:t>
-      </w:r>
-      <w:r>
-        <w:rPr>
-          <w:i/>
-          <w:iCs/>
-          <w:sz w:val="22"/>
-          <w:szCs w:val="22"/>
-        </w:rPr>
-        <w:t>I</w:t>
-      </w:r>
-      <w:r>
-        <w:rPr>
-          <w:i/>
-          <w:iCs/>
+      <w:proofErr w:type="spellStart"/>
+      <w:proofErr w:type="spellEnd"/>
+      <w:proofErr w:type="spellStart"/>
+      <w:proofErr w:type="spellEnd"/>
+      <w:proofErr w:type="spellStart"/>
+      <w:proofErr w:type="spellEnd"/>
+      <w:r>
+        <w:rPr>
+          <w:b w:val="0"/>
+          <w:bCs w:val="0"/>
+          <w:i w:val="0"/>
+          <w:iCs w:val="0"/>
+          <w:sz w:val="22"/>
+          <w:szCs w:val="22"/>
+          <w:rtl w:val="0"/>
+        </w:rPr>
+        <w:t xml:space="preserve">One acquisition costs ≈0.30 A·s: 22 mA at 80 MHz for the 10 s recording and 28 mA at 160 MHz for ≈1.5 s of FFTs [12], 0.15 s of radio at ≈120 mA average (335 mA TX peak [12]), and the microphone (≈1.4 mA), preamplifier and HX711. With </w:t>
+      </w:r>
+      <w:r>
+        <w:rPr>
+          <w:b w:val="0"/>
+          <w:bCs w:val="0"/>
+          <w:i w:val="1"/>
+          <w:iCs w:val="1"/>
+          <w:sz w:val="22"/>
+          <w:szCs w:val="22"/>
+          <w:rtl w:val="0"/>
+        </w:rPr>
+        <w:t xml:space="preserve">I</w:t>
+      </w:r>
+      <w:r>
+        <w:rPr>
+          <w:b w:val="0"/>
+          <w:bCs w:val="0"/>
+          <w:i w:val="1"/>
+          <w:iCs w:val="1"/>
           <w:sz w:val="22"/>
           <w:szCs w:val="22"/>
           <w:vertAlign w:val="subscript"/>
-        </w:rPr>
-        <w:t>0</w:t>
-      </w:r>
-      <w:r>
-        <w:rPr>
-          <w:sz w:val="22"/>
-          <w:szCs w:val="22"/>
+          <w:rtl w:val="0"/>
+        </w:rPr>
+        <w:t xml:space="preserve">0</w:t>
+      </w:r>
+      <w:r>
+        <w:rPr>
+          <w:b w:val="0"/>
+          <w:bCs w:val="0"/>
+          <w:i w:val="0"/>
+          <w:iCs w:val="0"/>
+          <w:sz w:val="22"/>
+          <w:szCs w:val="22"/>
+          <w:rtl w:val="0"/>
         </w:rPr>
         <w:t xml:space="preserve"> = 22 µA (2 µA wake circuit, 5 µA chip [12], LDO and leakage) and 96 periodic acquisitions per day, </w:t>
       </w:r>
       <w:r>
         <w:rPr>
-          <w:i/>
-          <w:iCs/>
-          <w:sz w:val="22"/>
-          <w:szCs w:val="22"/>
-        </w:rPr>
-        <w:t>Ī</w:t>
-      </w:r>
-      <w:r>
-        <w:rPr>
-          <w:sz w:val="22"/>
-          <w:szCs w:val="22"/>
-        </w:rPr>
-        <w:t xml:space="preserve"> ≈ 0.35 mA, and one 3000 </w:t>
-      </w:r>
-      <w:proofErr w:type="spellStart"/>
-      <w:r>
-        <w:rPr>
-          <w:sz w:val="22"/>
-          <w:szCs w:val="22"/>
-        </w:rPr>
-        <w:t>mAh</w:t>
-      </w:r>
-      <w:proofErr w:type="spellEnd"/>
-      <w:r>
-        <w:rPr>
-          <w:sz w:val="22"/>
-          <w:szCs w:val="22"/>
-        </w:rPr>
-        <w:t xml:space="preserve"> cell with </w:t>
-      </w:r>
-      <w:r>
-        <w:rPr>
-          <w:i/>
-          <w:iCs/>
-          <w:sz w:val="22"/>
-          <w:szCs w:val="22"/>
-        </w:rPr>
-        <w:t>η</w:t>
-      </w:r>
-      <w:r>
-        <w:rPr>
-          <w:sz w:val="22"/>
-          <w:szCs w:val="22"/>
+          <w:b w:val="0"/>
+          <w:bCs w:val="0"/>
+          <w:i w:val="1"/>
+          <w:iCs w:val="1"/>
+          <w:sz w:val="22"/>
+          <w:szCs w:val="22"/>
+          <w:rtl w:val="0"/>
+        </w:rPr>
+        <w:t xml:space="preserve">Ī</w:t>
+      </w:r>
+      <w:r>
+        <w:rPr>
+          <w:b w:val="0"/>
+          <w:bCs w:val="0"/>
+          <w:i w:val="0"/>
+          <w:iCs w:val="0"/>
+          <w:sz w:val="22"/>
+          <w:szCs w:val="22"/>
+          <w:rtl w:val="0"/>
+        </w:rPr>
+        <w:t xml:space="preserve"> ≈ 0.35 mA, and one 3000 mAh cell with </w:t>
+      </w:r>
+      <w:r>
+        <w:rPr>
+          <w:b w:val="0"/>
+          <w:bCs w:val="0"/>
+          <w:i w:val="1"/>
+          <w:iCs w:val="1"/>
+          <w:sz w:val="22"/>
+          <w:szCs w:val="22"/>
+          <w:rtl w:val="0"/>
+        </w:rPr>
+        <w:t xml:space="preserve">η</w:t>
+      </w:r>
+      <w:r>
+        <w:rPr>
+          <w:b w:val="0"/>
+          <w:bCs w:val="0"/>
+          <w:i w:val="0"/>
+          <w:iCs w:val="0"/>
+          <w:sz w:val="22"/>
+          <w:szCs w:val="22"/>
+          <w:rtl w:val="0"/>
         </w:rPr>
         <w:t xml:space="preserve"> = 0.8 lasts ≈285 days; each extra event wake costs ≈3.4 µA, so the six-month target holds up to ≈60 event wakes per day (Fig. 2), which the adaptive threshold and 20-min hold-off keep well below. </w:t>
       </w:r>
       <w:r>
         <w:rPr>
-          <w:i/>
-          <w:iCs/>
-          <w:sz w:val="22"/>
-          <w:szCs w:val="22"/>
-        </w:rPr>
-        <w:t>Hub power:</w:t>
-      </w:r>
-      <w:r>
-        <w:rPr>
-          <w:sz w:val="22"/>
-          <w:szCs w:val="22"/>
-        </w:rPr>
-        <w:t xml:space="preserve"> listening continuously (≈100 mA) plus the modem, the hub draws ≈0.5 W (≈12 </w:t>
-      </w:r>
-      <w:proofErr w:type="spellStart"/>
-      <w:r>
-        <w:rPr>
-          <w:sz w:val="22"/>
-          <w:szCs w:val="22"/>
-        </w:rPr>
-        <w:t>Wh</w:t>
-      </w:r>
-      <w:proofErr w:type="spellEnd"/>
-      <w:r>
-        <w:rPr>
-          <w:sz w:val="22"/>
-          <w:szCs w:val="22"/>
-        </w:rPr>
-        <w:t xml:space="preserve">/day) against ≈45 </w:t>
-      </w:r>
-      <w:proofErr w:type="spellStart"/>
-      <w:r>
-        <w:rPr>
-          <w:sz w:val="22"/>
-          <w:szCs w:val="22"/>
-        </w:rPr>
-        <w:t>Wh</w:t>
-      </w:r>
-      <w:proofErr w:type="spellEnd"/>
-      <w:r>
-        <w:rPr>
-          <w:sz w:val="22"/>
-          <w:szCs w:val="22"/>
-        </w:rPr>
-        <w:t>/day from the panel (5 full-sun hours, 60% conversion); three 18650 cells cover two days without sun.</w:t>
+          <w:b w:val="0"/>
+          <w:bCs w:val="0"/>
+          <w:i w:val="1"/>
+          <w:iCs w:val="1"/>
+          <w:sz w:val="22"/>
+          <w:szCs w:val="22"/>
+          <w:rtl w:val="0"/>
+        </w:rPr>
+        <w:t xml:space="preserve">Hub power:</w:t>
+      </w:r>
+      <w:r>
+        <w:rPr>
+          <w:b w:val="0"/>
+          <w:bCs w:val="0"/>
+          <w:i w:val="0"/>
+          <w:iCs w:val="0"/>
+          <w:sz w:val="22"/>
+          <w:szCs w:val="22"/>
+          <w:rtl w:val="0"/>
+        </w:rPr>
+        <w:t xml:space="preserve"> continuous receive plus the modem draw ≈0.5 W (≈12 Wh/day) against ≈45 Wh/day from the panel (5 full-sun hours, 60% conversion); three 18650 cells cover two days without sun.</w:t>
       </w:r>
     </w:p>
     <w:p>
@@ -3894,7 +3616,7 @@
         </w:rPr>
         <w:drawing>
           <wp:inline distT="0" distB="0" distL="114300" distR="114300" wp14:anchorId="430EDE66" wp14:editId="2C76C30D">
-            <wp:extent cx="5120640" cy="1422400"/>
+            <wp:extent cx="4572000" cy="1270000"/>
             <wp:effectExtent l="0" t="0" r="0" b="0"/>
             <wp:docPr id="5" name="image3.png"/>
             <wp:cNvGraphicFramePr/>
@@ -3915,7 +3637,7 @@
                   <pic:spPr>
                     <a:xfrm>
                       <a:off x="0" y="0"/>
-                      <a:ext cx="5120640" cy="1422400"/>
+                      <a:ext cx="4572000" cy="1270000"/>
                     </a:xfrm>
                     <a:prstGeom prst="rect">
                       <a:avLst/>
@@ -4701,6 +4423,37 @@
     </w:p>
     <w:p>
       <w:pPr>
+        <w:keepNext/>
+        <w:spacing w:after="80" w:line="360" w:lineRule="auto" w:before="120"/>
+        <w:jc w:val="left"/>
+        <w:rPr>
+          <w:sz w:val="22"/>
+          <w:szCs w:val="22"/>
+        </w:rPr>
+      </w:pPr>
+      <w:proofErr w:type="spellStart"/>
+      <w:proofErr w:type="spellEnd"/>
+      <w:proofErr w:type="spellStart"/>
+      <w:proofErr w:type="spellEnd"/>
+      <w:proofErr w:type="spellStart"/>
+      <w:proofErr w:type="spellEnd"/>
+      <w:proofErr w:type="spellStart"/>
+      <w:proofErr w:type="spellEnd"/>
+      <w:r>
+        <w:rPr>
+          <w:b w:val="1"/>
+          <w:bCs w:val="1"/>
+          <w:i w:val="0"/>
+          <w:iCs w:val="0"/>
+          <w:sz w:val="20"/>
+          <w:szCs w:val="20"/>
+          <w:rtl w:val="0"/>
+        </w:rPr>
+        <w:t xml:space="preserve">Background research: precision beekeeping, swarming and hive signals</w:t>
+      </w:r>
+    </w:p>
+    <w:p>
+      <w:pPr>
         <w:tabs>
           <w:tab w:val="left" w:pos="510"/>
         </w:tabs>
@@ -5121,6 +4874,37 @@
     </w:p>
     <w:p>
       <w:pPr>
+        <w:keepNext/>
+        <w:spacing w:after="80" w:line="360" w:lineRule="auto" w:before="120"/>
+        <w:jc w:val="left"/>
+        <w:rPr>
+          <w:sz w:val="22"/>
+          <w:szCs w:val="22"/>
+        </w:rPr>
+      </w:pPr>
+      <w:proofErr w:type="spellStart"/>
+      <w:proofErr w:type="spellEnd"/>
+      <w:proofErr w:type="spellStart"/>
+      <w:proofErr w:type="spellEnd"/>
+      <w:proofErr w:type="gramStart"/>
+      <w:proofErr w:type="gramEnd"/>
+      <w:proofErr w:type="spellStart"/>
+      <w:proofErr w:type="spellEnd"/>
+      <w:r>
+        <w:rPr>
+          <w:b w:val="1"/>
+          <w:bCs w:val="1"/>
+          <w:i w:val="0"/>
+          <w:iCs w:val="0"/>
+          <w:sz w:val="20"/>
+          <w:szCs w:val="20"/>
+          <w:rtl w:val="0"/>
+        </w:rPr>
+        <w:t xml:space="preserve">Existing hive-monitoring systems</w:t>
+      </w:r>
+    </w:p>
+    <w:p>
+      <w:pPr>
         <w:tabs>
           <w:tab w:val="left" w:pos="510"/>
         </w:tabs>
@@ -5330,6 +5114,35 @@
           <w:szCs w:val="20"/>
         </w:rPr>
         <w:t>, "Technology." [Online]. Available: https://www.beehero.io/technology</w:t>
+      </w:r>
+    </w:p>
+    <w:p>
+      <w:pPr>
+        <w:keepNext/>
+        <w:spacing w:after="80" w:line="360" w:lineRule="auto" w:before="120"/>
+        <w:jc w:val="left"/>
+        <w:rPr>
+          <w:sz w:val="22"/>
+          <w:szCs w:val="22"/>
+        </w:rPr>
+      </w:pPr>
+      <w:proofErr w:type="spellStart"/>
+      <w:proofErr w:type="spellEnd"/>
+      <w:proofErr w:type="spellStart"/>
+      <w:proofErr w:type="spellEnd"/>
+      <w:proofErr w:type="spellStart"/>
+      <w:proofErr w:type="spellEnd"/>
+      <w:r>
+        <w:rPr>
+          <w:b w:val="1"/>
+          <w:bCs w:val="1"/>
+          <w:i w:val="0"/>
+          <w:iCs w:val="0"/>
+          <w:sz w:val="20"/>
+          <w:szCs w:val="20"/>
+          <w:rtl w:val="0"/>
+        </w:rPr>
+        <w:t xml:space="preserve">Design data: signal levels, communication and components</w:t>
       </w:r>
     </w:p>
     <w:p>

</xml_diff>

<commit_message>
vault backup: 2026-10-25 16:32:24
Affected files:
.obsidian/plugins/word-reader/data.json
docs/pdr-2027-165.docx
</commit_message>
<xml_diff>
--- a/docs/pdr-2027-165.docx
+++ b/docs/pdr-2027-165.docx
@@ -264,11 +264,9 @@
         <w:rPr>
           <w:b/>
           <w:bCs/>
-          <w:i w:val="0"/>
-          <w:iCs w:val="0"/>
-          <w:rtl w:val="1"/>
-        </w:rPr>
-        <w:t xml:space="preserve">בי-סנס – ניטור אקוסטי ומשקלי של מושבות דבורי דבש מבוסס האינטרנט של הדברים</w:t>
+          <w:rtl/>
+        </w:rPr>
+        <w:t>בי-סנס – ניטור אקוסטי ומשקלי של מושבות דבורי דבש מבוסס האינטרנט של הדברים</w:t>
       </w:r>
     </w:p>
     <w:p>
@@ -633,14 +631,13 @@
         <w:rPr>
           <w:b/>
           <w:bCs/>
-          <w:i w:val="0"/>
-          <w:iCs w:val="0"/>
           <w:sz w:val="26"/>
           <w:szCs w:val="26"/>
           <w:u w:val="single"/>
-          <w:rtl w:val="1"/>
-        </w:rPr>
-        <w:t xml:space="preserve">בי-סנס – ניטור אקוסטי ומשקלי של מושבות דבורי דבש מבוסס האינטרנט של הדברים</w:t>
+          <w:rtl/>
+        </w:rPr>
+        <w:lastRenderedPageBreak/>
+        <w:t>בי-סנס – ניטור אקוסטי ומשקלי של מושבות דבורי דבש מבוסס האינטרנט של הדברים</w:t>
       </w:r>
     </w:p>
     <w:p>
@@ -670,14 +667,44 @@
         <w:rPr>
           <w:sz w:val="22"/>
           <w:szCs w:val="22"/>
-        </w:rPr>
-      </w:pPr>
-      <w:r>
-        <w:rPr>
-          <w:sz w:val="22"/>
-          <w:szCs w:val="22"/>
-        </w:rPr>
-        <w:t>drorbe@post.bgu.ac.il</w:t>
+          <w:rtl/>
+        </w:rPr>
+      </w:pPr>
+      <w:hyperlink r:id="rId12" w:history="1">
+        <w:r>
+          <w:rPr>
+            <w:rStyle w:val="Hyperlink"/>
+            <w:sz w:val="22"/>
+            <w:szCs w:val="22"/>
+          </w:rPr>
+          <w:t>drorbe@post.bgu.ac.il</w:t>
+        </w:r>
+      </w:hyperlink>
+    </w:p>
+    <w:p>
+      <w:pPr>
+        <w:bidi/>
+        <w:spacing w:after="0" w:line="240" w:lineRule="auto"/>
+        <w:jc w:val="center"/>
+        <w:rPr>
+          <w:rFonts w:hint="cs"/>
+          <w:sz w:val="22"/>
+          <w:szCs w:val="22"/>
+        </w:rPr>
+      </w:pPr>
+      <w:r>
+        <w:rPr>
+          <w:sz w:val="22"/>
+          <w:szCs w:val="22"/>
+        </w:rPr>
+        <w:t>dancoop</w:t>
+      </w:r>
+      <w:r>
+        <w:rPr>
+          <w:sz w:val="22"/>
+          <w:szCs w:val="22"/>
+        </w:rPr>
+        <w:t>@post.bgu.ac.il</w:t>
       </w:r>
     </w:p>
     <w:p>
@@ -740,169 +767,101 @@
           <w:szCs w:val="22"/>
         </w:rPr>
       </w:pPr>
-      <w:proofErr w:type="spellStart"/>
-      <w:proofErr w:type="spellEnd"/>
-      <w:proofErr w:type="spellStart"/>
-      <w:proofErr w:type="spellEnd"/>
-      <w:proofErr w:type="spellStart"/>
-      <w:proofErr w:type="spellEnd"/>
-      <w:proofErr w:type="spellStart"/>
-      <w:proofErr w:type="spellEnd"/>
-      <w:proofErr w:type="spellStart"/>
-      <w:proofErr w:type="spellEnd"/>
-      <w:r>
-        <w:rPr>
-          <w:b w:val="0"/>
-          <w:bCs w:val="0"/>
-          <w:i w:val="0"/>
-          <w:iCs w:val="0"/>
-          <w:sz w:val="22"/>
-          <w:szCs w:val="22"/>
-          <w:rtl w:val="1"/>
-        </w:rPr>
-        <w:t xml:space="preserve">מצב כוורות הדבורים נבדק כיום בעיקר בפתיחה ידנית של הכוורת אחת לכמה שבועות עד חודשים, ובין ביקור לביקור המגדל אינו יודע מה מתרחש בה. הכנה לבריחת נחיל נמשכת כשבוע עד שבועיים, והנחיל, שלוקח איתו חלק ניכר מהמושבה, עוזב תוך דקות ולעיתים קרובות מתגלה רק בביקור הבא. בי-סנס היא מערכת מבוססת האינטרנט של הדברים (</w:t>
-      </w:r>
-      <w:r>
-        <w:rPr>
-          <w:b w:val="0"/>
-          <w:bCs w:val="0"/>
-          <w:i w:val="0"/>
-          <w:iCs w:val="0"/>
-          <w:sz w:val="22"/>
-          <w:szCs w:val="22"/>
-          <w:rtl w:val="0"/>
-        </w:rPr>
-        <w:t xml:space="preserve">IoT</w:t>
-      </w:r>
-      <w:r>
-        <w:rPr>
-          <w:b w:val="0"/>
-          <w:bCs w:val="0"/>
-          <w:i w:val="0"/>
-          <w:iCs w:val="0"/>
-          <w:sz w:val="22"/>
-          <w:szCs w:val="22"/>
-          <w:rtl w:val="1"/>
+      <w:r>
+        <w:rPr>
+          <w:sz w:val="22"/>
+          <w:szCs w:val="22"/>
+          <w:rtl/>
+        </w:rPr>
+        <w:t>מצב כוורות הדבורים נבדק כיום בעיקר בפתיחה ידנית של הכוורת אחת לכמה שבועות עד חודשים, ובין ביקור לביקור המגדל אינו יודע מה מתרחש בה. הכנה לבריחת נחיל נמשכת כשבוע עד שבועיים, והנחיל, שלוקח איתו חלק ניכר מהמושבה, עוזב תוך דקות ולעיתים קרובות מתגלה רק בביקור הבא. בי-סנס היא מערכת מבוססת האינטרנט של הדברים (</w:t>
+      </w:r>
+      <w:r>
+        <w:rPr>
+          <w:sz w:val="22"/>
+          <w:szCs w:val="22"/>
+        </w:rPr>
+        <w:t>IoT</w:t>
+      </w:r>
+      <w:r>
+        <w:rPr>
+          <w:sz w:val="22"/>
+          <w:szCs w:val="22"/>
+          <w:rtl/>
         </w:rPr>
         <w:t xml:space="preserve">) לניטור כוורות בכוורן ללא חשמל וללא רשת. בכל כוורת מותקן צומת סוללתי עם חיישן רטט פיאזואלקטרי, המאזין בצריכה של ננו-אמפרים ומעיר את הצומת כשהרטט חורג מרמת הרקע; הצומת מחשב את ספקטרום הרטט והקול ומשלב אותו עם משקל הכוורת והטמפרטורה. מרכזייה סולארית בכוורן אוספת את הנתונים, מזהה סימנים לנחילה מתקרבת וחריגות במושבה, ושולחת התרעות דרך הרשת הסלולרית. החדשנות היא מערכת אוטונומית וזולה שמביאה לשטח יכולת שהוכחה במעבדה, בצריכת הספק נמוכה פי אלפים ממערכות המחקר. היעדים: דיוק שקילה של </w:t>
       </w:r>
       <w:r>
         <w:rPr>
-          <w:b w:val="0"/>
-          <w:bCs w:val="0"/>
-          <w:i w:val="0"/>
-          <w:iCs w:val="0"/>
-          <w:sz w:val="22"/>
-          <w:szCs w:val="22"/>
-          <w:rtl w:val="0"/>
-        </w:rPr>
-        <w:t xml:space="preserve">20</w:t>
-      </w:r>
-      <w:r>
-        <w:rPr>
-          <w:b w:val="0"/>
-          <w:bCs w:val="0"/>
-          <w:i w:val="0"/>
-          <w:iCs w:val="0"/>
-          <w:sz w:val="22"/>
-          <w:szCs w:val="22"/>
-          <w:rtl w:val="1"/>
+          <w:sz w:val="22"/>
+          <w:szCs w:val="22"/>
+        </w:rPr>
+        <w:t>20</w:t>
+      </w:r>
+      <w:r>
+        <w:rPr>
+          <w:sz w:val="22"/>
+          <w:szCs w:val="22"/>
+          <w:rtl/>
         </w:rPr>
         <w:t xml:space="preserve">± גרם, קליטת חבילות מעל </w:t>
       </w:r>
       <w:r>
         <w:rPr>
-          <w:b w:val="0"/>
-          <w:bCs w:val="0"/>
-          <w:i w:val="0"/>
-          <w:iCs w:val="0"/>
-          <w:sz w:val="22"/>
-          <w:szCs w:val="22"/>
-          <w:rtl w:val="0"/>
-        </w:rPr>
-        <w:t xml:space="preserve">95%</w:t>
-      </w:r>
-      <w:r>
-        <w:rPr>
-          <w:b w:val="0"/>
-          <w:bCs w:val="0"/>
-          <w:i w:val="0"/>
-          <w:iCs w:val="0"/>
-          <w:sz w:val="22"/>
-          <w:szCs w:val="22"/>
-          <w:rtl w:val="1"/>
-        </w:rPr>
-        <w:t xml:space="preserve">, לפחות חצי שנה על סוללה, וכיעד המחייב, דיוק (</w:t>
-      </w:r>
-      <w:r>
-        <w:rPr>
-          <w:b w:val="0"/>
-          <w:bCs w:val="0"/>
-          <w:i w:val="0"/>
-          <w:iCs w:val="0"/>
-          <w:sz w:val="22"/>
-          <w:szCs w:val="22"/>
-          <w:rtl w:val="0"/>
-        </w:rPr>
-        <w:t xml:space="preserve">Precision</w:t>
-      </w:r>
-      <w:r>
-        <w:rPr>
-          <w:b w:val="0"/>
-          <w:bCs w:val="0"/>
-          <w:i w:val="0"/>
-          <w:iCs w:val="0"/>
-          <w:sz w:val="22"/>
-          <w:szCs w:val="22"/>
-          <w:rtl w:val="1"/>
-        </w:rPr>
-        <w:t xml:space="preserve">) ורגישות (</w:t>
-      </w:r>
-      <w:r>
-        <w:rPr>
-          <w:b w:val="0"/>
-          <w:bCs w:val="0"/>
-          <w:i w:val="0"/>
-          <w:iCs w:val="0"/>
-          <w:sz w:val="22"/>
-          <w:szCs w:val="22"/>
-          <w:rtl w:val="0"/>
-        </w:rPr>
-        <w:t xml:space="preserve">Recall</w:t>
-      </w:r>
-      <w:r>
-        <w:rPr>
-          <w:b w:val="0"/>
-          <w:bCs w:val="0"/>
-          <w:i w:val="0"/>
-          <w:iCs w:val="0"/>
-          <w:sz w:val="22"/>
-          <w:szCs w:val="22"/>
-          <w:rtl w:val="1"/>
+          <w:sz w:val="22"/>
+          <w:szCs w:val="22"/>
+        </w:rPr>
+        <w:t>95%</w:t>
+      </w:r>
+      <w:r>
+        <w:rPr>
+          <w:sz w:val="22"/>
+          <w:szCs w:val="22"/>
+          <w:rtl/>
+        </w:rPr>
+        <w:t>, לפחות חצי שנה על סוללה, וכיעד המחייב, דיוק (</w:t>
+      </w:r>
+      <w:r>
+        <w:rPr>
+          <w:sz w:val="22"/>
+          <w:szCs w:val="22"/>
+        </w:rPr>
+        <w:t>Precision</w:t>
+      </w:r>
+      <w:r>
+        <w:rPr>
+          <w:sz w:val="22"/>
+          <w:szCs w:val="22"/>
+          <w:rtl/>
+        </w:rPr>
+        <w:t>) ורגישות (</w:t>
+      </w:r>
+      <w:r>
+        <w:rPr>
+          <w:sz w:val="22"/>
+          <w:szCs w:val="22"/>
+        </w:rPr>
+        <w:t>Recall</w:t>
+      </w:r>
+      <w:r>
+        <w:rPr>
+          <w:sz w:val="22"/>
+          <w:szCs w:val="22"/>
+          <w:rtl/>
         </w:rPr>
         <w:t xml:space="preserve">) מעל </w:t>
       </w:r>
       <w:r>
         <w:rPr>
-          <w:b w:val="0"/>
-          <w:bCs w:val="0"/>
-          <w:i w:val="0"/>
-          <w:iCs w:val="0"/>
-          <w:sz w:val="22"/>
-          <w:szCs w:val="22"/>
-          <w:rtl w:val="0"/>
-        </w:rPr>
-        <w:t xml:space="preserve">90%</w:t>
-      </w:r>
-      <w:r>
-        <w:rPr>
-          <w:b w:val="0"/>
-          <w:bCs w:val="0"/>
-          <w:i w:val="0"/>
-          <w:iCs w:val="0"/>
-          <w:sz w:val="22"/>
-          <w:szCs w:val="22"/>
-          <w:rtl w:val="1"/>
+          <w:sz w:val="22"/>
+          <w:szCs w:val="22"/>
+        </w:rPr>
+        <w:t>90%</w:t>
+      </w:r>
+      <w:r>
+        <w:rPr>
+          <w:sz w:val="22"/>
+          <w:szCs w:val="22"/>
+          <w:rtl/>
         </w:rPr>
         <w:t xml:space="preserve"> בהתרעה על נחילה לפני יציאת הנחיל.</w:t>
       </w:r>
@@ -987,7 +946,6 @@
           <w:szCs w:val="26"/>
           <w:u w:val="single"/>
         </w:rPr>
-        <w:lastRenderedPageBreak/>
         <w:t>BeeSense</w:t>
       </w:r>
       <w:proofErr w:type="spellEnd"/>
@@ -1097,21 +1055,12 @@
           <w:szCs w:val="22"/>
         </w:rPr>
       </w:pPr>
-      <w:proofErr w:type="gramStart"/>
-      <w:proofErr w:type="gramEnd"/>
-      <w:proofErr w:type="spellStart"/>
-      <w:proofErr w:type="spellEnd"/>
-      <w:r>
-        <w:rPr>
-          <w:b w:val="0"/>
-          <w:bCs w:val="0"/>
-          <w:i w:val="0"/>
-          <w:iCs w:val="0"/>
-          <w:sz w:val="22"/>
-          <w:szCs w:val="22"/>
-          <w:rtl w:val="0"/>
-        </w:rPr>
-        <w:t xml:space="preserve">Honeybee colonies are checked mainly by opening the hive every few weeks to months, leaving the beekeeper blind between visits. Swarm preparation takes one to two weeks, and the swarm, taking a large part of the colony, leaves within minutes and is often discovered only at the next visit. BeeSense is an Internet of Things (IoT) system for monitoring hives at apiaries without mains power or network. In each hive, a battery-powered node uses a piezoelectric vibration sensor that listens at nanoampere current and wakes the node when vibration rises above the background; the node then computes vibration and sound spectra and fuses them with hive weight and temperature. A solar-powered hub at the apiary collects the data, detects signs of an approaching swarm and colony anomalies, and sends alerts over the cellular network. The innovation is an autonomous, low-cost system that brings a laboratory-proven capability to the field, at thousands of times less power than research systems. Targets: weighing accuracy of ±20 g, packet delivery above 95%, at least six months per battery and, as the committed target, precision and recall above 90% for swarm alerts issued before the swarm leaves.</w:t>
+      <w:r>
+        <w:rPr>
+          <w:sz w:val="22"/>
+          <w:szCs w:val="22"/>
+        </w:rPr>
+        <w:t>Honeybee colonies are checked mainly by opening the hive every few weeks to months, leaving the beekeeper blind between visits. Swarm preparation takes one to two weeks, and the swarm, taking a large part of the colony, leaves within minutes and is often discovered only at the next visit. BeeSense is an Internet of Things (IoT) system for monitoring hives at apiaries without mains power or network. In each hive, a battery-powered node uses a piezoelectric vibration sensor that listens at nanoampere current and wakes the node when vibration rises above the background; the node then computes vibration and sound spectra and fuses them with hive weight and temperature. A solar-powered hub at the apiary collects the data, detects signs of an approaching swarm and colony anomalies, and sends alerts over the cellular network. The innovation is an autonomous, low-cost system that brings a laboratory-proven capability to the field, at thousands of times less power than research systems. Targets: weighing accuracy of ±20 g, packet delivery above 95%, at least six months per battery and, as the committed target, precision and recall above 90% for swarm alerts issued before the swarm leaves.</w:t>
       </w:r>
     </w:p>
     <w:p>
@@ -1123,8 +1072,8 @@
           <w:szCs w:val="22"/>
         </w:rPr>
         <w:sectPr>
-          <w:headerReference w:type="default" r:id="rId17"/>
-          <w:footerReference w:type="default" r:id="rId18"/>
+          <w:headerReference w:type="default" r:id="rId13"/>
+          <w:footerReference w:type="default" r:id="rId14"/>
           <w:pgSz w:w="11906" w:h="16838"/>
           <w:pgMar w:top="1417" w:right="1417" w:bottom="1417" w:left="1417" w:header="709" w:footer="709" w:gutter="0"/>
           <w:pgNumType w:fmt="lowerRoman" w:start="1"/>
@@ -1133,25 +1082,17 @@
       </w:pPr>
       <w:r>
         <w:rPr>
-          <w:b w:val="1"/>
-          <w:bCs w:val="1"/>
-          <w:i w:val="0"/>
-          <w:iCs w:val="0"/>
-          <w:sz w:val="22"/>
-          <w:szCs w:val="22"/>
-          <w:rtl w:val="0"/>
-        </w:rPr>
-        <w:t xml:space="preserve">Keywords:</w:t>
-      </w:r>
-      <w:r>
-        <w:rPr>
-          <w:b w:val="0"/>
-          <w:bCs w:val="0"/>
-          <w:i w:val="0"/>
-          <w:iCs w:val="0"/>
-          <w:sz w:val="22"/>
-          <w:szCs w:val="22"/>
-          <w:rtl w:val="0"/>
+          <w:b/>
+          <w:bCs/>
+          <w:sz w:val="22"/>
+          <w:szCs w:val="22"/>
+        </w:rPr>
+        <w:t>Keywords:</w:t>
+      </w:r>
+      <w:r>
+        <w:rPr>
+          <w:sz w:val="22"/>
+          <w:szCs w:val="22"/>
         </w:rPr>
         <w:t xml:space="preserve"> Internet of Things, Hive Monitoring, Honeybees, Piezoelectric Sensor, Event-Driven Wake-Up, Signal Processing, Load Cells, Low-Power Embedded Systems, ESP32, ESP-NOW.</w:t>
       </w:r>
@@ -1234,21 +1175,12 @@
           <w:szCs w:val="22"/>
         </w:rPr>
       </w:pPr>
-      <w:proofErr w:type="gramStart"/>
-      <w:proofErr w:type="gramEnd"/>
-      <w:proofErr w:type="spellStart"/>
-      <w:proofErr w:type="spellEnd"/>
-      <w:r>
-        <w:rPr>
-          <w:b w:val="0"/>
-          <w:bCs w:val="0"/>
-          <w:i w:val="0"/>
-          <w:iCs w:val="0"/>
-          <w:sz w:val="22"/>
-          <w:szCs w:val="22"/>
-          <w:rtl w:val="0"/>
-        </w:rPr>
-        <w:t xml:space="preserve">Honeybee colonies are inspected mostly by opening the hive every few weeks to months; inspections disturb the colony, cost labour, and leave the beekeeper blind between visits. Precision beekeeping, i.e. monitoring colonies with sensors so that interventions are based on data, was proposed to close this gap [1]. Swarming is the costliest blind spot: the colony rears new queens for one to two weeks, the prime swarm leaves with the old queen once the queen cells are capped, clusters nearby for a few hours, and is then lost. Hive vibrations change measurably before swarming [2], [3], and continuous hive weight reveals foraging, consumption and swarm departures [4]. Initial use case: a beekeeper with many hives standing close together at a remote apiary without mains power or Wi-Fi, visiting every few weeks. The system must alert before a swarm leaves or a colony behaves abnormally, and show which hives need a visit first. Applications: commercial and hobby apiaries, pollination services, and research apiaries that need long continuous records.</w:t>
+      <w:r>
+        <w:rPr>
+          <w:sz w:val="22"/>
+          <w:szCs w:val="22"/>
+        </w:rPr>
+        <w:t>Honeybee colonies are inspected mostly by opening the hive every few weeks to months; inspections disturb the colony, cost labour, and leave the beekeeper blind between visits. Precision beekeeping, i.e. monitoring colonies with sensors so that interventions are based on data, was proposed to close this gap [1]. Swarming is the costliest blind spot: the colony rears new queens for one to two weeks, the prime swarm leaves with the old queen once the queen cells are capped, clusters nearby for a few hours, and is then lost. Hive vibrations change measurably before swarming [2], [3], and continuous hive weight reveals foraging, consumption and swarm departures [4]. Initial use case: a beekeeper with many hives standing close together at a remote apiary without mains power or Wi-Fi, visiting every few weeks. The system must alert before a swarm leaves or a colony behaves abnormally, and show which hives need a visit first. Applications: commercial and hobby apiaries, pollination services, and research apiaries that need long continuous records.</w:t>
       </w:r>
     </w:p>
     <w:p>
@@ -1279,29 +1211,19 @@
           <w:szCs w:val="22"/>
         </w:rPr>
       </w:pPr>
-      <w:proofErr w:type="gramStart"/>
-      <w:proofErr w:type="gramEnd"/>
-      <w:r>
-        <w:rPr>
-          <w:b w:val="1"/>
-          <w:bCs w:val="1"/>
-          <w:i w:val="0"/>
-          <w:iCs w:val="0"/>
-          <w:sz w:val="22"/>
-          <w:szCs w:val="22"/>
-          <w:rtl w:val="0"/>
-        </w:rPr>
-        <w:t xml:space="preserve">Objectives:</w:t>
-      </w:r>
-      <w:r>
-        <w:rPr>
-          <w:b w:val="0"/>
-          <w:bCs w:val="0"/>
-          <w:i w:val="0"/>
-          <w:iCs w:val="0"/>
-          <w:sz w:val="22"/>
-          <w:szCs w:val="22"/>
-          <w:rtl w:val="0"/>
+      <w:r>
+        <w:rPr>
+          <w:b/>
+          <w:bCs/>
+          <w:sz w:val="22"/>
+          <w:szCs w:val="22"/>
+        </w:rPr>
+        <w:t>Objectives:</w:t>
+      </w:r>
+      <w:r>
+        <w:rPr>
+          <w:sz w:val="22"/>
+          <w:szCs w:val="22"/>
         </w:rPr>
         <w:t xml:space="preserve"> (1) a battery-powered hive node with event-driven wake-up that measures vibration and sound spectra, weight and temperature, and runs at least six months per charge (targets in Section 3.3);</w:t>
       </w:r>
@@ -1351,25 +1273,17 @@
       </w:pPr>
       <w:r>
         <w:rPr>
-          <w:b w:val="1"/>
-          <w:bCs w:val="1"/>
-          <w:i w:val="0"/>
-          <w:iCs w:val="0"/>
-          <w:sz w:val="22"/>
-          <w:szCs w:val="22"/>
-          <w:rtl w:val="0"/>
-        </w:rPr>
-        <w:t xml:space="preserve">Stages:</w:t>
-      </w:r>
-      <w:r>
-        <w:rPr>
-          <w:b w:val="0"/>
-          <w:bCs w:val="0"/>
-          <w:i w:val="0"/>
-          <w:iCs w:val="0"/>
-          <w:sz w:val="22"/>
-          <w:szCs w:val="22"/>
-          <w:rtl w:val="0"/>
+          <w:b/>
+          <w:bCs/>
+          <w:sz w:val="22"/>
+          <w:szCs w:val="22"/>
+        </w:rPr>
+        <w:t>Stages:</w:t>
+      </w:r>
+      <w:r>
+        <w:rPr>
+          <w:sz w:val="22"/>
+          <w:szCs w:val="22"/>
         </w:rPr>
         <w:t xml:space="preserve"> (1) requirements with the beekeeper and bench tests: piezo and wake chains, weighing, FFT time on the C3, and one night-time hive recording; (2) node: wake circuit, acquisition, on-board spectra, power modes, piezo vs. microphone, ESP-NOW range on site; (3) hub, database, detection and dashboard, installed before the spring swarming season; (4) field evaluation.</w:t>
       </w:r>
@@ -1455,7 +1369,23 @@
           <w:sz w:val="22"/>
           <w:szCs w:val="22"/>
         </w:rPr>
-        <w:t xml:space="preserve"> wake circuit </w:t>
+        <w:t xml:space="preserve"> wake circuit (envelope detector and comparator, about 2 µA) compares the vibration envelope with its own slow average and wakes the MCU through a GPIO when the envelope jumps. Second, an op-amp preamplifier, powered only while recording, biases and protects the signal for the ADC and acts as the anti-aliasing low-pass (≈800 Hz). </w:t>
+      </w:r>
+      <w:proofErr w:type="gramStart"/>
+      <w:r>
+        <w:rPr>
+          <w:sz w:val="22"/>
+          <w:szCs w:val="22"/>
+        </w:rPr>
+        <w:t>An</w:t>
+      </w:r>
+      <w:proofErr w:type="gramEnd"/>
+      <w:r>
+        <w:rPr>
+          <w:sz w:val="22"/>
+          <w:szCs w:val="22"/>
+        </w:rPr>
+        <w:t xml:space="preserve"> I²S MEMS microphone, inside the hive behind a mesh, is the second analysis channel. Weight: four 50 kg half-bridge load cells under a hive platform and an HX711 24-bit ADC; temperature: DS18B20 probes. Power: one 18650 cell and a low-quiescent LDO. Nodes report over ESP-NOW, a connectionless protocol on the Wi-Fi radio, to an ESP32-S3 hub serving a </w:t>
       </w:r>
       <w:r>
         <w:rPr>
@@ -1463,23 +1393,7 @@
           <w:szCs w:val="22"/>
         </w:rPr>
         <w:lastRenderedPageBreak/>
-        <w:t xml:space="preserve">(envelope detector and comparator, about 2 µA) compares the vibration envelope with its own slow average and wakes the MCU through a GPIO when the envelope jumps. Second, an op-amp preamplifier, powered only while recording, biases and protects the signal for the ADC and acts as the anti-aliasing low-pass (≈800 Hz). </w:t>
-      </w:r>
-      <w:proofErr w:type="gramStart"/>
-      <w:r>
-        <w:rPr>
-          <w:sz w:val="22"/>
-          <w:szCs w:val="22"/>
-        </w:rPr>
-        <w:t>An</w:t>
-      </w:r>
-      <w:proofErr w:type="gramEnd"/>
-      <w:r>
-        <w:rPr>
-          <w:sz w:val="22"/>
-          <w:szCs w:val="22"/>
-        </w:rPr>
-        <w:t xml:space="preserve"> I²S MEMS microphone, inside the hive behind a mesh, is the second analysis channel. Weight: four 50 kg half-bridge load cells under a hive platform and an HX711 24-bit ADC; temperature: DS18B20 probes. Power: one 18650 cell and a low-quiescent LDO. Nodes report over ESP-NOW, a connectionless protocol on the Wi-Fi radio, to an ESP32-S3 hub serving a group of nearby hives; the hub uploads over a cellular modem and runs from an 18 V / 15 W solar panel, an MPPT charger and a Li-ion pack. As the hives stand close together, one SIM per hub replaces a LoRa radio or a SIM in every hive.</w:t>
+        <w:t>group of nearby hives; the hub uploads over a cellular modem and runs from an 18 V / 15 W solar panel, an MPPT charger and a Li-ion pack. As the hives stand close together, one SIM per hub replaces a LoRa radio or a SIM in every hive.</w:t>
       </w:r>
       <w:r>
         <w:rPr>
@@ -1508,7 +1422,7 @@
                     <pic:cNvPicPr preferRelativeResize="0"/>
                   </pic:nvPicPr>
                   <pic:blipFill>
-                    <a:blip r:embed="rId12"/>
+                    <a:blip r:embed="rId15"/>
                     <a:srcRect/>
                     <a:stretch>
                       <a:fillRect/>
@@ -1608,23 +1522,12 @@
           <w:szCs w:val="22"/>
         </w:rPr>
       </w:pPr>
-      <w:proofErr w:type="spellStart"/>
-      <w:proofErr w:type="spellEnd"/>
-      <w:proofErr w:type="spellStart"/>
-      <w:proofErr w:type="spellEnd"/>
-      <w:proofErr w:type="spellStart"/>
-      <w:proofErr w:type="spellEnd"/>
-      <w:r>
-        <w:rPr>
-          <w:b w:val="0"/>
-          <w:bCs w:val="0"/>
-          <w:i w:val="0"/>
-          <w:iCs w:val="0"/>
-          <w:sz w:val="22"/>
-          <w:szCs w:val="22"/>
-          <w:rtl w:val="0"/>
-        </w:rPr>
-        <w:t xml:space="preserve">Ferrari et al. recorded hive sounds with in-hive microphones and found that the power spectral density near 110 Hz rises, and shifts upward in frequency, before swarming [2]. Ramsey et al. placed accelerometers in the heart of the colony and, by tracking how the vibrational spectra evolve, separated colonies preparing to swarm with more than 90% accuracy, up to 30 days ahead [3]; Bencsik et al. predicted swarming several days ahead with a simple transducer on the outside hive wall [5]. Cecchi et al. built a multi-sensor hive with microphones, weighing to ±10 g and CO₂, but each hive used a Raspberry Pi drawing about 4 W from mains power [6]. Commercially, BroodMinder hive scales log weight only [7], and BeeHero in-hive sensors measure acoustics and climate and report over Bluetooth Low Energy to a cellular gateway in a closed system [8] (Table I).</w:t>
+      <w:r>
+        <w:rPr>
+          <w:sz w:val="22"/>
+          <w:szCs w:val="22"/>
+        </w:rPr>
+        <w:t>Ferrari et al. recorded hive sounds with in-hive microphones and found that the power spectral density near 110 Hz rises, and shifts upward in frequency, before swarming [2]. Ramsey et al. placed accelerometers in the heart of the colony and, by tracking how the vibrational spectra evolve, separated colonies preparing to swarm with more than 90% accuracy, up to 30 days ahead [3]; Bencsik et al. predicted swarming several days ahead with a simple transducer on the outside hive wall [5]. Cecchi et al. built a multi-sensor hive with microphones, weighing to ±10 g and CO₂, but each hive used a Raspberry Pi drawing about 4 W from mains power [6]. Commercially, BroodMinder hive scales log weight only [7], and BeeHero in-hive sensors measure acoustics and climate and report over Bluetooth Low Energy to a cellular gateway in a closed system [8] (Table I).</w:t>
       </w:r>
     </w:p>
     <w:p>
@@ -1638,7 +1541,6 @@
           <w:sz w:val="18"/>
           <w:szCs w:val="18"/>
         </w:rPr>
-        <w:lastRenderedPageBreak/>
         <w:t>TABLE I.  PRIOR WORK AND WHAT BEESENSE MUST DEMONSTRATE</w:t>
       </w:r>
     </w:p>
@@ -2193,7 +2095,15 @@
           <w:sz w:val="22"/>
           <w:szCs w:val="22"/>
         </w:rPr>
-        <w:t xml:space="preserve">) is estimated with Welch's method (1024-point Hann windows, 50% overlap, </w:t>
+        <w:t xml:space="preserve">) is estimated </w:t>
+      </w:r>
+      <w:r>
+        <w:rPr>
+          <w:sz w:val="22"/>
+          <w:szCs w:val="22"/>
+        </w:rPr>
+        <w:lastRenderedPageBreak/>
+        <w:t xml:space="preserve">with Welch's method (1024-point Hann windows, 50% overlap, </w:t>
       </w:r>
       <w:proofErr w:type="spellStart"/>
       <w:r>
@@ -2979,256 +2889,170 @@
           <w:szCs w:val="22"/>
         </w:rPr>
       </w:pPr>
-      <w:proofErr w:type="gramStart"/>
-      <w:proofErr w:type="gramEnd"/>
-      <w:proofErr w:type="spellStart"/>
-      <w:proofErr w:type="spellEnd"/>
-      <w:proofErr w:type="spellStart"/>
-      <w:proofErr w:type="spellEnd"/>
-      <w:proofErr w:type="spellStart"/>
-      <w:proofErr w:type="spellEnd"/>
-      <w:r>
-        <w:rPr>
-          <w:b w:val="0"/>
-          <w:bCs w:val="0"/>
-          <w:i w:val="0"/>
-          <w:iCs w:val="0"/>
-          <w:sz w:val="22"/>
-          <w:szCs w:val="22"/>
-          <w:rtl w:val="0"/>
+      <w:r>
+        <w:rPr>
+          <w:sz w:val="22"/>
+          <w:szCs w:val="22"/>
         </w:rPr>
         <w:t xml:space="preserve">The parts are in hand but no node is built yet, so feasibility is shown from published measurements and datasheet values, each to be replaced by a bench measurement. </w:t>
       </w:r>
       <w:r>
         <w:rPr>
-          <w:b w:val="0"/>
-          <w:bCs w:val="0"/>
-          <w:i w:val="1"/>
-          <w:iCs w:val="1"/>
-          <w:sz w:val="22"/>
-          <w:szCs w:val="22"/>
-          <w:rtl w:val="0"/>
-        </w:rPr>
-        <w:t xml:space="preserve">Signal levels:</w:t>
-      </w:r>
-      <w:r>
-        <w:rPr>
-          <w:b w:val="0"/>
-          <w:bCs w:val="0"/>
-          <w:i w:val="0"/>
-          <w:iCs w:val="0"/>
-          <w:sz w:val="22"/>
-          <w:szCs w:val="22"/>
-          <w:rtl w:val="0"/>
+          <w:i/>
+          <w:iCs/>
+          <w:sz w:val="22"/>
+          <w:szCs w:val="22"/>
+        </w:rPr>
+        <w:t>Signal levels:</w:t>
+      </w:r>
+      <w:r>
+        <w:rPr>
+          <w:sz w:val="22"/>
+          <w:szCs w:val="22"/>
         </w:rPr>
         <w:t xml:space="preserve"> comb vibration measured at night with laboratory accelerometers is only 1–5 µm/s² per spectral bin, about ten times weaker on the hive wall [9], and far below the noise of a typical MEMS accelerometer (≈25 µg/√Hz), hence a piezoelectric sensor in the comb. The pre-swarm changes in [2] were found with ordinary in-hive microphones, so our microphone channel is expected to resolve them; whether the piezo chain also resolves the quieter comb vibrations is measured in Stage 1 (fallback: external audio ADC). The departure itself (mass flight, 1–2 kg) gives a robust confirmation. </w:t>
       </w:r>
       <w:r>
         <w:rPr>
-          <w:b w:val="0"/>
-          <w:bCs w:val="0"/>
-          <w:i w:val="1"/>
-          <w:iCs w:val="1"/>
-          <w:sz w:val="22"/>
-          <w:szCs w:val="22"/>
-          <w:rtl w:val="0"/>
-        </w:rPr>
-        <w:t xml:space="preserve">Data and link:</w:t>
-      </w:r>
-      <w:r>
-        <w:rPr>
-          <w:b w:val="0"/>
-          <w:bCs w:val="0"/>
-          <w:i w:val="0"/>
-          <w:iCs w:val="0"/>
-          <w:sz w:val="22"/>
-          <w:szCs w:val="22"/>
-          <w:rtl w:val="0"/>
+          <w:i/>
+          <w:iCs/>
+          <w:sz w:val="22"/>
+          <w:szCs w:val="22"/>
+        </w:rPr>
+        <w:t>Data and link:</w:t>
+      </w:r>
+      <w:r>
+        <w:rPr>
+          <w:sz w:val="22"/>
+          <w:szCs w:val="22"/>
         </w:rPr>
         <w:t xml:space="preserve"> raw data is 4 kB/s per channel; features reduce it to ≈75 bytes per report, one ESP-NOW frame (≤250 bytes, 1 Mbps, MAC-level acknowledgement [10]), so 20 hives need ≈5 MB/month of cellular data. Wood, honey and bees attenuate 2.4 GHz, so the radio sits outside the hive body; range is measured on site first (fallback: LoRa on SPI). </w:t>
       </w:r>
       <w:r>
         <w:rPr>
-          <w:b w:val="0"/>
-          <w:bCs w:val="0"/>
-          <w:i w:val="1"/>
-          <w:iCs w:val="1"/>
-          <w:sz w:val="22"/>
-          <w:szCs w:val="22"/>
-          <w:rtl w:val="0"/>
-        </w:rPr>
-        <w:t xml:space="preserve">Weighing:</w:t>
-      </w:r>
-      <w:r>
-        <w:rPr>
-          <w:b w:val="0"/>
-          <w:bCs w:val="0"/>
-          <w:i w:val="0"/>
-          <w:iCs w:val="0"/>
-          <w:sz w:val="22"/>
-          <w:szCs w:val="22"/>
-          <w:rtl w:val="0"/>
+          <w:i/>
+          <w:iCs/>
+          <w:sz w:val="22"/>
+          <w:szCs w:val="22"/>
+        </w:rPr>
+        <w:t>Weighing:</w:t>
+      </w:r>
+      <w:r>
+        <w:rPr>
+          <w:sz w:val="22"/>
+          <w:szCs w:val="22"/>
         </w:rPr>
         <w:t xml:space="preserve"> four 50 kg cells at 1 mV/V and 3.3 V excitation give 16.5 µV/kg; the HX711 noise of 50 nV rms at 10 samples/s [11] equals ≈3 g, so load-cell temperature drift will set field accuracy. </w:t>
       </w:r>
       <w:r>
         <w:rPr>
-          <w:b w:val="0"/>
-          <w:bCs w:val="0"/>
-          <w:i w:val="1"/>
-          <w:iCs w:val="1"/>
-          <w:sz w:val="22"/>
-          <w:szCs w:val="22"/>
-          <w:rtl w:val="0"/>
-        </w:rPr>
-        <w:t xml:space="preserve">Node power:</w:t>
-      </w:r>
-      <w:r>
-        <w:rPr>
-          <w:b w:val="0"/>
-          <w:bCs w:val="0"/>
-          <w:i w:val="0"/>
-          <w:iCs w:val="0"/>
-          <w:sz w:val="22"/>
-          <w:szCs w:val="22"/>
-          <w:rtl w:val="0"/>
+          <w:i/>
+          <w:iCs/>
+          <w:sz w:val="22"/>
+          <w:szCs w:val="22"/>
+        </w:rPr>
+        <w:t>Node power:</w:t>
+      </w:r>
+      <w:r>
+        <w:rPr>
+          <w:sz w:val="22"/>
+          <w:szCs w:val="22"/>
         </w:rPr>
         <w:t xml:space="preserve"> for task currents </w:t>
       </w:r>
       <w:r>
         <w:rPr>
-          <w:b w:val="0"/>
-          <w:bCs w:val="0"/>
-          <w:i w:val="1"/>
-          <w:iCs w:val="1"/>
-          <w:sz w:val="22"/>
-          <w:szCs w:val="22"/>
-          <w:rtl w:val="0"/>
-        </w:rPr>
-        <w:t xml:space="preserve">I</w:t>
-      </w:r>
-      <w:r>
-        <w:rPr>
-          <w:b w:val="0"/>
-          <w:bCs w:val="0"/>
-          <w:i w:val="1"/>
-          <w:iCs w:val="1"/>
+          <w:i/>
+          <w:iCs/>
+          <w:sz w:val="22"/>
+          <w:szCs w:val="22"/>
+        </w:rPr>
+        <w:t>I</w:t>
+      </w:r>
+      <w:r>
+        <w:rPr>
+          <w:i/>
+          <w:iCs/>
           <w:sz w:val="22"/>
           <w:szCs w:val="22"/>
           <w:vertAlign w:val="subscript"/>
-          <w:rtl w:val="0"/>
-        </w:rPr>
-        <w:t xml:space="preserve">i</w:t>
-      </w:r>
-      <w:r>
-        <w:rPr>
-          <w:b w:val="0"/>
-          <w:bCs w:val="0"/>
-          <w:i w:val="0"/>
-          <w:iCs w:val="0"/>
-          <w:sz w:val="22"/>
-          <w:szCs w:val="22"/>
-          <w:rtl w:val="0"/>
+        </w:rPr>
+        <w:t>i</w:t>
+      </w:r>
+      <w:r>
+        <w:rPr>
+          <w:sz w:val="22"/>
+          <w:szCs w:val="22"/>
         </w:rPr>
         <w:t xml:space="preserve"> lasting </w:t>
       </w:r>
       <w:r>
         <w:rPr>
-          <w:b w:val="0"/>
-          <w:bCs w:val="0"/>
-          <w:i w:val="1"/>
-          <w:iCs w:val="1"/>
-          <w:sz w:val="22"/>
-          <w:szCs w:val="22"/>
-          <w:rtl w:val="0"/>
-        </w:rPr>
-        <w:t xml:space="preserve">t</w:t>
-      </w:r>
-      <w:r>
-        <w:rPr>
-          <w:b w:val="0"/>
-          <w:bCs w:val="0"/>
-          <w:i w:val="1"/>
-          <w:iCs w:val="1"/>
+          <w:i/>
+          <w:iCs/>
+          <w:sz w:val="22"/>
+          <w:szCs w:val="22"/>
+        </w:rPr>
+        <w:t>t</w:t>
+      </w:r>
+      <w:r>
+        <w:rPr>
+          <w:i/>
+          <w:iCs/>
           <w:sz w:val="22"/>
           <w:szCs w:val="22"/>
           <w:vertAlign w:val="subscript"/>
-          <w:rtl w:val="0"/>
-        </w:rPr>
-        <w:t xml:space="preserve">i</w:t>
-      </w:r>
-      <w:r>
-        <w:rPr>
-          <w:b w:val="0"/>
-          <w:bCs w:val="0"/>
-          <w:i w:val="0"/>
-          <w:iCs w:val="0"/>
-          <w:sz w:val="22"/>
-          <w:szCs w:val="22"/>
-          <w:rtl w:val="0"/>
+        </w:rPr>
+        <w:t>i</w:t>
+      </w:r>
+      <w:r>
+        <w:rPr>
+          <w:sz w:val="22"/>
+          <w:szCs w:val="22"/>
         </w:rPr>
         <w:t xml:space="preserve"> per acquisition, </w:t>
       </w:r>
       <w:r>
         <w:rPr>
-          <w:b w:val="0"/>
-          <w:bCs w:val="0"/>
-          <w:i w:val="1"/>
-          <w:iCs w:val="1"/>
-          <w:sz w:val="22"/>
-          <w:szCs w:val="22"/>
-          <w:rtl w:val="0"/>
-        </w:rPr>
-        <w:t xml:space="preserve">A</w:t>
-      </w:r>
-      <w:r>
-        <w:rPr>
-          <w:b w:val="0"/>
-          <w:bCs w:val="0"/>
-          <w:i w:val="0"/>
-          <w:iCs w:val="0"/>
-          <w:sz w:val="22"/>
-          <w:szCs w:val="22"/>
-          <w:rtl w:val="0"/>
+          <w:i/>
+          <w:iCs/>
+          <w:sz w:val="22"/>
+          <w:szCs w:val="22"/>
+        </w:rPr>
+        <w:t>A</w:t>
+      </w:r>
+      <w:r>
+        <w:rPr>
+          <w:sz w:val="22"/>
+          <w:szCs w:val="22"/>
         </w:rPr>
         <w:t xml:space="preserve"> acquisitions per day and a continuous current </w:t>
       </w:r>
       <w:r>
         <w:rPr>
-          <w:b w:val="0"/>
-          <w:bCs w:val="0"/>
-          <w:i w:val="1"/>
-          <w:iCs w:val="1"/>
-          <w:sz w:val="22"/>
-          <w:szCs w:val="22"/>
-          <w:rtl w:val="0"/>
-        </w:rPr>
-        <w:t xml:space="preserve">I</w:t>
-      </w:r>
-      <w:r>
-        <w:rPr>
-          <w:b w:val="0"/>
-          <w:bCs w:val="0"/>
-          <w:i w:val="1"/>
-          <w:iCs w:val="1"/>
+          <w:i/>
+          <w:iCs/>
+          <w:sz w:val="22"/>
+          <w:szCs w:val="22"/>
+        </w:rPr>
+        <w:t>I</w:t>
+      </w:r>
+      <w:r>
+        <w:rPr>
+          <w:i/>
+          <w:iCs/>
           <w:sz w:val="22"/>
           <w:szCs w:val="22"/>
           <w:vertAlign w:val="subscript"/>
-          <w:rtl w:val="0"/>
-        </w:rPr>
-        <w:t xml:space="preserve">0</w:t>
-      </w:r>
-      <w:r>
-        <w:rPr>
-          <w:b w:val="0"/>
-          <w:bCs w:val="0"/>
-          <w:i w:val="0"/>
-          <w:iCs w:val="0"/>
-          <w:sz w:val="22"/>
-          <w:szCs w:val="22"/>
-          <w:rtl w:val="0"/>
-        </w:rPr>
-        <w:t xml:space="preserve">,</w:t>
+        </w:rPr>
+        <w:t>0</w:t>
+      </w:r>
+      <w:r>
+        <w:rPr>
+          <w:sz w:val="22"/>
+          <w:szCs w:val="22"/>
+        </w:rPr>
+        <w:t>,</w:t>
       </w:r>
     </w:p>
     <w:p>
@@ -3468,132 +3292,92 @@
           <w:szCs w:val="22"/>
         </w:rPr>
       </w:pPr>
-      <w:proofErr w:type="gramStart"/>
-      <w:proofErr w:type="gramEnd"/>
-      <w:proofErr w:type="spellStart"/>
-      <w:proofErr w:type="spellEnd"/>
-      <w:proofErr w:type="spellStart"/>
-      <w:proofErr w:type="spellEnd"/>
-      <w:proofErr w:type="spellStart"/>
-      <w:proofErr w:type="spellEnd"/>
-      <w:r>
-        <w:rPr>
-          <w:b w:val="0"/>
-          <w:bCs w:val="0"/>
-          <w:i w:val="0"/>
-          <w:iCs w:val="0"/>
-          <w:sz w:val="22"/>
-          <w:szCs w:val="22"/>
-          <w:rtl w:val="0"/>
+      <w:r>
+        <w:rPr>
+          <w:sz w:val="22"/>
+          <w:szCs w:val="22"/>
         </w:rPr>
         <w:t xml:space="preserve">One acquisition costs ≈0.30 A·s: 22 mA at 80 MHz for the 10 s recording and 28 mA at 160 MHz for ≈1.5 s of FFTs [12], 0.15 s of radio at ≈120 mA average (335 mA TX peak [12]), and the microphone (≈1.4 mA), preamplifier and HX711. With </w:t>
       </w:r>
       <w:r>
         <w:rPr>
-          <w:b w:val="0"/>
-          <w:bCs w:val="0"/>
-          <w:i w:val="1"/>
-          <w:iCs w:val="1"/>
-          <w:sz w:val="22"/>
-          <w:szCs w:val="22"/>
-          <w:rtl w:val="0"/>
-        </w:rPr>
-        <w:t xml:space="preserve">I</w:t>
-      </w:r>
-      <w:r>
-        <w:rPr>
-          <w:b w:val="0"/>
-          <w:bCs w:val="0"/>
-          <w:i w:val="1"/>
-          <w:iCs w:val="1"/>
+          <w:i/>
+          <w:iCs/>
+          <w:sz w:val="22"/>
+          <w:szCs w:val="22"/>
+        </w:rPr>
+        <w:t>I</w:t>
+      </w:r>
+      <w:r>
+        <w:rPr>
+          <w:i/>
+          <w:iCs/>
           <w:sz w:val="22"/>
           <w:szCs w:val="22"/>
           <w:vertAlign w:val="subscript"/>
-          <w:rtl w:val="0"/>
-        </w:rPr>
-        <w:t xml:space="preserve">0</w:t>
-      </w:r>
-      <w:r>
-        <w:rPr>
-          <w:b w:val="0"/>
-          <w:bCs w:val="0"/>
-          <w:i w:val="0"/>
-          <w:iCs w:val="0"/>
-          <w:sz w:val="22"/>
-          <w:szCs w:val="22"/>
-          <w:rtl w:val="0"/>
-        </w:rPr>
-        <w:t xml:space="preserve"> = 22 µA (2 µA wake circuit, 5 µA chip [12], LDO and leakage) and 96 periodic acquisitions per day, </w:t>
-      </w:r>
-      <w:r>
-        <w:rPr>
-          <w:b w:val="0"/>
-          <w:bCs w:val="0"/>
-          <w:i w:val="1"/>
-          <w:iCs w:val="1"/>
-          <w:sz w:val="22"/>
-          <w:szCs w:val="22"/>
-          <w:rtl w:val="0"/>
-        </w:rPr>
-        <w:t xml:space="preserve">Ī</w:t>
-      </w:r>
-      <w:r>
-        <w:rPr>
-          <w:b w:val="0"/>
-          <w:bCs w:val="0"/>
-          <w:i w:val="0"/>
-          <w:iCs w:val="0"/>
-          <w:sz w:val="22"/>
-          <w:szCs w:val="22"/>
-          <w:rtl w:val="0"/>
+        </w:rPr>
+        <w:t>0</w:t>
+      </w:r>
+      <w:r>
+        <w:rPr>
+          <w:sz w:val="22"/>
+          <w:szCs w:val="22"/>
+        </w:rPr>
+        <w:t xml:space="preserve"> = 22 µA (2 µA wake circuit, 5 µA chip [12], LDO and </w:t>
+      </w:r>
+      <w:r>
+        <w:rPr>
+          <w:sz w:val="22"/>
+          <w:szCs w:val="22"/>
+        </w:rPr>
+        <w:lastRenderedPageBreak/>
+        <w:t xml:space="preserve">leakage) and 96 periodic acquisitions per day, </w:t>
+      </w:r>
+      <w:r>
+        <w:rPr>
+          <w:i/>
+          <w:iCs/>
+          <w:sz w:val="22"/>
+          <w:szCs w:val="22"/>
+        </w:rPr>
+        <w:t>Ī</w:t>
+      </w:r>
+      <w:r>
+        <w:rPr>
+          <w:sz w:val="22"/>
+          <w:szCs w:val="22"/>
         </w:rPr>
         <w:t xml:space="preserve"> ≈ 0.35 mA, and one 3000 mAh cell with </w:t>
       </w:r>
       <w:r>
         <w:rPr>
-          <w:b w:val="0"/>
-          <w:bCs w:val="0"/>
-          <w:i w:val="1"/>
-          <w:iCs w:val="1"/>
-          <w:sz w:val="22"/>
-          <w:szCs w:val="22"/>
-          <w:rtl w:val="0"/>
-        </w:rPr>
-        <w:t xml:space="preserve">η</w:t>
-      </w:r>
-      <w:r>
-        <w:rPr>
-          <w:b w:val="0"/>
-          <w:bCs w:val="0"/>
-          <w:i w:val="0"/>
-          <w:iCs w:val="0"/>
-          <w:sz w:val="22"/>
-          <w:szCs w:val="22"/>
-          <w:rtl w:val="0"/>
+          <w:i/>
+          <w:iCs/>
+          <w:sz w:val="22"/>
+          <w:szCs w:val="22"/>
+        </w:rPr>
+        <w:t>η</w:t>
+      </w:r>
+      <w:r>
+        <w:rPr>
+          <w:sz w:val="22"/>
+          <w:szCs w:val="22"/>
         </w:rPr>
         <w:t xml:space="preserve"> = 0.8 lasts ≈285 days; each extra event wake costs ≈3.4 µA, so the six-month target holds up to ≈60 event wakes per day (Fig. 2), which the adaptive threshold and 20-min hold-off keep well below. </w:t>
       </w:r>
       <w:r>
         <w:rPr>
-          <w:b w:val="0"/>
-          <w:bCs w:val="0"/>
-          <w:i w:val="1"/>
-          <w:iCs w:val="1"/>
-          <w:sz w:val="22"/>
-          <w:szCs w:val="22"/>
-          <w:rtl w:val="0"/>
-        </w:rPr>
-        <w:t xml:space="preserve">Hub power:</w:t>
-      </w:r>
-      <w:r>
-        <w:rPr>
-          <w:b w:val="0"/>
-          <w:bCs w:val="0"/>
-          <w:i w:val="0"/>
-          <w:iCs w:val="0"/>
-          <w:sz w:val="22"/>
-          <w:szCs w:val="22"/>
-          <w:rtl w:val="0"/>
+          <w:i/>
+          <w:iCs/>
+          <w:sz w:val="22"/>
+          <w:szCs w:val="22"/>
+        </w:rPr>
+        <w:t>Hub power:</w:t>
+      </w:r>
+      <w:r>
+        <w:rPr>
+          <w:sz w:val="22"/>
+          <w:szCs w:val="22"/>
         </w:rPr>
         <w:t xml:space="preserve"> continuous receive plus the modem draw ≈0.5 W (≈12 Wh/day) against ≈45 Wh/day from the panel (5 full-sun hours, 60% conversion); three 18650 cells cover two days without sun.</w:t>
       </w:r>
@@ -3628,7 +3412,7 @@
                     <pic:cNvPicPr preferRelativeResize="0"/>
                   </pic:nvPicPr>
                   <pic:blipFill>
-                    <a:blip r:embed="rId13"/>
+                    <a:blip r:embed="rId16"/>
                     <a:srcRect/>
                     <a:stretch>
                       <a:fillRect/>
@@ -3788,15 +3572,7 @@
           <w:sz w:val="22"/>
           <w:szCs w:val="22"/>
         </w:rPr>
-        <w:t xml:space="preserve">, from installation through the spring swarming season, including a first night-time recording that compares hive signal with the circuit noise floor. Ground truth: weekly inspection records (queen cells, brood, queen presence), beekeeper reports and, where possible, an entrance camera. A swarm is labelled by an observed departure or by capped queen cells at </w:t>
-      </w:r>
-      <w:r>
-        <w:rPr>
-          <w:sz w:val="22"/>
-          <w:szCs w:val="22"/>
-        </w:rPr>
-        <w:lastRenderedPageBreak/>
-        <w:t xml:space="preserve">inspection. A pre-swarm alert is a true positive if it precedes the swarm, giving precision </w:t>
+        <w:t xml:space="preserve">, from installation through the spring swarming season, including a first night-time recording that compares hive signal with the circuit noise floor. Ground truth: weekly inspection records (queen cells, brood, queen presence), beekeeper reports and, where possible, an entrance camera. A swarm is labelled by an observed departure or by capped queen cells at inspection. A pre-swarm alert is a true positive if it precedes the swarm, giving precision </w:t>
       </w:r>
       <w:r>
         <w:rPr>
@@ -4424,32 +4200,20 @@
     <w:p>
       <w:pPr>
         <w:keepNext/>
-        <w:spacing w:after="80" w:line="360" w:lineRule="auto" w:before="120"/>
-        <w:jc w:val="left"/>
-        <w:rPr>
-          <w:sz w:val="22"/>
-          <w:szCs w:val="22"/>
-        </w:rPr>
-      </w:pPr>
-      <w:proofErr w:type="spellStart"/>
-      <w:proofErr w:type="spellEnd"/>
-      <w:proofErr w:type="spellStart"/>
-      <w:proofErr w:type="spellEnd"/>
-      <w:proofErr w:type="spellStart"/>
-      <w:proofErr w:type="spellEnd"/>
-      <w:proofErr w:type="spellStart"/>
-      <w:proofErr w:type="spellEnd"/>
-      <w:r>
-        <w:rPr>
-          <w:b w:val="1"/>
-          <w:bCs w:val="1"/>
-          <w:i w:val="0"/>
-          <w:iCs w:val="0"/>
-          <w:sz w:val="20"/>
-          <w:szCs w:val="20"/>
-          <w:rtl w:val="0"/>
-        </w:rPr>
-        <w:t xml:space="preserve">Background research: precision beekeeping, swarming and hive signals</w:t>
+        <w:spacing w:before="120" w:after="80" w:line="360" w:lineRule="auto"/>
+        <w:rPr>
+          <w:sz w:val="22"/>
+          <w:szCs w:val="22"/>
+        </w:rPr>
+      </w:pPr>
+      <w:r>
+        <w:rPr>
+          <w:b/>
+          <w:bCs/>
+          <w:sz w:val="20"/>
+          <w:szCs w:val="20"/>
+        </w:rPr>
+        <w:t>Background research: precision beekeeping, swarming and hive signals</w:t>
       </w:r>
     </w:p>
     <w:p>
@@ -4875,32 +4639,20 @@
     <w:p>
       <w:pPr>
         <w:keepNext/>
-        <w:spacing w:after="80" w:line="360" w:lineRule="auto" w:before="120"/>
-        <w:jc w:val="left"/>
-        <w:rPr>
-          <w:sz w:val="22"/>
-          <w:szCs w:val="22"/>
-        </w:rPr>
-      </w:pPr>
-      <w:proofErr w:type="spellStart"/>
-      <w:proofErr w:type="spellEnd"/>
-      <w:proofErr w:type="spellStart"/>
-      <w:proofErr w:type="spellEnd"/>
-      <w:proofErr w:type="gramStart"/>
-      <w:proofErr w:type="gramEnd"/>
-      <w:proofErr w:type="spellStart"/>
-      <w:proofErr w:type="spellEnd"/>
-      <w:r>
-        <w:rPr>
-          <w:b w:val="1"/>
-          <w:bCs w:val="1"/>
-          <w:i w:val="0"/>
-          <w:iCs w:val="0"/>
-          <w:sz w:val="20"/>
-          <w:szCs w:val="20"/>
-          <w:rtl w:val="0"/>
-        </w:rPr>
-        <w:t xml:space="preserve">Existing hive-monitoring systems</w:t>
+        <w:spacing w:before="120" w:after="80" w:line="360" w:lineRule="auto"/>
+        <w:rPr>
+          <w:sz w:val="22"/>
+          <w:szCs w:val="22"/>
+        </w:rPr>
+      </w:pPr>
+      <w:r>
+        <w:rPr>
+          <w:b/>
+          <w:bCs/>
+          <w:sz w:val="20"/>
+          <w:szCs w:val="20"/>
+        </w:rPr>
+        <w:t>Existing hive-monitoring systems</w:t>
       </w:r>
     </w:p>
     <w:p>
@@ -5119,30 +4871,20 @@
     <w:p>
       <w:pPr>
         <w:keepNext/>
-        <w:spacing w:after="80" w:line="360" w:lineRule="auto" w:before="120"/>
-        <w:jc w:val="left"/>
-        <w:rPr>
-          <w:sz w:val="22"/>
-          <w:szCs w:val="22"/>
-        </w:rPr>
-      </w:pPr>
-      <w:proofErr w:type="spellStart"/>
-      <w:proofErr w:type="spellEnd"/>
-      <w:proofErr w:type="spellStart"/>
-      <w:proofErr w:type="spellEnd"/>
-      <w:proofErr w:type="spellStart"/>
-      <w:proofErr w:type="spellEnd"/>
-      <w:r>
-        <w:rPr>
-          <w:b w:val="1"/>
-          <w:bCs w:val="1"/>
-          <w:i w:val="0"/>
-          <w:iCs w:val="0"/>
-          <w:sz w:val="20"/>
-          <w:szCs w:val="20"/>
-          <w:rtl w:val="0"/>
-        </w:rPr>
-        <w:t xml:space="preserve">Design data: signal levels, communication and components</w:t>
+        <w:spacing w:before="120" w:after="80" w:line="360" w:lineRule="auto"/>
+        <w:rPr>
+          <w:sz w:val="22"/>
+          <w:szCs w:val="22"/>
+        </w:rPr>
+      </w:pPr>
+      <w:r>
+        <w:rPr>
+          <w:b/>
+          <w:bCs/>
+          <w:sz w:val="20"/>
+          <w:szCs w:val="20"/>
+        </w:rPr>
+        <w:t>Design data: signal levels, communication and components</w:t>
       </w:r>
     </w:p>
     <w:p>
@@ -7529,7 +7271,7 @@
     <w:sectPr>
       <w:pgSz w:w="11906" w:h="16838"/>
       <w:pgMar w:top="1417" w:right="1417" w:bottom="1417" w:left="1417" w:header="709" w:footer="709" w:gutter="0"/>
-      <w:pgNumType w:fmt="decimal" w:start="1"/>
+      <w:pgNumType w:start="1"/>
       <w:cols w:space="720"/>
     </w:sectPr>
   </w:body>
@@ -7602,7 +7344,7 @@
 </file>
 
 <file path=word/footer3.xml><?xml version="1.0" encoding="utf-8"?>
-<w:ftr xmlns:m="http://schemas.openxmlformats.org/officeDocument/2006/math" xmlns:mc="http://schemas.openxmlformats.org/markup-compatibility/2006" xmlns:mo="http://schemas.microsoft.com/office/mac/office/2008/main" xmlns:mv="urn:schemas-microsoft-com:mac:vml" xmlns:o="urn:schemas-microsoft-com:office:office" xmlns:r="http://schemas.openxmlformats.org/officeDocument/2006/relationships" xmlns:v="urn:schemas-microsoft-com:vml" xmlns:w10="urn:schemas-microsoft-com:office:word" xmlns:w14="http://schemas.microsoft.com/office/word/2010/wordml" xmlns:w="http://schemas.openxmlformats.org/wordprocessingml/2006/main" xmlns:wne="http://schemas.microsoft.com/office/word/2006/wordml" xmlns:wp14="http://schemas.microsoft.com/office/word/2010/wordprocessingDrawing" xmlns:wp="http://schemas.openxmlformats.org/drawingml/2006/wordprocessingDrawing" xmlns:wpc="http://schemas.microsoft.com/office/word/2010/wordprocessingCanvas" xmlns:wpg="http://schemas.microsoft.com/office/word/2010/wordprocessingGroup" xmlns:wpi="http://schemas.microsoft.com/office/word/2010/wordprocessingInk" xmlns:wps="http://schemas.microsoft.com/office/word/2010/wordprocessingShape" mc:Ignorable="w14 wp14">
+<w:ftr xmlns:wpc="http://schemas.microsoft.com/office/word/2010/wordprocessingCanvas" xmlns:cx="http://schemas.microsoft.com/office/drawing/2014/chartex" xmlns:cx1="http://schemas.microsoft.com/office/drawing/2015/9/8/chartex" xmlns:cx2="http://schemas.microsoft.com/office/drawing/2015/10/21/chartex" xmlns:cx3="http://schemas.microsoft.com/office/drawing/2016/5/9/chartex" xmlns:cx4="http://schemas.microsoft.com/office/drawing/2016/5/10/chartex" xmlns:cx5="http://schemas.microsoft.com/office/drawing/2016/5/11/chartex" xmlns:cx6="http://schemas.microsoft.com/office/drawing/2016/5/12/chartex" xmlns:cx7="http://schemas.microsoft.com/office/drawing/2016/5/13/chartex" xmlns:cx8="http://schemas.microsoft.com/office/drawing/2016/5/14/chartex" xmlns:mc="http://schemas.openxmlformats.org/markup-compatibility/2006" xmlns:aink="http://schemas.microsoft.com/office/drawing/2016/ink" xmlns:am3d="http://schemas.microsoft.com/office/drawing/2017/model3d" xmlns:o="urn:schemas-microsoft-com:office:office" xmlns:oel="http://schemas.microsoft.com/office/2019/extlst" xmlns:r="http://schemas.openxmlformats.org/officeDocument/2006/relationships" xmlns:m="http://schemas.openxmlformats.org/officeDocument/2006/math" xmlns:v="urn:schemas-microsoft-com:vml" xmlns:wp14="http://schemas.microsoft.com/office/word/2010/wordprocessingDrawing" xmlns:wp="http://schemas.openxmlformats.org/drawingml/2006/wordprocessingDrawing" xmlns:w10="urn:schemas-microsoft-com:office:word" xmlns:w="http://schemas.openxmlformats.org/wordprocessingml/2006/main" xmlns:w14="http://schemas.microsoft.com/office/word/2010/wordml" xmlns:w15="http://schemas.microsoft.com/office/word/2012/wordml" xmlns:w16cex="http://schemas.microsoft.com/office/word/2018/wordml/cex" xmlns:w16cid="http://schemas.microsoft.com/office/word/2016/wordml/cid" xmlns:w16="http://schemas.microsoft.com/office/word/2018/wordml" xmlns:w16du="http://schemas.microsoft.com/office/word/2023/wordml/word16du" xmlns:w16sdtdh="http://schemas.microsoft.com/office/word/2020/wordml/sdtdatahash" xmlns:w16sdtfl="http://schemas.microsoft.com/office/word/2024/wordml/sdtformatlock" xmlns:w16se="http://schemas.microsoft.com/office/word/2015/wordml/symex" xmlns:wpg="http://schemas.microsoft.com/office/word/2010/wordprocessingGroup" xmlns:wpi="http://schemas.microsoft.com/office/word/2010/wordprocessingInk" xmlns:wne="http://schemas.microsoft.com/office/word/2006/wordml" xmlns:wps="http://schemas.microsoft.com/office/word/2010/wordprocessingShape" mc:Ignorable="w14 w15 w16se w16cid w16 w16cex w16sdtdh w16sdtfl w16du wp14">
   <w:p>
     <w:pPr>
       <w:pStyle w:val="Footer"/>
@@ -7668,41 +7410,26 @@
 </w:hdr>
 </file>
 
-<file path=word/header4.xml><?xml version="1.0" encoding="utf-8"?>
-<w:hdr xmlns:m="http://schemas.openxmlformats.org/officeDocument/2006/math" xmlns:mc="http://schemas.openxmlformats.org/markup-compatibility/2006" xmlns:mo="http://schemas.microsoft.com/office/mac/office/2008/main" xmlns:mv="urn:schemas-microsoft-com:mac:vml" xmlns:o="urn:schemas-microsoft-com:office:office" xmlns:r="http://schemas.openxmlformats.org/officeDocument/2006/relationships" xmlns:v="urn:schemas-microsoft-com:vml" xmlns:w10="urn:schemas-microsoft-com:office:word" xmlns:w14="http://schemas.microsoft.com/office/word/2010/wordml" xmlns:w="http://schemas.openxmlformats.org/wordprocessingml/2006/main" xmlns:wne="http://schemas.microsoft.com/office/word/2006/wordml" xmlns:wp14="http://schemas.microsoft.com/office/word/2010/wordprocessingDrawing" xmlns:wp="http://schemas.openxmlformats.org/drawingml/2006/wordprocessingDrawing" xmlns:wpc="http://schemas.microsoft.com/office/word/2010/wordprocessingCanvas" xmlns:wpg="http://schemas.microsoft.com/office/word/2010/wordprocessingGroup" xmlns:wpi="http://schemas.microsoft.com/office/word/2010/wordprocessingInk" xmlns:wps="http://schemas.microsoft.com/office/word/2010/wordprocessingShape" mc:Ignorable="w14 wp14">
+<file path=word/header3.xml><?xml version="1.0" encoding="utf-8"?>
+<w:hdr xmlns:wpc="http://schemas.microsoft.com/office/word/2010/wordprocessingCanvas" xmlns:cx="http://schemas.microsoft.com/office/drawing/2014/chartex" xmlns:cx1="http://schemas.microsoft.com/office/drawing/2015/9/8/chartex" xmlns:cx2="http://schemas.microsoft.com/office/drawing/2015/10/21/chartex" xmlns:cx3="http://schemas.microsoft.com/office/drawing/2016/5/9/chartex" xmlns:cx4="http://schemas.microsoft.com/office/drawing/2016/5/10/chartex" xmlns:cx5="http://schemas.microsoft.com/office/drawing/2016/5/11/chartex" xmlns:cx6="http://schemas.microsoft.com/office/drawing/2016/5/12/chartex" xmlns:cx7="http://schemas.microsoft.com/office/drawing/2016/5/13/chartex" xmlns:cx8="http://schemas.microsoft.com/office/drawing/2016/5/14/chartex" xmlns:mc="http://schemas.openxmlformats.org/markup-compatibility/2006" xmlns:aink="http://schemas.microsoft.com/office/drawing/2016/ink" xmlns:am3d="http://schemas.microsoft.com/office/drawing/2017/model3d" xmlns:o="urn:schemas-microsoft-com:office:office" xmlns:oel="http://schemas.microsoft.com/office/2019/extlst" xmlns:r="http://schemas.openxmlformats.org/officeDocument/2006/relationships" xmlns:m="http://schemas.openxmlformats.org/officeDocument/2006/math" xmlns:v="urn:schemas-microsoft-com:vml" xmlns:wp14="http://schemas.microsoft.com/office/word/2010/wordprocessingDrawing" xmlns:wp="http://schemas.openxmlformats.org/drawingml/2006/wordprocessingDrawing" xmlns:w10="urn:schemas-microsoft-com:office:word" xmlns:w="http://schemas.openxmlformats.org/wordprocessingml/2006/main" xmlns:w14="http://schemas.microsoft.com/office/word/2010/wordml" xmlns:w15="http://schemas.microsoft.com/office/word/2012/wordml" xmlns:w16cex="http://schemas.microsoft.com/office/word/2018/wordml/cex" xmlns:w16cid="http://schemas.microsoft.com/office/word/2016/wordml/cid" xmlns:w16="http://schemas.microsoft.com/office/word/2018/wordml" xmlns:w16du="http://schemas.microsoft.com/office/word/2023/wordml/word16du" xmlns:w16sdtdh="http://schemas.microsoft.com/office/word/2020/wordml/sdtdatahash" xmlns:w16sdtfl="http://schemas.microsoft.com/office/word/2024/wordml/sdtformatlock" xmlns:w16se="http://schemas.microsoft.com/office/word/2015/wordml/symex" xmlns:wpg="http://schemas.microsoft.com/office/word/2010/wordprocessingGroup" xmlns:wpi="http://schemas.microsoft.com/office/word/2010/wordprocessingInk" xmlns:wne="http://schemas.microsoft.com/office/word/2006/wordml" xmlns:wps="http://schemas.microsoft.com/office/word/2010/wordprocessingShape" mc:Ignorable="w14 w15 w16se w16cid w16 w16cex w16sdtdh w16sdtfl w16du wp14">
   <w:p>
     <w:pPr>
       <w:pStyle w:val="Header"/>
       <w:jc w:val="center"/>
     </w:pPr>
     <w:r>
-      <w:rPr>
-        <w:rFonts w:ascii="Times New Roman" w:hAnsi="Times New Roman" w:cs="Times New Roman"/>
-      </w:rPr>
       <w:fldChar w:fldCharType="begin"/>
     </w:r>
     <w:r>
-      <w:rPr>
-        <w:rFonts w:ascii="Times New Roman" w:hAnsi="Times New Roman" w:cs="Times New Roman"/>
-      </w:rPr>
       <w:instrText xml:space="preserve"> PAGE </w:instrText>
     </w:r>
     <w:r>
-      <w:rPr>
-        <w:rFonts w:ascii="Times New Roman" w:hAnsi="Times New Roman" w:cs="Times New Roman"/>
-      </w:rPr>
       <w:fldChar w:fldCharType="separate"/>
     </w:r>
     <w:r>
-      <w:rPr>
-        <w:rFonts w:ascii="Times New Roman" w:hAnsi="Times New Roman" w:cs="Times New Roman"/>
-      </w:rPr>
       <w:t>1</w:t>
     </w:r>
     <w:r>
-      <w:rPr>
-        <w:rFonts w:ascii="Times New Roman" w:hAnsi="Times New Roman" w:cs="Times New Roman"/>
-      </w:rPr>
       <w:fldChar w:fldCharType="end"/>
     </w:r>
   </w:p>
@@ -8590,6 +8317,18 @@
       </w:tblCellMar>
     </w:tblPr>
   </w:style>
+  <w:style w:type="character" w:styleId="UnresolvedMention">
+    <w:name w:val="Unresolved Mention"/>
+    <w:basedOn w:val="DefaultParagraphFont"/>
+    <w:uiPriority w:val="99"/>
+    <w:semiHidden/>
+    <w:unhideWhenUsed/>
+    <w:rsid w:val="000E4162"/>
+    <w:rPr>
+      <w:color w:val="605E5C"/>
+      <w:shd w:val="clear" w:color="auto" w:fill="E1DFDD"/>
+    </w:rPr>
+  </w:style>
 </w:styles>
 </file>
 

</xml_diff>

<commit_message>
vault backup: 2026-10-25 16:47:01
Affected files:
.obsidian/plugins/word-reader/data.json
docs/pdr-2027-165.docx
docs/~$r-2027-165.docx
</commit_message>
<xml_diff>
--- a/docs/pdr-2027-165.docx
+++ b/docs/pdr-2027-165.docx
@@ -78,13 +78,8 @@
         <w:jc w:val="center"/>
       </w:pPr>
       <w:r>
-        <w:t xml:space="preserve">Ben-Gurion University of </w:t>
-      </w:r>
-      <w:proofErr w:type="gramStart"/>
-      <w:r>
-        <w:t>the Negev</w:t>
-      </w:r>
-      <w:proofErr w:type="gramEnd"/>
+        <w:t>Ben-Gurion University of the Negev</w:t>
+      </w:r>
     </w:p>
     <w:p>
       <w:pPr>
@@ -278,21 +273,12 @@
           <w:bCs/>
         </w:rPr>
       </w:pPr>
-      <w:proofErr w:type="spellStart"/>
       <w:r>
         <w:rPr>
           <w:b/>
           <w:bCs/>
         </w:rPr>
-        <w:t>BeeSense</w:t>
-      </w:r>
-      <w:proofErr w:type="spellEnd"/>
-      <w:r>
-        <w:rPr>
-          <w:b/>
-          <w:bCs/>
-        </w:rPr>
-        <w:t xml:space="preserve"> — IoT-Based Acoustic and Weight Monitoring of Honeybee Colonies</w:t>
+        <w:t>BeeSense — IoT-Based Acoustic and Weight Monitoring of Honeybee Colonies</w:t>
       </w:r>
     </w:p>
     <w:p>
@@ -723,18 +709,8 @@
           <w:szCs w:val="22"/>
           <w:rtl/>
         </w:rPr>
-        <w:t xml:space="preserve">שם המנחה: ד"ר דן </w:t>
-      </w:r>
-      <w:proofErr w:type="spellStart"/>
-      <w:r>
-        <w:rPr>
-          <w:sz w:val="22"/>
-          <w:szCs w:val="22"/>
-          <w:rtl/>
-        </w:rPr>
-        <w:t>וילנצ'יק</w:t>
-      </w:r>
-      <w:proofErr w:type="spellEnd"/>
+        <w:t>שם המנחה: ד"ר דן וילנצ'יק</w:t>
+      </w:r>
     </w:p>
     <w:p>
       <w:pPr>
@@ -788,7 +764,24 @@
           <w:szCs w:val="22"/>
           <w:rtl/>
         </w:rPr>
-        <w:t xml:space="preserve">) לניטור כוורות בכוורן ללא חשמל וללא רשת. בכל כוורת מותקן צומת סוללתי עם חיישן רטט פיאזואלקטרי, המאזין בצריכה של ננו-אמפרים ומעיר את הצומת כשהרטט חורג מרמת הרקע; הצומת מחשב את ספקטרום הרטט והקול ומשלב אותו עם משקל הכוורת והטמפרטורה. מרכזייה סולארית בכוורן אוספת את הנתונים, מזהה סימנים לנחילה מתקרבת וחריגות במושבה, ושולחת התרעות דרך הרשת הסלולרית. החדשנות היא מערכת אוטונומית וזולה שמביאה לשטח יכולת שהוכחה במעבדה, בצריכת הספק נמוכה פי אלפים ממערכות המחקר. היעדים: דיוק שקילה של </w:t>
+        <w:t xml:space="preserve">) לניטור כוורות </w:t>
+      </w:r>
+      <w:r>
+        <w:rPr>
+          <w:rFonts w:hint="cs"/>
+          <w:sz w:val="22"/>
+          <w:szCs w:val="22"/>
+          <w:rtl/>
+        </w:rPr>
+        <w:t>במכוורת</w:t>
+      </w:r>
+      <w:r>
+        <w:rPr>
+          <w:sz w:val="22"/>
+          <w:szCs w:val="22"/>
+          <w:rtl/>
+        </w:rPr>
+        <w:t xml:space="preserve"> ללא חשמל וללא רשת. בכל כוורת מותקן צומת סוללתי עם חיישן רטט פיאזואלקטרי, המאזין בצריכה של ננו-אמפרים ומעיר את הצומת כשהרטט חורג מרמת הרקע; הצומת מחשב את ספקטרום הרטט והקול ומשלב אותו עם משקל הכוורת והטמפרטורה. מרכזייה סולארית בכוורן אוספת את הנתונים, מזהה סימנים לנחילה מתקרבת וחריגות במושבה, ושולחת התרעות דרך הרשת הסלולרית. החדשנות היא מערכת אוטונומית וזולה שמביאה לשטח יכולת שהוכחה במעבדה, בצריכת הספק נמוכה פי אלפים ממערכות המחקר. היעדים: דיוק שקילה של </w:t>
       </w:r>
       <w:r>
         <w:rPr>
@@ -892,25 +885,7 @@
           <w:szCs w:val="22"/>
           <w:rtl/>
         </w:rPr>
-        <w:t xml:space="preserve"> האינטרנט של הדברים, ניטור כוורות, דבורת הדבש, חיישן </w:t>
-      </w:r>
-      <w:proofErr w:type="spellStart"/>
-      <w:r>
-        <w:rPr>
-          <w:sz w:val="22"/>
-          <w:szCs w:val="22"/>
-          <w:rtl/>
-        </w:rPr>
-        <w:t>פיאזואלקטרי</w:t>
-      </w:r>
-      <w:proofErr w:type="spellEnd"/>
-      <w:r>
-        <w:rPr>
-          <w:sz w:val="22"/>
-          <w:szCs w:val="22"/>
-          <w:rtl/>
-        </w:rPr>
-        <w:t xml:space="preserve">, השכמה מונעת-אירועים, עיבוד אותות, תאי עומס, מערכות משובצות בהספק נמוך, </w:t>
+        <w:t xml:space="preserve"> האינטרנט של הדברים, ניטור כוורות, דבורת הדבש, חיישן פיאזואלקטרי, השכמה מונעת-אירועים, עיבוד אותות, תאי עומס, מערכות משובצות בהספק נמוך, </w:t>
       </w:r>
       <w:r>
         <w:rPr>
@@ -937,7 +912,6 @@
           <w:szCs w:val="22"/>
         </w:rPr>
       </w:pPr>
-      <w:proofErr w:type="spellStart"/>
       <w:r>
         <w:rPr>
           <w:b/>
@@ -946,18 +920,7 @@
           <w:szCs w:val="26"/>
           <w:u w:val="single"/>
         </w:rPr>
-        <w:t>BeeSense</w:t>
-      </w:r>
-      <w:proofErr w:type="spellEnd"/>
-      <w:r>
-        <w:rPr>
-          <w:b/>
-          <w:bCs/>
-          <w:sz w:val="26"/>
-          <w:szCs w:val="26"/>
-          <w:u w:val="single"/>
-        </w:rPr>
-        <w:t xml:space="preserve"> — IoT-Based Acoustic and Weight Monitoring of Honeybee Colonies</w:t>
+        <w:t>BeeSense — IoT-Based Acoustic and Weight Monitoring of Honeybee Colonies</w:t>
       </w:r>
     </w:p>
     <w:p>
@@ -1008,23 +971,7 @@
           <w:sz w:val="22"/>
           <w:szCs w:val="22"/>
         </w:rPr>
-        <w:t xml:space="preserve">Adviser Name: </w:t>
-      </w:r>
-      <w:proofErr w:type="spellStart"/>
-      <w:r>
-        <w:rPr>
-          <w:sz w:val="22"/>
-          <w:szCs w:val="22"/>
-        </w:rPr>
-        <w:t>Vilenchik</w:t>
-      </w:r>
-      <w:proofErr w:type="spellEnd"/>
-      <w:r>
-        <w:rPr>
-          <w:sz w:val="22"/>
-          <w:szCs w:val="22"/>
-        </w:rPr>
-        <w:t xml:space="preserve"> Dan</w:t>
+        <w:t>Adviser Name: Vilenchik Dan</w:t>
       </w:r>
     </w:p>
     <w:p>
@@ -1126,7 +1073,6 @@
           <w:szCs w:val="22"/>
         </w:rPr>
       </w:pPr>
-      <w:proofErr w:type="spellStart"/>
       <w:r>
         <w:rPr>
           <w:b/>
@@ -1134,9 +1080,18 @@
           <w:sz w:val="22"/>
           <w:szCs w:val="22"/>
         </w:rPr>
-        <w:t>BeeSense</w:t>
-      </w:r>
-      <w:proofErr w:type="spellEnd"/>
+        <w:t>BeeSense – event-driven vibration and weight monitoring of honeybee hives</w:t>
+      </w:r>
+    </w:p>
+    <w:p>
+      <w:pPr>
+        <w:keepNext/>
+        <w:spacing w:before="40" w:after="0" w:line="360" w:lineRule="auto"/>
+        <w:rPr>
+          <w:sz w:val="22"/>
+          <w:szCs w:val="22"/>
+        </w:rPr>
+      </w:pPr>
       <w:r>
         <w:rPr>
           <w:b/>
@@ -1144,7 +1099,24 @@
           <w:sz w:val="22"/>
           <w:szCs w:val="22"/>
         </w:rPr>
-        <w:t xml:space="preserve"> – event-driven vibration and weight monitoring of honeybee hives</w:t>
+        <w:t>1.1 Motivation, Use Case and Applications</w:t>
+      </w:r>
+    </w:p>
+    <w:p>
+      <w:pPr>
+        <w:spacing w:after="20" w:line="360" w:lineRule="auto"/>
+        <w:jc w:val="both"/>
+        <w:rPr>
+          <w:sz w:val="22"/>
+          <w:szCs w:val="22"/>
+        </w:rPr>
+      </w:pPr>
+      <w:r>
+        <w:rPr>
+          <w:sz w:val="22"/>
+          <w:szCs w:val="22"/>
+        </w:rPr>
+        <w:t>Honeybee colonies are inspected mostly by opening the hive every few weeks to months; inspections disturb the colony, cost labour, and leave the beekeeper blind between visits. Precision beekeeping, i.e. monitoring colonies with sensors so that interventions are based on data, was proposed to close this gap [1]. Swarming is the costliest blind spot: the colony rears new queens for one to two weeks, the prime swarm leaves with the old queen once the queen cells are capped, clusters nearby for a few hours, and is then lost. Hive vibrations change measurably before swarming [2], [3], and continuous hive weight reveals foraging, consumption and swarm departures [4]. Initial use case: a beekeeper with many hives standing close together at a remote apiary without mains power or Wi-Fi, visiting every few weeks. The system must alert before a swarm leaves or a colony behaves abnormally, and show which hives need a visit first. Applications: commercial and hobby apiaries, pollination services, and research apiaries that need long continuous records.</w:t>
       </w:r>
     </w:p>
     <w:p>
@@ -1163,7 +1135,7 @@
           <w:sz w:val="22"/>
           <w:szCs w:val="22"/>
         </w:rPr>
-        <w:t>1.1 Motivation, Use Case and Applications</w:t>
+        <w:t>1.2 Objectives and Work Stages</w:t>
       </w:r>
     </w:p>
     <w:p>
@@ -1177,10 +1149,93 @@
       </w:pPr>
       <w:r>
         <w:rPr>
-          <w:sz w:val="22"/>
-          <w:szCs w:val="22"/>
-        </w:rPr>
-        <w:t>Honeybee colonies are inspected mostly by opening the hive every few weeks to months; inspections disturb the colony, cost labour, and leave the beekeeper blind between visits. Precision beekeeping, i.e. monitoring colonies with sensors so that interventions are based on data, was proposed to close this gap [1]. Swarming is the costliest blind spot: the colony rears new queens for one to two weeks, the prime swarm leaves with the old queen once the queen cells are capped, clusters nearby for a few hours, and is then lost. Hive vibrations change measurably before swarming [2], [3], and continuous hive weight reveals foraging, consumption and swarm departures [4]. Initial use case: a beekeeper with many hives standing close together at a remote apiary without mains power or Wi-Fi, visiting every few weeks. The system must alert before a swarm leaves or a colony behaves abnormally, and show which hives need a visit first. Applications: commercial and hobby apiaries, pollination services, and research apiaries that need long continuous records.</w:t>
+          <w:b/>
+          <w:bCs/>
+          <w:sz w:val="22"/>
+          <w:szCs w:val="22"/>
+        </w:rPr>
+        <w:t>Objectives:</w:t>
+      </w:r>
+      <w:r>
+        <w:rPr>
+          <w:sz w:val="22"/>
+          <w:szCs w:val="22"/>
+        </w:rPr>
+        <w:t xml:space="preserve"> (1) a battery-powered hive node with event-driven wake-up that measures vibration and sound spectra, weight and temperature, and runs at least six months per charge (targets in Section 3.3);</w:t>
+      </w:r>
+    </w:p>
+    <w:p>
+      <w:pPr>
+        <w:spacing w:after="20" w:line="360" w:lineRule="auto"/>
+        <w:jc w:val="both"/>
+        <w:rPr>
+          <w:sz w:val="22"/>
+          <w:szCs w:val="22"/>
+        </w:rPr>
+      </w:pPr>
+      <w:r>
+        <w:rPr>
+          <w:sz w:val="22"/>
+          <w:szCs w:val="22"/>
+        </w:rPr>
+        <w:t>(2) a reliable short-range link from the hives to a solar-powered hub with a cellular uplink, a cloud database and a web dashboard;</w:t>
+      </w:r>
+    </w:p>
+    <w:p>
+      <w:pPr>
+        <w:spacing w:after="20" w:line="360" w:lineRule="auto"/>
+        <w:jc w:val="both"/>
+        <w:rPr>
+          <w:sz w:val="22"/>
+          <w:szCs w:val="22"/>
+        </w:rPr>
+      </w:pPr>
+      <w:r>
+        <w:rPr>
+          <w:sz w:val="22"/>
+          <w:szCs w:val="22"/>
+        </w:rPr>
+        <w:t>(3) alerts on approaching swarms before the swarm leaves, with the achievable lead time as the research question, and detection of colony anomalies.</w:t>
+      </w:r>
+    </w:p>
+    <w:p>
+      <w:pPr>
+        <w:spacing w:after="20" w:line="360" w:lineRule="auto"/>
+        <w:jc w:val="both"/>
+        <w:rPr>
+          <w:sz w:val="22"/>
+          <w:szCs w:val="22"/>
+        </w:rPr>
+      </w:pPr>
+      <w:r>
+        <w:rPr>
+          <w:b/>
+          <w:bCs/>
+          <w:sz w:val="22"/>
+          <w:szCs w:val="22"/>
+        </w:rPr>
+        <w:t>Stages:</w:t>
+      </w:r>
+      <w:r>
+        <w:rPr>
+          <w:sz w:val="22"/>
+          <w:szCs w:val="22"/>
+        </w:rPr>
+        <w:t xml:space="preserve"> (1) requirements with the beekeeper and bench tests: piezo and wake chains, weighing, FFT</w:t>
+      </w:r>
+      <w:r>
+        <w:rPr>
+          <w:sz w:val="22"/>
+          <w:szCs w:val="22"/>
+        </w:rPr>
+        <w:t>(why)</w:t>
+      </w:r>
+      <w:r>
+        <w:rPr>
+          <w:sz w:val="22"/>
+          <w:szCs w:val="22"/>
+        </w:rPr>
+        <w:t xml:space="preserve"> time on the C3, and one night-time hive recording; (2) node: wake circuit, acquisition, on-board spectra, power modes, piezo vs. microphone, ESP-NOW range on site; (3) hub, database, detection and dashboard, installed before the spring swarming season; (4) field evaluation.</w:t>
       </w:r>
     </w:p>
     <w:p>
@@ -1199,7 +1254,7 @@
           <w:sz w:val="22"/>
           <w:szCs w:val="22"/>
         </w:rPr>
-        <w:t>1.2 Objectives and Work Stages</w:t>
+        <w:t>1.3 Technology, Interfaces and Contribution</w:t>
       </w:r>
     </w:p>
     <w:p>
@@ -1213,179 +1268,40 @@
       </w:pPr>
       <w:r>
         <w:rPr>
-          <w:b/>
-          <w:bCs/>
-          <w:sz w:val="22"/>
-          <w:szCs w:val="22"/>
-        </w:rPr>
-        <w:t>Objectives:</w:t>
-      </w:r>
-      <w:r>
-        <w:rPr>
-          <w:sz w:val="22"/>
-          <w:szCs w:val="22"/>
-        </w:rPr>
-        <w:t xml:space="preserve"> (1) a battery-powered hive node with event-driven wake-up that measures vibration and sound spectra, weight and temperature, and runs at least six months per charge (targets in Section 3.3);</w:t>
-      </w:r>
-    </w:p>
-    <w:p>
-      <w:pPr>
-        <w:spacing w:after="20" w:line="360" w:lineRule="auto"/>
-        <w:jc w:val="both"/>
-        <w:rPr>
-          <w:sz w:val="22"/>
-          <w:szCs w:val="22"/>
-        </w:rPr>
-      </w:pPr>
-      <w:r>
-        <w:rPr>
-          <w:sz w:val="22"/>
-          <w:szCs w:val="22"/>
-        </w:rPr>
-        <w:t>(2) a reliable short-range link from the hives to a solar-powered hub with a cellular uplink, a cloud database and a web dashboard;</w:t>
-      </w:r>
-    </w:p>
-    <w:p>
-      <w:pPr>
-        <w:spacing w:after="20" w:line="360" w:lineRule="auto"/>
-        <w:jc w:val="both"/>
-        <w:rPr>
-          <w:sz w:val="22"/>
-          <w:szCs w:val="22"/>
-        </w:rPr>
-      </w:pPr>
-      <w:r>
-        <w:rPr>
-          <w:sz w:val="22"/>
-          <w:szCs w:val="22"/>
-        </w:rPr>
-        <w:t>(3) alerts on approaching swarms before the swarm leaves, with the achievable lead time as the research question, and detection of colony anomalies.</w:t>
-      </w:r>
-    </w:p>
-    <w:p>
-      <w:pPr>
-        <w:spacing w:after="20" w:line="360" w:lineRule="auto"/>
-        <w:jc w:val="both"/>
-        <w:rPr>
-          <w:sz w:val="22"/>
-          <w:szCs w:val="22"/>
-        </w:rPr>
-      </w:pPr>
-      <w:r>
-        <w:rPr>
-          <w:b/>
-          <w:bCs/>
-          <w:sz w:val="22"/>
-          <w:szCs w:val="22"/>
-        </w:rPr>
-        <w:t>Stages:</w:t>
-      </w:r>
-      <w:r>
-        <w:rPr>
-          <w:sz w:val="22"/>
-          <w:szCs w:val="22"/>
-        </w:rPr>
-        <w:t xml:space="preserve"> (1) requirements with the beekeeper and bench tests: piezo and wake chains, weighing, FFT time on the C3, and one night-time hive recording; (2) node: wake circuit, acquisition, on-board spectra, power modes, piezo vs. microphone, ESP-NOW range on site; (3) hub, database, detection and dashboard, installed before the spring swarming season; (4) field evaluation.</w:t>
-      </w:r>
-    </w:p>
-    <w:p>
-      <w:pPr>
-        <w:keepNext/>
-        <w:spacing w:before="40" w:after="0" w:line="360" w:lineRule="auto"/>
-        <w:rPr>
-          <w:sz w:val="22"/>
-          <w:szCs w:val="22"/>
-        </w:rPr>
-      </w:pPr>
-      <w:r>
-        <w:rPr>
-          <w:b/>
-          <w:bCs/>
-          <w:sz w:val="22"/>
-          <w:szCs w:val="22"/>
-        </w:rPr>
-        <w:t>1.3 Technology, Interfaces and Contribution</w:t>
-      </w:r>
-    </w:p>
-    <w:p>
-      <w:pPr>
-        <w:spacing w:after="20" w:line="360" w:lineRule="auto"/>
-        <w:jc w:val="both"/>
-        <w:rPr>
-          <w:sz w:val="22"/>
-          <w:szCs w:val="22"/>
-        </w:rPr>
-      </w:pPr>
-      <w:r>
-        <w:rPr>
-          <w:sz w:val="22"/>
-          <w:szCs w:val="22"/>
-        </w:rPr>
-        <w:t xml:space="preserve">Each hive node uses an ESP32-C3 </w:t>
-      </w:r>
-      <w:proofErr w:type="spellStart"/>
-      <w:r>
-        <w:rPr>
-          <w:sz w:val="22"/>
-          <w:szCs w:val="22"/>
-        </w:rPr>
-        <w:t>SuperMini</w:t>
-      </w:r>
-      <w:proofErr w:type="spellEnd"/>
-      <w:r>
-        <w:rPr>
-          <w:sz w:val="22"/>
-          <w:szCs w:val="22"/>
-        </w:rPr>
-        <w:t xml:space="preserve"> (RISC-V, 160 MHz, Wi-Fi radio, no floating-point unit). A 27 mm piezo disc is pressed into the comb at the </w:t>
-      </w:r>
-      <w:proofErr w:type="spellStart"/>
-      <w:r>
-        <w:rPr>
-          <w:sz w:val="22"/>
-          <w:szCs w:val="22"/>
-        </w:rPr>
-        <w:t>centre</w:t>
-      </w:r>
-      <w:proofErr w:type="spellEnd"/>
-      <w:r>
-        <w:rPr>
-          <w:sz w:val="22"/>
-          <w:szCs w:val="22"/>
-        </w:rPr>
-        <w:t xml:space="preserve"> of the central frame and covered with wax, where comb vibration is strongest (Section 3.2). It has two roles. First, a </w:t>
-      </w:r>
-      <w:proofErr w:type="spellStart"/>
-      <w:r>
-        <w:rPr>
-          <w:sz w:val="22"/>
-          <w:szCs w:val="22"/>
-        </w:rPr>
-        <w:t>nanopower</w:t>
-      </w:r>
-      <w:proofErr w:type="spellEnd"/>
-      <w:r>
-        <w:rPr>
-          <w:sz w:val="22"/>
-          <w:szCs w:val="22"/>
-        </w:rPr>
-        <w:t xml:space="preserve"> wake circuit (envelope detector and comparator, about 2 µA) compares the vibration envelope with its own slow average and wakes the MCU through a GPIO when the envelope jumps. Second, an op-amp preamplifier, powered only while recording, biases and protects the signal for the ADC and acts as the anti-aliasing low-pass (≈800 Hz). </w:t>
-      </w:r>
-      <w:proofErr w:type="gramStart"/>
-      <w:r>
-        <w:rPr>
-          <w:sz w:val="22"/>
-          <w:szCs w:val="22"/>
-        </w:rPr>
-        <w:t>An</w:t>
-      </w:r>
-      <w:proofErr w:type="gramEnd"/>
-      <w:r>
-        <w:rPr>
-          <w:sz w:val="22"/>
-          <w:szCs w:val="22"/>
-        </w:rPr>
-        <w:t xml:space="preserve"> I²S MEMS microphone, inside the hive behind a mesh, is the second analysis channel. Weight: four 50 kg half-bridge load cells under a hive platform and an HX711 24-bit ADC; temperature: DS18B20 probes. Power: one 18650 cell and a low-quiescent LDO. Nodes report over ESP-NOW, a connectionless protocol on the Wi-Fi radio, to an ESP32-S3 hub serving a </w:t>
+          <w:sz w:val="22"/>
+          <w:szCs w:val="22"/>
+        </w:rPr>
+        <w:t>Each hive node uses an ESP32-C3 SuperMini (RISC-V, 160 MHz, Wi-Fi radio, no floating-point unit</w:t>
+      </w:r>
+      <w:r>
+        <w:rPr>
+          <w:sz w:val="22"/>
+          <w:szCs w:val="22"/>
+        </w:rPr>
+        <w:t xml:space="preserve">- </w:t>
+      </w:r>
+      <w:r>
+        <w:rPr>
+          <w:sz w:val="22"/>
+          <w:szCs w:val="22"/>
+          <w:highlight w:val="yellow"/>
+        </w:rPr>
+        <w:t>is that ok?</w:t>
+      </w:r>
+      <w:r>
+        <w:rPr>
+          <w:sz w:val="22"/>
+          <w:szCs w:val="22"/>
+          <w:highlight w:val="yellow"/>
+        </w:rPr>
+        <w:t>).</w:t>
+      </w:r>
+      <w:r>
+        <w:rPr>
+          <w:sz w:val="22"/>
+          <w:szCs w:val="22"/>
+        </w:rPr>
+        <w:t xml:space="preserve"> A 27 mm piezo disc is pressed into the comb at the centre of the central frame and covered with wax, where comb vibration is strongest (Section 3.2). It has two roles. First, a nanopower wake circuit (envelope detector and comparator, about 2 µA) compares the vibration envelope with its own slow average and wakes the MCU through a GPIO when the envelope jumps. Second, an op-amp preamplifier, powered only while recording, biases and protects the signal for the ADC and acts as the anti-aliasing low-pass (≈800 Hz). An I²S MEMS microphone, inside the hive behind a mesh, is the second analysis channel. Weight: four 50 kg half-bridge load cells under a hive platform and an HX711 24-bit ADC; temperature: DS18B20 probes. Power: one 18650 cell and a low-quiescent LDO. Nodes report over ESP-NOW, a connectionless protocol on the Wi-Fi radio, to an ESP32-S3 hub serving a </w:t>
       </w:r>
       <w:r>
         <w:rPr>
@@ -1459,39 +1375,7 @@
           <w:sz w:val="18"/>
           <w:szCs w:val="18"/>
         </w:rPr>
-        <w:t xml:space="preserve">Fig. 1.  </w:t>
-      </w:r>
-      <w:proofErr w:type="spellStart"/>
-      <w:r>
-        <w:rPr>
-          <w:sz w:val="18"/>
-          <w:szCs w:val="18"/>
-        </w:rPr>
-        <w:t>BeeSense</w:t>
-      </w:r>
-      <w:proofErr w:type="spellEnd"/>
-      <w:r>
-        <w:rPr>
-          <w:sz w:val="18"/>
-          <w:szCs w:val="18"/>
-        </w:rPr>
-        <w:t xml:space="preserve"> block diagram (blue: </w:t>
-      </w:r>
-      <w:proofErr w:type="spellStart"/>
-      <w:r>
-        <w:rPr>
-          <w:sz w:val="18"/>
-          <w:szCs w:val="18"/>
-        </w:rPr>
-        <w:t>BeeSense</w:t>
-      </w:r>
-      <w:proofErr w:type="spellEnd"/>
-      <w:r>
-        <w:rPr>
-          <w:sz w:val="18"/>
-          <w:szCs w:val="18"/>
-        </w:rPr>
-        <w:t xml:space="preserve"> system, grey: external; red: event wake-up path).</w:t>
+        <w:t>Fig. 1.  BeeSense block diagram (blue: BeeSense system, grey: external; red: event wake-up path).</w:t>
       </w:r>
     </w:p>
     <w:p>
@@ -1632,27 +1516,7 @@
                 <w:sz w:val="18"/>
                 <w:szCs w:val="18"/>
               </w:rPr>
-              <w:t xml:space="preserve">What </w:t>
-            </w:r>
-            <w:proofErr w:type="spellStart"/>
-            <w:r>
-              <w:rPr>
-                <w:b/>
-                <w:bCs/>
-                <w:sz w:val="18"/>
-                <w:szCs w:val="18"/>
-              </w:rPr>
-              <w:t>BeeSense</w:t>
-            </w:r>
-            <w:proofErr w:type="spellEnd"/>
-            <w:r>
-              <w:rPr>
-                <w:b/>
-                <w:bCs/>
-                <w:sz w:val="18"/>
-                <w:szCs w:val="18"/>
-              </w:rPr>
-              <w:t xml:space="preserve"> must show</w:t>
+              <w:t>What BeeSense must show</w:t>
             </w:r>
           </w:p>
         </w:tc>
@@ -1772,23 +1636,7 @@
                 <w:sz w:val="18"/>
                 <w:szCs w:val="18"/>
               </w:rPr>
-              <w:t xml:space="preserve">Battery operation, ~1 </w:t>
-            </w:r>
-            <w:proofErr w:type="spellStart"/>
-            <w:r>
-              <w:rPr>
-                <w:sz w:val="18"/>
-                <w:szCs w:val="18"/>
-              </w:rPr>
-              <w:t>mW</w:t>
-            </w:r>
-            <w:proofErr w:type="spellEnd"/>
-            <w:r>
-              <w:rPr>
-                <w:sz w:val="18"/>
-                <w:szCs w:val="18"/>
-              </w:rPr>
-              <w:t xml:space="preserve"> average power</w:t>
+              <w:t>Battery operation, ~1 mW average power</w:t>
             </w:r>
           </w:p>
         </w:tc>
@@ -1807,21 +1655,12 @@
               <w:keepNext/>
               <w:spacing w:after="0" w:line="240" w:lineRule="auto"/>
             </w:pPr>
-            <w:proofErr w:type="spellStart"/>
             <w:r>
               <w:rPr>
                 <w:sz w:val="18"/>
                 <w:szCs w:val="18"/>
               </w:rPr>
-              <w:t>BroodMinder</w:t>
-            </w:r>
-            <w:proofErr w:type="spellEnd"/>
-            <w:r>
-              <w:rPr>
-                <w:sz w:val="18"/>
-                <w:szCs w:val="18"/>
-              </w:rPr>
-              <w:t xml:space="preserve"> [7]</w:t>
+              <w:t>BroodMinder [7]</w:t>
             </w:r>
           </w:p>
         </w:tc>
@@ -1877,21 +1716,12 @@
             <w:pPr>
               <w:spacing w:after="0" w:line="240" w:lineRule="auto"/>
             </w:pPr>
-            <w:proofErr w:type="spellStart"/>
             <w:r>
               <w:rPr>
                 <w:sz w:val="18"/>
                 <w:szCs w:val="18"/>
               </w:rPr>
-              <w:t>BeeHero</w:t>
-            </w:r>
-            <w:proofErr w:type="spellEnd"/>
-            <w:r>
-              <w:rPr>
-                <w:sz w:val="18"/>
-                <w:szCs w:val="18"/>
-              </w:rPr>
-              <w:t xml:space="preserve"> [8]</w:t>
+              <w:t>BeeHero [8]</w:t>
             </w:r>
           </w:p>
         </w:tc>
@@ -2103,15 +1933,7 @@
           <w:szCs w:val="22"/>
         </w:rPr>
         <w:lastRenderedPageBreak/>
-        <w:t xml:space="preserve">with Welch's method (1024-point Hann windows, 50% overlap, </w:t>
-      </w:r>
-      <w:proofErr w:type="spellStart"/>
-      <w:r>
-        <w:rPr>
-          <w:sz w:val="22"/>
-          <w:szCs w:val="22"/>
-        </w:rPr>
-        <w:t>Δ</w:t>
+        <w:t>with Welch's method (1024-point Hann windows, 50% overlap, Δ</w:t>
       </w:r>
       <w:r>
         <w:rPr>
@@ -2122,7 +1944,6 @@
         </w:rPr>
         <w:t>f</w:t>
       </w:r>
-      <w:proofErr w:type="spellEnd"/>
       <w:r>
         <w:rPr>
           <w:sz w:val="22"/>
@@ -2226,15 +2047,7 @@
           <w:sz w:val="22"/>
           <w:szCs w:val="22"/>
         </w:rPr>
-        <w:t xml:space="preserve"> = </w:t>
-      </w:r>
-      <w:proofErr w:type="spellStart"/>
-      <w:r>
-        <w:rPr>
-          <w:sz w:val="22"/>
-          <w:szCs w:val="22"/>
-        </w:rPr>
-        <w:t>Σ</w:t>
+        <w:t xml:space="preserve"> = Σ</w:t>
       </w:r>
       <w:r>
         <w:rPr>
@@ -2246,7 +2059,6 @@
         </w:rPr>
         <w:t>f∈Bk</w:t>
       </w:r>
-      <w:proofErr w:type="spellEnd"/>
       <w:r>
         <w:rPr>
           <w:sz w:val="22"/>
@@ -2284,15 +2096,7 @@
           <w:sz w:val="22"/>
           <w:szCs w:val="22"/>
         </w:rPr>
-        <w:t xml:space="preserve">) / </w:t>
-      </w:r>
-      <w:proofErr w:type="spellStart"/>
-      <w:r>
-        <w:rPr>
-          <w:sz w:val="22"/>
-          <w:szCs w:val="22"/>
-        </w:rPr>
-        <w:t>Σ</w:t>
+        <w:t>) / Σ</w:t>
       </w:r>
       <w:r>
         <w:rPr>
@@ -2304,7 +2108,6 @@
         </w:rPr>
         <w:t>f∈B</w:t>
       </w:r>
-      <w:proofErr w:type="spellEnd"/>
       <w:r>
         <w:rPr>
           <w:sz w:val="22"/>
@@ -2337,21 +2140,12 @@
         </w:rPr>
         <w:t>f</w:t>
       </w:r>
-      <w:proofErr w:type="gramStart"/>
-      <w:r>
-        <w:rPr>
-          <w:sz w:val="22"/>
-          <w:szCs w:val="22"/>
-        </w:rPr>
-        <w:t xml:space="preserve">),   </w:t>
-      </w:r>
-      <w:proofErr w:type="gramEnd"/>
-      <w:r>
-        <w:rPr>
-          <w:sz w:val="22"/>
-          <w:szCs w:val="22"/>
-        </w:rPr>
-        <w:t xml:space="preserve">  </w:t>
+      <w:r>
+        <w:rPr>
+          <w:sz w:val="22"/>
+          <w:szCs w:val="22"/>
+        </w:rPr>
+        <w:t xml:space="preserve">),     </w:t>
       </w:r>
       <w:r>
         <w:rPr>
@@ -2440,7 +2234,6 @@
         </w:rPr>
         <w:t xml:space="preserve"> − </w:t>
       </w:r>
-      <w:proofErr w:type="spellStart"/>
       <w:r>
         <w:rPr>
           <w:i/>
@@ -2460,7 +2253,6 @@
         </w:rPr>
         <w:t>h</w:t>
       </w:r>
-      <w:proofErr w:type="spellEnd"/>
       <w:r>
         <w:rPr>
           <w:sz w:val="22"/>
@@ -2468,7 +2260,6 @@
         </w:rPr>
         <w:t xml:space="preserve">) / </w:t>
       </w:r>
-      <w:proofErr w:type="spellStart"/>
       <w:r>
         <w:rPr>
           <w:i/>
@@ -2478,7 +2269,6 @@
         </w:rPr>
         <w:t>σ</w:t>
       </w:r>
-      <w:proofErr w:type="gramStart"/>
       <w:r>
         <w:rPr>
           <w:i/>
@@ -2489,21 +2279,12 @@
         </w:rPr>
         <w:t>h</w:t>
       </w:r>
-      <w:proofErr w:type="spellEnd"/>
-      <w:r>
-        <w:rPr>
-          <w:sz w:val="22"/>
-          <w:szCs w:val="22"/>
-        </w:rPr>
-        <w:t xml:space="preserve">,   </w:t>
-      </w:r>
-      <w:proofErr w:type="gramEnd"/>
-      <w:r>
-        <w:rPr>
-          <w:sz w:val="22"/>
-          <w:szCs w:val="22"/>
-        </w:rPr>
-        <w:t xml:space="preserve">  Δ</w:t>
+      <w:r>
+        <w:rPr>
+          <w:sz w:val="22"/>
+          <w:szCs w:val="22"/>
+        </w:rPr>
+        <w:t>,     Δ</w:t>
       </w:r>
       <w:r>
         <w:rPr>
@@ -2569,7 +2350,6 @@
         </w:rPr>
         <w:t xml:space="preserve">) − </w:t>
       </w:r>
-      <w:proofErr w:type="gramStart"/>
       <w:r>
         <w:rPr>
           <w:i/>
@@ -2586,7 +2366,6 @@
         </w:rPr>
         <w:t>(</w:t>
       </w:r>
-      <w:proofErr w:type="gramEnd"/>
       <w:r>
         <w:rPr>
           <w:i/>
@@ -2668,7 +2447,6 @@
         </w:rPr>
         <w:t xml:space="preserve"> with the same hive's mean </w:t>
       </w:r>
-      <w:proofErr w:type="spellStart"/>
       <w:r>
         <w:rPr>
           <w:i/>
@@ -2688,7 +2466,6 @@
         </w:rPr>
         <w:t>h</w:t>
       </w:r>
-      <w:proofErr w:type="spellEnd"/>
       <w:r>
         <w:rPr>
           <w:sz w:val="22"/>
@@ -2696,7 +2473,6 @@
         </w:rPr>
         <w:t xml:space="preserve"> and deviation </w:t>
       </w:r>
-      <w:proofErr w:type="spellStart"/>
       <w:r>
         <w:rPr>
           <w:i/>
@@ -2716,7 +2492,6 @@
         </w:rPr>
         <w:t>h</w:t>
       </w:r>
-      <w:proofErr w:type="spellEnd"/>
       <w:r>
         <w:rPr>
           <w:sz w:val="22"/>
@@ -2788,7 +2563,6 @@
         </w:rPr>
         <w:t xml:space="preserve"> &lt; −</w:t>
       </w:r>
-      <w:proofErr w:type="spellStart"/>
       <w:r>
         <w:rPr>
           <w:i/>
@@ -2808,7 +2582,6 @@
         </w:rPr>
         <w:t>th</w:t>
       </w:r>
-      <w:proofErr w:type="spellEnd"/>
       <w:r>
         <w:rPr>
           <w:sz w:val="22"/>
@@ -2832,7 +2605,6 @@
         </w:rPr>
         <w:t xml:space="preserve"> = 30 min together with an event wake; a prime swarm carries roughly 10,000–20,000 bees, about 1–2 kg at ≈0.1 g per bee, so </w:t>
       </w:r>
-      <w:proofErr w:type="spellStart"/>
       <w:r>
         <w:rPr>
           <w:i/>
@@ -2852,7 +2624,6 @@
         </w:rPr>
         <w:t>th</w:t>
       </w:r>
-      <w:proofErr w:type="spellEnd"/>
       <w:r>
         <w:rPr>
           <w:sz w:val="22"/>
@@ -3124,15 +2895,33 @@
           <w:sz w:val="22"/>
           <w:szCs w:val="22"/>
         </w:rPr>
+        <w:t xml:space="preserve"> Σ</w:t>
+      </w:r>
+      <w:r>
+        <w:rPr>
+          <w:i/>
+          <w:iCs/>
+          <w:sz w:val="22"/>
+          <w:szCs w:val="22"/>
+          <w:vertAlign w:val="subscript"/>
+        </w:rPr>
+        <w:t>i</w:t>
+      </w:r>
+      <w:r>
+        <w:rPr>
+          <w:sz w:val="22"/>
+          <w:szCs w:val="22"/>
+        </w:rPr>
         <w:t xml:space="preserve"> </w:t>
       </w:r>
-      <w:proofErr w:type="spellStart"/>
-      <w:r>
-        <w:rPr>
-          <w:sz w:val="22"/>
-          <w:szCs w:val="22"/>
-        </w:rPr>
-        <w:t>Σ</w:t>
+      <w:r>
+        <w:rPr>
+          <w:i/>
+          <w:iCs/>
+          <w:sz w:val="22"/>
+          <w:szCs w:val="22"/>
+        </w:rPr>
+        <w:t>I</w:t>
       </w:r>
       <w:r>
         <w:rPr>
@@ -3144,23 +2933,14 @@
         </w:rPr>
         <w:t>i</w:t>
       </w:r>
-      <w:proofErr w:type="spellEnd"/>
-      <w:r>
-        <w:rPr>
-          <w:sz w:val="22"/>
-          <w:szCs w:val="22"/>
-        </w:rPr>
-        <w:t xml:space="preserve"> </w:t>
-      </w:r>
-      <w:proofErr w:type="spellStart"/>
-      <w:r>
-        <w:rPr>
-          <w:i/>
-          <w:iCs/>
-          <w:sz w:val="22"/>
-          <w:szCs w:val="22"/>
-        </w:rPr>
-        <w:t>I</w:t>
+      <w:r>
+        <w:rPr>
+          <w:i/>
+          <w:iCs/>
+          <w:sz w:val="22"/>
+          <w:szCs w:val="22"/>
+        </w:rPr>
+        <w:t>t</w:t>
       </w:r>
       <w:r>
         <w:rPr>
@@ -3174,66 +2954,28 @@
       </w:r>
       <w:r>
         <w:rPr>
-          <w:i/>
-          <w:iCs/>
-          <w:sz w:val="22"/>
-          <w:szCs w:val="22"/>
-        </w:rPr>
-        <w:t>t</w:t>
-      </w:r>
-      <w:r>
-        <w:rPr>
-          <w:i/>
-          <w:iCs/>
+          <w:sz w:val="22"/>
+          <w:szCs w:val="22"/>
+        </w:rPr>
+        <w:t xml:space="preserve"> / 86 400 s,     </w:t>
+      </w:r>
+      <w:r>
+        <w:rPr>
+          <w:i/>
+          <w:iCs/>
+          <w:sz w:val="22"/>
+          <w:szCs w:val="22"/>
+        </w:rPr>
+        <w:t>T</w:t>
+      </w:r>
+      <w:r>
+        <w:rPr>
           <w:sz w:val="22"/>
           <w:szCs w:val="22"/>
           <w:vertAlign w:val="subscript"/>
         </w:rPr>
-        <w:t>i</w:t>
-      </w:r>
-      <w:proofErr w:type="spellEnd"/>
-      <w:r>
-        <w:rPr>
-          <w:sz w:val="22"/>
-          <w:szCs w:val="22"/>
-        </w:rPr>
-        <w:t xml:space="preserve"> / 86 400 </w:t>
-      </w:r>
-      <w:proofErr w:type="gramStart"/>
-      <w:r>
-        <w:rPr>
-          <w:sz w:val="22"/>
-          <w:szCs w:val="22"/>
-        </w:rPr>
-        <w:t xml:space="preserve">s,   </w:t>
-      </w:r>
-      <w:proofErr w:type="gramEnd"/>
-      <w:r>
-        <w:rPr>
-          <w:sz w:val="22"/>
-          <w:szCs w:val="22"/>
-        </w:rPr>
-        <w:t xml:space="preserve">  </w:t>
-      </w:r>
-      <w:proofErr w:type="spellStart"/>
-      <w:r>
-        <w:rPr>
-          <w:i/>
-          <w:iCs/>
-          <w:sz w:val="22"/>
-          <w:szCs w:val="22"/>
-        </w:rPr>
-        <w:t>T</w:t>
-      </w:r>
-      <w:r>
-        <w:rPr>
-          <w:sz w:val="22"/>
-          <w:szCs w:val="22"/>
-          <w:vertAlign w:val="subscript"/>
-        </w:rPr>
         <w:t>life</w:t>
       </w:r>
-      <w:proofErr w:type="spellEnd"/>
       <w:r>
         <w:rPr>
           <w:sz w:val="22"/>
@@ -3449,23 +3191,7 @@
           <w:sz w:val="18"/>
           <w:szCs w:val="18"/>
         </w:rPr>
-        <w:t xml:space="preserve">Fig. 2.  Estimated node battery life (one 18650 cell) vs. event </w:t>
-      </w:r>
-      <w:proofErr w:type="gramStart"/>
-      <w:r>
-        <w:rPr>
-          <w:sz w:val="18"/>
-          <w:szCs w:val="18"/>
-        </w:rPr>
-        <w:t>wake-ups</w:t>
-      </w:r>
-      <w:proofErr w:type="gramEnd"/>
-      <w:r>
-        <w:rPr>
-          <w:sz w:val="18"/>
-          <w:szCs w:val="18"/>
-        </w:rPr>
-        <w:t xml:space="preserve"> per day by (3) (datasheet-level estimates, to be measured).</w:t>
+        <w:t>Fig. 2.  Estimated node battery life (one 18650 cell) vs. event wake-ups per day by (3) (datasheet-level estimates, to be measured).</w:t>
       </w:r>
     </w:p>
     <w:p>
@@ -3510,23 +3236,7 @@
           <w:sz w:val="22"/>
           <w:szCs w:val="22"/>
         </w:rPr>
-        <w:t xml:space="preserve"> weighing linearity with reference masses (0–100 kg) and a temperature sweep; piezo and wake chains checked with known tones (100–800 Hz) and bursts from a shaker coupled to a frame; average current measured with a power </w:t>
-      </w:r>
-      <w:proofErr w:type="spellStart"/>
-      <w:r>
-        <w:rPr>
-          <w:sz w:val="22"/>
-          <w:szCs w:val="22"/>
-        </w:rPr>
-        <w:t>analyser</w:t>
-      </w:r>
-      <w:proofErr w:type="spellEnd"/>
-      <w:r>
-        <w:rPr>
-          <w:sz w:val="22"/>
-          <w:szCs w:val="22"/>
-        </w:rPr>
-        <w:t xml:space="preserve"> over full cycles. </w:t>
+        <w:t xml:space="preserve"> weighing linearity with reference masses (0–100 kg) and a temperature sweep; piezo and wake chains checked with known tones (100–800 Hz) and bursts from a shaker coupled to a frame; average current measured with a power analyser over full cycles. </w:t>
       </w:r>
       <w:r>
         <w:rPr>
@@ -3604,23 +3314,7 @@
           <w:sz w:val="22"/>
           <w:szCs w:val="22"/>
         </w:rPr>
-        <w:t xml:space="preserve"> = TP/(TP+FN) per swarm, with the lead time reported; the departure rule is also tested with controlled removal of known masses (0.5–2 kg). Event wakes and false alarms are counted per hive-day. Thresholds are tuned on the first weeks and </w:t>
-      </w:r>
-      <w:proofErr w:type="gramStart"/>
-      <w:r>
-        <w:rPr>
-          <w:sz w:val="22"/>
-          <w:szCs w:val="22"/>
-        </w:rPr>
-        <w:t>frozen</w:t>
-      </w:r>
-      <w:proofErr w:type="gramEnd"/>
-      <w:r>
-        <w:rPr>
-          <w:sz w:val="22"/>
-          <w:szCs w:val="22"/>
-        </w:rPr>
-        <w:t xml:space="preserve"> before the evaluation period. The packet delivery ratio (PDR) is computed from sequence numbers, and the hub logs its battery voltage to check the solar energy balance.</w:t>
+        <w:t xml:space="preserve"> = TP/(TP+FN) per swarm, with the lead time reported; the departure rule is also tested with controlled removal of known masses (0.5–2 kg). Event wakes and false alarms are counted per hive-day. Thresholds are tuned on the first weeks and frozen before the evaluation period. The packet delivery ratio (PDR) is computed from sequence numbers, and the hub logs its battery voltage to check the solar energy balance.</w:t>
       </w:r>
     </w:p>
     <w:p>
@@ -4242,82 +3936,23 @@
           <w:szCs w:val="20"/>
         </w:rPr>
         <w:tab/>
-        <w:t xml:space="preserve">A. Zacepins, V. Brusbardis, J. </w:t>
-      </w:r>
-      <w:proofErr w:type="spellStart"/>
-      <w:r>
-        <w:rPr>
+        <w:t xml:space="preserve">A. Zacepins, V. Brusbardis, J. Meitalovs, and E. Stalidzans, "Challenges in the development of precision beekeeping," </w:t>
+      </w:r>
+      <w:r>
+        <w:rPr>
+          <w:i/>
+          <w:iCs/>
           <w:sz w:val="20"/>
           <w:szCs w:val="20"/>
         </w:rPr>
-        <w:t>Meitalovs</w:t>
-      </w:r>
-      <w:proofErr w:type="spellEnd"/>
+        <w:t>Biosyst. Eng.</w:t>
+      </w:r>
       <w:r>
         <w:rPr>
           <w:sz w:val="20"/>
           <w:szCs w:val="20"/>
         </w:rPr>
-        <w:t xml:space="preserve">, and E. </w:t>
-      </w:r>
-      <w:proofErr w:type="spellStart"/>
-      <w:r>
-        <w:rPr>
-          <w:sz w:val="20"/>
-          <w:szCs w:val="20"/>
-        </w:rPr>
-        <w:t>Stalidzans</w:t>
-      </w:r>
-      <w:proofErr w:type="spellEnd"/>
-      <w:r>
-        <w:rPr>
-          <w:sz w:val="20"/>
-          <w:szCs w:val="20"/>
-        </w:rPr>
-        <w:t xml:space="preserve">, "Challenges in the development of precision beekeeping," </w:t>
-      </w:r>
-      <w:proofErr w:type="spellStart"/>
-      <w:r>
-        <w:rPr>
-          <w:i/>
-          <w:iCs/>
-          <w:sz w:val="20"/>
-          <w:szCs w:val="20"/>
-        </w:rPr>
-        <w:t>Biosyst</w:t>
-      </w:r>
-      <w:proofErr w:type="spellEnd"/>
-      <w:r>
-        <w:rPr>
-          <w:i/>
-          <w:iCs/>
-          <w:sz w:val="20"/>
-          <w:szCs w:val="20"/>
-        </w:rPr>
-        <w:t>. Eng.</w:t>
-      </w:r>
-      <w:r>
-        <w:rPr>
-          <w:sz w:val="20"/>
-          <w:szCs w:val="20"/>
-        </w:rPr>
-        <w:t xml:space="preserve">, vol. 130, pp. 60–71, Feb. 2015, </w:t>
-      </w:r>
-      <w:proofErr w:type="spellStart"/>
-      <w:r>
-        <w:rPr>
-          <w:sz w:val="20"/>
-          <w:szCs w:val="20"/>
-        </w:rPr>
-        <w:t>doi</w:t>
-      </w:r>
-      <w:proofErr w:type="spellEnd"/>
-      <w:r>
-        <w:rPr>
-          <w:sz w:val="20"/>
-          <w:szCs w:val="20"/>
-        </w:rPr>
-        <w:t>: 10.1016/j.biosystemseng.2014.12.001.</w:t>
+        <w:t>, vol. 130, pp. 60–71, Feb. 2015, doi: 10.1016/j.biosystemseng.2014.12.001.</w:t>
       </w:r>
     </w:p>
     <w:p>
@@ -4348,7 +3983,6 @@
         <w:tab/>
         <w:t xml:space="preserve">S. Ferrari, M. Silva, M. Guarino, and D. Berckmans, "Monitoring of swarming sounds in bee hives for early detection of the swarming period," </w:t>
       </w:r>
-      <w:proofErr w:type="spellStart"/>
       <w:r>
         <w:rPr>
           <w:i/>
@@ -4356,40 +3990,14 @@
           <w:sz w:val="20"/>
           <w:szCs w:val="20"/>
         </w:rPr>
-        <w:t>Comput</w:t>
-      </w:r>
-      <w:proofErr w:type="spellEnd"/>
-      <w:r>
-        <w:rPr>
-          <w:i/>
-          <w:iCs/>
+        <w:t>Comput. Electron. Agric.</w:t>
+      </w:r>
+      <w:r>
+        <w:rPr>
           <w:sz w:val="20"/>
           <w:szCs w:val="20"/>
         </w:rPr>
-        <w:t>. Electron. Agric.</w:t>
-      </w:r>
-      <w:r>
-        <w:rPr>
-          <w:sz w:val="20"/>
-          <w:szCs w:val="20"/>
-        </w:rPr>
-        <w:t xml:space="preserve">, vol. 64, no. 1, pp. 72–77, 2008, </w:t>
-      </w:r>
-      <w:proofErr w:type="spellStart"/>
-      <w:r>
-        <w:rPr>
-          <w:sz w:val="20"/>
-          <w:szCs w:val="20"/>
-        </w:rPr>
-        <w:t>doi</w:t>
-      </w:r>
-      <w:proofErr w:type="spellEnd"/>
-      <w:r>
-        <w:rPr>
-          <w:sz w:val="20"/>
-          <w:szCs w:val="20"/>
-        </w:rPr>
-        <w:t>: 10.1016/j.compag.2008.05.010.</w:t>
+        <w:t>, vol. 64, no. 1, pp. 72–77, 2008, doi: 10.1016/j.compag.2008.05.010.</w:t>
       </w:r>
     </w:p>
     <w:p>
@@ -4418,55 +4026,23 @@
           <w:szCs w:val="20"/>
         </w:rPr>
         <w:tab/>
-        <w:t xml:space="preserve">M.-T. Ramsey, M. Bencsik, M. I. Newton, M. Reyes, M. Pioz, D. </w:t>
-      </w:r>
-      <w:proofErr w:type="spellStart"/>
-      <w:r>
-        <w:rPr>
+        <w:t xml:space="preserve">M.-T. Ramsey, M. Bencsik, M. I. Newton, M. Reyes, M. Pioz, D. Crauser, N. Simon Delso, and Y. Le Conte, "The prediction of swarming in honeybee colonies using vibrational spectra," </w:t>
+      </w:r>
+      <w:r>
+        <w:rPr>
+          <w:i/>
+          <w:iCs/>
           <w:sz w:val="20"/>
           <w:szCs w:val="20"/>
         </w:rPr>
-        <w:t>Crauser</w:t>
-      </w:r>
-      <w:proofErr w:type="spellEnd"/>
+        <w:t>Sci. Rep.</w:t>
+      </w:r>
       <w:r>
         <w:rPr>
           <w:sz w:val="20"/>
           <w:szCs w:val="20"/>
         </w:rPr>
-        <w:t xml:space="preserve">, N. Simon Delso, and Y. Le Conte, "The prediction of swarming in honeybee colonies using vibrational spectra," </w:t>
-      </w:r>
-      <w:r>
-        <w:rPr>
-          <w:i/>
-          <w:iCs/>
-          <w:sz w:val="20"/>
-          <w:szCs w:val="20"/>
-        </w:rPr>
-        <w:t>Sci. Rep.</w:t>
-      </w:r>
-      <w:r>
-        <w:rPr>
-          <w:sz w:val="20"/>
-          <w:szCs w:val="20"/>
-        </w:rPr>
-        <w:t xml:space="preserve">, vol. 10, Art. no. 9798, Jun. 2020, </w:t>
-      </w:r>
-      <w:proofErr w:type="spellStart"/>
-      <w:r>
-        <w:rPr>
-          <w:sz w:val="20"/>
-          <w:szCs w:val="20"/>
-        </w:rPr>
-        <w:t>doi</w:t>
-      </w:r>
-      <w:proofErr w:type="spellEnd"/>
-      <w:r>
-        <w:rPr>
-          <w:sz w:val="20"/>
-          <w:szCs w:val="20"/>
-        </w:rPr>
-        <w:t>: 10.1038/s41598-020-66115-5.</w:t>
+        <w:t>, vol. 10, Art. no. 9798, Jun. 2020, doi: 10.1038/s41598-020-66115-5.</w:t>
       </w:r>
     </w:p>
     <w:p>
@@ -4497,7 +4073,6 @@
         <w:tab/>
         <w:t xml:space="preserve">W. G. Meikle and N. Holst, "Application of continuous monitoring of honeybee colonies," </w:t>
       </w:r>
-      <w:proofErr w:type="spellStart"/>
       <w:r>
         <w:rPr>
           <w:i/>
@@ -4507,29 +4082,12 @@
         </w:rPr>
         <w:t>Apidologie</w:t>
       </w:r>
-      <w:proofErr w:type="spellEnd"/>
       <w:r>
         <w:rPr>
           <w:sz w:val="20"/>
           <w:szCs w:val="20"/>
         </w:rPr>
-        <w:t xml:space="preserve">, vol. 46, no. 1, pp. 10–22, 2015, </w:t>
-      </w:r>
-      <w:proofErr w:type="spellStart"/>
-      <w:r>
-        <w:rPr>
-          <w:sz w:val="20"/>
-          <w:szCs w:val="20"/>
-        </w:rPr>
-        <w:t>doi</w:t>
-      </w:r>
-      <w:proofErr w:type="spellEnd"/>
-      <w:r>
-        <w:rPr>
-          <w:sz w:val="20"/>
-          <w:szCs w:val="20"/>
-        </w:rPr>
-        <w:t>: 10.1007/s13592-014-0298-x.</w:t>
+        <w:t>, vol. 46, no. 1, pp. 10–22, 2015, doi: 10.1007/s13592-014-0298-x.</w:t>
       </w:r>
     </w:p>
     <w:p>
@@ -4558,82 +4116,23 @@
           <w:szCs w:val="20"/>
         </w:rPr>
         <w:tab/>
-        <w:t xml:space="preserve">M. Bencsik, J. Bencsik, M. Baxter, A. Lucian, J. Romieu, and M. Millet, "Identification of the </w:t>
-      </w:r>
-      <w:proofErr w:type="gramStart"/>
-      <w:r>
-        <w:rPr>
+        <w:t xml:space="preserve">M. Bencsik, J. Bencsik, M. Baxter, A. Lucian, J. Romieu, and M. Millet, "Identification of the honey bee swarming process by analysing the time course of hive vibrations," </w:t>
+      </w:r>
+      <w:r>
+        <w:rPr>
+          <w:i/>
+          <w:iCs/>
           <w:sz w:val="20"/>
           <w:szCs w:val="20"/>
         </w:rPr>
-        <w:t>honey bee</w:t>
-      </w:r>
-      <w:proofErr w:type="gramEnd"/>
+        <w:t>Comput. Electron. Agric.</w:t>
+      </w:r>
       <w:r>
         <w:rPr>
           <w:sz w:val="20"/>
           <w:szCs w:val="20"/>
         </w:rPr>
-        <w:t xml:space="preserve"> swarming process by </w:t>
-      </w:r>
-      <w:proofErr w:type="spellStart"/>
-      <w:r>
-        <w:rPr>
-          <w:sz w:val="20"/>
-          <w:szCs w:val="20"/>
-        </w:rPr>
-        <w:t>analysing</w:t>
-      </w:r>
-      <w:proofErr w:type="spellEnd"/>
-      <w:r>
-        <w:rPr>
-          <w:sz w:val="20"/>
-          <w:szCs w:val="20"/>
-        </w:rPr>
-        <w:t xml:space="preserve"> the time course of hive vibrations," </w:t>
-      </w:r>
-      <w:proofErr w:type="spellStart"/>
-      <w:r>
-        <w:rPr>
-          <w:i/>
-          <w:iCs/>
-          <w:sz w:val="20"/>
-          <w:szCs w:val="20"/>
-        </w:rPr>
-        <w:t>Comput</w:t>
-      </w:r>
-      <w:proofErr w:type="spellEnd"/>
-      <w:r>
-        <w:rPr>
-          <w:i/>
-          <w:iCs/>
-          <w:sz w:val="20"/>
-          <w:szCs w:val="20"/>
-        </w:rPr>
-        <w:t>. Electron. Agric.</w:t>
-      </w:r>
-      <w:r>
-        <w:rPr>
-          <w:sz w:val="20"/>
-          <w:szCs w:val="20"/>
-        </w:rPr>
-        <w:t xml:space="preserve">, vol. 76, no. 1, pp. 44–50, 2011, </w:t>
-      </w:r>
-      <w:proofErr w:type="spellStart"/>
-      <w:r>
-        <w:rPr>
-          <w:sz w:val="20"/>
-          <w:szCs w:val="20"/>
-        </w:rPr>
-        <w:t>doi</w:t>
-      </w:r>
-      <w:proofErr w:type="spellEnd"/>
-      <w:r>
-        <w:rPr>
-          <w:sz w:val="20"/>
-          <w:szCs w:val="20"/>
-        </w:rPr>
-        <w:t>: 10.1016/j.compag.2011.01.004.</w:t>
+        <w:t>, vol. 76, no. 1, pp. 44–50, 2011, doi: 10.1016/j.compag.2011.01.004.</w:t>
       </w:r>
     </w:p>
     <w:p>
@@ -4681,87 +4180,23 @@
           <w:szCs w:val="20"/>
         </w:rPr>
         <w:tab/>
-        <w:t xml:space="preserve">S. Cecchi, S. </w:t>
-      </w:r>
-      <w:proofErr w:type="spellStart"/>
-      <w:r>
-        <w:rPr>
+        <w:t xml:space="preserve">S. Cecchi, S. Spinsante, A. Terenzi, and S. Orcioni, "A smart sensor-based measurement system for advanced bee hive monitoring," </w:t>
+      </w:r>
+      <w:r>
+        <w:rPr>
+          <w:i/>
+          <w:iCs/>
           <w:sz w:val="20"/>
           <w:szCs w:val="20"/>
         </w:rPr>
-        <w:t>Spinsante</w:t>
-      </w:r>
-      <w:proofErr w:type="spellEnd"/>
+        <w:t>Sensors</w:t>
+      </w:r>
       <w:r>
         <w:rPr>
           <w:sz w:val="20"/>
           <w:szCs w:val="20"/>
         </w:rPr>
-        <w:t xml:space="preserve">, A. Terenzi, and S. </w:t>
-      </w:r>
-      <w:proofErr w:type="spellStart"/>
-      <w:r>
-        <w:rPr>
-          <w:sz w:val="20"/>
-          <w:szCs w:val="20"/>
-        </w:rPr>
-        <w:t>Orcioni</w:t>
-      </w:r>
-      <w:proofErr w:type="spellEnd"/>
-      <w:r>
-        <w:rPr>
-          <w:sz w:val="20"/>
-          <w:szCs w:val="20"/>
-        </w:rPr>
-        <w:t xml:space="preserve">, "A smart sensor-based measurement system for advanced </w:t>
-      </w:r>
-      <w:proofErr w:type="gramStart"/>
-      <w:r>
-        <w:rPr>
-          <w:sz w:val="20"/>
-          <w:szCs w:val="20"/>
-        </w:rPr>
-        <w:t>bee hive</w:t>
-      </w:r>
-      <w:proofErr w:type="gramEnd"/>
-      <w:r>
-        <w:rPr>
-          <w:sz w:val="20"/>
-          <w:szCs w:val="20"/>
-        </w:rPr>
-        <w:t xml:space="preserve"> monitoring," </w:t>
-      </w:r>
-      <w:r>
-        <w:rPr>
-          <w:i/>
-          <w:iCs/>
-          <w:sz w:val="20"/>
-          <w:szCs w:val="20"/>
-        </w:rPr>
-        <w:t>Sensors</w:t>
-      </w:r>
-      <w:r>
-        <w:rPr>
-          <w:sz w:val="20"/>
-          <w:szCs w:val="20"/>
-        </w:rPr>
-        <w:t xml:space="preserve">, vol. 20, no. 9, Art. no. 2726, May 2020, </w:t>
-      </w:r>
-      <w:proofErr w:type="spellStart"/>
-      <w:r>
-        <w:rPr>
-          <w:sz w:val="20"/>
-          <w:szCs w:val="20"/>
-        </w:rPr>
-        <w:t>doi</w:t>
-      </w:r>
-      <w:proofErr w:type="spellEnd"/>
-      <w:r>
-        <w:rPr>
-          <w:sz w:val="20"/>
-          <w:szCs w:val="20"/>
-        </w:rPr>
-        <w:t>: 10.3390/s20092726.</w:t>
+        <w:t>, vol. 20, no. 9, Art. no. 2726, May 2020, doi: 10.3390/s20092726.</w:t>
       </w:r>
     </w:p>
     <w:p>
@@ -4790,38 +4225,7 @@
           <w:szCs w:val="20"/>
         </w:rPr>
         <w:tab/>
-      </w:r>
-      <w:proofErr w:type="spellStart"/>
-      <w:r>
-        <w:rPr>
-          <w:sz w:val="20"/>
-          <w:szCs w:val="20"/>
-        </w:rPr>
-        <w:t>BroodMinder</w:t>
-      </w:r>
-      <w:proofErr w:type="spellEnd"/>
-      <w:r>
-        <w:rPr>
-          <w:sz w:val="20"/>
-          <w:szCs w:val="20"/>
-        </w:rPr>
-        <w:t xml:space="preserve">, "BroodMinder-W3 </w:t>
-      </w:r>
-      <w:proofErr w:type="gramStart"/>
-      <w:r>
-        <w:rPr>
-          <w:sz w:val="20"/>
-          <w:szCs w:val="20"/>
-        </w:rPr>
-        <w:t>four point</w:t>
-      </w:r>
-      <w:proofErr w:type="gramEnd"/>
-      <w:r>
-        <w:rPr>
-          <w:sz w:val="20"/>
-          <w:szCs w:val="20"/>
-        </w:rPr>
-        <w:t xml:space="preserve"> weight scale kit." [Online]. Available: https://workerandhive.com/products/broodminder-w3-four-point-weight-scale-kit</w:t>
+        <w:t>BroodMinder, "BroodMinder-W3 four point weight scale kit." [Online]. Available: https://workerandhive.com/products/broodminder-w3-four-point-weight-scale-kit</w:t>
       </w:r>
     </w:p>
     <w:p>
@@ -4850,22 +4254,7 @@
           <w:szCs w:val="20"/>
         </w:rPr>
         <w:tab/>
-      </w:r>
-      <w:proofErr w:type="spellStart"/>
-      <w:r>
-        <w:rPr>
-          <w:sz w:val="20"/>
-          <w:szCs w:val="20"/>
-        </w:rPr>
-        <w:t>BeeHero</w:t>
-      </w:r>
-      <w:proofErr w:type="spellEnd"/>
-      <w:r>
-        <w:rPr>
-          <w:sz w:val="20"/>
-          <w:szCs w:val="20"/>
-        </w:rPr>
-        <w:t>, "Technology." [Online]. Available: https://www.beehero.io/technology</w:t>
+        <w:t>BeeHero, "Technology." [Online]. Available: https://www.beehero.io/technology</w:t>
       </w:r>
     </w:p>
     <w:p>
@@ -4913,66 +4302,23 @@
           <w:szCs w:val="20"/>
         </w:rPr>
         <w:tab/>
-        <w:t xml:space="preserve">M. Bencsik, Y. Le Conte, M. Reyes, M. Pioz, D. Whittaker, D. </w:t>
-      </w:r>
-      <w:proofErr w:type="spellStart"/>
-      <w:r>
-        <w:rPr>
+        <w:t xml:space="preserve">M. Bencsik, Y. Le Conte, M. Reyes, M. Pioz, D. Whittaker, D. Crauser, N. Simon Delso, and M. I. Newton, "Honeybee colony vibrational measurements to highlight the brood cycle," </w:t>
+      </w:r>
+      <w:r>
+        <w:rPr>
+          <w:i/>
+          <w:iCs/>
           <w:sz w:val="20"/>
           <w:szCs w:val="20"/>
         </w:rPr>
-        <w:t>Crauser</w:t>
-      </w:r>
-      <w:proofErr w:type="spellEnd"/>
+        <w:t>PLoS ONE</w:t>
+      </w:r>
       <w:r>
         <w:rPr>
           <w:sz w:val="20"/>
           <w:szCs w:val="20"/>
         </w:rPr>
-        <w:t xml:space="preserve">, N. Simon Delso, and M. I. Newton, "Honeybee colony vibrational measurements to highlight the brood cycle," </w:t>
-      </w:r>
-      <w:proofErr w:type="spellStart"/>
-      <w:r>
-        <w:rPr>
-          <w:i/>
-          <w:iCs/>
-          <w:sz w:val="20"/>
-          <w:szCs w:val="20"/>
-        </w:rPr>
-        <w:t>PLoS</w:t>
-      </w:r>
-      <w:proofErr w:type="spellEnd"/>
-      <w:r>
-        <w:rPr>
-          <w:i/>
-          <w:iCs/>
-          <w:sz w:val="20"/>
-          <w:szCs w:val="20"/>
-        </w:rPr>
-        <w:t xml:space="preserve"> ONE</w:t>
-      </w:r>
-      <w:r>
-        <w:rPr>
-          <w:sz w:val="20"/>
-          <w:szCs w:val="20"/>
-        </w:rPr>
-        <w:t xml:space="preserve">, vol. 10, no. 11, Art. no. e0141926, Nov. 2015, </w:t>
-      </w:r>
-      <w:proofErr w:type="spellStart"/>
-      <w:r>
-        <w:rPr>
-          <w:sz w:val="20"/>
-          <w:szCs w:val="20"/>
-        </w:rPr>
-        <w:t>doi</w:t>
-      </w:r>
-      <w:proofErr w:type="spellEnd"/>
-      <w:r>
-        <w:rPr>
-          <w:sz w:val="20"/>
-          <w:szCs w:val="20"/>
-        </w:rPr>
-        <w:t>: 10.1371/journal.pone.0141926.</w:t>
+        <w:t>, vol. 10, no. 11, Art. no. e0141926, Nov. 2015, doi: 10.1371/journal.pone.0141926.</w:t>
       </w:r>
     </w:p>
     <w:p>
@@ -5001,22 +4347,7 @@
           <w:szCs w:val="20"/>
         </w:rPr>
         <w:tab/>
-      </w:r>
-      <w:proofErr w:type="spellStart"/>
-      <w:r>
-        <w:rPr>
-          <w:sz w:val="20"/>
-          <w:szCs w:val="20"/>
-        </w:rPr>
-        <w:t>Espressif</w:t>
-      </w:r>
-      <w:proofErr w:type="spellEnd"/>
-      <w:r>
-        <w:rPr>
-          <w:sz w:val="20"/>
-          <w:szCs w:val="20"/>
-        </w:rPr>
-        <w:t xml:space="preserve"> Systems, "ESP-NOW," in </w:t>
+        <w:t xml:space="preserve">Espressif Systems, "ESP-NOW," in </w:t>
       </w:r>
       <w:r>
         <w:rPr>
@@ -5090,22 +4421,7 @@
           <w:szCs w:val="20"/>
         </w:rPr>
         <w:tab/>
-      </w:r>
-      <w:proofErr w:type="spellStart"/>
-      <w:r>
-        <w:rPr>
-          <w:sz w:val="20"/>
-          <w:szCs w:val="20"/>
-        </w:rPr>
-        <w:t>Espressif</w:t>
-      </w:r>
-      <w:proofErr w:type="spellEnd"/>
-      <w:r>
-        <w:rPr>
-          <w:sz w:val="20"/>
-          <w:szCs w:val="20"/>
-        </w:rPr>
-        <w:t xml:space="preserve"> Systems, "ESP32-C3 series datasheet." [Online]. Available: https://www.espressif.com/en/support/documents/technical-documents</w:t>
+        <w:t>Espressif Systems, "ESP32-C3 series datasheet." [Online]. Available: https://www.espressif.com/en/support/documents/technical-documents</w:t>
       </w:r>
     </w:p>
     <w:p>
@@ -5169,7 +4485,6 @@
         </w:rPr>
         <w:t xml:space="preserve">, שם הפרויקט: </w:t>
       </w:r>
-      <w:proofErr w:type="spellStart"/>
       <w:r>
         <w:rPr>
           <w:sz w:val="22"/>
@@ -5177,7 +4492,6 @@
         </w:rPr>
         <w:t>BeeSense</w:t>
       </w:r>
-      <w:proofErr w:type="spellEnd"/>
       <w:r>
         <w:rPr>
           <w:sz w:val="22"/>
@@ -5210,18 +4524,8 @@
           <w:szCs w:val="22"/>
           <w:rtl/>
         </w:rPr>
-        <w:t xml:space="preserve">שם המנחה: ד"ר דן </w:t>
-      </w:r>
-      <w:proofErr w:type="spellStart"/>
-      <w:r>
-        <w:rPr>
-          <w:sz w:val="22"/>
-          <w:szCs w:val="22"/>
-          <w:rtl/>
-        </w:rPr>
-        <w:t>וילנצ'יק</w:t>
-      </w:r>
-      <w:proofErr w:type="spellEnd"/>
+        <w:t>שם המנחה: ד"ר דן וילנצ'יק</w:t>
+      </w:r>
     </w:p>
     <w:p>
       <w:pPr>
@@ -6249,7 +5553,6 @@
         </w:rPr>
         <w:t xml:space="preserve">, שם הפרויקט: </w:t>
       </w:r>
-      <w:proofErr w:type="spellStart"/>
       <w:r>
         <w:rPr>
           <w:sz w:val="22"/>
@@ -6257,7 +5560,6 @@
         </w:rPr>
         <w:t>BeeSense</w:t>
       </w:r>
-      <w:proofErr w:type="spellEnd"/>
       <w:r>
         <w:rPr>
           <w:sz w:val="22"/>
@@ -6290,18 +5592,8 @@
           <w:szCs w:val="22"/>
           <w:rtl/>
         </w:rPr>
-        <w:t xml:space="preserve">שם המנחה: ד"ר דן </w:t>
-      </w:r>
-      <w:proofErr w:type="spellStart"/>
-      <w:r>
-        <w:rPr>
-          <w:sz w:val="22"/>
-          <w:szCs w:val="22"/>
-          <w:rtl/>
-        </w:rPr>
-        <w:t>וילנצ'יק</w:t>
-      </w:r>
-      <w:proofErr w:type="spellEnd"/>
+        <w:t>שם המנחה: ד"ר דן וילנצ'יק</w:t>
+      </w:r>
     </w:p>
     <w:p>
       <w:pPr>

</xml_diff>

<commit_message>
vault backup: 2026-10-25 16:49:35
Affected files:
.obsidian/plugins/word-reader/data.json
TODO.md
docs/pdr-2027-165.docx
docs/~$r-2027-165.docx
hardware/README.md
hardware/components/ESP32-S3.md
hardware/orders.md
</commit_message>
<xml_diff>
--- a/docs/pdr-2027-165.docx
+++ b/docs/pdr-2027-165.docx
@@ -745,116 +745,157 @@
       </w:pPr>
       <w:r>
         <w:rPr>
-          <w:sz w:val="22"/>
-          <w:szCs w:val="22"/>
-          <w:rtl/>
-        </w:rPr>
-        <w:t>מצב כוורות הדבורים נבדק כיום בעיקר בפתיחה ידנית של הכוורת אחת לכמה שבועות עד חודשים, ובין ביקור לביקור המגדל אינו יודע מה מתרחש בה. הכנה לבריחת נחיל נמשכת כשבוע עד שבועיים, והנחיל, שלוקח איתו חלק ניכר מהמושבה, עוזב תוך דקות ולעיתים קרובות מתגלה רק בביקור הבא. בי-סנס היא מערכת מבוססת האינטרנט של הדברים (</w:t>
-      </w:r>
-      <w:r>
-        <w:rPr>
-          <w:sz w:val="22"/>
-          <w:szCs w:val="22"/>
-        </w:rPr>
-        <w:t>IoT</w:t>
-      </w:r>
-      <w:r>
-        <w:rPr>
-          <w:sz w:val="22"/>
-          <w:szCs w:val="22"/>
-          <w:rtl/>
-        </w:rPr>
-        <w:t xml:space="preserve">) לניטור כוורות </w:t>
-      </w:r>
-      <w:r>
-        <w:rPr>
-          <w:rFonts w:hint="cs"/>
-          <w:sz w:val="22"/>
-          <w:szCs w:val="22"/>
-          <w:rtl/>
-        </w:rPr>
-        <w:t>במכוורת</w:t>
-      </w:r>
-      <w:r>
-        <w:rPr>
-          <w:sz w:val="22"/>
-          <w:szCs w:val="22"/>
-          <w:rtl/>
-        </w:rPr>
-        <w:t xml:space="preserve"> ללא חשמל וללא רשת. בכל כוורת מותקן צומת סוללתי עם חיישן רטט פיאזואלקטרי, המאזין בצריכה של ננו-אמפרים ומעיר את הצומת כשהרטט חורג מרמת הרקע; הצומת מחשב את ספקטרום הרטט והקול ומשלב אותו עם משקל הכוורת והטמפרטורה. מרכזייה סולארית בכוורן אוספת את הנתונים, מזהה סימנים לנחילה מתקרבת וחריגות במושבה, ושולחת התרעות דרך הרשת הסלולרית. החדשנות היא מערכת אוטונומית וזולה שמביאה לשטח יכולת שהוכחה במעבדה, בצריכת הספק נמוכה פי אלפים ממערכות המחקר. היעדים: דיוק שקילה של </w:t>
-      </w:r>
-      <w:r>
-        <w:rPr>
-          <w:sz w:val="22"/>
-          <w:szCs w:val="22"/>
-        </w:rPr>
-        <w:t>20</w:t>
-      </w:r>
-      <w:r>
-        <w:rPr>
-          <w:sz w:val="22"/>
-          <w:szCs w:val="22"/>
-          <w:rtl/>
+          <w:b w:val="0"/>
+          <w:bCs w:val="0"/>
+          <w:i w:val="0"/>
+          <w:iCs w:val="0"/>
+          <w:sz w:val="22"/>
+          <w:szCs w:val="22"/>
+          <w:rtl w:val="1"/>
+        </w:rPr>
+        <w:t xml:space="preserve">מצב כוורות הדבורים נבדק כיום בעיקר בפתיחה ידנית של הכוורת אחת לכמה שבועות עד חודשים, ובין ביקור לביקור המגדל אינו יודע מה מתרחש בה. הכנה לבריחת נחיל נמשכת כשבוע עד שבועיים, והנחיל, שלוקח איתו חלק ניכר מהמושבה, עוזב תוך דקות ולעיתים קרובות מתגלה רק בביקור הבא. בי-סנס היא מערכת מבוססת האינטרנט של הדברים (</w:t>
+      </w:r>
+      <w:r>
+        <w:rPr>
+          <w:b w:val="0"/>
+          <w:bCs w:val="0"/>
+          <w:i w:val="0"/>
+          <w:iCs w:val="0"/>
+          <w:sz w:val="22"/>
+          <w:szCs w:val="22"/>
+          <w:rtl w:val="0"/>
+        </w:rPr>
+        <w:t xml:space="preserve">IoT</w:t>
+      </w:r>
+      <w:r>
+        <w:rPr>
+          <w:b w:val="0"/>
+          <w:bCs w:val="0"/>
+          <w:i w:val="0"/>
+          <w:iCs w:val="0"/>
+          <w:sz w:val="22"/>
+          <w:szCs w:val="22"/>
+          <w:rtl w:val="1"/>
+        </w:rPr>
+        <w:t xml:space="preserve">) לניטור כוורות במכוורת ללא חשמל וללא רשת. בכל כוורת מותקן צומת סוללתי עם חיישן רטט פיאזואלקטרי, המאזין בצריכה של ננו-אמפרים ומעיר את הצומת כשהרטט חורג מרמת הרקע; הצומת מחשב את ספקטרום הרטט והקול ומשלב אותו עם משקל הכוורת והטמפרטורה. מרכזייה סולארית במכוורת אוספת את הנתונים, מזהה סימנים לנחילה מתקרבת וחריגות במושבה, ושולחת התרעות דרך הרשת הסלולרית. החדשנות היא מערכת אוטונומית וזולה שמביאה לשטח יכולת שהוכחה במעבדה, בצריכת הספק נמוכה פי אלפים ממערכות המחקר. היעדים: דיוק שקילה של </w:t>
+      </w:r>
+      <w:r>
+        <w:rPr>
+          <w:b w:val="0"/>
+          <w:bCs w:val="0"/>
+          <w:i w:val="0"/>
+          <w:iCs w:val="0"/>
+          <w:sz w:val="22"/>
+          <w:szCs w:val="22"/>
+          <w:rtl w:val="0"/>
+        </w:rPr>
+        <w:t xml:space="preserve">20</w:t>
+      </w:r>
+      <w:r>
+        <w:rPr>
+          <w:b w:val="0"/>
+          <w:bCs w:val="0"/>
+          <w:i w:val="0"/>
+          <w:iCs w:val="0"/>
+          <w:sz w:val="22"/>
+          <w:szCs w:val="22"/>
+          <w:rtl w:val="1"/>
         </w:rPr>
         <w:t xml:space="preserve">± גרם, קליטת חבילות מעל </w:t>
       </w:r>
       <w:r>
         <w:rPr>
-          <w:sz w:val="22"/>
-          <w:szCs w:val="22"/>
-        </w:rPr>
-        <w:t>95%</w:t>
-      </w:r>
-      <w:r>
-        <w:rPr>
-          <w:sz w:val="22"/>
-          <w:szCs w:val="22"/>
-          <w:rtl/>
-        </w:rPr>
-        <w:t>, לפחות חצי שנה על סוללה, וכיעד המחייב, דיוק (</w:t>
-      </w:r>
-      <w:r>
-        <w:rPr>
-          <w:sz w:val="22"/>
-          <w:szCs w:val="22"/>
-        </w:rPr>
-        <w:t>Precision</w:t>
-      </w:r>
-      <w:r>
-        <w:rPr>
-          <w:sz w:val="22"/>
-          <w:szCs w:val="22"/>
-          <w:rtl/>
-        </w:rPr>
-        <w:t>) ורגישות (</w:t>
-      </w:r>
-      <w:r>
-        <w:rPr>
-          <w:sz w:val="22"/>
-          <w:szCs w:val="22"/>
-        </w:rPr>
-        <w:t>Recall</w:t>
-      </w:r>
-      <w:r>
-        <w:rPr>
-          <w:sz w:val="22"/>
-          <w:szCs w:val="22"/>
-          <w:rtl/>
+          <w:b w:val="0"/>
+          <w:bCs w:val="0"/>
+          <w:i w:val="0"/>
+          <w:iCs w:val="0"/>
+          <w:sz w:val="22"/>
+          <w:szCs w:val="22"/>
+          <w:rtl w:val="0"/>
+        </w:rPr>
+        <w:t xml:space="preserve">95%</w:t>
+      </w:r>
+      <w:r>
+        <w:rPr>
+          <w:b w:val="0"/>
+          <w:bCs w:val="0"/>
+          <w:i w:val="0"/>
+          <w:iCs w:val="0"/>
+          <w:sz w:val="22"/>
+          <w:szCs w:val="22"/>
+          <w:rtl w:val="1"/>
+        </w:rPr>
+        <w:t xml:space="preserve">, לפחות חצי שנה על סוללה, וכיעד המחייב, דיוק (</w:t>
+      </w:r>
+      <w:r>
+        <w:rPr>
+          <w:b w:val="0"/>
+          <w:bCs w:val="0"/>
+          <w:i w:val="0"/>
+          <w:iCs w:val="0"/>
+          <w:sz w:val="22"/>
+          <w:szCs w:val="22"/>
+          <w:rtl w:val="0"/>
+        </w:rPr>
+        <w:t xml:space="preserve">Precision</w:t>
+      </w:r>
+      <w:r>
+        <w:rPr>
+          <w:b w:val="0"/>
+          <w:bCs w:val="0"/>
+          <w:i w:val="0"/>
+          <w:iCs w:val="0"/>
+          <w:sz w:val="22"/>
+          <w:szCs w:val="22"/>
+          <w:rtl w:val="1"/>
+        </w:rPr>
+        <w:t xml:space="preserve">) ורגישות (</w:t>
+      </w:r>
+      <w:r>
+        <w:rPr>
+          <w:b w:val="0"/>
+          <w:bCs w:val="0"/>
+          <w:i w:val="0"/>
+          <w:iCs w:val="0"/>
+          <w:sz w:val="22"/>
+          <w:szCs w:val="22"/>
+          <w:rtl w:val="0"/>
+        </w:rPr>
+        <w:t xml:space="preserve">Recall</w:t>
+      </w:r>
+      <w:r>
+        <w:rPr>
+          <w:b w:val="0"/>
+          <w:bCs w:val="0"/>
+          <w:i w:val="0"/>
+          <w:iCs w:val="0"/>
+          <w:sz w:val="22"/>
+          <w:szCs w:val="22"/>
+          <w:rtl w:val="1"/>
         </w:rPr>
         <w:t xml:space="preserve">) מעל </w:t>
       </w:r>
       <w:r>
         <w:rPr>
-          <w:sz w:val="22"/>
-          <w:szCs w:val="22"/>
-        </w:rPr>
-        <w:t>90%</w:t>
-      </w:r>
-      <w:r>
-        <w:rPr>
-          <w:sz w:val="22"/>
-          <w:szCs w:val="22"/>
-          <w:rtl/>
+          <w:b w:val="0"/>
+          <w:bCs w:val="0"/>
+          <w:i w:val="0"/>
+          <w:iCs w:val="0"/>
+          <w:sz w:val="22"/>
+          <w:szCs w:val="22"/>
+          <w:rtl w:val="0"/>
+        </w:rPr>
+        <w:t xml:space="preserve">90%</w:t>
+      </w:r>
+      <w:r>
+        <w:rPr>
+          <w:b w:val="0"/>
+          <w:bCs w:val="0"/>
+          <w:i w:val="0"/>
+          <w:iCs w:val="0"/>
+          <w:sz w:val="22"/>
+          <w:szCs w:val="22"/>
+          <w:rtl w:val="1"/>
         </w:rPr>
         <w:t xml:space="preserve"> בהתרעה על נחילה לפני יציאת הנחיל.</w:t>
       </w:r>
@@ -1149,19 +1190,127 @@
       </w:pPr>
       <w:r>
         <w:rPr>
+          <w:b w:val="1"/>
+          <w:bCs w:val="1"/>
+          <w:i w:val="0"/>
+          <w:iCs w:val="0"/>
+          <w:sz w:val="22"/>
+          <w:szCs w:val="22"/>
+          <w:rtl w:val="0"/>
+        </w:rPr>
+        <w:t xml:space="preserve">Objectives:</w:t>
+      </w:r>
+      <w:r>
+        <w:rPr>
+          <w:b w:val="0"/>
+          <w:bCs w:val="0"/>
+          <w:i w:val="0"/>
+          <w:iCs w:val="0"/>
+          <w:sz w:val="22"/>
+          <w:szCs w:val="22"/>
+          <w:rtl w:val="0"/>
+        </w:rPr>
+        <w:t xml:space="preserve"> (1) a battery-powered hive node that wakes on events, measures vibration, sound, weight and temperature, and lasts at least six months per charge (targets in Section 3.3);</w:t>
+      </w:r>
+    </w:p>
+    <w:p>
+      <w:pPr>
+        <w:spacing w:after="20" w:line="360" w:lineRule="auto"/>
+        <w:jc w:val="both"/>
+        <w:rPr>
+          <w:sz w:val="22"/>
+          <w:szCs w:val="22"/>
+        </w:rPr>
+      </w:pPr>
+      <w:r>
+        <w:rPr>
+          <w:b w:val="0"/>
+          <w:bCs w:val="0"/>
+          <w:i w:val="0"/>
+          <w:iCs w:val="0"/>
+          <w:sz w:val="22"/>
+          <w:szCs w:val="22"/>
+          <w:rtl w:val="0"/>
+        </w:rPr>
+        <w:t xml:space="preserve">(2) a reliable link from the hives to a solar-powered hub that uploads the data over the cellular network to a web dashboard;</w:t>
+      </w:r>
+    </w:p>
+    <w:p>
+      <w:pPr>
+        <w:spacing w:after="20" w:line="360" w:lineRule="auto"/>
+        <w:jc w:val="both"/>
+        <w:rPr>
+          <w:sz w:val="22"/>
+          <w:szCs w:val="22"/>
+        </w:rPr>
+      </w:pPr>
+      <w:r>
+        <w:rPr>
+          <w:b w:val="0"/>
+          <w:bCs w:val="0"/>
+          <w:i w:val="0"/>
+          <w:iCs w:val="0"/>
+          <w:sz w:val="22"/>
+          <w:szCs w:val="22"/>
+          <w:rtl w:val="0"/>
+        </w:rPr>
+        <w:t xml:space="preserve">(3) alerts on approaching swarms before the swarm leaves; how early this is possible is the research question.</w:t>
+      </w:r>
+    </w:p>
+    <w:p>
+      <w:pPr>
+        <w:spacing w:after="20" w:line="360" w:lineRule="auto"/>
+        <w:jc w:val="both"/>
+        <w:rPr>
+          <w:sz w:val="22"/>
+          <w:szCs w:val="22"/>
+        </w:rPr>
+      </w:pPr>
+      <w:r>
+        <w:rPr>
+          <w:b w:val="1"/>
+          <w:bCs w:val="1"/>
+          <w:i w:val="0"/>
+          <w:iCs w:val="0"/>
+          <w:sz w:val="22"/>
+          <w:szCs w:val="22"/>
+          <w:rtl w:val="0"/>
+        </w:rPr>
+        <w:t xml:space="preserve">Stages:</w:t>
+      </w:r>
+      <w:r>
+        <w:rPr>
+          <w:b w:val="0"/>
+          <w:bCs w:val="0"/>
+          <w:i w:val="0"/>
+          <w:iCs w:val="0"/>
+          <w:sz w:val="22"/>
+          <w:szCs w:val="22"/>
+          <w:rtl w:val="0"/>
+        </w:rPr>
+        <w:t xml:space="preserve"> (1) requirements with the beekeeper and bench tests of each sensor chain and of the node's energy use; (2) build the node and test the link at the apiary; (3) build the hub, detection and dashboard, and install on hives before spring; (4) field evaluation.</w:t>
+      </w:r>
+    </w:p>
+    <w:p>
+      <w:pPr>
+        <w:keepNext/>
+        <w:spacing w:before="40" w:after="0" w:line="360" w:lineRule="auto"/>
+        <w:rPr>
+          <w:sz w:val="22"/>
+          <w:szCs w:val="22"/>
+        </w:rPr>
+      </w:pPr>
+      <w:r>
+        <w:rPr>
           <w:b/>
           <w:bCs/>
-          <w:sz w:val="22"/>
-          <w:szCs w:val="22"/>
-        </w:rPr>
-        <w:t>Objectives:</w:t>
-      </w:r>
-      <w:r>
-        <w:rPr>
-          <w:sz w:val="22"/>
-          <w:szCs w:val="22"/>
-        </w:rPr>
-        <w:t xml:space="preserve"> (1) a battery-powered hive node with event-driven wake-up that measures vibration and sound spectra, weight and temperature, and runs at least six months per charge (targets in Section 3.3);</w:t>
+          <w:i w:val="0"/>
+          <w:iCs w:val="0"/>
+          <w:sz w:val="22"/>
+          <w:szCs w:val="22"/>
+          <w:rtl w:val="0"/>
+        </w:rPr>
+        <w:t xml:space="preserve">1.3 Technology and Interfaces</w:t>
       </w:r>
     </w:p>
     <w:p>
@@ -1175,149 +1324,86 @@
       </w:pPr>
       <w:r>
         <w:rPr>
-          <w:sz w:val="22"/>
-          <w:szCs w:val="22"/>
-        </w:rPr>
-        <w:t>(2) a reliable short-range link from the hives to a solar-powered hub with a cellular uplink, a cloud database and a web dashboard;</w:t>
-      </w:r>
-    </w:p>
-    <w:p>
-      <w:pPr>
-        <w:spacing w:after="20" w:line="360" w:lineRule="auto"/>
-        <w:jc w:val="both"/>
-        <w:rPr>
-          <w:sz w:val="22"/>
-          <w:szCs w:val="22"/>
-        </w:rPr>
-      </w:pPr>
-      <w:r>
-        <w:rPr>
-          <w:sz w:val="22"/>
-          <w:szCs w:val="22"/>
-        </w:rPr>
-        <w:t>(3) alerts on approaching swarms before the swarm leaves, with the achievable lead time as the research question, and detection of colony anomalies.</w:t>
-      </w:r>
-    </w:p>
-    <w:p>
-      <w:pPr>
-        <w:spacing w:after="20" w:line="360" w:lineRule="auto"/>
-        <w:jc w:val="both"/>
-        <w:rPr>
-          <w:sz w:val="22"/>
-          <w:szCs w:val="22"/>
-        </w:rPr>
-      </w:pPr>
-      <w:r>
-        <w:rPr>
-          <w:b/>
-          <w:bCs/>
-          <w:sz w:val="22"/>
-          <w:szCs w:val="22"/>
-        </w:rPr>
-        <w:t>Stages:</w:t>
-      </w:r>
-      <w:r>
-        <w:rPr>
-          <w:sz w:val="22"/>
-          <w:szCs w:val="22"/>
-        </w:rPr>
-        <w:t xml:space="preserve"> (1) requirements with the beekeeper and bench tests: piezo and wake chains, weighing, FFT</w:t>
-      </w:r>
-      <w:r>
-        <w:rPr>
-          <w:sz w:val="22"/>
-          <w:szCs w:val="22"/>
-        </w:rPr>
-        <w:t>(why)</w:t>
-      </w:r>
-      <w:r>
-        <w:rPr>
-          <w:sz w:val="22"/>
-          <w:szCs w:val="22"/>
-        </w:rPr>
-        <w:t xml:space="preserve"> time on the C3, and one night-time hive recording; (2) node: wake circuit, acquisition, on-board spectra, power modes, piezo vs. microphone, ESP-NOW range on site; (3) hub, database, detection and dashboard, installed before the spring swarming season; (4) field evaluation.</w:t>
-      </w:r>
-    </w:p>
-    <w:p>
-      <w:pPr>
-        <w:keepNext/>
-        <w:spacing w:before="40" w:after="0" w:line="360" w:lineRule="auto"/>
-        <w:rPr>
-          <w:sz w:val="22"/>
-          <w:szCs w:val="22"/>
-        </w:rPr>
-      </w:pPr>
-      <w:r>
-        <w:rPr>
-          <w:b/>
-          <w:bCs/>
-          <w:sz w:val="22"/>
-          <w:szCs w:val="22"/>
-        </w:rPr>
-        <w:t>1.3 Technology, Interfaces and Contribution</w:t>
-      </w:r>
-    </w:p>
-    <w:p>
-      <w:pPr>
-        <w:spacing w:after="20" w:line="360" w:lineRule="auto"/>
-        <w:jc w:val="both"/>
-        <w:rPr>
-          <w:sz w:val="22"/>
-          <w:szCs w:val="22"/>
-        </w:rPr>
-      </w:pPr>
-      <w:r>
-        <w:rPr>
-          <w:sz w:val="22"/>
-          <w:szCs w:val="22"/>
-        </w:rPr>
-        <w:t>Each hive node uses an ESP32-C3 SuperMini (RISC-V, 160 MHz, Wi-Fi radio, no floating-point unit</w:t>
-      </w:r>
-      <w:r>
-        <w:rPr>
-          <w:sz w:val="22"/>
-          <w:szCs w:val="22"/>
-        </w:rPr>
-        <w:t xml:space="preserve">- </w:t>
-      </w:r>
-      <w:r>
-        <w:rPr>
-          <w:sz w:val="22"/>
-          <w:szCs w:val="22"/>
-          <w:highlight w:val="yellow"/>
-        </w:rPr>
-        <w:t>is that ok?</w:t>
-      </w:r>
-      <w:r>
-        <w:rPr>
-          <w:sz w:val="22"/>
-          <w:szCs w:val="22"/>
-          <w:highlight w:val="yellow"/>
-        </w:rPr>
-        <w:t>).</w:t>
-      </w:r>
-      <w:r>
-        <w:rPr>
-          <w:sz w:val="22"/>
-          <w:szCs w:val="22"/>
-        </w:rPr>
-        <w:t xml:space="preserve"> A 27 mm piezo disc is pressed into the comb at the centre of the central frame and covered with wax, where comb vibration is strongest (Section 3.2). It has two roles. First, a nanopower wake circuit (envelope detector and comparator, about 2 µA) compares the vibration envelope with its own slow average and wakes the MCU through a GPIO when the envelope jumps. Second, an op-amp preamplifier, powered only while recording, biases and protects the signal for the ADC and acts as the anti-aliasing low-pass (≈800 Hz). An I²S MEMS microphone, inside the hive behind a mesh, is the second analysis channel. Weight: four 50 kg half-bridge load cells under a hive platform and an HX711 24-bit ADC; temperature: DS18B20 probes. Power: one 18650 cell and a low-quiescent LDO. Nodes report over ESP-NOW, a connectionless protocol on the Wi-Fi radio, to an ESP32-S3 hub serving a </w:t>
-      </w:r>
-      <w:r>
-        <w:rPr>
-          <w:sz w:val="22"/>
-          <w:szCs w:val="22"/>
-        </w:rPr>
-        <w:lastRenderedPageBreak/>
-        <w:t>group of nearby hives; the hub uploads over a cellular modem and runs from an 18 V / 15 W solar panel, an MPPT charger and a Li-ion pack. As the hives stand close together, one SIM per hub replaces a LoRa radio or a SIM in every hive.</w:t>
-      </w:r>
-      <w:r>
-        <w:rPr>
-          <w:sz w:val="22"/>
-          <w:szCs w:val="22"/>
-        </w:rPr>
-        <w:br/>
-      </w:r>
+          <w:b w:val="0"/>
+          <w:bCs w:val="0"/>
+          <w:i w:val="1"/>
+          <w:iCs w:val="1"/>
+          <w:sz w:val="22"/>
+          <w:szCs w:val="22"/>
+          <w:rtl w:val="0"/>
+        </w:rPr>
+        <w:t xml:space="preserve">Hive node:</w:t>
+      </w:r>
+      <w:r>
+        <w:rPr>
+          <w:b w:val="0"/>
+          <w:bCs w:val="0"/>
+          <w:i w:val="0"/>
+          <w:iCs w:val="0"/>
+          <w:sz w:val="22"/>
+          <w:szCs w:val="22"/>
+          <w:rtl w:val="0"/>
+        </w:rPr>
+        <w:t xml:space="preserve"> an ESP32-C3 microcontroller board powered by one 18650 Li-ion cell, with four sensors: (a) a 27 mm piezoelectric disc pressed into the comb at the centre of the hive, where comb vibration is strongest (Section 3.2); (b) a small digital MEMS microphone inside the hive, behind a mesh; (c) four 50 kg load cells under the hive with an HX711 weighing ADC; and (d) DS18B20 temperature probes. The piezo disc also feeds a low-power wake circuit (≈2 µA) that wakes the node when vibration jumps above its usual level; an amplifier prepares the signal for the ADC only while recording. The C3 has no floating-point unit, so the spectra are computed with a fixed-point FFT, the usual practice on small microcontrollers. </w:t>
+      </w:r>
+      <w:r>
+        <w:rPr>
+          <w:b w:val="0"/>
+          <w:bCs w:val="0"/>
+          <w:i w:val="1"/>
+          <w:iCs w:val="1"/>
+          <w:sz w:val="22"/>
+          <w:szCs w:val="22"/>
+          <w:rtl w:val="0"/>
+        </w:rPr>
+        <w:t xml:space="preserve">Hub:</w:t>
+      </w:r>
+      <w:r>
+        <w:rPr>
+          <w:b w:val="0"/>
+          <w:bCs w:val="0"/>
+          <w:i w:val="0"/>
+          <w:iCs w:val="0"/>
+          <w:sz w:val="22"/>
+          <w:szCs w:val="22"/>
+          <w:rtl w:val="0"/>
+        </w:rPr>
+        <w:t xml:space="preserve"> an ESP32-S3 board at the apiary receives the nodes over ESP-NOW, a direct Wi-Fi radio link that needs no router, uploads over a cellular modem, and runs from an 18 V / 15 W solar panel with a charger and battery. Because the hives stand close together, one hub and one SIM serve a group of hives. </w:t>
+      </w:r>
+      <w:r>
+        <w:rPr>
+          <w:b w:val="0"/>
+          <w:bCs w:val="0"/>
+          <w:i w:val="1"/>
+          <w:iCs w:val="1"/>
+          <w:sz w:val="22"/>
+          <w:szCs w:val="22"/>
+          <w:rtl w:val="0"/>
+        </w:rPr>
+        <w:t xml:space="preserve">Interfaces:</w:t>
+      </w:r>
+      <w:r>
+        <w:rPr>
+          <w:b w:val="0"/>
+          <w:bCs w:val="0"/>
+          <w:i w:val="0"/>
+          <w:iCs w:val="0"/>
+          <w:sz w:val="22"/>
+          <w:szCs w:val="22"/>
+          <w:rtl w:val="0"/>
+        </w:rPr>
+        <w:t xml:space="preserve"> ADC (piezo), I²S (microphone), two-wire serial (HX711), 1-Wire (temperature), GPIO (wake-up), ESP-NOW (node to hub), LTE (hub to cloud).</w:t>
+      </w:r>
+    </w:p>
+    <w:p>
+      <w:pPr>
+        <w:spacing w:after="60" w:line="240" w:lineRule="auto"/>
+        <w:jc w:val="center"/>
+        <w:rPr>
+          <w:sz w:val="22"/>
+          <w:szCs w:val="22"/>
+        </w:rPr>
+      </w:pPr>
       <w:r>
         <w:rPr>
           <w:noProof/>

</xml_diff>

<commit_message>
vault backup: 2026-10-25 16:50:39
Affected files:
.obsidian/plugins/word-reader/data.json
docs/pdr-2027-165.docx
</commit_message>
<xml_diff>
--- a/docs/pdr-2027-165.docx
+++ b/docs/pdr-2027-165.docx
@@ -273,12 +273,21 @@
           <w:bCs/>
         </w:rPr>
       </w:pPr>
+      <w:proofErr w:type="spellStart"/>
       <w:r>
         <w:rPr>
           <w:b/>
           <w:bCs/>
         </w:rPr>
-        <w:t>BeeSense — IoT-Based Acoustic and Weight Monitoring of Honeybee Colonies</w:t>
+        <w:t>BeeSense</w:t>
+      </w:r>
+      <w:proofErr w:type="spellEnd"/>
+      <w:r>
+        <w:rPr>
+          <w:b/>
+          <w:bCs/>
+        </w:rPr>
+        <w:t xml:space="preserve"> — IoT-Based Acoustic and Weight Monitoring of Honeybee Colonies</w:t>
       </w:r>
     </w:p>
     <w:p>
@@ -673,24 +682,16 @@
         <w:spacing w:after="0" w:line="240" w:lineRule="auto"/>
         <w:jc w:val="center"/>
         <w:rPr>
-          <w:rFonts w:hint="cs"/>
-          <w:sz w:val="22"/>
-          <w:szCs w:val="22"/>
-        </w:rPr>
-      </w:pPr>
-      <w:r>
-        <w:rPr>
-          <w:sz w:val="22"/>
-          <w:szCs w:val="22"/>
-        </w:rPr>
-        <w:t>dancoop</w:t>
-      </w:r>
-      <w:r>
-        <w:rPr>
-          <w:sz w:val="22"/>
-          <w:szCs w:val="22"/>
-        </w:rPr>
-        <w:t>@post.bgu.ac.il</w:t>
+          <w:sz w:val="22"/>
+          <w:szCs w:val="22"/>
+        </w:rPr>
+      </w:pPr>
+      <w:r>
+        <w:rPr>
+          <w:sz w:val="22"/>
+          <w:szCs w:val="22"/>
+        </w:rPr>
+        <w:t>dancoop@post.bgu.ac.il</w:t>
       </w:r>
     </w:p>
     <w:p>
@@ -709,8 +710,18 @@
           <w:szCs w:val="22"/>
           <w:rtl/>
         </w:rPr>
-        <w:t>שם המנחה: ד"ר דן וילנצ'יק</w:t>
-      </w:r>
+        <w:t xml:space="preserve">שם המנחה: ד"ר דן </w:t>
+      </w:r>
+      <w:proofErr w:type="spellStart"/>
+      <w:r>
+        <w:rPr>
+          <w:sz w:val="22"/>
+          <w:szCs w:val="22"/>
+          <w:rtl/>
+        </w:rPr>
+        <w:t>וילנצ'יק</w:t>
+      </w:r>
+      <w:proofErr w:type="spellEnd"/>
     </w:p>
     <w:p>
       <w:pPr>
@@ -745,157 +756,171 @@
       </w:pPr>
       <w:r>
         <w:rPr>
-          <w:b w:val="0"/>
-          <w:bCs w:val="0"/>
-          <w:i w:val="0"/>
-          <w:iCs w:val="0"/>
-          <w:sz w:val="22"/>
-          <w:szCs w:val="22"/>
-          <w:rtl w:val="1"/>
-        </w:rPr>
-        <w:t xml:space="preserve">מצב כוורות הדבורים נבדק כיום בעיקר בפתיחה ידנית של הכוורת אחת לכמה שבועות עד חודשים, ובין ביקור לביקור המגדל אינו יודע מה מתרחש בה. הכנה לבריחת נחיל נמשכת כשבוע עד שבועיים, והנחיל, שלוקח איתו חלק ניכר מהמושבה, עוזב תוך דקות ולעיתים קרובות מתגלה רק בביקור הבא. בי-סנס היא מערכת מבוססת האינטרנט של הדברים (</w:t>
-      </w:r>
-      <w:r>
-        <w:rPr>
-          <w:b w:val="0"/>
-          <w:bCs w:val="0"/>
-          <w:i w:val="0"/>
-          <w:iCs w:val="0"/>
-          <w:sz w:val="22"/>
-          <w:szCs w:val="22"/>
-          <w:rtl w:val="0"/>
-        </w:rPr>
-        <w:t xml:space="preserve">IoT</w:t>
-      </w:r>
-      <w:r>
-        <w:rPr>
-          <w:b w:val="0"/>
-          <w:bCs w:val="0"/>
-          <w:i w:val="0"/>
-          <w:iCs w:val="0"/>
-          <w:sz w:val="22"/>
-          <w:szCs w:val="22"/>
-          <w:rtl w:val="1"/>
-        </w:rPr>
-        <w:t xml:space="preserve">) לניטור כוורות במכוורת ללא חשמל וללא רשת. בכל כוורת מותקן צומת סוללתי עם חיישן רטט פיאזואלקטרי, המאזין בצריכה של ננו-אמפרים ומעיר את הצומת כשהרטט חורג מרמת הרקע; הצומת מחשב את ספקטרום הרטט והקול ומשלב אותו עם משקל הכוורת והטמפרטורה. מרכזייה סולארית במכוורת אוספת את הנתונים, מזהה סימנים לנחילה מתקרבת וחריגות במושבה, ושולחת התרעות דרך הרשת הסלולרית. החדשנות היא מערכת אוטונומית וזולה שמביאה לשטח יכולת שהוכחה במעבדה, בצריכת הספק נמוכה פי אלפים ממערכות המחקר. היעדים: דיוק שקילה של </w:t>
-      </w:r>
-      <w:r>
-        <w:rPr>
-          <w:b w:val="0"/>
-          <w:bCs w:val="0"/>
-          <w:i w:val="0"/>
-          <w:iCs w:val="0"/>
-          <w:sz w:val="22"/>
-          <w:szCs w:val="22"/>
-          <w:rtl w:val="0"/>
-        </w:rPr>
-        <w:t xml:space="preserve">20</w:t>
-      </w:r>
-      <w:r>
-        <w:rPr>
-          <w:b w:val="0"/>
-          <w:bCs w:val="0"/>
-          <w:i w:val="0"/>
-          <w:iCs w:val="0"/>
-          <w:sz w:val="22"/>
-          <w:szCs w:val="22"/>
-          <w:rtl w:val="1"/>
+          <w:sz w:val="22"/>
+          <w:szCs w:val="22"/>
+          <w:rtl/>
+        </w:rPr>
+        <w:t xml:space="preserve">מצב כוורות הדבורים נבדק כיום בעיקר בפתיחה ידנית של הכוורת אחת לכמה שבועות עד חודשים, ובין ביקור לביקור המגדל אינו יודע מה מתרחש בה. הכנה לבריחת נחיל נמשכת כשבוע עד שבועיים, והנחיל, שלוקח </w:t>
+      </w:r>
+      <w:proofErr w:type="spellStart"/>
+      <w:r>
+        <w:rPr>
+          <w:sz w:val="22"/>
+          <w:szCs w:val="22"/>
+          <w:rtl/>
+        </w:rPr>
+        <w:t>איתו</w:t>
+      </w:r>
+      <w:proofErr w:type="spellEnd"/>
+      <w:r>
+        <w:rPr>
+          <w:sz w:val="22"/>
+          <w:szCs w:val="22"/>
+          <w:rtl/>
+        </w:rPr>
+        <w:t xml:space="preserve"> חלק ניכר מהמושבה, עוזב תוך דקות ולעיתים קרובות מתגלה רק בביקור הבא. בי-סנס היא מערכת מבוססת האינטרנט של הדברים (</w:t>
+      </w:r>
+      <w:r>
+        <w:rPr>
+          <w:sz w:val="22"/>
+          <w:szCs w:val="22"/>
+        </w:rPr>
+        <w:t>IoT</w:t>
+      </w:r>
+      <w:r>
+        <w:rPr>
+          <w:sz w:val="22"/>
+          <w:szCs w:val="22"/>
+          <w:rtl/>
+        </w:rPr>
+        <w:t xml:space="preserve">) לניטור כוורות במכוורת ללא חשמל וללא רשת. בכל כוורת מותקן צומת </w:t>
+      </w:r>
+      <w:proofErr w:type="spellStart"/>
+      <w:r>
+        <w:rPr>
+          <w:sz w:val="22"/>
+          <w:szCs w:val="22"/>
+          <w:rtl/>
+        </w:rPr>
+        <w:t>סוללתי</w:t>
+      </w:r>
+      <w:proofErr w:type="spellEnd"/>
+      <w:r>
+        <w:rPr>
+          <w:sz w:val="22"/>
+          <w:szCs w:val="22"/>
+          <w:rtl/>
+        </w:rPr>
+        <w:t xml:space="preserve"> עם חיישן רטט </w:t>
+      </w:r>
+      <w:proofErr w:type="spellStart"/>
+      <w:r>
+        <w:rPr>
+          <w:sz w:val="22"/>
+          <w:szCs w:val="22"/>
+          <w:rtl/>
+        </w:rPr>
+        <w:t>פיאזואלקטרי</w:t>
+      </w:r>
+      <w:proofErr w:type="spellEnd"/>
+      <w:r>
+        <w:rPr>
+          <w:sz w:val="22"/>
+          <w:szCs w:val="22"/>
+          <w:rtl/>
+        </w:rPr>
+        <w:t xml:space="preserve">, המאזין בצריכה של ננו-אמפרים ומעיר את הצומת כשהרטט חורג מרמת הרקע; הצומת מחשב את ספקטרום הרטט והקול ומשלב אותו עם משקל הכוורת והטמפרטורה. מרכזייה סולארית במכוורת אוספת את הנתונים, מזהה סימנים </w:t>
+      </w:r>
+      <w:proofErr w:type="spellStart"/>
+      <w:r>
+        <w:rPr>
+          <w:sz w:val="22"/>
+          <w:szCs w:val="22"/>
+          <w:rtl/>
+        </w:rPr>
+        <w:t>לנחילה</w:t>
+      </w:r>
+      <w:proofErr w:type="spellEnd"/>
+      <w:r>
+        <w:rPr>
+          <w:sz w:val="22"/>
+          <w:szCs w:val="22"/>
+          <w:rtl/>
+        </w:rPr>
+        <w:t xml:space="preserve"> מתקרבת וחריגות במושבה, ושולחת התרעות דרך הרשת הסלולרית. החדשנות היא מערכת אוטונומית וזולה שמביאה לשטח יכולת שהוכחה במעבדה, בצריכת הספק נמוכה פי אלפים ממערכות המחקר. היעדים: דיוק שקילה של </w:t>
+      </w:r>
+      <w:r>
+        <w:rPr>
+          <w:sz w:val="22"/>
+          <w:szCs w:val="22"/>
+        </w:rPr>
+        <w:t>20</w:t>
+      </w:r>
+      <w:r>
+        <w:rPr>
+          <w:sz w:val="22"/>
+          <w:szCs w:val="22"/>
+          <w:rtl/>
         </w:rPr>
         <w:t xml:space="preserve">± גרם, קליטת חבילות מעל </w:t>
       </w:r>
       <w:r>
         <w:rPr>
-          <w:b w:val="0"/>
-          <w:bCs w:val="0"/>
-          <w:i w:val="0"/>
-          <w:iCs w:val="0"/>
-          <w:sz w:val="22"/>
-          <w:szCs w:val="22"/>
-          <w:rtl w:val="0"/>
-        </w:rPr>
-        <w:t xml:space="preserve">95%</w:t>
-      </w:r>
-      <w:r>
-        <w:rPr>
-          <w:b w:val="0"/>
-          <w:bCs w:val="0"/>
-          <w:i w:val="0"/>
-          <w:iCs w:val="0"/>
-          <w:sz w:val="22"/>
-          <w:szCs w:val="22"/>
-          <w:rtl w:val="1"/>
-        </w:rPr>
-        <w:t xml:space="preserve">, לפחות חצי שנה על סוללה, וכיעד המחייב, דיוק (</w:t>
-      </w:r>
-      <w:r>
-        <w:rPr>
-          <w:b w:val="0"/>
-          <w:bCs w:val="0"/>
-          <w:i w:val="0"/>
-          <w:iCs w:val="0"/>
-          <w:sz w:val="22"/>
-          <w:szCs w:val="22"/>
-          <w:rtl w:val="0"/>
-        </w:rPr>
-        <w:t xml:space="preserve">Precision</w:t>
-      </w:r>
-      <w:r>
-        <w:rPr>
-          <w:b w:val="0"/>
-          <w:bCs w:val="0"/>
-          <w:i w:val="0"/>
-          <w:iCs w:val="0"/>
-          <w:sz w:val="22"/>
-          <w:szCs w:val="22"/>
-          <w:rtl w:val="1"/>
-        </w:rPr>
-        <w:t xml:space="preserve">) ורגישות (</w:t>
-      </w:r>
-      <w:r>
-        <w:rPr>
-          <w:b w:val="0"/>
-          <w:bCs w:val="0"/>
-          <w:i w:val="0"/>
-          <w:iCs w:val="0"/>
-          <w:sz w:val="22"/>
-          <w:szCs w:val="22"/>
-          <w:rtl w:val="0"/>
-        </w:rPr>
-        <w:t xml:space="preserve">Recall</w:t>
-      </w:r>
-      <w:r>
-        <w:rPr>
-          <w:b w:val="0"/>
-          <w:bCs w:val="0"/>
-          <w:i w:val="0"/>
-          <w:iCs w:val="0"/>
-          <w:sz w:val="22"/>
-          <w:szCs w:val="22"/>
-          <w:rtl w:val="1"/>
+          <w:sz w:val="22"/>
+          <w:szCs w:val="22"/>
+        </w:rPr>
+        <w:t>95%</w:t>
+      </w:r>
+      <w:r>
+        <w:rPr>
+          <w:sz w:val="22"/>
+          <w:szCs w:val="22"/>
+          <w:rtl/>
+        </w:rPr>
+        <w:t>, לפחות חצי שנה על סוללה, וכיעד המחייב, דיוק (</w:t>
+      </w:r>
+      <w:r>
+        <w:rPr>
+          <w:sz w:val="22"/>
+          <w:szCs w:val="22"/>
+        </w:rPr>
+        <w:t>Precision</w:t>
+      </w:r>
+      <w:r>
+        <w:rPr>
+          <w:sz w:val="22"/>
+          <w:szCs w:val="22"/>
+          <w:rtl/>
+        </w:rPr>
+        <w:t>) ורגישות (</w:t>
+      </w:r>
+      <w:r>
+        <w:rPr>
+          <w:sz w:val="22"/>
+          <w:szCs w:val="22"/>
+        </w:rPr>
+        <w:t>Recall</w:t>
+      </w:r>
+      <w:r>
+        <w:rPr>
+          <w:sz w:val="22"/>
+          <w:szCs w:val="22"/>
+          <w:rtl/>
         </w:rPr>
         <w:t xml:space="preserve">) מעל </w:t>
       </w:r>
       <w:r>
         <w:rPr>
-          <w:b w:val="0"/>
-          <w:bCs w:val="0"/>
-          <w:i w:val="0"/>
-          <w:iCs w:val="0"/>
-          <w:sz w:val="22"/>
-          <w:szCs w:val="22"/>
-          <w:rtl w:val="0"/>
-        </w:rPr>
-        <w:t xml:space="preserve">90%</w:t>
-      </w:r>
-      <w:r>
-        <w:rPr>
-          <w:b w:val="0"/>
-          <w:bCs w:val="0"/>
-          <w:i w:val="0"/>
-          <w:iCs w:val="0"/>
-          <w:sz w:val="22"/>
-          <w:szCs w:val="22"/>
-          <w:rtl w:val="1"/>
+          <w:sz w:val="22"/>
+          <w:szCs w:val="22"/>
+        </w:rPr>
+        <w:t>90%</w:t>
+      </w:r>
+      <w:r>
+        <w:rPr>
+          <w:sz w:val="22"/>
+          <w:szCs w:val="22"/>
+          <w:rtl/>
         </w:rPr>
         <w:t xml:space="preserve"> בהתרעה על נחילה לפני יציאת הנחיל.</w:t>
       </w:r>
@@ -926,7 +951,25 @@
           <w:szCs w:val="22"/>
           <w:rtl/>
         </w:rPr>
-        <w:t xml:space="preserve"> האינטרנט של הדברים, ניטור כוורות, דבורת הדבש, חיישן פיאזואלקטרי, השכמה מונעת-אירועים, עיבוד אותות, תאי עומס, מערכות משובצות בהספק נמוך, </w:t>
+        <w:t xml:space="preserve"> האינטרנט של הדברים, ניטור כוורות, דבורת הדבש, חיישן </w:t>
+      </w:r>
+      <w:proofErr w:type="spellStart"/>
+      <w:r>
+        <w:rPr>
+          <w:sz w:val="22"/>
+          <w:szCs w:val="22"/>
+          <w:rtl/>
+        </w:rPr>
+        <w:t>פיאזואלקטרי</w:t>
+      </w:r>
+      <w:proofErr w:type="spellEnd"/>
+      <w:r>
+        <w:rPr>
+          <w:sz w:val="22"/>
+          <w:szCs w:val="22"/>
+          <w:rtl/>
+        </w:rPr>
+        <w:t xml:space="preserve">, השכמה מונעת-אירועים, עיבוד אותות, תאי עומס, מערכות משובצות בהספק נמוך, </w:t>
       </w:r>
       <w:r>
         <w:rPr>
@@ -953,6 +996,7 @@
           <w:szCs w:val="22"/>
         </w:rPr>
       </w:pPr>
+      <w:proofErr w:type="spellStart"/>
       <w:r>
         <w:rPr>
           <w:b/>
@@ -961,75 +1005,102 @@
           <w:szCs w:val="26"/>
           <w:u w:val="single"/>
         </w:rPr>
-        <w:t>BeeSense — IoT-Based Acoustic and Weight Monitoring of Honeybee Colonies</w:t>
-      </w:r>
-    </w:p>
-    <w:p>
-      <w:pPr>
-        <w:spacing w:after="0" w:line="240" w:lineRule="auto"/>
-        <w:jc w:val="center"/>
-        <w:rPr>
-          <w:sz w:val="22"/>
-          <w:szCs w:val="22"/>
-        </w:rPr>
-      </w:pPr>
-      <w:r>
-        <w:rPr>
-          <w:sz w:val="22"/>
-          <w:szCs w:val="22"/>
-        </w:rPr>
-        <w:t>Students Names: Ben-Simon Dror, Cooper Dan</w:t>
-      </w:r>
-    </w:p>
-    <w:p>
-      <w:pPr>
-        <w:spacing w:after="0" w:line="240" w:lineRule="auto"/>
-        <w:jc w:val="center"/>
-        <w:rPr>
-          <w:sz w:val="22"/>
-          <w:szCs w:val="22"/>
-        </w:rPr>
-      </w:pPr>
-      <w:r>
-        <w:rPr>
-          <w:sz w:val="22"/>
-          <w:szCs w:val="22"/>
-        </w:rPr>
-        <w:t>drorbe@post.bgu.ac.il</w:t>
-      </w:r>
-    </w:p>
-    <w:p>
-      <w:pPr>
-        <w:spacing w:after="200" w:line="240" w:lineRule="auto"/>
-        <w:jc w:val="center"/>
-        <w:rPr>
-          <w:sz w:val="22"/>
-          <w:szCs w:val="22"/>
-        </w:rPr>
-      </w:pPr>
-      <w:r>
-        <w:rPr>
-          <w:sz w:val="22"/>
-          <w:szCs w:val="22"/>
-        </w:rPr>
-        <w:t>Adviser Name: Vilenchik Dan</w:t>
-      </w:r>
-    </w:p>
-    <w:p>
-      <w:pPr>
-        <w:spacing w:after="120" w:line="240" w:lineRule="auto"/>
-        <w:jc w:val="center"/>
-        <w:rPr>
-          <w:sz w:val="22"/>
-          <w:szCs w:val="22"/>
-        </w:rPr>
-      </w:pPr>
+        <w:t>BeeSense</w:t>
+      </w:r>
+      <w:proofErr w:type="spellEnd"/>
       <w:r>
         <w:rPr>
           <w:b/>
           <w:bCs/>
           <w:sz w:val="26"/>
           <w:szCs w:val="26"/>
+          <w:u w:val="single"/>
+        </w:rPr>
+        <w:t xml:space="preserve"> — IoT-Based Acoustic and Weight Monitoring of Honeybee Colonies</w:t>
+      </w:r>
+    </w:p>
+    <w:p>
+      <w:pPr>
+        <w:spacing w:after="0" w:line="240" w:lineRule="auto"/>
+        <w:jc w:val="center"/>
+        <w:rPr>
+          <w:sz w:val="22"/>
+          <w:szCs w:val="22"/>
+        </w:rPr>
+      </w:pPr>
+      <w:r>
+        <w:rPr>
+          <w:sz w:val="22"/>
+          <w:szCs w:val="22"/>
+        </w:rPr>
+        <w:t>Students Names: Ben-Simon Dror, Cooper Dan</w:t>
+      </w:r>
+    </w:p>
+    <w:p>
+      <w:pPr>
+        <w:spacing w:after="0" w:line="240" w:lineRule="auto"/>
+        <w:jc w:val="center"/>
+        <w:rPr>
+          <w:sz w:val="22"/>
+          <w:szCs w:val="22"/>
+        </w:rPr>
+      </w:pPr>
+      <w:r>
+        <w:rPr>
+          <w:sz w:val="22"/>
+          <w:szCs w:val="22"/>
+        </w:rPr>
+        <w:t>drorbe@post.bgu.ac.il</w:t>
+      </w:r>
+    </w:p>
+    <w:p>
+      <w:pPr>
+        <w:spacing w:after="200" w:line="240" w:lineRule="auto"/>
+        <w:jc w:val="center"/>
+        <w:rPr>
+          <w:sz w:val="22"/>
+          <w:szCs w:val="22"/>
+        </w:rPr>
+      </w:pPr>
+      <w:r>
+        <w:rPr>
+          <w:sz w:val="22"/>
+          <w:szCs w:val="22"/>
+        </w:rPr>
+        <w:t xml:space="preserve">Adviser Name: </w:t>
+      </w:r>
+      <w:proofErr w:type="spellStart"/>
+      <w:r>
+        <w:rPr>
+          <w:sz w:val="22"/>
+          <w:szCs w:val="22"/>
+        </w:rPr>
+        <w:t>Vilenchik</w:t>
+      </w:r>
+      <w:proofErr w:type="spellEnd"/>
+      <w:r>
+        <w:rPr>
+          <w:sz w:val="22"/>
+          <w:szCs w:val="22"/>
+        </w:rPr>
+        <w:t xml:space="preserve"> Dan</w:t>
+      </w:r>
+    </w:p>
+    <w:p>
+      <w:pPr>
+        <w:spacing w:after="120" w:line="240" w:lineRule="auto"/>
+        <w:jc w:val="center"/>
+        <w:rPr>
+          <w:sz w:val="22"/>
+          <w:szCs w:val="22"/>
+        </w:rPr>
+      </w:pPr>
+      <w:r>
+        <w:rPr>
+          <w:b/>
+          <w:bCs/>
+          <w:sz w:val="26"/>
+          <w:szCs w:val="26"/>
         </w:rPr>
         <w:t>Abstract</w:t>
       </w:r>
@@ -1048,7 +1119,23 @@
           <w:sz w:val="22"/>
           <w:szCs w:val="22"/>
         </w:rPr>
-        <w:t>Honeybee colonies are checked mainly by opening the hive every few weeks to months, leaving the beekeeper blind between visits. Swarm preparation takes one to two weeks, and the swarm, taking a large part of the colony, leaves within minutes and is often discovered only at the next visit. BeeSense is an Internet of Things (IoT) system for monitoring hives at apiaries without mains power or network. In each hive, a battery-powered node uses a piezoelectric vibration sensor that listens at nanoampere current and wakes the node when vibration rises above the background; the node then computes vibration and sound spectra and fuses them with hive weight and temperature. A solar-powered hub at the apiary collects the data, detects signs of an approaching swarm and colony anomalies, and sends alerts over the cellular network. The innovation is an autonomous, low-cost system that brings a laboratory-proven capability to the field, at thousands of times less power than research systems. Targets: weighing accuracy of ±20 g, packet delivery above 95%, at least six months per battery and, as the committed target, precision and recall above 90% for swarm alerts issued before the swarm leaves.</w:t>
+        <w:t xml:space="preserve">Honeybee colonies are checked mainly by opening the hive every few weeks to months, leaving the beekeeper blind between visits. Swarm preparation takes one to two weeks, and the swarm, taking a large part of the colony, leaves within minutes and is often discovered only at the next visit. </w:t>
+      </w:r>
+      <w:proofErr w:type="spellStart"/>
+      <w:r>
+        <w:rPr>
+          <w:sz w:val="22"/>
+          <w:szCs w:val="22"/>
+        </w:rPr>
+        <w:t>BeeSense</w:t>
+      </w:r>
+      <w:proofErr w:type="spellEnd"/>
+      <w:r>
+        <w:rPr>
+          <w:sz w:val="22"/>
+          <w:szCs w:val="22"/>
+        </w:rPr>
+        <w:t xml:space="preserve"> is an Internet of Things (IoT) system for monitoring hives at apiaries without mains power or network. In each hive, a battery-powered node uses a piezoelectric vibration sensor that listens at nanoampere current and wakes the node when vibration rises above the background; the node then computes vibration and sound spectra and fuses them with hive weight and temperature. A solar-powered hub at the apiary collects the data, detects signs of an approaching swarm and colony anomalies, and sends alerts over the cellular network. The innovation is an autonomous, low-cost system that brings a laboratory-proven capability to the field, at thousands of times less power than research systems. Targets: weighing accuracy of ±20 g, packet delivery above 95%, at least six months per battery and, as the committed target, precision and recall above 90% for swarm alerts issued before the swarm leaves.</w:t>
       </w:r>
     </w:p>
     <w:p>
@@ -1114,6 +1201,7 @@
           <w:szCs w:val="22"/>
         </w:rPr>
       </w:pPr>
+      <w:proofErr w:type="spellStart"/>
       <w:r>
         <w:rPr>
           <w:b/>
@@ -1121,7 +1209,17 @@
           <w:sz w:val="22"/>
           <w:szCs w:val="22"/>
         </w:rPr>
-        <w:t>BeeSense – event-driven vibration and weight monitoring of honeybee hives</w:t>
+        <w:t>BeeSense</w:t>
+      </w:r>
+      <w:proofErr w:type="spellEnd"/>
+      <w:r>
+        <w:rPr>
+          <w:b/>
+          <w:bCs/>
+          <w:sz w:val="22"/>
+          <w:szCs w:val="22"/>
+        </w:rPr>
+        <w:t xml:space="preserve"> – event-driven vibration and weight monitoring of honeybee hives</w:t>
       </w:r>
     </w:p>
     <w:p>
@@ -1157,7 +1255,23 @@
           <w:sz w:val="22"/>
           <w:szCs w:val="22"/>
         </w:rPr>
-        <w:t>Honeybee colonies are inspected mostly by opening the hive every few weeks to months; inspections disturb the colony, cost labour, and leave the beekeeper blind between visits. Precision beekeeping, i.e. monitoring colonies with sensors so that interventions are based on data, was proposed to close this gap [1]. Swarming is the costliest blind spot: the colony rears new queens for one to two weeks, the prime swarm leaves with the old queen once the queen cells are capped, clusters nearby for a few hours, and is then lost. Hive vibrations change measurably before swarming [2], [3], and continuous hive weight reveals foraging, consumption and swarm departures [4]. Initial use case: a beekeeper with many hives standing close together at a remote apiary without mains power or Wi-Fi, visiting every few weeks. The system must alert before a swarm leaves or a colony behaves abnormally, and show which hives need a visit first. Applications: commercial and hobby apiaries, pollination services, and research apiaries that need long continuous records.</w:t>
+        <w:t xml:space="preserve">Honeybee colonies are inspected mostly by opening the hive every few weeks to months; inspections disturb the colony, cost </w:t>
+      </w:r>
+      <w:proofErr w:type="spellStart"/>
+      <w:r>
+        <w:rPr>
+          <w:sz w:val="22"/>
+          <w:szCs w:val="22"/>
+        </w:rPr>
+        <w:t>labour</w:t>
+      </w:r>
+      <w:proofErr w:type="spellEnd"/>
+      <w:r>
+        <w:rPr>
+          <w:sz w:val="22"/>
+          <w:szCs w:val="22"/>
+        </w:rPr>
+        <w:t>, and leave the beekeeper blind between visits. Precision beekeeping, i.e. monitoring colonies with sensors so that interventions are based on data, was proposed to close this gap [1]. Swarming is the costliest blind spot: the colony rears new queens for one to two weeks, the prime swarm leaves with the old queen once the queen cells are capped, clusters nearby for a few hours, and is then lost. Hive vibrations change measurably before swarming [2], [3], and continuous hive weight reveals foraging, consumption and swarm departures [4]. Initial use case: a beekeeper with many hives standing close together at a remote apiary without mains power or Wi-Fi, visiting every few weeks. The system must alert before a swarm leaves or a colony behaves abnormally, and show which hives need a visit first. Applications: commercial and hobby apiaries, pollination services, and research apiaries that need long continuous records.</w:t>
       </w:r>
     </w:p>
     <w:p>
@@ -1190,25 +1304,17 @@
       </w:pPr>
       <w:r>
         <w:rPr>
-          <w:b w:val="1"/>
-          <w:bCs w:val="1"/>
-          <w:i w:val="0"/>
-          <w:iCs w:val="0"/>
-          <w:sz w:val="22"/>
-          <w:szCs w:val="22"/>
-          <w:rtl w:val="0"/>
-        </w:rPr>
-        <w:t xml:space="preserve">Objectives:</w:t>
-      </w:r>
-      <w:r>
-        <w:rPr>
-          <w:b w:val="0"/>
-          <w:bCs w:val="0"/>
-          <w:i w:val="0"/>
-          <w:iCs w:val="0"/>
-          <w:sz w:val="22"/>
-          <w:szCs w:val="22"/>
-          <w:rtl w:val="0"/>
+          <w:b/>
+          <w:bCs/>
+          <w:sz w:val="22"/>
+          <w:szCs w:val="22"/>
+        </w:rPr>
+        <w:t>Objectives:</w:t>
+      </w:r>
+      <w:r>
+        <w:rPr>
+          <w:sz w:val="22"/>
+          <w:szCs w:val="22"/>
         </w:rPr>
         <w:t xml:space="preserve"> (1) a battery-powered hive node that wakes on events, measures vibration, sound, weight and temperature, and lasts at least six months per charge (targets in Section 3.3);</w:t>
       </w:r>
@@ -1224,15 +1330,10 @@
       </w:pPr>
       <w:r>
         <w:rPr>
-          <w:b w:val="0"/>
-          <w:bCs w:val="0"/>
-          <w:i w:val="0"/>
-          <w:iCs w:val="0"/>
-          <w:sz w:val="22"/>
-          <w:szCs w:val="22"/>
-          <w:rtl w:val="0"/>
-        </w:rPr>
-        <w:t xml:space="preserve">(2) a reliable link from the hives to a solar-powered hub that uploads the data over the cellular network to a web dashboard;</w:t>
+          <w:sz w:val="22"/>
+          <w:szCs w:val="22"/>
+        </w:rPr>
+        <w:t>(2) a reliable link from the hives to a solar-powered hub that uploads the data over the cellular network to a web dashboard;</w:t>
       </w:r>
     </w:p>
     <w:p>
@@ -1246,15 +1347,10 @@
       </w:pPr>
       <w:r>
         <w:rPr>
-          <w:b w:val="0"/>
-          <w:bCs w:val="0"/>
-          <w:i w:val="0"/>
-          <w:iCs w:val="0"/>
-          <w:sz w:val="22"/>
-          <w:szCs w:val="22"/>
-          <w:rtl w:val="0"/>
-        </w:rPr>
-        <w:t xml:space="preserve">(3) alerts on approaching swarms before the swarm leaves; how early this is possible is the research question.</w:t>
+          <w:sz w:val="22"/>
+          <w:szCs w:val="22"/>
+        </w:rPr>
+        <w:t>(3) alerts on approaching swarms before the swarm leaves; how early this is possible is the research question.</w:t>
       </w:r>
     </w:p>
     <w:p>
@@ -1268,25 +1364,17 @@
       </w:pPr>
       <w:r>
         <w:rPr>
-          <w:b w:val="1"/>
-          <w:bCs w:val="1"/>
-          <w:i w:val="0"/>
-          <w:iCs w:val="0"/>
-          <w:sz w:val="22"/>
-          <w:szCs w:val="22"/>
-          <w:rtl w:val="0"/>
-        </w:rPr>
-        <w:t xml:space="preserve">Stages:</w:t>
-      </w:r>
-      <w:r>
-        <w:rPr>
-          <w:b w:val="0"/>
-          <w:bCs w:val="0"/>
-          <w:i w:val="0"/>
-          <w:iCs w:val="0"/>
-          <w:sz w:val="22"/>
-          <w:szCs w:val="22"/>
-          <w:rtl w:val="0"/>
+          <w:b/>
+          <w:bCs/>
+          <w:sz w:val="22"/>
+          <w:szCs w:val="22"/>
+        </w:rPr>
+        <w:t>Stages:</w:t>
+      </w:r>
+      <w:r>
+        <w:rPr>
+          <w:sz w:val="22"/>
+          <w:szCs w:val="22"/>
         </w:rPr>
         <w:t xml:space="preserve"> (1) requirements with the beekeeper and bench tests of each sensor chain and of the node's energy use; (2) build the node and test the link at the apiary; (3) build the hub, detection and dashboard, and install on hives before spring; (4) field evaluation.</w:t>
       </w:r>
@@ -1304,13 +1392,10 @@
         <w:rPr>
           <w:b/>
           <w:bCs/>
-          <w:i w:val="0"/>
-          <w:iCs w:val="0"/>
-          <w:sz w:val="22"/>
-          <w:szCs w:val="22"/>
-          <w:rtl w:val="0"/>
-        </w:rPr>
-        <w:t xml:space="preserve">1.3 Technology and Interfaces</w:t>
+          <w:sz w:val="22"/>
+          <w:szCs w:val="22"/>
+        </w:rPr>
+        <w:t>1.3 Technology and Interfaces</w:t>
       </w:r>
     </w:p>
     <w:p>
@@ -1324,73 +1409,71 @@
       </w:pPr>
       <w:r>
         <w:rPr>
-          <w:b w:val="0"/>
-          <w:bCs w:val="0"/>
-          <w:i w:val="1"/>
-          <w:iCs w:val="1"/>
-          <w:sz w:val="22"/>
-          <w:szCs w:val="22"/>
-          <w:rtl w:val="0"/>
-        </w:rPr>
-        <w:t xml:space="preserve">Hive node:</w:t>
-      </w:r>
-      <w:r>
-        <w:rPr>
-          <w:b w:val="0"/>
-          <w:bCs w:val="0"/>
-          <w:i w:val="0"/>
-          <w:iCs w:val="0"/>
-          <w:sz w:val="22"/>
-          <w:szCs w:val="22"/>
-          <w:rtl w:val="0"/>
-        </w:rPr>
-        <w:t xml:space="preserve"> an ESP32-C3 microcontroller board powered by one 18650 Li-ion cell, with four sensors: (a) a 27 mm piezoelectric disc pressed into the comb at the centre of the hive, where comb vibration is strongest (Section 3.2); (b) a small digital MEMS microphone inside the hive, behind a mesh; (c) four 50 kg load cells under the hive with an HX711 weighing ADC; and (d) DS18B20 temperature probes. The piezo disc also feeds a low-power wake circuit (≈2 µA) that wakes the node when vibration jumps above its usual level; an amplifier prepares the signal for the ADC only while recording. The C3 has no floating-point unit, so the spectra are computed with a fixed-point FFT, the usual practice on small microcontrollers. </w:t>
-      </w:r>
-      <w:r>
-        <w:rPr>
-          <w:b w:val="0"/>
-          <w:bCs w:val="0"/>
-          <w:i w:val="1"/>
-          <w:iCs w:val="1"/>
-          <w:sz w:val="22"/>
-          <w:szCs w:val="22"/>
-          <w:rtl w:val="0"/>
-        </w:rPr>
-        <w:t xml:space="preserve">Hub:</w:t>
-      </w:r>
-      <w:r>
-        <w:rPr>
-          <w:b w:val="0"/>
-          <w:bCs w:val="0"/>
-          <w:i w:val="0"/>
-          <w:iCs w:val="0"/>
-          <w:sz w:val="22"/>
-          <w:szCs w:val="22"/>
-          <w:rtl w:val="0"/>
-        </w:rPr>
-        <w:t xml:space="preserve"> an ESP32-S3 board at the apiary receives the nodes over ESP-NOW, a direct Wi-Fi radio link that needs no router, uploads over a cellular modem, and runs from an 18 V / 15 W solar panel with a charger and battery. Because the hives stand close together, one hub and one SIM serve a group of hives. </w:t>
-      </w:r>
-      <w:r>
-        <w:rPr>
-          <w:b w:val="0"/>
-          <w:bCs w:val="0"/>
-          <w:i w:val="1"/>
-          <w:iCs w:val="1"/>
-          <w:sz w:val="22"/>
-          <w:szCs w:val="22"/>
-          <w:rtl w:val="0"/>
-        </w:rPr>
-        <w:t xml:space="preserve">Interfaces:</w:t>
-      </w:r>
-      <w:r>
-        <w:rPr>
-          <w:b w:val="0"/>
-          <w:bCs w:val="0"/>
-          <w:i w:val="0"/>
-          <w:iCs w:val="0"/>
-          <w:sz w:val="22"/>
-          <w:szCs w:val="22"/>
-          <w:rtl w:val="0"/>
+          <w:i/>
+          <w:iCs/>
+          <w:sz w:val="22"/>
+          <w:szCs w:val="22"/>
+        </w:rPr>
+        <w:t>Hive node:</w:t>
+      </w:r>
+      <w:r>
+        <w:rPr>
+          <w:sz w:val="22"/>
+          <w:szCs w:val="22"/>
+        </w:rPr>
+        <w:t xml:space="preserve"> an ESP32-C3 microcontroller board powered by one 18650 Li-ion cell, with four sensors: (a) a 27 mm piezoelectric disc pressed into the comb at the </w:t>
+      </w:r>
+      <w:r>
+        <w:rPr>
+          <w:sz w:val="22"/>
+          <w:szCs w:val="22"/>
+        </w:rPr>
+        <w:t>center</w:t>
+      </w:r>
+      <w:r>
+        <w:rPr>
+          <w:sz w:val="22"/>
+          <w:szCs w:val="22"/>
+        </w:rPr>
+        <w:t xml:space="preserve"> of the hive, where comb vibration is strongest (Section 3.2); (b) a small digital MEMS microphone inside the hive, behind a mesh; (c) four 50 kg load cells under the hive with an HX711 weighing ADC; and (d) DS18B20 temperature probes. The piezo disc also feeds a low-power wake circuit (≈2 µA) that wakes the node when vibration jumps above its usual level; an amplifier prepares the signal for the ADC only while recording. The C3 has no floating-point unit, so the spectra are computed with a fixed-point FFT, the usual practice on small microcontrollers. </w:t>
+      </w:r>
+      <w:r>
+        <w:rPr>
+          <w:i/>
+          <w:iCs/>
+          <w:sz w:val="22"/>
+          <w:szCs w:val="22"/>
+        </w:rPr>
+        <w:t>Hub:</w:t>
+      </w:r>
+      <w:r>
+        <w:rPr>
+          <w:sz w:val="22"/>
+          <w:szCs w:val="22"/>
+        </w:rPr>
+        <w:t xml:space="preserve"> an ESP32-S3 board at the apiary receives the nodes over ESP-NOW, a direct Wi-Fi radio link that needs no router, uploads over a cellular modem, and runs from an 18 V / 15 W solar panel with a charger and battery. Because the hives stand close together, one hub and one SIM </w:t>
+      </w:r>
+      <w:r>
+        <w:rPr>
+          <w:sz w:val="22"/>
+          <w:szCs w:val="22"/>
+        </w:rPr>
+        <w:lastRenderedPageBreak/>
+        <w:t xml:space="preserve">serve a group of hives. </w:t>
+      </w:r>
+      <w:r>
+        <w:rPr>
+          <w:i/>
+          <w:iCs/>
+          <w:sz w:val="22"/>
+          <w:szCs w:val="22"/>
+        </w:rPr>
+        <w:t>Interfaces:</w:t>
+      </w:r>
+      <w:r>
+        <w:rPr>
+          <w:sz w:val="22"/>
+          <w:szCs w:val="22"/>
         </w:rPr>
         <w:t xml:space="preserve"> ADC (piezo), I²S (microphone), two-wire serial (HX711), 1-Wire (temperature), GPIO (wake-up), ESP-NOW (node to hub), LTE (hub to cloud).</w:t>
       </w:r>
@@ -1461,7 +1544,39 @@
           <w:sz w:val="18"/>
           <w:szCs w:val="18"/>
         </w:rPr>
-        <w:t>Fig. 1.  BeeSense block diagram (blue: BeeSense system, grey: external; red: event wake-up path).</w:t>
+        <w:t xml:space="preserve">Fig. 1.  </w:t>
+      </w:r>
+      <w:proofErr w:type="spellStart"/>
+      <w:r>
+        <w:rPr>
+          <w:sz w:val="18"/>
+          <w:szCs w:val="18"/>
+        </w:rPr>
+        <w:t>BeeSense</w:t>
+      </w:r>
+      <w:proofErr w:type="spellEnd"/>
+      <w:r>
+        <w:rPr>
+          <w:sz w:val="18"/>
+          <w:szCs w:val="18"/>
+        </w:rPr>
+        <w:t xml:space="preserve"> block diagram (blue: </w:t>
+      </w:r>
+      <w:proofErr w:type="spellStart"/>
+      <w:r>
+        <w:rPr>
+          <w:sz w:val="18"/>
+          <w:szCs w:val="18"/>
+        </w:rPr>
+        <w:t>BeeSense</w:t>
+      </w:r>
+      <w:proofErr w:type="spellEnd"/>
+      <w:r>
+        <w:rPr>
+          <w:sz w:val="18"/>
+          <w:szCs w:val="18"/>
+        </w:rPr>
+        <w:t xml:space="preserve"> system, grey: external; red: event wake-up path).</w:t>
       </w:r>
     </w:p>
     <w:p>
@@ -1497,7 +1612,39 @@
           <w:sz w:val="22"/>
           <w:szCs w:val="22"/>
         </w:rPr>
-        <w:t>Ferrari et al. recorded hive sounds with in-hive microphones and found that the power spectral density near 110 Hz rises, and shifts upward in frequency, before swarming [2]. Ramsey et al. placed accelerometers in the heart of the colony and, by tracking how the vibrational spectra evolve, separated colonies preparing to swarm with more than 90% accuracy, up to 30 days ahead [3]; Bencsik et al. predicted swarming several days ahead with a simple transducer on the outside hive wall [5]. Cecchi et al. built a multi-sensor hive with microphones, weighing to ±10 g and CO₂, but each hive used a Raspberry Pi drawing about 4 W from mains power [6]. Commercially, BroodMinder hive scales log weight only [7], and BeeHero in-hive sensors measure acoustics and climate and report over Bluetooth Low Energy to a cellular gateway in a closed system [8] (Table I).</w:t>
+        <w:t xml:space="preserve">Ferrari et al. recorded hive sounds with in-hive microphones and found that the power spectral density near 110 Hz rises, and shifts upward in frequency, before swarming [2]. Ramsey et al. placed accelerometers in the heart of the colony and, by tracking how the vibrational spectra evolve, separated colonies preparing to swarm with more than 90% accuracy, up to 30 days ahead [3]; Bencsik et al. predicted swarming several days ahead with a simple transducer on the outside hive wall [5]. Cecchi et al. built a multi-sensor hive with microphones, weighing to ±10 g and CO₂, but each hive used a Raspberry Pi drawing about 4 W from mains power [6]. Commercially, </w:t>
+      </w:r>
+      <w:proofErr w:type="spellStart"/>
+      <w:r>
+        <w:rPr>
+          <w:sz w:val="22"/>
+          <w:szCs w:val="22"/>
+        </w:rPr>
+        <w:t>BroodMinder</w:t>
+      </w:r>
+      <w:proofErr w:type="spellEnd"/>
+      <w:r>
+        <w:rPr>
+          <w:sz w:val="22"/>
+          <w:szCs w:val="22"/>
+        </w:rPr>
+        <w:t xml:space="preserve"> hive scales log weight only [7], and </w:t>
+      </w:r>
+      <w:proofErr w:type="spellStart"/>
+      <w:r>
+        <w:rPr>
+          <w:sz w:val="22"/>
+          <w:szCs w:val="22"/>
+        </w:rPr>
+        <w:t>BeeHero</w:t>
+      </w:r>
+      <w:proofErr w:type="spellEnd"/>
+      <w:r>
+        <w:rPr>
+          <w:sz w:val="22"/>
+          <w:szCs w:val="22"/>
+        </w:rPr>
+        <w:t xml:space="preserve"> in-hive sensors measure acoustics and climate and report over Bluetooth Low Energy to a cellular gateway in a closed system [8] (Table I).</w:t>
       </w:r>
     </w:p>
     <w:p>
@@ -1602,7 +1749,27 @@
                 <w:sz w:val="18"/>
                 <w:szCs w:val="18"/>
               </w:rPr>
-              <w:t>What BeeSense must show</w:t>
+              <w:t xml:space="preserve">What </w:t>
+            </w:r>
+            <w:proofErr w:type="spellStart"/>
+            <w:r>
+              <w:rPr>
+                <w:b/>
+                <w:bCs/>
+                <w:sz w:val="18"/>
+                <w:szCs w:val="18"/>
+              </w:rPr>
+              <w:t>BeeSense</w:t>
+            </w:r>
+            <w:proofErr w:type="spellEnd"/>
+            <w:r>
+              <w:rPr>
+                <w:b/>
+                <w:bCs/>
+                <w:sz w:val="18"/>
+                <w:szCs w:val="18"/>
+              </w:rPr>
+              <w:t xml:space="preserve"> must show</w:t>
             </w:r>
           </w:p>
         </w:tc>
@@ -1722,7 +1889,23 @@
                 <w:sz w:val="18"/>
                 <w:szCs w:val="18"/>
               </w:rPr>
-              <w:t>Battery operation, ~1 mW average power</w:t>
+              <w:t xml:space="preserve">Battery operation, ~1 </w:t>
+            </w:r>
+            <w:proofErr w:type="spellStart"/>
+            <w:r>
+              <w:rPr>
+                <w:sz w:val="18"/>
+                <w:szCs w:val="18"/>
+              </w:rPr>
+              <w:t>mW</w:t>
+            </w:r>
+            <w:proofErr w:type="spellEnd"/>
+            <w:r>
+              <w:rPr>
+                <w:sz w:val="18"/>
+                <w:szCs w:val="18"/>
+              </w:rPr>
+              <w:t xml:space="preserve"> average power</w:t>
             </w:r>
           </w:p>
         </w:tc>
@@ -1741,12 +1924,21 @@
               <w:keepNext/>
               <w:spacing w:after="0" w:line="240" w:lineRule="auto"/>
             </w:pPr>
+            <w:proofErr w:type="spellStart"/>
             <w:r>
               <w:rPr>
                 <w:sz w:val="18"/>
                 <w:szCs w:val="18"/>
               </w:rPr>
-              <w:t>BroodMinder [7]</w:t>
+              <w:t>BroodMinder</w:t>
+            </w:r>
+            <w:proofErr w:type="spellEnd"/>
+            <w:r>
+              <w:rPr>
+                <w:sz w:val="18"/>
+                <w:szCs w:val="18"/>
+              </w:rPr>
+              <w:t xml:space="preserve"> [7]</w:t>
             </w:r>
           </w:p>
         </w:tc>
@@ -1802,12 +1994,21 @@
             <w:pPr>
               <w:spacing w:after="0" w:line="240" w:lineRule="auto"/>
             </w:pPr>
+            <w:proofErr w:type="spellStart"/>
             <w:r>
               <w:rPr>
                 <w:sz w:val="18"/>
                 <w:szCs w:val="18"/>
               </w:rPr>
-              <w:t>BeeHero [8]</w:t>
+              <w:t>BeeHero</w:t>
+            </w:r>
+            <w:proofErr w:type="spellEnd"/>
+            <w:r>
+              <w:rPr>
+                <w:sz w:val="18"/>
+                <w:szCs w:val="18"/>
+              </w:rPr>
+              <w:t xml:space="preserve"> [8]</w:t>
             </w:r>
           </w:p>
         </w:tc>
@@ -2011,7 +2212,32 @@
           <w:sz w:val="22"/>
           <w:szCs w:val="22"/>
         </w:rPr>
-        <w:t xml:space="preserve">) is estimated </w:t>
+        <w:t xml:space="preserve">) is estimated with Welch's method (1024-point Hann windows, 50% overlap, </w:t>
+      </w:r>
+      <w:proofErr w:type="spellStart"/>
+      <w:r>
+        <w:rPr>
+          <w:sz w:val="22"/>
+          <w:szCs w:val="22"/>
+        </w:rPr>
+        <w:t>Δ</w:t>
+      </w:r>
+      <w:r>
+        <w:rPr>
+          <w:i/>
+          <w:iCs/>
+          <w:sz w:val="22"/>
+          <w:szCs w:val="22"/>
+        </w:rPr>
+        <w:t>f</w:t>
+      </w:r>
+      <w:proofErr w:type="spellEnd"/>
+      <w:r>
+        <w:rPr>
+          <w:sz w:val="22"/>
+          <w:szCs w:val="22"/>
+        </w:rPr>
+        <w:t xml:space="preserve"> ≈ 1.95 Hz) using a fixed-point FFT, </w:t>
       </w:r>
       <w:r>
         <w:rPr>
@@ -2019,23 +2245,7 @@
           <w:szCs w:val="22"/>
         </w:rPr>
         <w:lastRenderedPageBreak/>
-        <w:t>with Welch's method (1024-point Hann windows, 50% overlap, Δ</w:t>
-      </w:r>
-      <w:r>
-        <w:rPr>
-          <w:i/>
-          <w:iCs/>
-          <w:sz w:val="22"/>
-          <w:szCs w:val="22"/>
-        </w:rPr>
-        <w:t>f</w:t>
-      </w:r>
-      <w:r>
-        <w:rPr>
-          <w:sz w:val="22"/>
-          <w:szCs w:val="22"/>
-        </w:rPr>
-        <w:t xml:space="preserve"> ≈ 1.95 Hz) using a fixed-point FFT, since the C3 has no floating-point unit, and reduced to </w:t>
+        <w:t xml:space="preserve">since the C3 has no floating-point unit, and reduced to </w:t>
       </w:r>
       <w:r>
         <w:rPr>
@@ -2133,7 +2343,15 @@
           <w:sz w:val="22"/>
           <w:szCs w:val="22"/>
         </w:rPr>
-        <w:t xml:space="preserve"> = Σ</w:t>
+        <w:t xml:space="preserve"> = </w:t>
+      </w:r>
+      <w:proofErr w:type="spellStart"/>
+      <w:r>
+        <w:rPr>
+          <w:sz w:val="22"/>
+          <w:szCs w:val="22"/>
+        </w:rPr>
+        <w:t>Σ</w:t>
       </w:r>
       <w:r>
         <w:rPr>
@@ -2145,6 +2363,7 @@
         </w:rPr>
         <w:t>f∈Bk</w:t>
       </w:r>
+      <w:proofErr w:type="spellEnd"/>
       <w:r>
         <w:rPr>
           <w:sz w:val="22"/>
@@ -2182,7 +2401,15 @@
           <w:sz w:val="22"/>
           <w:szCs w:val="22"/>
         </w:rPr>
-        <w:t>) / Σ</w:t>
+        <w:t xml:space="preserve">) / </w:t>
+      </w:r>
+      <w:proofErr w:type="spellStart"/>
+      <w:r>
+        <w:rPr>
+          <w:sz w:val="22"/>
+          <w:szCs w:val="22"/>
+        </w:rPr>
+        <w:t>Σ</w:t>
       </w:r>
       <w:r>
         <w:rPr>
@@ -2194,6 +2421,7 @@
         </w:rPr>
         <w:t>f∈B</w:t>
       </w:r>
+      <w:proofErr w:type="spellEnd"/>
       <w:r>
         <w:rPr>
           <w:sz w:val="22"/>
@@ -2320,6 +2548,7 @@
         </w:rPr>
         <w:t xml:space="preserve"> − </w:t>
       </w:r>
+      <w:proofErr w:type="spellStart"/>
       <w:r>
         <w:rPr>
           <w:i/>
@@ -2339,6 +2568,7 @@
         </w:rPr>
         <w:t>h</w:t>
       </w:r>
+      <w:proofErr w:type="spellEnd"/>
       <w:r>
         <w:rPr>
           <w:sz w:val="22"/>
@@ -2346,6 +2576,7 @@
         </w:rPr>
         <w:t xml:space="preserve">) / </w:t>
       </w:r>
+      <w:proofErr w:type="spellStart"/>
       <w:r>
         <w:rPr>
           <w:i/>
@@ -2365,6 +2596,7 @@
         </w:rPr>
         <w:t>h</w:t>
       </w:r>
+      <w:proofErr w:type="spellEnd"/>
       <w:r>
         <w:rPr>
           <w:sz w:val="22"/>
@@ -2533,6 +2765,7 @@
         </w:rPr>
         <w:t xml:space="preserve"> with the same hive's mean </w:t>
       </w:r>
+      <w:proofErr w:type="spellStart"/>
       <w:r>
         <w:rPr>
           <w:i/>
@@ -2552,6 +2785,7 @@
         </w:rPr>
         <w:t>h</w:t>
       </w:r>
+      <w:proofErr w:type="spellEnd"/>
       <w:r>
         <w:rPr>
           <w:sz w:val="22"/>
@@ -2559,6 +2793,7 @@
         </w:rPr>
         <w:t xml:space="preserve"> and deviation </w:t>
       </w:r>
+      <w:proofErr w:type="spellStart"/>
       <w:r>
         <w:rPr>
           <w:i/>
@@ -2578,6 +2813,7 @@
         </w:rPr>
         <w:t>h</w:t>
       </w:r>
+      <w:proofErr w:type="spellEnd"/>
       <w:r>
         <w:rPr>
           <w:sz w:val="22"/>
@@ -2649,6 +2885,7 @@
         </w:rPr>
         <w:t xml:space="preserve"> &lt; −</w:t>
       </w:r>
+      <w:proofErr w:type="spellStart"/>
       <w:r>
         <w:rPr>
           <w:i/>
@@ -2668,6 +2905,7 @@
         </w:rPr>
         <w:t>th</w:t>
       </w:r>
+      <w:proofErr w:type="spellEnd"/>
       <w:r>
         <w:rPr>
           <w:sz w:val="22"/>
@@ -2691,6 +2929,7 @@
         </w:rPr>
         <w:t xml:space="preserve"> = 30 min together with an event wake; a prime swarm carries roughly 10,000–20,000 bees, about 1–2 kg at ≈0.1 g per bee, so </w:t>
       </w:r>
+      <w:proofErr w:type="spellStart"/>
       <w:r>
         <w:rPr>
           <w:i/>
@@ -2710,6 +2949,7 @@
         </w:rPr>
         <w:t>th</w:t>
       </w:r>
+      <w:proofErr w:type="spellEnd"/>
       <w:r>
         <w:rPr>
           <w:sz w:val="22"/>
@@ -2799,7 +3039,23 @@
           <w:sz w:val="22"/>
           <w:szCs w:val="22"/>
         </w:rPr>
-        <w:t xml:space="preserve"> four 50 kg cells at 1 mV/V and 3.3 V excitation give 16.5 µV/kg; the HX711 noise of 50 nV rms at 10 samples/s [11] equals ≈3 g, so load-cell temperature drift will set field accuracy. </w:t>
+        <w:t xml:space="preserve"> four 50 kg cells at 1 mV/V and 3.3 V excitation give 16.5 µV/kg; the HX711 noise of 50 </w:t>
+      </w:r>
+      <w:proofErr w:type="spellStart"/>
+      <w:r>
+        <w:rPr>
+          <w:sz w:val="22"/>
+          <w:szCs w:val="22"/>
+        </w:rPr>
+        <w:t>nV</w:t>
+      </w:r>
+      <w:proofErr w:type="spellEnd"/>
+      <w:r>
+        <w:rPr>
+          <w:sz w:val="22"/>
+          <w:szCs w:val="22"/>
+        </w:rPr>
+        <w:t xml:space="preserve"> rms at 10 samples/s [11] equals ≈3 g, so load-cell temperature drift will set field accuracy. </w:t>
       </w:r>
       <w:r>
         <w:rPr>
@@ -2817,6 +3073,7 @@
         </w:rPr>
         <w:t xml:space="preserve"> for task currents </w:t>
       </w:r>
+      <w:proofErr w:type="spellStart"/>
       <w:r>
         <w:rPr>
           <w:i/>
@@ -2836,6 +3093,7 @@
         </w:rPr>
         <w:t>i</w:t>
       </w:r>
+      <w:proofErr w:type="spellEnd"/>
       <w:r>
         <w:rPr>
           <w:sz w:val="22"/>
@@ -2843,6 +3101,7 @@
         </w:rPr>
         <w:t xml:space="preserve"> lasting </w:t>
       </w:r>
+      <w:proofErr w:type="spellStart"/>
       <w:r>
         <w:rPr>
           <w:i/>
@@ -2862,6 +3121,7 @@
         </w:rPr>
         <w:t>i</w:t>
       </w:r>
+      <w:proofErr w:type="spellEnd"/>
       <w:r>
         <w:rPr>
           <w:sz w:val="22"/>
@@ -2981,7 +3241,15 @@
           <w:sz w:val="22"/>
           <w:szCs w:val="22"/>
         </w:rPr>
-        <w:t xml:space="preserve"> Σ</w:t>
+        <w:t xml:space="preserve"> </w:t>
+      </w:r>
+      <w:proofErr w:type="spellStart"/>
+      <w:r>
+        <w:rPr>
+          <w:sz w:val="22"/>
+          <w:szCs w:val="22"/>
+        </w:rPr>
+        <w:t>Σ</w:t>
       </w:r>
       <w:r>
         <w:rPr>
@@ -2993,6 +3261,7 @@
         </w:rPr>
         <w:t>i</w:t>
       </w:r>
+      <w:proofErr w:type="spellEnd"/>
       <w:r>
         <w:rPr>
           <w:sz w:val="22"/>
@@ -3000,6 +3269,7 @@
         </w:rPr>
         <w:t xml:space="preserve"> </w:t>
       </w:r>
+      <w:proofErr w:type="spellStart"/>
       <w:r>
         <w:rPr>
           <w:i/>
@@ -3038,6 +3308,7 @@
         </w:rPr>
         <w:t>i</w:t>
       </w:r>
+      <w:proofErr w:type="spellEnd"/>
       <w:r>
         <w:rPr>
           <w:sz w:val="22"/>
@@ -3045,6 +3316,7 @@
         </w:rPr>
         <w:t xml:space="preserve"> / 86 400 s,     </w:t>
       </w:r>
+      <w:proofErr w:type="spellStart"/>
       <w:r>
         <w:rPr>
           <w:i/>
@@ -3062,6 +3334,7 @@
         </w:rPr>
         <w:t>life</w:t>
       </w:r>
+      <w:proofErr w:type="spellEnd"/>
       <w:r>
         <w:rPr>
           <w:sz w:val="22"/>
@@ -3151,7 +3424,55 @@
           <w:sz w:val="22"/>
           <w:szCs w:val="22"/>
         </w:rPr>
-        <w:t xml:space="preserve"> = 22 µA (2 µA wake circuit, 5 µA chip [12], LDO and </w:t>
+        <w:t xml:space="preserve"> = 22 µA (2 µA wake circuit, 5 µA chip [12], LDO and leakage) and 96 periodic acquisitions per day, </w:t>
+      </w:r>
+      <w:r>
+        <w:rPr>
+          <w:i/>
+          <w:iCs/>
+          <w:sz w:val="22"/>
+          <w:szCs w:val="22"/>
+        </w:rPr>
+        <w:t>Ī</w:t>
+      </w:r>
+      <w:r>
+        <w:rPr>
+          <w:sz w:val="22"/>
+          <w:szCs w:val="22"/>
+        </w:rPr>
+        <w:t xml:space="preserve"> ≈ 0.35 mA, and one 3000 </w:t>
+      </w:r>
+      <w:proofErr w:type="spellStart"/>
+      <w:r>
+        <w:rPr>
+          <w:sz w:val="22"/>
+          <w:szCs w:val="22"/>
+        </w:rPr>
+        <w:t>mAh</w:t>
+      </w:r>
+      <w:proofErr w:type="spellEnd"/>
+      <w:r>
+        <w:rPr>
+          <w:sz w:val="22"/>
+          <w:szCs w:val="22"/>
+        </w:rPr>
+        <w:t xml:space="preserve"> cell with </w:t>
+      </w:r>
+      <w:r>
+        <w:rPr>
+          <w:i/>
+          <w:iCs/>
+          <w:sz w:val="22"/>
+          <w:szCs w:val="22"/>
+        </w:rPr>
+        <w:t>η</w:t>
+      </w:r>
+      <w:r>
+        <w:rPr>
+          <w:sz w:val="22"/>
+          <w:szCs w:val="22"/>
+        </w:rPr>
+        <w:t xml:space="preserve"> = 0.8 lasts </w:t>
       </w:r>
       <w:r>
         <w:rPr>
@@ -3159,39 +3480,7 @@
           <w:szCs w:val="22"/>
         </w:rPr>
         <w:lastRenderedPageBreak/>
-        <w:t xml:space="preserve">leakage) and 96 periodic acquisitions per day, </w:t>
-      </w:r>
-      <w:r>
-        <w:rPr>
-          <w:i/>
-          <w:iCs/>
-          <w:sz w:val="22"/>
-          <w:szCs w:val="22"/>
-        </w:rPr>
-        <w:t>Ī</w:t>
-      </w:r>
-      <w:r>
-        <w:rPr>
-          <w:sz w:val="22"/>
-          <w:szCs w:val="22"/>
-        </w:rPr>
-        <w:t xml:space="preserve"> ≈ 0.35 mA, and one 3000 mAh cell with </w:t>
-      </w:r>
-      <w:r>
-        <w:rPr>
-          <w:i/>
-          <w:iCs/>
-          <w:sz w:val="22"/>
-          <w:szCs w:val="22"/>
-        </w:rPr>
-        <w:t>η</w:t>
-      </w:r>
-      <w:r>
-        <w:rPr>
-          <w:sz w:val="22"/>
-          <w:szCs w:val="22"/>
-        </w:rPr>
-        <w:t xml:space="preserve"> = 0.8 lasts ≈285 days; each extra event wake costs ≈3.4 µA, so the six-month target holds up to ≈60 event wakes per day (Fig. 2), which the adaptive threshold and 20-min hold-off keep well below. </w:t>
+        <w:t xml:space="preserve">≈285 days; each extra event wake costs ≈3.4 µA, so the six-month target holds up to ≈60 event wakes per day (Fig. 2), which the adaptive threshold and 20-min hold-off keep well below. </w:t>
       </w:r>
       <w:r>
         <w:rPr>
@@ -3207,7 +3496,39 @@
           <w:sz w:val="22"/>
           <w:szCs w:val="22"/>
         </w:rPr>
-        <w:t xml:space="preserve"> continuous receive plus the modem draw ≈0.5 W (≈12 Wh/day) against ≈45 Wh/day from the panel (5 full-sun hours, 60% conversion); three 18650 cells cover two days without sun.</w:t>
+        <w:t xml:space="preserve"> continuous receive plus the modem draw ≈0.5 W (≈12 </w:t>
+      </w:r>
+      <w:proofErr w:type="spellStart"/>
+      <w:r>
+        <w:rPr>
+          <w:sz w:val="22"/>
+          <w:szCs w:val="22"/>
+        </w:rPr>
+        <w:t>Wh</w:t>
+      </w:r>
+      <w:proofErr w:type="spellEnd"/>
+      <w:r>
+        <w:rPr>
+          <w:sz w:val="22"/>
+          <w:szCs w:val="22"/>
+        </w:rPr>
+        <w:t xml:space="preserve">/day) against ≈45 </w:t>
+      </w:r>
+      <w:proofErr w:type="spellStart"/>
+      <w:r>
+        <w:rPr>
+          <w:sz w:val="22"/>
+          <w:szCs w:val="22"/>
+        </w:rPr>
+        <w:t>Wh</w:t>
+      </w:r>
+      <w:proofErr w:type="spellEnd"/>
+      <w:r>
+        <w:rPr>
+          <w:sz w:val="22"/>
+          <w:szCs w:val="22"/>
+        </w:rPr>
+        <w:t>/day from the panel (5 full-sun hours, 60% conversion); three 18650 cells cover two days without sun.</w:t>
       </w:r>
     </w:p>
     <w:p>
@@ -3322,7 +3643,23 @@
           <w:sz w:val="22"/>
           <w:szCs w:val="22"/>
         </w:rPr>
-        <w:t xml:space="preserve"> weighing linearity with reference masses (0–100 kg) and a temperature sweep; piezo and wake chains checked with known tones (100–800 Hz) and bursts from a shaker coupled to a frame; average current measured with a power analyser over full cycles. </w:t>
+        <w:t xml:space="preserve"> weighing linearity with reference masses (0–100 kg) and a temperature sweep; piezo and wake chains checked with known tones (100–800 Hz) and bursts from a shaker coupled to a frame; average current measured with a power </w:t>
+      </w:r>
+      <w:proofErr w:type="spellStart"/>
+      <w:r>
+        <w:rPr>
+          <w:sz w:val="22"/>
+          <w:szCs w:val="22"/>
+        </w:rPr>
+        <w:t>analyser</w:t>
+      </w:r>
+      <w:proofErr w:type="spellEnd"/>
+      <w:r>
+        <w:rPr>
+          <w:sz w:val="22"/>
+          <w:szCs w:val="22"/>
+        </w:rPr>
+        <w:t xml:space="preserve"> over full cycles. </w:t>
       </w:r>
       <w:r>
         <w:rPr>
@@ -4022,23 +4359,82 @@
           <w:szCs w:val="20"/>
         </w:rPr>
         <w:tab/>
-        <w:t xml:space="preserve">A. Zacepins, V. Brusbardis, J. Meitalovs, and E. Stalidzans, "Challenges in the development of precision beekeeping," </w:t>
-      </w:r>
-      <w:r>
-        <w:rPr>
-          <w:i/>
-          <w:iCs/>
+        <w:t xml:space="preserve">A. Zacepins, V. Brusbardis, J. </w:t>
+      </w:r>
+      <w:proofErr w:type="spellStart"/>
+      <w:r>
+        <w:rPr>
           <w:sz w:val="20"/>
           <w:szCs w:val="20"/>
         </w:rPr>
-        <w:t>Biosyst. Eng.</w:t>
-      </w:r>
+        <w:t>Meitalovs</w:t>
+      </w:r>
+      <w:proofErr w:type="spellEnd"/>
       <w:r>
         <w:rPr>
           <w:sz w:val="20"/>
           <w:szCs w:val="20"/>
         </w:rPr>
-        <w:t>, vol. 130, pp. 60–71, Feb. 2015, doi: 10.1016/j.biosystemseng.2014.12.001.</w:t>
+        <w:t xml:space="preserve">, and E. </w:t>
+      </w:r>
+      <w:proofErr w:type="spellStart"/>
+      <w:r>
+        <w:rPr>
+          <w:sz w:val="20"/>
+          <w:szCs w:val="20"/>
+        </w:rPr>
+        <w:t>Stalidzans</w:t>
+      </w:r>
+      <w:proofErr w:type="spellEnd"/>
+      <w:r>
+        <w:rPr>
+          <w:sz w:val="20"/>
+          <w:szCs w:val="20"/>
+        </w:rPr>
+        <w:t xml:space="preserve">, "Challenges in the development of precision beekeeping," </w:t>
+      </w:r>
+      <w:proofErr w:type="spellStart"/>
+      <w:r>
+        <w:rPr>
+          <w:i/>
+          <w:iCs/>
+          <w:sz w:val="20"/>
+          <w:szCs w:val="20"/>
+        </w:rPr>
+        <w:t>Biosyst</w:t>
+      </w:r>
+      <w:proofErr w:type="spellEnd"/>
+      <w:r>
+        <w:rPr>
+          <w:i/>
+          <w:iCs/>
+          <w:sz w:val="20"/>
+          <w:szCs w:val="20"/>
+        </w:rPr>
+        <w:t>. Eng.</w:t>
+      </w:r>
+      <w:r>
+        <w:rPr>
+          <w:sz w:val="20"/>
+          <w:szCs w:val="20"/>
+        </w:rPr>
+        <w:t xml:space="preserve">, vol. 130, pp. 60–71, Feb. 2015, </w:t>
+      </w:r>
+      <w:proofErr w:type="spellStart"/>
+      <w:r>
+        <w:rPr>
+          <w:sz w:val="20"/>
+          <w:szCs w:val="20"/>
+        </w:rPr>
+        <w:t>doi</w:t>
+      </w:r>
+      <w:proofErr w:type="spellEnd"/>
+      <w:r>
+        <w:rPr>
+          <w:sz w:val="20"/>
+          <w:szCs w:val="20"/>
+        </w:rPr>
+        <w:t>: 10.1016/j.biosystemseng.2014.12.001.</w:t>
       </w:r>
     </w:p>
     <w:p>
@@ -4069,6 +4465,7 @@
         <w:tab/>
         <w:t xml:space="preserve">S. Ferrari, M. Silva, M. Guarino, and D. Berckmans, "Monitoring of swarming sounds in bee hives for early detection of the swarming period," </w:t>
       </w:r>
+      <w:proofErr w:type="spellStart"/>
       <w:r>
         <w:rPr>
           <w:i/>
@@ -4076,14 +4473,40 @@
           <w:sz w:val="20"/>
           <w:szCs w:val="20"/>
         </w:rPr>
-        <w:t>Comput. Electron. Agric.</w:t>
-      </w:r>
-      <w:r>
-        <w:rPr>
+        <w:t>Comput</w:t>
+      </w:r>
+      <w:proofErr w:type="spellEnd"/>
+      <w:r>
+        <w:rPr>
+          <w:i/>
+          <w:iCs/>
           <w:sz w:val="20"/>
           <w:szCs w:val="20"/>
         </w:rPr>
-        <w:t>, vol. 64, no. 1, pp. 72–77, 2008, doi: 10.1016/j.compag.2008.05.010.</w:t>
+        <w:t>. Electron. Agric.</w:t>
+      </w:r>
+      <w:r>
+        <w:rPr>
+          <w:sz w:val="20"/>
+          <w:szCs w:val="20"/>
+        </w:rPr>
+        <w:t xml:space="preserve">, vol. 64, no. 1, pp. 72–77, 2008, </w:t>
+      </w:r>
+      <w:proofErr w:type="spellStart"/>
+      <w:r>
+        <w:rPr>
+          <w:sz w:val="20"/>
+          <w:szCs w:val="20"/>
+        </w:rPr>
+        <w:t>doi</w:t>
+      </w:r>
+      <w:proofErr w:type="spellEnd"/>
+      <w:r>
+        <w:rPr>
+          <w:sz w:val="20"/>
+          <w:szCs w:val="20"/>
+        </w:rPr>
+        <w:t>: 10.1016/j.compag.2008.05.010.</w:t>
       </w:r>
     </w:p>
     <w:p>
@@ -4112,23 +4535,55 @@
           <w:szCs w:val="20"/>
         </w:rPr>
         <w:tab/>
-        <w:t xml:space="preserve">M.-T. Ramsey, M. Bencsik, M. I. Newton, M. Reyes, M. Pioz, D. Crauser, N. Simon Delso, and Y. Le Conte, "The prediction of swarming in honeybee colonies using vibrational spectra," </w:t>
-      </w:r>
-      <w:r>
-        <w:rPr>
-          <w:i/>
-          <w:iCs/>
+        <w:t xml:space="preserve">M.-T. Ramsey, M. Bencsik, M. I. Newton, M. Reyes, M. Pioz, D. </w:t>
+      </w:r>
+      <w:proofErr w:type="spellStart"/>
+      <w:r>
+        <w:rPr>
           <w:sz w:val="20"/>
           <w:szCs w:val="20"/>
         </w:rPr>
-        <w:t>Sci. Rep.</w:t>
-      </w:r>
+        <w:t>Crauser</w:t>
+      </w:r>
+      <w:proofErr w:type="spellEnd"/>
       <w:r>
         <w:rPr>
           <w:sz w:val="20"/>
           <w:szCs w:val="20"/>
         </w:rPr>
-        <w:t>, vol. 10, Art. no. 9798, Jun. 2020, doi: 10.1038/s41598-020-66115-5.</w:t>
+        <w:t xml:space="preserve">, N. Simon Delso, and Y. Le Conte, "The prediction of swarming in honeybee colonies using vibrational spectra," </w:t>
+      </w:r>
+      <w:r>
+        <w:rPr>
+          <w:i/>
+          <w:iCs/>
+          <w:sz w:val="20"/>
+          <w:szCs w:val="20"/>
+        </w:rPr>
+        <w:t>Sci. Rep.</w:t>
+      </w:r>
+      <w:r>
+        <w:rPr>
+          <w:sz w:val="20"/>
+          <w:szCs w:val="20"/>
+        </w:rPr>
+        <w:t xml:space="preserve">, vol. 10, Art. no. 9798, Jun. 2020, </w:t>
+      </w:r>
+      <w:proofErr w:type="spellStart"/>
+      <w:r>
+        <w:rPr>
+          <w:sz w:val="20"/>
+          <w:szCs w:val="20"/>
+        </w:rPr>
+        <w:t>doi</w:t>
+      </w:r>
+      <w:proofErr w:type="spellEnd"/>
+      <w:r>
+        <w:rPr>
+          <w:sz w:val="20"/>
+          <w:szCs w:val="20"/>
+        </w:rPr>
+        <w:t>: 10.1038/s41598-020-66115-5.</w:t>
       </w:r>
     </w:p>
     <w:p>
@@ -4159,6 +4614,7 @@
         <w:tab/>
         <w:t xml:space="preserve">W. G. Meikle and N. Holst, "Application of continuous monitoring of honeybee colonies," </w:t>
       </w:r>
+      <w:proofErr w:type="spellStart"/>
       <w:r>
         <w:rPr>
           <w:i/>
@@ -4168,12 +4624,29 @@
         </w:rPr>
         <w:t>Apidologie</w:t>
       </w:r>
+      <w:proofErr w:type="spellEnd"/>
       <w:r>
         <w:rPr>
           <w:sz w:val="20"/>
           <w:szCs w:val="20"/>
         </w:rPr>
-        <w:t>, vol. 46, no. 1, pp. 10–22, 2015, doi: 10.1007/s13592-014-0298-x.</w:t>
+        <w:t xml:space="preserve">, vol. 46, no. 1, pp. 10–22, 2015, </w:t>
+      </w:r>
+      <w:proofErr w:type="spellStart"/>
+      <w:r>
+        <w:rPr>
+          <w:sz w:val="20"/>
+          <w:szCs w:val="20"/>
+        </w:rPr>
+        <w:t>doi</w:t>
+      </w:r>
+      <w:proofErr w:type="spellEnd"/>
+      <w:r>
+        <w:rPr>
+          <w:sz w:val="20"/>
+          <w:szCs w:val="20"/>
+        </w:rPr>
+        <w:t>: 10.1007/s13592-014-0298-x.</w:t>
       </w:r>
     </w:p>
     <w:p>
@@ -4202,23 +4675,66 @@
           <w:szCs w:val="20"/>
         </w:rPr>
         <w:tab/>
-        <w:t xml:space="preserve">M. Bencsik, J. Bencsik, M. Baxter, A. Lucian, J. Romieu, and M. Millet, "Identification of the honey bee swarming process by analysing the time course of hive vibrations," </w:t>
-      </w:r>
-      <w:r>
-        <w:rPr>
-          <w:i/>
-          <w:iCs/>
+        <w:t xml:space="preserve">M. Bencsik, J. Bencsik, M. Baxter, A. Lucian, J. Romieu, and M. Millet, "Identification of the honey bee swarming process by </w:t>
+      </w:r>
+      <w:proofErr w:type="spellStart"/>
+      <w:r>
+        <w:rPr>
           <w:sz w:val="20"/>
           <w:szCs w:val="20"/>
         </w:rPr>
-        <w:t>Comput. Electron. Agric.</w:t>
-      </w:r>
+        <w:t>analysing</w:t>
+      </w:r>
+      <w:proofErr w:type="spellEnd"/>
       <w:r>
         <w:rPr>
           <w:sz w:val="20"/>
           <w:szCs w:val="20"/>
         </w:rPr>
-        <w:t>, vol. 76, no. 1, pp. 44–50, 2011, doi: 10.1016/j.compag.2011.01.004.</w:t>
+        <w:t xml:space="preserve"> the time course of hive vibrations," </w:t>
+      </w:r>
+      <w:proofErr w:type="spellStart"/>
+      <w:r>
+        <w:rPr>
+          <w:i/>
+          <w:iCs/>
+          <w:sz w:val="20"/>
+          <w:szCs w:val="20"/>
+        </w:rPr>
+        <w:t>Comput</w:t>
+      </w:r>
+      <w:proofErr w:type="spellEnd"/>
+      <w:r>
+        <w:rPr>
+          <w:i/>
+          <w:iCs/>
+          <w:sz w:val="20"/>
+          <w:szCs w:val="20"/>
+        </w:rPr>
+        <w:t>. Electron. Agric.</w:t>
+      </w:r>
+      <w:r>
+        <w:rPr>
+          <w:sz w:val="20"/>
+          <w:szCs w:val="20"/>
+        </w:rPr>
+        <w:t xml:space="preserve">, vol. 76, no. 1, pp. 44–50, 2011, </w:t>
+      </w:r>
+      <w:proofErr w:type="spellStart"/>
+      <w:r>
+        <w:rPr>
+          <w:sz w:val="20"/>
+          <w:szCs w:val="20"/>
+        </w:rPr>
+        <w:t>doi</w:t>
+      </w:r>
+      <w:proofErr w:type="spellEnd"/>
+      <w:r>
+        <w:rPr>
+          <w:sz w:val="20"/>
+          <w:szCs w:val="20"/>
+        </w:rPr>
+        <w:t>: 10.1016/j.compag.2011.01.004.</w:t>
       </w:r>
     </w:p>
     <w:p>
@@ -4266,23 +4782,71 @@
           <w:szCs w:val="20"/>
         </w:rPr>
         <w:tab/>
-        <w:t xml:space="preserve">S. Cecchi, S. Spinsante, A. Terenzi, and S. Orcioni, "A smart sensor-based measurement system for advanced bee hive monitoring," </w:t>
-      </w:r>
-      <w:r>
-        <w:rPr>
-          <w:i/>
-          <w:iCs/>
+        <w:t xml:space="preserve">S. Cecchi, S. </w:t>
+      </w:r>
+      <w:proofErr w:type="spellStart"/>
+      <w:r>
+        <w:rPr>
           <w:sz w:val="20"/>
           <w:szCs w:val="20"/>
         </w:rPr>
-        <w:t>Sensors</w:t>
-      </w:r>
+        <w:t>Spinsante</w:t>
+      </w:r>
+      <w:proofErr w:type="spellEnd"/>
       <w:r>
         <w:rPr>
           <w:sz w:val="20"/>
           <w:szCs w:val="20"/>
         </w:rPr>
-        <w:t>, vol. 20, no. 9, Art. no. 2726, May 2020, doi: 10.3390/s20092726.</w:t>
+        <w:t xml:space="preserve">, A. Terenzi, and S. </w:t>
+      </w:r>
+      <w:proofErr w:type="spellStart"/>
+      <w:r>
+        <w:rPr>
+          <w:sz w:val="20"/>
+          <w:szCs w:val="20"/>
+        </w:rPr>
+        <w:t>Orcioni</w:t>
+      </w:r>
+      <w:proofErr w:type="spellEnd"/>
+      <w:r>
+        <w:rPr>
+          <w:sz w:val="20"/>
+          <w:szCs w:val="20"/>
+        </w:rPr>
+        <w:t xml:space="preserve">, "A smart sensor-based measurement system for advanced bee hive monitoring," </w:t>
+      </w:r>
+      <w:r>
+        <w:rPr>
+          <w:i/>
+          <w:iCs/>
+          <w:sz w:val="20"/>
+          <w:szCs w:val="20"/>
+        </w:rPr>
+        <w:t>Sensors</w:t>
+      </w:r>
+      <w:r>
+        <w:rPr>
+          <w:sz w:val="20"/>
+          <w:szCs w:val="20"/>
+        </w:rPr>
+        <w:t xml:space="preserve">, vol. 20, no. 9, Art. no. 2726, May 2020, </w:t>
+      </w:r>
+      <w:proofErr w:type="spellStart"/>
+      <w:r>
+        <w:rPr>
+          <w:sz w:val="20"/>
+          <w:szCs w:val="20"/>
+        </w:rPr>
+        <w:t>doi</w:t>
+      </w:r>
+      <w:proofErr w:type="spellEnd"/>
+      <w:r>
+        <w:rPr>
+          <w:sz w:val="20"/>
+          <w:szCs w:val="20"/>
+        </w:rPr>
+        <w:t>: 10.3390/s20092726.</w:t>
       </w:r>
     </w:p>
     <w:p>
@@ -4311,7 +4875,22 @@
           <w:szCs w:val="20"/>
         </w:rPr>
         <w:tab/>
-        <w:t>BroodMinder, "BroodMinder-W3 four point weight scale kit." [Online]. Available: https://workerandhive.com/products/broodminder-w3-four-point-weight-scale-kit</w:t>
+      </w:r>
+      <w:proofErr w:type="spellStart"/>
+      <w:r>
+        <w:rPr>
+          <w:sz w:val="20"/>
+          <w:szCs w:val="20"/>
+        </w:rPr>
+        <w:t>BroodMinder</w:t>
+      </w:r>
+      <w:proofErr w:type="spellEnd"/>
+      <w:r>
+        <w:rPr>
+          <w:sz w:val="20"/>
+          <w:szCs w:val="20"/>
+        </w:rPr>
+        <w:t>, "BroodMinder-W3 four point weight scale kit." [Online]. Available: https://workerandhive.com/products/broodminder-w3-four-point-weight-scale-kit</w:t>
       </w:r>
     </w:p>
     <w:p>
@@ -4340,7 +4919,22 @@
           <w:szCs w:val="20"/>
         </w:rPr>
         <w:tab/>
-        <w:t>BeeHero, "Technology." [Online]. Available: https://www.beehero.io/technology</w:t>
+      </w:r>
+      <w:proofErr w:type="spellStart"/>
+      <w:r>
+        <w:rPr>
+          <w:sz w:val="20"/>
+          <w:szCs w:val="20"/>
+        </w:rPr>
+        <w:t>BeeHero</w:t>
+      </w:r>
+      <w:proofErr w:type="spellEnd"/>
+      <w:r>
+        <w:rPr>
+          <w:sz w:val="20"/>
+          <w:szCs w:val="20"/>
+        </w:rPr>
+        <w:t>, "Technology." [Online]. Available: https://www.beehero.io/technology</w:t>
       </w:r>
     </w:p>
     <w:p>
@@ -4388,23 +4982,66 @@
           <w:szCs w:val="20"/>
         </w:rPr>
         <w:tab/>
-        <w:t xml:space="preserve">M. Bencsik, Y. Le Conte, M. Reyes, M. Pioz, D. Whittaker, D. Crauser, N. Simon Delso, and M. I. Newton, "Honeybee colony vibrational measurements to highlight the brood cycle," </w:t>
-      </w:r>
-      <w:r>
-        <w:rPr>
-          <w:i/>
-          <w:iCs/>
+        <w:t xml:space="preserve">M. Bencsik, Y. Le Conte, M. Reyes, M. Pioz, D. Whittaker, D. </w:t>
+      </w:r>
+      <w:proofErr w:type="spellStart"/>
+      <w:r>
+        <w:rPr>
           <w:sz w:val="20"/>
           <w:szCs w:val="20"/>
         </w:rPr>
-        <w:t>PLoS ONE</w:t>
-      </w:r>
+        <w:t>Crauser</w:t>
+      </w:r>
+      <w:proofErr w:type="spellEnd"/>
       <w:r>
         <w:rPr>
           <w:sz w:val="20"/>
           <w:szCs w:val="20"/>
         </w:rPr>
-        <w:t>, vol. 10, no. 11, Art. no. e0141926, Nov. 2015, doi: 10.1371/journal.pone.0141926.</w:t>
+        <w:t xml:space="preserve">, N. Simon Delso, and M. I. Newton, "Honeybee colony vibrational measurements to highlight the brood cycle," </w:t>
+      </w:r>
+      <w:proofErr w:type="spellStart"/>
+      <w:r>
+        <w:rPr>
+          <w:i/>
+          <w:iCs/>
+          <w:sz w:val="20"/>
+          <w:szCs w:val="20"/>
+        </w:rPr>
+        <w:t>PLoS</w:t>
+      </w:r>
+      <w:proofErr w:type="spellEnd"/>
+      <w:r>
+        <w:rPr>
+          <w:i/>
+          <w:iCs/>
+          <w:sz w:val="20"/>
+          <w:szCs w:val="20"/>
+        </w:rPr>
+        <w:t xml:space="preserve"> ONE</w:t>
+      </w:r>
+      <w:r>
+        <w:rPr>
+          <w:sz w:val="20"/>
+          <w:szCs w:val="20"/>
+        </w:rPr>
+        <w:t xml:space="preserve">, vol. 10, no. 11, Art. no. e0141926, Nov. 2015, </w:t>
+      </w:r>
+      <w:proofErr w:type="spellStart"/>
+      <w:r>
+        <w:rPr>
+          <w:sz w:val="20"/>
+          <w:szCs w:val="20"/>
+        </w:rPr>
+        <w:t>doi</w:t>
+      </w:r>
+      <w:proofErr w:type="spellEnd"/>
+      <w:r>
+        <w:rPr>
+          <w:sz w:val="20"/>
+          <w:szCs w:val="20"/>
+        </w:rPr>
+        <w:t>: 10.1371/journal.pone.0141926.</w:t>
       </w:r>
     </w:p>
     <w:p>
@@ -4433,7 +5070,22 @@
           <w:szCs w:val="20"/>
         </w:rPr>
         <w:tab/>
-        <w:t xml:space="preserve">Espressif Systems, "ESP-NOW," in </w:t>
+      </w:r>
+      <w:proofErr w:type="spellStart"/>
+      <w:r>
+        <w:rPr>
+          <w:sz w:val="20"/>
+          <w:szCs w:val="20"/>
+        </w:rPr>
+        <w:t>Espressif</w:t>
+      </w:r>
+      <w:proofErr w:type="spellEnd"/>
+      <w:r>
+        <w:rPr>
+          <w:sz w:val="20"/>
+          <w:szCs w:val="20"/>
+        </w:rPr>
+        <w:t xml:space="preserve"> Systems, "ESP-NOW," in </w:t>
       </w:r>
       <w:r>
         <w:rPr>
@@ -4507,7 +5159,22 @@
           <w:szCs w:val="20"/>
         </w:rPr>
         <w:tab/>
-        <w:t>Espressif Systems, "ESP32-C3 series datasheet." [Online]. Available: https://www.espressif.com/en/support/documents/technical-documents</w:t>
+      </w:r>
+      <w:proofErr w:type="spellStart"/>
+      <w:r>
+        <w:rPr>
+          <w:sz w:val="20"/>
+          <w:szCs w:val="20"/>
+        </w:rPr>
+        <w:t>Espressif</w:t>
+      </w:r>
+      <w:proofErr w:type="spellEnd"/>
+      <w:r>
+        <w:rPr>
+          <w:sz w:val="20"/>
+          <w:szCs w:val="20"/>
+        </w:rPr>
+        <w:t xml:space="preserve"> Systems, "ESP32-C3 series datasheet." [Online]. Available: https://www.espressif.com/en/support/documents/technical-documents</w:t>
       </w:r>
     </w:p>
     <w:p>
@@ -4571,6 +5238,7 @@
         </w:rPr>
         <w:t xml:space="preserve">, שם הפרויקט: </w:t>
       </w:r>
+      <w:proofErr w:type="spellStart"/>
       <w:r>
         <w:rPr>
           <w:sz w:val="22"/>
@@ -4578,6 +5246,7 @@
         </w:rPr>
         <w:t>BeeSense</w:t>
       </w:r>
+      <w:proofErr w:type="spellEnd"/>
       <w:r>
         <w:rPr>
           <w:sz w:val="22"/>
@@ -4610,8 +5279,18 @@
           <w:szCs w:val="22"/>
           <w:rtl/>
         </w:rPr>
-        <w:t>שם המנחה: ד"ר דן וילנצ'יק</w:t>
-      </w:r>
+        <w:t xml:space="preserve">שם המנחה: ד"ר דן </w:t>
+      </w:r>
+      <w:proofErr w:type="spellStart"/>
+      <w:r>
+        <w:rPr>
+          <w:sz w:val="22"/>
+          <w:szCs w:val="22"/>
+          <w:rtl/>
+        </w:rPr>
+        <w:t>וילנצ'יק</w:t>
+      </w:r>
+      <w:proofErr w:type="spellEnd"/>
     </w:p>
     <w:p>
       <w:pPr>
@@ -5639,6 +6318,7 @@
         </w:rPr>
         <w:t xml:space="preserve">, שם הפרויקט: </w:t>
       </w:r>
+      <w:proofErr w:type="spellStart"/>
       <w:r>
         <w:rPr>
           <w:sz w:val="22"/>
@@ -5646,6 +6326,7 @@
         </w:rPr>
         <w:t>BeeSense</w:t>
       </w:r>
+      <w:proofErr w:type="spellEnd"/>
       <w:r>
         <w:rPr>
           <w:sz w:val="22"/>
@@ -5678,8 +6359,18 @@
           <w:szCs w:val="22"/>
           <w:rtl/>
         </w:rPr>
-        <w:t>שם המנחה: ד"ר דן וילנצ'יק</w:t>
-      </w:r>
+        <w:t xml:space="preserve">שם המנחה: ד"ר דן </w:t>
+      </w:r>
+      <w:proofErr w:type="spellStart"/>
+      <w:r>
+        <w:rPr>
+          <w:sz w:val="22"/>
+          <w:szCs w:val="22"/>
+          <w:rtl/>
+        </w:rPr>
+        <w:t>וילנצ'יק</w:t>
+      </w:r>
+      <w:proofErr w:type="spellEnd"/>
     </w:p>
     <w:p>
       <w:pPr>

</xml_diff>

<commit_message>
vault backup: 2026-10-25 16:58:50
Affected files:
.obsidian/plugins/word-reader/data.json
docs/pdr-2027-165.docx
docs/~$r-2027-165.docx
</commit_message>
<xml_diff>
--- a/docs/pdr-2027-165.docx
+++ b/docs/pdr-2027-165.docx
@@ -1263,7 +1263,7 @@
           <w:sz w:val="22"/>
           <w:szCs w:val="22"/>
         </w:rPr>
-        <w:t>labour</w:t>
+        <w:t>labor</w:t>
       </w:r>
       <w:proofErr w:type="spellEnd"/>
       <w:r>
@@ -1607,44 +1607,21 @@
           <w:szCs w:val="22"/>
         </w:rPr>
       </w:pPr>
-      <w:r>
-        <w:rPr>
-          <w:sz w:val="22"/>
-          <w:szCs w:val="22"/>
-        </w:rPr>
-        <w:t xml:space="preserve">Ferrari et al. recorded hive sounds with in-hive microphones and found that the power spectral density near 110 Hz rises, and shifts upward in frequency, before swarming [2]. Ramsey et al. placed accelerometers in the heart of the colony and, by tracking how the vibrational spectra evolve, separated colonies preparing to swarm with more than 90% accuracy, up to 30 days ahead [3]; Bencsik et al. predicted swarming several days ahead with a simple transducer on the outside hive wall [5]. Cecchi et al. built a multi-sensor hive with microphones, weighing to ±10 g and CO₂, but each hive used a Raspberry Pi drawing about 4 W from mains power [6]. Commercially, </w:t>
-      </w:r>
       <w:proofErr w:type="spellStart"/>
-      <w:r>
-        <w:rPr>
-          <w:sz w:val="22"/>
-          <w:szCs w:val="22"/>
-        </w:rPr>
-        <w:t>BroodMinder</w:t>
-      </w:r>
       <w:proofErr w:type="spellEnd"/>
-      <w:r>
-        <w:rPr>
-          <w:sz w:val="22"/>
-          <w:szCs w:val="22"/>
-        </w:rPr>
-        <w:t xml:space="preserve"> hive scales log weight only [7], and </w:t>
-      </w:r>
       <w:proofErr w:type="spellStart"/>
-      <w:r>
-        <w:rPr>
-          <w:sz w:val="22"/>
-          <w:szCs w:val="22"/>
-        </w:rPr>
-        <w:t>BeeHero</w:t>
-      </w:r>
       <w:proofErr w:type="spellEnd"/>
       <w:r>
         <w:rPr>
-          <w:sz w:val="22"/>
-          <w:szCs w:val="22"/>
-        </w:rPr>
-        <w:t xml:space="preserve"> in-hive sensors measure acoustics and climate and report over Bluetooth Low Energy to a cellular gateway in a closed system [8] (Table I).</w:t>
+          <w:b w:val="0"/>
+          <w:bCs w:val="0"/>
+          <w:i w:val="0"/>
+          <w:iCs w:val="0"/>
+          <w:sz w:val="22"/>
+          <w:szCs w:val="22"/>
+          <w:rtl w:val="0"/>
+        </w:rPr>
+        <w:t xml:space="preserve">Ferrari et al. found with in-hive microphones that the power spectral density near 110 Hz rises, and shifts upward in frequency, before swarming [2]. Ramsey et al. placed accelerometers in the heart of the colony and, by tracking how the vibrational spectra evolve, identified colonies preparing to swarm with more than 90% accuracy, up to 30 days ahead [3]. Cecchi et al. built a multi-sensor hive with microphones, weighing to ±10 g and CO₂, but each hive used a Raspberry Pi drawing about 4 W from mains power [5]. Commercially, BeeHero in-hive sensors measure acoustics and climate and report over Bluetooth Low Energy to a cellular gateway in a closed system [6] (Table I).</w:t>
       </w:r>
     </w:p>
     <w:p>
@@ -1702,10 +1679,13 @@
               <w:rPr>
                 <w:b/>
                 <w:bCs/>
+                <w:i w:val="0"/>
+                <w:iCs w:val="0"/>
                 <w:sz w:val="18"/>
                 <w:szCs w:val="18"/>
-              </w:rPr>
-              <w:t>Comparator</w:t>
+                <w:rtl w:val="0"/>
+              </w:rPr>
+              <w:t xml:space="preserve">Comparator</w:t>
             </w:r>
           </w:p>
         </w:tc>
@@ -1724,10 +1704,13 @@
               <w:rPr>
                 <w:b/>
                 <w:bCs/>
+                <w:i w:val="0"/>
+                <w:iCs w:val="0"/>
                 <w:sz w:val="18"/>
                 <w:szCs w:val="18"/>
-              </w:rPr>
-              <w:t>Relevant capability</w:t>
+                <w:rtl w:val="0"/>
+              </w:rPr>
+              <w:t xml:space="preserve">Relevant capability</w:t>
             </w:r>
           </w:p>
         </w:tc>
@@ -1742,34 +1725,19 @@
               <w:spacing w:after="0" w:line="240" w:lineRule="auto"/>
               <w:jc w:val="center"/>
             </w:pPr>
+            <w:proofErr w:type="spellStart"/>
+            <w:proofErr w:type="spellEnd"/>
             <w:r>
               <w:rPr>
                 <w:b/>
                 <w:bCs/>
+                <w:i w:val="0"/>
+                <w:iCs w:val="0"/>
                 <w:sz w:val="18"/>
                 <w:szCs w:val="18"/>
-              </w:rPr>
-              <w:t xml:space="preserve">What </w:t>
-            </w:r>
-            <w:proofErr w:type="spellStart"/>
-            <w:r>
-              <w:rPr>
-                <w:b/>
-                <w:bCs/>
-                <w:sz w:val="18"/>
-                <w:szCs w:val="18"/>
-              </w:rPr>
-              <w:t>BeeSense</w:t>
-            </w:r>
-            <w:proofErr w:type="spellEnd"/>
-            <w:r>
-              <w:rPr>
-                <w:b/>
-                <w:bCs/>
-                <w:sz w:val="18"/>
-                <w:szCs w:val="18"/>
-              </w:rPr>
-              <w:t xml:space="preserve"> must show</w:t>
+                <w:rtl w:val="0"/>
+              </w:rPr>
+              <w:t xml:space="preserve">What BeeSense must show</w:t>
             </w:r>
           </w:p>
         </w:tc>
@@ -1790,10 +1758,13 @@
             </w:pPr>
             <w:r>
               <w:rPr>
+                <w:i w:val="0"/>
+                <w:iCs w:val="0"/>
                 <w:sz w:val="18"/>
                 <w:szCs w:val="18"/>
-              </w:rPr>
-              <w:t>Ferrari [2], Ramsey [3], Bencsik [5]</w:t>
+                <w:rtl w:val="0"/>
+              </w:rPr>
+              <w:t xml:space="preserve">Ferrari [2], Ramsey [3]</w:t>
             </w:r>
           </w:p>
         </w:tc>
@@ -1809,10 +1780,13 @@
             </w:pPr>
             <w:r>
               <w:rPr>
+                <w:i w:val="0"/>
+                <w:iCs w:val="0"/>
                 <w:sz w:val="18"/>
                 <w:szCs w:val="18"/>
-              </w:rPr>
-              <w:t>Sound/vibration features precede swarming</w:t>
+                <w:rtl w:val="0"/>
+              </w:rPr>
+              <w:t xml:space="preserve">Sound/vibration features precede swarming</w:t>
             </w:r>
           </w:p>
         </w:tc>
@@ -1828,10 +1802,13 @@
             </w:pPr>
             <w:r>
               <w:rPr>
+                <w:i w:val="0"/>
+                <w:iCs w:val="0"/>
                 <w:sz w:val="18"/>
                 <w:szCs w:val="18"/>
-              </w:rPr>
-              <w:t>Same features on a battery node, in the field</w:t>
+                <w:rtl w:val="0"/>
+              </w:rPr>
+              <w:t xml:space="preserve">Same features on a battery node, in the field</w:t>
             </w:r>
           </w:p>
         </w:tc>
@@ -1852,10 +1829,13 @@
             </w:pPr>
             <w:r>
               <w:rPr>
+                <w:i w:val="0"/>
+                <w:iCs w:val="0"/>
                 <w:sz w:val="18"/>
                 <w:szCs w:val="18"/>
-              </w:rPr>
-              <w:t>Cecchi et al. [6]</w:t>
+                <w:rtl w:val="0"/>
+              </w:rPr>
+              <w:t xml:space="preserve">Cecchi et al. [5]</w:t>
             </w:r>
           </w:p>
         </w:tc>
@@ -1870,7 +1850,12 @@
               <w:jc w:val="center"/>
             </w:pPr>
             <w:r>
-              <w:t>Microphones, weight ±10 g, CO₂; mains, ~4 W per hive</w:t>
+              <w:rPr>
+                <w:i w:val="0"/>
+                <w:iCs w:val="0"/>
+                <w:rtl w:val="0"/>
+              </w:rPr>
+              <w:t xml:space="preserve">Microphones, weight ±10 g, CO₂; mains, ~4 W per hive</w:t>
             </w:r>
           </w:p>
         </w:tc>
@@ -1884,28 +1869,17 @@
               <w:spacing w:after="0" w:line="240" w:lineRule="auto"/>
               <w:jc w:val="center"/>
             </w:pPr>
+            <w:proofErr w:type="spellStart"/>
+            <w:proofErr w:type="spellEnd"/>
             <w:r>
               <w:rPr>
+                <w:i w:val="0"/>
+                <w:iCs w:val="0"/>
                 <w:sz w:val="18"/>
                 <w:szCs w:val="18"/>
-              </w:rPr>
-              <w:t xml:space="preserve">Battery operation, ~1 </w:t>
-            </w:r>
-            <w:proofErr w:type="spellStart"/>
-            <w:r>
-              <w:rPr>
-                <w:sz w:val="18"/>
-                <w:szCs w:val="18"/>
-              </w:rPr>
-              <w:t>mW</w:t>
-            </w:r>
-            <w:proofErr w:type="spellEnd"/>
-            <w:r>
-              <w:rPr>
-                <w:sz w:val="18"/>
-                <w:szCs w:val="18"/>
-              </w:rPr>
-              <w:t xml:space="preserve"> average power</w:t>
+                <w:rtl w:val="0"/>
+              </w:rPr>
+              <w:t xml:space="preserve">Battery operation, ~1 mW average power</w:t>
             </w:r>
           </w:p>
         </w:tc>
@@ -1921,24 +1895,40 @@
           </w:tcPr>
           <w:p>
             <w:pPr>
-              <w:keepNext/>
               <w:spacing w:after="0" w:line="240" w:lineRule="auto"/>
             </w:pPr>
             <w:proofErr w:type="spellStart"/>
+            <w:proofErr w:type="spellEnd"/>
             <w:r>
               <w:rPr>
+                <w:i w:val="0"/>
+                <w:iCs w:val="0"/>
                 <w:sz w:val="18"/>
                 <w:szCs w:val="18"/>
-              </w:rPr>
-              <w:t>BroodMinder</w:t>
+                <w:rtl w:val="0"/>
+              </w:rPr>
+              <w:t xml:space="preserve">BeeHero [6]</w:t>
             </w:r>
-            <w:proofErr w:type="spellEnd"/>
+          </w:p>
+        </w:tc>
+        <w:tc>
+          <w:tcPr>
+            <w:tcW w:w="2769" w:type="dxa"/>
+          </w:tcPr>
+          <w:p>
+            <w:pPr>
+              <w:spacing w:after="0" w:line="240" w:lineRule="auto"/>
+              <w:jc w:val="center"/>
+            </w:pPr>
             <w:r>
               <w:rPr>
+                <w:i w:val="0"/>
+                <w:iCs w:val="0"/>
                 <w:sz w:val="18"/>
                 <w:szCs w:val="18"/>
-              </w:rPr>
-              <w:t xml:space="preserve"> [7]</w:t>
+                <w:rtl w:val="0"/>
+              </w:rPr>
+              <w:t xml:space="preserve">In-hive acoustics and climate, BLE + cellular gateway</w:t>
             </w:r>
           </w:p>
         </w:tc>
@@ -1948,103 +1938,18 @@
           </w:tcPr>
           <w:p>
             <w:pPr>
-              <w:keepNext/>
               <w:spacing w:after="0" w:line="240" w:lineRule="auto"/>
               <w:jc w:val="center"/>
             </w:pPr>
             <w:r>
               <w:rPr>
+                <w:i w:val="0"/>
+                <w:iCs w:val="0"/>
                 <w:sz w:val="18"/>
                 <w:szCs w:val="18"/>
-              </w:rPr>
-              <w:t>Hive scale, 5 g resolution, hourly, AA batteries</w:t>
-            </w:r>
-          </w:p>
-        </w:tc>
-        <w:tc>
-          <w:tcPr>
-            <w:tcW w:w="2769" w:type="dxa"/>
-          </w:tcPr>
-          <w:p>
-            <w:pPr>
-              <w:keepNext/>
-              <w:spacing w:after="0" w:line="240" w:lineRule="auto"/>
-              <w:jc w:val="center"/>
-            </w:pPr>
-            <w:r>
-              <w:rPr>
-                <w:sz w:val="18"/>
-                <w:szCs w:val="18"/>
-              </w:rPr>
-              <w:t>Added vibration channel and event alerts</w:t>
-            </w:r>
-          </w:p>
-        </w:tc>
-      </w:tr>
-      <w:tr>
-        <w:trPr>
-          <w:cantSplit/>
-          <w:jc w:val="center"/>
-        </w:trPr>
-        <w:tc>
-          <w:tcPr>
-            <w:tcW w:w="2769" w:type="dxa"/>
-          </w:tcPr>
-          <w:p>
-            <w:pPr>
-              <w:spacing w:after="0" w:line="240" w:lineRule="auto"/>
-            </w:pPr>
-            <w:proofErr w:type="spellStart"/>
-            <w:r>
-              <w:rPr>
-                <w:sz w:val="18"/>
-                <w:szCs w:val="18"/>
-              </w:rPr>
-              <w:t>BeeHero</w:t>
-            </w:r>
-            <w:proofErr w:type="spellEnd"/>
-            <w:r>
-              <w:rPr>
-                <w:sz w:val="18"/>
-                <w:szCs w:val="18"/>
-              </w:rPr>
-              <w:t xml:space="preserve"> [8]</w:t>
-            </w:r>
-          </w:p>
-        </w:tc>
-        <w:tc>
-          <w:tcPr>
-            <w:tcW w:w="2769" w:type="dxa"/>
-          </w:tcPr>
-          <w:p>
-            <w:pPr>
-              <w:spacing w:after="0" w:line="240" w:lineRule="auto"/>
-              <w:jc w:val="center"/>
-            </w:pPr>
-            <w:r>
-              <w:rPr>
-                <w:sz w:val="18"/>
-                <w:szCs w:val="18"/>
-              </w:rPr>
-              <w:t>In-hive acoustics and climate, BLE + cellular gateway</w:t>
-            </w:r>
-          </w:p>
-        </w:tc>
-        <w:tc>
-          <w:tcPr>
-            <w:tcW w:w="2769" w:type="dxa"/>
-          </w:tcPr>
-          <w:p>
-            <w:pPr>
-              <w:spacing w:after="0" w:line="240" w:lineRule="auto"/>
-              <w:jc w:val="center"/>
-            </w:pPr>
-            <w:r>
-              <w:rPr>
-                <w:sz w:val="18"/>
-                <w:szCs w:val="18"/>
-              </w:rPr>
-              <w:t>Open, measured pipeline; weight + vibration fusion</w:t>
+                <w:rtl w:val="0"/>
+              </w:rPr>
+              <w:t xml:space="preserve">Open, measured pipeline; weight + vibration fusion</w:t>
             </w:r>
           </w:p>
         </w:tc>
@@ -3007,7 +2912,7 @@
           <w:sz w:val="22"/>
           <w:szCs w:val="22"/>
         </w:rPr>
-        <w:t xml:space="preserve"> comb vibration measured at night with laboratory accelerometers is only 1–5 µm/s² per spectral bin, about ten times weaker on the hive wall [9], and far below the noise of a typical MEMS accelerometer (≈25 µg/√Hz), hence a piezoelectric sensor in the comb. The pre-swarm changes in [2] were found with ordinary in-hive microphones, so our microphone channel is expected to resolve them; whether the piezo chain also resolves the quieter comb vibrations is measured in Stage 1 (fallback: external audio ADC). The departure itself (mass flight, 1–2 kg) gives a robust confirmation. </w:t>
+        <w:t xml:space="preserve"> comb vibration measured at night with laboratory accelerometers is only 1–5 µm/s² per spectral bin, about ten times weaker on the hive wall [7], and far below the noise of a typical MEMS accelerometer (≈25 µg/√Hz), hence a piezoelectric sensor in the comb. The pre-swarm changes in [2] were found with ordinary in-hive microphones, so our microphone channel is expected to resolve them; whether the piezo chain also resolves the quieter comb vibrations is measured in Stage 1 (fallback: external audio ADC). The departure itself (mass flight, 1–2 kg) gives a robust confirmation. </w:t>
       </w:r>
       <w:r>
         <w:rPr>
@@ -3023,7 +2928,7 @@
           <w:sz w:val="22"/>
           <w:szCs w:val="22"/>
         </w:rPr>
-        <w:t xml:space="preserve"> raw data is 4 kB/s per channel; features reduce it to ≈75 bytes per report, one ESP-NOW frame (≤250 bytes, 1 Mbps, MAC-level acknowledgement [10]), so 20 hives need ≈5 MB/month of cellular data. Wood, honey and bees attenuate 2.4 GHz, so the radio sits outside the hive body; range is measured on site first (fallback: LoRa on SPI). </w:t>
+        <w:t xml:space="preserve"> raw data is 4 kB/s per channel; features reduce it to ≈75 bytes per report, one ESP-NOW frame (≤250 bytes, 1 Mbps, MAC-level acknowledgement [8]), so 20 hives need ≈5 MB/month of cellular data. Wood, honey and bees attenuate 2.4 GHz, so the radio sits outside the hive body; range is measured on site first (fallback: LoRa on SPI). </w:t>
       </w:r>
       <w:r>
         <w:rPr>
@@ -3055,7 +2960,7 @@
           <w:sz w:val="22"/>
           <w:szCs w:val="22"/>
         </w:rPr>
-        <w:t xml:space="preserve"> rms at 10 samples/s [11] equals ≈3 g, so load-cell temperature drift will set field accuracy. </w:t>
+        <w:t xml:space="preserve"> rms at 10 samples/s [9] equals ≈3 g, so load-cell temperature drift will set field accuracy. </w:t>
       </w:r>
       <w:r>
         <w:rPr>
@@ -3398,7 +3303,7 @@
           <w:sz w:val="22"/>
           <w:szCs w:val="22"/>
         </w:rPr>
-        <w:t xml:space="preserve">One acquisition costs ≈0.30 A·s: 22 mA at 80 MHz for the 10 s recording and 28 mA at 160 MHz for ≈1.5 s of FFTs [12], 0.15 s of radio at ≈120 mA average (335 mA TX peak [12]), and the microphone (≈1.4 mA), preamplifier and HX711. With </w:t>
+        <w:t xml:space="preserve">One acquisition costs ≈0.30 A·s: 22 mA at 80 MHz for the 10 s recording and 28 mA at 160 MHz for ≈1.5 s of FFTs [10], 0.15 s of radio at ≈120 mA average (335 mA TX peak [10]), and the microphone (≈1.4 mA), preamplifier and HX711. With </w:t>
       </w:r>
       <w:r>
         <w:rPr>
@@ -3424,7 +3329,7 @@
           <w:sz w:val="22"/>
           <w:szCs w:val="22"/>
         </w:rPr>
-        <w:t xml:space="preserve"> = 22 µA (2 µA wake circuit, 5 µA chip [12], LDO and leakage) and 96 periodic acquisitions per day, </w:t>
+        <w:t xml:space="preserve"> = 22 µA (2 µA wake circuit, 5 µA chip [10], LDO and leakage) and 96 periodic acquisitions per day, </w:t>
       </w:r>
       <w:r>
         <w:rPr>
@@ -3651,7 +3556,7 @@
           <w:sz w:val="22"/>
           <w:szCs w:val="22"/>
         </w:rPr>
-        <w:t>analyser</w:t>
+        <w:t>analyzer</w:t>
       </w:r>
       <w:proofErr w:type="spellEnd"/>
       <w:r>
@@ -4651,6 +4556,25 @@
     </w:p>
     <w:p>
       <w:pPr>
+        <w:keepNext/>
+        <w:spacing w:before="120" w:after="80" w:line="360" w:lineRule="auto"/>
+        <w:rPr>
+          <w:sz w:val="22"/>
+          <w:szCs w:val="22"/>
+        </w:rPr>
+      </w:pPr>
+      <w:r>
+        <w:rPr>
+          <w:b/>
+          <w:bCs/>
+          <w:sz w:val="20"/>
+          <w:szCs w:val="20"/>
+        </w:rPr>
+        <w:t>Existing hive-monitoring systems</w:t>
+      </w:r>
+    </w:p>
+    <w:p>
+      <w:pPr>
         <w:tabs>
           <w:tab w:val="left" w:pos="510"/>
         </w:tabs>
@@ -4675,7 +4599,7 @@
           <w:szCs w:val="20"/>
         </w:rPr>
         <w:tab/>
-        <w:t xml:space="preserve">M. Bencsik, J. Bencsik, M. Baxter, A. Lucian, J. Romieu, and M. Millet, "Identification of the honey bee swarming process by </w:t>
+        <w:t xml:space="preserve">S. Cecchi, S. </w:t>
       </w:r>
       <w:proofErr w:type="spellStart"/>
       <w:r>
@@ -4683,7 +4607,7 @@
           <w:sz w:val="20"/>
           <w:szCs w:val="20"/>
         </w:rPr>
-        <w:t>analysing</w:t>
+        <w:t>Spinsante</w:t>
       </w:r>
       <w:proofErr w:type="spellEnd"/>
       <w:r>
@@ -4691,69 +4615,55 @@
           <w:sz w:val="20"/>
           <w:szCs w:val="20"/>
         </w:rPr>
-        <w:t xml:space="preserve"> the time course of hive vibrations," </w:t>
+        <w:t xml:space="preserve">, A. Terenzi, and S. </w:t>
       </w:r>
       <w:proofErr w:type="spellStart"/>
       <w:r>
         <w:rPr>
-          <w:i/>
-          <w:iCs/>
           <w:sz w:val="20"/>
           <w:szCs w:val="20"/>
         </w:rPr>
-        <w:t>Comput</w:t>
+        <w:t>Orcioni</w:t>
       </w:r>
       <w:proofErr w:type="spellEnd"/>
       <w:r>
         <w:rPr>
-          <w:i/>
-          <w:iCs/>
           <w:sz w:val="20"/>
           <w:szCs w:val="20"/>
         </w:rPr>
-        <w:t>. Electron. Agric.</w:t>
-      </w:r>
-      <w:r>
-        <w:rPr>
+        <w:t xml:space="preserve">, "A smart sensor-based measurement system for advanced bee hive monitoring," </w:t>
+      </w:r>
+      <w:r>
+        <w:rPr>
+          <w:i/>
+          <w:iCs/>
           <w:sz w:val="20"/>
           <w:szCs w:val="20"/>
         </w:rPr>
-        <w:t xml:space="preserve">, vol. 76, no. 1, pp. 44–50, 2011, </w:t>
-      </w:r>
-      <w:proofErr w:type="spellStart"/>
+        <w:t>Sensors</w:t>
+      </w:r>
       <w:r>
         <w:rPr>
           <w:sz w:val="20"/>
           <w:szCs w:val="20"/>
         </w:rPr>
-        <w:t>doi</w:t>
-      </w:r>
-      <w:proofErr w:type="spellEnd"/>
+        <w:t xml:space="preserve">, vol. 20, no. 9, Art. no. 2726, May 2020, </w:t>
+      </w:r>
+      <w:proofErr w:type="spellStart"/>
       <w:r>
         <w:rPr>
           <w:sz w:val="20"/>
           <w:szCs w:val="20"/>
         </w:rPr>
-        <w:t>: 10.1016/j.compag.2011.01.004.</w:t>
-      </w:r>
-    </w:p>
-    <w:p>
-      <w:pPr>
-        <w:keepNext/>
-        <w:spacing w:before="120" w:after="80" w:line="360" w:lineRule="auto"/>
-        <w:rPr>
-          <w:sz w:val="22"/>
-          <w:szCs w:val="22"/>
-        </w:rPr>
-      </w:pPr>
-      <w:r>
-        <w:rPr>
-          <w:b/>
-          <w:bCs/>
+        <w:t>doi</w:t>
+      </w:r>
+      <w:proofErr w:type="spellEnd"/>
+      <w:r>
+        <w:rPr>
           <w:sz w:val="20"/>
           <w:szCs w:val="20"/>
         </w:rPr>
-        <w:t>Existing hive-monitoring systems</w:t>
+        <w:t>: 10.3390/s20092726.</w:t>
       </w:r>
     </w:p>
     <w:p>
@@ -4782,7 +4692,6 @@
           <w:szCs w:val="20"/>
         </w:rPr>
         <w:tab/>
-        <w:t xml:space="preserve">S. Cecchi, S. </w:t>
       </w:r>
       <w:proofErr w:type="spellStart"/>
       <w:r>
@@ -4790,7 +4699,7 @@
           <w:sz w:val="20"/>
           <w:szCs w:val="20"/>
         </w:rPr>
-        <w:t>Spinsante</w:t>
+        <w:t>BeeHero</w:t>
       </w:r>
       <w:proofErr w:type="spellEnd"/>
       <w:r>
@@ -4798,55 +4707,26 @@
           <w:sz w:val="20"/>
           <w:szCs w:val="20"/>
         </w:rPr>
-        <w:t xml:space="preserve">, A. Terenzi, and S. </w:t>
-      </w:r>
-      <w:proofErr w:type="spellStart"/>
-      <w:r>
-        <w:rPr>
+        <w:t>, "Technology." [Online]. Available: https://www.beehero.io/technology</w:t>
+      </w:r>
+    </w:p>
+    <w:p>
+      <w:pPr>
+        <w:keepNext/>
+        <w:spacing w:before="120" w:after="80" w:line="360" w:lineRule="auto"/>
+        <w:rPr>
+          <w:sz w:val="22"/>
+          <w:szCs w:val="22"/>
+        </w:rPr>
+      </w:pPr>
+      <w:r>
+        <w:rPr>
+          <w:b/>
+          <w:bCs/>
           <w:sz w:val="20"/>
           <w:szCs w:val="20"/>
         </w:rPr>
-        <w:t>Orcioni</w:t>
-      </w:r>
-      <w:proofErr w:type="spellEnd"/>
-      <w:r>
-        <w:rPr>
-          <w:sz w:val="20"/>
-          <w:szCs w:val="20"/>
-        </w:rPr>
-        <w:t xml:space="preserve">, "A smart sensor-based measurement system for advanced bee hive monitoring," </w:t>
-      </w:r>
-      <w:r>
-        <w:rPr>
-          <w:i/>
-          <w:iCs/>
-          <w:sz w:val="20"/>
-          <w:szCs w:val="20"/>
-        </w:rPr>
-        <w:t>Sensors</w:t>
-      </w:r>
-      <w:r>
-        <w:rPr>
-          <w:sz w:val="20"/>
-          <w:szCs w:val="20"/>
-        </w:rPr>
-        <w:t xml:space="preserve">, vol. 20, no. 9, Art. no. 2726, May 2020, </w:t>
-      </w:r>
-      <w:proofErr w:type="spellStart"/>
-      <w:r>
-        <w:rPr>
-          <w:sz w:val="20"/>
-          <w:szCs w:val="20"/>
-        </w:rPr>
-        <w:t>doi</w:t>
-      </w:r>
-      <w:proofErr w:type="spellEnd"/>
-      <w:r>
-        <w:rPr>
-          <w:sz w:val="20"/>
-          <w:szCs w:val="20"/>
-        </w:rPr>
-        <w:t>: 10.3390/s20092726.</w:t>
+        <w:t>Design data: signal levels, communication and components</w:t>
       </w:r>
     </w:p>
     <w:p>
@@ -4875,6 +4755,7 @@
           <w:szCs w:val="20"/>
         </w:rPr>
         <w:tab/>
+        <w:t xml:space="preserve">M. Bencsik, Y. Le Conte, M. Reyes, M. Pioz, D. Whittaker, D. </w:t>
       </w:r>
       <w:proofErr w:type="spellStart"/>
       <w:r>
@@ -4882,7 +4763,7 @@
           <w:sz w:val="20"/>
           <w:szCs w:val="20"/>
         </w:rPr>
-        <w:t>BroodMinder</w:t>
+        <w:t>Crauser</w:t>
       </w:r>
       <w:proofErr w:type="spellEnd"/>
       <w:r>
@@ -4890,7 +4771,50 @@
           <w:sz w:val="20"/>
           <w:szCs w:val="20"/>
         </w:rPr>
-        <w:t>, "BroodMinder-W3 four point weight scale kit." [Online]. Available: https://workerandhive.com/products/broodminder-w3-four-point-weight-scale-kit</w:t>
+        <w:t xml:space="preserve">, N. Simon Delso, and M. I. Newton, "Honeybee colony vibrational measurements to highlight the brood cycle," </w:t>
+      </w:r>
+      <w:proofErr w:type="spellStart"/>
+      <w:r>
+        <w:rPr>
+          <w:i/>
+          <w:iCs/>
+          <w:sz w:val="20"/>
+          <w:szCs w:val="20"/>
+        </w:rPr>
+        <w:t>PLoS</w:t>
+      </w:r>
+      <w:proofErr w:type="spellEnd"/>
+      <w:r>
+        <w:rPr>
+          <w:i/>
+          <w:iCs/>
+          <w:sz w:val="20"/>
+          <w:szCs w:val="20"/>
+        </w:rPr>
+        <w:t xml:space="preserve"> ONE</w:t>
+      </w:r>
+      <w:r>
+        <w:rPr>
+          <w:sz w:val="20"/>
+          <w:szCs w:val="20"/>
+        </w:rPr>
+        <w:t xml:space="preserve">, vol. 10, no. 11, Art. no. e0141926, Nov. 2015, </w:t>
+      </w:r>
+      <w:proofErr w:type="spellStart"/>
+      <w:r>
+        <w:rPr>
+          <w:sz w:val="20"/>
+          <w:szCs w:val="20"/>
+        </w:rPr>
+        <w:t>doi</w:t>
+      </w:r>
+      <w:proofErr w:type="spellEnd"/>
+      <w:r>
+        <w:rPr>
+          <w:sz w:val="20"/>
+          <w:szCs w:val="20"/>
+        </w:rPr>
+        <w:t>: 10.1371/journal.pone.0141926.</w:t>
       </w:r>
     </w:p>
     <w:p>
@@ -4926,7 +4850,7 @@
           <w:sz w:val="20"/>
           <w:szCs w:val="20"/>
         </w:rPr>
-        <w:t>BeeHero</w:t>
+        <w:t>Espressif</w:t>
       </w:r>
       <w:proofErr w:type="spellEnd"/>
       <w:r>
@@ -4934,26 +4858,23 @@
           <w:sz w:val="20"/>
           <w:szCs w:val="20"/>
         </w:rPr>
-        <w:t>, "Technology." [Online]. Available: https://www.beehero.io/technology</w:t>
-      </w:r>
-    </w:p>
-    <w:p>
-      <w:pPr>
-        <w:keepNext/>
-        <w:spacing w:before="120" w:after="80" w:line="360" w:lineRule="auto"/>
-        <w:rPr>
-          <w:sz w:val="22"/>
-          <w:szCs w:val="22"/>
-        </w:rPr>
-      </w:pPr>
-      <w:r>
-        <w:rPr>
-          <w:b/>
-          <w:bCs/>
+        <w:t xml:space="preserve"> Systems, "ESP-NOW," in </w:t>
+      </w:r>
+      <w:r>
+        <w:rPr>
+          <w:i/>
+          <w:iCs/>
           <w:sz w:val="20"/>
           <w:szCs w:val="20"/>
         </w:rPr>
-        <w:t>Design data: signal levels, communication and components</w:t>
+        <w:t>ESP-IDF Programming Guide (ESP32-C3), v5.3.2</w:t>
+      </w:r>
+      <w:r>
+        <w:rPr>
+          <w:sz w:val="20"/>
+          <w:szCs w:val="20"/>
+        </w:rPr>
+        <w:t>. [Online]. Available: https://docs.espressif.com/projects/esp-idf/en/v5.3.2/esp32c3/api-reference/network/esp_now.html</w:t>
       </w:r>
     </w:p>
     <w:p>
@@ -4982,66 +4903,7 @@
           <w:szCs w:val="20"/>
         </w:rPr>
         <w:tab/>
-        <w:t xml:space="preserve">M. Bencsik, Y. Le Conte, M. Reyes, M. Pioz, D. Whittaker, D. </w:t>
-      </w:r>
-      <w:proofErr w:type="spellStart"/>
-      <w:r>
-        <w:rPr>
-          <w:sz w:val="20"/>
-          <w:szCs w:val="20"/>
-        </w:rPr>
-        <w:t>Crauser</w:t>
-      </w:r>
-      <w:proofErr w:type="spellEnd"/>
-      <w:r>
-        <w:rPr>
-          <w:sz w:val="20"/>
-          <w:szCs w:val="20"/>
-        </w:rPr>
-        <w:t xml:space="preserve">, N. Simon Delso, and M. I. Newton, "Honeybee colony vibrational measurements to highlight the brood cycle," </w:t>
-      </w:r>
-      <w:proofErr w:type="spellStart"/>
-      <w:r>
-        <w:rPr>
-          <w:i/>
-          <w:iCs/>
-          <w:sz w:val="20"/>
-          <w:szCs w:val="20"/>
-        </w:rPr>
-        <w:t>PLoS</w:t>
-      </w:r>
-      <w:proofErr w:type="spellEnd"/>
-      <w:r>
-        <w:rPr>
-          <w:i/>
-          <w:iCs/>
-          <w:sz w:val="20"/>
-          <w:szCs w:val="20"/>
-        </w:rPr>
-        <w:t xml:space="preserve"> ONE</w:t>
-      </w:r>
-      <w:r>
-        <w:rPr>
-          <w:sz w:val="20"/>
-          <w:szCs w:val="20"/>
-        </w:rPr>
-        <w:t xml:space="preserve">, vol. 10, no. 11, Art. no. e0141926, Nov. 2015, </w:t>
-      </w:r>
-      <w:proofErr w:type="spellStart"/>
-      <w:r>
-        <w:rPr>
-          <w:sz w:val="20"/>
-          <w:szCs w:val="20"/>
-        </w:rPr>
-        <w:t>doi</w:t>
-      </w:r>
-      <w:proofErr w:type="spellEnd"/>
-      <w:r>
-        <w:rPr>
-          <w:sz w:val="20"/>
-          <w:szCs w:val="20"/>
-        </w:rPr>
-        <w:t>: 10.1371/journal.pone.0141926.</w:t>
+        <w:t>Avia Semiconductor, "HX711: 24-bit analog-to-digital converter (ADC) for weigh scales," datasheet.</w:t>
       </w:r>
     </w:p>
     <w:p>
@@ -5063,95 +4925,6 @@
           <w:szCs w:val="20"/>
         </w:rPr>
         <w:t>[10]</w:t>
-      </w:r>
-      <w:r>
-        <w:rPr>
-          <w:sz w:val="20"/>
-          <w:szCs w:val="20"/>
-        </w:rPr>
-        <w:tab/>
-      </w:r>
-      <w:proofErr w:type="spellStart"/>
-      <w:r>
-        <w:rPr>
-          <w:sz w:val="20"/>
-          <w:szCs w:val="20"/>
-        </w:rPr>
-        <w:t>Espressif</w:t>
-      </w:r>
-      <w:proofErr w:type="spellEnd"/>
-      <w:r>
-        <w:rPr>
-          <w:sz w:val="20"/>
-          <w:szCs w:val="20"/>
-        </w:rPr>
-        <w:t xml:space="preserve"> Systems, "ESP-NOW," in </w:t>
-      </w:r>
-      <w:r>
-        <w:rPr>
-          <w:i/>
-          <w:iCs/>
-          <w:sz w:val="20"/>
-          <w:szCs w:val="20"/>
-        </w:rPr>
-        <w:t>ESP-IDF Programming Guide (ESP32-C3), v5.3.2</w:t>
-      </w:r>
-      <w:r>
-        <w:rPr>
-          <w:sz w:val="20"/>
-          <w:szCs w:val="20"/>
-        </w:rPr>
-        <w:t>. [Online]. Available: https://docs.espressif.com/projects/esp-idf/en/v5.3.2/esp32c3/api-reference/network/esp_now.html</w:t>
-      </w:r>
-    </w:p>
-    <w:p>
-      <w:pPr>
-        <w:tabs>
-          <w:tab w:val="left" w:pos="510"/>
-        </w:tabs>
-        <w:spacing w:after="80" w:line="360" w:lineRule="auto"/>
-        <w:ind w:left="510" w:hanging="510"/>
-        <w:jc w:val="both"/>
-        <w:rPr>
-          <w:sz w:val="22"/>
-          <w:szCs w:val="22"/>
-        </w:rPr>
-      </w:pPr>
-      <w:r>
-        <w:rPr>
-          <w:sz w:val="20"/>
-          <w:szCs w:val="20"/>
-        </w:rPr>
-        <w:t>[11]</w:t>
-      </w:r>
-      <w:r>
-        <w:rPr>
-          <w:sz w:val="20"/>
-          <w:szCs w:val="20"/>
-        </w:rPr>
-        <w:tab/>
-        <w:t>Avia Semiconductor, "HX711: 24-bit analog-to-digital converter (ADC) for weigh scales," datasheet.</w:t>
-      </w:r>
-    </w:p>
-    <w:p>
-      <w:pPr>
-        <w:tabs>
-          <w:tab w:val="left" w:pos="510"/>
-        </w:tabs>
-        <w:spacing w:after="80" w:line="360" w:lineRule="auto"/>
-        <w:ind w:left="510" w:hanging="510"/>
-        <w:jc w:val="both"/>
-        <w:rPr>
-          <w:sz w:val="22"/>
-          <w:szCs w:val="22"/>
-        </w:rPr>
-      </w:pPr>
-      <w:r>
-        <w:rPr>
-          <w:sz w:val="20"/>
-          <w:szCs w:val="20"/>
-        </w:rPr>
-        <w:t>[12]</w:t>
       </w:r>
       <w:r>
         <w:rPr>

</xml_diff>

<commit_message>
vault backup: 2026-10-25 17:00:00
Affected files:
.obsidian/plugins/word-reader/data.json
docs/pdr-2027-165.docx
</commit_message>
<xml_diff>
--- a/docs/pdr-2027-165.docx
+++ b/docs/pdr-2027-165.docx
@@ -1255,23 +1255,7 @@
           <w:sz w:val="22"/>
           <w:szCs w:val="22"/>
         </w:rPr>
-        <w:t xml:space="preserve">Honeybee colonies are inspected mostly by opening the hive every few weeks to months; inspections disturb the colony, cost </w:t>
-      </w:r>
-      <w:proofErr w:type="spellStart"/>
-      <w:r>
-        <w:rPr>
-          <w:sz w:val="22"/>
-          <w:szCs w:val="22"/>
-        </w:rPr>
-        <w:t>labor</w:t>
-      </w:r>
-      <w:proofErr w:type="spellEnd"/>
-      <w:r>
-        <w:rPr>
-          <w:sz w:val="22"/>
-          <w:szCs w:val="22"/>
-        </w:rPr>
-        <w:t>, and leave the beekeeper blind between visits. Precision beekeeping, i.e. monitoring colonies with sensors so that interventions are based on data, was proposed to close this gap [1]. Swarming is the costliest blind spot: the colony rears new queens for one to two weeks, the prime swarm leaves with the old queen once the queen cells are capped, clusters nearby for a few hours, and is then lost. Hive vibrations change measurably before swarming [2], [3], and continuous hive weight reveals foraging, consumption and swarm departures [4]. Initial use case: a beekeeper with many hives standing close together at a remote apiary without mains power or Wi-Fi, visiting every few weeks. The system must alert before a swarm leaves or a colony behaves abnormally, and show which hives need a visit first. Applications: commercial and hobby apiaries, pollination services, and research apiaries that need long continuous records.</w:t>
+        <w:t>Honeybee colonies are inspected mostly by opening the hive every few weeks to months; inspections disturb the colony, cost labor, and leave the beekeeper blind between visits. Precision beekeeping, i.e. monitoring colonies with sensors so that interventions are based on data, was proposed to close this gap [1]. Swarming is the costliest blind spot: the colony rears new queens for one to two weeks, the prime swarm leaves with the old queen once the queen cells are capped, clusters nearby for a few hours, and is then lost. Hive vibrations change measurably before swarming [2], [3], and continuous hive weight reveals foraging, consumption and swarm departures [4]. Initial use case: a beekeeper with many hives standing close together at a remote apiary without mains power or Wi-Fi, visiting every few weeks. The system must alert before a swarm leaves or a colony behaves abnormally, and show which hives need a visit first. Applications: commercial and hobby apiaries, pollination services, and research apiaries that need long continuous records.</w:t>
       </w:r>
     </w:p>
     <w:p>
@@ -1607,21 +1591,26 @@
           <w:szCs w:val="22"/>
         </w:rPr>
       </w:pPr>
-      <w:proofErr w:type="spellStart"/>
-      <w:proofErr w:type="spellEnd"/>
-      <w:proofErr w:type="spellStart"/>
-      <w:proofErr w:type="spellEnd"/>
-      <w:r>
-        <w:rPr>
-          <w:b w:val="0"/>
-          <w:bCs w:val="0"/>
-          <w:i w:val="0"/>
-          <w:iCs w:val="0"/>
-          <w:sz w:val="22"/>
-          <w:szCs w:val="22"/>
-          <w:rtl w:val="0"/>
-        </w:rPr>
-        <w:t xml:space="preserve">Ferrari et al. found with in-hive microphones that the power spectral density near 110 Hz rises, and shifts upward in frequency, before swarming [2]. Ramsey et al. placed accelerometers in the heart of the colony and, by tracking how the vibrational spectra evolve, identified colonies preparing to swarm with more than 90% accuracy, up to 30 days ahead [3]. Cecchi et al. built a multi-sensor hive with microphones, weighing to ±10 g and CO₂, but each hive used a Raspberry Pi drawing about 4 W from mains power [5]. Commercially, BeeHero in-hive sensors measure acoustics and climate and report over Bluetooth Low Energy to a cellular gateway in a closed system [6] (Table I).</w:t>
+      <w:r>
+        <w:rPr>
+          <w:sz w:val="22"/>
+          <w:szCs w:val="22"/>
+        </w:rPr>
+        <w:t>Ferrari et al. found with in-hive microphones that the power spectral density near 110 Hz rises, and shifts upward in frequency, before swarming [2]. Ramsey et al. placed accelerometers in the heart of the colony and, by tracking how the vibrational spectra evolve, identified colonies preparing to swarm with more than 90% accuracy, up to 30 days ahead [3]. Cecchi et al. built a multi-sensor hive with microphones, weighing to ±10 g and CO₂</w:t>
+      </w:r>
+      <w:r>
+        <w:rPr>
+          <w:sz w:val="22"/>
+          <w:szCs w:val="22"/>
+        </w:rPr>
+        <w:t xml:space="preserve"> (why CO2) </w:t>
+      </w:r>
+      <w:r>
+        <w:rPr>
+          <w:sz w:val="22"/>
+          <w:szCs w:val="22"/>
+        </w:rPr>
+        <w:t>, but each hive used a Raspberry Pi drawing about 4 W from mains power [5]. Commercially, BeeHero in-hive sensors measure acoustics and climate and report over Bluetooth Low Energy to a cellular gateway in a closed system [6] (Table I).</w:t>
       </w:r>
     </w:p>
     <w:p>
@@ -1679,13 +1668,10 @@
               <w:rPr>
                 <w:b/>
                 <w:bCs/>
-                <w:i w:val="0"/>
-                <w:iCs w:val="0"/>
                 <w:sz w:val="18"/>
                 <w:szCs w:val="18"/>
-                <w:rtl w:val="0"/>
-              </w:rPr>
-              <w:t xml:space="preserve">Comparator</w:t>
+              </w:rPr>
+              <w:t>Comparator</w:t>
             </w:r>
           </w:p>
         </w:tc>
@@ -1704,13 +1690,10 @@
               <w:rPr>
                 <w:b/>
                 <w:bCs/>
-                <w:i w:val="0"/>
-                <w:iCs w:val="0"/>
                 <w:sz w:val="18"/>
                 <w:szCs w:val="18"/>
-                <w:rtl w:val="0"/>
-              </w:rPr>
-              <w:t xml:space="preserve">Relevant capability</w:t>
+              </w:rPr>
+              <w:t>Relevant capability</w:t>
             </w:r>
           </w:p>
         </w:tc>
@@ -1725,19 +1708,14 @@
               <w:spacing w:after="0" w:line="240" w:lineRule="auto"/>
               <w:jc w:val="center"/>
             </w:pPr>
-            <w:proofErr w:type="spellStart"/>
-            <w:proofErr w:type="spellEnd"/>
             <w:r>
               <w:rPr>
                 <w:b/>
                 <w:bCs/>
-                <w:i w:val="0"/>
-                <w:iCs w:val="0"/>
                 <w:sz w:val="18"/>
                 <w:szCs w:val="18"/>
-                <w:rtl w:val="0"/>
-              </w:rPr>
-              <w:t xml:space="preserve">What BeeSense must show</w:t>
+              </w:rPr>
+              <w:t>What BeeSense must show</w:t>
             </w:r>
           </w:p>
         </w:tc>
@@ -1758,13 +1736,10 @@
             </w:pPr>
             <w:r>
               <w:rPr>
-                <w:i w:val="0"/>
-                <w:iCs w:val="0"/>
                 <w:sz w:val="18"/>
                 <w:szCs w:val="18"/>
-                <w:rtl w:val="0"/>
-              </w:rPr>
-              <w:t xml:space="preserve">Ferrari [2], Ramsey [3]</w:t>
+              </w:rPr>
+              <w:t>Ferrari [2], Ramsey [3]</w:t>
             </w:r>
           </w:p>
         </w:tc>
@@ -1780,13 +1755,10 @@
             </w:pPr>
             <w:r>
               <w:rPr>
-                <w:i w:val="0"/>
-                <w:iCs w:val="0"/>
                 <w:sz w:val="18"/>
                 <w:szCs w:val="18"/>
-                <w:rtl w:val="0"/>
-              </w:rPr>
-              <w:t xml:space="preserve">Sound/vibration features precede swarming</w:t>
+              </w:rPr>
+              <w:t>Sound/vibration features precede swarming</w:t>
             </w:r>
           </w:p>
         </w:tc>
@@ -1802,13 +1774,10 @@
             </w:pPr>
             <w:r>
               <w:rPr>
-                <w:i w:val="0"/>
-                <w:iCs w:val="0"/>
                 <w:sz w:val="18"/>
                 <w:szCs w:val="18"/>
-                <w:rtl w:val="0"/>
-              </w:rPr>
-              <w:t xml:space="preserve">Same features on a battery node, in the field</w:t>
+              </w:rPr>
+              <w:t>Same features on a battery node, in the field</w:t>
             </w:r>
           </w:p>
         </w:tc>
@@ -1829,13 +1798,10 @@
             </w:pPr>
             <w:r>
               <w:rPr>
-                <w:i w:val="0"/>
-                <w:iCs w:val="0"/>
                 <w:sz w:val="18"/>
                 <w:szCs w:val="18"/>
-                <w:rtl w:val="0"/>
-              </w:rPr>
-              <w:t xml:space="preserve">Cecchi et al. [5]</w:t>
+              </w:rPr>
+              <w:t>Cecchi et al. [5]</w:t>
             </w:r>
           </w:p>
         </w:tc>
@@ -1850,12 +1816,7 @@
               <w:jc w:val="center"/>
             </w:pPr>
             <w:r>
-              <w:rPr>
-                <w:i w:val="0"/>
-                <w:iCs w:val="0"/>
-                <w:rtl w:val="0"/>
-              </w:rPr>
-              <w:t xml:space="preserve">Microphones, weight ±10 g, CO₂; mains, ~4 W per hive</w:t>
+              <w:t>Microphones, weight ±10 g, CO₂; mains, ~4 W per hive</w:t>
             </w:r>
           </w:p>
         </w:tc>
@@ -1869,17 +1830,12 @@
               <w:spacing w:after="0" w:line="240" w:lineRule="auto"/>
               <w:jc w:val="center"/>
             </w:pPr>
-            <w:proofErr w:type="spellStart"/>
-            <w:proofErr w:type="spellEnd"/>
             <w:r>
               <w:rPr>
-                <w:i w:val="0"/>
-                <w:iCs w:val="0"/>
                 <w:sz w:val="18"/>
                 <w:szCs w:val="18"/>
-                <w:rtl w:val="0"/>
-              </w:rPr>
-              <w:t xml:space="preserve">Battery operation, ~1 mW average power</w:t>
+              </w:rPr>
+              <w:t>Battery operation, ~1 mW average power</w:t>
             </w:r>
           </w:p>
         </w:tc>
@@ -1897,17 +1853,12 @@
             <w:pPr>
               <w:spacing w:after="0" w:line="240" w:lineRule="auto"/>
             </w:pPr>
-            <w:proofErr w:type="spellStart"/>
-            <w:proofErr w:type="spellEnd"/>
             <w:r>
               <w:rPr>
-                <w:i w:val="0"/>
-                <w:iCs w:val="0"/>
                 <w:sz w:val="18"/>
                 <w:szCs w:val="18"/>
-                <w:rtl w:val="0"/>
-              </w:rPr>
-              <w:t xml:space="preserve">BeeHero [6]</w:t>
+              </w:rPr>
+              <w:t>BeeHero [6]</w:t>
             </w:r>
           </w:p>
         </w:tc>
@@ -1922,13 +1873,10 @@
             </w:pPr>
             <w:r>
               <w:rPr>
-                <w:i w:val="0"/>
-                <w:iCs w:val="0"/>
                 <w:sz w:val="18"/>
                 <w:szCs w:val="18"/>
-                <w:rtl w:val="0"/>
-              </w:rPr>
-              <w:t xml:space="preserve">In-hive acoustics and climate, BLE + cellular gateway</w:t>
+              </w:rPr>
+              <w:t>In-hive acoustics and climate, BLE + cellular gateway</w:t>
             </w:r>
           </w:p>
         </w:tc>
@@ -1943,13 +1891,10 @@
             </w:pPr>
             <w:r>
               <w:rPr>
-                <w:i w:val="0"/>
-                <w:iCs w:val="0"/>
                 <w:sz w:val="18"/>
                 <w:szCs w:val="18"/>
-                <w:rtl w:val="0"/>
-              </w:rPr>
-              <w:t xml:space="preserve">Open, measured pipeline; weight + vibration fusion</w:t>
+              </w:rPr>
+              <w:t>Open, measured pipeline; weight + vibration fusion</w:t>
             </w:r>
           </w:p>
         </w:tc>
@@ -2142,15 +2087,7 @@
           <w:sz w:val="22"/>
           <w:szCs w:val="22"/>
         </w:rPr>
-        <w:t xml:space="preserve"> ≈ 1.95 Hz) using a fixed-point FFT, </w:t>
-      </w:r>
-      <w:r>
-        <w:rPr>
-          <w:sz w:val="22"/>
-          <w:szCs w:val="22"/>
-        </w:rPr>
-        <w:lastRenderedPageBreak/>
-        <w:t xml:space="preserve">since the C3 has no floating-point unit, and reduced to </w:t>
+        <w:t xml:space="preserve"> ≈ 1.95 Hz) using a fixed-point FFT, since the C3 has no floating-point unit, and reduced to </w:t>
       </w:r>
       <w:r>
         <w:rPr>
@@ -2230,6 +2167,7 @@
           <w:sz w:val="22"/>
           <w:szCs w:val="22"/>
         </w:rPr>
+        <w:lastRenderedPageBreak/>
         <w:tab/>
         <w:t>e</w:t>
       </w:r>
@@ -3377,15 +3315,7 @@
           <w:sz w:val="22"/>
           <w:szCs w:val="22"/>
         </w:rPr>
-        <w:t xml:space="preserve"> = 0.8 lasts </w:t>
-      </w:r>
-      <w:r>
-        <w:rPr>
-          <w:sz w:val="22"/>
-          <w:szCs w:val="22"/>
-        </w:rPr>
-        <w:lastRenderedPageBreak/>
-        <w:t xml:space="preserve">≈285 days; each extra event wake costs ≈3.4 µA, so the six-month target holds up to ≈60 event wakes per day (Fig. 2), which the adaptive threshold and 20-min hold-off keep well below. </w:t>
+        <w:t xml:space="preserve"> = 0.8 lasts ≈285 days; each extra event wake costs ≈3.4 µA, so the six-month target holds up to ≈60 event wakes per day (Fig. 2), which the adaptive threshold and 20-min hold-off keep well below. </w:t>
       </w:r>
       <w:r>
         <w:rPr>
@@ -3452,6 +3382,7 @@
           <w:sz w:val="22"/>
           <w:szCs w:val="22"/>
         </w:rPr>
+        <w:lastRenderedPageBreak/>
         <w:drawing>
           <wp:inline distT="0" distB="0" distL="114300" distR="114300" wp14:anchorId="430EDE66" wp14:editId="2C76C30D">
             <wp:extent cx="4572000" cy="1270000"/>
@@ -3548,23 +3479,7 @@
           <w:sz w:val="22"/>
           <w:szCs w:val="22"/>
         </w:rPr>
-        <w:t xml:space="preserve"> weighing linearity with reference masses (0–100 kg) and a temperature sweep; piezo and wake chains checked with known tones (100–800 Hz) and bursts from a shaker coupled to a frame; average current measured with a power </w:t>
-      </w:r>
-      <w:proofErr w:type="spellStart"/>
-      <w:r>
-        <w:rPr>
-          <w:sz w:val="22"/>
-          <w:szCs w:val="22"/>
-        </w:rPr>
-        <w:t>analyzer</w:t>
-      </w:r>
-      <w:proofErr w:type="spellEnd"/>
-      <w:r>
-        <w:rPr>
-          <w:sz w:val="22"/>
-          <w:szCs w:val="22"/>
-        </w:rPr>
-        <w:t xml:space="preserve"> over full cycles. </w:t>
+        <w:t xml:space="preserve"> weighing linearity with reference masses (0–100 kg) and a temperature sweep; piezo and wake chains checked with known tones (100–800 Hz) and bursts from a shaker coupled to a frame; average current measured with a power analyzer over full cycles. </w:t>
       </w:r>
       <w:r>
         <w:rPr>

</xml_diff>

<commit_message>
vault backup: 2026-10-25 17:24:01
Affected files:
.obsidian/plugins/word-reader/data.json
docs/pdr-2027-165.docx
docs/~$r-2027-165.docx
</commit_message>
<xml_diff>
--- a/docs/pdr-2027-165.docx
+++ b/docs/pdr-2027-165.docx
@@ -78,8 +78,13 @@
         <w:jc w:val="center"/>
       </w:pPr>
       <w:r>
-        <w:t>Ben-Gurion University of the Negev</w:t>
-      </w:r>
+        <w:t xml:space="preserve">Ben-Gurion University of </w:t>
+      </w:r>
+      <w:proofErr w:type="gramStart"/>
+      <w:r>
+        <w:t>the Negev</w:t>
+      </w:r>
+      <w:proofErr w:type="gramEnd"/>
     </w:p>
     <w:p>
       <w:pPr>
@@ -688,6 +693,7 @@
       </w:pPr>
       <w:r>
         <w:rPr>
+          <w:i/>
           <w:sz w:val="22"/>
           <w:szCs w:val="22"/>
         </w:rPr>
@@ -1047,6 +1053,7 @@
       </w:pPr>
       <w:r>
         <w:rPr>
+          <w:i/>
           <w:sz w:val="22"/>
           <w:szCs w:val="22"/>
         </w:rPr>
@@ -1119,7 +1126,23 @@
           <w:sz w:val="22"/>
           <w:szCs w:val="22"/>
         </w:rPr>
-        <w:t xml:space="preserve">Honeybee colonies are checked mainly by opening the hive every few weeks to months, leaving the beekeeper blind between visits. Swarm preparation takes one to two weeks, and the swarm, taking a large part of the colony, leaves within minutes and is often discovered only at the next visit. </w:t>
+        <w:t xml:space="preserve">Honeybee colonies are checked mainly by opening the hive every few weeks to months, leaving the beekeeper blind between visits. Swarm preparation takes one to two weeks, and the swarm, taking a large part of the colony, leaves within minutes and is often discovered only </w:t>
+      </w:r>
+      <w:proofErr w:type="gramStart"/>
+      <w:r>
+        <w:rPr>
+          <w:sz w:val="22"/>
+          <w:szCs w:val="22"/>
+        </w:rPr>
+        <w:t>at</w:t>
+      </w:r>
+      <w:proofErr w:type="gramEnd"/>
+      <w:r>
+        <w:rPr>
+          <w:sz w:val="22"/>
+          <w:szCs w:val="22"/>
+        </w:rPr>
+        <w:t xml:space="preserve"> the next visit. </w:t>
       </w:r>
       <w:proofErr w:type="spellStart"/>
       <w:r>
@@ -1202,16 +1225,29 @@
         </w:rPr>
       </w:pPr>
       <w:proofErr w:type="spellStart"/>
+      <w:proofErr w:type="spellEnd"/>
       <w:r>
         <w:rPr>
           <w:b/>
           <w:bCs/>
-          <w:sz w:val="22"/>
-          <w:szCs w:val="22"/>
-        </w:rPr>
-        <w:t>BeeSense</w:t>
-      </w:r>
-      <w:proofErr w:type="spellEnd"/>
+          <w:i w:val="0"/>
+          <w:iCs w:val="0"/>
+          <w:sz w:val="22"/>
+          <w:szCs w:val="22"/>
+          <w:rtl w:val="0"/>
+        </w:rPr>
+        <w:t xml:space="preserve">BeeSense — IoT-Based Acoustic and Weight Monitoring of Honeybee Colonies</w:t>
+      </w:r>
+    </w:p>
+    <w:p>
+      <w:pPr>
+        <w:keepNext/>
+        <w:spacing w:before="40" w:after="0" w:line="360" w:lineRule="auto"/>
+        <w:rPr>
+          <w:sz w:val="22"/>
+          <w:szCs w:val="22"/>
+        </w:rPr>
+      </w:pPr>
       <w:r>
         <w:rPr>
           <w:b/>
@@ -1219,7 +1255,24 @@
           <w:sz w:val="22"/>
           <w:szCs w:val="22"/>
         </w:rPr>
-        <w:t xml:space="preserve"> – event-driven vibration and weight monitoring of honeybee hives</w:t>
+        <w:t>1.1 Motivation, Use Case and Applications</w:t>
+      </w:r>
+    </w:p>
+    <w:p>
+      <w:pPr>
+        <w:spacing w:after="20" w:line="360" w:lineRule="auto"/>
+        <w:jc w:val="both"/>
+        <w:rPr>
+          <w:sz w:val="22"/>
+          <w:szCs w:val="22"/>
+        </w:rPr>
+      </w:pPr>
+      <w:r>
+        <w:rPr>
+          <w:sz w:val="22"/>
+          <w:szCs w:val="22"/>
+        </w:rPr>
+        <w:t>Honeybee colonies are inspected mostly by opening the hive every few weeks to months; inspections disturb the colony, cost labor, and leave the beekeeper blind between visits. Precision beekeeping, i.e. monitoring colonies with sensors so that interventions are based on data, was proposed to close this gap [1]. Swarming is the costliest blind spot: the colony rears new queens for one to two weeks, the prime swarm leaves with the old queen once the queen cells are capped, clusters nearby for a few hours, and is then lost. Hive vibrations change measurably before swarming [2], [3], and continuous hive weight reveals foraging, consumption and swarm departures [4]. Initial use case: a beekeeper with many hives standing close together at a remote apiary without mains power or Wi-Fi, visiting every few weeks. The system must alert before a swarm leaves or a colony behaves abnormally, and show which hives need a visit first. Applications: commercial and hobby apiaries, pollination services, and research apiaries that need long continuous records.</w:t>
       </w:r>
     </w:p>
     <w:p>
@@ -1238,7 +1291,7 @@
           <w:sz w:val="22"/>
           <w:szCs w:val="22"/>
         </w:rPr>
-        <w:t>1.1 Motivation, Use Case and Applications</w:t>
+        <w:t>1.2 Objectives and Work Stages</w:t>
       </w:r>
     </w:p>
     <w:p>
@@ -1252,10 +1305,97 @@
       </w:pPr>
       <w:r>
         <w:rPr>
-          <w:sz w:val="22"/>
-          <w:szCs w:val="22"/>
-        </w:rPr>
-        <w:t>Honeybee colonies are inspected mostly by opening the hive every few weeks to months; inspections disturb the colony, cost labor, and leave the beekeeper blind between visits. Precision beekeeping, i.e. monitoring colonies with sensors so that interventions are based on data, was proposed to close this gap [1]. Swarming is the costliest blind spot: the colony rears new queens for one to two weeks, the prime swarm leaves with the old queen once the queen cells are capped, clusters nearby for a few hours, and is then lost. Hive vibrations change measurably before swarming [2], [3], and continuous hive weight reveals foraging, consumption and swarm departures [4]. Initial use case: a beekeeper with many hives standing close together at a remote apiary without mains power or Wi-Fi, visiting every few weeks. The system must alert before a swarm leaves or a colony behaves abnormally, and show which hives need a visit first. Applications: commercial and hobby apiaries, pollination services, and research apiaries that need long continuous records.</w:t>
+          <w:b w:val="1"/>
+          <w:bCs w:val="1"/>
+          <w:i w:val="0"/>
+          <w:iCs w:val="0"/>
+          <w:sz w:val="22"/>
+          <w:szCs w:val="22"/>
+          <w:rtl w:val="0"/>
+        </w:rPr>
+        <w:t xml:space="preserve">Objectives:</w:t>
+      </w:r>
+      <w:r>
+        <w:rPr>
+          <w:b w:val="0"/>
+          <w:bCs w:val="0"/>
+          <w:i w:val="0"/>
+          <w:iCs w:val="0"/>
+          <w:sz w:val="22"/>
+          <w:szCs w:val="22"/>
+          <w:rtl w:val="0"/>
+        </w:rPr>
+        <w:t xml:space="preserve"> (1) alert the beekeeper before a swarm leaves, with precision and recall above 90%; how early this is possible is the research question;</w:t>
+      </w:r>
+    </w:p>
+    <w:p>
+      <w:pPr>
+        <w:spacing w:after="20" w:line="360" w:lineRule="auto"/>
+        <w:jc w:val="both"/>
+        <w:rPr>
+          <w:sz w:val="22"/>
+          <w:szCs w:val="22"/>
+        </w:rPr>
+      </w:pPr>
+      <w:r>
+        <w:rPr>
+          <w:b w:val="0"/>
+          <w:bCs w:val="0"/>
+          <w:i w:val="0"/>
+          <w:iCs w:val="0"/>
+          <w:sz w:val="22"/>
+          <w:szCs w:val="22"/>
+          <w:rtl w:val="0"/>
+        </w:rPr>
+        <w:t xml:space="preserve">(2) operate autonomously at an apiary without mains power or network: node battery life of at least six months, packet delivery of at least 95%, and 30 days without intervention;</w:t>
+      </w:r>
+    </w:p>
+    <w:p>
+      <w:pPr>
+        <w:spacing w:after="20" w:line="360" w:lineRule="auto"/>
+        <w:jc w:val="both"/>
+        <w:rPr>
+          <w:sz w:val="22"/>
+          <w:szCs w:val="22"/>
+        </w:rPr>
+      </w:pPr>
+      <w:r>
+        <w:rPr>
+          <w:b w:val="0"/>
+          <w:bCs w:val="0"/>
+          <w:i w:val="0"/>
+          <w:iCs w:val="0"/>
+          <w:sz w:val="22"/>
+          <w:szCs w:val="22"/>
+          <w:rtl w:val="0"/>
+        </w:rPr>
+        <w:t xml:space="preserve">(3) measure each colony accurately: weight within ±20 g, vibration and sound spectra and temperature, shown per hive on a web dashboard.</w:t>
+      </w:r>
+    </w:p>
+    <w:p>
+      <w:pPr>
+        <w:spacing w:after="20" w:line="360" w:lineRule="auto"/>
+        <w:jc w:val="both"/>
+        <w:rPr>
+          <w:sz w:val="22"/>
+          <w:szCs w:val="22"/>
+        </w:rPr>
+      </w:pPr>
+      <w:r>
+        <w:rPr>
+          <w:b/>
+          <w:bCs/>
+          <w:sz w:val="22"/>
+          <w:szCs w:val="22"/>
+        </w:rPr>
+        <w:t>Stages:</w:t>
+      </w:r>
+      <w:r>
+        <w:rPr>
+          <w:sz w:val="22"/>
+          <w:szCs w:val="22"/>
+        </w:rPr>
+        <w:t xml:space="preserve"> (1) requirements with the beekeeper and bench tests of each sensor chain and of the node's energy use; (2) build the node and test the link at the apiary; (3) build the hub, detection and dashboard, and install on hives before spring; (4) field evaluation.</w:t>
       </w:r>
     </w:p>
     <w:p>
@@ -1274,7 +1414,7 @@
           <w:sz w:val="22"/>
           <w:szCs w:val="22"/>
         </w:rPr>
-        <w:t>1.2 Objectives and Work Stages</w:t>
+        <w:t>1.3 Technology and Interfaces</w:t>
       </w:r>
     </w:p>
     <w:p>
@@ -1288,176 +1428,73 @@
       </w:pPr>
       <w:r>
         <w:rPr>
-          <w:b/>
-          <w:bCs/>
-          <w:sz w:val="22"/>
-          <w:szCs w:val="22"/>
-        </w:rPr>
-        <w:t>Objectives:</w:t>
-      </w:r>
-      <w:r>
-        <w:rPr>
-          <w:sz w:val="22"/>
-          <w:szCs w:val="22"/>
-        </w:rPr>
-        <w:t xml:space="preserve"> (1) a battery-powered hive node that wakes on events, measures vibration, sound, weight and temperature, and lasts at least six months per charge (targets in Section 3.3);</w:t>
-      </w:r>
-    </w:p>
-    <w:p>
-      <w:pPr>
-        <w:spacing w:after="20" w:line="360" w:lineRule="auto"/>
-        <w:jc w:val="both"/>
-        <w:rPr>
-          <w:sz w:val="22"/>
-          <w:szCs w:val="22"/>
-        </w:rPr>
-      </w:pPr>
-      <w:r>
-        <w:rPr>
-          <w:sz w:val="22"/>
-          <w:szCs w:val="22"/>
-        </w:rPr>
-        <w:t>(2) a reliable link from the hives to a solar-powered hub that uploads the data over the cellular network to a web dashboard;</w:t>
-      </w:r>
-    </w:p>
-    <w:p>
-      <w:pPr>
-        <w:spacing w:after="20" w:line="360" w:lineRule="auto"/>
-        <w:jc w:val="both"/>
-        <w:rPr>
-          <w:sz w:val="22"/>
-          <w:szCs w:val="22"/>
-        </w:rPr>
-      </w:pPr>
-      <w:r>
-        <w:rPr>
-          <w:sz w:val="22"/>
-          <w:szCs w:val="22"/>
-        </w:rPr>
-        <w:t>(3) alerts on approaching swarms before the swarm leaves; how early this is possible is the research question.</w:t>
-      </w:r>
-    </w:p>
-    <w:p>
-      <w:pPr>
-        <w:spacing w:after="20" w:line="360" w:lineRule="auto"/>
-        <w:jc w:val="both"/>
-        <w:rPr>
-          <w:sz w:val="22"/>
-          <w:szCs w:val="22"/>
-        </w:rPr>
-      </w:pPr>
-      <w:r>
-        <w:rPr>
-          <w:b/>
-          <w:bCs/>
-          <w:sz w:val="22"/>
-          <w:szCs w:val="22"/>
-        </w:rPr>
-        <w:t>Stages:</w:t>
-      </w:r>
-      <w:r>
-        <w:rPr>
-          <w:sz w:val="22"/>
-          <w:szCs w:val="22"/>
-        </w:rPr>
-        <w:t xml:space="preserve"> (1) requirements with the beekeeper and bench tests of each sensor chain and of the node's energy use; (2) build the node and test the link at the apiary; (3) build the hub, detection and dashboard, and install on hives before spring; (4) field evaluation.</w:t>
-      </w:r>
-    </w:p>
-    <w:p>
-      <w:pPr>
-        <w:keepNext/>
-        <w:spacing w:before="40" w:after="0" w:line="360" w:lineRule="auto"/>
-        <w:rPr>
-          <w:sz w:val="22"/>
-          <w:szCs w:val="22"/>
-        </w:rPr>
-      </w:pPr>
-      <w:r>
-        <w:rPr>
-          <w:b/>
-          <w:bCs/>
-          <w:sz w:val="22"/>
-          <w:szCs w:val="22"/>
-        </w:rPr>
-        <w:t>1.3 Technology and Interfaces</w:t>
-      </w:r>
-    </w:p>
-    <w:p>
-      <w:pPr>
-        <w:spacing w:after="20" w:line="360" w:lineRule="auto"/>
-        <w:jc w:val="both"/>
-        <w:rPr>
-          <w:sz w:val="22"/>
-          <w:szCs w:val="22"/>
-        </w:rPr>
-      </w:pPr>
-      <w:r>
-        <w:rPr>
-          <w:i/>
-          <w:iCs/>
-          <w:sz w:val="22"/>
-          <w:szCs w:val="22"/>
-        </w:rPr>
-        <w:t>Hive node:</w:t>
-      </w:r>
-      <w:r>
-        <w:rPr>
-          <w:sz w:val="22"/>
-          <w:szCs w:val="22"/>
-        </w:rPr>
-        <w:t xml:space="preserve"> an ESP32-C3 microcontroller board powered by one 18650 Li-ion cell, with four sensors: (a) a 27 mm piezoelectric disc pressed into the comb at the </w:t>
-      </w:r>
-      <w:r>
-        <w:rPr>
-          <w:sz w:val="22"/>
-          <w:szCs w:val="22"/>
-        </w:rPr>
-        <w:t>center</w:t>
-      </w:r>
-      <w:r>
-        <w:rPr>
-          <w:sz w:val="22"/>
-          <w:szCs w:val="22"/>
-        </w:rPr>
-        <w:t xml:space="preserve"> of the hive, where comb vibration is strongest (Section 3.2); (b) a small digital MEMS microphone inside the hive, behind a mesh; (c) four 50 kg load cells under the hive with an HX711 weighing ADC; and (d) DS18B20 temperature probes. The piezo disc also feeds a low-power wake circuit (≈2 µA) that wakes the node when vibration jumps above its usual level; an amplifier prepares the signal for the ADC only while recording. The C3 has no floating-point unit, so the spectra are computed with a fixed-point FFT, the usual practice on small microcontrollers. </w:t>
-      </w:r>
-      <w:r>
-        <w:rPr>
-          <w:i/>
-          <w:iCs/>
-          <w:sz w:val="22"/>
-          <w:szCs w:val="22"/>
-        </w:rPr>
-        <w:t>Hub:</w:t>
-      </w:r>
-      <w:r>
-        <w:rPr>
-          <w:sz w:val="22"/>
-          <w:szCs w:val="22"/>
-        </w:rPr>
-        <w:t xml:space="preserve"> an ESP32-S3 board at the apiary receives the nodes over ESP-NOW, a direct Wi-Fi radio link that needs no router, uploads over a cellular modem, and runs from an 18 V / 15 W solar panel with a charger and battery. Because the hives stand close together, one hub and one SIM </w:t>
-      </w:r>
-      <w:r>
-        <w:rPr>
-          <w:sz w:val="22"/>
-          <w:szCs w:val="22"/>
-        </w:rPr>
-        <w:lastRenderedPageBreak/>
-        <w:t xml:space="preserve">serve a group of hives. </w:t>
-      </w:r>
-      <w:r>
-        <w:rPr>
-          <w:i/>
-          <w:iCs/>
-          <w:sz w:val="22"/>
-          <w:szCs w:val="22"/>
-        </w:rPr>
-        <w:t>Interfaces:</w:t>
-      </w:r>
-      <w:r>
-        <w:rPr>
-          <w:sz w:val="22"/>
-          <w:szCs w:val="22"/>
+          <w:b w:val="0"/>
+          <w:bCs w:val="0"/>
+          <w:i w:val="1"/>
+          <w:iCs w:val="1"/>
+          <w:sz w:val="22"/>
+          <w:szCs w:val="22"/>
+          <w:rtl w:val="0"/>
+        </w:rPr>
+        <w:t xml:space="preserve">Hive node:</w:t>
+      </w:r>
+      <w:r>
+        <w:rPr>
+          <w:b w:val="0"/>
+          <w:bCs w:val="0"/>
+          <w:i w:val="0"/>
+          <w:iCs w:val="0"/>
+          <w:sz w:val="22"/>
+          <w:szCs w:val="22"/>
+          <w:rtl w:val="0"/>
+        </w:rPr>
+        <w:t xml:space="preserve"> an ESP32-C3 microcontroller board powered by one 18650 Li-ion cell, with four sensors: (a) a 27 mm piezoelectric disc pressed into the comb at the center of the hive, where comb vibration is strongest (Section 3.2); (b) a small digital MEMS microphone inside the hive, behind a mesh; (c) four 50 kg load cells under the hive with an HX711 weighing ADC; and (d) DS18B20 temperature probes. The piezo disc also feeds a low-power wake circuit (≈2 µA) that wakes the node when vibration jumps above its usual level; an amplifier prepares the signal for the ADC only while recording. Spectra are computed with a fixed-point FFT, since the C3 has no floating-point unit. </w:t>
+      </w:r>
+      <w:r>
+        <w:rPr>
+          <w:b w:val="0"/>
+          <w:bCs w:val="0"/>
+          <w:i w:val="1"/>
+          <w:iCs w:val="1"/>
+          <w:sz w:val="22"/>
+          <w:szCs w:val="22"/>
+          <w:rtl w:val="0"/>
+        </w:rPr>
+        <w:t xml:space="preserve">Hub:</w:t>
+      </w:r>
+      <w:r>
+        <w:rPr>
+          <w:b w:val="0"/>
+          <w:bCs w:val="0"/>
+          <w:i w:val="0"/>
+          <w:iCs w:val="0"/>
+          <w:sz w:val="22"/>
+          <w:szCs w:val="22"/>
+          <w:rtl w:val="0"/>
+        </w:rPr>
+        <w:t xml:space="preserve"> an ESP32-S3 board at the apiary receives the nodes over ESP-NOW (a direct Wi-Fi radio link, no router), uploads over a cellular modem, and runs from an 18 V / 15 W solar panel with a charger and battery. Because the hives stand close together, one hub and one SIM serve a group of hives. </w:t>
+      </w:r>
+      <w:r>
+        <w:rPr>
+          <w:b w:val="0"/>
+          <w:bCs w:val="0"/>
+          <w:i w:val="1"/>
+          <w:iCs w:val="1"/>
+          <w:sz w:val="22"/>
+          <w:szCs w:val="22"/>
+          <w:rtl w:val="0"/>
+        </w:rPr>
+        <w:t xml:space="preserve">Interfaces:</w:t>
+      </w:r>
+      <w:r>
+        <w:rPr>
+          <w:b w:val="0"/>
+          <w:bCs w:val="0"/>
+          <w:i w:val="0"/>
+          <w:iCs w:val="0"/>
+          <w:sz w:val="22"/>
+          <w:szCs w:val="22"/>
+          <w:rtl w:val="0"/>
         </w:rPr>
         <w:t xml:space="preserve"> ADC (piezo), I²S (microphone), two-wire serial (HX711), 1-Wire (temperature), GPIO (wake-up), ESP-NOW (node to hub), LTE (hub to cloud).</w:t>
       </w:r>
@@ -1566,6 +1603,735 @@
     <w:p>
       <w:pPr>
         <w:keepNext/>
+        <w:spacing w:before="40" w:after="0" w:line="360" w:lineRule="auto"/>
+        <w:rPr>
+          <w:sz w:val="22"/>
+          <w:szCs w:val="22"/>
+        </w:rPr>
+      </w:pPr>
+      <w:r>
+        <w:rPr>
+          <w:b/>
+          <w:bCs/>
+          <w:i w:val="0"/>
+          <w:iCs w:val="0"/>
+          <w:sz w:val="22"/>
+          <w:szCs w:val="22"/>
+          <w:rtl w:val="0"/>
+        </w:rPr>
+        <w:t xml:space="preserve">1.4 Performance Specification</w:t>
+      </w:r>
+    </w:p>
+    <w:p>
+      <w:pPr>
+        <w:keepNext/>
+        <w:spacing w:before="40" w:after="20" w:line="240" w:lineRule="auto"/>
+        <w:jc w:val="center"/>
+        <w:rPr>
+          <w:sz w:val="26"/>
+          <w:szCs w:val="26"/>
+        </w:rPr>
+      </w:pPr>
+      <w:r>
+        <w:rPr>
+          <w:b w:val="0"/>
+          <w:bCs w:val="0"/>
+          <w:i w:val="0"/>
+          <w:iCs w:val="0"/>
+          <w:sz w:val="20"/>
+          <w:szCs w:val="20"/>
+          <w:rtl w:val="0"/>
+        </w:rPr>
+        <w:t xml:space="preserve">TABLE I.  BEESENSE PERFORMANCE SPECIFICATION AND ACCEPTANCE TARGETS</w:t>
+      </w:r>
+    </w:p>
+    <w:tbl>
+      <w:tblPr>
+        <w:tblStyle w:val="a1"/>
+        <w:tblW w:w="8307" w:type="dxa"/>
+        <w:jc w:val="center"/>
+        <w:tblInd w:w="0" w:type="dxa"/>
+        <w:tblBorders>
+          <w:top w:val="single" w:sz="6" w:space="0" w:color="000000"/>
+          <w:left w:val="single" w:sz="6" w:space="0" w:color="000000"/>
+          <w:bottom w:val="single" w:sz="6" w:space="0" w:color="000000"/>
+          <w:right w:val="single" w:sz="6" w:space="0" w:color="000000"/>
+          <w:insideH w:val="single" w:sz="6" w:space="0" w:color="000000"/>
+          <w:insideV w:val="single" w:sz="6" w:space="0" w:color="000000"/>
+        </w:tblBorders>
+        <w:tblLayout w:type="fixed"/>
+        <w:tblLook w:val="0400" w:firstRow="0" w:lastRow="0" w:firstColumn="0" w:lastColumn="0" w:noHBand="0" w:noVBand="1"/>
+      </w:tblPr>
+      <w:tblGrid>
+        <w:gridCol w:w="2769"/>
+        <w:gridCol w:w="2769"/>
+        <w:gridCol w:w="2769"/>
+      </w:tblGrid>
+      <w:tr>
+        <w:trPr>
+          <w:cantSplit/>
+          <w:jc w:val="center"/>
+        </w:trPr>
+        <w:tc>
+          <w:tcPr>
+            <w:tcW w:w="2769" w:type="dxa"/>
+            <w:shd w:val="clear" w:color="auto" w:fill="D9E2F3"/>
+          </w:tcPr>
+          <w:p>
+            <w:pPr>
+              <w:keepNext/>
+              <w:spacing w:after="0" w:line="240" w:lineRule="auto"/>
+              <w:rPr>
+                <w:sz w:val="26"/>
+                <w:szCs w:val="26"/>
+              </w:rPr>
+            </w:pPr>
+            <w:r>
+              <w:rPr>
+                <w:b/>
+                <w:bCs/>
+                <w:i w:val="0"/>
+                <w:iCs w:val="0"/>
+                <w:sz w:val="20"/>
+                <w:szCs w:val="20"/>
+                <w:rtl w:val="0"/>
+              </w:rPr>
+              <w:t xml:space="preserve">Area</w:t>
+            </w:r>
+          </w:p>
+        </w:tc>
+        <w:tc>
+          <w:tcPr>
+            <w:tcW w:w="2769" w:type="dxa"/>
+            <w:shd w:val="clear" w:color="auto" w:fill="D9E2F3"/>
+          </w:tcPr>
+          <w:p>
+            <w:pPr>
+              <w:keepNext/>
+              <w:spacing w:after="0" w:line="240" w:lineRule="auto"/>
+              <w:jc w:val="center"/>
+              <w:rPr>
+                <w:sz w:val="26"/>
+                <w:szCs w:val="26"/>
+              </w:rPr>
+            </w:pPr>
+            <w:r>
+              <w:rPr>
+                <w:b/>
+                <w:bCs/>
+                <w:i w:val="0"/>
+                <w:iCs w:val="0"/>
+                <w:sz w:val="20"/>
+                <w:szCs w:val="20"/>
+                <w:rtl w:val="0"/>
+              </w:rPr>
+              <w:t xml:space="preserve">Specification</w:t>
+            </w:r>
+          </w:p>
+        </w:tc>
+        <w:tc>
+          <w:tcPr>
+            <w:tcW w:w="2769" w:type="dxa"/>
+            <w:shd w:val="clear" w:color="auto" w:fill="D9E2F3"/>
+          </w:tcPr>
+          <w:p>
+            <w:pPr>
+              <w:keepNext/>
+              <w:spacing w:after="0" w:line="240" w:lineRule="auto"/>
+              <w:jc w:val="center"/>
+              <w:rPr>
+                <w:sz w:val="26"/>
+                <w:szCs w:val="26"/>
+              </w:rPr>
+            </w:pPr>
+            <w:r>
+              <w:rPr>
+                <w:b/>
+                <w:bCs/>
+                <w:i w:val="0"/>
+                <w:iCs w:val="0"/>
+                <w:sz w:val="20"/>
+                <w:szCs w:val="20"/>
+                <w:rtl w:val="0"/>
+              </w:rPr>
+              <w:t xml:space="preserve">Target</w:t>
+            </w:r>
+          </w:p>
+        </w:tc>
+      </w:tr>
+      <w:tr>
+        <w:trPr>
+          <w:cantSplit/>
+          <w:jc w:val="center"/>
+        </w:trPr>
+        <w:tc>
+          <w:tcPr>
+            <w:tcW w:w="2769" w:type="dxa"/>
+          </w:tcPr>
+          <w:p>
+            <w:pPr>
+              <w:keepNext/>
+              <w:spacing w:after="0" w:line="240" w:lineRule="auto"/>
+              <w:rPr>
+                <w:sz w:val="26"/>
+                <w:szCs w:val="26"/>
+              </w:rPr>
+            </w:pPr>
+            <w:r>
+              <w:rPr>
+                <w:i w:val="0"/>
+                <w:iCs w:val="0"/>
+                <w:sz w:val="20"/>
+                <w:szCs w:val="20"/>
+                <w:rtl w:val="0"/>
+              </w:rPr>
+              <w:t xml:space="preserve">Function</w:t>
+            </w:r>
+          </w:p>
+        </w:tc>
+        <w:tc>
+          <w:tcPr>
+            <w:tcW w:w="2769" w:type="dxa"/>
+          </w:tcPr>
+          <w:p>
+            <w:pPr>
+              <w:keepNext/>
+              <w:spacing w:after="0" w:line="240" w:lineRule="auto"/>
+              <w:jc w:val="center"/>
+              <w:rPr>
+                <w:sz w:val="26"/>
+                <w:szCs w:val="26"/>
+              </w:rPr>
+            </w:pPr>
+            <w:r>
+              <w:rPr>
+                <w:i w:val="0"/>
+                <w:iCs w:val="0"/>
+                <w:sz w:val="20"/>
+                <w:szCs w:val="20"/>
+                <w:rtl w:val="0"/>
+              </w:rPr>
+              <w:t xml:space="preserve">Alerts on approaching swarms before departure; colony anomaly alerts</w:t>
+            </w:r>
+          </w:p>
+        </w:tc>
+        <w:tc>
+          <w:tcPr>
+            <w:tcW w:w="2769" w:type="dxa"/>
+          </w:tcPr>
+          <w:p>
+            <w:pPr>
+              <w:keepNext/>
+              <w:spacing w:after="0" w:line="240" w:lineRule="auto"/>
+              <w:jc w:val="center"/>
+              <w:rPr>
+                <w:sz w:val="26"/>
+                <w:szCs w:val="26"/>
+              </w:rPr>
+            </w:pPr>
+            <w:r>
+              <w:rPr>
+                <w:i w:val="0"/>
+                <w:iCs w:val="0"/>
+                <w:sz w:val="20"/>
+                <w:szCs w:val="20"/>
+                <w:rtl w:val="0"/>
+              </w:rPr>
+              <w:t xml:space="preserve">Precision / recall &gt; 90%; lead time reported</w:t>
+            </w:r>
+          </w:p>
+        </w:tc>
+      </w:tr>
+      <w:tr>
+        <w:trPr>
+          <w:cantSplit/>
+          <w:jc w:val="center"/>
+        </w:trPr>
+        <w:tc>
+          <w:tcPr>
+            <w:tcW w:w="2769" w:type="dxa"/>
+          </w:tcPr>
+          <w:p>
+            <w:pPr>
+              <w:keepNext/>
+              <w:spacing w:after="0" w:line="240" w:lineRule="auto"/>
+              <w:rPr>
+                <w:sz w:val="26"/>
+                <w:szCs w:val="26"/>
+              </w:rPr>
+            </w:pPr>
+            <w:r>
+              <w:rPr>
+                <w:i w:val="0"/>
+                <w:iCs w:val="0"/>
+                <w:sz w:val="20"/>
+                <w:szCs w:val="20"/>
+                <w:rtl w:val="0"/>
+              </w:rPr>
+              <w:t xml:space="preserve">Inputs</w:t>
+            </w:r>
+          </w:p>
+        </w:tc>
+        <w:tc>
+          <w:tcPr>
+            <w:tcW w:w="2769" w:type="dxa"/>
+          </w:tcPr>
+          <w:p>
+            <w:pPr>
+              <w:keepNext/>
+              <w:spacing w:after="0" w:line="240" w:lineRule="auto"/>
+              <w:jc w:val="center"/>
+              <w:rPr>
+                <w:sz w:val="26"/>
+                <w:szCs w:val="26"/>
+              </w:rPr>
+            </w:pPr>
+            <w:r>
+              <w:rPr>
+                <w:i w:val="0"/>
+                <w:iCs w:val="0"/>
+                <w:sz w:val="20"/>
+                <w:szCs w:val="20"/>
+                <w:rtl w:val="0"/>
+              </w:rPr>
+              <w:t xml:space="preserve">Hive vibration and sound (50–800 Hz), weight (0–200 kg), temperature in and out</w:t>
+            </w:r>
+          </w:p>
+        </w:tc>
+        <w:tc>
+          <w:tcPr>
+            <w:tcW w:w="2769" w:type="dxa"/>
+          </w:tcPr>
+          <w:p>
+            <w:pPr>
+              <w:keepNext/>
+              <w:spacing w:after="0" w:line="240" w:lineRule="auto"/>
+              <w:jc w:val="center"/>
+              <w:rPr>
+                <w:sz w:val="26"/>
+                <w:szCs w:val="26"/>
+              </w:rPr>
+            </w:pPr>
+            <w:r>
+              <w:rPr>
+                <w:i w:val="0"/>
+                <w:iCs w:val="0"/>
+                <w:rtl w:val="0"/>
+              </w:rPr>
+              <w:t xml:space="preserve">Weight error ≤ ±20 g</w:t>
+            </w:r>
+          </w:p>
+        </w:tc>
+      </w:tr>
+      <w:tr>
+        <w:trPr>
+          <w:cantSplit/>
+          <w:jc w:val="center"/>
+        </w:trPr>
+        <w:tc>
+          <w:tcPr>
+            <w:tcW w:w="2769" w:type="dxa"/>
+          </w:tcPr>
+          <w:p>
+            <w:pPr>
+              <w:keepNext/>
+              <w:spacing w:after="0" w:line="240" w:lineRule="auto"/>
+              <w:rPr>
+                <w:sz w:val="26"/>
+                <w:szCs w:val="26"/>
+              </w:rPr>
+            </w:pPr>
+            <w:r>
+              <w:rPr>
+                <w:i w:val="0"/>
+                <w:iCs w:val="0"/>
+                <w:sz w:val="20"/>
+                <w:szCs w:val="20"/>
+                <w:rtl w:val="0"/>
+              </w:rPr>
+              <w:t xml:space="preserve">Outputs</w:t>
+            </w:r>
+          </w:p>
+        </w:tc>
+        <w:tc>
+          <w:tcPr>
+            <w:tcW w:w="2769" w:type="dxa"/>
+          </w:tcPr>
+          <w:p>
+            <w:pPr>
+              <w:keepNext/>
+              <w:spacing w:after="0" w:line="240" w:lineRule="auto"/>
+              <w:jc w:val="center"/>
+              <w:rPr>
+                <w:sz w:val="26"/>
+                <w:szCs w:val="26"/>
+              </w:rPr>
+            </w:pPr>
+            <w:r>
+              <w:rPr>
+                <w:i w:val="0"/>
+                <w:iCs w:val="0"/>
+                <w:sz w:val="20"/>
+                <w:szCs w:val="20"/>
+                <w:rtl w:val="0"/>
+              </w:rPr>
+              <w:t xml:space="preserve">Alerts to the beekeeper's phone; per-hive dashboard</w:t>
+            </w:r>
+          </w:p>
+        </w:tc>
+        <w:tc>
+          <w:tcPr>
+            <w:tcW w:w="2769" w:type="dxa"/>
+          </w:tcPr>
+          <w:p>
+            <w:pPr>
+              <w:keepNext/>
+              <w:spacing w:after="0" w:line="240" w:lineRule="auto"/>
+              <w:jc w:val="center"/>
+              <w:rPr>
+                <w:sz w:val="26"/>
+                <w:szCs w:val="26"/>
+              </w:rPr>
+            </w:pPr>
+            <w:r>
+              <w:rPr>
+                <w:i w:val="0"/>
+                <w:iCs w:val="0"/>
+                <w:sz w:val="20"/>
+                <w:szCs w:val="20"/>
+                <w:rtl w:val="0"/>
+              </w:rPr>
+              <w:t xml:space="preserve">False alarms ≤ 1 per hive-week</w:t>
+            </w:r>
+          </w:p>
+        </w:tc>
+      </w:tr>
+      <w:tr>
+        <w:trPr>
+          <w:cantSplit/>
+          <w:jc w:val="center"/>
+        </w:trPr>
+        <w:tc>
+          <w:tcPr>
+            <w:tcW w:w="2769" w:type="dxa"/>
+          </w:tcPr>
+          <w:p>
+            <w:pPr>
+              <w:keepNext/>
+              <w:spacing w:after="0" w:line="240" w:lineRule="auto"/>
+              <w:rPr>
+                <w:sz w:val="26"/>
+                <w:szCs w:val="26"/>
+              </w:rPr>
+            </w:pPr>
+            <w:r>
+              <w:rPr>
+                <w:i w:val="0"/>
+                <w:iCs w:val="0"/>
+                <w:sz w:val="20"/>
+                <w:szCs w:val="20"/>
+                <w:rtl w:val="0"/>
+              </w:rPr>
+              <w:t xml:space="preserve">Rates</w:t>
+            </w:r>
+          </w:p>
+        </w:tc>
+        <w:tc>
+          <w:tcPr>
+            <w:tcW w:w="2769" w:type="dxa"/>
+          </w:tcPr>
+          <w:p>
+            <w:pPr>
+              <w:keepNext/>
+              <w:spacing w:after="0" w:line="240" w:lineRule="auto"/>
+              <w:jc w:val="center"/>
+              <w:rPr>
+                <w:sz w:val="26"/>
+                <w:szCs w:val="26"/>
+              </w:rPr>
+            </w:pPr>
+            <w:r>
+              <w:rPr>
+                <w:i w:val="0"/>
+                <w:iCs w:val="0"/>
+                <w:sz w:val="20"/>
+                <w:szCs w:val="20"/>
+                <w:rtl w:val="0"/>
+              </w:rPr>
+              <w:t xml:space="preserve">Report every 15 min and on vibration events (20-min hold-off)</w:t>
+            </w:r>
+          </w:p>
+        </w:tc>
+        <w:tc>
+          <w:tcPr>
+            <w:tcW w:w="2769" w:type="dxa"/>
+          </w:tcPr>
+          <w:p>
+            <w:pPr>
+              <w:keepNext/>
+              <w:spacing w:after="0" w:line="240" w:lineRule="auto"/>
+              <w:jc w:val="center"/>
+              <w:rPr>
+                <w:sz w:val="26"/>
+                <w:szCs w:val="26"/>
+              </w:rPr>
+            </w:pPr>
+            <w:r>
+              <w:rPr>
+                <w:i w:val="0"/>
+                <w:iCs w:val="0"/>
+                <w:rtl w:val="0"/>
+              </w:rPr>
+              <w:t xml:space="preserve">No missed departure; ≤ 20 false wakes per hive-day</w:t>
+            </w:r>
+          </w:p>
+        </w:tc>
+      </w:tr>
+      <w:tr>
+        <w:trPr>
+          <w:cantSplit/>
+          <w:jc w:val="center"/>
+        </w:trPr>
+        <w:tc>
+          <w:tcPr>
+            <w:tcW w:w="2769" w:type="dxa"/>
+          </w:tcPr>
+          <w:p>
+            <w:pPr>
+              <w:keepNext/>
+              <w:spacing w:after="0" w:line="240" w:lineRule="auto"/>
+              <w:rPr>
+                <w:sz w:val="26"/>
+                <w:szCs w:val="26"/>
+              </w:rPr>
+            </w:pPr>
+            <w:r>
+              <w:rPr>
+                <w:i w:val="0"/>
+                <w:iCs w:val="0"/>
+                <w:sz w:val="20"/>
+                <w:szCs w:val="20"/>
+                <w:rtl w:val="0"/>
+              </w:rPr>
+              <w:t xml:space="preserve">Interfaces</w:t>
+            </w:r>
+          </w:p>
+        </w:tc>
+        <w:tc>
+          <w:tcPr>
+            <w:tcW w:w="2769" w:type="dxa"/>
+          </w:tcPr>
+          <w:p>
+            <w:pPr>
+              <w:keepNext/>
+              <w:spacing w:after="0" w:line="240" w:lineRule="auto"/>
+              <w:jc w:val="center"/>
+              <w:rPr>
+                <w:sz w:val="26"/>
+                <w:szCs w:val="26"/>
+              </w:rPr>
+            </w:pPr>
+            <w:r>
+              <w:rPr>
+                <w:i w:val="0"/>
+                <w:iCs w:val="0"/>
+                <w:sz w:val="20"/>
+                <w:szCs w:val="20"/>
+                <w:rtl w:val="0"/>
+              </w:rPr>
+              <w:t xml:space="preserve">Node to hub: ESP-NOW (2.4 GHz); hub to cloud: LTE; web browser</w:t>
+            </w:r>
+          </w:p>
+        </w:tc>
+        <w:tc>
+          <w:tcPr>
+            <w:tcW w:w="2769" w:type="dxa"/>
+          </w:tcPr>
+          <w:p>
+            <w:pPr>
+              <w:keepNext/>
+              <w:spacing w:after="0" w:line="240" w:lineRule="auto"/>
+              <w:jc w:val="center"/>
+              <w:rPr>
+                <w:sz w:val="26"/>
+                <w:szCs w:val="26"/>
+              </w:rPr>
+            </w:pPr>
+            <w:r>
+              <w:rPr>
+                <w:i w:val="0"/>
+                <w:iCs w:val="0"/>
+                <w:rtl w:val="0"/>
+              </w:rPr>
+              <w:t xml:space="preserve">Packet delivery ≥ 95%</w:t>
+            </w:r>
+          </w:p>
+        </w:tc>
+      </w:tr>
+      <w:tr>
+        <w:trPr>
+          <w:cantSplit/>
+          <w:jc w:val="center"/>
+        </w:trPr>
+        <w:tc>
+          <w:tcPr>
+            <w:tcW w:w="2769" w:type="dxa"/>
+          </w:tcPr>
+          <w:p>
+            <w:pPr>
+              <w:spacing w:after="0" w:line="240" w:lineRule="auto"/>
+              <w:rPr>
+                <w:sz w:val="26"/>
+                <w:szCs w:val="26"/>
+              </w:rPr>
+            </w:pPr>
+            <w:r>
+              <w:rPr>
+                <w:i w:val="0"/>
+                <w:iCs w:val="0"/>
+                <w:sz w:val="20"/>
+                <w:szCs w:val="20"/>
+                <w:rtl w:val="0"/>
+              </w:rPr>
+              <w:t xml:space="preserve">Power</w:t>
+            </w:r>
+          </w:p>
+        </w:tc>
+        <w:tc>
+          <w:tcPr>
+            <w:tcW w:w="2769" w:type="dxa"/>
+          </w:tcPr>
+          <w:p>
+            <w:pPr>
+              <w:spacing w:after="0" w:line="240" w:lineRule="auto"/>
+              <w:jc w:val="center"/>
+              <w:rPr>
+                <w:sz w:val="26"/>
+                <w:szCs w:val="26"/>
+              </w:rPr>
+            </w:pPr>
+            <w:r>
+              <w:rPr>
+                <w:i w:val="0"/>
+                <w:iCs w:val="0"/>
+                <w:sz w:val="20"/>
+                <w:szCs w:val="20"/>
+                <w:rtl w:val="0"/>
+              </w:rPr>
+              <w:t xml:space="preserve">Node: one 18650 cell; hub: 18 V / 15 W solar panel and Li-ion pack</w:t>
+            </w:r>
+          </w:p>
+        </w:tc>
+        <w:tc>
+          <w:tcPr>
+            <w:tcW w:w="2769" w:type="dxa"/>
+          </w:tcPr>
+          <w:p>
+            <w:pPr>
+              <w:spacing w:after="0" w:line="240" w:lineRule="auto"/>
+              <w:jc w:val="center"/>
+              <w:rPr>
+                <w:sz w:val="26"/>
+                <w:szCs w:val="26"/>
+              </w:rPr>
+            </w:pPr>
+            <w:r>
+              <w:rPr>
+                <w:i w:val="0"/>
+                <w:iCs w:val="0"/>
+                <w:sz w:val="20"/>
+                <w:szCs w:val="20"/>
+                <w:rtl w:val="0"/>
+              </w:rPr>
+              <w:t xml:space="preserve">Node ≥ 6 months; ≥ 30 days unattended</w:t>
+            </w:r>
+          </w:p>
+        </w:tc>
+      </w:tr>
+      <w:tr>
+        <w:trPr>
+          <w:cantSplit/>
+          <w:jc w:val="center"/>
+        </w:trPr>
+        <w:tc>
+          <w:tcPr>
+            <w:tcW w:w="2769" w:type="dxa"/>
+          </w:tcPr>
+          <w:p>
+            <w:pPr>
+              <w:spacing w:after="0" w:line="240" w:lineRule="auto"/>
+              <w:rPr>
+                <w:sz w:val="26"/>
+                <w:szCs w:val="26"/>
+              </w:rPr>
+            </w:pPr>
+            <w:r>
+              <w:rPr>
+                <w:i w:val="0"/>
+                <w:iCs w:val="0"/>
+                <w:sz w:val="20"/>
+                <w:szCs w:val="20"/>
+                <w:rtl w:val="0"/>
+              </w:rPr>
+              <w:t xml:space="preserve">Environment</w:t>
+            </w:r>
+          </w:p>
+        </w:tc>
+        <w:tc>
+          <w:tcPr>
+            <w:tcW w:w="2769" w:type="dxa"/>
+          </w:tcPr>
+          <w:p>
+            <w:pPr>
+              <w:spacing w:after="0" w:line="240" w:lineRule="auto"/>
+              <w:jc w:val="center"/>
+              <w:rPr>
+                <w:sz w:val="26"/>
+                <w:szCs w:val="26"/>
+              </w:rPr>
+            </w:pPr>
+            <w:r>
+              <w:rPr>
+                <w:i w:val="0"/>
+                <w:iCs w:val="0"/>
+                <w:sz w:val="20"/>
+                <w:szCs w:val="20"/>
+                <w:rtl w:val="0"/>
+              </w:rPr>
+              <w:t xml:space="preserve">Outdoor apiary without mains power or Wi-Fi; sealed enclosures</w:t>
+            </w:r>
+          </w:p>
+        </w:tc>
+        <w:tc>
+          <w:tcPr>
+            <w:tcW w:w="2769" w:type="dxa"/>
+          </w:tcPr>
+          <w:p>
+            <w:pPr>
+              <w:spacing w:after="0" w:line="240" w:lineRule="auto"/>
+              <w:jc w:val="center"/>
+              <w:rPr>
+                <w:sz w:val="26"/>
+                <w:szCs w:val="26"/>
+              </w:rPr>
+            </w:pPr>
+            <w:r>
+              <w:rPr>
+                <w:i w:val="0"/>
+                <w:iCs w:val="0"/>
+                <w:sz w:val="20"/>
+                <w:szCs w:val="20"/>
+                <w:rtl w:val="0"/>
+              </w:rPr>
+              <w:t xml:space="preserve">Operation through the spring season</w:t>
+            </w:r>
+          </w:p>
+        </w:tc>
+      </w:tr>
+    </w:tbl>
+    <w:p>
+      <w:pPr>
+        <w:keepNext/>
         <w:spacing w:before="80" w:after="0" w:line="360" w:lineRule="auto"/>
         <w:rPr>
           <w:sz w:val="22"/>
@@ -1591,26 +2357,21 @@
           <w:szCs w:val="22"/>
         </w:rPr>
       </w:pPr>
-      <w:r>
-        <w:rPr>
-          <w:sz w:val="22"/>
-          <w:szCs w:val="22"/>
-        </w:rPr>
-        <w:t>Ferrari et al. found with in-hive microphones that the power spectral density near 110 Hz rises, and shifts upward in frequency, before swarming [2]. Ramsey et al. placed accelerometers in the heart of the colony and, by tracking how the vibrational spectra evolve, identified colonies preparing to swarm with more than 90% accuracy, up to 30 days ahead [3]. Cecchi et al. built a multi-sensor hive with microphones, weighing to ±10 g and CO₂</w:t>
-      </w:r>
-      <w:r>
-        <w:rPr>
-          <w:sz w:val="22"/>
-          <w:szCs w:val="22"/>
-        </w:rPr>
-        <w:t xml:space="preserve"> (why CO2) </w:t>
-      </w:r>
-      <w:r>
-        <w:rPr>
-          <w:sz w:val="22"/>
-          <w:szCs w:val="22"/>
-        </w:rPr>
-        <w:t>, but each hive used a Raspberry Pi drawing about 4 W from mains power [5]. Commercially, BeeHero in-hive sensors measure acoustics and climate and report over Bluetooth Low Energy to a cellular gateway in a closed system [6] (Table I).</w:t>
+      <w:proofErr w:type="gramStart"/>
+      <w:proofErr w:type="gramEnd"/>
+      <w:proofErr w:type="gramStart"/>
+      <w:proofErr w:type="gramEnd"/>
+      <w:r>
+        <w:rPr>
+          <w:b w:val="0"/>
+          <w:bCs w:val="0"/>
+          <w:i w:val="0"/>
+          <w:iCs w:val="0"/>
+          <w:sz w:val="22"/>
+          <w:szCs w:val="22"/>
+          <w:rtl w:val="0"/>
+        </w:rPr>
+        <w:t xml:space="preserve">Ferrari et al. found with in-hive microphones that the power spectral density near 110 Hz rises, and shifts upward in frequency, before swarming [2]. Ramsey et al. placed accelerometers in the heart of the colony and, by tracking how the vibrational spectra evolve, identified colonies preparing to swarm with more than 90% accuracy, up to 30 days ahead [3]. Cecchi et al. built a multi-sensor hive with microphones and weighing to ±10 g, but each hive used a Raspberry Pi drawing about 4 W from mains power [5]. Commercially, BeeHero in-hive sensors measure acoustics and climate and report over Bluetooth Low Energy to a cellular gateway in a closed system [6] (Table II).</w:t>
       </w:r>
     </w:p>
     <w:p>
@@ -1621,10 +2382,15 @@
       </w:pPr>
       <w:r>
         <w:rPr>
+          <w:b w:val="0"/>
+          <w:bCs w:val="0"/>
+          <w:i w:val="0"/>
+          <w:iCs w:val="0"/>
           <w:sz w:val="18"/>
           <w:szCs w:val="18"/>
-        </w:rPr>
-        <w:t>TABLE I.  PRIOR WORK AND WHAT BEESENSE MUST DEMONSTRATE</w:t>
+          <w:rtl w:val="0"/>
+        </w:rPr>
+        <w:t xml:space="preserve">TABLE II.  PRIOR WORK AND WHAT BEESENSE MUST DEMONSTRATE</w:t>
       </w:r>
     </w:p>
     <w:tbl>
@@ -1814,8 +2580,16 @@
               <w:keepNext/>
               <w:spacing w:after="0" w:line="240" w:lineRule="auto"/>
               <w:jc w:val="center"/>
+              <w:rPr>
+                <w:sz w:val="18"/>
+                <w:szCs w:val="18"/>
+              </w:rPr>
             </w:pPr>
             <w:r>
+              <w:rPr>
+                <w:sz w:val="18"/>
+                <w:szCs w:val="18"/>
+              </w:rPr>
               <w:t>Microphones, weight ±10 g, CO₂; mains, ~4 W per hive</w:t>
             </w:r>
           </w:p>
@@ -2167,7 +2941,6 @@
           <w:sz w:val="22"/>
           <w:szCs w:val="22"/>
         </w:rPr>
-        <w:lastRenderedPageBreak/>
         <w:tab/>
         <w:t>e</w:t>
       </w:r>
@@ -2297,12 +3070,21 @@
         </w:rPr>
         <w:t>f</w:t>
       </w:r>
-      <w:r>
-        <w:rPr>
-          <w:sz w:val="22"/>
-          <w:szCs w:val="22"/>
-        </w:rPr>
-        <w:t xml:space="preserve">),     </w:t>
+      <w:proofErr w:type="gramStart"/>
+      <w:r>
+        <w:rPr>
+          <w:sz w:val="22"/>
+          <w:szCs w:val="22"/>
+        </w:rPr>
+        <w:t xml:space="preserve">),   </w:t>
+      </w:r>
+      <w:proofErr w:type="gramEnd"/>
+      <w:r>
+        <w:rPr>
+          <w:sz w:val="22"/>
+          <w:szCs w:val="22"/>
+        </w:rPr>
+        <w:t xml:space="preserve">  </w:t>
       </w:r>
       <w:r>
         <w:rPr>
@@ -2365,6 +3147,7 @@
           <w:sz w:val="22"/>
           <w:szCs w:val="22"/>
         </w:rPr>
+        <w:lastRenderedPageBreak/>
         <w:tab/>
         <w:t>z</w:t>
       </w:r>
@@ -2429,6 +3212,7 @@
         </w:rPr>
         <w:t>σ</w:t>
       </w:r>
+      <w:proofErr w:type="gramStart"/>
       <w:r>
         <w:rPr>
           <w:i/>
@@ -2445,7 +3229,15 @@
           <w:sz w:val="22"/>
           <w:szCs w:val="22"/>
         </w:rPr>
-        <w:t>,     Δ</w:t>
+        <w:t xml:space="preserve">,   </w:t>
+      </w:r>
+      <w:proofErr w:type="gramEnd"/>
+      <w:r>
+        <w:rPr>
+          <w:sz w:val="22"/>
+          <w:szCs w:val="22"/>
+        </w:rPr>
+        <w:t xml:space="preserve">  Δ</w:t>
       </w:r>
       <w:r>
         <w:rPr>
@@ -2511,6 +3303,7 @@
         </w:rPr>
         <w:t xml:space="preserve">) − </w:t>
       </w:r>
+      <w:proofErr w:type="gramStart"/>
       <w:r>
         <w:rPr>
           <w:i/>
@@ -2527,6 +3320,7 @@
         </w:rPr>
         <w:t>(</w:t>
       </w:r>
+      <w:proofErr w:type="gramEnd"/>
       <w:r>
         <w:rPr>
           <w:i/>
@@ -2834,7 +3628,23 @@
           <w:sz w:val="22"/>
           <w:szCs w:val="22"/>
         </w:rPr>
-        <w:t xml:space="preserve">The parts are in hand but no node is built yet, so feasibility is shown from published measurements and datasheet values, each to be replaced by a bench measurement. </w:t>
+        <w:t xml:space="preserve">The parts are in </w:t>
+      </w:r>
+      <w:proofErr w:type="gramStart"/>
+      <w:r>
+        <w:rPr>
+          <w:sz w:val="22"/>
+          <w:szCs w:val="22"/>
+        </w:rPr>
+        <w:t>hand</w:t>
+      </w:r>
+      <w:proofErr w:type="gramEnd"/>
+      <w:r>
+        <w:rPr>
+          <w:sz w:val="22"/>
+          <w:szCs w:val="22"/>
+        </w:rPr>
+        <w:t xml:space="preserve"> but no node is built yet, so feasibility is shown from published measurements and datasheet values, each to be replaced by a bench measurement. </w:t>
       </w:r>
       <w:r>
         <w:rPr>
@@ -3157,7 +3967,23 @@
           <w:sz w:val="22"/>
           <w:szCs w:val="22"/>
         </w:rPr>
-        <w:t xml:space="preserve"> / 86 400 s,     </w:t>
+        <w:t xml:space="preserve"> / 86 400 </w:t>
+      </w:r>
+      <w:proofErr w:type="gramStart"/>
+      <w:r>
+        <w:rPr>
+          <w:sz w:val="22"/>
+          <w:szCs w:val="22"/>
+        </w:rPr>
+        <w:t xml:space="preserve">s,   </w:t>
+      </w:r>
+      <w:proofErr w:type="gramEnd"/>
+      <w:r>
+        <w:rPr>
+          <w:sz w:val="22"/>
+          <w:szCs w:val="22"/>
+        </w:rPr>
+        <w:t xml:space="preserve">  </w:t>
       </w:r>
       <w:proofErr w:type="spellStart"/>
       <w:r>
@@ -3241,7 +4067,23 @@
           <w:sz w:val="22"/>
           <w:szCs w:val="22"/>
         </w:rPr>
-        <w:t xml:space="preserve">One acquisition costs ≈0.30 A·s: 22 mA at 80 MHz for the 10 s recording and 28 mA at 160 MHz for ≈1.5 s of FFTs [10], 0.15 s of radio at ≈120 mA average (335 mA TX peak [10]), and the microphone (≈1.4 mA), preamplifier and HX711. With </w:t>
+        <w:t xml:space="preserve">One acquisition </w:t>
+      </w:r>
+      <w:proofErr w:type="gramStart"/>
+      <w:r>
+        <w:rPr>
+          <w:sz w:val="22"/>
+          <w:szCs w:val="22"/>
+        </w:rPr>
+        <w:t>costs</w:t>
+      </w:r>
+      <w:proofErr w:type="gramEnd"/>
+      <w:r>
+        <w:rPr>
+          <w:sz w:val="22"/>
+          <w:szCs w:val="22"/>
+        </w:rPr>
+        <w:t xml:space="preserve"> ≈0.30 A·s: 22 mA at 80 MHz for the 10 s recording and 28 mA at 160 MHz for ≈1.5 s of FFTs [10], 0.15 s of radio at ≈120 mA average (335 mA TX peak [10]), and the microphone (≈1.4 mA), preamplifier and HX711. With </w:t>
       </w:r>
       <w:r>
         <w:rPr>
@@ -3434,7 +4276,23 @@
           <w:sz w:val="18"/>
           <w:szCs w:val="18"/>
         </w:rPr>
-        <w:t>Fig. 2.  Estimated node battery life (one 18650 cell) vs. event wake-ups per day by (3) (datasheet-level estimates, to be measured).</w:t>
+        <w:t xml:space="preserve">Fig. 2.  Estimated node battery life (one 18650 cell) vs. event </w:t>
+      </w:r>
+      <w:proofErr w:type="gramStart"/>
+      <w:r>
+        <w:rPr>
+          <w:sz w:val="18"/>
+          <w:szCs w:val="18"/>
+        </w:rPr>
+        <w:t>wake-ups</w:t>
+      </w:r>
+      <w:proofErr w:type="gramEnd"/>
+      <w:r>
+        <w:rPr>
+          <w:sz w:val="18"/>
+          <w:szCs w:val="18"/>
+        </w:rPr>
+        <w:t xml:space="preserve"> per day by (3) (datasheet-level estimates, to be measured).</w:t>
       </w:r>
     </w:p>
     <w:p>
@@ -3465,654 +4323,105 @@
           <w:szCs w:val="22"/>
         </w:rPr>
       </w:pPr>
-      <w:r>
-        <w:rPr>
-          <w:i/>
-          <w:iCs/>
-          <w:sz w:val="22"/>
-          <w:szCs w:val="22"/>
-        </w:rPr>
-        <w:t>Lab:</w:t>
-      </w:r>
-      <w:r>
-        <w:rPr>
-          <w:sz w:val="22"/>
-          <w:szCs w:val="22"/>
+      <w:proofErr w:type="gramStart"/>
+      <w:proofErr w:type="gramEnd"/>
+      <w:r>
+        <w:rPr>
+          <w:b w:val="0"/>
+          <w:bCs w:val="0"/>
+          <w:i w:val="1"/>
+          <w:iCs w:val="1"/>
+          <w:sz w:val="22"/>
+          <w:szCs w:val="22"/>
+          <w:rtl w:val="0"/>
+        </w:rPr>
+        <w:t xml:space="preserve">Lab:</w:t>
+      </w:r>
+      <w:r>
+        <w:rPr>
+          <w:b w:val="0"/>
+          <w:bCs w:val="0"/>
+          <w:i w:val="0"/>
+          <w:iCs w:val="0"/>
+          <w:sz w:val="22"/>
+          <w:szCs w:val="22"/>
+          <w:rtl w:val="0"/>
         </w:rPr>
         <w:t xml:space="preserve"> weighing linearity with reference masses (0–100 kg) and a temperature sweep; piezo and wake chains checked with known tones (100–800 Hz) and bursts from a shaker coupled to a frame; average current measured with a power analyzer over full cycles. </w:t>
       </w:r>
       <w:r>
         <w:rPr>
-          <w:i/>
-          <w:iCs/>
-          <w:sz w:val="22"/>
-          <w:szCs w:val="22"/>
-        </w:rPr>
-        <w:t>Field:</w:t>
-      </w:r>
-      <w:r>
-        <w:rPr>
-          <w:sz w:val="22"/>
-          <w:szCs w:val="22"/>
-        </w:rPr>
-        <w:t xml:space="preserve"> </w:t>
-      </w:r>
-      <w:r>
-        <w:rPr>
-          <w:sz w:val="22"/>
-          <w:szCs w:val="22"/>
-          <w:highlight w:val="yellow"/>
-        </w:rPr>
-        <w:t>3–5</w:t>
-      </w:r>
-      <w:r>
-        <w:rPr>
-          <w:sz w:val="22"/>
-          <w:szCs w:val="22"/>
-        </w:rPr>
-        <w:t xml:space="preserve"> instrumented hives and one empty control platform at the cooperating apiary </w:t>
-      </w:r>
-      <w:r>
-        <w:rPr>
-          <w:sz w:val="22"/>
-          <w:szCs w:val="22"/>
-          <w:highlight w:val="yellow"/>
-        </w:rPr>
-        <w:t>name</w:t>
-      </w:r>
-      <w:r>
-        <w:rPr>
-          <w:sz w:val="22"/>
-          <w:szCs w:val="22"/>
-        </w:rPr>
-        <w:t xml:space="preserve">, from installation through the spring swarming season, including a first night-time recording that compares hive signal with the circuit noise floor. Ground truth: weekly inspection records (queen cells, brood, queen presence), beekeeper reports and, where possible, an entrance camera. A swarm is labelled by an observed departure or by capped queen cells at inspection. A pre-swarm alert is a true positive if it precedes the swarm, giving precision </w:t>
-      </w:r>
-      <w:r>
-        <w:rPr>
-          <w:i/>
-          <w:iCs/>
-          <w:sz w:val="22"/>
-          <w:szCs w:val="22"/>
-        </w:rPr>
-        <w:t>P</w:t>
-      </w:r>
-      <w:r>
-        <w:rPr>
-          <w:sz w:val="22"/>
-          <w:szCs w:val="22"/>
+          <w:b w:val="0"/>
+          <w:bCs w:val="0"/>
+          <w:i w:val="1"/>
+          <w:iCs w:val="1"/>
+          <w:sz w:val="22"/>
+          <w:szCs w:val="22"/>
+          <w:rtl w:val="0"/>
+        </w:rPr>
+        <w:t xml:space="preserve">Field:</w:t>
+      </w:r>
+      <w:r>
+        <w:rPr>
+          <w:b w:val="0"/>
+          <w:bCs w:val="0"/>
+          <w:i w:val="0"/>
+          <w:iCs w:val="0"/>
+          <w:sz w:val="22"/>
+          <w:szCs w:val="22"/>
+          <w:rtl w:val="0"/>
+        </w:rPr>
+        <w:t xml:space="preserve"> 3–5 instrumented hives and one empty control platform at the cooperating apiary name, from installation through the spring swarming season, including a first night-time recording that compares hive signal with the circuit noise floor. Ground truth: weekly inspection records (queen cells, brood, queen presence), beekeeper reports and, where possible, an entrance camera. A swarm is labeled by an observed departure or by capped queen cells at inspection. A pre-swarm alert is a true positive if it precedes the swarm, giving precision </w:t>
+      </w:r>
+      <w:r>
+        <w:rPr>
+          <w:b w:val="0"/>
+          <w:bCs w:val="0"/>
+          <w:i w:val="1"/>
+          <w:iCs w:val="1"/>
+          <w:sz w:val="22"/>
+          <w:szCs w:val="22"/>
+          <w:rtl w:val="0"/>
+        </w:rPr>
+        <w:t xml:space="preserve">P</w:t>
+      </w:r>
+      <w:r>
+        <w:rPr>
+          <w:b w:val="0"/>
+          <w:bCs w:val="0"/>
+          <w:i w:val="0"/>
+          <w:iCs w:val="0"/>
+          <w:sz w:val="22"/>
+          <w:szCs w:val="22"/>
+          <w:rtl w:val="0"/>
         </w:rPr>
         <w:t xml:space="preserve"> = TP/(TP+FP) and recall </w:t>
       </w:r>
       <w:r>
         <w:rPr>
-          <w:i/>
-          <w:iCs/>
-          <w:sz w:val="22"/>
-          <w:szCs w:val="22"/>
-        </w:rPr>
-        <w:t>R</w:t>
-      </w:r>
-      <w:r>
-        <w:rPr>
-          <w:sz w:val="22"/>
-          <w:szCs w:val="22"/>
-        </w:rPr>
-        <w:t xml:space="preserve"> = TP/(TP+FN) per swarm, with the lead time reported; the departure rule is also tested with controlled removal of known masses (0.5–2 kg). Event wakes and false alarms are counted per hive-day. Thresholds are tuned on the first weeks and frozen before the evaluation period. The packet delivery ratio (PDR) is computed from sequence numbers, and the hub logs its battery voltage to check the solar energy balance.</w:t>
-      </w:r>
-    </w:p>
-    <w:p>
-      <w:pPr>
-        <w:keepNext/>
-        <w:spacing w:before="40" w:after="20" w:line="240" w:lineRule="auto"/>
-        <w:jc w:val="center"/>
-        <w:rPr>
-          <w:sz w:val="26"/>
-          <w:szCs w:val="26"/>
-        </w:rPr>
-      </w:pPr>
-      <w:r>
-        <w:rPr>
-          <w:sz w:val="20"/>
-          <w:szCs w:val="20"/>
-        </w:rPr>
-        <w:t>TABLE II.  PROPOSED ACCEPTANCE TARGETS (FROZEN BEFORE THE FIELD EVALUATION)</w:t>
-      </w:r>
-    </w:p>
-    <w:tbl>
-      <w:tblPr>
-        <w:tblStyle w:val="a1"/>
-        <w:tblW w:w="8307" w:type="dxa"/>
-        <w:jc w:val="center"/>
-        <w:tblInd w:w="0" w:type="dxa"/>
-        <w:tblBorders>
-          <w:top w:val="single" w:sz="6" w:space="0" w:color="000000"/>
-          <w:left w:val="single" w:sz="6" w:space="0" w:color="000000"/>
-          <w:bottom w:val="single" w:sz="6" w:space="0" w:color="000000"/>
-          <w:right w:val="single" w:sz="6" w:space="0" w:color="000000"/>
-          <w:insideH w:val="single" w:sz="6" w:space="0" w:color="000000"/>
-          <w:insideV w:val="single" w:sz="6" w:space="0" w:color="000000"/>
-        </w:tblBorders>
-        <w:tblLayout w:type="fixed"/>
-        <w:tblLook w:val="0400" w:firstRow="0" w:lastRow="0" w:firstColumn="0" w:lastColumn="0" w:noHBand="0" w:noVBand="1"/>
-      </w:tblPr>
-      <w:tblGrid>
-        <w:gridCol w:w="2769"/>
-        <w:gridCol w:w="2769"/>
-        <w:gridCol w:w="2769"/>
-      </w:tblGrid>
-      <w:tr>
-        <w:trPr>
-          <w:cantSplit/>
-          <w:jc w:val="center"/>
-        </w:trPr>
-        <w:tc>
-          <w:tcPr>
-            <w:tcW w:w="2769" w:type="dxa"/>
-            <w:shd w:val="clear" w:color="auto" w:fill="D9E2F3"/>
-          </w:tcPr>
-          <w:p>
-            <w:pPr>
-              <w:keepNext/>
-              <w:spacing w:after="0" w:line="240" w:lineRule="auto"/>
-              <w:rPr>
-                <w:sz w:val="26"/>
-                <w:szCs w:val="26"/>
-              </w:rPr>
-            </w:pPr>
-            <w:r>
-              <w:rPr>
-                <w:b/>
-                <w:bCs/>
-                <w:sz w:val="20"/>
-                <w:szCs w:val="20"/>
-              </w:rPr>
-              <w:t>Area</w:t>
-            </w:r>
-          </w:p>
-        </w:tc>
-        <w:tc>
-          <w:tcPr>
-            <w:tcW w:w="2769" w:type="dxa"/>
-            <w:shd w:val="clear" w:color="auto" w:fill="D9E2F3"/>
-          </w:tcPr>
-          <w:p>
-            <w:pPr>
-              <w:keepNext/>
-              <w:spacing w:after="0" w:line="240" w:lineRule="auto"/>
-              <w:jc w:val="center"/>
-              <w:rPr>
-                <w:sz w:val="26"/>
-                <w:szCs w:val="26"/>
-              </w:rPr>
-            </w:pPr>
-            <w:r>
-              <w:rPr>
-                <w:b/>
-                <w:bCs/>
-                <w:sz w:val="20"/>
-                <w:szCs w:val="20"/>
-              </w:rPr>
-              <w:t>Metric</w:t>
-            </w:r>
-          </w:p>
-        </w:tc>
-        <w:tc>
-          <w:tcPr>
-            <w:tcW w:w="2769" w:type="dxa"/>
-            <w:shd w:val="clear" w:color="auto" w:fill="D9E2F3"/>
-          </w:tcPr>
-          <w:p>
-            <w:pPr>
-              <w:keepNext/>
-              <w:spacing w:after="0" w:line="240" w:lineRule="auto"/>
-              <w:jc w:val="center"/>
-              <w:rPr>
-                <w:sz w:val="26"/>
-                <w:szCs w:val="26"/>
-              </w:rPr>
-            </w:pPr>
-            <w:r>
-              <w:rPr>
-                <w:b/>
-                <w:bCs/>
-                <w:sz w:val="20"/>
-                <w:szCs w:val="20"/>
-              </w:rPr>
-              <w:t>Target</w:t>
-            </w:r>
-          </w:p>
-        </w:tc>
-      </w:tr>
-      <w:tr>
-        <w:trPr>
-          <w:cantSplit/>
-          <w:jc w:val="center"/>
-        </w:trPr>
-        <w:tc>
-          <w:tcPr>
-            <w:tcW w:w="2769" w:type="dxa"/>
-          </w:tcPr>
-          <w:p>
-            <w:pPr>
-              <w:keepNext/>
-              <w:spacing w:after="0" w:line="240" w:lineRule="auto"/>
-              <w:rPr>
-                <w:sz w:val="26"/>
-                <w:szCs w:val="26"/>
-              </w:rPr>
-            </w:pPr>
-            <w:r>
-              <w:rPr>
-                <w:sz w:val="20"/>
-                <w:szCs w:val="20"/>
-              </w:rPr>
-              <w:t>Weighing</w:t>
-            </w:r>
-          </w:p>
-        </w:tc>
-        <w:tc>
-          <w:tcPr>
-            <w:tcW w:w="2769" w:type="dxa"/>
-          </w:tcPr>
-          <w:p>
-            <w:pPr>
-              <w:keepNext/>
-              <w:spacing w:after="0" w:line="240" w:lineRule="auto"/>
-              <w:jc w:val="center"/>
-              <w:rPr>
-                <w:sz w:val="26"/>
-                <w:szCs w:val="26"/>
-              </w:rPr>
-            </w:pPr>
-            <w:r>
-              <w:rPr>
-                <w:sz w:val="20"/>
-                <w:szCs w:val="20"/>
-              </w:rPr>
-              <w:t>Error vs. reference masses; daily drift (control)</w:t>
-            </w:r>
-          </w:p>
-        </w:tc>
-        <w:tc>
-          <w:tcPr>
-            <w:tcW w:w="2769" w:type="dxa"/>
-          </w:tcPr>
-          <w:p>
-            <w:pPr>
-              <w:keepNext/>
-              <w:spacing w:after="0" w:line="240" w:lineRule="auto"/>
-              <w:jc w:val="center"/>
-              <w:rPr>
-                <w:sz w:val="26"/>
-                <w:szCs w:val="26"/>
-              </w:rPr>
-            </w:pPr>
-            <w:r>
-              <w:rPr>
-                <w:sz w:val="20"/>
-                <w:szCs w:val="20"/>
-              </w:rPr>
-              <w:t>≤ ±20 g; reported</w:t>
-            </w:r>
-          </w:p>
-        </w:tc>
-      </w:tr>
-      <w:tr>
-        <w:trPr>
-          <w:cantSplit/>
-          <w:jc w:val="center"/>
-        </w:trPr>
-        <w:tc>
-          <w:tcPr>
-            <w:tcW w:w="2769" w:type="dxa"/>
-          </w:tcPr>
-          <w:p>
-            <w:pPr>
-              <w:keepNext/>
-              <w:spacing w:after="0" w:line="240" w:lineRule="auto"/>
-              <w:rPr>
-                <w:sz w:val="26"/>
-                <w:szCs w:val="26"/>
-              </w:rPr>
-            </w:pPr>
-            <w:r>
-              <w:rPr>
-                <w:sz w:val="20"/>
-                <w:szCs w:val="20"/>
-              </w:rPr>
-              <w:t>Wake-up</w:t>
-            </w:r>
-          </w:p>
-        </w:tc>
-        <w:tc>
-          <w:tcPr>
-            <w:tcW w:w="2769" w:type="dxa"/>
-          </w:tcPr>
-          <w:p>
-            <w:pPr>
-              <w:keepNext/>
-              <w:spacing w:after="0" w:line="240" w:lineRule="auto"/>
-              <w:jc w:val="center"/>
-              <w:rPr>
-                <w:sz w:val="26"/>
-                <w:szCs w:val="26"/>
-              </w:rPr>
-            </w:pPr>
-            <w:r>
-              <w:rPr>
-                <w:sz w:val="20"/>
-                <w:szCs w:val="20"/>
-              </w:rPr>
-              <w:t>Departures and bursts missed; false wakes</w:t>
-            </w:r>
-          </w:p>
-        </w:tc>
-        <w:tc>
-          <w:tcPr>
-            <w:tcW w:w="2769" w:type="dxa"/>
-          </w:tcPr>
-          <w:p>
-            <w:pPr>
-              <w:keepNext/>
-              <w:spacing w:after="0" w:line="240" w:lineRule="auto"/>
-              <w:jc w:val="center"/>
-              <w:rPr>
-                <w:sz w:val="26"/>
-                <w:szCs w:val="26"/>
-              </w:rPr>
-            </w:pPr>
-            <w:r>
-              <w:t>None; ≤ 20 per hive-day</w:t>
-            </w:r>
-          </w:p>
-        </w:tc>
-      </w:tr>
-      <w:tr>
-        <w:trPr>
-          <w:cantSplit/>
-          <w:jc w:val="center"/>
-        </w:trPr>
-        <w:tc>
-          <w:tcPr>
-            <w:tcW w:w="2769" w:type="dxa"/>
-          </w:tcPr>
-          <w:p>
-            <w:pPr>
-              <w:keepNext/>
-              <w:spacing w:after="0" w:line="240" w:lineRule="auto"/>
-              <w:rPr>
-                <w:sz w:val="26"/>
-                <w:szCs w:val="26"/>
-              </w:rPr>
-            </w:pPr>
-            <w:r>
-              <w:rPr>
-                <w:sz w:val="20"/>
-                <w:szCs w:val="20"/>
-              </w:rPr>
-              <w:t>Swarm alert</w:t>
-            </w:r>
-          </w:p>
-        </w:tc>
-        <w:tc>
-          <w:tcPr>
-            <w:tcW w:w="2769" w:type="dxa"/>
-          </w:tcPr>
-          <w:p>
-            <w:pPr>
-              <w:keepNext/>
-              <w:spacing w:after="0" w:line="240" w:lineRule="auto"/>
-              <w:jc w:val="center"/>
-              <w:rPr>
-                <w:sz w:val="26"/>
-                <w:szCs w:val="26"/>
-              </w:rPr>
-            </w:pPr>
-            <w:r>
-              <w:rPr>
-                <w:sz w:val="20"/>
-                <w:szCs w:val="20"/>
-              </w:rPr>
-              <w:t>Precision / recall of alerts before departure; lead time</w:t>
-            </w:r>
-          </w:p>
-        </w:tc>
-        <w:tc>
-          <w:tcPr>
-            <w:tcW w:w="2769" w:type="dxa"/>
-          </w:tcPr>
-          <w:p>
-            <w:pPr>
-              <w:keepNext/>
-              <w:spacing w:after="0" w:line="240" w:lineRule="auto"/>
-              <w:jc w:val="center"/>
-              <w:rPr>
-                <w:sz w:val="26"/>
-                <w:szCs w:val="26"/>
-              </w:rPr>
-            </w:pPr>
-            <w:r>
-              <w:rPr>
-                <w:sz w:val="20"/>
-                <w:szCs w:val="20"/>
-              </w:rPr>
-              <w:t>&gt; 90% / &gt; 90%; reported</w:t>
-            </w:r>
-          </w:p>
-        </w:tc>
-      </w:tr>
-      <w:tr>
-        <w:trPr>
-          <w:cantSplit/>
-          <w:jc w:val="center"/>
-        </w:trPr>
-        <w:tc>
-          <w:tcPr>
-            <w:tcW w:w="2769" w:type="dxa"/>
-          </w:tcPr>
-          <w:p>
-            <w:pPr>
-              <w:keepNext/>
-              <w:spacing w:after="0" w:line="240" w:lineRule="auto"/>
-              <w:rPr>
-                <w:sz w:val="26"/>
-                <w:szCs w:val="26"/>
-              </w:rPr>
-            </w:pPr>
-            <w:r>
-              <w:rPr>
-                <w:sz w:val="20"/>
-                <w:szCs w:val="20"/>
-              </w:rPr>
-              <w:t>False alarms</w:t>
-            </w:r>
-          </w:p>
-        </w:tc>
-        <w:tc>
-          <w:tcPr>
-            <w:tcW w:w="2769" w:type="dxa"/>
-          </w:tcPr>
-          <w:p>
-            <w:pPr>
-              <w:keepNext/>
-              <w:spacing w:after="0" w:line="240" w:lineRule="auto"/>
-              <w:jc w:val="center"/>
-              <w:rPr>
-                <w:sz w:val="26"/>
-                <w:szCs w:val="26"/>
-              </w:rPr>
-            </w:pPr>
-            <w:r>
-              <w:rPr>
-                <w:sz w:val="20"/>
-                <w:szCs w:val="20"/>
-              </w:rPr>
-              <w:t>Alerts without a matching event</w:t>
-            </w:r>
-          </w:p>
-        </w:tc>
-        <w:tc>
-          <w:tcPr>
-            <w:tcW w:w="2769" w:type="dxa"/>
-          </w:tcPr>
-          <w:p>
-            <w:pPr>
-              <w:keepNext/>
-              <w:spacing w:after="0" w:line="240" w:lineRule="auto"/>
-              <w:jc w:val="center"/>
-              <w:rPr>
-                <w:sz w:val="26"/>
-                <w:szCs w:val="26"/>
-              </w:rPr>
-            </w:pPr>
-            <w:r>
-              <w:t>≤ 1 per hive-week</w:t>
-            </w:r>
-          </w:p>
-        </w:tc>
-      </w:tr>
-      <w:tr>
-        <w:trPr>
-          <w:cantSplit/>
-          <w:jc w:val="center"/>
-        </w:trPr>
-        <w:tc>
-          <w:tcPr>
-            <w:tcW w:w="2769" w:type="dxa"/>
-          </w:tcPr>
-          <w:p>
-            <w:pPr>
-              <w:keepNext/>
-              <w:spacing w:after="0" w:line="240" w:lineRule="auto"/>
-              <w:rPr>
-                <w:sz w:val="26"/>
-                <w:szCs w:val="26"/>
-              </w:rPr>
-            </w:pPr>
-            <w:r>
-              <w:rPr>
-                <w:sz w:val="20"/>
-                <w:szCs w:val="20"/>
-              </w:rPr>
-              <w:t>Wireless</w:t>
-            </w:r>
-          </w:p>
-        </w:tc>
-        <w:tc>
-          <w:tcPr>
-            <w:tcW w:w="2769" w:type="dxa"/>
-          </w:tcPr>
-          <w:p>
-            <w:pPr>
-              <w:keepNext/>
-              <w:spacing w:after="0" w:line="240" w:lineRule="auto"/>
-              <w:jc w:val="center"/>
-              <w:rPr>
-                <w:sz w:val="26"/>
-                <w:szCs w:val="26"/>
-              </w:rPr>
-            </w:pPr>
-            <w:r>
-              <w:rPr>
-                <w:sz w:val="20"/>
-                <w:szCs w:val="20"/>
-              </w:rPr>
-              <w:t>Packet delivery ratio, hive to hub (ESP-NOW)</w:t>
-            </w:r>
-          </w:p>
-        </w:tc>
-        <w:tc>
-          <w:tcPr>
-            <w:tcW w:w="2769" w:type="dxa"/>
-          </w:tcPr>
-          <w:p>
-            <w:pPr>
-              <w:keepNext/>
-              <w:spacing w:after="0" w:line="240" w:lineRule="auto"/>
-              <w:jc w:val="center"/>
-              <w:rPr>
-                <w:sz w:val="26"/>
-                <w:szCs w:val="26"/>
-              </w:rPr>
-            </w:pPr>
-            <w:r>
-              <w:t>≥ 95%</w:t>
-            </w:r>
-          </w:p>
-        </w:tc>
-      </w:tr>
-      <w:tr>
-        <w:trPr>
-          <w:cantSplit/>
-          <w:jc w:val="center"/>
-        </w:trPr>
-        <w:tc>
-          <w:tcPr>
-            <w:tcW w:w="2769" w:type="dxa"/>
-          </w:tcPr>
-          <w:p>
-            <w:pPr>
-              <w:spacing w:after="0" w:line="240" w:lineRule="auto"/>
-              <w:rPr>
-                <w:sz w:val="26"/>
-                <w:szCs w:val="26"/>
-              </w:rPr>
-            </w:pPr>
-            <w:r>
-              <w:rPr>
-                <w:sz w:val="20"/>
-                <w:szCs w:val="20"/>
-              </w:rPr>
-              <w:t>Power / reliability</w:t>
-            </w:r>
-          </w:p>
-        </w:tc>
-        <w:tc>
-          <w:tcPr>
-            <w:tcW w:w="2769" w:type="dxa"/>
-          </w:tcPr>
-          <w:p>
-            <w:pPr>
-              <w:spacing w:after="0" w:line="240" w:lineRule="auto"/>
-              <w:jc w:val="center"/>
-              <w:rPr>
-                <w:sz w:val="26"/>
-                <w:szCs w:val="26"/>
-              </w:rPr>
-            </w:pPr>
-            <w:r>
-              <w:rPr>
-                <w:sz w:val="20"/>
-                <w:szCs w:val="20"/>
-              </w:rPr>
-              <w:t>Projected node battery life; unattended run</w:t>
-            </w:r>
-          </w:p>
-        </w:tc>
-        <w:tc>
-          <w:tcPr>
-            <w:tcW w:w="2769" w:type="dxa"/>
-          </w:tcPr>
-          <w:p>
-            <w:pPr>
-              <w:spacing w:after="0" w:line="240" w:lineRule="auto"/>
-              <w:jc w:val="center"/>
-              <w:rPr>
-                <w:sz w:val="26"/>
-                <w:szCs w:val="26"/>
-              </w:rPr>
-            </w:pPr>
-            <w:r>
-              <w:rPr>
-                <w:sz w:val="20"/>
-                <w:szCs w:val="20"/>
-              </w:rPr>
-              <w:t>≥ 6 months; ≥ 30 days</w:t>
-            </w:r>
-          </w:p>
-        </w:tc>
-      </w:tr>
-    </w:tbl>
+          <w:b w:val="0"/>
+          <w:bCs w:val="0"/>
+          <w:i w:val="1"/>
+          <w:iCs w:val="1"/>
+          <w:sz w:val="22"/>
+          <w:szCs w:val="22"/>
+          <w:rtl w:val="0"/>
+        </w:rPr>
+        <w:t xml:space="preserve">R</w:t>
+      </w:r>
+      <w:r>
+        <w:rPr>
+          <w:b w:val="0"/>
+          <w:bCs w:val="0"/>
+          <w:i w:val="0"/>
+          <w:iCs w:val="0"/>
+          <w:sz w:val="22"/>
+          <w:szCs w:val="22"/>
+          <w:rtl w:val="0"/>
+        </w:rPr>
+        <w:t xml:space="preserve"> = TP/(TP+FN) per swarm, with the lead time reported; the departure rule is also tested with controlled removal of known masses (0.5–2 kg). Event wakes and false alarms are counted per hive-day. Thresholds are tuned on the first weeks. The packet delivery ratio (PDR) is computed from sequence numbers, and the hub logs its battery voltage to check the solar energy balance. Acceptance targets are listed in Table I and frozen before the field evaluation.</w:t>
+      </w:r>
+    </w:p>
     <w:p>
       <w:pPr>
         <w:keepNext/>
@@ -4546,7 +4855,23 @@
           <w:sz w:val="20"/>
           <w:szCs w:val="20"/>
         </w:rPr>
-        <w:t xml:space="preserve">, "A smart sensor-based measurement system for advanced bee hive monitoring," </w:t>
+        <w:t xml:space="preserve">, "A smart sensor-based measurement system for advanced </w:t>
+      </w:r>
+      <w:proofErr w:type="gramStart"/>
+      <w:r>
+        <w:rPr>
+          <w:sz w:val="20"/>
+          <w:szCs w:val="20"/>
+        </w:rPr>
+        <w:t>bee hive</w:t>
+      </w:r>
+      <w:proofErr w:type="gramEnd"/>
+      <w:r>
+        <w:rPr>
+          <w:sz w:val="20"/>
+          <w:szCs w:val="20"/>
+        </w:rPr>
+        <w:t xml:space="preserve"> monitoring," </w:t>
       </w:r>
       <w:r>
         <w:rPr>

</xml_diff>

<commit_message>
vault backup: 2026-10-25 17:30:53
Affected files:
.obsidian/plugins/word-reader/data.json
docs/pdr-2027-165.docx
docs/~$r-2027-165.docx
</commit_message>
<xml_diff>
--- a/docs/pdr-2027-165.docx
+++ b/docs/pdr-2027-165.docx
@@ -2706,10 +2706,13 @@
         <w:rPr>
           <w:b/>
           <w:bCs/>
-          <w:sz w:val="22"/>
-          <w:szCs w:val="22"/>
-        </w:rPr>
-        <w:t>3.1 Event-Driven Acquisition, Signal Processing and Detection</w:t>
+          <w:i w:val="0"/>
+          <w:iCs w:val="0"/>
+          <w:sz w:val="22"/>
+          <w:szCs w:val="22"/>
+          <w:rtl w:val="0"/>
+        </w:rPr>
+        <w:t xml:space="preserve">3.1 Acquisition and Detection</w:t>
       </w:r>
     </w:p>
     <w:p>
@@ -2721,205 +2724,128 @@
           <w:szCs w:val="22"/>
         </w:rPr>
       </w:pPr>
-      <w:r>
-        <w:rPr>
-          <w:sz w:val="22"/>
-          <w:szCs w:val="22"/>
-        </w:rPr>
-        <w:t xml:space="preserve">The node wakes periodically every </w:t>
-      </w:r>
-      <w:r>
-        <w:rPr>
-          <w:i/>
-          <w:iCs/>
-          <w:sz w:val="22"/>
-          <w:szCs w:val="22"/>
-        </w:rPr>
-        <w:t>T</w:t>
-      </w:r>
-      <w:r>
-        <w:rPr>
-          <w:i/>
-          <w:iCs/>
+      <w:proofErr w:type="spellStart"/>
+      <w:proofErr w:type="spellEnd"/>
+      <w:r>
+        <w:rPr>
+          <w:b w:val="0"/>
+          <w:bCs w:val="0"/>
+          <w:i w:val="0"/>
+          <w:iCs w:val="0"/>
+          <w:sz w:val="22"/>
+          <w:szCs w:val="22"/>
+          <w:rtl w:val="0"/>
+        </w:rPr>
+        <w:t xml:space="preserve">The node wakes every 15 min and whenever the wake circuit detects a vibration burst; after an event it ignores new triggers for 20 min. On each wake it records 10 s from the piezo and the microphone and reads the weight and temperature. For each channel it computes the power spectral density </w:t>
+      </w:r>
+      <w:r>
+        <w:rPr>
+          <w:b w:val="0"/>
+          <w:bCs w:val="0"/>
+          <w:i w:val="1"/>
+          <w:iCs w:val="1"/>
+          <w:sz w:val="22"/>
+          <w:szCs w:val="22"/>
+          <w:rtl w:val="0"/>
+        </w:rPr>
+        <w:t xml:space="preserve">S</w:t>
+      </w:r>
+      <w:r>
+        <w:rPr>
+          <w:b w:val="0"/>
+          <w:bCs w:val="0"/>
+          <w:i w:val="0"/>
+          <w:iCs w:val="0"/>
+          <w:sz w:val="22"/>
+          <w:szCs w:val="22"/>
+          <w:rtl w:val="0"/>
+        </w:rPr>
+        <w:t xml:space="preserve">(</w:t>
+      </w:r>
+      <w:r>
+        <w:rPr>
+          <w:b w:val="0"/>
+          <w:bCs w:val="0"/>
+          <w:i w:val="1"/>
+          <w:iCs w:val="1"/>
+          <w:sz w:val="22"/>
+          <w:szCs w:val="22"/>
+          <w:rtl w:val="0"/>
+        </w:rPr>
+        <w:t xml:space="preserve">f</w:t>
+      </w:r>
+      <w:r>
+        <w:rPr>
+          <w:b w:val="0"/>
+          <w:bCs w:val="0"/>
+          <w:i w:val="0"/>
+          <w:iCs w:val="0"/>
+          <w:sz w:val="22"/>
+          <w:szCs w:val="22"/>
+          <w:rtl w:val="0"/>
+        </w:rPr>
+        <w:t xml:space="preserve">) with an FFT and sums it into </w:t>
+      </w:r>
+      <w:r>
+        <w:rPr>
+          <w:b w:val="0"/>
+          <w:bCs w:val="0"/>
+          <w:i w:val="1"/>
+          <w:iCs w:val="1"/>
+          <w:sz w:val="22"/>
+          <w:szCs w:val="22"/>
+          <w:rtl w:val="0"/>
+        </w:rPr>
+        <w:t xml:space="preserve">K</w:t>
+      </w:r>
+      <w:r>
+        <w:rPr>
+          <w:b w:val="0"/>
+          <w:bCs w:val="0"/>
+          <w:i w:val="0"/>
+          <w:iCs w:val="0"/>
+          <w:sz w:val="22"/>
+          <w:szCs w:val="22"/>
+          <w:rtl w:val="0"/>
+        </w:rPr>
+        <w:t xml:space="preserve"> = 24 frequency bands </w:t>
+      </w:r>
+      <w:r>
+        <w:rPr>
+          <w:b w:val="0"/>
+          <w:bCs w:val="0"/>
+          <w:i w:val="1"/>
+          <w:iCs w:val="1"/>
+          <w:sz w:val="22"/>
+          <w:szCs w:val="22"/>
+          <w:rtl w:val="0"/>
+        </w:rPr>
+        <w:t xml:space="preserve">B</w:t>
+      </w:r>
+      <w:r>
+        <w:rPr>
+          <w:b w:val="0"/>
+          <w:bCs w:val="0"/>
+          <w:i w:val="1"/>
+          <w:iCs w:val="1"/>
           <w:sz w:val="22"/>
           <w:szCs w:val="22"/>
           <w:vertAlign w:val="subscript"/>
-        </w:rPr>
-        <w:t>c</w:t>
-      </w:r>
-      <w:r>
-        <w:rPr>
-          <w:sz w:val="22"/>
-          <w:szCs w:val="22"/>
-        </w:rPr>
-        <w:t xml:space="preserve"> = 15 min and on events from the wake circuit; after an event wake it ignores further triggers for 20 min, so a long disturbance costs one acquisition. On every wake it records </w:t>
-      </w:r>
-      <w:r>
-        <w:rPr>
-          <w:i/>
-          <w:iCs/>
-          <w:sz w:val="22"/>
-          <w:szCs w:val="22"/>
-        </w:rPr>
-        <w:t>T</w:t>
-      </w:r>
-      <w:r>
-        <w:rPr>
-          <w:i/>
-          <w:iCs/>
-          <w:sz w:val="22"/>
-          <w:szCs w:val="22"/>
-          <w:vertAlign w:val="subscript"/>
-        </w:rPr>
-        <w:t>a</w:t>
-      </w:r>
-      <w:r>
-        <w:rPr>
-          <w:sz w:val="22"/>
-          <w:szCs w:val="22"/>
-        </w:rPr>
-        <w:t xml:space="preserve"> = 10 s of piezo signal at </w:t>
-      </w:r>
-      <w:r>
-        <w:rPr>
-          <w:i/>
-          <w:iCs/>
-          <w:sz w:val="22"/>
-          <w:szCs w:val="22"/>
-        </w:rPr>
-        <w:t>f</w:t>
-      </w:r>
-      <w:r>
-        <w:rPr>
-          <w:i/>
-          <w:iCs/>
-          <w:sz w:val="22"/>
-          <w:szCs w:val="22"/>
-          <w:vertAlign w:val="subscript"/>
-        </w:rPr>
-        <w:t>s</w:t>
-      </w:r>
-      <w:r>
-        <w:rPr>
-          <w:sz w:val="22"/>
-          <w:szCs w:val="22"/>
-        </w:rPr>
-        <w:t xml:space="preserve"> = 2 kHz (ADC with DMA) and of microphone signal (decimated to 2 kHz), and averages the weight over 1 s. For each channel the power spectral density </w:t>
-      </w:r>
-      <w:r>
-        <w:rPr>
-          <w:i/>
-          <w:iCs/>
-          <w:sz w:val="22"/>
-          <w:szCs w:val="22"/>
-        </w:rPr>
-        <w:t>S</w:t>
-      </w:r>
-      <w:r>
-        <w:rPr>
-          <w:sz w:val="22"/>
-          <w:szCs w:val="22"/>
-        </w:rPr>
-        <w:t>(</w:t>
-      </w:r>
-      <w:r>
-        <w:rPr>
-          <w:i/>
-          <w:iCs/>
-          <w:sz w:val="22"/>
-          <w:szCs w:val="22"/>
-        </w:rPr>
-        <w:t>f</w:t>
-      </w:r>
-      <w:r>
-        <w:rPr>
-          <w:sz w:val="22"/>
-          <w:szCs w:val="22"/>
-        </w:rPr>
-        <w:t xml:space="preserve">) is estimated with Welch's method (1024-point Hann windows, 50% overlap, </w:t>
-      </w:r>
-      <w:proofErr w:type="spellStart"/>
-      <w:r>
-        <w:rPr>
-          <w:sz w:val="22"/>
-          <w:szCs w:val="22"/>
-        </w:rPr>
-        <w:t>Δ</w:t>
-      </w:r>
-      <w:r>
-        <w:rPr>
-          <w:i/>
-          <w:iCs/>
-          <w:sz w:val="22"/>
-          <w:szCs w:val="22"/>
-        </w:rPr>
-        <w:t>f</w:t>
-      </w:r>
-      <w:proofErr w:type="spellEnd"/>
-      <w:r>
-        <w:rPr>
-          <w:sz w:val="22"/>
-          <w:szCs w:val="22"/>
-        </w:rPr>
-        <w:t xml:space="preserve"> ≈ 1.95 Hz) using a fixed-point FFT, since the C3 has no floating-point unit, and reduced to </w:t>
-      </w:r>
-      <w:r>
-        <w:rPr>
-          <w:i/>
-          <w:iCs/>
-          <w:sz w:val="22"/>
-          <w:szCs w:val="22"/>
-        </w:rPr>
-        <w:t>K</w:t>
-      </w:r>
-      <w:r>
-        <w:rPr>
-          <w:sz w:val="22"/>
-          <w:szCs w:val="22"/>
-        </w:rPr>
-        <w:t xml:space="preserve"> = 24 logarithmically spaced bands </w:t>
-      </w:r>
-      <w:r>
-        <w:rPr>
-          <w:i/>
-          <w:iCs/>
-          <w:sz w:val="22"/>
-          <w:szCs w:val="22"/>
-        </w:rPr>
-        <w:t>B</w:t>
-      </w:r>
-      <w:r>
-        <w:rPr>
-          <w:i/>
-          <w:iCs/>
-          <w:sz w:val="22"/>
-          <w:szCs w:val="22"/>
-          <w:vertAlign w:val="subscript"/>
-        </w:rPr>
-        <w:t>k</w:t>
-      </w:r>
-      <w:r>
-        <w:rPr>
-          <w:sz w:val="22"/>
-          <w:szCs w:val="22"/>
-        </w:rPr>
-        <w:t xml:space="preserve"> inside </w:t>
-      </w:r>
-      <w:r>
-        <w:rPr>
-          <w:i/>
-          <w:iCs/>
-          <w:sz w:val="22"/>
-          <w:szCs w:val="22"/>
-        </w:rPr>
-        <w:t>B</w:t>
-      </w:r>
-      <w:r>
-        <w:rPr>
-          <w:sz w:val="22"/>
-          <w:szCs w:val="22"/>
-        </w:rPr>
-        <w:t xml:space="preserve"> = 50–800 Hz, which covers the swarming band [2] and queen piping (≈200–500 Hz). Relative band energies cancel sensor coupling and gain:</w:t>
+          <w:rtl w:val="0"/>
+        </w:rPr>
+        <w:t xml:space="preserve">k</w:t>
+      </w:r>
+      <w:r>
+        <w:rPr>
+          <w:b w:val="0"/>
+          <w:bCs w:val="0"/>
+          <w:i w:val="0"/>
+          <w:iCs w:val="0"/>
+          <w:sz w:val="22"/>
+          <w:szCs w:val="22"/>
+          <w:rtl w:val="0"/>
+        </w:rPr>
+        <w:t xml:space="preserve"> between 50 and 800 Hz, the range of the pre-swarm changes [2] and of queen piping. Dividing each band by the total cancels differences in how well the sensor is coupled to the comb:</w:t>
       </w:r>
     </w:p>
     <w:p>
@@ -3379,220 +3305,243 @@
           <w:szCs w:val="22"/>
         </w:rPr>
       </w:pPr>
-      <w:r>
-        <w:rPr>
-          <w:sz w:val="22"/>
-          <w:szCs w:val="22"/>
-        </w:rPr>
-        <w:t xml:space="preserve">Each ≈75-byte payload (band energies of both channels, total powers, weight, temperatures, battery voltage, wake cause) is sent over ESP-NOW. Since colony activity follows a daily cycle [4], the hub compares each feature </w:t>
-      </w:r>
-      <w:r>
-        <w:rPr>
-          <w:i/>
-          <w:iCs/>
-          <w:sz w:val="22"/>
-          <w:szCs w:val="22"/>
-        </w:rPr>
-        <w:t>x</w:t>
-      </w:r>
-      <w:r>
-        <w:rPr>
-          <w:sz w:val="22"/>
-          <w:szCs w:val="22"/>
+      <w:proofErr w:type="spellStart"/>
+      <w:proofErr w:type="spellEnd"/>
+      <w:proofErr w:type="spellStart"/>
+      <w:proofErr w:type="spellEnd"/>
+      <w:proofErr w:type="spellStart"/>
+      <w:proofErr w:type="spellEnd"/>
+      <w:proofErr w:type="spellStart"/>
+      <w:proofErr w:type="spellEnd"/>
+      <w:r>
+        <w:rPr>
+          <w:b w:val="0"/>
+          <w:bCs w:val="0"/>
+          <w:i w:val="0"/>
+          <w:iCs w:val="0"/>
+          <w:sz w:val="22"/>
+          <w:szCs w:val="22"/>
+          <w:rtl w:val="0"/>
+        </w:rPr>
+        <w:t xml:space="preserve">The node sends these band energies, the weight and the temperatures to the hub. Because colony activity follows a daily cycle [4], the hub compares each value </w:t>
+      </w:r>
+      <w:r>
+        <w:rPr>
+          <w:b w:val="0"/>
+          <w:bCs w:val="0"/>
+          <w:i w:val="1"/>
+          <w:iCs w:val="1"/>
+          <w:sz w:val="22"/>
+          <w:szCs w:val="22"/>
+          <w:rtl w:val="0"/>
+        </w:rPr>
+        <w:t xml:space="preserve">x</w:t>
+      </w:r>
+      <w:r>
+        <w:rPr>
+          <w:b w:val="0"/>
+          <w:bCs w:val="0"/>
+          <w:i w:val="0"/>
+          <w:iCs w:val="0"/>
+          <w:sz w:val="22"/>
+          <w:szCs w:val="22"/>
+          <w:rtl w:val="0"/>
         </w:rPr>
         <w:t xml:space="preserve"> with the same hive's mean </w:t>
       </w:r>
-      <w:proofErr w:type="spellStart"/>
-      <w:r>
-        <w:rPr>
-          <w:i/>
-          <w:iCs/>
-          <w:sz w:val="22"/>
-          <w:szCs w:val="22"/>
-        </w:rPr>
-        <w:t>μ</w:t>
-      </w:r>
-      <w:r>
-        <w:rPr>
-          <w:i/>
-          <w:iCs/>
+      <w:r>
+        <w:rPr>
+          <w:b w:val="0"/>
+          <w:bCs w:val="0"/>
+          <w:i w:val="1"/>
+          <w:iCs w:val="1"/>
+          <w:sz w:val="22"/>
+          <w:szCs w:val="22"/>
+          <w:rtl w:val="0"/>
+        </w:rPr>
+        <w:t xml:space="preserve">μ</w:t>
+      </w:r>
+      <w:r>
+        <w:rPr>
+          <w:b w:val="0"/>
+          <w:bCs w:val="0"/>
+          <w:i w:val="1"/>
+          <w:iCs w:val="1"/>
           <w:sz w:val="22"/>
           <w:szCs w:val="22"/>
           <w:vertAlign w:val="subscript"/>
-        </w:rPr>
-        <w:t>h</w:t>
-      </w:r>
-      <w:proofErr w:type="spellEnd"/>
-      <w:r>
-        <w:rPr>
-          <w:sz w:val="22"/>
-          <w:szCs w:val="22"/>
-        </w:rPr>
-        <w:t xml:space="preserve"> and deviation </w:t>
-      </w:r>
-      <w:proofErr w:type="spellStart"/>
-      <w:r>
-        <w:rPr>
-          <w:i/>
-          <w:iCs/>
-          <w:sz w:val="22"/>
-          <w:szCs w:val="22"/>
-        </w:rPr>
-        <w:t>σ</w:t>
-      </w:r>
-      <w:r>
-        <w:rPr>
-          <w:i/>
-          <w:iCs/>
+          <w:rtl w:val="0"/>
+        </w:rPr>
+        <w:t xml:space="preserve">h</w:t>
+      </w:r>
+      <w:r>
+        <w:rPr>
+          <w:b w:val="0"/>
+          <w:bCs w:val="0"/>
+          <w:i w:val="0"/>
+          <w:iCs w:val="0"/>
+          <w:sz w:val="22"/>
+          <w:szCs w:val="22"/>
+          <w:rtl w:val="0"/>
+        </w:rPr>
+        <w:t xml:space="preserve"> and spread </w:t>
+      </w:r>
+      <w:r>
+        <w:rPr>
+          <w:b w:val="0"/>
+          <w:bCs w:val="0"/>
+          <w:i w:val="1"/>
+          <w:iCs w:val="1"/>
+          <w:sz w:val="22"/>
+          <w:szCs w:val="22"/>
+          <w:rtl w:val="0"/>
+        </w:rPr>
+        <w:t xml:space="preserve">σ</w:t>
+      </w:r>
+      <w:r>
+        <w:rPr>
+          <w:b w:val="0"/>
+          <w:bCs w:val="0"/>
+          <w:i w:val="1"/>
+          <w:iCs w:val="1"/>
           <w:sz w:val="22"/>
           <w:szCs w:val="22"/>
           <w:vertAlign w:val="subscript"/>
-        </w:rPr>
-        <w:t>h</w:t>
-      </w:r>
-      <w:proofErr w:type="spellEnd"/>
-      <w:r>
-        <w:rPr>
-          <w:sz w:val="22"/>
-          <w:szCs w:val="22"/>
-        </w:rPr>
-        <w:t xml:space="preserve"> at the same hour of day over the previous 7 days; an anomaly is declared when |</w:t>
-      </w:r>
-      <w:r>
-        <w:rPr>
-          <w:i/>
-          <w:iCs/>
-          <w:sz w:val="22"/>
-          <w:szCs w:val="22"/>
-        </w:rPr>
-        <w:t>z</w:t>
-      </w:r>
-      <w:r>
-        <w:rPr>
-          <w:sz w:val="22"/>
-          <w:szCs w:val="22"/>
-        </w:rPr>
-        <w:t xml:space="preserve">| &gt; 3 for three consecutive reports. A </w:t>
-      </w:r>
-      <w:r>
-        <w:rPr>
-          <w:i/>
-          <w:iCs/>
-          <w:sz w:val="22"/>
-          <w:szCs w:val="22"/>
-        </w:rPr>
-        <w:t>pre-swarm alert</w:t>
-      </w:r>
-      <w:r>
-        <w:rPr>
-          <w:sz w:val="22"/>
-          <w:szCs w:val="22"/>
-        </w:rPr>
-        <w:t xml:space="preserve"> is raised when the band energies in the swarming band (≈100–300 Hz [2]) and the in-hive temperature rise persistently above the hive's own baseline, as reported before swarming in [2]; spectral trends as in [3] are added to extend the warning. A </w:t>
-      </w:r>
-      <w:r>
-        <w:rPr>
-          <w:i/>
-          <w:iCs/>
-          <w:sz w:val="22"/>
-          <w:szCs w:val="22"/>
-        </w:rPr>
-        <w:t>departure</w:t>
-      </w:r>
-      <w:r>
-        <w:rPr>
-          <w:sz w:val="22"/>
-          <w:szCs w:val="22"/>
-        </w:rPr>
-        <w:t xml:space="preserve"> is confirmed when Δ</w:t>
-      </w:r>
-      <w:r>
-        <w:rPr>
-          <w:i/>
-          <w:iCs/>
-          <w:sz w:val="22"/>
-          <w:szCs w:val="22"/>
-        </w:rPr>
-        <w:t>W</w:t>
-      </w:r>
-      <w:r>
-        <w:rPr>
-          <w:sz w:val="22"/>
-          <w:szCs w:val="22"/>
-        </w:rPr>
-        <w:t xml:space="preserve"> &lt; −</w:t>
-      </w:r>
-      <w:proofErr w:type="spellStart"/>
-      <w:r>
-        <w:rPr>
-          <w:i/>
-          <w:iCs/>
-          <w:sz w:val="22"/>
-          <w:szCs w:val="22"/>
-        </w:rPr>
-        <w:t>W</w:t>
-      </w:r>
-      <w:r>
-        <w:rPr>
-          <w:i/>
-          <w:iCs/>
-          <w:sz w:val="22"/>
-          <w:szCs w:val="22"/>
-          <w:vertAlign w:val="subscript"/>
-        </w:rPr>
-        <w:t>th</w:t>
-      </w:r>
-      <w:proofErr w:type="spellEnd"/>
-      <w:r>
-        <w:rPr>
-          <w:sz w:val="22"/>
-          <w:szCs w:val="22"/>
-        </w:rPr>
-        <w:t xml:space="preserve"> within </w:t>
-      </w:r>
-      <w:r>
-        <w:rPr>
-          <w:i/>
-          <w:iCs/>
-          <w:sz w:val="22"/>
-          <w:szCs w:val="22"/>
-        </w:rPr>
-        <w:t>τ</w:t>
-      </w:r>
-      <w:r>
-        <w:rPr>
-          <w:sz w:val="22"/>
-          <w:szCs w:val="22"/>
-        </w:rPr>
-        <w:t xml:space="preserve"> = 30 min together with an event wake; a prime swarm carries roughly 10,000–20,000 bees, about 1–2 kg at ≈0.1 g per bee, so </w:t>
-      </w:r>
-      <w:proofErr w:type="spellStart"/>
-      <w:r>
-        <w:rPr>
-          <w:i/>
-          <w:iCs/>
-          <w:sz w:val="22"/>
-          <w:szCs w:val="22"/>
-        </w:rPr>
-        <w:t>W</w:t>
-      </w:r>
-      <w:r>
-        <w:rPr>
-          <w:i/>
-          <w:iCs/>
-          <w:sz w:val="22"/>
-          <w:szCs w:val="22"/>
-          <w:vertAlign w:val="subscript"/>
-        </w:rPr>
-        <w:t>th</w:t>
-      </w:r>
-      <w:proofErr w:type="spellEnd"/>
-      <w:r>
-        <w:rPr>
-          <w:sz w:val="22"/>
-          <w:szCs w:val="22"/>
-        </w:rPr>
-        <w:t xml:space="preserve"> = 0.8 kg is an initial value. The time from the first alert to the departure is the measured lead time. Logged inspections are excluded, and an empty-hive control platform separates rain and drift [4].</w:t>
+          <w:rtl w:val="0"/>
+        </w:rPr>
+        <w:t xml:space="preserve">h</w:t>
+      </w:r>
+      <w:r>
+        <w:rPr>
+          <w:b w:val="0"/>
+          <w:bCs w:val="0"/>
+          <w:i w:val="0"/>
+          <w:iCs w:val="0"/>
+          <w:sz w:val="22"/>
+          <w:szCs w:val="22"/>
+          <w:rtl w:val="0"/>
+        </w:rPr>
+        <w:t xml:space="preserve"> at the same hour of day over the past week. A </w:t>
+      </w:r>
+      <w:r>
+        <w:rPr>
+          <w:b w:val="0"/>
+          <w:bCs w:val="0"/>
+          <w:i w:val="1"/>
+          <w:iCs w:val="1"/>
+          <w:sz w:val="22"/>
+          <w:szCs w:val="22"/>
+          <w:rtl w:val="0"/>
+        </w:rPr>
+        <w:t xml:space="preserve">pre-swarm alert</w:t>
+      </w:r>
+      <w:r>
+        <w:rPr>
+          <w:b w:val="0"/>
+          <w:bCs w:val="0"/>
+          <w:i w:val="0"/>
+          <w:iCs w:val="0"/>
+          <w:sz w:val="22"/>
+          <w:szCs w:val="22"/>
+          <w:rtl w:val="0"/>
+        </w:rPr>
+        <w:t xml:space="preserve"> is raised when the energy in the swarming band (≈100–300 Hz) and the in-hive temperature stay above this baseline (|</w:t>
+      </w:r>
+      <w:r>
+        <w:rPr>
+          <w:b w:val="0"/>
+          <w:bCs w:val="0"/>
+          <w:i w:val="1"/>
+          <w:iCs w:val="1"/>
+          <w:sz w:val="22"/>
+          <w:szCs w:val="22"/>
+          <w:rtl w:val="0"/>
+        </w:rPr>
+        <w:t xml:space="preserve">z</w:t>
+      </w:r>
+      <w:r>
+        <w:rPr>
+          <w:b w:val="0"/>
+          <w:bCs w:val="0"/>
+          <w:i w:val="0"/>
+          <w:iCs w:val="0"/>
+          <w:sz w:val="22"/>
+          <w:szCs w:val="22"/>
+          <w:rtl w:val="0"/>
+        </w:rPr>
+        <w:t xml:space="preserve">| &gt; 3), as observed before swarming in [2]. A </w:t>
+      </w:r>
+      <w:r>
+        <w:rPr>
+          <w:b w:val="0"/>
+          <w:bCs w:val="0"/>
+          <w:i w:val="1"/>
+          <w:iCs w:val="1"/>
+          <w:sz w:val="22"/>
+          <w:szCs w:val="22"/>
+          <w:rtl w:val="0"/>
+        </w:rPr>
+        <w:t xml:space="preserve">departure</w:t>
+      </w:r>
+      <w:r>
+        <w:rPr>
+          <w:b w:val="0"/>
+          <w:bCs w:val="0"/>
+          <w:i w:val="0"/>
+          <w:iCs w:val="0"/>
+          <w:sz w:val="22"/>
+          <w:szCs w:val="22"/>
+          <w:rtl w:val="0"/>
+        </w:rPr>
+        <w:t xml:space="preserve"> is confirmed when the weight drops by more than 0.8 kg within 30 min (Δ</w:t>
+      </w:r>
+      <w:r>
+        <w:rPr>
+          <w:b w:val="0"/>
+          <w:bCs w:val="0"/>
+          <w:i w:val="1"/>
+          <w:iCs w:val="1"/>
+          <w:sz w:val="22"/>
+          <w:szCs w:val="22"/>
+          <w:rtl w:val="0"/>
+        </w:rPr>
+        <w:t xml:space="preserve">W</w:t>
+      </w:r>
+      <w:r>
+        <w:rPr>
+          <w:b w:val="0"/>
+          <w:bCs w:val="0"/>
+          <w:i w:val="0"/>
+          <w:iCs w:val="0"/>
+          <w:sz w:val="22"/>
+          <w:szCs w:val="22"/>
+          <w:rtl w:val="0"/>
+        </w:rPr>
+        <w:t xml:space="preserve">, with </w:t>
+      </w:r>
+      <w:r>
+        <w:rPr>
+          <w:b w:val="0"/>
+          <w:bCs w:val="0"/>
+          <w:i w:val="1"/>
+          <w:iCs w:val="1"/>
+          <w:sz w:val="22"/>
+          <w:szCs w:val="22"/>
+          <w:rtl w:val="0"/>
+        </w:rPr>
+        <w:t xml:space="preserve">τ</w:t>
+      </w:r>
+      <w:r>
+        <w:rPr>
+          <w:b w:val="0"/>
+          <w:bCs w:val="0"/>
+          <w:i w:val="0"/>
+          <w:iCs w:val="0"/>
+          <w:sz w:val="22"/>
+          <w:szCs w:val="22"/>
+          <w:rtl w:val="0"/>
+        </w:rPr>
+        <w:t xml:space="preserve"> = 30 min) together with a vibration burst, since a prime swarm weighs about 1–2 kg. The time between the first alert and the departure is the lead time.</w:t>
       </w:r>
     </w:p>
     <w:p>
@@ -3608,10 +3557,13 @@
         <w:rPr>
           <w:b/>
           <w:bCs/>
-          <w:sz w:val="22"/>
-          <w:szCs w:val="22"/>
-        </w:rPr>
-        <w:t>3.2 Feasibility – Signal Levels, Data, Link and Power Budgets</w:t>
+          <w:i w:val="0"/>
+          <w:iCs w:val="0"/>
+          <w:sz w:val="22"/>
+          <w:szCs w:val="22"/>
+          <w:rtl w:val="0"/>
+        </w:rPr>
+        <w:t xml:space="preserve">3.2 Feasibility</w:t>
       </w:r>
     </w:p>
     <w:p>
@@ -3623,206 +3575,121 @@
           <w:szCs w:val="22"/>
         </w:rPr>
       </w:pPr>
-      <w:r>
-        <w:rPr>
-          <w:sz w:val="22"/>
-          <w:szCs w:val="22"/>
-        </w:rPr>
-        <w:t xml:space="preserve">The parts are in </w:t>
-      </w:r>
       <w:proofErr w:type="gramStart"/>
-      <w:r>
-        <w:rPr>
-          <w:sz w:val="22"/>
-          <w:szCs w:val="22"/>
-        </w:rPr>
-        <w:t>hand</w:t>
-      </w:r>
       <w:proofErr w:type="gramEnd"/>
-      <w:r>
-        <w:rPr>
-          <w:sz w:val="22"/>
-          <w:szCs w:val="22"/>
-        </w:rPr>
-        <w:t xml:space="preserve"> but no node is built yet, so feasibility is shown from published measurements and datasheet values, each to be replaced by a bench measurement. </w:t>
-      </w:r>
-      <w:r>
-        <w:rPr>
-          <w:i/>
-          <w:iCs/>
-          <w:sz w:val="22"/>
-          <w:szCs w:val="22"/>
-        </w:rPr>
-        <w:t>Signal levels:</w:t>
-      </w:r>
-      <w:r>
-        <w:rPr>
-          <w:sz w:val="22"/>
-          <w:szCs w:val="22"/>
-        </w:rPr>
-        <w:t xml:space="preserve"> comb vibration measured at night with laboratory accelerometers is only 1–5 µm/s² per spectral bin, about ten times weaker on the hive wall [7], and far below the noise of a typical MEMS accelerometer (≈25 µg/√Hz), hence a piezoelectric sensor in the comb. The pre-swarm changes in [2] were found with ordinary in-hive microphones, so our microphone channel is expected to resolve them; whether the piezo chain also resolves the quieter comb vibrations is measured in Stage 1 (fallback: external audio ADC). The departure itself (mass flight, 1–2 kg) gives a robust confirmation. </w:t>
-      </w:r>
-      <w:r>
-        <w:rPr>
-          <w:i/>
-          <w:iCs/>
-          <w:sz w:val="22"/>
-          <w:szCs w:val="22"/>
-        </w:rPr>
-        <w:t>Data and link:</w:t>
-      </w:r>
-      <w:r>
-        <w:rPr>
-          <w:sz w:val="22"/>
-          <w:szCs w:val="22"/>
-        </w:rPr>
-        <w:t xml:space="preserve"> raw data is 4 kB/s per channel; features reduce it to ≈75 bytes per report, one ESP-NOW frame (≤250 bytes, 1 Mbps, MAC-level acknowledgement [8]), so 20 hives need ≈5 MB/month of cellular data. Wood, honey and bees attenuate 2.4 GHz, so the radio sits outside the hive body; range is measured on site first (fallback: LoRa on SPI). </w:t>
-      </w:r>
-      <w:r>
-        <w:rPr>
-          <w:i/>
-          <w:iCs/>
-          <w:sz w:val="22"/>
-          <w:szCs w:val="22"/>
-        </w:rPr>
-        <w:t>Weighing:</w:t>
-      </w:r>
-      <w:r>
-        <w:rPr>
-          <w:sz w:val="22"/>
-          <w:szCs w:val="22"/>
-        </w:rPr>
-        <w:t xml:space="preserve"> four 50 kg cells at 1 mV/V and 3.3 V excitation give 16.5 µV/kg; the HX711 noise of 50 </w:t>
-      </w:r>
       <w:proofErr w:type="spellStart"/>
-      <w:r>
-        <w:rPr>
-          <w:sz w:val="22"/>
-          <w:szCs w:val="22"/>
-        </w:rPr>
-        <w:t>nV</w:t>
-      </w:r>
       <w:proofErr w:type="spellEnd"/>
-      <w:r>
-        <w:rPr>
-          <w:sz w:val="22"/>
-          <w:szCs w:val="22"/>
-        </w:rPr>
-        <w:t xml:space="preserve"> rms at 10 samples/s [9] equals ≈3 g, so load-cell temperature drift will set field accuracy. </w:t>
-      </w:r>
-      <w:r>
-        <w:rPr>
-          <w:i/>
-          <w:iCs/>
-          <w:sz w:val="22"/>
-          <w:szCs w:val="22"/>
-        </w:rPr>
-        <w:t>Node power:</w:t>
-      </w:r>
-      <w:r>
-        <w:rPr>
-          <w:sz w:val="22"/>
-          <w:szCs w:val="22"/>
-        </w:rPr>
-        <w:t xml:space="preserve"> for task currents </w:t>
-      </w:r>
       <w:proofErr w:type="spellStart"/>
-      <w:r>
-        <w:rPr>
-          <w:i/>
-          <w:iCs/>
-          <w:sz w:val="22"/>
-          <w:szCs w:val="22"/>
-        </w:rPr>
-        <w:t>I</w:t>
-      </w:r>
-      <w:r>
-        <w:rPr>
-          <w:i/>
-          <w:iCs/>
-          <w:sz w:val="22"/>
-          <w:szCs w:val="22"/>
-          <w:vertAlign w:val="subscript"/>
-        </w:rPr>
-        <w:t>i</w:t>
-      </w:r>
       <w:proofErr w:type="spellEnd"/>
-      <w:r>
-        <w:rPr>
-          <w:sz w:val="22"/>
-          <w:szCs w:val="22"/>
-        </w:rPr>
-        <w:t xml:space="preserve"> lasting </w:t>
-      </w:r>
       <w:proofErr w:type="spellStart"/>
-      <w:r>
-        <w:rPr>
-          <w:i/>
-          <w:iCs/>
-          <w:sz w:val="22"/>
-          <w:szCs w:val="22"/>
-        </w:rPr>
-        <w:t>t</w:t>
-      </w:r>
-      <w:r>
-        <w:rPr>
-          <w:i/>
-          <w:iCs/>
-          <w:sz w:val="22"/>
-          <w:szCs w:val="22"/>
-          <w:vertAlign w:val="subscript"/>
-        </w:rPr>
-        <w:t>i</w:t>
-      </w:r>
       <w:proofErr w:type="spellEnd"/>
       <w:r>
         <w:rPr>
-          <w:sz w:val="22"/>
-          <w:szCs w:val="22"/>
-        </w:rPr>
-        <w:t xml:space="preserve"> per acquisition, </w:t>
-      </w:r>
-      <w:r>
-        <w:rPr>
-          <w:i/>
-          <w:iCs/>
-          <w:sz w:val="22"/>
-          <w:szCs w:val="22"/>
-        </w:rPr>
-        <w:t>A</w:t>
-      </w:r>
-      <w:r>
-        <w:rPr>
-          <w:sz w:val="22"/>
-          <w:szCs w:val="22"/>
-        </w:rPr>
-        <w:t xml:space="preserve"> acquisitions per day and a continuous current </w:t>
-      </w:r>
-      <w:r>
-        <w:rPr>
-          <w:i/>
-          <w:iCs/>
-          <w:sz w:val="22"/>
-          <w:szCs w:val="22"/>
-        </w:rPr>
-        <w:t>I</w:t>
-      </w:r>
-      <w:r>
-        <w:rPr>
-          <w:i/>
-          <w:iCs/>
-          <w:sz w:val="22"/>
-          <w:szCs w:val="22"/>
-          <w:vertAlign w:val="subscript"/>
-        </w:rPr>
-        <w:t>0</w:t>
-      </w:r>
-      <w:r>
-        <w:rPr>
-          <w:sz w:val="22"/>
-          <w:szCs w:val="22"/>
-        </w:rPr>
-        <w:t>,</w:t>
+          <w:b w:val="0"/>
+          <w:bCs w:val="0"/>
+          <w:i w:val="0"/>
+          <w:iCs w:val="0"/>
+          <w:sz w:val="22"/>
+          <w:szCs w:val="22"/>
+          <w:rtl w:val="0"/>
+        </w:rPr>
+        <w:t xml:space="preserve">No node is built yet, so feasibility is shown from published measurements and datasheet values, to be confirmed on the bench. </w:t>
+      </w:r>
+      <w:r>
+        <w:rPr>
+          <w:b w:val="0"/>
+          <w:bCs w:val="0"/>
+          <w:i w:val="1"/>
+          <w:iCs w:val="1"/>
+          <w:sz w:val="22"/>
+          <w:szCs w:val="22"/>
+          <w:rtl w:val="0"/>
+        </w:rPr>
+        <w:t xml:space="preserve">Sensitivity:</w:t>
+      </w:r>
+      <w:r>
+        <w:rPr>
+          <w:b w:val="0"/>
+          <w:bCs w:val="0"/>
+          <w:i w:val="0"/>
+          <w:iCs w:val="0"/>
+          <w:sz w:val="22"/>
+          <w:szCs w:val="22"/>
+          <w:rtl w:val="0"/>
+        </w:rPr>
+        <w:t xml:space="preserve"> comb vibration at night is only 1–5 µm/s² per frequency bin, ten times weaker on the hive wall [7] and below the noise of typical MEMS accelerometers, so we place a piezoelectric sensor in the comb. The pre-swarm changes in [2] were recorded with ordinary microphones, so the microphone channel is expected to see them; the piezo is tested on a real hive at night in Stage 1. </w:t>
+      </w:r>
+      <w:r>
+        <w:rPr>
+          <w:b w:val="0"/>
+          <w:bCs w:val="0"/>
+          <w:i w:val="1"/>
+          <w:iCs w:val="1"/>
+          <w:sz w:val="22"/>
+          <w:szCs w:val="22"/>
+          <w:rtl w:val="0"/>
+        </w:rPr>
+        <w:t xml:space="preserve">Link:</w:t>
+      </w:r>
+      <w:r>
+        <w:rPr>
+          <w:b w:val="0"/>
+          <w:bCs w:val="0"/>
+          <w:i w:val="0"/>
+          <w:iCs w:val="0"/>
+          <w:sz w:val="22"/>
+          <w:szCs w:val="22"/>
+          <w:rtl w:val="0"/>
+        </w:rPr>
+        <w:t xml:space="preserve"> each report is one short ESP-NOW message [8]; honey and wood attenuate 2.4 GHz, so the radio sits outside the hive and the range is measured on site (fallback: LoRa). </w:t>
+      </w:r>
+      <w:r>
+        <w:rPr>
+          <w:b w:val="0"/>
+          <w:bCs w:val="0"/>
+          <w:i w:val="1"/>
+          <w:iCs w:val="1"/>
+          <w:sz w:val="22"/>
+          <w:szCs w:val="22"/>
+          <w:rtl w:val="0"/>
+        </w:rPr>
+        <w:t xml:space="preserve">Weighing:</w:t>
+      </w:r>
+      <w:r>
+        <w:rPr>
+          <w:b w:val="0"/>
+          <w:bCs w:val="0"/>
+          <w:i w:val="0"/>
+          <w:iCs w:val="0"/>
+          <w:sz w:val="22"/>
+          <w:szCs w:val="22"/>
+          <w:rtl w:val="0"/>
+        </w:rPr>
+        <w:t xml:space="preserve"> the HX711 noise [9] corresponds to about 3 g, well below the 20 g target. </w:t>
+      </w:r>
+      <w:r>
+        <w:rPr>
+          <w:b w:val="0"/>
+          <w:bCs w:val="0"/>
+          <w:i w:val="1"/>
+          <w:iCs w:val="1"/>
+          <w:sz w:val="22"/>
+          <w:szCs w:val="22"/>
+          <w:rtl w:val="0"/>
+        </w:rPr>
+        <w:t xml:space="preserve">Node power:</w:t>
+      </w:r>
+      <w:r>
+        <w:rPr>
+          <w:b w:val="0"/>
+          <w:bCs w:val="0"/>
+          <w:i w:val="0"/>
+          <w:iCs w:val="0"/>
+          <w:sz w:val="22"/>
+          <w:szCs w:val="22"/>
+          <w:rtl w:val="0"/>
+        </w:rPr>
+        <w:t xml:space="preserve"> the average current and battery life are</w:t>
       </w:r>
     </w:p>
     <w:p>
@@ -3837,6 +3704,14 @@
           <w:szCs w:val="22"/>
         </w:rPr>
       </w:pPr>
+      <w:proofErr w:type="spellStart"/>
+      <w:proofErr w:type="spellEnd"/>
+      <w:proofErr w:type="spellStart"/>
+      <w:proofErr w:type="spellEnd"/>
+      <w:proofErr w:type="gramStart"/>
+      <w:proofErr w:type="gramEnd"/>
+      <w:proofErr w:type="spellStart"/>
+      <w:proofErr w:type="spellEnd"/>
       <w:r>
         <w:rPr>
           <w:i/>
@@ -3845,14 +3720,164 @@
           <w:szCs w:val="22"/>
         </w:rPr>
         <w:tab/>
-        <w:t>Ī</w:t>
-      </w:r>
-      <w:r>
-        <w:rPr>
-          <w:sz w:val="22"/>
-          <w:szCs w:val="22"/>
+      </w:r>
+      <w:r>
+        <w:rPr>
+          <w:b w:val="0"/>
+          <w:bCs w:val="0"/>
+          <w:i w:val="1"/>
+          <w:iCs w:val="1"/>
+          <w:sz w:val="22"/>
+          <w:szCs w:val="22"/>
+          <w:rtl w:val="0"/>
+        </w:rPr>
+        <w:t xml:space="preserve">Ī</w:t>
+      </w:r>
+      <w:r>
+        <w:rPr>
+          <w:b w:val="0"/>
+          <w:bCs w:val="0"/>
+          <w:i w:val="0"/>
+          <w:iCs w:val="0"/>
+          <w:sz w:val="22"/>
+          <w:szCs w:val="22"/>
+          <w:rtl w:val="0"/>
         </w:rPr>
         <w:t xml:space="preserve"> = </w:t>
+      </w:r>
+      <w:r>
+        <w:rPr>
+          <w:b w:val="0"/>
+          <w:bCs w:val="0"/>
+          <w:i w:val="1"/>
+          <w:iCs w:val="1"/>
+          <w:sz w:val="22"/>
+          <w:szCs w:val="22"/>
+          <w:rtl w:val="0"/>
+        </w:rPr>
+        <w:t xml:space="preserve">I</w:t>
+      </w:r>
+      <w:r>
+        <w:rPr>
+          <w:b w:val="0"/>
+          <w:bCs w:val="0"/>
+          <w:i w:val="1"/>
+          <w:iCs w:val="1"/>
+          <w:sz w:val="22"/>
+          <w:szCs w:val="22"/>
+          <w:vertAlign w:val="subscript"/>
+          <w:rtl w:val="0"/>
+        </w:rPr>
+        <w:t xml:space="preserve">0</w:t>
+      </w:r>
+      <w:r>
+        <w:rPr>
+          <w:b w:val="0"/>
+          <w:bCs w:val="0"/>
+          <w:i w:val="0"/>
+          <w:iCs w:val="0"/>
+          <w:sz w:val="22"/>
+          <w:szCs w:val="22"/>
+          <w:rtl w:val="0"/>
+        </w:rPr>
+        <w:t xml:space="preserve"> + </w:t>
+      </w:r>
+      <w:r>
+        <w:rPr>
+          <w:b w:val="0"/>
+          <w:bCs w:val="0"/>
+          <w:i w:val="1"/>
+          <w:iCs w:val="1"/>
+          <w:sz w:val="22"/>
+          <w:szCs w:val="22"/>
+          <w:rtl w:val="0"/>
+        </w:rPr>
+        <w:t xml:space="preserve">A Q</w:t>
+      </w:r>
+      <w:r>
+        <w:rPr>
+          <w:b w:val="0"/>
+          <w:bCs w:val="0"/>
+          <w:i w:val="0"/>
+          <w:iCs w:val="0"/>
+          <w:sz w:val="22"/>
+          <w:szCs w:val="22"/>
+          <w:rtl w:val="0"/>
+        </w:rPr>
+        <w:t xml:space="preserve"> / 86 400 s,     </w:t>
+      </w:r>
+      <w:r>
+        <w:rPr>
+          <w:b w:val="0"/>
+          <w:bCs w:val="0"/>
+          <w:i w:val="1"/>
+          <w:iCs w:val="1"/>
+          <w:sz w:val="22"/>
+          <w:szCs w:val="22"/>
+          <w:rtl w:val="0"/>
+        </w:rPr>
+        <w:t xml:space="preserve">T</w:t>
+      </w:r>
+      <w:r>
+        <w:rPr>
+          <w:b w:val="0"/>
+          <w:bCs w:val="0"/>
+          <w:i w:val="0"/>
+          <w:iCs w:val="0"/>
+          <w:sz w:val="22"/>
+          <w:szCs w:val="22"/>
+          <w:vertAlign w:val="subscript"/>
+          <w:rtl w:val="0"/>
+        </w:rPr>
+        <w:t xml:space="preserve">life</w:t>
+      </w:r>
+      <w:r>
+        <w:rPr>
+          <w:b w:val="0"/>
+          <w:bCs w:val="0"/>
+          <w:i w:val="0"/>
+          <w:iCs w:val="0"/>
+          <w:sz w:val="22"/>
+          <w:szCs w:val="22"/>
+          <w:rtl w:val="0"/>
+        </w:rPr>
+        <w:t xml:space="preserve"> = </w:t>
+      </w:r>
+      <w:r>
+        <w:rPr>
+          <w:b w:val="0"/>
+          <w:bCs w:val="0"/>
+          <w:i w:val="1"/>
+          <w:iCs w:val="1"/>
+          <w:sz w:val="22"/>
+          <w:szCs w:val="22"/>
+          <w:rtl w:val="0"/>
+        </w:rPr>
+        <w:t xml:space="preserve">η C</w:t>
+      </w:r>
+      <w:r>
+        <w:rPr>
+          <w:b w:val="0"/>
+          <w:bCs w:val="0"/>
+          <w:i w:val="0"/>
+          <w:iCs w:val="0"/>
+          <w:sz w:val="22"/>
+          <w:szCs w:val="22"/>
+          <w:rtl w:val="0"/>
+        </w:rPr>
+        <w:t xml:space="preserve"> / </w:t>
+      </w:r>
+      <w:r>
+        <w:rPr>
+          <w:b w:val="0"/>
+          <w:bCs w:val="0"/>
+          <w:i w:val="1"/>
+          <w:iCs w:val="1"/>
+          <w:sz w:val="22"/>
+          <w:szCs w:val="22"/>
+          <w:rtl w:val="0"/>
+        </w:rPr>
+        <w:t xml:space="preserve">Ī</w:t>
       </w:r>
       <w:r>
         <w:rPr>
@@ -3861,196 +3886,19 @@
           <w:sz w:val="22"/>
           <w:szCs w:val="22"/>
         </w:rPr>
-        <w:t>I</w:t>
-      </w:r>
-      <w:r>
-        <w:rPr>
-          <w:i/>
-          <w:iCs/>
-          <w:sz w:val="22"/>
-          <w:szCs w:val="22"/>
-          <w:vertAlign w:val="subscript"/>
-        </w:rPr>
-        <w:t>0</w:t>
-      </w:r>
-      <w:r>
-        <w:rPr>
-          <w:sz w:val="22"/>
-          <w:szCs w:val="22"/>
-        </w:rPr>
-        <w:t xml:space="preserve"> + </w:t>
-      </w:r>
-      <w:r>
-        <w:rPr>
-          <w:i/>
-          <w:iCs/>
-          <w:sz w:val="22"/>
-          <w:szCs w:val="22"/>
-        </w:rPr>
-        <w:t>A</w:t>
-      </w:r>
-      <w:r>
-        <w:rPr>
-          <w:sz w:val="22"/>
-          <w:szCs w:val="22"/>
-        </w:rPr>
-        <w:t xml:space="preserve"> </w:t>
-      </w:r>
-      <w:proofErr w:type="spellStart"/>
-      <w:r>
-        <w:rPr>
-          <w:sz w:val="22"/>
-          <w:szCs w:val="22"/>
-        </w:rPr>
-        <w:t>Σ</w:t>
-      </w:r>
-      <w:r>
-        <w:rPr>
-          <w:i/>
-          <w:iCs/>
-          <w:sz w:val="22"/>
-          <w:szCs w:val="22"/>
-          <w:vertAlign w:val="subscript"/>
-        </w:rPr>
-        <w:t>i</w:t>
-      </w:r>
-      <w:proofErr w:type="spellEnd"/>
-      <w:r>
-        <w:rPr>
-          <w:sz w:val="22"/>
-          <w:szCs w:val="22"/>
-        </w:rPr>
-        <w:t xml:space="preserve"> </w:t>
-      </w:r>
-      <w:proofErr w:type="spellStart"/>
-      <w:r>
-        <w:rPr>
-          <w:i/>
-          <w:iCs/>
-          <w:sz w:val="22"/>
-          <w:szCs w:val="22"/>
-        </w:rPr>
-        <w:t>I</w:t>
-      </w:r>
-      <w:r>
-        <w:rPr>
-          <w:i/>
-          <w:iCs/>
-          <w:sz w:val="22"/>
-          <w:szCs w:val="22"/>
-          <w:vertAlign w:val="subscript"/>
-        </w:rPr>
-        <w:t>i</w:t>
-      </w:r>
-      <w:r>
-        <w:rPr>
-          <w:i/>
-          <w:iCs/>
-          <w:sz w:val="22"/>
-          <w:szCs w:val="22"/>
-        </w:rPr>
-        <w:t>t</w:t>
-      </w:r>
-      <w:r>
-        <w:rPr>
-          <w:i/>
-          <w:iCs/>
-          <w:sz w:val="22"/>
-          <w:szCs w:val="22"/>
-          <w:vertAlign w:val="subscript"/>
-        </w:rPr>
-        <w:t>i</w:t>
-      </w:r>
-      <w:proofErr w:type="spellEnd"/>
-      <w:r>
-        <w:rPr>
-          <w:sz w:val="22"/>
-          <w:szCs w:val="22"/>
-        </w:rPr>
-        <w:t xml:space="preserve"> / 86 400 </w:t>
-      </w:r>
-      <w:proofErr w:type="gramStart"/>
-      <w:r>
-        <w:rPr>
-          <w:sz w:val="22"/>
-          <w:szCs w:val="22"/>
-        </w:rPr>
-        <w:t xml:space="preserve">s,   </w:t>
-      </w:r>
-      <w:proofErr w:type="gramEnd"/>
-      <w:r>
-        <w:rPr>
-          <w:sz w:val="22"/>
-          <w:szCs w:val="22"/>
-        </w:rPr>
-        <w:t xml:space="preserve">  </w:t>
-      </w:r>
-      <w:proofErr w:type="spellStart"/>
-      <w:r>
-        <w:rPr>
-          <w:i/>
-          <w:iCs/>
-          <w:sz w:val="22"/>
-          <w:szCs w:val="22"/>
-        </w:rPr>
-        <w:t>T</w:t>
-      </w:r>
-      <w:r>
-        <w:rPr>
-          <w:sz w:val="22"/>
-          <w:szCs w:val="22"/>
-          <w:vertAlign w:val="subscript"/>
-        </w:rPr>
-        <w:t>life</w:t>
-      </w:r>
-      <w:proofErr w:type="spellEnd"/>
-      <w:r>
-        <w:rPr>
-          <w:sz w:val="22"/>
-          <w:szCs w:val="22"/>
-        </w:rPr>
-        <w:t xml:space="preserve"> = </w:t>
-      </w:r>
-      <w:r>
-        <w:rPr>
-          <w:i/>
-          <w:iCs/>
-          <w:sz w:val="22"/>
-          <w:szCs w:val="22"/>
-        </w:rPr>
-        <w:t>η C</w:t>
-      </w:r>
-      <w:r>
-        <w:rPr>
-          <w:sz w:val="22"/>
-          <w:szCs w:val="22"/>
-        </w:rPr>
-        <w:t xml:space="preserve"> / </w:t>
-      </w:r>
-      <w:r>
-        <w:rPr>
-          <w:i/>
-          <w:iCs/>
-          <w:sz w:val="22"/>
-          <w:szCs w:val="22"/>
-        </w:rPr>
-        <w:t>Ī</w:t>
-      </w:r>
-      <w:r>
-        <w:rPr>
-          <w:i/>
-          <w:iCs/>
-          <w:sz w:val="22"/>
-          <w:szCs w:val="22"/>
-        </w:rPr>
         <w:tab/>
       </w:r>
       <w:r>
         <w:rPr>
-          <w:sz w:val="22"/>
-          <w:szCs w:val="22"/>
-        </w:rPr>
-        <w:t>(3)</w:t>
+          <w:b w:val="0"/>
+          <w:bCs w:val="0"/>
+          <w:i w:val="0"/>
+          <w:iCs w:val="0"/>
+          <w:sz w:val="22"/>
+          <w:szCs w:val="22"/>
+          <w:rtl w:val="0"/>
+        </w:rPr>
+        <w:t xml:space="preserve">(3)</w:t>
       </w:r>
     </w:p>
     <w:p>
@@ -4062,150 +3910,182 @@
           <w:szCs w:val="22"/>
         </w:rPr>
       </w:pPr>
-      <w:r>
-        <w:rPr>
-          <w:sz w:val="22"/>
-          <w:szCs w:val="22"/>
-        </w:rPr>
-        <w:t xml:space="preserve">One acquisition </w:t>
-      </w:r>
       <w:proofErr w:type="gramStart"/>
-      <w:r>
-        <w:rPr>
-          <w:sz w:val="22"/>
-          <w:szCs w:val="22"/>
-        </w:rPr>
-        <w:t>costs</w:t>
-      </w:r>
       <w:proofErr w:type="gramEnd"/>
-      <w:r>
-        <w:rPr>
-          <w:sz w:val="22"/>
-          <w:szCs w:val="22"/>
-        </w:rPr>
-        <w:t xml:space="preserve"> ≈0.30 A·s: 22 mA at 80 MHz for the 10 s recording and 28 mA at 160 MHz for ≈1.5 s of FFTs [10], 0.15 s of radio at ≈120 mA average (335 mA TX peak [10]), and the microphone (≈1.4 mA), preamplifier and HX711. With </w:t>
-      </w:r>
-      <w:r>
-        <w:rPr>
-          <w:i/>
-          <w:iCs/>
-          <w:sz w:val="22"/>
-          <w:szCs w:val="22"/>
-        </w:rPr>
-        <w:t>I</w:t>
-      </w:r>
-      <w:r>
-        <w:rPr>
-          <w:i/>
-          <w:iCs/>
+      <w:proofErr w:type="spellStart"/>
+      <w:proofErr w:type="spellEnd"/>
+      <w:proofErr w:type="spellStart"/>
+      <w:proofErr w:type="spellEnd"/>
+      <w:proofErr w:type="spellStart"/>
+      <w:proofErr w:type="spellEnd"/>
+      <w:r>
+        <w:rPr>
+          <w:b w:val="0"/>
+          <w:bCs w:val="0"/>
+          <w:i w:val="0"/>
+          <w:iCs w:val="0"/>
+          <w:sz w:val="22"/>
+          <w:szCs w:val="22"/>
+          <w:rtl w:val="0"/>
+        </w:rPr>
+        <w:t xml:space="preserve">where </w:t>
+      </w:r>
+      <w:r>
+        <w:rPr>
+          <w:b w:val="0"/>
+          <w:bCs w:val="0"/>
+          <w:i w:val="1"/>
+          <w:iCs w:val="1"/>
+          <w:sz w:val="22"/>
+          <w:szCs w:val="22"/>
+          <w:rtl w:val="0"/>
+        </w:rPr>
+        <w:t xml:space="preserve">Q</w:t>
+      </w:r>
+      <w:r>
+        <w:rPr>
+          <w:b w:val="0"/>
+          <w:bCs w:val="0"/>
+          <w:i w:val="0"/>
+          <w:iCs w:val="0"/>
+          <w:sz w:val="22"/>
+          <w:szCs w:val="22"/>
+          <w:rtl w:val="0"/>
+        </w:rPr>
+        <w:t xml:space="preserve"> ≈ 0.3 A·s is the charge of one acquisition, mostly the processor during the 10 s recording [10], </w:t>
+      </w:r>
+      <w:r>
+        <w:rPr>
+          <w:b w:val="0"/>
+          <w:bCs w:val="0"/>
+          <w:i w:val="1"/>
+          <w:iCs w:val="1"/>
+          <w:sz w:val="22"/>
+          <w:szCs w:val="22"/>
+          <w:rtl w:val="0"/>
+        </w:rPr>
+        <w:t xml:space="preserve">A</w:t>
+      </w:r>
+      <w:r>
+        <w:rPr>
+          <w:b w:val="0"/>
+          <w:bCs w:val="0"/>
+          <w:i w:val="0"/>
+          <w:iCs w:val="0"/>
+          <w:sz w:val="22"/>
+          <w:szCs w:val="22"/>
+          <w:rtl w:val="0"/>
+        </w:rPr>
+        <w:t xml:space="preserve"> the number of acquisitions per day and </w:t>
+      </w:r>
+      <w:r>
+        <w:rPr>
+          <w:b w:val="0"/>
+          <w:bCs w:val="0"/>
+          <w:i w:val="1"/>
+          <w:iCs w:val="1"/>
+          <w:sz w:val="22"/>
+          <w:szCs w:val="22"/>
+          <w:rtl w:val="0"/>
+        </w:rPr>
+        <w:t xml:space="preserve">I</w:t>
+      </w:r>
+      <w:r>
+        <w:rPr>
+          <w:b w:val="0"/>
+          <w:bCs w:val="0"/>
+          <w:i w:val="1"/>
+          <w:iCs w:val="1"/>
           <w:sz w:val="22"/>
           <w:szCs w:val="22"/>
           <w:vertAlign w:val="subscript"/>
-        </w:rPr>
-        <w:t>0</w:t>
-      </w:r>
-      <w:r>
-        <w:rPr>
-          <w:sz w:val="22"/>
-          <w:szCs w:val="22"/>
-        </w:rPr>
-        <w:t xml:space="preserve"> = 22 µA (2 µA wake circuit, 5 µA chip [10], LDO and leakage) and 96 periodic acquisitions per day, </w:t>
-      </w:r>
-      <w:r>
-        <w:rPr>
-          <w:i/>
-          <w:iCs/>
-          <w:sz w:val="22"/>
-          <w:szCs w:val="22"/>
-        </w:rPr>
-        <w:t>Ī</w:t>
-      </w:r>
-      <w:r>
-        <w:rPr>
-          <w:sz w:val="22"/>
-          <w:szCs w:val="22"/>
-        </w:rPr>
-        <w:t xml:space="preserve"> ≈ 0.35 mA, and one 3000 </w:t>
-      </w:r>
-      <w:proofErr w:type="spellStart"/>
-      <w:r>
-        <w:rPr>
-          <w:sz w:val="22"/>
-          <w:szCs w:val="22"/>
-        </w:rPr>
-        <w:t>mAh</w:t>
-      </w:r>
-      <w:proofErr w:type="spellEnd"/>
-      <w:r>
-        <w:rPr>
-          <w:sz w:val="22"/>
-          <w:szCs w:val="22"/>
-        </w:rPr>
-        <w:t xml:space="preserve"> cell with </w:t>
-      </w:r>
-      <w:r>
-        <w:rPr>
-          <w:i/>
-          <w:iCs/>
-          <w:sz w:val="22"/>
-          <w:szCs w:val="22"/>
-        </w:rPr>
-        <w:t>η</w:t>
-      </w:r>
-      <w:r>
-        <w:rPr>
-          <w:sz w:val="22"/>
-          <w:szCs w:val="22"/>
-        </w:rPr>
-        <w:t xml:space="preserve"> = 0.8 lasts ≈285 days; each extra event wake costs ≈3.4 µA, so the six-month target holds up to ≈60 event wakes per day (Fig. 2), which the adaptive threshold and 20-min hold-off keep well below. </w:t>
-      </w:r>
-      <w:r>
-        <w:rPr>
-          <w:i/>
-          <w:iCs/>
-          <w:sz w:val="22"/>
-          <w:szCs w:val="22"/>
-        </w:rPr>
-        <w:t>Hub power:</w:t>
-      </w:r>
-      <w:r>
-        <w:rPr>
-          <w:sz w:val="22"/>
-          <w:szCs w:val="22"/>
-        </w:rPr>
-        <w:t xml:space="preserve"> continuous receive plus the modem draw ≈0.5 W (≈12 </w:t>
-      </w:r>
-      <w:proofErr w:type="spellStart"/>
-      <w:r>
-        <w:rPr>
-          <w:sz w:val="22"/>
-          <w:szCs w:val="22"/>
-        </w:rPr>
-        <w:t>Wh</w:t>
-      </w:r>
-      <w:proofErr w:type="spellEnd"/>
-      <w:r>
-        <w:rPr>
-          <w:sz w:val="22"/>
-          <w:szCs w:val="22"/>
-        </w:rPr>
-        <w:t xml:space="preserve">/day) against ≈45 </w:t>
-      </w:r>
-      <w:proofErr w:type="spellStart"/>
-      <w:r>
-        <w:rPr>
-          <w:sz w:val="22"/>
-          <w:szCs w:val="22"/>
-        </w:rPr>
-        <w:t>Wh</w:t>
-      </w:r>
-      <w:proofErr w:type="spellEnd"/>
-      <w:r>
-        <w:rPr>
-          <w:sz w:val="22"/>
-          <w:szCs w:val="22"/>
-        </w:rPr>
-        <w:t>/day from the panel (5 full-sun hours, 60% conversion); three 18650 cells cover two days without sun.</w:t>
+          <w:rtl w:val="0"/>
+        </w:rPr>
+        <w:t xml:space="preserve">0</w:t>
+      </w:r>
+      <w:r>
+        <w:rPr>
+          <w:b w:val="0"/>
+          <w:bCs w:val="0"/>
+          <w:i w:val="0"/>
+          <w:iCs w:val="0"/>
+          <w:sz w:val="22"/>
+          <w:szCs w:val="22"/>
+          <w:rtl w:val="0"/>
+        </w:rPr>
+        <w:t xml:space="preserve"> ≈ 22 µA the sleep and wake-circuit current. With 96 periodic acquisitions per day, </w:t>
+      </w:r>
+      <w:r>
+        <w:rPr>
+          <w:b w:val="0"/>
+          <w:bCs w:val="0"/>
+          <w:i w:val="1"/>
+          <w:iCs w:val="1"/>
+          <w:sz w:val="22"/>
+          <w:szCs w:val="22"/>
+          <w:rtl w:val="0"/>
+        </w:rPr>
+        <w:t xml:space="preserve">Ī</w:t>
+      </w:r>
+      <w:r>
+        <w:rPr>
+          <w:b w:val="0"/>
+          <w:bCs w:val="0"/>
+          <w:i w:val="0"/>
+          <w:iCs w:val="0"/>
+          <w:sz w:val="22"/>
+          <w:szCs w:val="22"/>
+          <w:rtl w:val="0"/>
+        </w:rPr>
+        <w:t xml:space="preserve"> ≈ 0.35 mA, and one 3000 mAh cell (</w:t>
+      </w:r>
+      <w:r>
+        <w:rPr>
+          <w:b w:val="0"/>
+          <w:bCs w:val="0"/>
+          <w:i w:val="1"/>
+          <w:iCs w:val="1"/>
+          <w:sz w:val="22"/>
+          <w:szCs w:val="22"/>
+          <w:rtl w:val="0"/>
+        </w:rPr>
+        <w:t xml:space="preserve">η</w:t>
+      </w:r>
+      <w:r>
+        <w:rPr>
+          <w:b w:val="0"/>
+          <w:bCs w:val="0"/>
+          <w:i w:val="0"/>
+          <w:iCs w:val="0"/>
+          <w:sz w:val="22"/>
+          <w:szCs w:val="22"/>
+          <w:rtl w:val="0"/>
+        </w:rPr>
+        <w:t xml:space="preserve"> = 0.8) lasts about 285 days; the six-month target holds up to about 60 event wakes per day (Fig. 2). </w:t>
+      </w:r>
+      <w:r>
+        <w:rPr>
+          <w:b w:val="0"/>
+          <w:bCs w:val="0"/>
+          <w:i w:val="1"/>
+          <w:iCs w:val="1"/>
+          <w:sz w:val="22"/>
+          <w:szCs w:val="22"/>
+          <w:rtl w:val="0"/>
+        </w:rPr>
+        <w:t xml:space="preserve">Hub:</w:t>
+      </w:r>
+      <w:r>
+        <w:rPr>
+          <w:b w:val="0"/>
+          <w:bCs w:val="0"/>
+          <w:i w:val="0"/>
+          <w:iCs w:val="0"/>
+          <w:sz w:val="22"/>
+          <w:szCs w:val="22"/>
+          <w:rtl w:val="0"/>
+        </w:rPr>
+        <w:t xml:space="preserve"> it draws about 0.5 W, well within the ≈45 Wh/day of the 15 W panel.</w:t>
       </w:r>
     </w:p>
     <w:p>
@@ -4347,7 +4227,7 @@
           <w:szCs w:val="22"/>
           <w:rtl w:val="0"/>
         </w:rPr>
-        <w:t xml:space="preserve"> weighing linearity with reference masses (0–100 kg) and a temperature sweep; piezo and wake chains checked with known tones (100–800 Hz) and bursts from a shaker coupled to a frame; average current measured with a power analyzer over full cycles. </w:t>
+        <w:t xml:space="preserve"> weighing with reference masses and a temperature sweep; piezo and wake circuit with known tones and bursts on a frame; average current with a power analyzer. </w:t>
       </w:r>
       <w:r>
         <w:rPr>
@@ -4371,7 +4251,57 @@
           <w:szCs w:val="22"/>
           <w:rtl w:val="0"/>
         </w:rPr>
-        <w:t xml:space="preserve"> 3–5 instrumented hives and one empty control platform at the cooperating apiary name, from installation through the spring swarming season, including a first night-time recording that compares hive signal with the circuit noise floor. Ground truth: weekly inspection records (queen cells, brood, queen presence), beekeeper reports and, where possible, an entrance camera. A swarm is labeled by an observed departure or by capped queen cells at inspection. A pre-swarm alert is a true positive if it precedes the swarm, giving precision </w:t>
+        <w:t xml:space="preserve"> </w:t>
+      </w:r>
+      <w:r>
+        <w:rPr>
+          <w:b w:val="0"/>
+          <w:bCs w:val="0"/>
+          <w:i w:val="0"/>
+          <w:iCs w:val="0"/>
+          <w:sz w:val="22"/>
+          <w:szCs w:val="22"/>
+          <w:highlight w:val="yellow"/>
+          <w:rtl w:val="0"/>
+        </w:rPr>
+        <w:t xml:space="preserve">3–5</w:t>
+      </w:r>
+      <w:r>
+        <w:rPr>
+          <w:b w:val="0"/>
+          <w:bCs w:val="0"/>
+          <w:i w:val="0"/>
+          <w:iCs w:val="0"/>
+          <w:sz w:val="22"/>
+          <w:szCs w:val="22"/>
+          <w:rtl w:val="0"/>
+        </w:rPr>
+        <w:t xml:space="preserve"> instrumented hives and one empty control platform at the cooperating apiary </w:t>
+      </w:r>
+      <w:r>
+        <w:rPr>
+          <w:b w:val="0"/>
+          <w:bCs w:val="0"/>
+          <w:i w:val="0"/>
+          <w:iCs w:val="0"/>
+          <w:sz w:val="22"/>
+          <w:szCs w:val="22"/>
+          <w:highlight w:val="yellow"/>
+          <w:rtl w:val="0"/>
+        </w:rPr>
+        <w:t xml:space="preserve">name</w:t>
+      </w:r>
+      <w:r>
+        <w:rPr>
+          <w:b w:val="0"/>
+          <w:bCs w:val="0"/>
+          <w:i w:val="0"/>
+          <w:iCs w:val="0"/>
+          <w:sz w:val="22"/>
+          <w:szCs w:val="22"/>
+          <w:rtl w:val="0"/>
+        </w:rPr>
+        <w:t xml:space="preserve">, through the spring swarming season, starting with a night-time recording that compares the hive signal with the circuit noise. Ground truth comes from weekly inspections (queen cells, brood, queen presence) and the beekeeper's reports. A swarm is labeled by an observed departure or by capped queen cells; an alert is a true positive if it precedes the swarm, giving precision </w:t>
       </w:r>
       <w:r>
         <w:rPr>
@@ -4419,7 +4349,7 @@
           <w:szCs w:val="22"/>
           <w:rtl w:val="0"/>
         </w:rPr>
-        <w:t xml:space="preserve"> = TP/(TP+FN) per swarm, with the lead time reported; the departure rule is also tested with controlled removal of known masses (0.5–2 kg). Event wakes and false alarms are counted per hive-day. Thresholds are tuned on the first weeks. The packet delivery ratio (PDR) is computed from sequence numbers, and the hub logs its battery voltage to check the solar energy balance. Acceptance targets are listed in Table I and frozen before the field evaluation.</w:t>
+        <w:t xml:space="preserve"> = TP/(TP+FN), with the lead time reported. The departure rule is also tested by removing known masses (0.5–2 kg). Thresholds are tuned in the first weeks, and the targets in Table I are frozen before the field evaluation.</w:t>
       </w:r>
     </w:p>
     <w:p>

</xml_diff>

<commit_message>
vault backup: 2026-10-25 17:52:19
Affected files:
.obsidian/plugins/word-reader/data.json
docs/pdr-2027-165.docx
docs/~$r-2027-165.docx
</commit_message>
<xml_diff>
--- a/docs/pdr-2027-165.docx
+++ b/docs/pdr-2027-165.docx
@@ -1224,19 +1224,14 @@
           <w:szCs w:val="22"/>
         </w:rPr>
       </w:pPr>
-      <w:proofErr w:type="spellStart"/>
-      <w:proofErr w:type="spellEnd"/>
       <w:r>
         <w:rPr>
           <w:b/>
           <w:bCs/>
-          <w:i w:val="0"/>
-          <w:iCs w:val="0"/>
-          <w:sz w:val="22"/>
-          <w:szCs w:val="22"/>
-          <w:rtl w:val="0"/>
-        </w:rPr>
-        <w:t xml:space="preserve">BeeSense — IoT-Based Acoustic and Weight Monitoring of Honeybee Colonies</w:t>
+          <w:sz w:val="22"/>
+          <w:szCs w:val="22"/>
+        </w:rPr>
+        <w:t>BeeSense — IoT-Based Acoustic and Weight Monitoring of Honeybee Colonies</w:t>
       </w:r>
     </w:p>
     <w:p>
@@ -1305,25 +1300,17 @@
       </w:pPr>
       <w:r>
         <w:rPr>
-          <w:b w:val="1"/>
-          <w:bCs w:val="1"/>
-          <w:i w:val="0"/>
-          <w:iCs w:val="0"/>
-          <w:sz w:val="22"/>
-          <w:szCs w:val="22"/>
-          <w:rtl w:val="0"/>
-        </w:rPr>
-        <w:t xml:space="preserve">Objectives:</w:t>
-      </w:r>
-      <w:r>
-        <w:rPr>
-          <w:b w:val="0"/>
-          <w:bCs w:val="0"/>
-          <w:i w:val="0"/>
-          <w:iCs w:val="0"/>
-          <w:sz w:val="22"/>
-          <w:szCs w:val="22"/>
-          <w:rtl w:val="0"/>
+          <w:b/>
+          <w:bCs/>
+          <w:sz w:val="22"/>
+          <w:szCs w:val="22"/>
+        </w:rPr>
+        <w:t>Objectives:</w:t>
+      </w:r>
+      <w:r>
+        <w:rPr>
+          <w:sz w:val="22"/>
+          <w:szCs w:val="22"/>
         </w:rPr>
         <w:t xml:space="preserve"> (1) alert the beekeeper before a swarm leaves, with precision and recall above 90%; how early this is possible is the research question;</w:t>
       </w:r>
@@ -1339,15 +1326,10 @@
       </w:pPr>
       <w:r>
         <w:rPr>
-          <w:b w:val="0"/>
-          <w:bCs w:val="0"/>
-          <w:i w:val="0"/>
-          <w:iCs w:val="0"/>
-          <w:sz w:val="22"/>
-          <w:szCs w:val="22"/>
-          <w:rtl w:val="0"/>
-        </w:rPr>
-        <w:t xml:space="preserve">(2) operate autonomously at an apiary without mains power or network: node battery life of at least six months, packet delivery of at least 95%, and 30 days without intervention;</w:t>
+          <w:sz w:val="22"/>
+          <w:szCs w:val="22"/>
+        </w:rPr>
+        <w:t>(2) operate autonomously at an apiary without mains power or network: node battery life of at least six months, packet delivery of at least 95%, and 30 days without intervention;</w:t>
       </w:r>
     </w:p>
     <w:p>
@@ -1361,15 +1343,10 @@
       </w:pPr>
       <w:r>
         <w:rPr>
-          <w:b w:val="0"/>
-          <w:bCs w:val="0"/>
-          <w:i w:val="0"/>
-          <w:iCs w:val="0"/>
-          <w:sz w:val="22"/>
-          <w:szCs w:val="22"/>
-          <w:rtl w:val="0"/>
-        </w:rPr>
-        <w:t xml:space="preserve">(3) measure each colony accurately: weight within ±20 g, vibration and sound spectra and temperature, shown per hive on a web dashboard.</w:t>
+          <w:sz w:val="22"/>
+          <w:szCs w:val="22"/>
+        </w:rPr>
+        <w:t>(3) measure each colony accurately: weight within ±20 g, vibration and sound spectra and temperature, shown per hive on a web dashboard.</w:t>
       </w:r>
     </w:p>
     <w:p>
@@ -1428,75 +1405,59 @@
       </w:pPr>
       <w:r>
         <w:rPr>
-          <w:b w:val="0"/>
-          <w:bCs w:val="0"/>
-          <w:i w:val="1"/>
-          <w:iCs w:val="1"/>
-          <w:sz w:val="22"/>
-          <w:szCs w:val="22"/>
-          <w:rtl w:val="0"/>
-        </w:rPr>
-        <w:t xml:space="preserve">Hive node:</w:t>
-      </w:r>
-      <w:r>
-        <w:rPr>
-          <w:b w:val="0"/>
-          <w:bCs w:val="0"/>
-          <w:i w:val="0"/>
-          <w:iCs w:val="0"/>
-          <w:sz w:val="22"/>
-          <w:szCs w:val="22"/>
-          <w:rtl w:val="0"/>
+          <w:i/>
+          <w:iCs/>
+          <w:sz w:val="22"/>
+          <w:szCs w:val="22"/>
+        </w:rPr>
+        <w:t>Hive node:</w:t>
+      </w:r>
+      <w:r>
+        <w:rPr>
+          <w:sz w:val="22"/>
+          <w:szCs w:val="22"/>
         </w:rPr>
         <w:t xml:space="preserve"> an ESP32-C3 microcontroller board powered by one 18650 Li-ion cell, with four sensors: (a) a 27 mm piezoelectric disc pressed into the comb at the center of the hive, where comb vibration is strongest (Section 3.2); (b) a small digital MEMS microphone inside the hive, behind a mesh; (c) four 50 kg load cells under the hive with an HX711 weighing ADC; and (d) DS18B20 temperature probes. The piezo disc also feeds a low-power wake circuit (≈2 µA) that wakes the node when vibration jumps above its usual level; an amplifier prepares the signal for the ADC only while recording. Spectra are computed with a fixed-point FFT, since the C3 has no floating-point unit. </w:t>
       </w:r>
       <w:r>
         <w:rPr>
-          <w:b w:val="0"/>
-          <w:bCs w:val="0"/>
-          <w:i w:val="1"/>
-          <w:iCs w:val="1"/>
-          <w:sz w:val="22"/>
-          <w:szCs w:val="22"/>
-          <w:rtl w:val="0"/>
-        </w:rPr>
-        <w:t xml:space="preserve">Hub:</w:t>
-      </w:r>
-      <w:r>
-        <w:rPr>
-          <w:b w:val="0"/>
-          <w:bCs w:val="0"/>
-          <w:i w:val="0"/>
-          <w:iCs w:val="0"/>
-          <w:sz w:val="22"/>
-          <w:szCs w:val="22"/>
-          <w:rtl w:val="0"/>
+          <w:i/>
+          <w:iCs/>
+          <w:sz w:val="22"/>
+          <w:szCs w:val="22"/>
+        </w:rPr>
+        <w:t>Hub:</w:t>
+      </w:r>
+      <w:r>
+        <w:rPr>
+          <w:sz w:val="22"/>
+          <w:szCs w:val="22"/>
         </w:rPr>
         <w:t xml:space="preserve"> an ESP32-S3 board at the apiary receives the nodes over ESP-NOW (a direct Wi-Fi radio link, no router), uploads over a cellular modem, and runs from an 18 V / 15 W solar panel with a charger and battery. Because the hives stand close together, one hub and one SIM serve a group of hives. </w:t>
       </w:r>
       <w:r>
         <w:rPr>
-          <w:b w:val="0"/>
-          <w:bCs w:val="0"/>
-          <w:i w:val="1"/>
-          <w:iCs w:val="1"/>
-          <w:sz w:val="22"/>
-          <w:szCs w:val="22"/>
-          <w:rtl w:val="0"/>
-        </w:rPr>
-        <w:t xml:space="preserve">Interfaces:</w:t>
-      </w:r>
-      <w:r>
-        <w:rPr>
-          <w:b w:val="0"/>
-          <w:bCs w:val="0"/>
-          <w:i w:val="0"/>
-          <w:iCs w:val="0"/>
-          <w:sz w:val="22"/>
-          <w:szCs w:val="22"/>
-          <w:rtl w:val="0"/>
-        </w:rPr>
-        <w:t xml:space="preserve"> ADC (piezo), I²S (microphone), two-wire serial (HX711), 1-Wire (temperature), GPIO (wake-up), ESP-NOW (node to hub), LTE (hub to cloud).</w:t>
+          <w:i/>
+          <w:iCs/>
+          <w:sz w:val="22"/>
+          <w:szCs w:val="22"/>
+        </w:rPr>
+        <w:t>Interfaces:</w:t>
+      </w:r>
+      <w:r>
+        <w:rPr>
+          <w:sz w:val="22"/>
+          <w:szCs w:val="22"/>
+        </w:rPr>
+        <w:t xml:space="preserve"> ADC (piezo), I²S </w:t>
+      </w:r>
+      <w:r>
+        <w:rPr>
+          <w:sz w:val="22"/>
+          <w:szCs w:val="22"/>
+        </w:rPr>
+        <w:lastRenderedPageBreak/>
+        <w:t>(microphone), two-wire serial (HX711), 1-Wire (temperature), GPIO (wake-up), ESP-NOW (node to hub), LTE (hub to cloud).</w:t>
       </w:r>
     </w:p>
     <w:p>
@@ -1613,13 +1574,10 @@
         <w:rPr>
           <w:b/>
           <w:bCs/>
-          <w:i w:val="0"/>
-          <w:iCs w:val="0"/>
-          <w:sz w:val="22"/>
-          <w:szCs w:val="22"/>
-          <w:rtl w:val="0"/>
-        </w:rPr>
-        <w:t xml:space="preserve">1.4 Performance Specification</w:t>
+          <w:sz w:val="22"/>
+          <w:szCs w:val="22"/>
+        </w:rPr>
+        <w:t>1.4 Performance Specification</w:t>
       </w:r>
     </w:p>
     <w:p>
@@ -1634,15 +1592,10 @@
       </w:pPr>
       <w:r>
         <w:rPr>
-          <w:b w:val="0"/>
-          <w:bCs w:val="0"/>
-          <w:i w:val="0"/>
-          <w:iCs w:val="0"/>
           <w:sz w:val="20"/>
           <w:szCs w:val="20"/>
-          <w:rtl w:val="0"/>
-        </w:rPr>
-        <w:t xml:space="preserve">TABLE I.  BEESENSE PERFORMANCE SPECIFICATION AND ACCEPTANCE TARGETS</w:t>
+        </w:rPr>
+        <w:t>TABLE I.  BEESENSE PERFORMANCE SPECIFICATION AND ACCEPTANCE TARGETS</w:t>
       </w:r>
     </w:p>
     <w:tbl>
@@ -1690,13 +1643,10 @@
               <w:rPr>
                 <w:b/>
                 <w:bCs/>
-                <w:i w:val="0"/>
-                <w:iCs w:val="0"/>
                 <w:sz w:val="20"/>
                 <w:szCs w:val="20"/>
-                <w:rtl w:val="0"/>
-              </w:rPr>
-              <w:t xml:space="preserve">Area</w:t>
+              </w:rPr>
+              <w:t>Area</w:t>
             </w:r>
           </w:p>
         </w:tc>
@@ -1719,13 +1669,10 @@
               <w:rPr>
                 <w:b/>
                 <w:bCs/>
-                <w:i w:val="0"/>
-                <w:iCs w:val="0"/>
                 <w:sz w:val="20"/>
                 <w:szCs w:val="20"/>
-                <w:rtl w:val="0"/>
-              </w:rPr>
-              <w:t xml:space="preserve">Specification</w:t>
+              </w:rPr>
+              <w:t>Specification</w:t>
             </w:r>
           </w:p>
         </w:tc>
@@ -1748,13 +1695,10 @@
               <w:rPr>
                 <w:b/>
                 <w:bCs/>
-                <w:i w:val="0"/>
-                <w:iCs w:val="0"/>
                 <w:sz w:val="20"/>
                 <w:szCs w:val="20"/>
-                <w:rtl w:val="0"/>
-              </w:rPr>
-              <w:t xml:space="preserve">Target</w:t>
+              </w:rPr>
+              <w:t>Target</w:t>
             </w:r>
           </w:p>
         </w:tc>
@@ -1773,19 +1717,16 @@
               <w:keepNext/>
               <w:spacing w:after="0" w:line="240" w:lineRule="auto"/>
               <w:rPr>
-                <w:sz w:val="26"/>
-                <w:szCs w:val="26"/>
-              </w:rPr>
-            </w:pPr>
-            <w:r>
-              <w:rPr>
-                <w:i w:val="0"/>
-                <w:iCs w:val="0"/>
                 <w:sz w:val="20"/>
                 <w:szCs w:val="20"/>
-                <w:rtl w:val="0"/>
-              </w:rPr>
-              <w:t xml:space="preserve">Function</w:t>
+              </w:rPr>
+            </w:pPr>
+            <w:r>
+              <w:rPr>
+                <w:sz w:val="20"/>
+                <w:szCs w:val="20"/>
+              </w:rPr>
+              <w:t>Function</w:t>
             </w:r>
           </w:p>
         </w:tc>
@@ -1799,19 +1740,16 @@
               <w:spacing w:after="0" w:line="240" w:lineRule="auto"/>
               <w:jc w:val="center"/>
               <w:rPr>
-                <w:sz w:val="26"/>
-                <w:szCs w:val="26"/>
-              </w:rPr>
-            </w:pPr>
-            <w:r>
-              <w:rPr>
-                <w:i w:val="0"/>
-                <w:iCs w:val="0"/>
                 <w:sz w:val="20"/>
                 <w:szCs w:val="20"/>
-                <w:rtl w:val="0"/>
-              </w:rPr>
-              <w:t xml:space="preserve">Alerts on approaching swarms before departure; colony anomaly alerts</w:t>
+              </w:rPr>
+            </w:pPr>
+            <w:r>
+              <w:rPr>
+                <w:sz w:val="20"/>
+                <w:szCs w:val="20"/>
+              </w:rPr>
+              <w:t>Alerts on approaching swarms before departure; colony anomaly alerts</w:t>
             </w:r>
           </w:p>
         </w:tc>
@@ -1825,19 +1763,16 @@
               <w:spacing w:after="0" w:line="240" w:lineRule="auto"/>
               <w:jc w:val="center"/>
               <w:rPr>
-                <w:sz w:val="26"/>
-                <w:szCs w:val="26"/>
-              </w:rPr>
-            </w:pPr>
-            <w:r>
-              <w:rPr>
-                <w:i w:val="0"/>
-                <w:iCs w:val="0"/>
                 <w:sz w:val="20"/>
                 <w:szCs w:val="20"/>
-                <w:rtl w:val="0"/>
-              </w:rPr>
-              <w:t xml:space="preserve">Precision / recall &gt; 90%; lead time reported</w:t>
+              </w:rPr>
+            </w:pPr>
+            <w:r>
+              <w:rPr>
+                <w:sz w:val="20"/>
+                <w:szCs w:val="20"/>
+              </w:rPr>
+              <w:t>Precision / recall &gt; 90%; lead time reported</w:t>
             </w:r>
           </w:p>
         </w:tc>
@@ -1856,19 +1791,16 @@
               <w:keepNext/>
               <w:spacing w:after="0" w:line="240" w:lineRule="auto"/>
               <w:rPr>
-                <w:sz w:val="26"/>
-                <w:szCs w:val="26"/>
-              </w:rPr>
-            </w:pPr>
-            <w:r>
-              <w:rPr>
-                <w:i w:val="0"/>
-                <w:iCs w:val="0"/>
                 <w:sz w:val="20"/>
                 <w:szCs w:val="20"/>
-                <w:rtl w:val="0"/>
-              </w:rPr>
-              <w:t xml:space="preserve">Inputs</w:t>
+              </w:rPr>
+            </w:pPr>
+            <w:r>
+              <w:rPr>
+                <w:sz w:val="20"/>
+                <w:szCs w:val="20"/>
+              </w:rPr>
+              <w:t>Inputs</w:t>
             </w:r>
           </w:p>
         </w:tc>
@@ -1882,19 +1814,16 @@
               <w:spacing w:after="0" w:line="240" w:lineRule="auto"/>
               <w:jc w:val="center"/>
               <w:rPr>
-                <w:sz w:val="26"/>
-                <w:szCs w:val="26"/>
-              </w:rPr>
-            </w:pPr>
-            <w:r>
-              <w:rPr>
-                <w:i w:val="0"/>
-                <w:iCs w:val="0"/>
                 <w:sz w:val="20"/>
                 <w:szCs w:val="20"/>
-                <w:rtl w:val="0"/>
-              </w:rPr>
-              <w:t xml:space="preserve">Hive vibration and sound (50–800 Hz), weight (0–200 kg), temperature in and out</w:t>
+              </w:rPr>
+            </w:pPr>
+            <w:r>
+              <w:rPr>
+                <w:sz w:val="20"/>
+                <w:szCs w:val="20"/>
+              </w:rPr>
+              <w:t>Hive vibration and sound (50–800 Hz), weight (0–200 kg), temperature in and out</w:t>
             </w:r>
           </w:p>
         </w:tc>
@@ -1908,17 +1837,16 @@
               <w:spacing w:after="0" w:line="240" w:lineRule="auto"/>
               <w:jc w:val="center"/>
               <w:rPr>
-                <w:sz w:val="26"/>
-                <w:szCs w:val="26"/>
-              </w:rPr>
-            </w:pPr>
-            <w:r>
-              <w:rPr>
-                <w:i w:val="0"/>
-                <w:iCs w:val="0"/>
-                <w:rtl w:val="0"/>
-              </w:rPr>
-              <w:t xml:space="preserve">Weight error ≤ ±20 g</w:t>
+                <w:sz w:val="20"/>
+                <w:szCs w:val="20"/>
+              </w:rPr>
+            </w:pPr>
+            <w:r>
+              <w:rPr>
+                <w:sz w:val="20"/>
+                <w:szCs w:val="20"/>
+              </w:rPr>
+              <w:t>Weight error ≤ ±20 g</w:t>
             </w:r>
           </w:p>
         </w:tc>
@@ -1937,19 +1865,16 @@
               <w:keepNext/>
               <w:spacing w:after="0" w:line="240" w:lineRule="auto"/>
               <w:rPr>
-                <w:sz w:val="26"/>
-                <w:szCs w:val="26"/>
-              </w:rPr>
-            </w:pPr>
-            <w:r>
-              <w:rPr>
-                <w:i w:val="0"/>
-                <w:iCs w:val="0"/>
                 <w:sz w:val="20"/>
                 <w:szCs w:val="20"/>
-                <w:rtl w:val="0"/>
-              </w:rPr>
-              <w:t xml:space="preserve">Outputs</w:t>
+              </w:rPr>
+            </w:pPr>
+            <w:r>
+              <w:rPr>
+                <w:sz w:val="20"/>
+                <w:szCs w:val="20"/>
+              </w:rPr>
+              <w:t>Outputs</w:t>
             </w:r>
           </w:p>
         </w:tc>
@@ -1963,19 +1888,16 @@
               <w:spacing w:after="0" w:line="240" w:lineRule="auto"/>
               <w:jc w:val="center"/>
               <w:rPr>
-                <w:sz w:val="26"/>
-                <w:szCs w:val="26"/>
-              </w:rPr>
-            </w:pPr>
-            <w:r>
-              <w:rPr>
-                <w:i w:val="0"/>
-                <w:iCs w:val="0"/>
                 <w:sz w:val="20"/>
                 <w:szCs w:val="20"/>
-                <w:rtl w:val="0"/>
-              </w:rPr>
-              <w:t xml:space="preserve">Alerts to the beekeeper's phone; per-hive dashboard</w:t>
+              </w:rPr>
+            </w:pPr>
+            <w:r>
+              <w:rPr>
+                <w:sz w:val="20"/>
+                <w:szCs w:val="20"/>
+              </w:rPr>
+              <w:t>Alerts to the beekeeper's phone; per-hive dashboard</w:t>
             </w:r>
           </w:p>
         </w:tc>
@@ -1989,19 +1911,16 @@
               <w:spacing w:after="0" w:line="240" w:lineRule="auto"/>
               <w:jc w:val="center"/>
               <w:rPr>
-                <w:sz w:val="26"/>
-                <w:szCs w:val="26"/>
-              </w:rPr>
-            </w:pPr>
-            <w:r>
-              <w:rPr>
-                <w:i w:val="0"/>
-                <w:iCs w:val="0"/>
                 <w:sz w:val="20"/>
                 <w:szCs w:val="20"/>
-                <w:rtl w:val="0"/>
-              </w:rPr>
-              <w:t xml:space="preserve">False alarms ≤ 1 per hive-week</w:t>
+              </w:rPr>
+            </w:pPr>
+            <w:r>
+              <w:rPr>
+                <w:sz w:val="20"/>
+                <w:szCs w:val="20"/>
+              </w:rPr>
+              <w:t>False alarms ≤ 1 per hive-week</w:t>
             </w:r>
           </w:p>
         </w:tc>
@@ -2020,19 +1939,16 @@
               <w:keepNext/>
               <w:spacing w:after="0" w:line="240" w:lineRule="auto"/>
               <w:rPr>
-                <w:sz w:val="26"/>
-                <w:szCs w:val="26"/>
-              </w:rPr>
-            </w:pPr>
-            <w:r>
-              <w:rPr>
-                <w:i w:val="0"/>
-                <w:iCs w:val="0"/>
                 <w:sz w:val="20"/>
                 <w:szCs w:val="20"/>
-                <w:rtl w:val="0"/>
-              </w:rPr>
-              <w:t xml:space="preserve">Rates</w:t>
+              </w:rPr>
+            </w:pPr>
+            <w:r>
+              <w:rPr>
+                <w:sz w:val="20"/>
+                <w:szCs w:val="20"/>
+              </w:rPr>
+              <w:t>Rates</w:t>
             </w:r>
           </w:p>
         </w:tc>
@@ -2046,19 +1962,16 @@
               <w:spacing w:after="0" w:line="240" w:lineRule="auto"/>
               <w:jc w:val="center"/>
               <w:rPr>
-                <w:sz w:val="26"/>
-                <w:szCs w:val="26"/>
-              </w:rPr>
-            </w:pPr>
-            <w:r>
-              <w:rPr>
-                <w:i w:val="0"/>
-                <w:iCs w:val="0"/>
                 <w:sz w:val="20"/>
                 <w:szCs w:val="20"/>
-                <w:rtl w:val="0"/>
-              </w:rPr>
-              <w:t xml:space="preserve">Report every 15 min and on vibration events (20-min hold-off)</w:t>
+              </w:rPr>
+            </w:pPr>
+            <w:r>
+              <w:rPr>
+                <w:sz w:val="20"/>
+                <w:szCs w:val="20"/>
+              </w:rPr>
+              <w:t>Report every 15 min and on vibration events (20-min hold-off)</w:t>
             </w:r>
           </w:p>
         </w:tc>
@@ -2072,17 +1985,16 @@
               <w:spacing w:after="0" w:line="240" w:lineRule="auto"/>
               <w:jc w:val="center"/>
               <w:rPr>
-                <w:sz w:val="26"/>
-                <w:szCs w:val="26"/>
-              </w:rPr>
-            </w:pPr>
-            <w:r>
-              <w:rPr>
-                <w:i w:val="0"/>
-                <w:iCs w:val="0"/>
-                <w:rtl w:val="0"/>
-              </w:rPr>
-              <w:t xml:space="preserve">No missed departure; ≤ 20 false wakes per hive-day</w:t>
+                <w:sz w:val="20"/>
+                <w:szCs w:val="20"/>
+              </w:rPr>
+            </w:pPr>
+            <w:r>
+              <w:rPr>
+                <w:sz w:val="20"/>
+                <w:szCs w:val="20"/>
+              </w:rPr>
+              <w:t>No missed departure; ≤ 20 false wakes per hive-day</w:t>
             </w:r>
           </w:p>
         </w:tc>
@@ -2101,19 +2013,16 @@
               <w:keepNext/>
               <w:spacing w:after="0" w:line="240" w:lineRule="auto"/>
               <w:rPr>
-                <w:sz w:val="26"/>
-                <w:szCs w:val="26"/>
-              </w:rPr>
-            </w:pPr>
-            <w:r>
-              <w:rPr>
-                <w:i w:val="0"/>
-                <w:iCs w:val="0"/>
                 <w:sz w:val="20"/>
                 <w:szCs w:val="20"/>
-                <w:rtl w:val="0"/>
-              </w:rPr>
-              <w:t xml:space="preserve">Interfaces</w:t>
+              </w:rPr>
+            </w:pPr>
+            <w:r>
+              <w:rPr>
+                <w:sz w:val="20"/>
+                <w:szCs w:val="20"/>
+              </w:rPr>
+              <w:t>Interfaces</w:t>
             </w:r>
           </w:p>
         </w:tc>
@@ -2127,19 +2036,16 @@
               <w:spacing w:after="0" w:line="240" w:lineRule="auto"/>
               <w:jc w:val="center"/>
               <w:rPr>
-                <w:sz w:val="26"/>
-                <w:szCs w:val="26"/>
-              </w:rPr>
-            </w:pPr>
-            <w:r>
-              <w:rPr>
-                <w:i w:val="0"/>
-                <w:iCs w:val="0"/>
                 <w:sz w:val="20"/>
                 <w:szCs w:val="20"/>
-                <w:rtl w:val="0"/>
-              </w:rPr>
-              <w:t xml:space="preserve">Node to hub: ESP-NOW (2.4 GHz); hub to cloud: LTE; web browser</w:t>
+              </w:rPr>
+            </w:pPr>
+            <w:r>
+              <w:rPr>
+                <w:sz w:val="20"/>
+                <w:szCs w:val="20"/>
+              </w:rPr>
+              <w:t>Node to hub: ESP-NOW (2.4 GHz); hub to cloud: LTE; web browser</w:t>
             </w:r>
           </w:p>
         </w:tc>
@@ -2153,17 +2059,16 @@
               <w:spacing w:after="0" w:line="240" w:lineRule="auto"/>
               <w:jc w:val="center"/>
               <w:rPr>
-                <w:sz w:val="26"/>
-                <w:szCs w:val="26"/>
-              </w:rPr>
-            </w:pPr>
-            <w:r>
-              <w:rPr>
-                <w:i w:val="0"/>
-                <w:iCs w:val="0"/>
-                <w:rtl w:val="0"/>
-              </w:rPr>
-              <w:t xml:space="preserve">Packet delivery ≥ 95%</w:t>
+                <w:sz w:val="20"/>
+                <w:szCs w:val="20"/>
+              </w:rPr>
+            </w:pPr>
+            <w:r>
+              <w:rPr>
+                <w:sz w:val="20"/>
+                <w:szCs w:val="20"/>
+              </w:rPr>
+              <w:t>Packet delivery ≥ 95%</w:t>
             </w:r>
           </w:p>
         </w:tc>
@@ -2181,19 +2086,16 @@
             <w:pPr>
               <w:spacing w:after="0" w:line="240" w:lineRule="auto"/>
               <w:rPr>
-                <w:sz w:val="26"/>
-                <w:szCs w:val="26"/>
-              </w:rPr>
-            </w:pPr>
-            <w:r>
-              <w:rPr>
-                <w:i w:val="0"/>
-                <w:iCs w:val="0"/>
                 <w:sz w:val="20"/>
                 <w:szCs w:val="20"/>
-                <w:rtl w:val="0"/>
-              </w:rPr>
-              <w:t xml:space="preserve">Power</w:t>
+              </w:rPr>
+            </w:pPr>
+            <w:r>
+              <w:rPr>
+                <w:sz w:val="20"/>
+                <w:szCs w:val="20"/>
+              </w:rPr>
+              <w:t>Power</w:t>
             </w:r>
           </w:p>
         </w:tc>
@@ -2206,19 +2108,16 @@
               <w:spacing w:after="0" w:line="240" w:lineRule="auto"/>
               <w:jc w:val="center"/>
               <w:rPr>
-                <w:sz w:val="26"/>
-                <w:szCs w:val="26"/>
-              </w:rPr>
-            </w:pPr>
-            <w:r>
-              <w:rPr>
-                <w:i w:val="0"/>
-                <w:iCs w:val="0"/>
                 <w:sz w:val="20"/>
                 <w:szCs w:val="20"/>
-                <w:rtl w:val="0"/>
-              </w:rPr>
-              <w:t xml:space="preserve">Node: one 18650 cell; hub: 18 V / 15 W solar panel and Li-ion pack</w:t>
+              </w:rPr>
+            </w:pPr>
+            <w:r>
+              <w:rPr>
+                <w:sz w:val="20"/>
+                <w:szCs w:val="20"/>
+              </w:rPr>
+              <w:t>Node: one 18650 cell; hub: 18 V / 15 W solar panel and Li-ion pack</w:t>
             </w:r>
           </w:p>
         </w:tc>
@@ -2231,19 +2130,16 @@
               <w:spacing w:after="0" w:line="240" w:lineRule="auto"/>
               <w:jc w:val="center"/>
               <w:rPr>
-                <w:sz w:val="26"/>
-                <w:szCs w:val="26"/>
-              </w:rPr>
-            </w:pPr>
-            <w:r>
-              <w:rPr>
-                <w:i w:val="0"/>
-                <w:iCs w:val="0"/>
                 <w:sz w:val="20"/>
                 <w:szCs w:val="20"/>
-                <w:rtl w:val="0"/>
-              </w:rPr>
-              <w:t xml:space="preserve">Node ≥ 6 months; ≥ 30 days unattended</w:t>
+              </w:rPr>
+            </w:pPr>
+            <w:r>
+              <w:rPr>
+                <w:sz w:val="20"/>
+                <w:szCs w:val="20"/>
+              </w:rPr>
+              <w:t>Node ≥ 6 months; ≥ 30 days unattended</w:t>
             </w:r>
           </w:p>
         </w:tc>
@@ -2261,19 +2157,16 @@
             <w:pPr>
               <w:spacing w:after="0" w:line="240" w:lineRule="auto"/>
               <w:rPr>
-                <w:sz w:val="26"/>
-                <w:szCs w:val="26"/>
-              </w:rPr>
-            </w:pPr>
-            <w:r>
-              <w:rPr>
-                <w:i w:val="0"/>
-                <w:iCs w:val="0"/>
                 <w:sz w:val="20"/>
                 <w:szCs w:val="20"/>
-                <w:rtl w:val="0"/>
-              </w:rPr>
-              <w:t xml:space="preserve">Environment</w:t>
+              </w:rPr>
+            </w:pPr>
+            <w:r>
+              <w:rPr>
+                <w:sz w:val="20"/>
+                <w:szCs w:val="20"/>
+              </w:rPr>
+              <w:t>Environment</w:t>
             </w:r>
           </w:p>
         </w:tc>
@@ -2286,19 +2179,16 @@
               <w:spacing w:after="0" w:line="240" w:lineRule="auto"/>
               <w:jc w:val="center"/>
               <w:rPr>
-                <w:sz w:val="26"/>
-                <w:szCs w:val="26"/>
-              </w:rPr>
-            </w:pPr>
-            <w:r>
-              <w:rPr>
-                <w:i w:val="0"/>
-                <w:iCs w:val="0"/>
                 <w:sz w:val="20"/>
                 <w:szCs w:val="20"/>
-                <w:rtl w:val="0"/>
-              </w:rPr>
-              <w:t xml:space="preserve">Outdoor apiary without mains power or Wi-Fi; sealed enclosures</w:t>
+              </w:rPr>
+            </w:pPr>
+            <w:r>
+              <w:rPr>
+                <w:sz w:val="20"/>
+                <w:szCs w:val="20"/>
+              </w:rPr>
+              <w:t>Outdoor apiary without mains power or Wi-Fi; sealed enclosures</w:t>
             </w:r>
           </w:p>
         </w:tc>
@@ -2311,19 +2201,16 @@
               <w:spacing w:after="0" w:line="240" w:lineRule="auto"/>
               <w:jc w:val="center"/>
               <w:rPr>
-                <w:sz w:val="26"/>
-                <w:szCs w:val="26"/>
-              </w:rPr>
-            </w:pPr>
-            <w:r>
-              <w:rPr>
-                <w:i w:val="0"/>
-                <w:iCs w:val="0"/>
                 <w:sz w:val="20"/>
                 <w:szCs w:val="20"/>
-                <w:rtl w:val="0"/>
-              </w:rPr>
-              <w:t xml:space="preserve">Operation through the spring season</w:t>
+              </w:rPr>
+            </w:pPr>
+            <w:r>
+              <w:rPr>
+                <w:sz w:val="20"/>
+                <w:szCs w:val="20"/>
+              </w:rPr>
+              <w:t>Operation through the spring season</w:t>
             </w:r>
           </w:p>
         </w:tc>
@@ -2357,21 +2244,12 @@
           <w:szCs w:val="22"/>
         </w:rPr>
       </w:pPr>
-      <w:proofErr w:type="gramStart"/>
-      <w:proofErr w:type="gramEnd"/>
-      <w:proofErr w:type="gramStart"/>
-      <w:proofErr w:type="gramEnd"/>
-      <w:r>
-        <w:rPr>
-          <w:b w:val="0"/>
-          <w:bCs w:val="0"/>
-          <w:i w:val="0"/>
-          <w:iCs w:val="0"/>
-          <w:sz w:val="22"/>
-          <w:szCs w:val="22"/>
-          <w:rtl w:val="0"/>
-        </w:rPr>
-        <w:t xml:space="preserve">Ferrari et al. found with in-hive microphones that the power spectral density near 110 Hz rises, and shifts upward in frequency, before swarming [2]. Ramsey et al. placed accelerometers in the heart of the colony and, by tracking how the vibrational spectra evolve, identified colonies preparing to swarm with more than 90% accuracy, up to 30 days ahead [3]. Cecchi et al. built a multi-sensor hive with microphones and weighing to ±10 g, but each hive used a Raspberry Pi drawing about 4 W from mains power [5]. Commercially, BeeHero in-hive sensors measure acoustics and climate and report over Bluetooth Low Energy to a cellular gateway in a closed system [6] (Table II).</w:t>
+      <w:r>
+        <w:rPr>
+          <w:sz w:val="22"/>
+          <w:szCs w:val="22"/>
+        </w:rPr>
+        <w:t>Ferrari et al. found with in-hive microphones that the power spectral density near 110 Hz rises, and shifts upward in frequency, before swarming [2]. Ramsey et al. placed accelerometers in the heart of the colony and, by tracking how the vibrational spectra evolve, identified colonies preparing to swarm with more than 90% accuracy, up to 30 days ahead [3]. Cecchi et al. built a multi-sensor hive with microphones and weighing to ±10 g, but each hive used a Raspberry Pi drawing about 4 W from mains power [5]. Commercially, BeeHero in-hive sensors measure acoustics and climate and report over Bluetooth Low Energy to a cellular gateway in a closed system [6] (Table II).</w:t>
       </w:r>
     </w:p>
     <w:p>
@@ -2382,15 +2260,11 @@
       </w:pPr>
       <w:r>
         <w:rPr>
-          <w:b w:val="0"/>
-          <w:bCs w:val="0"/>
-          <w:i w:val="0"/>
-          <w:iCs w:val="0"/>
           <w:sz w:val="18"/>
           <w:szCs w:val="18"/>
-          <w:rtl w:val="0"/>
-        </w:rPr>
-        <w:t xml:space="preserve">TABLE II.  PRIOR WORK AND WHAT BEESENSE MUST DEMONSTRATE</w:t>
+        </w:rPr>
+        <w:lastRenderedPageBreak/>
+        <w:t>TABLE II.  PRIOR WORK AND WHAT BEESENSE MUST DEMONSTRATE</w:t>
       </w:r>
     </w:p>
     <w:tbl>
@@ -2706,13 +2580,10 @@
         <w:rPr>
           <w:b/>
           <w:bCs/>
-          <w:i w:val="0"/>
-          <w:iCs w:val="0"/>
-          <w:sz w:val="22"/>
-          <w:szCs w:val="22"/>
-          <w:rtl w:val="0"/>
-        </w:rPr>
-        <w:t xml:space="preserve">3.1 Acquisition and Detection</w:t>
+          <w:sz w:val="22"/>
+          <w:szCs w:val="22"/>
+        </w:rPr>
+        <w:t>3.1 Acquisition and Detection</w:t>
       </w:r>
     </w:p>
     <w:p>
@@ -2724,126 +2595,84 @@
           <w:szCs w:val="22"/>
         </w:rPr>
       </w:pPr>
-      <w:proofErr w:type="spellStart"/>
-      <w:proofErr w:type="spellEnd"/>
-      <w:r>
-        <w:rPr>
-          <w:b w:val="0"/>
-          <w:bCs w:val="0"/>
-          <w:i w:val="0"/>
-          <w:iCs w:val="0"/>
-          <w:sz w:val="22"/>
-          <w:szCs w:val="22"/>
-          <w:rtl w:val="0"/>
+      <w:r>
+        <w:rPr>
+          <w:sz w:val="22"/>
+          <w:szCs w:val="22"/>
         </w:rPr>
         <w:t xml:space="preserve">The node wakes every 15 min and whenever the wake circuit detects a vibration burst; after an event it ignores new triggers for 20 min. On each wake it records 10 s from the piezo and the microphone and reads the weight and temperature. For each channel it computes the power spectral density </w:t>
       </w:r>
       <w:r>
         <w:rPr>
-          <w:b w:val="0"/>
-          <w:bCs w:val="0"/>
-          <w:i w:val="1"/>
-          <w:iCs w:val="1"/>
-          <w:sz w:val="22"/>
-          <w:szCs w:val="22"/>
-          <w:rtl w:val="0"/>
-        </w:rPr>
-        <w:t xml:space="preserve">S</w:t>
-      </w:r>
-      <w:r>
-        <w:rPr>
-          <w:b w:val="0"/>
-          <w:bCs w:val="0"/>
-          <w:i w:val="0"/>
-          <w:iCs w:val="0"/>
-          <w:sz w:val="22"/>
-          <w:szCs w:val="22"/>
-          <w:rtl w:val="0"/>
-        </w:rPr>
-        <w:t xml:space="preserve">(</w:t>
-      </w:r>
-      <w:r>
-        <w:rPr>
-          <w:b w:val="0"/>
-          <w:bCs w:val="0"/>
-          <w:i w:val="1"/>
-          <w:iCs w:val="1"/>
-          <w:sz w:val="22"/>
-          <w:szCs w:val="22"/>
-          <w:rtl w:val="0"/>
-        </w:rPr>
-        <w:t xml:space="preserve">f</w:t>
-      </w:r>
-      <w:r>
-        <w:rPr>
-          <w:b w:val="0"/>
-          <w:bCs w:val="0"/>
-          <w:i w:val="0"/>
-          <w:iCs w:val="0"/>
-          <w:sz w:val="22"/>
-          <w:szCs w:val="22"/>
-          <w:rtl w:val="0"/>
+          <w:i/>
+          <w:iCs/>
+          <w:sz w:val="22"/>
+          <w:szCs w:val="22"/>
+        </w:rPr>
+        <w:t>S</w:t>
+      </w:r>
+      <w:r>
+        <w:rPr>
+          <w:sz w:val="22"/>
+          <w:szCs w:val="22"/>
+        </w:rPr>
+        <w:t>(</w:t>
+      </w:r>
+      <w:r>
+        <w:rPr>
+          <w:i/>
+          <w:iCs/>
+          <w:sz w:val="22"/>
+          <w:szCs w:val="22"/>
+        </w:rPr>
+        <w:t>f</w:t>
+      </w:r>
+      <w:r>
+        <w:rPr>
+          <w:sz w:val="22"/>
+          <w:szCs w:val="22"/>
         </w:rPr>
         <w:t xml:space="preserve">) with an FFT and sums it into </w:t>
       </w:r>
       <w:r>
         <w:rPr>
-          <w:b w:val="0"/>
-          <w:bCs w:val="0"/>
-          <w:i w:val="1"/>
-          <w:iCs w:val="1"/>
-          <w:sz w:val="22"/>
-          <w:szCs w:val="22"/>
-          <w:rtl w:val="0"/>
-        </w:rPr>
-        <w:t xml:space="preserve">K</w:t>
-      </w:r>
-      <w:r>
-        <w:rPr>
-          <w:b w:val="0"/>
-          <w:bCs w:val="0"/>
-          <w:i w:val="0"/>
-          <w:iCs w:val="0"/>
-          <w:sz w:val="22"/>
-          <w:szCs w:val="22"/>
-          <w:rtl w:val="0"/>
+          <w:i/>
+          <w:iCs/>
+          <w:sz w:val="22"/>
+          <w:szCs w:val="22"/>
+        </w:rPr>
+        <w:t>K</w:t>
+      </w:r>
+      <w:r>
+        <w:rPr>
+          <w:sz w:val="22"/>
+          <w:szCs w:val="22"/>
         </w:rPr>
         <w:t xml:space="preserve"> = 24 frequency bands </w:t>
       </w:r>
       <w:r>
         <w:rPr>
-          <w:b w:val="0"/>
-          <w:bCs w:val="0"/>
-          <w:i w:val="1"/>
-          <w:iCs w:val="1"/>
-          <w:sz w:val="22"/>
-          <w:szCs w:val="22"/>
-          <w:rtl w:val="0"/>
-        </w:rPr>
-        <w:t xml:space="preserve">B</w:t>
-      </w:r>
-      <w:r>
-        <w:rPr>
-          <w:b w:val="0"/>
-          <w:bCs w:val="0"/>
-          <w:i w:val="1"/>
-          <w:iCs w:val="1"/>
+          <w:i/>
+          <w:iCs/>
+          <w:sz w:val="22"/>
+          <w:szCs w:val="22"/>
+        </w:rPr>
+        <w:t>B</w:t>
+      </w:r>
+      <w:r>
+        <w:rPr>
+          <w:i/>
+          <w:iCs/>
           <w:sz w:val="22"/>
           <w:szCs w:val="22"/>
           <w:vertAlign w:val="subscript"/>
-          <w:rtl w:val="0"/>
-        </w:rPr>
-        <w:t xml:space="preserve">k</w:t>
-      </w:r>
-      <w:r>
-        <w:rPr>
-          <w:b w:val="0"/>
-          <w:bCs w:val="0"/>
-          <w:i w:val="0"/>
-          <w:iCs w:val="0"/>
-          <w:sz w:val="22"/>
-          <w:szCs w:val="22"/>
-          <w:rtl w:val="0"/>
+        </w:rPr>
+        <w:t>k</w:t>
+      </w:r>
+      <w:r>
+        <w:rPr>
+          <w:sz w:val="22"/>
+          <w:szCs w:val="22"/>
         </w:rPr>
         <w:t xml:space="preserve"> between 50 and 800 Hz, the range of the pre-swarm changes [2] and of queen piping. Dividing each band by the total cancels differences in how well the sensor is coupled to the comb:</w:t>
       </w:r>
@@ -3073,7 +2902,6 @@
           <w:sz w:val="22"/>
           <w:szCs w:val="22"/>
         </w:rPr>
-        <w:lastRenderedPageBreak/>
         <w:tab/>
         <w:t>z</w:t>
       </w:r>
@@ -3305,241 +3133,158 @@
           <w:szCs w:val="22"/>
         </w:rPr>
       </w:pPr>
-      <w:proofErr w:type="spellStart"/>
-      <w:proofErr w:type="spellEnd"/>
-      <w:proofErr w:type="spellStart"/>
-      <w:proofErr w:type="spellEnd"/>
-      <w:proofErr w:type="spellStart"/>
-      <w:proofErr w:type="spellEnd"/>
-      <w:proofErr w:type="spellStart"/>
-      <w:proofErr w:type="spellEnd"/>
-      <w:r>
-        <w:rPr>
-          <w:b w:val="0"/>
-          <w:bCs w:val="0"/>
-          <w:i w:val="0"/>
-          <w:iCs w:val="0"/>
-          <w:sz w:val="22"/>
-          <w:szCs w:val="22"/>
-          <w:rtl w:val="0"/>
+      <w:r>
+        <w:rPr>
+          <w:sz w:val="22"/>
+          <w:szCs w:val="22"/>
         </w:rPr>
         <w:t xml:space="preserve">The node sends these band energies, the weight and the temperatures to the hub. Because colony activity follows a daily cycle [4], the hub compares each value </w:t>
       </w:r>
       <w:r>
         <w:rPr>
-          <w:b w:val="0"/>
-          <w:bCs w:val="0"/>
-          <w:i w:val="1"/>
-          <w:iCs w:val="1"/>
-          <w:sz w:val="22"/>
-          <w:szCs w:val="22"/>
-          <w:rtl w:val="0"/>
-        </w:rPr>
-        <w:t xml:space="preserve">x</w:t>
-      </w:r>
-      <w:r>
-        <w:rPr>
-          <w:b w:val="0"/>
-          <w:bCs w:val="0"/>
-          <w:i w:val="0"/>
-          <w:iCs w:val="0"/>
-          <w:sz w:val="22"/>
-          <w:szCs w:val="22"/>
-          <w:rtl w:val="0"/>
+          <w:i/>
+          <w:iCs/>
+          <w:sz w:val="22"/>
+          <w:szCs w:val="22"/>
+        </w:rPr>
+        <w:t>x</w:t>
+      </w:r>
+      <w:r>
+        <w:rPr>
+          <w:sz w:val="22"/>
+          <w:szCs w:val="22"/>
         </w:rPr>
         <w:t xml:space="preserve"> with the same hive's mean </w:t>
       </w:r>
       <w:r>
         <w:rPr>
-          <w:b w:val="0"/>
-          <w:bCs w:val="0"/>
-          <w:i w:val="1"/>
-          <w:iCs w:val="1"/>
-          <w:sz w:val="22"/>
-          <w:szCs w:val="22"/>
-          <w:rtl w:val="0"/>
-        </w:rPr>
-        <w:t xml:space="preserve">μ</w:t>
-      </w:r>
-      <w:r>
-        <w:rPr>
-          <w:b w:val="0"/>
-          <w:bCs w:val="0"/>
-          <w:i w:val="1"/>
-          <w:iCs w:val="1"/>
+          <w:i/>
+          <w:iCs/>
+          <w:sz w:val="22"/>
+          <w:szCs w:val="22"/>
+        </w:rPr>
+        <w:t>μ</w:t>
+      </w:r>
+      <w:r>
+        <w:rPr>
+          <w:i/>
+          <w:iCs/>
           <w:sz w:val="22"/>
           <w:szCs w:val="22"/>
           <w:vertAlign w:val="subscript"/>
-          <w:rtl w:val="0"/>
-        </w:rPr>
-        <w:t xml:space="preserve">h</w:t>
-      </w:r>
-      <w:r>
-        <w:rPr>
-          <w:b w:val="0"/>
-          <w:bCs w:val="0"/>
-          <w:i w:val="0"/>
-          <w:iCs w:val="0"/>
-          <w:sz w:val="22"/>
-          <w:szCs w:val="22"/>
-          <w:rtl w:val="0"/>
+        </w:rPr>
+        <w:t>h</w:t>
+      </w:r>
+      <w:r>
+        <w:rPr>
+          <w:sz w:val="22"/>
+          <w:szCs w:val="22"/>
         </w:rPr>
         <w:t xml:space="preserve"> and spread </w:t>
       </w:r>
       <w:r>
         <w:rPr>
-          <w:b w:val="0"/>
-          <w:bCs w:val="0"/>
-          <w:i w:val="1"/>
-          <w:iCs w:val="1"/>
-          <w:sz w:val="22"/>
-          <w:szCs w:val="22"/>
-          <w:rtl w:val="0"/>
-        </w:rPr>
-        <w:t xml:space="preserve">σ</w:t>
-      </w:r>
-      <w:r>
-        <w:rPr>
-          <w:b w:val="0"/>
-          <w:bCs w:val="0"/>
-          <w:i w:val="1"/>
-          <w:iCs w:val="1"/>
+          <w:i/>
+          <w:iCs/>
+          <w:sz w:val="22"/>
+          <w:szCs w:val="22"/>
+        </w:rPr>
+        <w:t>σ</w:t>
+      </w:r>
+      <w:r>
+        <w:rPr>
+          <w:i/>
+          <w:iCs/>
           <w:sz w:val="22"/>
           <w:szCs w:val="22"/>
           <w:vertAlign w:val="subscript"/>
-          <w:rtl w:val="0"/>
-        </w:rPr>
-        <w:t xml:space="preserve">h</w:t>
-      </w:r>
-      <w:r>
-        <w:rPr>
-          <w:b w:val="0"/>
-          <w:bCs w:val="0"/>
-          <w:i w:val="0"/>
-          <w:iCs w:val="0"/>
-          <w:sz w:val="22"/>
-          <w:szCs w:val="22"/>
-          <w:rtl w:val="0"/>
+        </w:rPr>
+        <w:t>h</w:t>
+      </w:r>
+      <w:r>
+        <w:rPr>
+          <w:sz w:val="22"/>
+          <w:szCs w:val="22"/>
         </w:rPr>
         <w:t xml:space="preserve"> at the same hour of day over the past week. A </w:t>
       </w:r>
       <w:r>
         <w:rPr>
-          <w:b w:val="0"/>
-          <w:bCs w:val="0"/>
-          <w:i w:val="1"/>
-          <w:iCs w:val="1"/>
-          <w:sz w:val="22"/>
-          <w:szCs w:val="22"/>
-          <w:rtl w:val="0"/>
-        </w:rPr>
-        <w:t xml:space="preserve">pre-swarm alert</w:t>
-      </w:r>
-      <w:r>
-        <w:rPr>
-          <w:b w:val="0"/>
-          <w:bCs w:val="0"/>
-          <w:i w:val="0"/>
-          <w:iCs w:val="0"/>
-          <w:sz w:val="22"/>
-          <w:szCs w:val="22"/>
-          <w:rtl w:val="0"/>
+          <w:i/>
+          <w:iCs/>
+          <w:sz w:val="22"/>
+          <w:szCs w:val="22"/>
+        </w:rPr>
+        <w:t>pre-swarm alert</w:t>
+      </w:r>
+      <w:r>
+        <w:rPr>
+          <w:sz w:val="22"/>
+          <w:szCs w:val="22"/>
         </w:rPr>
         <w:t xml:space="preserve"> is raised when the energy in the swarming band (≈100–300 Hz) and the in-hive temperature stay above this baseline (|</w:t>
       </w:r>
       <w:r>
         <w:rPr>
-          <w:b w:val="0"/>
-          <w:bCs w:val="0"/>
-          <w:i w:val="1"/>
-          <w:iCs w:val="1"/>
-          <w:sz w:val="22"/>
-          <w:szCs w:val="22"/>
-          <w:rtl w:val="0"/>
-        </w:rPr>
-        <w:t xml:space="preserve">z</w:t>
-      </w:r>
-      <w:r>
-        <w:rPr>
-          <w:b w:val="0"/>
-          <w:bCs w:val="0"/>
-          <w:i w:val="0"/>
-          <w:iCs w:val="0"/>
-          <w:sz w:val="22"/>
-          <w:szCs w:val="22"/>
-          <w:rtl w:val="0"/>
+          <w:i/>
+          <w:iCs/>
+          <w:sz w:val="22"/>
+          <w:szCs w:val="22"/>
+        </w:rPr>
+        <w:t>z</w:t>
+      </w:r>
+      <w:r>
+        <w:rPr>
+          <w:sz w:val="22"/>
+          <w:szCs w:val="22"/>
         </w:rPr>
         <w:t xml:space="preserve">| &gt; 3), as observed before swarming in [2]. A </w:t>
       </w:r>
       <w:r>
         <w:rPr>
-          <w:b w:val="0"/>
-          <w:bCs w:val="0"/>
-          <w:i w:val="1"/>
-          <w:iCs w:val="1"/>
-          <w:sz w:val="22"/>
-          <w:szCs w:val="22"/>
-          <w:rtl w:val="0"/>
-        </w:rPr>
-        <w:t xml:space="preserve">departure</w:t>
-      </w:r>
-      <w:r>
-        <w:rPr>
-          <w:b w:val="0"/>
-          <w:bCs w:val="0"/>
-          <w:i w:val="0"/>
-          <w:iCs w:val="0"/>
-          <w:sz w:val="22"/>
-          <w:szCs w:val="22"/>
-          <w:rtl w:val="0"/>
+          <w:i/>
+          <w:iCs/>
+          <w:sz w:val="22"/>
+          <w:szCs w:val="22"/>
+        </w:rPr>
+        <w:t>departure</w:t>
+      </w:r>
+      <w:r>
+        <w:rPr>
+          <w:sz w:val="22"/>
+          <w:szCs w:val="22"/>
         </w:rPr>
         <w:t xml:space="preserve"> is confirmed when the weight drops by more than 0.8 kg within 30 min (Δ</w:t>
       </w:r>
       <w:r>
         <w:rPr>
-          <w:b w:val="0"/>
-          <w:bCs w:val="0"/>
-          <w:i w:val="1"/>
-          <w:iCs w:val="1"/>
-          <w:sz w:val="22"/>
-          <w:szCs w:val="22"/>
-          <w:rtl w:val="0"/>
-        </w:rPr>
-        <w:t xml:space="preserve">W</w:t>
-      </w:r>
-      <w:r>
-        <w:rPr>
-          <w:b w:val="0"/>
-          <w:bCs w:val="0"/>
-          <w:i w:val="0"/>
-          <w:iCs w:val="0"/>
-          <w:sz w:val="22"/>
-          <w:szCs w:val="22"/>
-          <w:rtl w:val="0"/>
+          <w:i/>
+          <w:iCs/>
+          <w:sz w:val="22"/>
+          <w:szCs w:val="22"/>
+        </w:rPr>
+        <w:t>W</w:t>
+      </w:r>
+      <w:r>
+        <w:rPr>
+          <w:sz w:val="22"/>
+          <w:szCs w:val="22"/>
         </w:rPr>
         <w:t xml:space="preserve">, with </w:t>
       </w:r>
       <w:r>
         <w:rPr>
-          <w:b w:val="0"/>
-          <w:bCs w:val="0"/>
-          <w:i w:val="1"/>
-          <w:iCs w:val="1"/>
-          <w:sz w:val="22"/>
-          <w:szCs w:val="22"/>
-          <w:rtl w:val="0"/>
-        </w:rPr>
-        <w:t xml:space="preserve">τ</w:t>
-      </w:r>
-      <w:r>
-        <w:rPr>
-          <w:b w:val="0"/>
-          <w:bCs w:val="0"/>
-          <w:i w:val="0"/>
-          <w:iCs w:val="0"/>
-          <w:sz w:val="22"/>
-          <w:szCs w:val="22"/>
-          <w:rtl w:val="0"/>
+          <w:i/>
+          <w:iCs/>
+          <w:sz w:val="22"/>
+          <w:szCs w:val="22"/>
+        </w:rPr>
+        <w:t>τ</w:t>
+      </w:r>
+      <w:r>
+        <w:rPr>
+          <w:sz w:val="22"/>
+          <w:szCs w:val="22"/>
         </w:rPr>
         <w:t xml:space="preserve"> = 30 min) together with a vibration burst, since a prime swarm weighs about 1–2 kg. The time between the first alert and the departure is the lead time.</w:t>
       </w:r>
@@ -3557,13 +3302,10 @@
         <w:rPr>
           <w:b/>
           <w:bCs/>
-          <w:i w:val="0"/>
-          <w:iCs w:val="0"/>
-          <w:sz w:val="22"/>
-          <w:szCs w:val="22"/>
-          <w:rtl w:val="0"/>
-        </w:rPr>
-        <w:t xml:space="preserve">3.2 Feasibility</w:t>
+          <w:sz w:val="22"/>
+          <w:szCs w:val="22"/>
+        </w:rPr>
+        <w:t>3.2 Feasibility</w:t>
       </w:r>
     </w:p>
     <w:p>
@@ -3575,119 +3317,74 @@
           <w:szCs w:val="22"/>
         </w:rPr>
       </w:pPr>
-      <w:proofErr w:type="gramStart"/>
-      <w:proofErr w:type="gramEnd"/>
-      <w:proofErr w:type="spellStart"/>
-      <w:proofErr w:type="spellEnd"/>
-      <w:proofErr w:type="spellStart"/>
-      <w:proofErr w:type="spellEnd"/>
-      <w:proofErr w:type="spellStart"/>
-      <w:proofErr w:type="spellEnd"/>
-      <w:r>
-        <w:rPr>
-          <w:b w:val="0"/>
-          <w:bCs w:val="0"/>
-          <w:i w:val="0"/>
-          <w:iCs w:val="0"/>
-          <w:sz w:val="22"/>
-          <w:szCs w:val="22"/>
-          <w:rtl w:val="0"/>
+      <w:r>
+        <w:rPr>
+          <w:sz w:val="22"/>
+          <w:szCs w:val="22"/>
         </w:rPr>
         <w:t xml:space="preserve">No node is built yet, so feasibility is shown from published measurements and datasheet values, to be confirmed on the bench. </w:t>
       </w:r>
       <w:r>
         <w:rPr>
-          <w:b w:val="0"/>
-          <w:bCs w:val="0"/>
-          <w:i w:val="1"/>
-          <w:iCs w:val="1"/>
-          <w:sz w:val="22"/>
-          <w:szCs w:val="22"/>
-          <w:rtl w:val="0"/>
-        </w:rPr>
-        <w:t xml:space="preserve">Sensitivity:</w:t>
-      </w:r>
-      <w:r>
-        <w:rPr>
-          <w:b w:val="0"/>
-          <w:bCs w:val="0"/>
-          <w:i w:val="0"/>
-          <w:iCs w:val="0"/>
-          <w:sz w:val="22"/>
-          <w:szCs w:val="22"/>
-          <w:rtl w:val="0"/>
+          <w:i/>
+          <w:iCs/>
+          <w:sz w:val="22"/>
+          <w:szCs w:val="22"/>
+        </w:rPr>
+        <w:t>Sensitivity:</w:t>
+      </w:r>
+      <w:r>
+        <w:rPr>
+          <w:sz w:val="22"/>
+          <w:szCs w:val="22"/>
         </w:rPr>
         <w:t xml:space="preserve"> comb vibration at night is only 1–5 µm/s² per frequency bin, ten times weaker on the hive wall [7] and below the noise of typical MEMS accelerometers, so we place a piezoelectric sensor in the comb. The pre-swarm changes in [2] were recorded with ordinary microphones, so the microphone channel is expected to see them; the piezo is tested on a real hive at night in Stage 1. </w:t>
       </w:r>
       <w:r>
         <w:rPr>
-          <w:b w:val="0"/>
-          <w:bCs w:val="0"/>
-          <w:i w:val="1"/>
-          <w:iCs w:val="1"/>
-          <w:sz w:val="22"/>
-          <w:szCs w:val="22"/>
-          <w:rtl w:val="0"/>
-        </w:rPr>
-        <w:t xml:space="preserve">Link:</w:t>
-      </w:r>
-      <w:r>
-        <w:rPr>
-          <w:b w:val="0"/>
-          <w:bCs w:val="0"/>
-          <w:i w:val="0"/>
-          <w:iCs w:val="0"/>
-          <w:sz w:val="22"/>
-          <w:szCs w:val="22"/>
-          <w:rtl w:val="0"/>
+          <w:i/>
+          <w:iCs/>
+          <w:sz w:val="22"/>
+          <w:szCs w:val="22"/>
+        </w:rPr>
+        <w:t>Link:</w:t>
+      </w:r>
+      <w:r>
+        <w:rPr>
+          <w:sz w:val="22"/>
+          <w:szCs w:val="22"/>
         </w:rPr>
         <w:t xml:space="preserve"> each report is one short ESP-NOW message [8]; honey and wood attenuate 2.4 GHz, so the radio sits outside the hive and the range is measured on site (fallback: LoRa). </w:t>
       </w:r>
       <w:r>
         <w:rPr>
-          <w:b w:val="0"/>
-          <w:bCs w:val="0"/>
-          <w:i w:val="1"/>
-          <w:iCs w:val="1"/>
-          <w:sz w:val="22"/>
-          <w:szCs w:val="22"/>
-          <w:rtl w:val="0"/>
-        </w:rPr>
-        <w:t xml:space="preserve">Weighing:</w:t>
-      </w:r>
-      <w:r>
-        <w:rPr>
-          <w:b w:val="0"/>
-          <w:bCs w:val="0"/>
-          <w:i w:val="0"/>
-          <w:iCs w:val="0"/>
-          <w:sz w:val="22"/>
-          <w:szCs w:val="22"/>
-          <w:rtl w:val="0"/>
+          <w:i/>
+          <w:iCs/>
+          <w:sz w:val="22"/>
+          <w:szCs w:val="22"/>
+        </w:rPr>
+        <w:t>Weighing:</w:t>
+      </w:r>
+      <w:r>
+        <w:rPr>
+          <w:sz w:val="22"/>
+          <w:szCs w:val="22"/>
         </w:rPr>
         <w:t xml:space="preserve"> the HX711 noise [9] corresponds to about 3 g, well below the 20 g target. </w:t>
       </w:r>
       <w:r>
         <w:rPr>
-          <w:b w:val="0"/>
-          <w:bCs w:val="0"/>
-          <w:i w:val="1"/>
-          <w:iCs w:val="1"/>
-          <w:sz w:val="22"/>
-          <w:szCs w:val="22"/>
-          <w:rtl w:val="0"/>
-        </w:rPr>
-        <w:t xml:space="preserve">Node power:</w:t>
-      </w:r>
-      <w:r>
-        <w:rPr>
-          <w:b w:val="0"/>
-          <w:bCs w:val="0"/>
-          <w:i w:val="0"/>
-          <w:iCs w:val="0"/>
-          <w:sz w:val="22"/>
-          <w:szCs w:val="22"/>
-          <w:rtl w:val="0"/>
+          <w:i/>
+          <w:iCs/>
+          <w:sz w:val="22"/>
+          <w:szCs w:val="22"/>
+        </w:rPr>
+        <w:t>Node power:</w:t>
+      </w:r>
+      <w:r>
+        <w:rPr>
+          <w:sz w:val="22"/>
+          <w:szCs w:val="22"/>
         </w:rPr>
         <w:t xml:space="preserve"> the average current and battery life are</w:t>
       </w:r>
@@ -3704,14 +3401,6 @@
           <w:szCs w:val="22"/>
         </w:rPr>
       </w:pPr>
-      <w:proofErr w:type="spellStart"/>
-      <w:proofErr w:type="spellEnd"/>
-      <w:proofErr w:type="spellStart"/>
-      <w:proofErr w:type="spellEnd"/>
-      <w:proofErr w:type="gramStart"/>
-      <w:proofErr w:type="gramEnd"/>
-      <w:proofErr w:type="spellStart"/>
-      <w:proofErr w:type="spellEnd"/>
       <w:r>
         <w:rPr>
           <w:i/>
@@ -3720,164 +3409,14 @@
           <w:szCs w:val="22"/>
         </w:rPr>
         <w:tab/>
-      </w:r>
-      <w:r>
-        <w:rPr>
-          <w:b w:val="0"/>
-          <w:bCs w:val="0"/>
-          <w:i w:val="1"/>
-          <w:iCs w:val="1"/>
-          <w:sz w:val="22"/>
-          <w:szCs w:val="22"/>
-          <w:rtl w:val="0"/>
-        </w:rPr>
-        <w:t xml:space="preserve">Ī</w:t>
-      </w:r>
-      <w:r>
-        <w:rPr>
-          <w:b w:val="0"/>
-          <w:bCs w:val="0"/>
-          <w:i w:val="0"/>
-          <w:iCs w:val="0"/>
-          <w:sz w:val="22"/>
-          <w:szCs w:val="22"/>
-          <w:rtl w:val="0"/>
+        <w:t>Ī</w:t>
+      </w:r>
+      <w:r>
+        <w:rPr>
+          <w:sz w:val="22"/>
+          <w:szCs w:val="22"/>
         </w:rPr>
         <w:t xml:space="preserve"> = </w:t>
-      </w:r>
-      <w:r>
-        <w:rPr>
-          <w:b w:val="0"/>
-          <w:bCs w:val="0"/>
-          <w:i w:val="1"/>
-          <w:iCs w:val="1"/>
-          <w:sz w:val="22"/>
-          <w:szCs w:val="22"/>
-          <w:rtl w:val="0"/>
-        </w:rPr>
-        <w:t xml:space="preserve">I</w:t>
-      </w:r>
-      <w:r>
-        <w:rPr>
-          <w:b w:val="0"/>
-          <w:bCs w:val="0"/>
-          <w:i w:val="1"/>
-          <w:iCs w:val="1"/>
-          <w:sz w:val="22"/>
-          <w:szCs w:val="22"/>
-          <w:vertAlign w:val="subscript"/>
-          <w:rtl w:val="0"/>
-        </w:rPr>
-        <w:t xml:space="preserve">0</w:t>
-      </w:r>
-      <w:r>
-        <w:rPr>
-          <w:b w:val="0"/>
-          <w:bCs w:val="0"/>
-          <w:i w:val="0"/>
-          <w:iCs w:val="0"/>
-          <w:sz w:val="22"/>
-          <w:szCs w:val="22"/>
-          <w:rtl w:val="0"/>
-        </w:rPr>
-        <w:t xml:space="preserve"> + </w:t>
-      </w:r>
-      <w:r>
-        <w:rPr>
-          <w:b w:val="0"/>
-          <w:bCs w:val="0"/>
-          <w:i w:val="1"/>
-          <w:iCs w:val="1"/>
-          <w:sz w:val="22"/>
-          <w:szCs w:val="22"/>
-          <w:rtl w:val="0"/>
-        </w:rPr>
-        <w:t xml:space="preserve">A Q</w:t>
-      </w:r>
-      <w:r>
-        <w:rPr>
-          <w:b w:val="0"/>
-          <w:bCs w:val="0"/>
-          <w:i w:val="0"/>
-          <w:iCs w:val="0"/>
-          <w:sz w:val="22"/>
-          <w:szCs w:val="22"/>
-          <w:rtl w:val="0"/>
-        </w:rPr>
-        <w:t xml:space="preserve"> / 86 400 s,     </w:t>
-      </w:r>
-      <w:r>
-        <w:rPr>
-          <w:b w:val="0"/>
-          <w:bCs w:val="0"/>
-          <w:i w:val="1"/>
-          <w:iCs w:val="1"/>
-          <w:sz w:val="22"/>
-          <w:szCs w:val="22"/>
-          <w:rtl w:val="0"/>
-        </w:rPr>
-        <w:t xml:space="preserve">T</w:t>
-      </w:r>
-      <w:r>
-        <w:rPr>
-          <w:b w:val="0"/>
-          <w:bCs w:val="0"/>
-          <w:i w:val="0"/>
-          <w:iCs w:val="0"/>
-          <w:sz w:val="22"/>
-          <w:szCs w:val="22"/>
-          <w:vertAlign w:val="subscript"/>
-          <w:rtl w:val="0"/>
-        </w:rPr>
-        <w:t xml:space="preserve">life</w:t>
-      </w:r>
-      <w:r>
-        <w:rPr>
-          <w:b w:val="0"/>
-          <w:bCs w:val="0"/>
-          <w:i w:val="0"/>
-          <w:iCs w:val="0"/>
-          <w:sz w:val="22"/>
-          <w:szCs w:val="22"/>
-          <w:rtl w:val="0"/>
-        </w:rPr>
-        <w:t xml:space="preserve"> = </w:t>
-      </w:r>
-      <w:r>
-        <w:rPr>
-          <w:b w:val="0"/>
-          <w:bCs w:val="0"/>
-          <w:i w:val="1"/>
-          <w:iCs w:val="1"/>
-          <w:sz w:val="22"/>
-          <w:szCs w:val="22"/>
-          <w:rtl w:val="0"/>
-        </w:rPr>
-        <w:t xml:space="preserve">η C</w:t>
-      </w:r>
-      <w:r>
-        <w:rPr>
-          <w:b w:val="0"/>
-          <w:bCs w:val="0"/>
-          <w:i w:val="0"/>
-          <w:iCs w:val="0"/>
-          <w:sz w:val="22"/>
-          <w:szCs w:val="22"/>
-          <w:rtl w:val="0"/>
-        </w:rPr>
-        <w:t xml:space="preserve"> / </w:t>
-      </w:r>
-      <w:r>
-        <w:rPr>
-          <w:b w:val="0"/>
-          <w:bCs w:val="0"/>
-          <w:i w:val="1"/>
-          <w:iCs w:val="1"/>
-          <w:sz w:val="22"/>
-          <w:szCs w:val="22"/>
-          <w:rtl w:val="0"/>
-        </w:rPr>
-        <w:t xml:space="preserve">Ī</w:t>
       </w:r>
       <w:r>
         <w:rPr>
@@ -3886,19 +3425,105 @@
           <w:sz w:val="22"/>
           <w:szCs w:val="22"/>
         </w:rPr>
+        <w:t>I</w:t>
+      </w:r>
+      <w:r>
+        <w:rPr>
+          <w:i/>
+          <w:iCs/>
+          <w:sz w:val="22"/>
+          <w:szCs w:val="22"/>
+          <w:vertAlign w:val="subscript"/>
+        </w:rPr>
+        <w:t>0</w:t>
+      </w:r>
+      <w:r>
+        <w:rPr>
+          <w:sz w:val="22"/>
+          <w:szCs w:val="22"/>
+        </w:rPr>
+        <w:t xml:space="preserve"> + </w:t>
+      </w:r>
+      <w:r>
+        <w:rPr>
+          <w:i/>
+          <w:iCs/>
+          <w:sz w:val="22"/>
+          <w:szCs w:val="22"/>
+        </w:rPr>
+        <w:t>A Q</w:t>
+      </w:r>
+      <w:r>
+        <w:rPr>
+          <w:sz w:val="22"/>
+          <w:szCs w:val="22"/>
+        </w:rPr>
+        <w:t xml:space="preserve"> / 86 400 s,     </w:t>
+      </w:r>
+      <w:r>
+        <w:rPr>
+          <w:i/>
+          <w:iCs/>
+          <w:sz w:val="22"/>
+          <w:szCs w:val="22"/>
+        </w:rPr>
+        <w:t>T</w:t>
+      </w:r>
+      <w:r>
+        <w:rPr>
+          <w:sz w:val="22"/>
+          <w:szCs w:val="22"/>
+          <w:vertAlign w:val="subscript"/>
+        </w:rPr>
+        <w:t>life</w:t>
+      </w:r>
+      <w:r>
+        <w:rPr>
+          <w:sz w:val="22"/>
+          <w:szCs w:val="22"/>
+        </w:rPr>
+        <w:t xml:space="preserve"> = </w:t>
+      </w:r>
+      <w:r>
+        <w:rPr>
+          <w:i/>
+          <w:iCs/>
+          <w:sz w:val="22"/>
+          <w:szCs w:val="22"/>
+        </w:rPr>
+        <w:t>η C</w:t>
+      </w:r>
+      <w:r>
+        <w:rPr>
+          <w:sz w:val="22"/>
+          <w:szCs w:val="22"/>
+        </w:rPr>
+        <w:t xml:space="preserve"> / </w:t>
+      </w:r>
+      <w:r>
+        <w:rPr>
+          <w:i/>
+          <w:iCs/>
+          <w:sz w:val="22"/>
+          <w:szCs w:val="22"/>
+        </w:rPr>
+        <w:t>Ī</w:t>
+      </w:r>
+      <w:r>
+        <w:rPr>
+          <w:i/>
+          <w:iCs/>
+          <w:sz w:val="22"/>
+          <w:szCs w:val="22"/>
+        </w:rPr>
         <w:tab/>
       </w:r>
       <w:r>
         <w:rPr>
-          <w:b w:val="0"/>
-          <w:bCs w:val="0"/>
-          <w:i w:val="0"/>
-          <w:iCs w:val="0"/>
-          <w:sz w:val="22"/>
-          <w:szCs w:val="22"/>
-          <w:rtl w:val="0"/>
-        </w:rPr>
-        <w:t xml:space="preserve">(3)</w:t>
+          <w:sz w:val="22"/>
+          <w:szCs w:val="22"/>
+        </w:rPr>
+        <w:t>(3)</w:t>
       </w:r>
     </w:p>
     <w:p>
@@ -3910,180 +3535,124 @@
           <w:szCs w:val="22"/>
         </w:rPr>
       </w:pPr>
-      <w:proofErr w:type="gramStart"/>
-      <w:proofErr w:type="gramEnd"/>
-      <w:proofErr w:type="spellStart"/>
-      <w:proofErr w:type="spellEnd"/>
-      <w:proofErr w:type="spellStart"/>
-      <w:proofErr w:type="spellEnd"/>
-      <w:proofErr w:type="spellStart"/>
-      <w:proofErr w:type="spellEnd"/>
-      <w:r>
-        <w:rPr>
-          <w:b w:val="0"/>
-          <w:bCs w:val="0"/>
-          <w:i w:val="0"/>
-          <w:iCs w:val="0"/>
-          <w:sz w:val="22"/>
-          <w:szCs w:val="22"/>
-          <w:rtl w:val="0"/>
+      <w:r>
+        <w:rPr>
+          <w:sz w:val="22"/>
+          <w:szCs w:val="22"/>
         </w:rPr>
         <w:t xml:space="preserve">where </w:t>
       </w:r>
       <w:r>
         <w:rPr>
-          <w:b w:val="0"/>
-          <w:bCs w:val="0"/>
-          <w:i w:val="1"/>
-          <w:iCs w:val="1"/>
-          <w:sz w:val="22"/>
-          <w:szCs w:val="22"/>
-          <w:rtl w:val="0"/>
-        </w:rPr>
-        <w:t xml:space="preserve">Q</w:t>
-      </w:r>
-      <w:r>
-        <w:rPr>
-          <w:b w:val="0"/>
-          <w:bCs w:val="0"/>
-          <w:i w:val="0"/>
-          <w:iCs w:val="0"/>
-          <w:sz w:val="22"/>
-          <w:szCs w:val="22"/>
-          <w:rtl w:val="0"/>
+          <w:i/>
+          <w:iCs/>
+          <w:sz w:val="22"/>
+          <w:szCs w:val="22"/>
+        </w:rPr>
+        <w:t>Q</w:t>
+      </w:r>
+      <w:r>
+        <w:rPr>
+          <w:sz w:val="22"/>
+          <w:szCs w:val="22"/>
         </w:rPr>
         <w:t xml:space="preserve"> ≈ 0.3 A·s is the charge of one acquisition, mostly the processor during the 10 s recording [10], </w:t>
       </w:r>
       <w:r>
         <w:rPr>
-          <w:b w:val="0"/>
-          <w:bCs w:val="0"/>
-          <w:i w:val="1"/>
-          <w:iCs w:val="1"/>
-          <w:sz w:val="22"/>
-          <w:szCs w:val="22"/>
-          <w:rtl w:val="0"/>
-        </w:rPr>
-        <w:t xml:space="preserve">A</w:t>
-      </w:r>
-      <w:r>
-        <w:rPr>
-          <w:b w:val="0"/>
-          <w:bCs w:val="0"/>
-          <w:i w:val="0"/>
-          <w:iCs w:val="0"/>
-          <w:sz w:val="22"/>
-          <w:szCs w:val="22"/>
-          <w:rtl w:val="0"/>
+          <w:i/>
+          <w:iCs/>
+          <w:sz w:val="22"/>
+          <w:szCs w:val="22"/>
+        </w:rPr>
+        <w:t>A</w:t>
+      </w:r>
+      <w:r>
+        <w:rPr>
+          <w:sz w:val="22"/>
+          <w:szCs w:val="22"/>
         </w:rPr>
         <w:t xml:space="preserve"> the number of acquisitions per day and </w:t>
       </w:r>
       <w:r>
         <w:rPr>
-          <w:b w:val="0"/>
-          <w:bCs w:val="0"/>
-          <w:i w:val="1"/>
-          <w:iCs w:val="1"/>
-          <w:sz w:val="22"/>
-          <w:szCs w:val="22"/>
-          <w:rtl w:val="0"/>
-        </w:rPr>
-        <w:t xml:space="preserve">I</w:t>
-      </w:r>
-      <w:r>
-        <w:rPr>
-          <w:b w:val="0"/>
-          <w:bCs w:val="0"/>
-          <w:i w:val="1"/>
-          <w:iCs w:val="1"/>
+          <w:i/>
+          <w:iCs/>
+          <w:sz w:val="22"/>
+          <w:szCs w:val="22"/>
+        </w:rPr>
+        <w:t>I</w:t>
+      </w:r>
+      <w:r>
+        <w:rPr>
+          <w:i/>
+          <w:iCs/>
           <w:sz w:val="22"/>
           <w:szCs w:val="22"/>
           <w:vertAlign w:val="subscript"/>
-          <w:rtl w:val="0"/>
-        </w:rPr>
-        <w:t xml:space="preserve">0</w:t>
-      </w:r>
-      <w:r>
-        <w:rPr>
-          <w:b w:val="0"/>
-          <w:bCs w:val="0"/>
-          <w:i w:val="0"/>
-          <w:iCs w:val="0"/>
-          <w:sz w:val="22"/>
-          <w:szCs w:val="22"/>
-          <w:rtl w:val="0"/>
+        </w:rPr>
+        <w:t>0</w:t>
+      </w:r>
+      <w:r>
+        <w:rPr>
+          <w:sz w:val="22"/>
+          <w:szCs w:val="22"/>
         </w:rPr>
         <w:t xml:space="preserve"> ≈ 22 µA the sleep and wake-circuit current. With 96 periodic acquisitions per day, </w:t>
       </w:r>
       <w:r>
         <w:rPr>
-          <w:b w:val="0"/>
-          <w:bCs w:val="0"/>
-          <w:i w:val="1"/>
-          <w:iCs w:val="1"/>
-          <w:sz w:val="22"/>
-          <w:szCs w:val="22"/>
-          <w:rtl w:val="0"/>
-        </w:rPr>
-        <w:t xml:space="preserve">Ī</w:t>
-      </w:r>
-      <w:r>
-        <w:rPr>
-          <w:b w:val="0"/>
-          <w:bCs w:val="0"/>
-          <w:i w:val="0"/>
-          <w:iCs w:val="0"/>
-          <w:sz w:val="22"/>
-          <w:szCs w:val="22"/>
-          <w:rtl w:val="0"/>
+          <w:i/>
+          <w:iCs/>
+          <w:sz w:val="22"/>
+          <w:szCs w:val="22"/>
+        </w:rPr>
+        <w:t>Ī</w:t>
+      </w:r>
+      <w:r>
+        <w:rPr>
+          <w:sz w:val="22"/>
+          <w:szCs w:val="22"/>
         </w:rPr>
         <w:t xml:space="preserve"> ≈ 0.35 mA, and one 3000 mAh cell (</w:t>
       </w:r>
       <w:r>
         <w:rPr>
-          <w:b w:val="0"/>
-          <w:bCs w:val="0"/>
-          <w:i w:val="1"/>
-          <w:iCs w:val="1"/>
-          <w:sz w:val="22"/>
-          <w:szCs w:val="22"/>
-          <w:rtl w:val="0"/>
-        </w:rPr>
-        <w:t xml:space="preserve">η</w:t>
-      </w:r>
-      <w:r>
-        <w:rPr>
-          <w:b w:val="0"/>
-          <w:bCs w:val="0"/>
-          <w:i w:val="0"/>
-          <w:iCs w:val="0"/>
-          <w:sz w:val="22"/>
-          <w:szCs w:val="22"/>
-          <w:rtl w:val="0"/>
-        </w:rPr>
-        <w:t xml:space="preserve"> = 0.8) lasts about 285 days; the six-month target holds up to about 60 event wakes per day (Fig. 2). </w:t>
-      </w:r>
-      <w:r>
-        <w:rPr>
-          <w:b w:val="0"/>
-          <w:bCs w:val="0"/>
-          <w:i w:val="1"/>
-          <w:iCs w:val="1"/>
-          <w:sz w:val="22"/>
-          <w:szCs w:val="22"/>
-          <w:rtl w:val="0"/>
-        </w:rPr>
-        <w:t xml:space="preserve">Hub:</w:t>
-      </w:r>
-      <w:r>
-        <w:rPr>
-          <w:b w:val="0"/>
-          <w:bCs w:val="0"/>
-          <w:i w:val="0"/>
-          <w:iCs w:val="0"/>
-          <w:sz w:val="22"/>
-          <w:szCs w:val="22"/>
-          <w:rtl w:val="0"/>
+          <w:i/>
+          <w:iCs/>
+          <w:sz w:val="22"/>
+          <w:szCs w:val="22"/>
+        </w:rPr>
+        <w:t>η</w:t>
+      </w:r>
+      <w:r>
+        <w:rPr>
+          <w:sz w:val="22"/>
+          <w:szCs w:val="22"/>
+        </w:rPr>
+        <w:t xml:space="preserve"> = 0.8) lasts about 285 days; the six-month </w:t>
+      </w:r>
+      <w:r>
+        <w:rPr>
+          <w:sz w:val="22"/>
+          <w:szCs w:val="22"/>
+        </w:rPr>
+        <w:lastRenderedPageBreak/>
+        <w:t xml:space="preserve">target holds up to about 60 event wakes per day (Fig. 2). </w:t>
+      </w:r>
+      <w:r>
+        <w:rPr>
+          <w:i/>
+          <w:iCs/>
+          <w:sz w:val="22"/>
+          <w:szCs w:val="22"/>
+        </w:rPr>
+        <w:t>Hub:</w:t>
+      </w:r>
+      <w:r>
+        <w:rPr>
+          <w:sz w:val="22"/>
+          <w:szCs w:val="22"/>
         </w:rPr>
         <w:t xml:space="preserve"> it draws about 0.5 W, well within the ≈45 Wh/day of the 15 W panel.</w:t>
       </w:r>
@@ -4104,7 +3673,6 @@
           <w:sz w:val="22"/>
           <w:szCs w:val="22"/>
         </w:rPr>
-        <w:lastRenderedPageBreak/>
         <w:drawing>
           <wp:inline distT="0" distB="0" distL="114300" distR="114300" wp14:anchorId="430EDE66" wp14:editId="2C76C30D">
             <wp:extent cx="4572000" cy="1270000"/>
@@ -4203,151 +3771,67 @@
           <w:szCs w:val="22"/>
         </w:rPr>
       </w:pPr>
-      <w:proofErr w:type="gramStart"/>
-      <w:proofErr w:type="gramEnd"/>
-      <w:r>
-        <w:rPr>
-          <w:b w:val="0"/>
-          <w:bCs w:val="0"/>
-          <w:i w:val="1"/>
-          <w:iCs w:val="1"/>
-          <w:sz w:val="22"/>
-          <w:szCs w:val="22"/>
-          <w:rtl w:val="0"/>
-        </w:rPr>
-        <w:t xml:space="preserve">Lab:</w:t>
-      </w:r>
-      <w:r>
-        <w:rPr>
-          <w:b w:val="0"/>
-          <w:bCs w:val="0"/>
-          <w:i w:val="0"/>
-          <w:iCs w:val="0"/>
-          <w:sz w:val="22"/>
-          <w:szCs w:val="22"/>
-          <w:rtl w:val="0"/>
+      <w:r>
+        <w:rPr>
+          <w:i/>
+          <w:iCs/>
+          <w:sz w:val="22"/>
+          <w:szCs w:val="22"/>
+        </w:rPr>
+        <w:t>Lab:</w:t>
+      </w:r>
+      <w:r>
+        <w:rPr>
+          <w:sz w:val="22"/>
+          <w:szCs w:val="22"/>
         </w:rPr>
         <w:t xml:space="preserve"> weighing with reference masses and a temperature sweep; piezo and wake circuit with known tones and bursts on a frame; average current with a power analyzer. </w:t>
       </w:r>
       <w:r>
         <w:rPr>
-          <w:b w:val="0"/>
-          <w:bCs w:val="0"/>
-          <w:i w:val="1"/>
-          <w:iCs w:val="1"/>
-          <w:sz w:val="22"/>
-          <w:szCs w:val="22"/>
-          <w:rtl w:val="0"/>
-        </w:rPr>
-        <w:t xml:space="preserve">Field:</w:t>
-      </w:r>
-      <w:r>
-        <w:rPr>
-          <w:b w:val="0"/>
-          <w:bCs w:val="0"/>
-          <w:i w:val="0"/>
-          <w:iCs w:val="0"/>
-          <w:sz w:val="22"/>
-          <w:szCs w:val="22"/>
-          <w:rtl w:val="0"/>
-        </w:rPr>
-        <w:t xml:space="preserve"> </w:t>
-      </w:r>
-      <w:r>
-        <w:rPr>
-          <w:b w:val="0"/>
-          <w:bCs w:val="0"/>
-          <w:i w:val="0"/>
-          <w:iCs w:val="0"/>
-          <w:sz w:val="22"/>
-          <w:szCs w:val="22"/>
-          <w:highlight w:val="yellow"/>
-          <w:rtl w:val="0"/>
-        </w:rPr>
-        <w:t xml:space="preserve">3–5</w:t>
-      </w:r>
-      <w:r>
-        <w:rPr>
-          <w:b w:val="0"/>
-          <w:bCs w:val="0"/>
-          <w:i w:val="0"/>
-          <w:iCs w:val="0"/>
-          <w:sz w:val="22"/>
-          <w:szCs w:val="22"/>
-          <w:rtl w:val="0"/>
-        </w:rPr>
-        <w:t xml:space="preserve"> instrumented hives and one empty control platform at the cooperating apiary </w:t>
-      </w:r>
-      <w:r>
-        <w:rPr>
-          <w:b w:val="0"/>
-          <w:bCs w:val="0"/>
-          <w:i w:val="0"/>
-          <w:iCs w:val="0"/>
-          <w:sz w:val="22"/>
-          <w:szCs w:val="22"/>
-          <w:highlight w:val="yellow"/>
-          <w:rtl w:val="0"/>
-        </w:rPr>
-        <w:t xml:space="preserve">name</w:t>
-      </w:r>
-      <w:r>
-        <w:rPr>
-          <w:b w:val="0"/>
-          <w:bCs w:val="0"/>
-          <w:i w:val="0"/>
-          <w:iCs w:val="0"/>
-          <w:sz w:val="22"/>
-          <w:szCs w:val="22"/>
-          <w:rtl w:val="0"/>
-        </w:rPr>
-        <w:t xml:space="preserve">, through the spring swarming season, starting with a night-time recording that compares the hive signal with the circuit noise. Ground truth comes from weekly inspections (queen cells, brood, queen presence) and the beekeeper's reports. A swarm is labeled by an observed departure or by capped queen cells; an alert is a true positive if it precedes the swarm, giving precision </w:t>
-      </w:r>
-      <w:r>
-        <w:rPr>
-          <w:b w:val="0"/>
-          <w:bCs w:val="0"/>
-          <w:i w:val="1"/>
-          <w:iCs w:val="1"/>
-          <w:sz w:val="22"/>
-          <w:szCs w:val="22"/>
-          <w:rtl w:val="0"/>
-        </w:rPr>
-        <w:t xml:space="preserve">P</w:t>
-      </w:r>
-      <w:r>
-        <w:rPr>
-          <w:b w:val="0"/>
-          <w:bCs w:val="0"/>
-          <w:i w:val="0"/>
-          <w:iCs w:val="0"/>
-          <w:sz w:val="22"/>
-          <w:szCs w:val="22"/>
-          <w:rtl w:val="0"/>
+          <w:i/>
+          <w:iCs/>
+          <w:sz w:val="22"/>
+          <w:szCs w:val="22"/>
+        </w:rPr>
+        <w:t>Field:</w:t>
+      </w:r>
+      <w:r>
+        <w:rPr>
+          <w:sz w:val="22"/>
+          <w:szCs w:val="22"/>
+        </w:rPr>
+        <w:t xml:space="preserve"> 3–5 instrumented hives and one empty control platform at the cooperating apiary, Zippory Honey, through the spring swarming season, starting with a night-time recording that compares the hive signal with the circuit noise. Ground truth comes from weekly inspections (queen cells, brood, queen presence) and the beekeeper's reports. A swarm is labeled by an observed departure or by capped queen cells; an alert is a true positive if it precedes the swarm, giving precision </w:t>
+      </w:r>
+      <w:r>
+        <w:rPr>
+          <w:i/>
+          <w:iCs/>
+          <w:sz w:val="22"/>
+          <w:szCs w:val="22"/>
+        </w:rPr>
+        <w:t>P</w:t>
+      </w:r>
+      <w:r>
+        <w:rPr>
+          <w:sz w:val="22"/>
+          <w:szCs w:val="22"/>
         </w:rPr>
         <w:t xml:space="preserve"> = TP/(TP+FP) and recall </w:t>
       </w:r>
       <w:r>
         <w:rPr>
-          <w:b w:val="0"/>
-          <w:bCs w:val="0"/>
-          <w:i w:val="1"/>
-          <w:iCs w:val="1"/>
-          <w:sz w:val="22"/>
-          <w:szCs w:val="22"/>
-          <w:rtl w:val="0"/>
-        </w:rPr>
-        <w:t xml:space="preserve">R</w:t>
-      </w:r>
-      <w:r>
-        <w:rPr>
-          <w:b w:val="0"/>
-          <w:bCs w:val="0"/>
-          <w:i w:val="0"/>
-          <w:iCs w:val="0"/>
-          <w:sz w:val="22"/>
-          <w:szCs w:val="22"/>
-          <w:rtl w:val="0"/>
+          <w:i/>
+          <w:iCs/>
+          <w:sz w:val="22"/>
+          <w:szCs w:val="22"/>
+        </w:rPr>
+        <w:t>R</w:t>
+      </w:r>
+      <w:r>
+        <w:rPr>
+          <w:sz w:val="22"/>
+          <w:szCs w:val="22"/>
         </w:rPr>
         <w:t xml:space="preserve"> = TP/(TP+FN), with the lead time reported. The departure rule is also tested by removing known masses (0.5–2 kg). Thresholds are tuned in the first weeks, and the targets in Table I are frozen before the field evaluation.</w:t>
       </w:r>

</xml_diff>

<commit_message>
vault backup: 2026-10-25 17:55:39
Affected files:
.obsidian/plugins/word-reader/data.json
docs/pdr-2027-165.docx
docs/~$r-2027-165.docx
</commit_message>
<xml_diff>
--- a/docs/pdr-2027-165.docx
+++ b/docs/pdr-2027-165.docx
@@ -78,13 +78,8 @@
         <w:jc w:val="center"/>
       </w:pPr>
       <w:r>
-        <w:t xml:space="preserve">Ben-Gurion University of </w:t>
-      </w:r>
-      <w:proofErr w:type="gramStart"/>
-      <w:r>
-        <w:t>the Negev</w:t>
-      </w:r>
-      <w:proofErr w:type="gramEnd"/>
+        <w:t>Ben-Gurion University of the Negev</w:t>
+      </w:r>
     </w:p>
     <w:p>
       <w:pPr>
@@ -278,21 +273,12 @@
           <w:bCs/>
         </w:rPr>
       </w:pPr>
-      <w:proofErr w:type="spellStart"/>
       <w:r>
         <w:rPr>
           <w:b/>
           <w:bCs/>
         </w:rPr>
-        <w:t>BeeSense</w:t>
-      </w:r>
-      <w:proofErr w:type="spellEnd"/>
-      <w:r>
-        <w:rPr>
-          <w:b/>
-          <w:bCs/>
-        </w:rPr>
-        <w:t xml:space="preserve"> — IoT-Based Acoustic and Weight Monitoring of Honeybee Colonies</w:t>
+        <w:t>BeeSense — IoT-Based Acoustic and Weight Monitoring of Honeybee Colonies</w:t>
       </w:r>
     </w:p>
     <w:p>
@@ -665,6 +651,7 @@
         <w:spacing w:after="0" w:line="240" w:lineRule="auto"/>
         <w:jc w:val="center"/>
         <w:rPr>
+          <w:i/>
           <w:sz w:val="22"/>
           <w:szCs w:val="22"/>
           <w:rtl/>
@@ -673,7 +660,7 @@
       <w:hyperlink r:id="rId12" w:history="1">
         <w:r>
           <w:rPr>
-            <w:rStyle w:val="Hyperlink"/>
+            <w:i/>
             <w:sz w:val="22"/>
             <w:szCs w:val="22"/>
           </w:rPr>
@@ -708,26 +695,17 @@
         <w:rPr>
           <w:sz w:val="22"/>
           <w:szCs w:val="22"/>
-        </w:rPr>
-      </w:pPr>
-      <w:r>
-        <w:rPr>
-          <w:sz w:val="22"/>
-          <w:szCs w:val="22"/>
           <w:rtl/>
         </w:rPr>
-        <w:t xml:space="preserve">שם המנחה: ד"ר דן </w:t>
-      </w:r>
-      <w:proofErr w:type="spellStart"/>
+      </w:pPr>
       <w:r>
         <w:rPr>
           <w:sz w:val="22"/>
           <w:szCs w:val="22"/>
           <w:rtl/>
         </w:rPr>
-        <w:t>וילנצ'יק</w:t>
-      </w:r>
-      <w:proofErr w:type="spellEnd"/>
+        <w:t>שם המנחה: ד"ר דן וילנצ'יק</w:t>
+      </w:r>
     </w:p>
     <w:p>
       <w:pPr>
@@ -766,94 +744,22 @@
           <w:szCs w:val="22"/>
           <w:rtl/>
         </w:rPr>
-        <w:t xml:space="preserve">מצב כוורות הדבורים נבדק כיום בעיקר בפתיחה ידנית של הכוורת אחת לכמה שבועות עד חודשים, ובין ביקור לביקור המגדל אינו יודע מה מתרחש בה. הכנה לבריחת נחיל נמשכת כשבוע עד שבועיים, והנחיל, שלוקח </w:t>
-      </w:r>
-      <w:proofErr w:type="spellStart"/>
+        <w:t>מצב כוורות הדבורים נבדק כיום בעיקר בפתיחה ידנית של הכוורת אחת לכמה שבועות עד חודשים, ובין ביקור לביקור המגדל אינו יודע מה מתרחש בה. הכנה לבריחת נחיל נמשכת כשבוע עד שבועיים, והנחיל, שלוקח איתו חלק ניכר מהמושבה, עוזב תוך דקות ולעיתים קרובות מתגלה רק בביקור הבא. בי-סנס היא מערכת מבוססת האינטרנט של הדברים (</w:t>
+      </w:r>
+      <w:r>
+        <w:rPr>
+          <w:sz w:val="22"/>
+          <w:szCs w:val="22"/>
+        </w:rPr>
+        <w:t>IoT</w:t>
+      </w:r>
       <w:r>
         <w:rPr>
           <w:sz w:val="22"/>
           <w:szCs w:val="22"/>
           <w:rtl/>
         </w:rPr>
-        <w:t>איתו</w:t>
-      </w:r>
-      <w:proofErr w:type="spellEnd"/>
-      <w:r>
-        <w:rPr>
-          <w:sz w:val="22"/>
-          <w:szCs w:val="22"/>
-          <w:rtl/>
-        </w:rPr>
-        <w:t xml:space="preserve"> חלק ניכר מהמושבה, עוזב תוך דקות ולעיתים קרובות מתגלה רק בביקור הבא. בי-סנס היא מערכת מבוססת האינטרנט של הדברים (</w:t>
-      </w:r>
-      <w:r>
-        <w:rPr>
-          <w:sz w:val="22"/>
-          <w:szCs w:val="22"/>
-        </w:rPr>
-        <w:t>IoT</w:t>
-      </w:r>
-      <w:r>
-        <w:rPr>
-          <w:sz w:val="22"/>
-          <w:szCs w:val="22"/>
-          <w:rtl/>
-        </w:rPr>
-        <w:t xml:space="preserve">) לניטור כוורות במכוורת ללא חשמל וללא רשת. בכל כוורת מותקן צומת </w:t>
-      </w:r>
-      <w:proofErr w:type="spellStart"/>
-      <w:r>
-        <w:rPr>
-          <w:sz w:val="22"/>
-          <w:szCs w:val="22"/>
-          <w:rtl/>
-        </w:rPr>
-        <w:t>סוללתי</w:t>
-      </w:r>
-      <w:proofErr w:type="spellEnd"/>
-      <w:r>
-        <w:rPr>
-          <w:sz w:val="22"/>
-          <w:szCs w:val="22"/>
-          <w:rtl/>
-        </w:rPr>
-        <w:t xml:space="preserve"> עם חיישן רטט </w:t>
-      </w:r>
-      <w:proofErr w:type="spellStart"/>
-      <w:r>
-        <w:rPr>
-          <w:sz w:val="22"/>
-          <w:szCs w:val="22"/>
-          <w:rtl/>
-        </w:rPr>
-        <w:t>פיאזואלקטרי</w:t>
-      </w:r>
-      <w:proofErr w:type="spellEnd"/>
-      <w:r>
-        <w:rPr>
-          <w:sz w:val="22"/>
-          <w:szCs w:val="22"/>
-          <w:rtl/>
-        </w:rPr>
-        <w:t xml:space="preserve">, המאזין בצריכה של ננו-אמפרים ומעיר את הצומת כשהרטט חורג מרמת הרקע; הצומת מחשב את ספקטרום הרטט והקול ומשלב אותו עם משקל הכוורת והטמפרטורה. מרכזייה סולארית במכוורת אוספת את הנתונים, מזהה סימנים </w:t>
-      </w:r>
-      <w:proofErr w:type="spellStart"/>
-      <w:r>
-        <w:rPr>
-          <w:sz w:val="22"/>
-          <w:szCs w:val="22"/>
-          <w:rtl/>
-        </w:rPr>
-        <w:t>לנחילה</w:t>
-      </w:r>
-      <w:proofErr w:type="spellEnd"/>
-      <w:r>
-        <w:rPr>
-          <w:sz w:val="22"/>
-          <w:szCs w:val="22"/>
-          <w:rtl/>
-        </w:rPr>
-        <w:t xml:space="preserve"> מתקרבת וחריגות במושבה, ושולחת התרעות דרך הרשת הסלולרית. החדשנות היא מערכת אוטונומית וזולה שמביאה לשטח יכולת שהוכחה במעבדה, בצריכת הספק נמוכה פי אלפים ממערכות המחקר. היעדים: דיוק שקילה של </w:t>
+        <w:t xml:space="preserve">) לניטור כוורות במכוורת ללא חשמל וללא רשת. בכל כוורת מותקן צומת סוללתי עם חיישן רטט פיאזואלקטרי, המאזין בצריכה של ננו-אמפרים ומעיר את הצומת כשהרטט חורג מרמת הרקע; הצומת מחשב את ספקטרום הרטט והקול ומשלב אותו עם משקל הכוורת והטמפרטורה. מרכזייה סולארית במכוורת אוספת את הנתונים, מזהה סימנים לנחילה מתקרבת וחריגות במושבה, ושולחת התרעות דרך הרשת הסלולרית. החדשנות היא מערכת אוטונומית וזולה שמביאה לשטח יכולת שהוכחה במעבדה, בצריכת הספק נמוכה פי אלפים ממערכות המחקר. היעדים: דיוק שקילה של </w:t>
       </w:r>
       <w:r>
         <w:rPr>
@@ -957,25 +863,7 @@
           <w:szCs w:val="22"/>
           <w:rtl/>
         </w:rPr>
-        <w:t xml:space="preserve"> האינטרנט של הדברים, ניטור כוורות, דבורת הדבש, חיישן </w:t>
-      </w:r>
-      <w:proofErr w:type="spellStart"/>
-      <w:r>
-        <w:rPr>
-          <w:sz w:val="22"/>
-          <w:szCs w:val="22"/>
-          <w:rtl/>
-        </w:rPr>
-        <w:t>פיאזואלקטרי</w:t>
-      </w:r>
-      <w:proofErr w:type="spellEnd"/>
-      <w:r>
-        <w:rPr>
-          <w:sz w:val="22"/>
-          <w:szCs w:val="22"/>
-          <w:rtl/>
-        </w:rPr>
-        <w:t xml:space="preserve">, השכמה מונעת-אירועים, עיבוד אותות, תאי עומס, מערכות משובצות בהספק נמוך, </w:t>
+        <w:t xml:space="preserve"> האינטרנט של הדברים, ניטור כוורות, דבורת הדבש, חיישן פיאזואלקטרי, השכמה מונעת-אירועים, עיבוד אותות, תאי עומס, מערכות משובצות בהספק נמוך, </w:t>
       </w:r>
       <w:r>
         <w:rPr>
@@ -1002,7 +890,6 @@
           <w:szCs w:val="22"/>
         </w:rPr>
       </w:pPr>
-      <w:proofErr w:type="spellStart"/>
       <w:r>
         <w:rPr>
           <w:b/>
@@ -1011,103 +898,112 @@
           <w:szCs w:val="26"/>
           <w:u w:val="single"/>
         </w:rPr>
-        <w:t>BeeSense</w:t>
-      </w:r>
-      <w:proofErr w:type="spellEnd"/>
+        <w:t>BeeSense — IoT-Based Acoustic and Weight Monitoring of Honeybee Colonies</w:t>
+      </w:r>
+    </w:p>
+    <w:p>
+      <w:pPr>
+        <w:spacing w:after="0" w:line="240" w:lineRule="auto"/>
+        <w:jc w:val="center"/>
+        <w:rPr>
+          <w:sz w:val="22"/>
+          <w:szCs w:val="22"/>
+        </w:rPr>
+      </w:pPr>
+      <w:r>
+        <w:rPr>
+          <w:sz w:val="22"/>
+          <w:szCs w:val="22"/>
+        </w:rPr>
+        <w:t>Students Names: Ben-Simon Dror, Cooper Dan</w:t>
+      </w:r>
+    </w:p>
+    <w:p>
+      <w:pPr>
+        <w:spacing w:after="0" w:line="240" w:lineRule="auto"/>
+        <w:jc w:val="center"/>
+        <w:rPr>
+          <w:i/>
+          <w:sz w:val="22"/>
+          <w:szCs w:val="22"/>
+        </w:rPr>
+      </w:pPr>
+      <w:hyperlink r:id="rId13" w:history="1">
+        <w:r>
+          <w:rPr>
+            <w:i/>
+            <w:sz w:val="22"/>
+            <w:szCs w:val="22"/>
+          </w:rPr>
+          <w:t>drorbe@post.bgu.ac.il</w:t>
+        </w:r>
+      </w:hyperlink>
+    </w:p>
+    <w:p>
+      <w:pPr>
+        <w:spacing w:after="0" w:line="240" w:lineRule="auto"/>
+        <w:jc w:val="center"/>
+        <w:rPr>
+          <w:i/>
+          <w:sz w:val="22"/>
+          <w:szCs w:val="22"/>
+        </w:rPr>
+      </w:pPr>
+      <w:r>
+        <w:rPr>
+          <w:i/>
+          <w:sz w:val="22"/>
+          <w:szCs w:val="22"/>
+        </w:rPr>
+        <w:t>dancoop@post.bgu.ac.il</w:t>
+      </w:r>
+    </w:p>
+    <w:p>
+      <w:pPr>
+        <w:spacing w:after="200" w:line="240" w:lineRule="auto"/>
+        <w:jc w:val="center"/>
+        <w:rPr>
+          <w:sz w:val="22"/>
+          <w:szCs w:val="22"/>
+        </w:rPr>
+      </w:pPr>
+      <w:r>
+        <w:rPr>
+          <w:sz w:val="22"/>
+          <w:szCs w:val="22"/>
+        </w:rPr>
+        <w:t>Adviser Name: Dr. Dan</w:t>
+      </w:r>
+      <w:r>
+        <w:rPr>
+          <w:sz w:val="22"/>
+          <w:szCs w:val="22"/>
+        </w:rPr>
+        <w:t xml:space="preserve"> </w:t>
+      </w:r>
+      <w:r>
+        <w:rPr>
+          <w:sz w:val="22"/>
+          <w:szCs w:val="22"/>
+        </w:rPr>
+        <w:t>Vilenchik</w:t>
+      </w:r>
+    </w:p>
+    <w:p>
+      <w:pPr>
+        <w:spacing w:after="120" w:line="240" w:lineRule="auto"/>
+        <w:jc w:val="center"/>
+        <w:rPr>
+          <w:sz w:val="22"/>
+          <w:szCs w:val="22"/>
+        </w:rPr>
+      </w:pPr>
       <w:r>
         <w:rPr>
           <w:b/>
           <w:bCs/>
           <w:sz w:val="26"/>
           <w:szCs w:val="26"/>
-          <w:u w:val="single"/>
-        </w:rPr>
-        <w:t xml:space="preserve"> — IoT-Based Acoustic and Weight Monitoring of Honeybee Colonies</w:t>
-      </w:r>
-    </w:p>
-    <w:p>
-      <w:pPr>
-        <w:spacing w:after="0" w:line="240" w:lineRule="auto"/>
-        <w:jc w:val="center"/>
-        <w:rPr>
-          <w:sz w:val="22"/>
-          <w:szCs w:val="22"/>
-        </w:rPr>
-      </w:pPr>
-      <w:r>
-        <w:rPr>
-          <w:sz w:val="22"/>
-          <w:szCs w:val="22"/>
-        </w:rPr>
-        <w:t>Students Names: Ben-Simon Dror, Cooper Dan</w:t>
-      </w:r>
-    </w:p>
-    <w:p>
-      <w:pPr>
-        <w:spacing w:after="0" w:line="240" w:lineRule="auto"/>
-        <w:jc w:val="center"/>
-        <w:rPr>
-          <w:sz w:val="22"/>
-          <w:szCs w:val="22"/>
-        </w:rPr>
-      </w:pPr>
-      <w:r>
-        <w:rPr>
-          <w:i/>
-          <w:sz w:val="22"/>
-          <w:szCs w:val="22"/>
-        </w:rPr>
-        <w:t>drorbe@post.bgu.ac.il</w:t>
-      </w:r>
-    </w:p>
-    <w:p>
-      <w:pPr>
-        <w:spacing w:after="200" w:line="240" w:lineRule="auto"/>
-        <w:jc w:val="center"/>
-        <w:rPr>
-          <w:sz w:val="22"/>
-          <w:szCs w:val="22"/>
-        </w:rPr>
-      </w:pPr>
-      <w:r>
-        <w:rPr>
-          <w:sz w:val="22"/>
-          <w:szCs w:val="22"/>
-        </w:rPr>
-        <w:t xml:space="preserve">Adviser Name: </w:t>
-      </w:r>
-      <w:proofErr w:type="spellStart"/>
-      <w:r>
-        <w:rPr>
-          <w:sz w:val="22"/>
-          <w:szCs w:val="22"/>
-        </w:rPr>
-        <w:t>Vilenchik</w:t>
-      </w:r>
-      <w:proofErr w:type="spellEnd"/>
-      <w:r>
-        <w:rPr>
-          <w:sz w:val="22"/>
-          <w:szCs w:val="22"/>
-        </w:rPr>
-        <w:t xml:space="preserve"> Dan</w:t>
-      </w:r>
-    </w:p>
-    <w:p>
-      <w:pPr>
-        <w:spacing w:after="120" w:line="240" w:lineRule="auto"/>
-        <w:jc w:val="center"/>
-        <w:rPr>
-          <w:sz w:val="22"/>
-          <w:szCs w:val="22"/>
-        </w:rPr>
-      </w:pPr>
-      <w:r>
-        <w:rPr>
-          <w:b/>
-          <w:bCs/>
-          <w:sz w:val="26"/>
-          <w:szCs w:val="26"/>
         </w:rPr>
         <w:t>Abstract</w:t>
       </w:r>
@@ -1126,39 +1022,7 @@
           <w:sz w:val="22"/>
           <w:szCs w:val="22"/>
         </w:rPr>
-        <w:t xml:space="preserve">Honeybee colonies are checked mainly by opening the hive every few weeks to months, leaving the beekeeper blind between visits. Swarm preparation takes one to two weeks, and the swarm, taking a large part of the colony, leaves within minutes and is often discovered only </w:t>
-      </w:r>
-      <w:proofErr w:type="gramStart"/>
-      <w:r>
-        <w:rPr>
-          <w:sz w:val="22"/>
-          <w:szCs w:val="22"/>
-        </w:rPr>
-        <w:t>at</w:t>
-      </w:r>
-      <w:proofErr w:type="gramEnd"/>
-      <w:r>
-        <w:rPr>
-          <w:sz w:val="22"/>
-          <w:szCs w:val="22"/>
-        </w:rPr>
-        <w:t xml:space="preserve"> the next visit. </w:t>
-      </w:r>
-      <w:proofErr w:type="spellStart"/>
-      <w:r>
-        <w:rPr>
-          <w:sz w:val="22"/>
-          <w:szCs w:val="22"/>
-        </w:rPr>
-        <w:t>BeeSense</w:t>
-      </w:r>
-      <w:proofErr w:type="spellEnd"/>
-      <w:r>
-        <w:rPr>
-          <w:sz w:val="22"/>
-          <w:szCs w:val="22"/>
-        </w:rPr>
-        <w:t xml:space="preserve"> is an Internet of Things (IoT) system for monitoring hives at apiaries without mains power or network. In each hive, a battery-powered node uses a piezoelectric vibration sensor that listens at nanoampere current and wakes the node when vibration rises above the background; the node then computes vibration and sound spectra and fuses them with hive weight and temperature. A solar-powered hub at the apiary collects the data, detects signs of an approaching swarm and colony anomalies, and sends alerts over the cellular network. The innovation is an autonomous, low-cost system that brings a laboratory-proven capability to the field, at thousands of times less power than research systems. Targets: weighing accuracy of ±20 g, packet delivery above 95%, at least six months per battery and, as the committed target, precision and recall above 90% for swarm alerts issued before the swarm leaves.</w:t>
+        <w:t>Honeybee colonies are checked mainly by opening the hive every few weeks to months, leaving the beekeeper blind between visits. Swarm preparation takes one to two weeks, and the swarm, taking a large part of the colony, leaves within minutes and is often discovered only at the next visit. BeeSense is an Internet of Things (IoT) system for monitoring hives at apiaries without mains power or network. In each hive, a battery-powered node uses a piezoelectric vibration sensor that listens at nanoampere current and wakes the node when vibration rises above the background; the node then computes vibration and sound spectra and fuses them with hive weight and temperature. A solar-powered hub at the apiary collects the data, detects signs of an approaching swarm and colony anomalies, and sends alerts over the cellular network. The innovation is an autonomous, low-cost system that brings a laboratory-proven capability to the field, at thousands of times less power than research systems. Targets: weighing accuracy of ±20 g, packet delivery above 95%, at least six months per battery and, as the committed target, precision and recall above 90% for swarm alerts issued before the swarm leaves.</w:t>
       </w:r>
     </w:p>
     <w:p>
@@ -1170,8 +1034,8 @@
           <w:szCs w:val="22"/>
         </w:rPr>
         <w:sectPr>
-          <w:headerReference w:type="default" r:id="rId13"/>
-          <w:footerReference w:type="default" r:id="rId14"/>
+          <w:headerReference w:type="default" r:id="rId14"/>
+          <w:footerReference w:type="default" r:id="rId15"/>
           <w:pgSz w:w="11906" w:h="16838"/>
           <w:pgMar w:top="1417" w:right="1417" w:bottom="1417" w:left="1417" w:header="709" w:footer="709" w:gutter="0"/>
           <w:pgNumType w:fmt="lowerRoman" w:start="1"/>
@@ -1489,7 +1353,7 @@
                     <pic:cNvPicPr preferRelativeResize="0"/>
                   </pic:nvPicPr>
                   <pic:blipFill>
-                    <a:blip r:embed="rId15"/>
+                    <a:blip r:embed="rId16"/>
                     <a:srcRect/>
                     <a:stretch>
                       <a:fillRect/>
@@ -1526,39 +1390,7 @@
           <w:sz w:val="18"/>
           <w:szCs w:val="18"/>
         </w:rPr>
-        <w:t xml:space="preserve">Fig. 1.  </w:t>
-      </w:r>
-      <w:proofErr w:type="spellStart"/>
-      <w:r>
-        <w:rPr>
-          <w:sz w:val="18"/>
-          <w:szCs w:val="18"/>
-        </w:rPr>
-        <w:t>BeeSense</w:t>
-      </w:r>
-      <w:proofErr w:type="spellEnd"/>
-      <w:r>
-        <w:rPr>
-          <w:sz w:val="18"/>
-          <w:szCs w:val="18"/>
-        </w:rPr>
-        <w:t xml:space="preserve"> block diagram (blue: </w:t>
-      </w:r>
-      <w:proofErr w:type="spellStart"/>
-      <w:r>
-        <w:rPr>
-          <w:sz w:val="18"/>
-          <w:szCs w:val="18"/>
-        </w:rPr>
-        <w:t>BeeSense</w:t>
-      </w:r>
-      <w:proofErr w:type="spellEnd"/>
-      <w:r>
-        <w:rPr>
-          <w:sz w:val="18"/>
-          <w:szCs w:val="18"/>
-        </w:rPr>
-        <w:t xml:space="preserve"> system, grey: external; red: event wake-up path).</w:t>
+        <w:t>Fig. 1.  BeeSense block diagram (blue: BeeSense system, grey: external; red: event wake-up path).</w:t>
       </w:r>
     </w:p>
     <w:p>
@@ -2714,15 +2546,7 @@
           <w:sz w:val="22"/>
           <w:szCs w:val="22"/>
         </w:rPr>
-        <w:t xml:space="preserve"> = </w:t>
-      </w:r>
-      <w:proofErr w:type="spellStart"/>
-      <w:r>
-        <w:rPr>
-          <w:sz w:val="22"/>
-          <w:szCs w:val="22"/>
-        </w:rPr>
-        <w:t>Σ</w:t>
+        <w:t xml:space="preserve"> = Σ</w:t>
       </w:r>
       <w:r>
         <w:rPr>
@@ -2734,7 +2558,6 @@
         </w:rPr>
         <w:t>f∈Bk</w:t>
       </w:r>
-      <w:proofErr w:type="spellEnd"/>
       <w:r>
         <w:rPr>
           <w:sz w:val="22"/>
@@ -2772,15 +2595,7 @@
           <w:sz w:val="22"/>
           <w:szCs w:val="22"/>
         </w:rPr>
-        <w:t xml:space="preserve">) / </w:t>
-      </w:r>
-      <w:proofErr w:type="spellStart"/>
-      <w:r>
-        <w:rPr>
-          <w:sz w:val="22"/>
-          <w:szCs w:val="22"/>
-        </w:rPr>
-        <w:t>Σ</w:t>
+        <w:t>) / Σ</w:t>
       </w:r>
       <w:r>
         <w:rPr>
@@ -2792,7 +2607,6 @@
         </w:rPr>
         <w:t>f∈B</w:t>
       </w:r>
-      <w:proofErr w:type="spellEnd"/>
       <w:r>
         <w:rPr>
           <w:sz w:val="22"/>
@@ -2825,21 +2639,12 @@
         </w:rPr>
         <w:t>f</w:t>
       </w:r>
-      <w:proofErr w:type="gramStart"/>
-      <w:r>
-        <w:rPr>
-          <w:sz w:val="22"/>
-          <w:szCs w:val="22"/>
-        </w:rPr>
-        <w:t xml:space="preserve">),   </w:t>
-      </w:r>
-      <w:proofErr w:type="gramEnd"/>
-      <w:r>
-        <w:rPr>
-          <w:sz w:val="22"/>
-          <w:szCs w:val="22"/>
-        </w:rPr>
-        <w:t xml:space="preserve">  </w:t>
+      <w:r>
+        <w:rPr>
+          <w:sz w:val="22"/>
+          <w:szCs w:val="22"/>
+        </w:rPr>
+        <w:t xml:space="preserve">),     </w:t>
       </w:r>
       <w:r>
         <w:rPr>
@@ -2928,7 +2733,6 @@
         </w:rPr>
         <w:t xml:space="preserve"> − </w:t>
       </w:r>
-      <w:proofErr w:type="spellStart"/>
       <w:r>
         <w:rPr>
           <w:i/>
@@ -2948,7 +2752,6 @@
         </w:rPr>
         <w:t>h</w:t>
       </w:r>
-      <w:proofErr w:type="spellEnd"/>
       <w:r>
         <w:rPr>
           <w:sz w:val="22"/>
@@ -2956,7 +2759,6 @@
         </w:rPr>
         <w:t xml:space="preserve">) / </w:t>
       </w:r>
-      <w:proofErr w:type="spellStart"/>
       <w:r>
         <w:rPr>
           <w:i/>
@@ -2966,7 +2768,6 @@
         </w:rPr>
         <w:t>σ</w:t>
       </w:r>
-      <w:proofErr w:type="gramStart"/>
       <w:r>
         <w:rPr>
           <w:i/>
@@ -2977,21 +2778,12 @@
         </w:rPr>
         <w:t>h</w:t>
       </w:r>
-      <w:proofErr w:type="spellEnd"/>
-      <w:r>
-        <w:rPr>
-          <w:sz w:val="22"/>
-          <w:szCs w:val="22"/>
-        </w:rPr>
-        <w:t xml:space="preserve">,   </w:t>
-      </w:r>
-      <w:proofErr w:type="gramEnd"/>
-      <w:r>
-        <w:rPr>
-          <w:sz w:val="22"/>
-          <w:szCs w:val="22"/>
-        </w:rPr>
-        <w:t xml:space="preserve">  Δ</w:t>
+      <w:r>
+        <w:rPr>
+          <w:sz w:val="22"/>
+          <w:szCs w:val="22"/>
+        </w:rPr>
+        <w:t>,     Δ</w:t>
       </w:r>
       <w:r>
         <w:rPr>
@@ -3057,7 +2849,6 @@
         </w:rPr>
         <w:t xml:space="preserve">) − </w:t>
       </w:r>
-      <w:proofErr w:type="gramStart"/>
       <w:r>
         <w:rPr>
           <w:i/>
@@ -3074,7 +2865,6 @@
         </w:rPr>
         <w:t>(</w:t>
       </w:r>
-      <w:proofErr w:type="gramEnd"/>
       <w:r>
         <w:rPr>
           <w:i/>
@@ -3687,7 +3477,7 @@
                     <pic:cNvPicPr preferRelativeResize="0"/>
                   </pic:nvPicPr>
                   <pic:blipFill>
-                    <a:blip r:embed="rId16"/>
+                    <a:blip r:embed="rId17"/>
                     <a:srcRect/>
                     <a:stretch>
                       <a:fillRect/>
@@ -3724,23 +3514,7 @@
           <w:sz w:val="18"/>
           <w:szCs w:val="18"/>
         </w:rPr>
-        <w:t xml:space="preserve">Fig. 2.  Estimated node battery life (one 18650 cell) vs. event </w:t>
-      </w:r>
-      <w:proofErr w:type="gramStart"/>
-      <w:r>
-        <w:rPr>
-          <w:sz w:val="18"/>
-          <w:szCs w:val="18"/>
-        </w:rPr>
-        <w:t>wake-ups</w:t>
-      </w:r>
-      <w:proofErr w:type="gramEnd"/>
-      <w:r>
-        <w:rPr>
-          <w:sz w:val="18"/>
-          <w:szCs w:val="18"/>
-        </w:rPr>
-        <w:t xml:space="preserve"> per day by (3) (datasheet-level estimates, to be measured).</w:t>
+        <w:t>Fig. 2.  Estimated node battery life (one 18650 cell) vs. event wake-ups per day by (3) (datasheet-level estimates, to be measured).</w:t>
       </w:r>
     </w:p>
     <w:p>
@@ -3902,41 +3676,8 @@
           <w:szCs w:val="20"/>
         </w:rPr>
         <w:tab/>
-        <w:t xml:space="preserve">A. Zacepins, V. Brusbardis, J. </w:t>
-      </w:r>
-      <w:proofErr w:type="spellStart"/>
-      <w:r>
-        <w:rPr>
-          <w:sz w:val="20"/>
-          <w:szCs w:val="20"/>
-        </w:rPr>
-        <w:t>Meitalovs</w:t>
-      </w:r>
-      <w:proofErr w:type="spellEnd"/>
-      <w:r>
-        <w:rPr>
-          <w:sz w:val="20"/>
-          <w:szCs w:val="20"/>
-        </w:rPr>
-        <w:t xml:space="preserve">, and E. </w:t>
-      </w:r>
-      <w:proofErr w:type="spellStart"/>
-      <w:r>
-        <w:rPr>
-          <w:sz w:val="20"/>
-          <w:szCs w:val="20"/>
-        </w:rPr>
-        <w:t>Stalidzans</w:t>
-      </w:r>
-      <w:proofErr w:type="spellEnd"/>
-      <w:r>
-        <w:rPr>
-          <w:sz w:val="20"/>
-          <w:szCs w:val="20"/>
-        </w:rPr>
-        <w:t xml:space="preserve">, "Challenges in the development of precision beekeeping," </w:t>
-      </w:r>
-      <w:proofErr w:type="spellStart"/>
+        <w:t xml:space="preserve">A. Zacepins, V. Brusbardis, J. Meitalovs, and E. Stalidzans, "Challenges in the development of precision beekeeping," </w:t>
+      </w:r>
       <w:r>
         <w:rPr>
           <w:i/>
@@ -3944,40 +3685,14 @@
           <w:sz w:val="20"/>
           <w:szCs w:val="20"/>
         </w:rPr>
-        <w:t>Biosyst</w:t>
-      </w:r>
-      <w:proofErr w:type="spellEnd"/>
-      <w:r>
-        <w:rPr>
-          <w:i/>
-          <w:iCs/>
+        <w:t>Biosyst. Eng.</w:t>
+      </w:r>
+      <w:r>
+        <w:rPr>
           <w:sz w:val="20"/>
           <w:szCs w:val="20"/>
         </w:rPr>
-        <w:t>. Eng.</w:t>
-      </w:r>
-      <w:r>
-        <w:rPr>
-          <w:sz w:val="20"/>
-          <w:szCs w:val="20"/>
-        </w:rPr>
-        <w:t xml:space="preserve">, vol. 130, pp. 60–71, Feb. 2015, </w:t>
-      </w:r>
-      <w:proofErr w:type="spellStart"/>
-      <w:r>
-        <w:rPr>
-          <w:sz w:val="20"/>
-          <w:szCs w:val="20"/>
-        </w:rPr>
-        <w:t>doi</w:t>
-      </w:r>
-      <w:proofErr w:type="spellEnd"/>
-      <w:r>
-        <w:rPr>
-          <w:sz w:val="20"/>
-          <w:szCs w:val="20"/>
-        </w:rPr>
-        <w:t>: 10.1016/j.biosystemseng.2014.12.001.</w:t>
+        <w:t>, vol. 130, pp. 60–71, Feb. 2015, doi: 10.1016/j.biosystemseng.2014.12.001.</w:t>
       </w:r>
     </w:p>
     <w:p>
@@ -4008,7 +3723,6 @@
         <w:tab/>
         <w:t xml:space="preserve">S. Ferrari, M. Silva, M. Guarino, and D. Berckmans, "Monitoring of swarming sounds in bee hives for early detection of the swarming period," </w:t>
       </w:r>
-      <w:proofErr w:type="spellStart"/>
       <w:r>
         <w:rPr>
           <w:i/>
@@ -4016,40 +3730,14 @@
           <w:sz w:val="20"/>
           <w:szCs w:val="20"/>
         </w:rPr>
-        <w:t>Comput</w:t>
-      </w:r>
-      <w:proofErr w:type="spellEnd"/>
-      <w:r>
-        <w:rPr>
-          <w:i/>
-          <w:iCs/>
+        <w:t>Comput. Electron. Agric.</w:t>
+      </w:r>
+      <w:r>
+        <w:rPr>
           <w:sz w:val="20"/>
           <w:szCs w:val="20"/>
         </w:rPr>
-        <w:t>. Electron. Agric.</w:t>
-      </w:r>
-      <w:r>
-        <w:rPr>
-          <w:sz w:val="20"/>
-          <w:szCs w:val="20"/>
-        </w:rPr>
-        <w:t xml:space="preserve">, vol. 64, no. 1, pp. 72–77, 2008, </w:t>
-      </w:r>
-      <w:proofErr w:type="spellStart"/>
-      <w:r>
-        <w:rPr>
-          <w:sz w:val="20"/>
-          <w:szCs w:val="20"/>
-        </w:rPr>
-        <w:t>doi</w:t>
-      </w:r>
-      <w:proofErr w:type="spellEnd"/>
-      <w:r>
-        <w:rPr>
-          <w:sz w:val="20"/>
-          <w:szCs w:val="20"/>
-        </w:rPr>
-        <w:t>: 10.1016/j.compag.2008.05.010.</w:t>
+        <w:t>, vol. 64, no. 1, pp. 72–77, 2008, doi: 10.1016/j.compag.2008.05.010.</w:t>
       </w:r>
     </w:p>
     <w:p>
@@ -4078,23 +3766,7 @@
           <w:szCs w:val="20"/>
         </w:rPr>
         <w:tab/>
-        <w:t xml:space="preserve">M.-T. Ramsey, M. Bencsik, M. I. Newton, M. Reyes, M. Pioz, D. </w:t>
-      </w:r>
-      <w:proofErr w:type="spellStart"/>
-      <w:r>
-        <w:rPr>
-          <w:sz w:val="20"/>
-          <w:szCs w:val="20"/>
-        </w:rPr>
-        <w:t>Crauser</w:t>
-      </w:r>
-      <w:proofErr w:type="spellEnd"/>
-      <w:r>
-        <w:rPr>
-          <w:sz w:val="20"/>
-          <w:szCs w:val="20"/>
-        </w:rPr>
-        <w:t xml:space="preserve">, N. Simon Delso, and Y. Le Conte, "The prediction of swarming in honeybee colonies using vibrational spectra," </w:t>
+        <w:t xml:space="preserve">M.-T. Ramsey, M. Bencsik, M. I. Newton, M. Reyes, M. Pioz, D. Crauser, N. Simon Delso, and Y. Le Conte, "The prediction of swarming in honeybee colonies using vibrational spectra," </w:t>
       </w:r>
       <w:r>
         <w:rPr>
@@ -4110,23 +3782,7 @@
           <w:sz w:val="20"/>
           <w:szCs w:val="20"/>
         </w:rPr>
-        <w:t xml:space="preserve">, vol. 10, Art. no. 9798, Jun. 2020, </w:t>
-      </w:r>
-      <w:proofErr w:type="spellStart"/>
-      <w:r>
-        <w:rPr>
-          <w:sz w:val="20"/>
-          <w:szCs w:val="20"/>
-        </w:rPr>
-        <w:t>doi</w:t>
-      </w:r>
-      <w:proofErr w:type="spellEnd"/>
-      <w:r>
-        <w:rPr>
-          <w:sz w:val="20"/>
-          <w:szCs w:val="20"/>
-        </w:rPr>
-        <w:t>: 10.1038/s41598-020-66115-5.</w:t>
+        <w:t>, vol. 10, Art. no. 9798, Jun. 2020, doi: 10.1038/s41598-020-66115-5.</w:t>
       </w:r>
     </w:p>
     <w:p>
@@ -4157,7 +3813,6 @@
         <w:tab/>
         <w:t xml:space="preserve">W. G. Meikle and N. Holst, "Application of continuous monitoring of honeybee colonies," </w:t>
       </w:r>
-      <w:proofErr w:type="spellStart"/>
       <w:r>
         <w:rPr>
           <w:i/>
@@ -4167,29 +3822,12 @@
         </w:rPr>
         <w:t>Apidologie</w:t>
       </w:r>
-      <w:proofErr w:type="spellEnd"/>
       <w:r>
         <w:rPr>
           <w:sz w:val="20"/>
           <w:szCs w:val="20"/>
         </w:rPr>
-        <w:t xml:space="preserve">, vol. 46, no. 1, pp. 10–22, 2015, </w:t>
-      </w:r>
-      <w:proofErr w:type="spellStart"/>
-      <w:r>
-        <w:rPr>
-          <w:sz w:val="20"/>
-          <w:szCs w:val="20"/>
-        </w:rPr>
-        <w:t>doi</w:t>
-      </w:r>
-      <w:proofErr w:type="spellEnd"/>
-      <w:r>
-        <w:rPr>
-          <w:sz w:val="20"/>
-          <w:szCs w:val="20"/>
-        </w:rPr>
-        <w:t>: 10.1007/s13592-014-0298-x.</w:t>
+        <w:t>, vol. 46, no. 1, pp. 10–22, 2015, doi: 10.1007/s13592-014-0298-x.</w:t>
       </w:r>
     </w:p>
     <w:p>
@@ -4237,55 +3875,7 @@
           <w:szCs w:val="20"/>
         </w:rPr>
         <w:tab/>
-        <w:t xml:space="preserve">S. Cecchi, S. </w:t>
-      </w:r>
-      <w:proofErr w:type="spellStart"/>
-      <w:r>
-        <w:rPr>
-          <w:sz w:val="20"/>
-          <w:szCs w:val="20"/>
-        </w:rPr>
-        <w:t>Spinsante</w:t>
-      </w:r>
-      <w:proofErr w:type="spellEnd"/>
-      <w:r>
-        <w:rPr>
-          <w:sz w:val="20"/>
-          <w:szCs w:val="20"/>
-        </w:rPr>
-        <w:t xml:space="preserve">, A. Terenzi, and S. </w:t>
-      </w:r>
-      <w:proofErr w:type="spellStart"/>
-      <w:r>
-        <w:rPr>
-          <w:sz w:val="20"/>
-          <w:szCs w:val="20"/>
-        </w:rPr>
-        <w:t>Orcioni</w:t>
-      </w:r>
-      <w:proofErr w:type="spellEnd"/>
-      <w:r>
-        <w:rPr>
-          <w:sz w:val="20"/>
-          <w:szCs w:val="20"/>
-        </w:rPr>
-        <w:t xml:space="preserve">, "A smart sensor-based measurement system for advanced </w:t>
-      </w:r>
-      <w:proofErr w:type="gramStart"/>
-      <w:r>
-        <w:rPr>
-          <w:sz w:val="20"/>
-          <w:szCs w:val="20"/>
-        </w:rPr>
-        <w:t>bee hive</w:t>
-      </w:r>
-      <w:proofErr w:type="gramEnd"/>
-      <w:r>
-        <w:rPr>
-          <w:sz w:val="20"/>
-          <w:szCs w:val="20"/>
-        </w:rPr>
-        <w:t xml:space="preserve"> monitoring," </w:t>
+        <w:t xml:space="preserve">S. Cecchi, S. Spinsante, A. Terenzi, and S. Orcioni, "A smart sensor-based measurement system for advanced bee hive monitoring," </w:t>
       </w:r>
       <w:r>
         <w:rPr>
@@ -4301,23 +3891,7 @@
           <w:sz w:val="20"/>
           <w:szCs w:val="20"/>
         </w:rPr>
-        <w:t xml:space="preserve">, vol. 20, no. 9, Art. no. 2726, May 2020, </w:t>
-      </w:r>
-      <w:proofErr w:type="spellStart"/>
-      <w:r>
-        <w:rPr>
-          <w:sz w:val="20"/>
-          <w:szCs w:val="20"/>
-        </w:rPr>
-        <w:t>doi</w:t>
-      </w:r>
-      <w:proofErr w:type="spellEnd"/>
-      <w:r>
-        <w:rPr>
-          <w:sz w:val="20"/>
-          <w:szCs w:val="20"/>
-        </w:rPr>
-        <w:t>: 10.3390/s20092726.</w:t>
+        <w:t>, vol. 20, no. 9, Art. no. 2726, May 2020, doi: 10.3390/s20092726.</w:t>
       </w:r>
     </w:p>
     <w:p>
@@ -4346,22 +3920,7 @@
           <w:szCs w:val="20"/>
         </w:rPr>
         <w:tab/>
-      </w:r>
-      <w:proofErr w:type="spellStart"/>
-      <w:r>
-        <w:rPr>
-          <w:sz w:val="20"/>
-          <w:szCs w:val="20"/>
-        </w:rPr>
-        <w:t>BeeHero</w:t>
-      </w:r>
-      <w:proofErr w:type="spellEnd"/>
-      <w:r>
-        <w:rPr>
-          <w:sz w:val="20"/>
-          <w:szCs w:val="20"/>
-        </w:rPr>
-        <w:t>, "Technology." [Online]. Available: https://www.beehero.io/technology</w:t>
+        <w:t>BeeHero, "Technology." [Online]. Available: https://www.beehero.io/technology</w:t>
       </w:r>
     </w:p>
     <w:p>
@@ -4409,25 +3968,8 @@
           <w:szCs w:val="20"/>
         </w:rPr>
         <w:tab/>
-        <w:t xml:space="preserve">M. Bencsik, Y. Le Conte, M. Reyes, M. Pioz, D. Whittaker, D. </w:t>
-      </w:r>
-      <w:proofErr w:type="spellStart"/>
-      <w:r>
-        <w:rPr>
-          <w:sz w:val="20"/>
-          <w:szCs w:val="20"/>
-        </w:rPr>
-        <w:t>Crauser</w:t>
-      </w:r>
-      <w:proofErr w:type="spellEnd"/>
-      <w:r>
-        <w:rPr>
-          <w:sz w:val="20"/>
-          <w:szCs w:val="20"/>
-        </w:rPr>
-        <w:t xml:space="preserve">, N. Simon Delso, and M. I. Newton, "Honeybee colony vibrational measurements to highlight the brood cycle," </w:t>
-      </w:r>
-      <w:proofErr w:type="spellStart"/>
+        <w:t xml:space="preserve">M. Bencsik, Y. Le Conte, M. Reyes, M. Pioz, D. Whittaker, D. Crauser, N. Simon Delso, and M. I. Newton, "Honeybee colony vibrational measurements to highlight the brood cycle," </w:t>
+      </w:r>
       <w:r>
         <w:rPr>
           <w:i/>
@@ -4435,40 +3977,14 @@
           <w:sz w:val="20"/>
           <w:szCs w:val="20"/>
         </w:rPr>
-        <w:t>PLoS</w:t>
-      </w:r>
-      <w:proofErr w:type="spellEnd"/>
-      <w:r>
-        <w:rPr>
-          <w:i/>
-          <w:iCs/>
+        <w:t>PLoS ONE</w:t>
+      </w:r>
+      <w:r>
+        <w:rPr>
           <w:sz w:val="20"/>
           <w:szCs w:val="20"/>
         </w:rPr>
-        <w:t xml:space="preserve"> ONE</w:t>
-      </w:r>
-      <w:r>
-        <w:rPr>
-          <w:sz w:val="20"/>
-          <w:szCs w:val="20"/>
-        </w:rPr>
-        <w:t xml:space="preserve">, vol. 10, no. 11, Art. no. e0141926, Nov. 2015, </w:t>
-      </w:r>
-      <w:proofErr w:type="spellStart"/>
-      <w:r>
-        <w:rPr>
-          <w:sz w:val="20"/>
-          <w:szCs w:val="20"/>
-        </w:rPr>
-        <w:t>doi</w:t>
-      </w:r>
-      <w:proofErr w:type="spellEnd"/>
-      <w:r>
-        <w:rPr>
-          <w:sz w:val="20"/>
-          <w:szCs w:val="20"/>
-        </w:rPr>
-        <w:t>: 10.1371/journal.pone.0141926.</w:t>
+        <w:t>, vol. 10, no. 11, Art. no. e0141926, Nov. 2015, doi: 10.1371/journal.pone.0141926.</w:t>
       </w:r>
     </w:p>
     <w:p>
@@ -4497,22 +4013,7 @@
           <w:szCs w:val="20"/>
         </w:rPr>
         <w:tab/>
-      </w:r>
-      <w:proofErr w:type="spellStart"/>
-      <w:r>
-        <w:rPr>
-          <w:sz w:val="20"/>
-          <w:szCs w:val="20"/>
-        </w:rPr>
-        <w:t>Espressif</w:t>
-      </w:r>
-      <w:proofErr w:type="spellEnd"/>
-      <w:r>
-        <w:rPr>
-          <w:sz w:val="20"/>
-          <w:szCs w:val="20"/>
-        </w:rPr>
-        <w:t xml:space="preserve"> Systems, "ESP-NOW," in </w:t>
+        <w:t xml:space="preserve">Espressif Systems, "ESP-NOW," in </w:t>
       </w:r>
       <w:r>
         <w:rPr>
@@ -4586,22 +4087,7 @@
           <w:szCs w:val="20"/>
         </w:rPr>
         <w:tab/>
-      </w:r>
-      <w:proofErr w:type="spellStart"/>
-      <w:r>
-        <w:rPr>
-          <w:sz w:val="20"/>
-          <w:szCs w:val="20"/>
-        </w:rPr>
-        <w:t>Espressif</w:t>
-      </w:r>
-      <w:proofErr w:type="spellEnd"/>
-      <w:r>
-        <w:rPr>
-          <w:sz w:val="20"/>
-          <w:szCs w:val="20"/>
-        </w:rPr>
-        <w:t xml:space="preserve"> Systems, "ESP32-C3 series datasheet." [Online]. Available: https://www.espressif.com/en/support/documents/technical-documents</w:t>
+        <w:t>Espressif Systems, "ESP32-C3 series datasheet." [Online]. Available: https://www.espressif.com/en/support/documents/technical-documents</w:t>
       </w:r>
     </w:p>
     <w:p>
@@ -4665,7 +4151,6 @@
         </w:rPr>
         <w:t xml:space="preserve">, שם הפרויקט: </w:t>
       </w:r>
-      <w:proofErr w:type="spellStart"/>
       <w:r>
         <w:rPr>
           <w:sz w:val="22"/>
@@ -4673,7 +4158,6 @@
         </w:rPr>
         <w:t>BeeSense</w:t>
       </w:r>
-      <w:proofErr w:type="spellEnd"/>
       <w:r>
         <w:rPr>
           <w:sz w:val="22"/>
@@ -4706,18 +4190,8 @@
           <w:szCs w:val="22"/>
           <w:rtl/>
         </w:rPr>
-        <w:t xml:space="preserve">שם המנחה: ד"ר דן </w:t>
-      </w:r>
-      <w:proofErr w:type="spellStart"/>
-      <w:r>
-        <w:rPr>
-          <w:sz w:val="22"/>
-          <w:szCs w:val="22"/>
-          <w:rtl/>
-        </w:rPr>
-        <w:t>וילנצ'יק</w:t>
-      </w:r>
-      <w:proofErr w:type="spellEnd"/>
+        <w:t>שם המנחה: ד"ר דן וילנצ'יק</w:t>
+      </w:r>
     </w:p>
     <w:p>
       <w:pPr>
@@ -5745,7 +5219,6 @@
         </w:rPr>
         <w:t xml:space="preserve">, שם הפרויקט: </w:t>
       </w:r>
-      <w:proofErr w:type="spellStart"/>
       <w:r>
         <w:rPr>
           <w:sz w:val="22"/>
@@ -5753,7 +5226,6 @@
         </w:rPr>
         <w:t>BeeSense</w:t>
       </w:r>
-      <w:proofErr w:type="spellEnd"/>
       <w:r>
         <w:rPr>
           <w:sz w:val="22"/>
@@ -5786,18 +5258,8 @@
           <w:szCs w:val="22"/>
           <w:rtl/>
         </w:rPr>
-        <w:t xml:space="preserve">שם המנחה: ד"ר דן </w:t>
-      </w:r>
-      <w:proofErr w:type="spellStart"/>
-      <w:r>
-        <w:rPr>
-          <w:sz w:val="22"/>
-          <w:szCs w:val="22"/>
-          <w:rtl/>
-        </w:rPr>
-        <w:t>וילנצ'יק</w:t>
-      </w:r>
-      <w:proofErr w:type="spellEnd"/>
+        <w:t>שם המנחה: ד"ר דן וילנצ'יק</w:t>
+      </w:r>
     </w:p>
     <w:p>
       <w:pPr>

</xml_diff>

<commit_message>
vault backup: 2026-10-26 19:57:37
Affected files:
.obsidian/plugins/word-reader/data.json
docs/pdr-2027-165.docx
docs/~$r-2027-165.docx
</commit_message>
<xml_diff>
--- a/docs/pdr-2027-165.docx
+++ b/docs/pdr-2027-165.docx
@@ -657,60 +657,41 @@
           <w:rtl/>
         </w:rPr>
       </w:pPr>
-      <w:hyperlink r:id="rId12" w:history="1">
-        <w:r>
-          <w:rPr>
-            <w:i/>
-            <w:sz w:val="22"/>
-            <w:szCs w:val="22"/>
-          </w:rPr>
-          <w:t>drorbe@post.bgu.ac.il</w:t>
-        </w:r>
-      </w:hyperlink>
+      <w:r>
+        <w:rPr>
+          <w:b w:val="0"/>
+          <w:bCs w:val="0"/>
+          <w:i/>
+          <w:iCs w:val="0"/>
+          <w:rtl w:val="0"/>
+        </w:rPr>
+        <w:t xml:space="preserve">drorbe@post.bgu.ac.il, dancoop@post.bgu.ac.il</w:t>
+      </w:r>
     </w:p>
     <w:p>
       <w:pPr>
         <w:bidi/>
-        <w:spacing w:after="0" w:line="240" w:lineRule="auto"/>
+        <w:spacing w:after="80" w:line="240" w:lineRule="auto"/>
         <w:jc w:val="center"/>
         <w:rPr>
           <w:sz w:val="22"/>
           <w:szCs w:val="22"/>
-        </w:rPr>
-      </w:pPr>
-      <w:r>
-        <w:rPr>
-          <w:i/>
-          <w:sz w:val="22"/>
-          <w:szCs w:val="22"/>
-        </w:rPr>
-        <w:t>dancoop@post.bgu.ac.il</w:t>
+          <w:rtl/>
+        </w:rPr>
+      </w:pPr>
+      <w:r>
+        <w:rPr>
+          <w:sz w:val="22"/>
+          <w:szCs w:val="22"/>
+          <w:rtl/>
+        </w:rPr>
+        <w:t>שם המנחה: ד"ר דן וילנצ'יק</w:t>
       </w:r>
     </w:p>
     <w:p>
       <w:pPr>
         <w:bidi/>
-        <w:spacing w:after="200" w:line="240" w:lineRule="auto"/>
-        <w:jc w:val="center"/>
-        <w:rPr>
-          <w:sz w:val="22"/>
-          <w:szCs w:val="22"/>
-          <w:rtl/>
-        </w:rPr>
-      </w:pPr>
-      <w:r>
-        <w:rPr>
-          <w:sz w:val="22"/>
-          <w:szCs w:val="22"/>
-          <w:rtl/>
-        </w:rPr>
-        <w:t>שם המנחה: ד"ר דן וילנצ'יק</w:t>
-      </w:r>
-    </w:p>
-    <w:p>
-      <w:pPr>
-        <w:bidi/>
-        <w:spacing w:after="120" w:line="240" w:lineRule="auto"/>
+        <w:spacing w:after="40" w:line="240" w:lineRule="auto"/>
         <w:jc w:val="center"/>
         <w:rPr>
           <w:sz w:val="22"/>
@@ -740,107 +721,165 @@
       </w:pPr>
       <w:r>
         <w:rPr>
-          <w:sz w:val="22"/>
-          <w:szCs w:val="22"/>
-          <w:rtl/>
-        </w:rPr>
-        <w:t>מצב כוורות הדבורים נבדק כיום בעיקר בפתיחה ידנית של הכוורת אחת לכמה שבועות עד חודשים, ובין ביקור לביקור המגדל אינו יודע מה מתרחש בה. הכנה לבריחת נחיל נמשכת כשבוע עד שבועיים, והנחיל, שלוקח איתו חלק ניכר מהמושבה, עוזב תוך דקות ולעיתים קרובות מתגלה רק בביקור הבא. בי-סנס היא מערכת מבוססת האינטרנט של הדברים (</w:t>
-      </w:r>
-      <w:r>
-        <w:rPr>
-          <w:sz w:val="22"/>
-          <w:szCs w:val="22"/>
-        </w:rPr>
-        <w:t>IoT</w:t>
-      </w:r>
-      <w:r>
-        <w:rPr>
-          <w:sz w:val="22"/>
-          <w:szCs w:val="22"/>
-          <w:rtl/>
-        </w:rPr>
-        <w:t xml:space="preserve">) לניטור כוורות במכוורת ללא חשמל וללא רשת. בכל כוורת מותקן צומת סוללתי עם חיישן רטט פיאזואלקטרי, המאזין בצריכה של ננו-אמפרים ומעיר את הצומת כשהרטט חורג מרמת הרקע; הצומת מחשב את ספקטרום הרטט והקול ומשלב אותו עם משקל הכוורת והטמפרטורה. מרכזייה סולארית במכוורת אוספת את הנתונים, מזהה סימנים לנחילה מתקרבת וחריגות במושבה, ושולחת התרעות דרך הרשת הסלולרית. החדשנות היא מערכת אוטונומית וזולה שמביאה לשטח יכולת שהוכחה במעבדה, בצריכת הספק נמוכה פי אלפים ממערכות המחקר. היעדים: דיוק שקילה של </w:t>
-      </w:r>
-      <w:r>
-        <w:rPr>
-          <w:sz w:val="22"/>
-          <w:szCs w:val="22"/>
-        </w:rPr>
-        <w:t>20</w:t>
-      </w:r>
-      <w:r>
-        <w:rPr>
-          <w:sz w:val="22"/>
-          <w:szCs w:val="22"/>
-          <w:rtl/>
-        </w:rPr>
-        <w:t xml:space="preserve">± גרם, קליטת חבילות מעל </w:t>
-      </w:r>
-      <w:r>
-        <w:rPr>
-          <w:sz w:val="22"/>
-          <w:szCs w:val="22"/>
-        </w:rPr>
-        <w:t>95%</w:t>
-      </w:r>
-      <w:r>
-        <w:rPr>
-          <w:sz w:val="22"/>
-          <w:szCs w:val="22"/>
-          <w:rtl/>
-        </w:rPr>
-        <w:t>, לפחות חצי שנה על סוללה, וכיעד המחייב, דיוק (</w:t>
-      </w:r>
-      <w:r>
-        <w:rPr>
-          <w:sz w:val="22"/>
-          <w:szCs w:val="22"/>
-        </w:rPr>
-        <w:t>Precision</w:t>
-      </w:r>
-      <w:r>
-        <w:rPr>
-          <w:sz w:val="22"/>
-          <w:szCs w:val="22"/>
-          <w:rtl/>
-        </w:rPr>
-        <w:t>) ורגישות (</w:t>
-      </w:r>
-      <w:r>
-        <w:rPr>
-          <w:sz w:val="22"/>
-          <w:szCs w:val="22"/>
-        </w:rPr>
-        <w:t>Recall</w:t>
-      </w:r>
-      <w:r>
-        <w:rPr>
-          <w:sz w:val="22"/>
-          <w:szCs w:val="22"/>
-          <w:rtl/>
-        </w:rPr>
-        <w:t xml:space="preserve">) מעל </w:t>
-      </w:r>
-      <w:r>
-        <w:rPr>
-          <w:sz w:val="22"/>
-          <w:szCs w:val="22"/>
-        </w:rPr>
-        <w:t>90%</w:t>
-      </w:r>
-      <w:r>
-        <w:rPr>
-          <w:sz w:val="22"/>
-          <w:szCs w:val="22"/>
-          <w:rtl/>
-        </w:rPr>
-        <w:t xml:space="preserve"> בהתרעה על נחילה לפני יציאת הנחיל.</w:t>
+          <w:b w:val="0"/>
+          <w:bCs w:val="0"/>
+          <w:i w:val="0"/>
+          <w:iCs w:val="0"/>
+          <w:sz w:val="22"/>
+          <w:szCs w:val="22"/>
+          <w:rtl w:val="1"/>
+        </w:rPr>
+        <w:t xml:space="preserve">בי-סנס הוא אב-טיפוס אוטונומי לניטור מושבות דבורי דבש במכוורות ללא חשמל וללא </w:t>
+      </w:r>
+      <w:r>
+        <w:rPr>
+          <w:b w:val="0"/>
+          <w:bCs w:val="0"/>
+          <w:i w:val="0"/>
+          <w:iCs w:val="0"/>
+          <w:sz w:val="22"/>
+          <w:szCs w:val="22"/>
+          <w:rtl w:val="0"/>
+        </w:rPr>
+        <w:t xml:space="preserve">Wi-Fi</w:t>
+      </w:r>
+      <w:r>
+        <w:rPr>
+          <w:b w:val="0"/>
+          <w:bCs w:val="0"/>
+          <w:i w:val="0"/>
+          <w:iCs w:val="0"/>
+          <w:sz w:val="22"/>
+          <w:szCs w:val="22"/>
+          <w:rtl w:val="1"/>
+        </w:rPr>
+        <w:t xml:space="preserve">. צמתים סוללתיים בכוורות אוספים מדידות רטט וקול, מתוזמנות ומונעות-אירועים, יחד עם משקל וטמפרטורה. עיבוד משובץ מחלץ מאפיינים ספקטרליים, הנשלחים למרכזייה סולארית עם חיבור סלולרי ומוצגים בממשק אינטרנט (</w:t>
+      </w:r>
+      <w:r>
+        <w:rPr>
+          <w:b w:val="0"/>
+          <w:bCs w:val="0"/>
+          <w:i w:val="0"/>
+          <w:iCs w:val="0"/>
+          <w:sz w:val="22"/>
+          <w:szCs w:val="22"/>
+          <w:rtl w:val="0"/>
+        </w:rPr>
+        <w:t xml:space="preserve">Web</w:t>
+      </w:r>
+      <w:r>
+        <w:rPr>
+          <w:b w:val="0"/>
+          <w:bCs w:val="0"/>
+          <w:i w:val="0"/>
+          <w:iCs w:val="0"/>
+          <w:sz w:val="22"/>
+          <w:szCs w:val="22"/>
+          <w:rtl w:val="1"/>
+        </w:rPr>
+        <w:t xml:space="preserve">) לכל כוורת. ההערכה ההנדסית תאפיין, על השולחן ובשטח, את איכות האות, ביצועי השקילה, קליטת החבילות ברמת היישום, צריכת האנרגיה וזמינות המערכת בשטח. מחקר פרוספקטיבי על שלוש עד חמש כוורות במכוורת </w:t>
+      </w:r>
+      <w:r>
+        <w:rPr>
+          <w:b w:val="0"/>
+          <w:bCs w:val="0"/>
+          <w:i w:val="0"/>
+          <w:iCs w:val="0"/>
+          <w:sz w:val="22"/>
+          <w:szCs w:val="22"/>
+          <w:rtl w:val="0"/>
+        </w:rPr>
+        <w:t xml:space="preserve">Zippory Honey</w:t>
+      </w:r>
+      <w:r>
+        <w:rPr>
+          <w:b w:val="0"/>
+          <w:bCs w:val="0"/>
+          <w:i w:val="0"/>
+          <w:iCs w:val="0"/>
+          <w:sz w:val="22"/>
+          <w:szCs w:val="22"/>
+          <w:rtl w:val="1"/>
+        </w:rPr>
+        <w:t xml:space="preserve">, לאורך עונת הנחילה באביב </w:t>
+      </w:r>
+      <w:r>
+        <w:rPr>
+          <w:b w:val="0"/>
+          <w:bCs w:val="0"/>
+          <w:i w:val="0"/>
+          <w:iCs w:val="0"/>
+          <w:sz w:val="22"/>
+          <w:szCs w:val="22"/>
+          <w:rtl w:val="0"/>
+        </w:rPr>
+        <w:t xml:space="preserve">2027</w:t>
+      </w:r>
+      <w:r>
+        <w:rPr>
+          <w:b w:val="0"/>
+          <w:bCs w:val="0"/>
+          <w:i w:val="0"/>
+          <w:iCs w:val="0"/>
+          <w:sz w:val="22"/>
+          <w:szCs w:val="22"/>
+          <w:rtl w:val="1"/>
+        </w:rPr>
+        <w:t xml:space="preserve">, יבחן אם המאפיינים הנמדדים מספקים התרעה מוקדמת ושימושית על נחילות שאושרו באופן בלתי תלוי. ביצועי החיזוי ידווחו לפי כלל התאמה שנקבע מראש בין התרעות לאירועים: התרעות שווא לכוורת לשבוע, דיוק (</w:t>
+      </w:r>
+      <w:r>
+        <w:rPr>
+          <w:b w:val="0"/>
+          <w:bCs w:val="0"/>
+          <w:i w:val="0"/>
+          <w:iCs w:val="0"/>
+          <w:sz w:val="22"/>
+          <w:szCs w:val="22"/>
+          <w:rtl w:val="0"/>
+        </w:rPr>
+        <w:t xml:space="preserve">Precision</w:t>
+      </w:r>
+      <w:r>
+        <w:rPr>
+          <w:b w:val="0"/>
+          <w:bCs w:val="0"/>
+          <w:i w:val="0"/>
+          <w:iCs w:val="0"/>
+          <w:sz w:val="22"/>
+          <w:szCs w:val="22"/>
+          <w:rtl w:val="1"/>
+        </w:rPr>
+        <w:t xml:space="preserve">) ורגישות (</w:t>
+      </w:r>
+      <w:r>
+        <w:rPr>
+          <w:b w:val="0"/>
+          <w:bCs w:val="0"/>
+          <w:i w:val="0"/>
+          <w:iCs w:val="0"/>
+          <w:sz w:val="22"/>
+          <w:szCs w:val="22"/>
+          <w:rtl w:val="0"/>
+        </w:rPr>
+        <w:t xml:space="preserve">Recall</w:t>
+      </w:r>
+      <w:r>
+        <w:rPr>
+          <w:b w:val="0"/>
+          <w:bCs w:val="0"/>
+          <w:i w:val="0"/>
+          <w:iCs w:val="0"/>
+          <w:sz w:val="22"/>
+          <w:szCs w:val="22"/>
+          <w:rtl w:val="1"/>
+        </w:rPr>
+        <w:t xml:space="preserve">) ברמת האירוע וזמן ההתרעה המוקדמת, בכפוף למספר האירועים שייצפו. השוואה לחישה פשוטה יותר ולדגימה מתוזמנת בלבד תבחן את התועלת של שילוב החיישנים ושל הדגימה מונעת-האירועים. חצי שנה של פעולת צומת על סוללה היא יעד ראשוני, שיגובה בפרופילי צריכה מדודים.</w:t>
       </w:r>
     </w:p>
     <w:p>
       <w:pPr>
         <w:bidi/>
-        <w:spacing w:before="120" w:after="20" w:line="360" w:lineRule="auto"/>
+        <w:spacing w:before="40" w:after="20" w:line="360" w:lineRule="auto"/>
         <w:jc w:val="both"/>
         <w:rPr>
           <w:sz w:val="22"/>
@@ -849,36 +888,51 @@
       </w:pPr>
       <w:r>
         <w:rPr>
-          <w:b/>
-          <w:bCs/>
-          <w:sz w:val="22"/>
-          <w:szCs w:val="22"/>
-          <w:rtl/>
-        </w:rPr>
-        <w:t>מילות מפתח:</w:t>
-      </w:r>
-      <w:r>
-        <w:rPr>
-          <w:sz w:val="22"/>
-          <w:szCs w:val="22"/>
-          <w:rtl/>
-        </w:rPr>
-        <w:t xml:space="preserve"> האינטרנט של הדברים, ניטור כוורות, דבורת הדבש, חיישן פיאזואלקטרי, השכמה מונעת-אירועים, עיבוד אותות, תאי עומס, מערכות משובצות בהספק נמוך, </w:t>
-      </w:r>
-      <w:r>
-        <w:rPr>
-          <w:sz w:val="22"/>
-          <w:szCs w:val="22"/>
-        </w:rPr>
-        <w:t>ESP32, ESP-NOW</w:t>
-      </w:r>
-      <w:r>
-        <w:rPr>
-          <w:sz w:val="22"/>
-          <w:szCs w:val="22"/>
-          <w:rtl/>
-        </w:rPr>
-        <w:t>.</w:t>
+          <w:b w:val="1"/>
+          <w:bCs w:val="1"/>
+          <w:i w:val="0"/>
+          <w:iCs w:val="0"/>
+          <w:sz w:val="22"/>
+          <w:szCs w:val="22"/>
+          <w:rtl w:val="1"/>
+        </w:rPr>
+        <w:t xml:space="preserve">מילות מפתח:</w:t>
+      </w:r>
+      <w:r>
+        <w:rPr>
+          <w:b w:val="0"/>
+          <w:bCs w:val="0"/>
+          <w:i w:val="0"/>
+          <w:iCs w:val="0"/>
+          <w:sz w:val="22"/>
+          <w:szCs w:val="22"/>
+          <w:rtl w:val="1"/>
+        </w:rPr>
+        <w:t xml:space="preserve"> האינטרנט של הדברים, ניטור כוורות, דבורת הדבש, חיזוי נחילה, חיישן פיאזואלקטרי, דגימה מונעת-אירועים, עיבוד אותות, תאי עומס, מערכות משובצות בהספק נמוך, </w:t>
+      </w:r>
+      <w:r>
+        <w:rPr>
+          <w:b w:val="0"/>
+          <w:bCs w:val="0"/>
+          <w:i w:val="0"/>
+          <w:iCs w:val="0"/>
+          <w:sz w:val="22"/>
+          <w:szCs w:val="22"/>
+          <w:rtl w:val="0"/>
+        </w:rPr>
+        <w:t xml:space="preserve">ESP-NOW</w:t>
+      </w:r>
+      <w:r>
+        <w:rPr>
+          <w:b w:val="0"/>
+          <w:bCs w:val="0"/>
+          <w:i w:val="0"/>
+          <w:iCs w:val="0"/>
+          <w:sz w:val="22"/>
+          <w:szCs w:val="22"/>
+          <w:rtl w:val="1"/>
+        </w:rPr>
+        <w:t xml:space="preserve">.</w:t>
       </w:r>
     </w:p>
     <w:p>
@@ -928,41 +982,22 @@
           <w:szCs w:val="22"/>
         </w:rPr>
       </w:pPr>
-      <w:hyperlink r:id="rId13" w:history="1">
-        <w:r>
-          <w:rPr>
-            <w:i/>
-            <w:sz w:val="22"/>
-            <w:szCs w:val="22"/>
-          </w:rPr>
-          <w:t>drorbe@post.bgu.ac.il</w:t>
-        </w:r>
-      </w:hyperlink>
-    </w:p>
-    <w:p>
-      <w:pPr>
-        <w:spacing w:after="0" w:line="240" w:lineRule="auto"/>
+      <w:r>
+        <w:rPr>
+          <w:b w:val="0"/>
+          <w:bCs w:val="0"/>
+          <w:i/>
+          <w:iCs w:val="0"/>
+          <w:rtl w:val="0"/>
+        </w:rPr>
+        <w:t xml:space="preserve">drorbe@post.bgu.ac.il, dancoop@post.bgu.ac.il</w:t>
+      </w:r>
+    </w:p>
+    <w:p>
+      <w:pPr>
+        <w:spacing w:after="80" w:line="240" w:lineRule="auto"/>
         <w:jc w:val="center"/>
         <w:rPr>
-          <w:i/>
-          <w:sz w:val="22"/>
-          <w:szCs w:val="22"/>
-        </w:rPr>
-      </w:pPr>
-      <w:r>
-        <w:rPr>
-          <w:i/>
-          <w:sz w:val="22"/>
-          <w:szCs w:val="22"/>
-        </w:rPr>
-        <w:t>dancoop@post.bgu.ac.il</w:t>
-      </w:r>
-    </w:p>
-    <w:p>
-      <w:pPr>
-        <w:spacing w:after="200" w:line="240" w:lineRule="auto"/>
-        <w:jc w:val="center"/>
-        <w:rPr>
           <w:sz w:val="22"/>
           <w:szCs w:val="22"/>
         </w:rPr>
@@ -991,7 +1026,7 @@
     </w:p>
     <w:p>
       <w:pPr>
-        <w:spacing w:after="120" w:line="240" w:lineRule="auto"/>
+        <w:spacing w:after="40" w:line="240" w:lineRule="auto"/>
         <w:jc w:val="center"/>
         <w:rPr>
           <w:sz w:val="22"/>
@@ -1019,15 +1054,20 @@
       </w:pPr>
       <w:r>
         <w:rPr>
-          <w:sz w:val="22"/>
-          <w:szCs w:val="22"/>
-        </w:rPr>
-        <w:t>Honeybee colonies are checked mainly by opening the hive every few weeks to months, leaving the beekeeper blind between visits. Swarm preparation takes one to two weeks, and the swarm, taking a large part of the colony, leaves within minutes and is often discovered only at the next visit. BeeSense is an Internet of Things (IoT) system for monitoring hives at apiaries without mains power or network. In each hive, a battery-powered node uses a piezoelectric vibration sensor that listens at nanoampere current and wakes the node when vibration rises above the background; the node then computes vibration and sound spectra and fuses them with hive weight and temperature. A solar-powered hub at the apiary collects the data, detects signs of an approaching swarm and colony anomalies, and sends alerts over the cellular network. The innovation is an autonomous, low-cost system that brings a laboratory-proven capability to the field, at thousands of times less power than research systems. Targets: weighing accuracy of ±20 g, packet delivery above 95%, at least six months per battery and, as the committed target, precision and recall above 90% for swarm alerts issued before the swarm leaves.</w:t>
-      </w:r>
-    </w:p>
-    <w:p>
-      <w:pPr>
-        <w:spacing w:before="120" w:after="20" w:line="360" w:lineRule="auto"/>
+          <w:b w:val="0"/>
+          <w:bCs w:val="0"/>
+          <w:i w:val="0"/>
+          <w:iCs w:val="0"/>
+          <w:sz w:val="22"/>
+          <w:szCs w:val="22"/>
+          <w:rtl w:val="0"/>
+        </w:rPr>
+        <w:t xml:space="preserve">BeeSense is an autonomous monitoring prototype for honeybee colonies at apiaries without mains power or Wi-Fi. Battery-powered hive nodes collect scheduled and event-triggered vibration and acoustic measurements together with weight and temperature. Embedded processing extracts spectral features, which are transmitted to a solar-powered cellular gateway and displayed on a per-hive dashboard. The engineering evaluation will characterize signal quality, weighing performance, application-level packet delivery, energy consumption, and field availability. A prospective study on three to five hives at the Zippory Honey apiary will investigate whether the measured features provide actionable advance warning of independently confirmed swarming events. Prediction performance will be reported using a predefined alert-matching policy, false alerts per hive-week, event-level precision and recall, and warning lead time, subject to the number of observed events. Comparisons with simpler sensing and scheduled-only acquisition will assess the value of sensor fusion and event-driven operation. Six-month node autonomy is an initial target to be supported by measured operating profiles.</w:t>
+      </w:r>
+    </w:p>
+    <w:p>
+      <w:pPr>
+        <w:spacing w:before="40" w:after="20" w:line="360" w:lineRule="auto"/>
         <w:jc w:val="both"/>
         <w:rPr>
           <w:sz w:val="22"/>
@@ -1044,19 +1084,27 @@
       </w:pPr>
       <w:r>
         <w:rPr>
-          <w:b/>
-          <w:bCs/>
-          <w:sz w:val="22"/>
-          <w:szCs w:val="22"/>
-        </w:rPr>
-        <w:t>Keywords:</w:t>
-      </w:r>
-      <w:r>
-        <w:rPr>
-          <w:sz w:val="22"/>
-          <w:szCs w:val="22"/>
-        </w:rPr>
-        <w:t xml:space="preserve"> Internet of Things, Hive Monitoring, Honeybees, Piezoelectric Sensor, Event-Driven Wake-Up, Signal Processing, Load Cells, Low-Power Embedded Systems, ESP32, ESP-NOW.</w:t>
+          <w:b w:val="1"/>
+          <w:bCs w:val="1"/>
+          <w:i w:val="0"/>
+          <w:iCs w:val="0"/>
+          <w:sz w:val="22"/>
+          <w:szCs w:val="22"/>
+          <w:rtl w:val="0"/>
+        </w:rPr>
+        <w:t xml:space="preserve">Keywords:</w:t>
+      </w:r>
+      <w:r>
+        <w:rPr>
+          <w:b w:val="0"/>
+          <w:bCs w:val="0"/>
+          <w:i w:val="0"/>
+          <w:iCs w:val="0"/>
+          <w:sz w:val="22"/>
+          <w:szCs w:val="22"/>
+          <w:rtl w:val="0"/>
+        </w:rPr>
+        <w:t xml:space="preserve"> Internet of Things, Hive Monitoring, Honeybees, Swarm Prediction, Piezoelectric Sensor, Event-Driven Acquisition, Signal Processing, Load Cells, Low-Power Embedded Systems, ESP-NOW.</w:t>
       </w:r>
     </w:p>
     <w:p>
@@ -1111,10 +1159,13 @@
         <w:rPr>
           <w:b/>
           <w:bCs/>
-          <w:sz w:val="22"/>
-          <w:szCs w:val="22"/>
-        </w:rPr>
-        <w:t>1.1 Motivation, Use Case and Applications</w:t>
+          <w:i w:val="0"/>
+          <w:iCs w:val="0"/>
+          <w:sz w:val="22"/>
+          <w:szCs w:val="22"/>
+          <w:rtl w:val="0"/>
+        </w:rPr>
+        <w:t xml:space="preserve">1.1 Motivation, Use Case and Value</w:t>
       </w:r>
     </w:p>
     <w:p>
@@ -1128,10 +1179,63 @@
       </w:pPr>
       <w:r>
         <w:rPr>
-          <w:sz w:val="22"/>
-          <w:szCs w:val="22"/>
-        </w:rPr>
-        <w:t>Honeybee colonies are inspected mostly by opening the hive every few weeks to months; inspections disturb the colony, cost labor, and leave the beekeeper blind between visits. Precision beekeeping, i.e. monitoring colonies with sensors so that interventions are based on data, was proposed to close this gap [1]. Swarming is the costliest blind spot: the colony rears new queens for one to two weeks, the prime swarm leaves with the old queen once the queen cells are capped, clusters nearby for a few hours, and is then lost. Hive vibrations change measurably before swarming [2], [3], and continuous hive weight reveals foraging, consumption and swarm departures [4]. Initial use case: a beekeeper with many hives standing close together at a remote apiary without mains power or Wi-Fi, visiting every few weeks. The system must alert before a swarm leaves or a colony behaves abnormally, and show which hives need a visit first. Applications: commercial and hobby apiaries, pollination services, and research apiaries that need long continuous records.</w:t>
+          <w:b w:val="0"/>
+          <w:bCs w:val="0"/>
+          <w:i w:val="0"/>
+          <w:iCs w:val="0"/>
+          <w:sz w:val="22"/>
+          <w:szCs w:val="22"/>
+          <w:rtl w:val="0"/>
+        </w:rPr>
+        <w:t xml:space="preserve">Beekeepers check colonies by opening the hives at intervals that depend on season and management, and between visits they cannot see what happens inside. Precision beekeeping proposes sensor-based monitoring to support such decisions [1]. Swarming is a costly blind spot: the colony prepares for one to two weeks, then the swarm leaves with a large part of the workforce, clusters nearby for a few hours and is lost. Hive vibrations change before swarming [2], [3], and continuous weight reveals foraging and swarm departures [4]. </w:t>
+      </w:r>
+      <w:r>
+        <w:rPr>
+          <w:b w:val="0"/>
+          <w:bCs w:val="0"/>
+          <w:i w:val="1"/>
+          <w:iCs w:val="1"/>
+          <w:sz w:val="22"/>
+          <w:szCs w:val="22"/>
+          <w:rtl w:val="0"/>
+        </w:rPr>
+        <w:t xml:space="preserve">Use case:</w:t>
+      </w:r>
+      <w:r>
+        <w:rPr>
+          <w:b w:val="0"/>
+          <w:bCs w:val="0"/>
+          <w:i w:val="0"/>
+          <w:iCs w:val="0"/>
+          <w:sz w:val="22"/>
+          <w:szCs w:val="22"/>
+          <w:rtl w:val="0"/>
+        </w:rPr>
+        <w:t xml:space="preserve"> the Zippory Honey apiary, with many hives close together and no mains power or Wi-Fi. </w:t>
+      </w:r>
+      <w:r>
+        <w:rPr>
+          <w:b w:val="0"/>
+          <w:bCs w:val="0"/>
+          <w:i w:val="1"/>
+          <w:iCs w:val="1"/>
+          <w:sz w:val="22"/>
+          <w:szCs w:val="22"/>
+          <w:rtl w:val="0"/>
+        </w:rPr>
+        <w:t xml:space="preserve">Decision supported:</w:t>
+      </w:r>
+      <w:r>
+        <w:rPr>
+          <w:b w:val="0"/>
+          <w:bCs w:val="0"/>
+          <w:i w:val="0"/>
+          <w:iCs w:val="0"/>
+          <w:sz w:val="22"/>
+          <w:szCs w:val="22"/>
+          <w:rtl w:val="0"/>
+        </w:rPr>
+        <w:t xml:space="preserve"> which hive to inspect, and when. An alert must come early enough to reach the apiary and act (e.g., split the colony), but not so early or persistently that it causes needless visits. The beekeeper will document actual inspection intervals, response time, connectivity and preventable losses; these local data set the warning window (Section 3.4).</w:t>
       </w:r>
     </w:p>
     <w:p>
@@ -1164,19 +1268,141 @@
       </w:pPr>
       <w:r>
         <w:rPr>
+          <w:b w:val="1"/>
+          <w:bCs w:val="1"/>
+          <w:i w:val="0"/>
+          <w:iCs w:val="0"/>
+          <w:sz w:val="22"/>
+          <w:szCs w:val="22"/>
+          <w:rtl w:val="0"/>
+        </w:rPr>
+        <w:t xml:space="preserve">Goal:</w:t>
+      </w:r>
+      <w:r>
+        <w:rPr>
+          <w:b w:val="0"/>
+          <w:bCs w:val="0"/>
+          <w:i w:val="0"/>
+          <w:iCs w:val="0"/>
+          <w:sz w:val="22"/>
+          <w:szCs w:val="22"/>
+          <w:rtl w:val="0"/>
+        </w:rPr>
+        <w:t xml:space="preserve"> an autonomous, characterized monitoring system for a small group of hives without mains power or Wi-Fi. </w:t>
+      </w:r>
+      <w:r>
+        <w:rPr>
+          <w:b w:val="1"/>
+          <w:bCs w:val="1"/>
+          <w:i w:val="0"/>
+          <w:iCs w:val="0"/>
+          <w:sz w:val="22"/>
+          <w:szCs w:val="22"/>
+          <w:rtl w:val="0"/>
+        </w:rPr>
+        <w:t xml:space="preserve">Engineering objectives (committed, Table I):</w:t>
+      </w:r>
+      <w:r>
+        <w:rPr>
+          <w:b w:val="0"/>
+          <w:bCs w:val="0"/>
+          <w:i w:val="0"/>
+          <w:iCs w:val="0"/>
+          <w:sz w:val="22"/>
+          <w:szCs w:val="22"/>
+          <w:rtl w:val="0"/>
+        </w:rPr>
+        <w:t xml:space="preserve"> (E1) scheduled and event-triggered acquisition of vibration, audio, weight and temperature with validated signal quality; (E2) delivery of features from every hive to a solar-powered cellular gateway and a per-hive dashboard, with measured application-level delivery and availability; (E3) a node energy budget, measured over complete operating cycles, that projects at least six months per battery.</w:t>
+      </w:r>
+    </w:p>
+    <w:p>
+      <w:pPr>
+        <w:spacing w:after="20" w:line="360" w:lineRule="auto"/>
+        <w:jc w:val="both"/>
+        <w:rPr>
+          <w:sz w:val="22"/>
+          <w:szCs w:val="22"/>
+        </w:rPr>
+      </w:pPr>
+      <w:r>
+        <w:rPr>
+          <w:b w:val="1"/>
+          <w:bCs w:val="1"/>
+          <w:i w:val="0"/>
+          <w:iCs w:val="0"/>
+          <w:sz w:val="22"/>
+          <w:szCs w:val="22"/>
+          <w:rtl w:val="0"/>
+        </w:rPr>
+        <w:t xml:space="preserve">Research objective (reported with its evidence):</w:t>
+      </w:r>
+      <w:r>
+        <w:rPr>
+          <w:b w:val="0"/>
+          <w:bCs w:val="0"/>
+          <w:i w:val="0"/>
+          <w:iCs w:val="0"/>
+          <w:sz w:val="22"/>
+          <w:szCs w:val="22"/>
+          <w:rtl w:val="0"/>
+        </w:rPr>
+        <w:t xml:space="preserve"> (R1) determine whether the measured signals give actionable advance warning of independently confirmed swarming, and whether sensor fusion and event-triggered acquisition improve detection or energy use over simpler baselines.</w:t>
+      </w:r>
+    </w:p>
+    <w:p>
+      <w:pPr>
+        <w:spacing w:after="20" w:line="360" w:lineRule="auto"/>
+        <w:jc w:val="both"/>
+        <w:rPr>
+          <w:sz w:val="22"/>
+          <w:szCs w:val="22"/>
+        </w:rPr>
+      </w:pPr>
+      <w:r>
+        <w:rPr>
+          <w:b w:val="1"/>
+          <w:bCs w:val="1"/>
+          <w:i w:val="0"/>
+          <w:iCs w:val="0"/>
+          <w:sz w:val="22"/>
+          <w:szCs w:val="22"/>
+          <w:rtl w:val="0"/>
+        </w:rPr>
+        <w:t xml:space="preserve">Stages:</w:t>
+      </w:r>
+      <w:r>
+        <w:rPr>
+          <w:b w:val="0"/>
+          <w:bCs w:val="0"/>
+          <w:i w:val="0"/>
+          <w:iCs w:val="0"/>
+          <w:sz w:val="22"/>
+          <w:szCs w:val="22"/>
+          <w:rtl w:val="0"/>
+        </w:rPr>
+        <w:t xml:space="preserve"> (1) bench characterization of each sensor chain, timing, delivery and power (Nov.–Dec. 2026); (2) real-hive feasibility gate by 31 Dec. 2026: piezo and microphone spectra vs. electronics noise and measured node energy on one hive, and the LoRa decision; (3) fix mounting, features, thresholds and logging, then freeze the system (Jan.–Feb. 2027); (4) prospective field evaluation on 3–5 hives through the swarming season.</w:t>
+      </w:r>
+    </w:p>
+    <w:p>
+      <w:pPr>
+        <w:keepNext/>
+        <w:spacing w:before="40" w:after="0" w:line="360" w:lineRule="auto"/>
+        <w:rPr>
+          <w:sz w:val="22"/>
+          <w:szCs w:val="22"/>
+        </w:rPr>
+      </w:pPr>
+      <w:r>
+        <w:rPr>
           <w:b/>
           <w:bCs/>
-          <w:sz w:val="22"/>
-          <w:szCs w:val="22"/>
-        </w:rPr>
-        <w:t>Objectives:</w:t>
-      </w:r>
-      <w:r>
-        <w:rPr>
-          <w:sz w:val="22"/>
-          <w:szCs w:val="22"/>
-        </w:rPr>
-        <w:t xml:space="preserve"> (1) alert the beekeeper before a swarm leaves, with precision and recall above 90%; how early this is possible is the research question;</w:t>
+          <w:i w:val="0"/>
+          <w:iCs w:val="0"/>
+          <w:sz w:val="22"/>
+          <w:szCs w:val="22"/>
+          <w:rtl w:val="0"/>
+        </w:rPr>
+        <w:t xml:space="preserve">1.3 Technology, Interfaces and Cost</w:t>
       </w:r>
     </w:p>
     <w:p>
@@ -1190,138 +1416,99 @@
       </w:pPr>
       <w:r>
         <w:rPr>
-          <w:sz w:val="22"/>
-          <w:szCs w:val="22"/>
-        </w:rPr>
-        <w:t>(2) operate autonomously at an apiary without mains power or network: node battery life of at least six months, packet delivery of at least 95%, and 30 days without intervention;</w:t>
-      </w:r>
-    </w:p>
-    <w:p>
-      <w:pPr>
-        <w:spacing w:after="20" w:line="360" w:lineRule="auto"/>
-        <w:jc w:val="both"/>
-        <w:rPr>
-          <w:sz w:val="22"/>
-          <w:szCs w:val="22"/>
-        </w:rPr>
-      </w:pPr>
-      <w:r>
-        <w:rPr>
-          <w:sz w:val="22"/>
-          <w:szCs w:val="22"/>
-        </w:rPr>
-        <w:t>(3) measure each colony accurately: weight within ±20 g, vibration and sound spectra and temperature, shown per hive on a web dashboard.</w:t>
-      </w:r>
-    </w:p>
-    <w:p>
-      <w:pPr>
-        <w:spacing w:after="20" w:line="360" w:lineRule="auto"/>
-        <w:jc w:val="both"/>
-        <w:rPr>
-          <w:sz w:val="22"/>
-          <w:szCs w:val="22"/>
-        </w:rPr>
-      </w:pPr>
-      <w:r>
-        <w:rPr>
-          <w:b/>
-          <w:bCs/>
-          <w:sz w:val="22"/>
-          <w:szCs w:val="22"/>
-        </w:rPr>
-        <w:t>Stages:</w:t>
-      </w:r>
-      <w:r>
-        <w:rPr>
-          <w:sz w:val="22"/>
-          <w:szCs w:val="22"/>
-        </w:rPr>
-        <w:t xml:space="preserve"> (1) requirements with the beekeeper and bench tests of each sensor chain and of the node's energy use; (2) build the node and test the link at the apiary; (3) build the hub, detection and dashboard, and install on hives before spring; (4) field evaluation.</w:t>
-      </w:r>
-    </w:p>
-    <w:p>
-      <w:pPr>
-        <w:keepNext/>
-        <w:spacing w:before="40" w:after="0" w:line="360" w:lineRule="auto"/>
-        <w:rPr>
-          <w:sz w:val="22"/>
-          <w:szCs w:val="22"/>
-        </w:rPr>
-      </w:pPr>
-      <w:r>
-        <w:rPr>
-          <w:b/>
-          <w:bCs/>
-          <w:sz w:val="22"/>
-          <w:szCs w:val="22"/>
-        </w:rPr>
-        <w:t>1.3 Technology and Interfaces</w:t>
-      </w:r>
-    </w:p>
-    <w:p>
-      <w:pPr>
-        <w:spacing w:after="20" w:line="360" w:lineRule="auto"/>
-        <w:jc w:val="both"/>
-        <w:rPr>
-          <w:sz w:val="22"/>
-          <w:szCs w:val="22"/>
-        </w:rPr>
-      </w:pPr>
-      <w:r>
-        <w:rPr>
-          <w:i/>
-          <w:iCs/>
-          <w:sz w:val="22"/>
-          <w:szCs w:val="22"/>
-        </w:rPr>
-        <w:t>Hive node:</w:t>
-      </w:r>
-      <w:r>
-        <w:rPr>
-          <w:sz w:val="22"/>
-          <w:szCs w:val="22"/>
-        </w:rPr>
-        <w:t xml:space="preserve"> an ESP32-C3 microcontroller board powered by one 18650 Li-ion cell, with four sensors: (a) a 27 mm piezoelectric disc pressed into the comb at the center of the hive, where comb vibration is strongest (Section 3.2); (b) a small digital MEMS microphone inside the hive, behind a mesh; (c) four 50 kg load cells under the hive with an HX711 weighing ADC; and (d) DS18B20 temperature probes. The piezo disc also feeds a low-power wake circuit (≈2 µA) that wakes the node when vibration jumps above its usual level; an amplifier prepares the signal for the ADC only while recording. Spectra are computed with a fixed-point FFT, since the C3 has no floating-point unit. </w:t>
-      </w:r>
-      <w:r>
-        <w:rPr>
-          <w:i/>
-          <w:iCs/>
-          <w:sz w:val="22"/>
-          <w:szCs w:val="22"/>
-        </w:rPr>
-        <w:t>Hub:</w:t>
-      </w:r>
-      <w:r>
-        <w:rPr>
-          <w:sz w:val="22"/>
-          <w:szCs w:val="22"/>
-        </w:rPr>
-        <w:t xml:space="preserve"> an ESP32-S3 board at the apiary receives the nodes over ESP-NOW (a direct Wi-Fi radio link, no router), uploads over a cellular modem, and runs from an 18 V / 15 W solar panel with a charger and battery. Because the hives stand close together, one hub and one SIM serve a group of hives. </w:t>
-      </w:r>
-      <w:r>
-        <w:rPr>
-          <w:i/>
-          <w:iCs/>
-          <w:sz w:val="22"/>
-          <w:szCs w:val="22"/>
-        </w:rPr>
-        <w:t>Interfaces:</w:t>
-      </w:r>
-      <w:r>
-        <w:rPr>
-          <w:sz w:val="22"/>
-          <w:szCs w:val="22"/>
-        </w:rPr>
-        <w:t xml:space="preserve"> ADC (piezo), I²S </w:t>
-      </w:r>
-      <w:r>
-        <w:rPr>
-          <w:sz w:val="22"/>
-          <w:szCs w:val="22"/>
-        </w:rPr>
-        <w:lastRenderedPageBreak/>
-        <w:t>(microphone), two-wire serial (HX711), 1-Wire (temperature), GPIO (wake-up), ESP-NOW (node to hub), LTE (hub to cloud).</w:t>
+          <w:b w:val="0"/>
+          <w:bCs w:val="0"/>
+          <w:i w:val="1"/>
+          <w:iCs w:val="1"/>
+          <w:sz w:val="22"/>
+          <w:szCs w:val="22"/>
+          <w:rtl w:val="0"/>
+        </w:rPr>
+        <w:t xml:space="preserve">Hive node:</w:t>
+      </w:r>
+      <w:r>
+        <w:rPr>
+          <w:b w:val="0"/>
+          <w:bCs w:val="0"/>
+          <w:i w:val="0"/>
+          <w:iCs w:val="0"/>
+          <w:sz w:val="22"/>
+          <w:szCs w:val="22"/>
+          <w:rtl w:val="0"/>
+        </w:rPr>
+        <w:t xml:space="preserve"> an ESP32-C3 board and one 18650 Li-ion cell with (a) a 27 mm piezo disc on a dedicated brood frame, sealed against wax, propolis and humidity and wired through a connector at the top bar, so the frame can still be lifted for inspection; (b) an I²S MEMS microphone inside the hive behind a mesh; (c) four 50 kg load cells under a hive platform with an HX711 ADC; (d) DS18B20 probes inside and outside. An op-amp front end (bias, protection, gain, ≈800 Hz anti-alias low-pass) is powered only while recording; a separate always-on wake circuit (≈2 µA, datasheet estimate) watches the piezo envelope. </w:t>
+      </w:r>
+      <w:r>
+        <w:rPr>
+          <w:b w:val="0"/>
+          <w:bCs w:val="0"/>
+          <w:i w:val="1"/>
+          <w:iCs w:val="1"/>
+          <w:sz w:val="22"/>
+          <w:szCs w:val="22"/>
+          <w:rtl w:val="0"/>
+        </w:rPr>
+        <w:t xml:space="preserve">Hub:</w:t>
+      </w:r>
+      <w:r>
+        <w:rPr>
+          <w:b w:val="0"/>
+          <w:bCs w:val="0"/>
+          <w:i w:val="0"/>
+          <w:iCs w:val="0"/>
+          <w:sz w:val="22"/>
+          <w:szCs w:val="22"/>
+          <w:rtl w:val="0"/>
+        </w:rPr>
+        <w:t xml:space="preserve"> an ESP32-S3 board with a SIMCom A7608E-H LTE modem, an 18 V / 15 W solar panel, an MPPT charger and a Li-ion pack; one hub serves a group of nearby hives. </w:t>
+      </w:r>
+      <w:r>
+        <w:rPr>
+          <w:b w:val="0"/>
+          <w:bCs w:val="0"/>
+          <w:i w:val="1"/>
+          <w:iCs w:val="1"/>
+          <w:sz w:val="22"/>
+          <w:szCs w:val="22"/>
+          <w:rtl w:val="0"/>
+        </w:rPr>
+        <w:t xml:space="preserve">Interfaces:</w:t>
+      </w:r>
+      <w:r>
+        <w:rPr>
+          <w:b w:val="0"/>
+          <w:bCs w:val="0"/>
+          <w:i w:val="0"/>
+          <w:iCs w:val="0"/>
+          <w:sz w:val="22"/>
+          <w:szCs w:val="22"/>
+          <w:rtl w:val="0"/>
+        </w:rPr>
+        <w:t xml:space="preserve"> ADC, I²S, two-wire serial (HX711), 1-Wire, GPIO wake, ESP-NOW (node–hub), LTE (hub–cloud). </w:t>
+      </w:r>
+      <w:r>
+        <w:rPr>
+          <w:b w:val="0"/>
+          <w:bCs w:val="0"/>
+          <w:i w:val="1"/>
+          <w:iCs w:val="1"/>
+          <w:sz w:val="22"/>
+          <w:szCs w:val="22"/>
+          <w:rtl w:val="0"/>
+        </w:rPr>
+        <w:t xml:space="preserve">Cost (estimate; itemized bill of materials in the preliminary report):</w:t>
+      </w:r>
+      <w:r>
+        <w:rPr>
+          <w:b w:val="0"/>
+          <w:bCs w:val="0"/>
+          <w:i w:val="0"/>
+          <w:iCs w:val="0"/>
+          <w:sz w:val="22"/>
+          <w:szCs w:val="22"/>
+          <w:rtl w:val="0"/>
+        </w:rPr>
+        <w:t xml:space="preserve"> ≈$40 per node including platform and enclosure, ≈$100 per hub, plus a data SIM, i.e. ≈$50 per hive at 10 hives per hub.</w:t>
       </w:r>
     </w:p>
     <w:p>
@@ -1424,10 +1611,15 @@
       </w:pPr>
       <w:r>
         <w:rPr>
+          <w:b w:val="0"/>
+          <w:bCs w:val="0"/>
+          <w:i w:val="0"/>
+          <w:iCs w:val="0"/>
           <w:sz w:val="20"/>
           <w:szCs w:val="20"/>
-        </w:rPr>
-        <w:t>TABLE I.  BEESENSE PERFORMANCE SPECIFICATION AND ACCEPTANCE TARGETS</w:t>
+          <w:rtl w:val="0"/>
+        </w:rPr>
+        <w:t xml:space="preserve">TABLE I.  SPECIFICATION: ENGINEERING ACCEPTANCE (E) AND RESEARCH TARGETS (R)</w:t>
       </w:r>
     </w:p>
     <w:tbl>
@@ -1448,9 +1640,9 @@
         <w:tblLook w:val="0400" w:firstRow="0" w:lastRow="0" w:firstColumn="0" w:lastColumn="0" w:noHBand="0" w:noVBand="1"/>
       </w:tblPr>
       <w:tblGrid>
-        <w:gridCol w:w="2769"/>
-        <w:gridCol w:w="2769"/>
-        <w:gridCol w:w="2769"/>
+        <w:gridCol w:w="1750"/>
+        <w:gridCol w:w="3900"/>
+        <w:gridCol w:w="3350"/>
       </w:tblGrid>
       <w:tr>
         <w:trPr>
@@ -1459,7 +1651,7 @@
         </w:trPr>
         <w:tc>
           <w:tcPr>
-            <w:tcW w:w="2769" w:type="dxa"/>
+            <w:tcW w:w="1750" w:type="dxa"/>
             <w:shd w:val="clear" w:color="auto" w:fill="D9E2F3"/>
           </w:tcPr>
           <w:p>
@@ -1475,16 +1667,19 @@
               <w:rPr>
                 <w:b/>
                 <w:bCs/>
+                <w:i w:val="0"/>
+                <w:iCs w:val="0"/>
                 <w:sz w:val="20"/>
                 <w:szCs w:val="20"/>
-              </w:rPr>
-              <w:t>Area</w:t>
+                <w:rtl w:val="0"/>
+              </w:rPr>
+              <w:t xml:space="preserve">Area</w:t>
             </w:r>
           </w:p>
         </w:tc>
         <w:tc>
           <w:tcPr>
-            <w:tcW w:w="2769" w:type="dxa"/>
+            <w:tcW w:w="3900" w:type="dxa"/>
             <w:shd w:val="clear" w:color="auto" w:fill="D9E2F3"/>
           </w:tcPr>
           <w:p>
@@ -1501,16 +1696,19 @@
               <w:rPr>
                 <w:b/>
                 <w:bCs/>
+                <w:i w:val="0"/>
+                <w:iCs w:val="0"/>
                 <w:sz w:val="20"/>
                 <w:szCs w:val="20"/>
-              </w:rPr>
-              <w:t>Specification</w:t>
+                <w:rtl w:val="0"/>
+              </w:rPr>
+              <w:t xml:space="preserve">Specification and test</w:t>
             </w:r>
           </w:p>
         </w:tc>
         <w:tc>
           <w:tcPr>
-            <w:tcW w:w="2769" w:type="dxa"/>
+            <w:tcW w:w="3350" w:type="dxa"/>
             <w:shd w:val="clear" w:color="auto" w:fill="D9E2F3"/>
           </w:tcPr>
           <w:p>
@@ -1527,10 +1725,13 @@
               <w:rPr>
                 <w:b/>
                 <w:bCs/>
+                <w:i w:val="0"/>
+                <w:iCs w:val="0"/>
                 <w:sz w:val="20"/>
                 <w:szCs w:val="20"/>
-              </w:rPr>
-              <w:t>Target</w:t>
+                <w:rtl w:val="0"/>
+              </w:rPr>
+              <w:t xml:space="preserve">Target / evidence</w:t>
             </w:r>
           </w:p>
         </w:tc>
@@ -1542,7 +1743,7 @@
         </w:trPr>
         <w:tc>
           <w:tcPr>
-            <w:tcW w:w="2769" w:type="dxa"/>
+            <w:tcW w:w="1750" w:type="dxa"/>
           </w:tcPr>
           <w:p>
             <w:pPr>
@@ -1555,16 +1756,19 @@
             </w:pPr>
             <w:r>
               <w:rPr>
+                <w:i w:val="0"/>
+                <w:iCs w:val="0"/>
                 <w:sz w:val="20"/>
                 <w:szCs w:val="20"/>
-              </w:rPr>
-              <w:t>Function</w:t>
+                <w:rtl w:val="0"/>
+              </w:rPr>
+              <w:t xml:space="preserve">E – Signal quality</w:t>
             </w:r>
           </w:p>
         </w:tc>
         <w:tc>
           <w:tcPr>
-            <w:tcW w:w="2769" w:type="dxa"/>
+            <w:tcW w:w="3900" w:type="dxa"/>
           </w:tcPr>
           <w:p>
             <w:pPr>
@@ -1578,16 +1782,19 @@
             </w:pPr>
             <w:r>
               <w:rPr>
+                <w:i w:val="0"/>
+                <w:iCs w:val="0"/>
                 <w:sz w:val="20"/>
                 <w:szCs w:val="20"/>
-              </w:rPr>
-              <w:t>Alerts on approaching swarms before departure; colony anomaly alerts</w:t>
+                <w:rtl w:val="0"/>
+              </w:rPr>
+              <w:t xml:space="preserve">Hive spectra vs. electronics noise; remount repeatability; invalid recordings</w:t>
             </w:r>
           </w:p>
         </w:tc>
         <w:tc>
           <w:tcPr>
-            <w:tcW w:w="2769" w:type="dxa"/>
+            <w:tcW w:w="3350" w:type="dxa"/>
           </w:tcPr>
           <w:p>
             <w:pPr>
@@ -1601,10 +1808,13 @@
             </w:pPr>
             <w:r>
               <w:rPr>
+                <w:i w:val="0"/>
+                <w:iCs w:val="0"/>
                 <w:sz w:val="20"/>
                 <w:szCs w:val="20"/>
-              </w:rPr>
-              <w:t>Precision / recall &gt; 90%; lead time reported</w:t>
+                <w:rtl w:val="0"/>
+              </w:rPr>
+              <w:t xml:space="preserve">Signal above noise in 50–800 Hz; invalid rate</w:t>
             </w:r>
           </w:p>
         </w:tc>
@@ -1616,7 +1826,7 @@
         </w:trPr>
         <w:tc>
           <w:tcPr>
-            <w:tcW w:w="2769" w:type="dxa"/>
+            <w:tcW w:w="1750" w:type="dxa"/>
           </w:tcPr>
           <w:p>
             <w:pPr>
@@ -1629,16 +1839,19 @@
             </w:pPr>
             <w:r>
               <w:rPr>
+                <w:i w:val="0"/>
+                <w:iCs w:val="0"/>
                 <w:sz w:val="20"/>
                 <w:szCs w:val="20"/>
-              </w:rPr>
-              <w:t>Inputs</w:t>
+                <w:rtl w:val="0"/>
+              </w:rPr>
+              <w:t xml:space="preserve">E – Weighing</w:t>
             </w:r>
           </w:p>
         </w:tc>
         <w:tc>
           <w:tcPr>
-            <w:tcW w:w="2769" w:type="dxa"/>
+            <w:tcW w:w="3900" w:type="dxa"/>
           </w:tcPr>
           <w:p>
             <w:pPr>
@@ -1652,16 +1865,19 @@
             </w:pPr>
             <w:r>
               <w:rPr>
+                <w:i w:val="0"/>
+                <w:iCs w:val="0"/>
                 <w:sz w:val="20"/>
                 <w:szCs w:val="20"/>
-              </w:rPr>
-              <w:t>Hive vibration and sound (50–800 Hz), weight (0–200 kg), temperature in and out</w:t>
+                <w:rtl w:val="0"/>
+              </w:rPr>
+              <w:t xml:space="preserve">30-min change at several loads, off-center, −5…40 °C; absolute error and drift reported</w:t>
             </w:r>
           </w:p>
         </w:tc>
         <w:tc>
           <w:tcPr>
-            <w:tcW w:w="2769" w:type="dxa"/>
+            <w:tcW w:w="3350" w:type="dxa"/>
           </w:tcPr>
           <w:p>
             <w:pPr>
@@ -1675,10 +1891,13 @@
             </w:pPr>
             <w:r>
               <w:rPr>
+                <w:i w:val="0"/>
+                <w:iCs w:val="0"/>
                 <w:sz w:val="20"/>
                 <w:szCs w:val="20"/>
-              </w:rPr>
-              <w:t>Weight error ≤ ±20 g</w:t>
+                <w:rtl w:val="0"/>
+              </w:rPr>
+              <w:t xml:space="preserve">Change error ≤ ±20 g</w:t>
             </w:r>
           </w:p>
         </w:tc>
@@ -1690,7 +1909,7 @@
         </w:trPr>
         <w:tc>
           <w:tcPr>
-            <w:tcW w:w="2769" w:type="dxa"/>
+            <w:tcW w:w="1750" w:type="dxa"/>
           </w:tcPr>
           <w:p>
             <w:pPr>
@@ -1703,16 +1922,19 @@
             </w:pPr>
             <w:r>
               <w:rPr>
+                <w:i w:val="0"/>
+                <w:iCs w:val="0"/>
                 <w:sz w:val="20"/>
                 <w:szCs w:val="20"/>
-              </w:rPr>
-              <w:t>Outputs</w:t>
+                <w:rtl w:val="0"/>
+              </w:rPr>
+              <w:t xml:space="preserve">E – Event wake</w:t>
             </w:r>
           </w:p>
         </w:tc>
         <w:tc>
           <w:tcPr>
-            <w:tcW w:w="2769" w:type="dxa"/>
+            <w:tcW w:w="3900" w:type="dxa"/>
           </w:tcPr>
           <w:p>
             <w:pPr>
@@ -1726,16 +1948,19 @@
             </w:pPr>
             <w:r>
               <w:rPr>
+                <w:i w:val="0"/>
+                <w:iCs w:val="0"/>
                 <w:sz w:val="20"/>
                 <w:szCs w:val="20"/>
-              </w:rPr>
-              <w:t>Alerts to the beekeeper's phone; per-hive dashboard</w:t>
+                <w:rtl w:val="0"/>
+              </w:rPr>
+              <w:t xml:space="preserve">Annotated trials (bursts, wind, rain, handling) vs. scheduled reference</w:t>
             </w:r>
           </w:p>
         </w:tc>
         <w:tc>
           <w:tcPr>
-            <w:tcW w:w="2769" w:type="dxa"/>
+            <w:tcW w:w="3350" w:type="dxa"/>
           </w:tcPr>
           <w:p>
             <w:pPr>
@@ -1749,10 +1974,13 @@
             </w:pPr>
             <w:r>
               <w:rPr>
+                <w:i w:val="0"/>
+                <w:iCs w:val="0"/>
                 <w:sz w:val="20"/>
                 <w:szCs w:val="20"/>
-              </w:rPr>
-              <w:t>False alarms ≤ 1 per hive-week</w:t>
+                <w:rtl w:val="0"/>
+              </w:rPr>
+              <w:t xml:space="preserve">Useful-event capture; ≤ 20 false wakes per hive-day (provisional)</w:t>
             </w:r>
           </w:p>
         </w:tc>
@@ -1764,7 +1992,7 @@
         </w:trPr>
         <w:tc>
           <w:tcPr>
-            <w:tcW w:w="2769" w:type="dxa"/>
+            <w:tcW w:w="1750" w:type="dxa"/>
           </w:tcPr>
           <w:p>
             <w:pPr>
@@ -1777,16 +2005,19 @@
             </w:pPr>
             <w:r>
               <w:rPr>
+                <w:i w:val="0"/>
+                <w:iCs w:val="0"/>
                 <w:sz w:val="20"/>
                 <w:szCs w:val="20"/>
-              </w:rPr>
-              <w:t>Rates</w:t>
+                <w:rtl w:val="0"/>
+              </w:rPr>
+              <w:t xml:space="preserve">E – Delivery</w:t>
             </w:r>
           </w:p>
         </w:tc>
         <w:tc>
           <w:tcPr>
-            <w:tcW w:w="2769" w:type="dxa"/>
+            <w:tcW w:w="3900" w:type="dxa"/>
           </w:tcPr>
           <w:p>
             <w:pPr>
@@ -1800,16 +2031,19 @@
             </w:pPr>
             <w:r>
               <w:rPr>
+                <w:i w:val="0"/>
+                <w:iCs w:val="0"/>
                 <w:sz w:val="20"/>
                 <w:szCs w:val="20"/>
-              </w:rPr>
-              <w:t>Report every 15 min and on vibration events (20-min hold-off)</w:t>
+                <w:rtl w:val="0"/>
+              </w:rPr>
+              <w:t xml:space="preserve">Hub-application receipts / sent (sequence numbers), all nodes on site</w:t>
             </w:r>
           </w:p>
         </w:tc>
         <w:tc>
           <w:tcPr>
-            <w:tcW w:w="2769" w:type="dxa"/>
+            <w:tcW w:w="3350" w:type="dxa"/>
           </w:tcPr>
           <w:p>
             <w:pPr>
@@ -1823,10 +2057,13 @@
             </w:pPr>
             <w:r>
               <w:rPr>
+                <w:i w:val="0"/>
+                <w:iCs w:val="0"/>
                 <w:sz w:val="20"/>
                 <w:szCs w:val="20"/>
-              </w:rPr>
-              <w:t>No missed departure; ≤ 20 false wakes per hive-day</w:t>
+                <w:rtl w:val="0"/>
+              </w:rPr>
+              <w:t xml:space="preserve">≥ 95%; alert latency ≤ 30 min</w:t>
             </w:r>
           </w:p>
         </w:tc>
@@ -1838,7 +2075,7 @@
         </w:trPr>
         <w:tc>
           <w:tcPr>
-            <w:tcW w:w="2769" w:type="dxa"/>
+            <w:tcW w:w="1750" w:type="dxa"/>
           </w:tcPr>
           <w:p>
             <w:pPr>
@@ -1851,16 +2088,19 @@
             </w:pPr>
             <w:r>
               <w:rPr>
+                <w:i w:val="0"/>
+                <w:iCs w:val="0"/>
                 <w:sz w:val="20"/>
                 <w:szCs w:val="20"/>
-              </w:rPr>
-              <w:t>Interfaces</w:t>
+                <w:rtl w:val="0"/>
+              </w:rPr>
+              <w:t xml:space="preserve">E – Node energy</w:t>
             </w:r>
           </w:p>
         </w:tc>
         <w:tc>
           <w:tcPr>
-            <w:tcW w:w="2769" w:type="dxa"/>
+            <w:tcW w:w="3900" w:type="dxa"/>
           </w:tcPr>
           <w:p>
             <w:pPr>
@@ -1874,16 +2114,19 @@
             </w:pPr>
             <w:r>
               <w:rPr>
+                <w:i w:val="0"/>
+                <w:iCs w:val="0"/>
                 <w:sz w:val="20"/>
                 <w:szCs w:val="20"/>
-              </w:rPr>
-              <w:t>Node to hub: ESP-NOW (2.4 GHz); hub to cloud: LTE; web browser</w:t>
+                <w:rtl w:val="0"/>
+              </w:rPr>
+              <w:t xml:space="preserve">Measured full-cycle profiles; nominal and adverse (events, retries) cases</w:t>
             </w:r>
           </w:p>
         </w:tc>
         <w:tc>
           <w:tcPr>
-            <w:tcW w:w="2769" w:type="dxa"/>
+            <w:tcW w:w="3350" w:type="dxa"/>
           </w:tcPr>
           <w:p>
             <w:pPr>
@@ -1897,10 +2140,13 @@
             </w:pPr>
             <w:r>
               <w:rPr>
+                <w:i w:val="0"/>
+                <w:iCs w:val="0"/>
                 <w:sz w:val="20"/>
                 <w:szCs w:val="20"/>
-              </w:rPr>
-              <w:t>Packet delivery ≥ 95%</w:t>
+                <w:rtl w:val="0"/>
+              </w:rPr>
+              <w:t xml:space="preserve">≥ 6 months projected, 20% margin</w:t>
             </w:r>
           </w:p>
         </w:tc>
@@ -1912,7 +2158,7 @@
         </w:trPr>
         <w:tc>
           <w:tcPr>
-            <w:tcW w:w="2769" w:type="dxa"/>
+            <w:tcW w:w="1750" w:type="dxa"/>
           </w:tcPr>
           <w:p>
             <w:pPr>
@@ -1924,16 +2170,19 @@
             </w:pPr>
             <w:r>
               <w:rPr>
+                <w:i w:val="0"/>
+                <w:iCs w:val="0"/>
                 <w:sz w:val="20"/>
                 <w:szCs w:val="20"/>
-              </w:rPr>
-              <w:t>Power</w:t>
+                <w:rtl w:val="0"/>
+              </w:rPr>
+              <w:t xml:space="preserve">E – Availability</w:t>
             </w:r>
           </w:p>
         </w:tc>
         <w:tc>
           <w:tcPr>
-            <w:tcW w:w="2769" w:type="dxa"/>
+            <w:tcW w:w="3900" w:type="dxa"/>
           </w:tcPr>
           <w:p>
             <w:pPr>
@@ -1946,16 +2195,19 @@
             </w:pPr>
             <w:r>
               <w:rPr>
+                <w:i w:val="0"/>
+                <w:iCs w:val="0"/>
                 <w:sz w:val="20"/>
                 <w:szCs w:val="20"/>
-              </w:rPr>
-              <w:t>Node: one 18650 cell; hub: 18 V / 15 W solar panel and Li-ion pack</w:t>
+                <w:rtl w:val="0"/>
+              </w:rPr>
+              <w:t xml:space="preserve">Log of uptime, resets, data gaps, interventions, solar and battery</w:t>
             </w:r>
           </w:p>
         </w:tc>
         <w:tc>
           <w:tcPr>
-            <w:tcW w:w="2769" w:type="dxa"/>
+            <w:tcW w:w="3350" w:type="dxa"/>
           </w:tcPr>
           <w:p>
             <w:pPr>
@@ -1968,10 +2220,13 @@
             </w:pPr>
             <w:r>
               <w:rPr>
+                <w:i w:val="0"/>
+                <w:iCs w:val="0"/>
                 <w:sz w:val="20"/>
                 <w:szCs w:val="20"/>
-              </w:rPr>
-              <w:t>Node ≥ 6 months; ≥ 30 days unattended</w:t>
+                <w:rtl w:val="0"/>
+              </w:rPr>
+              <w:t xml:space="preserve">≥ 30 days without maintenance</w:t>
             </w:r>
           </w:p>
         </w:tc>
@@ -1983,7 +2238,7 @@
         </w:trPr>
         <w:tc>
           <w:tcPr>
-            <w:tcW w:w="2769" w:type="dxa"/>
+            <w:tcW w:w="1750" w:type="dxa"/>
           </w:tcPr>
           <w:p>
             <w:pPr>
@@ -1995,16 +2250,19 @@
             </w:pPr>
             <w:r>
               <w:rPr>
+                <w:i w:val="0"/>
+                <w:iCs w:val="0"/>
                 <w:sz w:val="20"/>
                 <w:szCs w:val="20"/>
-              </w:rPr>
-              <w:t>Environment</w:t>
+                <w:rtl w:val="0"/>
+              </w:rPr>
+              <w:t xml:space="preserve">E – Cost</w:t>
             </w:r>
           </w:p>
         </w:tc>
         <w:tc>
           <w:tcPr>
-            <w:tcW w:w="2769" w:type="dxa"/>
+            <w:tcW w:w="3900" w:type="dxa"/>
           </w:tcPr>
           <w:p>
             <w:pPr>
@@ -2017,16 +2275,19 @@
             </w:pPr>
             <w:r>
               <w:rPr>
+                <w:i w:val="0"/>
+                <w:iCs w:val="0"/>
                 <w:sz w:val="20"/>
                 <w:szCs w:val="20"/>
-              </w:rPr>
-              <w:t>Outdoor apiary without mains power or Wi-Fi; sealed enclosures</w:t>
+                <w:rtl w:val="0"/>
+              </w:rPr>
+              <w:t xml:space="preserve">Bill of materials per node and hub; recurring SIM fee</w:t>
             </w:r>
           </w:p>
         </w:tc>
         <w:tc>
           <w:tcPr>
-            <w:tcW w:w="2769" w:type="dxa"/>
+            <w:tcW w:w="3350" w:type="dxa"/>
           </w:tcPr>
           <w:p>
             <w:pPr>
@@ -2039,155 +2300,13 @@
             </w:pPr>
             <w:r>
               <w:rPr>
+                <w:i w:val="0"/>
+                <w:iCs w:val="0"/>
                 <w:sz w:val="20"/>
                 <w:szCs w:val="20"/>
-              </w:rPr>
-              <w:t>Operation through the spring season</w:t>
-            </w:r>
-          </w:p>
-        </w:tc>
-      </w:tr>
-    </w:tbl>
-    <w:p>
-      <w:pPr>
-        <w:keepNext/>
-        <w:spacing w:before="80" w:after="0" w:line="360" w:lineRule="auto"/>
-        <w:rPr>
-          <w:sz w:val="22"/>
-          <w:szCs w:val="22"/>
-        </w:rPr>
-      </w:pPr>
-      <w:r>
-        <w:rPr>
-          <w:b/>
-          <w:bCs/>
-          <w:sz w:val="26"/>
-          <w:szCs w:val="26"/>
-        </w:rPr>
-        <w:t>2. Existing Solutions and Prior Work</w:t>
-      </w:r>
-    </w:p>
-    <w:p>
-      <w:pPr>
-        <w:spacing w:after="20" w:line="360" w:lineRule="auto"/>
-        <w:jc w:val="both"/>
-        <w:rPr>
-          <w:sz w:val="22"/>
-          <w:szCs w:val="22"/>
-        </w:rPr>
-      </w:pPr>
-      <w:r>
-        <w:rPr>
-          <w:sz w:val="22"/>
-          <w:szCs w:val="22"/>
-        </w:rPr>
-        <w:t>Ferrari et al. found with in-hive microphones that the power spectral density near 110 Hz rises, and shifts upward in frequency, before swarming [2]. Ramsey et al. placed accelerometers in the heart of the colony and, by tracking how the vibrational spectra evolve, identified colonies preparing to swarm with more than 90% accuracy, up to 30 days ahead [3]. Cecchi et al. built a multi-sensor hive with microphones and weighing to ±10 g, but each hive used a Raspberry Pi drawing about 4 W from mains power [5]. Commercially, BeeHero in-hive sensors measure acoustics and climate and report over Bluetooth Low Energy to a cellular gateway in a closed system [6] (Table II).</w:t>
-      </w:r>
-    </w:p>
-    <w:p>
-      <w:pPr>
-        <w:keepNext/>
-        <w:spacing w:before="40" w:after="20" w:line="240" w:lineRule="auto"/>
-        <w:jc w:val="center"/>
-      </w:pPr>
-      <w:r>
-        <w:rPr>
-          <w:sz w:val="18"/>
-          <w:szCs w:val="18"/>
-        </w:rPr>
-        <w:lastRenderedPageBreak/>
-        <w:t>TABLE II.  PRIOR WORK AND WHAT BEESENSE MUST DEMONSTRATE</w:t>
-      </w:r>
-    </w:p>
-    <w:tbl>
-      <w:tblPr>
-        <w:tblStyle w:val="a0"/>
-        <w:tblW w:w="8307" w:type="dxa"/>
-        <w:jc w:val="center"/>
-        <w:tblInd w:w="0" w:type="dxa"/>
-        <w:tblBorders>
-          <w:top w:val="single" w:sz="6" w:space="0" w:color="000000"/>
-          <w:left w:val="single" w:sz="6" w:space="0" w:color="000000"/>
-          <w:bottom w:val="single" w:sz="6" w:space="0" w:color="000000"/>
-          <w:right w:val="single" w:sz="6" w:space="0" w:color="000000"/>
-          <w:insideH w:val="single" w:sz="6" w:space="0" w:color="000000"/>
-          <w:insideV w:val="single" w:sz="6" w:space="0" w:color="000000"/>
-        </w:tblBorders>
-        <w:tblLayout w:type="fixed"/>
-        <w:tblLook w:val="0400" w:firstRow="0" w:lastRow="0" w:firstColumn="0" w:lastColumn="0" w:noHBand="0" w:noVBand="1"/>
-      </w:tblPr>
-      <w:tblGrid>
-        <w:gridCol w:w="2769"/>
-        <w:gridCol w:w="2769"/>
-        <w:gridCol w:w="2769"/>
-      </w:tblGrid>
-      <w:tr>
-        <w:trPr>
-          <w:cantSplit/>
-          <w:jc w:val="center"/>
-        </w:trPr>
-        <w:tc>
-          <w:tcPr>
-            <w:tcW w:w="2769" w:type="dxa"/>
-            <w:shd w:val="clear" w:color="auto" w:fill="D9E2F3"/>
-          </w:tcPr>
-          <w:p>
-            <w:pPr>
-              <w:keepNext/>
-              <w:spacing w:after="0" w:line="240" w:lineRule="auto"/>
-            </w:pPr>
-            <w:r>
-              <w:rPr>
-                <w:b/>
-                <w:bCs/>
-                <w:sz w:val="18"/>
-                <w:szCs w:val="18"/>
-              </w:rPr>
-              <w:t>Comparator</w:t>
-            </w:r>
-          </w:p>
-        </w:tc>
-        <w:tc>
-          <w:tcPr>
-            <w:tcW w:w="2769" w:type="dxa"/>
-            <w:shd w:val="clear" w:color="auto" w:fill="D9E2F3"/>
-          </w:tcPr>
-          <w:p>
-            <w:pPr>
-              <w:keepNext/>
-              <w:spacing w:after="0" w:line="240" w:lineRule="auto"/>
-              <w:jc w:val="center"/>
-            </w:pPr>
-            <w:r>
-              <w:rPr>
-                <w:b/>
-                <w:bCs/>
-                <w:sz w:val="18"/>
-                <w:szCs w:val="18"/>
-              </w:rPr>
-              <w:t>Relevant capability</w:t>
-            </w:r>
-          </w:p>
-        </w:tc>
-        <w:tc>
-          <w:tcPr>
-            <w:tcW w:w="2769" w:type="dxa"/>
-            <w:shd w:val="clear" w:color="auto" w:fill="D9E2F3"/>
-          </w:tcPr>
-          <w:p>
-            <w:pPr>
-              <w:keepNext/>
-              <w:spacing w:after="0" w:line="240" w:lineRule="auto"/>
-              <w:jc w:val="center"/>
-            </w:pPr>
-            <w:r>
-              <w:rPr>
-                <w:b/>
-                <w:bCs/>
-                <w:sz w:val="18"/>
-                <w:szCs w:val="18"/>
-              </w:rPr>
-              <w:t>What BeeSense must show</w:t>
+                <w:rtl w:val="0"/>
+              </w:rPr>
+              <w:t xml:space="preserve">Per hive at 10 hives per hub</w:t>
             </w:r>
           </w:p>
         </w:tc>
@@ -2199,57 +2318,75 @@
         </w:trPr>
         <w:tc>
           <w:tcPr>
-            <w:tcW w:w="2769" w:type="dxa"/>
-          </w:tcPr>
-          <w:p>
-            <w:pPr>
-              <w:keepNext/>
+            <w:tcW w:w="1750" w:type="dxa"/>
+          </w:tcPr>
+          <w:p>
+            <w:pPr>
               <w:spacing w:after="0" w:line="240" w:lineRule="auto"/>
+              <w:rPr>
+                <w:sz w:val="20"/>
+                <w:szCs w:val="20"/>
+              </w:rPr>
             </w:pPr>
             <w:r>
               <w:rPr>
-                <w:sz w:val="18"/>
-                <w:szCs w:val="18"/>
-              </w:rPr>
-              <w:t>Ferrari [2], Ramsey [3]</w:t>
+                <w:i w:val="0"/>
+                <w:iCs w:val="0"/>
+                <w:sz w:val="20"/>
+                <w:szCs w:val="20"/>
+                <w:rtl w:val="0"/>
+              </w:rPr>
+              <w:t xml:space="preserve">R – Advance warning</w:t>
             </w:r>
           </w:p>
         </w:tc>
         <w:tc>
           <w:tcPr>
-            <w:tcW w:w="2769" w:type="dxa"/>
-          </w:tcPr>
-          <w:p>
-            <w:pPr>
-              <w:keepNext/>
+            <w:tcW w:w="3900" w:type="dxa"/>
+          </w:tcPr>
+          <w:p>
+            <w:pPr>
               <w:spacing w:after="0" w:line="240" w:lineRule="auto"/>
               <w:jc w:val="center"/>
+              <w:rPr>
+                <w:sz w:val="20"/>
+                <w:szCs w:val="20"/>
+              </w:rPr>
             </w:pPr>
             <w:r>
               <w:rPr>
-                <w:sz w:val="18"/>
-                <w:szCs w:val="18"/>
-              </w:rPr>
-              <w:t>Sound/vibration features precede swarming</w:t>
+                <w:i w:val="0"/>
+                <w:iCs w:val="0"/>
+                <w:sz w:val="20"/>
+                <w:szCs w:val="20"/>
+                <w:rtl w:val="0"/>
+              </w:rPr>
+              <w:t xml:space="preserve">Episodes matched to confirmed departures in the frozen window (Section 3.4)</w:t>
             </w:r>
           </w:p>
         </w:tc>
         <w:tc>
           <w:tcPr>
-            <w:tcW w:w="2769" w:type="dxa"/>
-          </w:tcPr>
-          <w:p>
-            <w:pPr>
-              <w:keepNext/>
+            <w:tcW w:w="3350" w:type="dxa"/>
+          </w:tcPr>
+          <w:p>
+            <w:pPr>
               <w:spacing w:after="0" w:line="240" w:lineRule="auto"/>
               <w:jc w:val="center"/>
+              <w:rPr>
+                <w:sz w:val="20"/>
+                <w:szCs w:val="20"/>
+              </w:rPr>
             </w:pPr>
             <w:r>
               <w:rPr>
-                <w:sz w:val="18"/>
-                <w:szCs w:val="18"/>
-              </w:rPr>
-              <w:t>Same features on a battery node, in the field</w:t>
+                <w:i w:val="0"/>
+                <w:iCs w:val="0"/>
+                <w:sz w:val="20"/>
+                <w:szCs w:val="20"/>
+                <w:rtl w:val="0"/>
+              </w:rPr>
+              <w:t xml:space="preserve">P, R (goal &gt; 90%), lead time, ≤ 1 false episode per hive-week; counts and uncertainty</w:t>
             </w:r>
           </w:p>
         </w:tc>
@@ -2261,120 +2398,75 @@
         </w:trPr>
         <w:tc>
           <w:tcPr>
-            <w:tcW w:w="2769" w:type="dxa"/>
-          </w:tcPr>
-          <w:p>
-            <w:pPr>
-              <w:keepNext/>
+            <w:tcW w:w="1750" w:type="dxa"/>
+          </w:tcPr>
+          <w:p>
+            <w:pPr>
               <w:spacing w:after="0" w:line="240" w:lineRule="auto"/>
+              <w:rPr>
+                <w:sz w:val="20"/>
+                <w:szCs w:val="20"/>
+              </w:rPr>
             </w:pPr>
             <w:r>
               <w:rPr>
-                <w:sz w:val="18"/>
-                <w:szCs w:val="18"/>
-              </w:rPr>
-              <w:t>Cecchi et al. [5]</w:t>
+                <w:i w:val="0"/>
+                <w:iCs w:val="0"/>
+                <w:sz w:val="20"/>
+                <w:szCs w:val="20"/>
+                <w:rtl w:val="0"/>
+              </w:rPr>
+              <w:t xml:space="preserve">R – Sensor fusion</w:t>
             </w:r>
           </w:p>
         </w:tc>
         <w:tc>
           <w:tcPr>
-            <w:tcW w:w="2769" w:type="dxa"/>
-          </w:tcPr>
-          <w:p>
-            <w:pPr>
-              <w:keepNext/>
+            <w:tcW w:w="3900" w:type="dxa"/>
+          </w:tcPr>
+          <w:p>
+            <w:pPr>
               <w:spacing w:after="0" w:line="240" w:lineRule="auto"/>
               <w:jc w:val="center"/>
               <w:rPr>
-                <w:sz w:val="18"/>
-                <w:szCs w:val="18"/>
+                <w:sz w:val="20"/>
+                <w:szCs w:val="20"/>
               </w:rPr>
             </w:pPr>
             <w:r>
               <w:rPr>
-                <w:sz w:val="18"/>
-                <w:szCs w:val="18"/>
-              </w:rPr>
-              <w:t>Microphones, weight ±10 g, CO₂; mains, ~4 W per hive</w:t>
+                <w:i w:val="0"/>
+                <w:iCs w:val="0"/>
+                <w:sz w:val="20"/>
+                <w:szCs w:val="20"/>
+                <w:rtl w:val="0"/>
+              </w:rPr>
+              <w:t xml:space="preserve">Weight-only, vibration/audio-only and fused; scheduled-only vs. + event</w:t>
             </w:r>
           </w:p>
         </w:tc>
         <w:tc>
           <w:tcPr>
-            <w:tcW w:w="2769" w:type="dxa"/>
-          </w:tcPr>
-          <w:p>
-            <w:pPr>
-              <w:keepNext/>
+            <w:tcW w:w="3350" w:type="dxa"/>
+          </w:tcPr>
+          <w:p>
+            <w:pPr>
               <w:spacing w:after="0" w:line="240" w:lineRule="auto"/>
               <w:jc w:val="center"/>
+              <w:rPr>
+                <w:sz w:val="20"/>
+                <w:szCs w:val="20"/>
+              </w:rPr>
             </w:pPr>
             <w:r>
               <w:rPr>
-                <w:sz w:val="18"/>
-                <w:szCs w:val="18"/>
-              </w:rPr>
-              <w:t>Battery operation, ~1 mW average power</w:t>
-            </w:r>
-          </w:p>
-        </w:tc>
-      </w:tr>
-      <w:tr>
-        <w:trPr>
-          <w:cantSplit/>
-          <w:jc w:val="center"/>
-        </w:trPr>
-        <w:tc>
-          <w:tcPr>
-            <w:tcW w:w="2769" w:type="dxa"/>
-          </w:tcPr>
-          <w:p>
-            <w:pPr>
-              <w:spacing w:after="0" w:line="240" w:lineRule="auto"/>
-            </w:pPr>
-            <w:r>
-              <w:rPr>
-                <w:sz w:val="18"/>
-                <w:szCs w:val="18"/>
-              </w:rPr>
-              <w:t>BeeHero [6]</w:t>
-            </w:r>
-          </w:p>
-        </w:tc>
-        <w:tc>
-          <w:tcPr>
-            <w:tcW w:w="2769" w:type="dxa"/>
-          </w:tcPr>
-          <w:p>
-            <w:pPr>
-              <w:spacing w:after="0" w:line="240" w:lineRule="auto"/>
-              <w:jc w:val="center"/>
-            </w:pPr>
-            <w:r>
-              <w:rPr>
-                <w:sz w:val="18"/>
-                <w:szCs w:val="18"/>
-              </w:rPr>
-              <w:t>In-hive acoustics and climate, BLE + cellular gateway</w:t>
-            </w:r>
-          </w:p>
-        </w:tc>
-        <w:tc>
-          <w:tcPr>
-            <w:tcW w:w="2769" w:type="dxa"/>
-          </w:tcPr>
-          <w:p>
-            <w:pPr>
-              <w:spacing w:after="0" w:line="240" w:lineRule="auto"/>
-              <w:jc w:val="center"/>
-            </w:pPr>
-            <w:r>
-              <w:rPr>
-                <w:sz w:val="18"/>
-                <w:szCs w:val="18"/>
-              </w:rPr>
-              <w:t>Open, measured pipeline; weight + vibration fusion</w:t>
+                <w:i w:val="0"/>
+                <w:iCs w:val="0"/>
+                <w:sz w:val="20"/>
+                <w:szCs w:val="20"/>
+                <w:rtl w:val="0"/>
+              </w:rPr>
+              <w:t xml:space="preserve">Same eligible events and hive-days</w:t>
             </w:r>
           </w:p>
         </w:tc>
@@ -2396,6 +2488,47 @@
           <w:sz w:val="26"/>
           <w:szCs w:val="26"/>
         </w:rPr>
+        <w:t>2. Existing Solutions and Prior Work</w:t>
+      </w:r>
+    </w:p>
+    <w:p>
+      <w:pPr>
+        <w:spacing w:after="20" w:line="360" w:lineRule="auto"/>
+        <w:jc w:val="both"/>
+        <w:rPr>
+          <w:sz w:val="22"/>
+          <w:szCs w:val="22"/>
+        </w:rPr>
+      </w:pPr>
+      <w:r>
+        <w:rPr>
+          <w:b w:val="0"/>
+          <w:bCs w:val="0"/>
+          <w:i w:val="0"/>
+          <w:iCs w:val="0"/>
+          <w:sz w:val="22"/>
+          <w:szCs w:val="22"/>
+          <w:rtl w:val="0"/>
+        </w:rPr>
+        <w:t xml:space="preserve">Ferrari et al. reported, with in-hive microphones and temperature sensors on three hives, a rise in spectral power near 110 Hz shifting toward 300 Hz before swarming [2]. Ramsey et al. placed accelerometers in the comb and, using learned spectral discrimination and spectral-history analysis, identified colonies preparing to swarm with more than 90% accuracy, up to 30 days ahead [3]. Iqbal et al. compared acoustic classifiers for swarm prediction on public hive recordings [5], a candidate offline baseline. Cecchi et al. built a multi-sensor hive with microphones and four load cells, each hive unit drawing about 4.2 W from mains power [6]. Commercially, BeeHero sensors measure acoustics and climate and report over Bluetooth Low Energy to a cellular gateway in a closed system [7].</w:t>
+      </w:r>
+    </w:p>
+    <w:p>
+      <w:pPr>
+        <w:keepNext/>
+        <w:spacing w:before="80" w:after="0" w:line="360" w:lineRule="auto"/>
+        <w:rPr>
+          <w:sz w:val="22"/>
+          <w:szCs w:val="22"/>
+        </w:rPr>
+      </w:pPr>
+      <w:r>
+        <w:rPr>
+          <w:b/>
+          <w:bCs/>
+          <w:sz w:val="26"/>
+          <w:szCs w:val="26"/>
+        </w:rPr>
         <w:t>3. Proposed Solution</w:t>
       </w:r>
     </w:p>
@@ -2412,10 +2545,13 @@
         <w:rPr>
           <w:b/>
           <w:bCs/>
-          <w:sz w:val="22"/>
-          <w:szCs w:val="22"/>
-        </w:rPr>
-        <w:t>3.1 Acquisition and Detection</w:t>
+          <w:i w:val="0"/>
+          <w:iCs w:val="0"/>
+          <w:sz w:val="22"/>
+          <w:szCs w:val="22"/>
+          <w:rtl w:val="0"/>
+        </w:rPr>
+        <w:t xml:space="preserve">3.1 Acquisition and Features</w:t>
       </w:r>
     </w:p>
     <w:p>
@@ -2429,84 +2565,15 @@
       </w:pPr>
       <w:r>
         <w:rPr>
-          <w:sz w:val="22"/>
-          <w:szCs w:val="22"/>
-        </w:rPr>
-        <w:t xml:space="preserve">The node wakes every 15 min and whenever the wake circuit detects a vibration burst; after an event it ignores new triggers for 20 min. On each wake it records 10 s from the piezo and the microphone and reads the weight and temperature. For each channel it computes the power spectral density </w:t>
-      </w:r>
-      <w:r>
-        <w:rPr>
-          <w:i/>
-          <w:iCs/>
-          <w:sz w:val="22"/>
-          <w:szCs w:val="22"/>
-        </w:rPr>
-        <w:t>S</w:t>
-      </w:r>
-      <w:r>
-        <w:rPr>
-          <w:sz w:val="22"/>
-          <w:szCs w:val="22"/>
-        </w:rPr>
-        <w:t>(</w:t>
-      </w:r>
-      <w:r>
-        <w:rPr>
-          <w:i/>
-          <w:iCs/>
-          <w:sz w:val="22"/>
-          <w:szCs w:val="22"/>
-        </w:rPr>
-        <w:t>f</w:t>
-      </w:r>
-      <w:r>
-        <w:rPr>
-          <w:sz w:val="22"/>
-          <w:szCs w:val="22"/>
-        </w:rPr>
-        <w:t xml:space="preserve">) with an FFT and sums it into </w:t>
-      </w:r>
-      <w:r>
-        <w:rPr>
-          <w:i/>
-          <w:iCs/>
-          <w:sz w:val="22"/>
-          <w:szCs w:val="22"/>
-        </w:rPr>
-        <w:t>K</w:t>
-      </w:r>
-      <w:r>
-        <w:rPr>
-          <w:sz w:val="22"/>
-          <w:szCs w:val="22"/>
-        </w:rPr>
-        <w:t xml:space="preserve"> = 24 frequency bands </w:t>
-      </w:r>
-      <w:r>
-        <w:rPr>
-          <w:i/>
-          <w:iCs/>
-          <w:sz w:val="22"/>
-          <w:szCs w:val="22"/>
-        </w:rPr>
-        <w:t>B</w:t>
-      </w:r>
-      <w:r>
-        <w:rPr>
-          <w:i/>
-          <w:iCs/>
-          <w:sz w:val="22"/>
-          <w:szCs w:val="22"/>
-          <w:vertAlign w:val="subscript"/>
-        </w:rPr>
-        <w:t>k</w:t>
-      </w:r>
-      <w:r>
-        <w:rPr>
-          <w:sz w:val="22"/>
-          <w:szCs w:val="22"/>
-        </w:rPr>
-        <w:t xml:space="preserve"> between 50 and 800 Hz, the range of the pre-swarm changes [2] and of queen piping. Dividing each band by the total cancels differences in how well the sensor is coupled to the comb:</w:t>
+          <w:b w:val="0"/>
+          <w:bCs w:val="0"/>
+          <w:i w:val="0"/>
+          <w:iCs w:val="0"/>
+          <w:sz w:val="22"/>
+          <w:szCs w:val="22"/>
+          <w:rtl w:val="0"/>
+        </w:rPr>
+        <w:t xml:space="preserve">Scheduled acquisitions every 15 min are the baseline; the wake circuit adds acquisitions on vibration bursts, and its 20-min hold-off blocks only further event wakes, never scheduled ones. The wake circuit compares the piezo envelope with a slow running average; it reacts to amplitude, so gradual spectral changes are expected in the scheduled recordings, and the added value of event wakes is evaluated. Each acquisition records 10 s of piezo signal (ADC, fs = 2 kHz) and microphone signal (I²S, decimated to 2 kHz), then the weight after the HX711 settles and the temperatures. Welch's method (1024-point Hann windows, 50% overlap, ≈38 averages, Δf ≈ 2 Hz) gives S(f); the FFT is Q15 fixed-point, validated offline against a floating-point reference. S(f) is summed into K = 24 logarithmically spaced bands Bk in B = 50–800 Hz, ≈6 Hz wide at 50 Hz, ≈13 Hz near 110 Hz and ≈90 Hz near 800 Hz. Absolute band powers are kept together with the normalized energies (1), which remove a common gain but not frequency-dependent coupling; both are compared, and recordings near the noise floor are flagged. During development each node also keeps one raw recording per night (≈80 kB), retrieved by the hub to diagnose aliasing, coupling and noise.</w:t>
       </w:r>
     </w:p>
     <w:p>
@@ -2690,6 +2757,28 @@
     </w:p>
     <w:p>
       <w:pPr>
+        <w:keepNext/>
+        <w:spacing w:before="40" w:after="0" w:line="360" w:lineRule="auto"/>
+        <w:rPr>
+          <w:sz w:val="22"/>
+          <w:szCs w:val="22"/>
+        </w:rPr>
+      </w:pPr>
+      <w:r>
+        <w:rPr>
+          <w:b/>
+          <w:bCs/>
+          <w:i w:val="0"/>
+          <w:iCs w:val="0"/>
+          <w:sz w:val="22"/>
+          <w:szCs w:val="22"/>
+          <w:rtl w:val="0"/>
+        </w:rPr>
+        <w:t xml:space="preserve">3.2 Detection Rule (Hypothesis)</w:t>
+      </w:r>
+    </w:p>
+    <w:p>
+      <w:pPr>
         <w:tabs>
           <w:tab w:val="center" w:pos="4535"/>
           <w:tab w:val="right" w:pos="9071"/>
@@ -2708,14 +2797,296 @@
           <w:szCs w:val="22"/>
         </w:rPr>
         <w:tab/>
-        <w:t>z</w:t>
-      </w:r>
-      <w:r>
-        <w:rPr>
-          <w:sz w:val="22"/>
-          <w:szCs w:val="22"/>
+      </w:r>
+      <w:r>
+        <w:rPr>
+          <w:b w:val="0"/>
+          <w:bCs w:val="0"/>
+          <w:i w:val="1"/>
+          <w:iCs w:val="1"/>
+          <w:sz w:val="22"/>
+          <w:szCs w:val="22"/>
+          <w:rtl w:val="0"/>
+        </w:rPr>
+        <w:t xml:space="preserve">z</w:t>
+      </w:r>
+      <w:r>
+        <w:rPr>
+          <w:b w:val="0"/>
+          <w:bCs w:val="0"/>
+          <w:i w:val="0"/>
+          <w:iCs w:val="0"/>
+          <w:sz w:val="22"/>
+          <w:szCs w:val="22"/>
+          <w:rtl w:val="0"/>
         </w:rPr>
         <w:t xml:space="preserve"> = (</w:t>
+      </w:r>
+      <w:r>
+        <w:rPr>
+          <w:b w:val="0"/>
+          <w:bCs w:val="0"/>
+          <w:i w:val="1"/>
+          <w:iCs w:val="1"/>
+          <w:sz w:val="22"/>
+          <w:szCs w:val="22"/>
+          <w:rtl w:val="0"/>
+        </w:rPr>
+        <w:t xml:space="preserve">x</w:t>
+      </w:r>
+      <w:r>
+        <w:rPr>
+          <w:b w:val="0"/>
+          <w:bCs w:val="0"/>
+          <w:i w:val="0"/>
+          <w:iCs w:val="0"/>
+          <w:sz w:val="22"/>
+          <w:szCs w:val="22"/>
+          <w:rtl w:val="0"/>
+        </w:rPr>
+        <w:t xml:space="preserve"> − </w:t>
+      </w:r>
+      <w:r>
+        <w:rPr>
+          <w:b w:val="0"/>
+          <w:bCs w:val="0"/>
+          <w:i w:val="1"/>
+          <w:iCs w:val="1"/>
+          <w:sz w:val="22"/>
+          <w:szCs w:val="22"/>
+          <w:rtl w:val="0"/>
+        </w:rPr>
+        <w:t xml:space="preserve">μ</w:t>
+      </w:r>
+      <w:r>
+        <w:rPr>
+          <w:b w:val="0"/>
+          <w:bCs w:val="0"/>
+          <w:i w:val="1"/>
+          <w:iCs w:val="1"/>
+          <w:sz w:val="22"/>
+          <w:szCs w:val="22"/>
+          <w:vertAlign w:val="subscript"/>
+          <w:rtl w:val="0"/>
+        </w:rPr>
+        <w:t xml:space="preserve">h</w:t>
+      </w:r>
+      <w:r>
+        <w:rPr>
+          <w:b w:val="0"/>
+          <w:bCs w:val="0"/>
+          <w:i w:val="0"/>
+          <w:iCs w:val="0"/>
+          <w:sz w:val="22"/>
+          <w:szCs w:val="22"/>
+          <w:rtl w:val="0"/>
+        </w:rPr>
+        <w:t xml:space="preserve">) / </w:t>
+      </w:r>
+      <w:r>
+        <w:rPr>
+          <w:b w:val="0"/>
+          <w:bCs w:val="0"/>
+          <w:i w:val="1"/>
+          <w:iCs w:val="1"/>
+          <w:sz w:val="22"/>
+          <w:szCs w:val="22"/>
+          <w:rtl w:val="0"/>
+        </w:rPr>
+        <w:t xml:space="preserve">σ</w:t>
+      </w:r>
+      <w:r>
+        <w:rPr>
+          <w:b w:val="0"/>
+          <w:bCs w:val="0"/>
+          <w:i w:val="1"/>
+          <w:iCs w:val="1"/>
+          <w:sz w:val="22"/>
+          <w:szCs w:val="22"/>
+          <w:vertAlign w:val="subscript"/>
+          <w:rtl w:val="0"/>
+        </w:rPr>
+        <w:t xml:space="preserve">h</w:t>
+      </w:r>
+      <w:r>
+        <w:rPr>
+          <w:b w:val="0"/>
+          <w:bCs w:val="0"/>
+          <w:i w:val="0"/>
+          <w:iCs w:val="0"/>
+          <w:sz w:val="22"/>
+          <w:szCs w:val="22"/>
+          <w:rtl w:val="0"/>
+        </w:rPr>
+        <w:t xml:space="preserve">,     Δ</w:t>
+      </w:r>
+      <w:r>
+        <w:rPr>
+          <w:b w:val="0"/>
+          <w:bCs w:val="0"/>
+          <w:i w:val="1"/>
+          <w:iCs w:val="1"/>
+          <w:sz w:val="22"/>
+          <w:szCs w:val="22"/>
+          <w:rtl w:val="0"/>
+        </w:rPr>
+        <w:t xml:space="preserve">W</w:t>
+      </w:r>
+      <w:r>
+        <w:rPr>
+          <w:b w:val="0"/>
+          <w:bCs w:val="0"/>
+          <w:i w:val="0"/>
+          <w:iCs w:val="0"/>
+          <w:sz w:val="22"/>
+          <w:szCs w:val="22"/>
+          <w:rtl w:val="0"/>
+        </w:rPr>
+        <w:t xml:space="preserve">(</w:t>
+      </w:r>
+      <w:r>
+        <w:rPr>
+          <w:b w:val="0"/>
+          <w:bCs w:val="0"/>
+          <w:i w:val="1"/>
+          <w:iCs w:val="1"/>
+          <w:sz w:val="22"/>
+          <w:szCs w:val="22"/>
+          <w:rtl w:val="0"/>
+        </w:rPr>
+        <w:t xml:space="preserve">t</w:t>
+      </w:r>
+      <w:r>
+        <w:rPr>
+          <w:b w:val="0"/>
+          <w:bCs w:val="0"/>
+          <w:i w:val="0"/>
+          <w:iCs w:val="0"/>
+          <w:sz w:val="22"/>
+          <w:szCs w:val="22"/>
+          <w:rtl w:val="0"/>
+        </w:rPr>
+        <w:t xml:space="preserve">) = </w:t>
+      </w:r>
+      <w:r>
+        <w:rPr>
+          <w:b w:val="0"/>
+          <w:bCs w:val="0"/>
+          <w:i w:val="1"/>
+          <w:iCs w:val="1"/>
+          <w:sz w:val="22"/>
+          <w:szCs w:val="22"/>
+          <w:rtl w:val="0"/>
+        </w:rPr>
+        <w:t xml:space="preserve">W</w:t>
+      </w:r>
+      <w:r>
+        <w:rPr>
+          <w:b w:val="0"/>
+          <w:bCs w:val="0"/>
+          <w:i w:val="0"/>
+          <w:iCs w:val="0"/>
+          <w:sz w:val="22"/>
+          <w:szCs w:val="22"/>
+          <w:rtl w:val="0"/>
+        </w:rPr>
+        <w:t xml:space="preserve">(</w:t>
+      </w:r>
+      <w:r>
+        <w:rPr>
+          <w:b w:val="0"/>
+          <w:bCs w:val="0"/>
+          <w:i w:val="1"/>
+          <w:iCs w:val="1"/>
+          <w:sz w:val="22"/>
+          <w:szCs w:val="22"/>
+          <w:rtl w:val="0"/>
+        </w:rPr>
+        <w:t xml:space="preserve">t</w:t>
+      </w:r>
+      <w:r>
+        <w:rPr>
+          <w:b w:val="0"/>
+          <w:bCs w:val="0"/>
+          <w:i w:val="0"/>
+          <w:iCs w:val="0"/>
+          <w:sz w:val="22"/>
+          <w:szCs w:val="22"/>
+          <w:rtl w:val="0"/>
+        </w:rPr>
+        <w:t xml:space="preserve">) − </w:t>
+      </w:r>
+      <w:r>
+        <w:rPr>
+          <w:b w:val="0"/>
+          <w:bCs w:val="0"/>
+          <w:i w:val="1"/>
+          <w:iCs w:val="1"/>
+          <w:sz w:val="22"/>
+          <w:szCs w:val="22"/>
+          <w:rtl w:val="0"/>
+        </w:rPr>
+        <w:t xml:space="preserve">W</w:t>
+      </w:r>
+      <w:r>
+        <w:rPr>
+          <w:b w:val="0"/>
+          <w:bCs w:val="0"/>
+          <w:i w:val="0"/>
+          <w:iCs w:val="0"/>
+          <w:sz w:val="22"/>
+          <w:szCs w:val="22"/>
+          <w:rtl w:val="0"/>
+        </w:rPr>
+        <w:t xml:space="preserve">(</w:t>
+      </w:r>
+      <w:r>
+        <w:rPr>
+          <w:b w:val="0"/>
+          <w:bCs w:val="0"/>
+          <w:i w:val="1"/>
+          <w:iCs w:val="1"/>
+          <w:sz w:val="22"/>
+          <w:szCs w:val="22"/>
+          <w:rtl w:val="0"/>
+        </w:rPr>
+        <w:t xml:space="preserve">t</w:t>
+      </w:r>
+      <w:r>
+        <w:rPr>
+          <w:b w:val="0"/>
+          <w:bCs w:val="0"/>
+          <w:i w:val="0"/>
+          <w:iCs w:val="0"/>
+          <w:sz w:val="22"/>
+          <w:szCs w:val="22"/>
+          <w:rtl w:val="0"/>
+        </w:rPr>
+        <w:t xml:space="preserve"> − </w:t>
+      </w:r>
+      <w:r>
+        <w:rPr>
+          <w:b w:val="0"/>
+          <w:bCs w:val="0"/>
+          <w:i w:val="1"/>
+          <w:iCs w:val="1"/>
+          <w:sz w:val="22"/>
+          <w:szCs w:val="22"/>
+          <w:rtl w:val="0"/>
+        </w:rPr>
+        <w:t xml:space="preserve">τ</w:t>
+      </w:r>
+      <w:r>
+        <w:rPr>
+          <w:b w:val="0"/>
+          <w:bCs w:val="0"/>
+          <w:i w:val="0"/>
+          <w:iCs w:val="0"/>
+          <w:sz w:val="22"/>
+          <w:szCs w:val="22"/>
+          <w:rtl w:val="0"/>
+        </w:rPr>
+        <w:t xml:space="preserve">)</w:t>
       </w:r>
       <w:r>
         <w:rPr>
@@ -2724,194 +3095,19 @@
           <w:sz w:val="22"/>
           <w:szCs w:val="22"/>
         </w:rPr>
-        <w:t>x</w:t>
-      </w:r>
-      <w:r>
-        <w:rPr>
-          <w:sz w:val="22"/>
-          <w:szCs w:val="22"/>
-        </w:rPr>
-        <w:t xml:space="preserve"> − </w:t>
-      </w:r>
-      <w:r>
-        <w:rPr>
-          <w:i/>
-          <w:iCs/>
-          <w:sz w:val="22"/>
-          <w:szCs w:val="22"/>
-        </w:rPr>
-        <w:t>μ</w:t>
-      </w:r>
-      <w:r>
-        <w:rPr>
-          <w:i/>
-          <w:iCs/>
-          <w:sz w:val="22"/>
-          <w:szCs w:val="22"/>
-          <w:vertAlign w:val="subscript"/>
-        </w:rPr>
-        <w:t>h</w:t>
-      </w:r>
-      <w:r>
-        <w:rPr>
-          <w:sz w:val="22"/>
-          <w:szCs w:val="22"/>
-        </w:rPr>
-        <w:t xml:space="preserve">) / </w:t>
-      </w:r>
-      <w:r>
-        <w:rPr>
-          <w:i/>
-          <w:iCs/>
-          <w:sz w:val="22"/>
-          <w:szCs w:val="22"/>
-        </w:rPr>
-        <w:t>σ</w:t>
-      </w:r>
-      <w:r>
-        <w:rPr>
-          <w:i/>
-          <w:iCs/>
-          <w:sz w:val="22"/>
-          <w:szCs w:val="22"/>
-          <w:vertAlign w:val="subscript"/>
-        </w:rPr>
-        <w:t>h</w:t>
-      </w:r>
-      <w:r>
-        <w:rPr>
-          <w:sz w:val="22"/>
-          <w:szCs w:val="22"/>
-        </w:rPr>
-        <w:t>,     Δ</w:t>
-      </w:r>
-      <w:r>
-        <w:rPr>
-          <w:i/>
-          <w:iCs/>
-          <w:sz w:val="22"/>
-          <w:szCs w:val="22"/>
-        </w:rPr>
-        <w:t>W</w:t>
-      </w:r>
-      <w:r>
-        <w:rPr>
-          <w:sz w:val="22"/>
-          <w:szCs w:val="22"/>
-        </w:rPr>
-        <w:t>(</w:t>
-      </w:r>
-      <w:r>
-        <w:rPr>
-          <w:i/>
-          <w:iCs/>
-          <w:sz w:val="22"/>
-          <w:szCs w:val="22"/>
-        </w:rPr>
-        <w:t>t</w:t>
-      </w:r>
-      <w:r>
-        <w:rPr>
-          <w:sz w:val="22"/>
-          <w:szCs w:val="22"/>
-        </w:rPr>
-        <w:t xml:space="preserve">) = </w:t>
-      </w:r>
-      <w:r>
-        <w:rPr>
-          <w:i/>
-          <w:iCs/>
-          <w:sz w:val="22"/>
-          <w:szCs w:val="22"/>
-        </w:rPr>
-        <w:t>W</w:t>
-      </w:r>
-      <w:r>
-        <w:rPr>
-          <w:sz w:val="22"/>
-          <w:szCs w:val="22"/>
-        </w:rPr>
-        <w:t>(</w:t>
-      </w:r>
-      <w:r>
-        <w:rPr>
-          <w:i/>
-          <w:iCs/>
-          <w:sz w:val="22"/>
-          <w:szCs w:val="22"/>
-        </w:rPr>
-        <w:t>t</w:t>
-      </w:r>
-      <w:r>
-        <w:rPr>
-          <w:sz w:val="22"/>
-          <w:szCs w:val="22"/>
-        </w:rPr>
-        <w:t xml:space="preserve">) − </w:t>
-      </w:r>
-      <w:r>
-        <w:rPr>
-          <w:i/>
-          <w:iCs/>
-          <w:sz w:val="22"/>
-          <w:szCs w:val="22"/>
-        </w:rPr>
-        <w:t>W</w:t>
-      </w:r>
-      <w:r>
-        <w:rPr>
-          <w:sz w:val="22"/>
-          <w:szCs w:val="22"/>
-        </w:rPr>
-        <w:t>(</w:t>
-      </w:r>
-      <w:r>
-        <w:rPr>
-          <w:i/>
-          <w:iCs/>
-          <w:sz w:val="22"/>
-          <w:szCs w:val="22"/>
-        </w:rPr>
-        <w:t>t</w:t>
-      </w:r>
-      <w:r>
-        <w:rPr>
-          <w:sz w:val="22"/>
-          <w:szCs w:val="22"/>
-        </w:rPr>
-        <w:t xml:space="preserve"> − </w:t>
-      </w:r>
-      <w:r>
-        <w:rPr>
-          <w:i/>
-          <w:iCs/>
-          <w:sz w:val="22"/>
-          <w:szCs w:val="22"/>
-        </w:rPr>
-        <w:t>τ</w:t>
-      </w:r>
-      <w:r>
-        <w:rPr>
-          <w:sz w:val="22"/>
-          <w:szCs w:val="22"/>
-        </w:rPr>
-        <w:t>)</w:t>
-      </w:r>
-      <w:r>
-        <w:rPr>
-          <w:i/>
-          <w:iCs/>
-          <w:sz w:val="22"/>
-          <w:szCs w:val="22"/>
-        </w:rPr>
         <w:tab/>
       </w:r>
       <w:r>
         <w:rPr>
-          <w:sz w:val="22"/>
-          <w:szCs w:val="22"/>
-        </w:rPr>
-        <w:t>(2)</w:t>
+          <w:b w:val="0"/>
+          <w:bCs w:val="0"/>
+          <w:i w:val="0"/>
+          <w:iCs w:val="0"/>
+          <w:sz w:val="22"/>
+          <w:szCs w:val="22"/>
+          <w:rtl w:val="0"/>
+        </w:rPr>
+        <w:t xml:space="preserve">(2)</w:t>
       </w:r>
     </w:p>
     <w:p>
@@ -2925,158 +3121,270 @@
       </w:pPr>
       <w:r>
         <w:rPr>
-          <w:sz w:val="22"/>
-          <w:szCs w:val="22"/>
-        </w:rPr>
-        <w:t xml:space="preserve">The node sends these band energies, the weight and the temperatures to the hub. Because colony activity follows a daily cycle [4], the hub compares each value </w:t>
-      </w:r>
-      <w:r>
-        <w:rPr>
-          <w:i/>
-          <w:iCs/>
-          <w:sz w:val="22"/>
-          <w:szCs w:val="22"/>
-        </w:rPr>
-        <w:t>x</w:t>
-      </w:r>
-      <w:r>
-        <w:rPr>
-          <w:sz w:val="22"/>
-          <w:szCs w:val="22"/>
+          <w:b w:val="0"/>
+          <w:bCs w:val="0"/>
+          <w:i w:val="0"/>
+          <w:iCs w:val="0"/>
+          <w:sz w:val="22"/>
+          <w:szCs w:val="22"/>
+          <w:rtl w:val="0"/>
+        </w:rPr>
+        <w:t xml:space="preserve">The hub compares each feature </w:t>
+      </w:r>
+      <w:r>
+        <w:rPr>
+          <w:b w:val="0"/>
+          <w:bCs w:val="0"/>
+          <w:i w:val="1"/>
+          <w:iCs w:val="1"/>
+          <w:sz w:val="22"/>
+          <w:szCs w:val="22"/>
+          <w:rtl w:val="0"/>
+        </w:rPr>
+        <w:t xml:space="preserve">x</w:t>
+      </w:r>
+      <w:r>
+        <w:rPr>
+          <w:b w:val="0"/>
+          <w:bCs w:val="0"/>
+          <w:i w:val="0"/>
+          <w:iCs w:val="0"/>
+          <w:sz w:val="22"/>
+          <w:szCs w:val="22"/>
+          <w:rtl w:val="0"/>
         </w:rPr>
         <w:t xml:space="preserve"> with the same hive's mean </w:t>
       </w:r>
       <w:r>
         <w:rPr>
-          <w:i/>
-          <w:iCs/>
-          <w:sz w:val="22"/>
-          <w:szCs w:val="22"/>
-        </w:rPr>
-        <w:t>μ</w:t>
-      </w:r>
-      <w:r>
-        <w:rPr>
-          <w:i/>
-          <w:iCs/>
+          <w:b w:val="0"/>
+          <w:bCs w:val="0"/>
+          <w:i w:val="1"/>
+          <w:iCs w:val="1"/>
+          <w:sz w:val="22"/>
+          <w:szCs w:val="22"/>
+          <w:rtl w:val="0"/>
+        </w:rPr>
+        <w:t xml:space="preserve">μ</w:t>
+      </w:r>
+      <w:r>
+        <w:rPr>
+          <w:b w:val="0"/>
+          <w:bCs w:val="0"/>
+          <w:i w:val="1"/>
+          <w:iCs w:val="1"/>
           <w:sz w:val="22"/>
           <w:szCs w:val="22"/>
           <w:vertAlign w:val="subscript"/>
-        </w:rPr>
-        <w:t>h</w:t>
-      </w:r>
-      <w:r>
-        <w:rPr>
-          <w:sz w:val="22"/>
-          <w:szCs w:val="22"/>
-        </w:rPr>
-        <w:t xml:space="preserve"> and spread </w:t>
-      </w:r>
-      <w:r>
-        <w:rPr>
-          <w:i/>
-          <w:iCs/>
-          <w:sz w:val="22"/>
-          <w:szCs w:val="22"/>
-        </w:rPr>
-        <w:t>σ</w:t>
-      </w:r>
-      <w:r>
-        <w:rPr>
-          <w:i/>
-          <w:iCs/>
+          <w:rtl w:val="0"/>
+        </w:rPr>
+        <w:t xml:space="preserve">h</w:t>
+      </w:r>
+      <w:r>
+        <w:rPr>
+          <w:b w:val="0"/>
+          <w:bCs w:val="0"/>
+          <w:i w:val="0"/>
+          <w:iCs w:val="0"/>
+          <w:sz w:val="22"/>
+          <w:szCs w:val="22"/>
+          <w:rtl w:val="0"/>
+        </w:rPr>
+        <w:t xml:space="preserve"> and deviation </w:t>
+      </w:r>
+      <w:r>
+        <w:rPr>
+          <w:b w:val="0"/>
+          <w:bCs w:val="0"/>
+          <w:i w:val="1"/>
+          <w:iCs w:val="1"/>
+          <w:sz w:val="22"/>
+          <w:szCs w:val="22"/>
+          <w:rtl w:val="0"/>
+        </w:rPr>
+        <w:t xml:space="preserve">σ</w:t>
+      </w:r>
+      <w:r>
+        <w:rPr>
+          <w:b w:val="0"/>
+          <w:bCs w:val="0"/>
+          <w:i w:val="1"/>
+          <w:iCs w:val="1"/>
           <w:sz w:val="22"/>
           <w:szCs w:val="22"/>
           <w:vertAlign w:val="subscript"/>
-        </w:rPr>
-        <w:t>h</w:t>
-      </w:r>
-      <w:r>
-        <w:rPr>
-          <w:sz w:val="22"/>
-          <w:szCs w:val="22"/>
-        </w:rPr>
-        <w:t xml:space="preserve"> at the same hour of day over the past week. A </w:t>
-      </w:r>
-      <w:r>
-        <w:rPr>
-          <w:i/>
-          <w:iCs/>
-          <w:sz w:val="22"/>
-          <w:szCs w:val="22"/>
-        </w:rPr>
-        <w:t>pre-swarm alert</w:t>
-      </w:r>
-      <w:r>
-        <w:rPr>
-          <w:sz w:val="22"/>
-          <w:szCs w:val="22"/>
-        </w:rPr>
-        <w:t xml:space="preserve"> is raised when the energy in the swarming band (≈100–300 Hz) and the in-hive temperature stay above this baseline (|</w:t>
-      </w:r>
-      <w:r>
-        <w:rPr>
-          <w:i/>
-          <w:iCs/>
-          <w:sz w:val="22"/>
-          <w:szCs w:val="22"/>
-        </w:rPr>
-        <w:t>z</w:t>
-      </w:r>
-      <w:r>
-        <w:rPr>
-          <w:sz w:val="22"/>
-          <w:szCs w:val="22"/>
-        </w:rPr>
-        <w:t xml:space="preserve">| &gt; 3), as observed before swarming in [2]. A </w:t>
-      </w:r>
-      <w:r>
-        <w:rPr>
-          <w:i/>
-          <w:iCs/>
-          <w:sz w:val="22"/>
-          <w:szCs w:val="22"/>
-        </w:rPr>
-        <w:t>departure</w:t>
-      </w:r>
-      <w:r>
-        <w:rPr>
-          <w:sz w:val="22"/>
-          <w:szCs w:val="22"/>
-        </w:rPr>
-        <w:t xml:space="preserve"> is confirmed when the weight drops by more than 0.8 kg within 30 min (Δ</w:t>
-      </w:r>
-      <w:r>
-        <w:rPr>
-          <w:i/>
-          <w:iCs/>
-          <w:sz w:val="22"/>
-          <w:szCs w:val="22"/>
-        </w:rPr>
-        <w:t>W</w:t>
-      </w:r>
-      <w:r>
-        <w:rPr>
-          <w:sz w:val="22"/>
-          <w:szCs w:val="22"/>
-        </w:rPr>
-        <w:t xml:space="preserve">, with </w:t>
-      </w:r>
-      <w:r>
-        <w:rPr>
-          <w:i/>
-          <w:iCs/>
-          <w:sz w:val="22"/>
-          <w:szCs w:val="22"/>
-        </w:rPr>
-        <w:t>τ</w:t>
-      </w:r>
-      <w:r>
-        <w:rPr>
-          <w:sz w:val="22"/>
-          <w:szCs w:val="22"/>
-        </w:rPr>
-        <w:t xml:space="preserve"> = 30 min) together with a vibration burst, since a prime swarm weighs about 1–2 kg. The time between the first alert and the departure is the lead time.</w:t>
+          <w:rtl w:val="0"/>
+        </w:rPr>
+        <w:t xml:space="preserve">h</w:t>
+      </w:r>
+      <w:r>
+        <w:rPr>
+          <w:b w:val="0"/>
+          <w:bCs w:val="0"/>
+          <w:i w:val="0"/>
+          <w:iCs w:val="0"/>
+          <w:sz w:val="22"/>
+          <w:szCs w:val="22"/>
+          <w:rtl w:val="0"/>
+        </w:rPr>
+        <w:t xml:space="preserve"> at the same hour over the previous 7 days, excluding the current sample; </w:t>
+      </w:r>
+      <w:r>
+        <w:rPr>
+          <w:b w:val="0"/>
+          <w:bCs w:val="0"/>
+          <w:i w:val="1"/>
+          <w:iCs w:val="1"/>
+          <w:sz w:val="22"/>
+          <w:szCs w:val="22"/>
+          <w:rtl w:val="0"/>
+        </w:rPr>
+        <w:t xml:space="preserve">σ</w:t>
+      </w:r>
+      <w:r>
+        <w:rPr>
+          <w:b w:val="0"/>
+          <w:bCs w:val="0"/>
+          <w:i w:val="1"/>
+          <w:iCs w:val="1"/>
+          <w:sz w:val="22"/>
+          <w:szCs w:val="22"/>
+          <w:vertAlign w:val="subscript"/>
+          <w:rtl w:val="0"/>
+        </w:rPr>
+        <w:t xml:space="preserve">h</w:t>
+      </w:r>
+      <w:r>
+        <w:rPr>
+          <w:b w:val="0"/>
+          <w:bCs w:val="0"/>
+          <w:i w:val="0"/>
+          <w:iCs w:val="0"/>
+          <w:sz w:val="22"/>
+          <w:szCs w:val="22"/>
+          <w:rtl w:val="0"/>
+        </w:rPr>
+        <w:t xml:space="preserve"> has a floor set by the noise level, and no alerts are issued in the first week or for hours with fewer than four valid samples. The hypothesis, inspired by [2] and not a validated implementation of [2] or [3], is that a sustained increase of the 100–300 Hz band energy together with in-hive temperature indicates preparation: a </w:t>
+      </w:r>
+      <w:r>
+        <w:rPr>
+          <w:b w:val="0"/>
+          <w:bCs w:val="0"/>
+          <w:i w:val="1"/>
+          <w:iCs w:val="1"/>
+          <w:sz w:val="22"/>
+          <w:szCs w:val="22"/>
+          <w:rtl w:val="0"/>
+        </w:rPr>
+        <w:t xml:space="preserve">pre-swarm alert</w:t>
+      </w:r>
+      <w:r>
+        <w:rPr>
+          <w:b w:val="0"/>
+          <w:bCs w:val="0"/>
+          <w:i w:val="0"/>
+          <w:iCs w:val="0"/>
+          <w:sz w:val="22"/>
+          <w:szCs w:val="22"/>
+          <w:rtl w:val="0"/>
+        </w:rPr>
+        <w:t xml:space="preserve"> is raised when </w:t>
+      </w:r>
+      <w:r>
+        <w:rPr>
+          <w:b w:val="0"/>
+          <w:bCs w:val="0"/>
+          <w:i w:val="1"/>
+          <w:iCs w:val="1"/>
+          <w:sz w:val="22"/>
+          <w:szCs w:val="22"/>
+          <w:rtl w:val="0"/>
+        </w:rPr>
+        <w:t xml:space="preserve">z</w:t>
+      </w:r>
+      <w:r>
+        <w:rPr>
+          <w:b w:val="0"/>
+          <w:bCs w:val="0"/>
+          <w:i w:val="0"/>
+          <w:iCs w:val="0"/>
+          <w:sz w:val="22"/>
+          <w:szCs w:val="22"/>
+          <w:rtl w:val="0"/>
+        </w:rPr>
+        <w:t xml:space="preserve"> &gt; 3 for both in three consecutive scheduled reports. Outside temperature and logged management are recorded as confounders, and a fixed pre-season baseline is also tested, since an adaptive one may absorb a gradual precursor. Alerts are grouped into episodes that end after 24 h without a new alert. A separate </w:t>
+      </w:r>
+      <w:r>
+        <w:rPr>
+          <w:b w:val="0"/>
+          <w:bCs w:val="0"/>
+          <w:i w:val="1"/>
+          <w:iCs w:val="1"/>
+          <w:sz w:val="22"/>
+          <w:szCs w:val="22"/>
+          <w:rtl w:val="0"/>
+        </w:rPr>
+        <w:t xml:space="preserve">departure detector</w:t>
+      </w:r>
+      <w:r>
+        <w:rPr>
+          <w:b w:val="0"/>
+          <w:bCs w:val="0"/>
+          <w:i w:val="0"/>
+          <w:iCs w:val="0"/>
+          <w:sz w:val="22"/>
+          <w:szCs w:val="22"/>
+          <w:rtl w:val="0"/>
+        </w:rPr>
+        <w:t xml:space="preserve"> flags Δ</w:t>
+      </w:r>
+      <w:r>
+        <w:rPr>
+          <w:b w:val="0"/>
+          <w:bCs w:val="0"/>
+          <w:i w:val="1"/>
+          <w:iCs w:val="1"/>
+          <w:sz w:val="22"/>
+          <w:szCs w:val="22"/>
+          <w:rtl w:val="0"/>
+        </w:rPr>
+        <w:t xml:space="preserve">W</w:t>
+      </w:r>
+      <w:r>
+        <w:rPr>
+          <w:b w:val="0"/>
+          <w:bCs w:val="0"/>
+          <w:i w:val="0"/>
+          <w:iCs w:val="0"/>
+          <w:sz w:val="22"/>
+          <w:szCs w:val="22"/>
+          <w:rtl w:val="0"/>
+        </w:rPr>
+        <w:t xml:space="preserve"> &lt; −0.8 kg within </w:t>
+      </w:r>
+      <w:r>
+        <w:rPr>
+          <w:b w:val="0"/>
+          <w:bCs w:val="0"/>
+          <w:i w:val="1"/>
+          <w:iCs w:val="1"/>
+          <w:sz w:val="22"/>
+          <w:szCs w:val="22"/>
+          <w:rtl w:val="0"/>
+        </w:rPr>
+        <w:t xml:space="preserve">τ</w:t>
+      </w:r>
+      <w:r>
+        <w:rPr>
+          <w:b w:val="0"/>
+          <w:bCs w:val="0"/>
+          <w:i w:val="0"/>
+          <w:iCs w:val="0"/>
+          <w:sz w:val="22"/>
+          <w:szCs w:val="22"/>
+          <w:rtl w:val="0"/>
+        </w:rPr>
+        <w:t xml:space="preserve"> = 30 min together with a vibration burst; it is evaluated on its own and never used as ground truth.</w:t>
       </w:r>
     </w:p>
     <w:p>
@@ -3092,10 +3400,13 @@
         <w:rPr>
           <w:b/>
           <w:bCs/>
-          <w:sz w:val="22"/>
-          <w:szCs w:val="22"/>
-        </w:rPr>
-        <w:t>3.2 Feasibility</w:t>
+          <w:i w:val="0"/>
+          <w:iCs w:val="0"/>
+          <w:sz w:val="22"/>
+          <w:szCs w:val="22"/>
+          <w:rtl w:val="0"/>
+        </w:rPr>
+        <w:t xml:space="preserve">3.3 Feasibility</w:t>
       </w:r>
     </w:p>
     <w:p>
@@ -3109,74 +3420,123 @@
       </w:pPr>
       <w:r>
         <w:rPr>
-          <w:sz w:val="22"/>
-          <w:szCs w:val="22"/>
-        </w:rPr>
-        <w:t xml:space="preserve">No node is built yet, so feasibility is shown from published measurements and datasheet values, to be confirmed on the bench. </w:t>
-      </w:r>
-      <w:r>
-        <w:rPr>
-          <w:i/>
-          <w:iCs/>
-          <w:sz w:val="22"/>
-          <w:szCs w:val="22"/>
-        </w:rPr>
-        <w:t>Sensitivity:</w:t>
-      </w:r>
-      <w:r>
-        <w:rPr>
-          <w:sz w:val="22"/>
-          <w:szCs w:val="22"/>
-        </w:rPr>
-        <w:t xml:space="preserve"> comb vibration at night is only 1–5 µm/s² per frequency bin, ten times weaker on the hive wall [7] and below the noise of typical MEMS accelerometers, so we place a piezoelectric sensor in the comb. The pre-swarm changes in [2] were recorded with ordinary microphones, so the microphone channel is expected to see them; the piezo is tested on a real hive at night in Stage 1. </w:t>
-      </w:r>
-      <w:r>
-        <w:rPr>
-          <w:i/>
-          <w:iCs/>
-          <w:sz w:val="22"/>
-          <w:szCs w:val="22"/>
-        </w:rPr>
-        <w:t>Link:</w:t>
-      </w:r>
-      <w:r>
-        <w:rPr>
-          <w:sz w:val="22"/>
-          <w:szCs w:val="22"/>
-        </w:rPr>
-        <w:t xml:space="preserve"> each report is one short ESP-NOW message [8]; honey and wood attenuate 2.4 GHz, so the radio sits outside the hive and the range is measured on site (fallback: LoRa). </w:t>
-      </w:r>
-      <w:r>
-        <w:rPr>
-          <w:i/>
-          <w:iCs/>
-          <w:sz w:val="22"/>
-          <w:szCs w:val="22"/>
-        </w:rPr>
-        <w:t>Weighing:</w:t>
-      </w:r>
-      <w:r>
-        <w:rPr>
-          <w:sz w:val="22"/>
-          <w:szCs w:val="22"/>
-        </w:rPr>
-        <w:t xml:space="preserve"> the HX711 noise [9] corresponds to about 3 g, well below the 20 g target. </w:t>
-      </w:r>
-      <w:r>
-        <w:rPr>
-          <w:i/>
-          <w:iCs/>
-          <w:sz w:val="22"/>
-          <w:szCs w:val="22"/>
-        </w:rPr>
-        <w:t>Node power:</w:t>
-      </w:r>
-      <w:r>
-        <w:rPr>
-          <w:sz w:val="22"/>
-          <w:szCs w:val="22"/>
-        </w:rPr>
-        <w:t xml:space="preserve"> the average current and battery life are</w:t>
+          <w:b w:val="0"/>
+          <w:bCs w:val="0"/>
+          <w:i w:val="1"/>
+          <w:iCs w:val="1"/>
+          <w:sz w:val="22"/>
+          <w:szCs w:val="22"/>
+          <w:rtl w:val="0"/>
+        </w:rPr>
+        <w:t xml:space="preserve">Sensitivity (not yet established):</w:t>
+      </w:r>
+      <w:r>
+        <w:rPr>
+          <w:b w:val="0"/>
+          <w:bCs w:val="0"/>
+          <w:i w:val="0"/>
+          <w:iCs w:val="0"/>
+          <w:sz w:val="22"/>
+          <w:szCs w:val="22"/>
+          <w:rtl w:val="0"/>
+        </w:rPr>
+        <w:t xml:space="preserve"> comb vibration at night is only 1–5 µm/s² per bin with calibrated accelerometers and ten times weaker on the hive wall [8]. A piezo disc responds through its mounting, loading and input impedance, so the chain is characterized on the bench (controlled excitation, noise, saturation, transfer response, remount repeatability) and on a real hive at night in Stage 2, the go/no-go gate; the microphone, as used in [2], is the second channel and an external audio ADC the fallback. </w:t>
+      </w:r>
+      <w:r>
+        <w:rPr>
+          <w:b w:val="0"/>
+          <w:bCs w:val="0"/>
+          <w:i w:val="1"/>
+          <w:iCs w:val="1"/>
+          <w:sz w:val="22"/>
+          <w:szCs w:val="22"/>
+          <w:rtl w:val="0"/>
+        </w:rPr>
+        <w:t xml:space="preserve">Link:</w:t>
+      </w:r>
+      <w:r>
+        <w:rPr>
+          <w:b w:val="0"/>
+          <w:bCs w:val="0"/>
+          <w:i w:val="0"/>
+          <w:iCs w:val="0"/>
+          <w:sz w:val="22"/>
+          <w:szCs w:val="22"/>
+          <w:rtl w:val="0"/>
+        </w:rPr>
+        <w:t xml:space="preserve"> each report (hive ID, timestamp, sequence number, firmware version, quality flags, features) is one ESP-NOW frame; the send callback confirms only MAC-level delivery [9], so the hub returns an application acknowledgement and the node retries up to three times. The hub buffers data during cellular outages and marks stale hives on the dashboard. </w:t>
+      </w:r>
+      <w:r>
+        <w:rPr>
+          <w:b w:val="0"/>
+          <w:bCs w:val="0"/>
+          <w:i w:val="1"/>
+          <w:iCs w:val="1"/>
+          <w:sz w:val="22"/>
+          <w:szCs w:val="22"/>
+          <w:rtl w:val="0"/>
+        </w:rPr>
+        <w:t xml:space="preserve">Weighing:</w:t>
+      </w:r>
+      <w:r>
+        <w:rPr>
+          <w:b w:val="0"/>
+          <w:bCs w:val="0"/>
+          <w:i w:val="0"/>
+          <w:iCs w:val="0"/>
+          <w:sz w:val="22"/>
+          <w:szCs w:val="22"/>
+          <w:rtl w:val="0"/>
+        </w:rPr>
+        <w:t xml:space="preserve"> HX711 noise (≈3 g [10]) is only one contributor; load-cell tolerance, creep, temperature, corner loading, platform stiffness and settling dominate. Detecting a ≥ 0.8 kg drop needs a stable 30-min change, so the ±20 g target applies to change; absolute accuracy is reported. </w:t>
+      </w:r>
+      <w:r>
+        <w:rPr>
+          <w:b w:val="0"/>
+          <w:bCs w:val="0"/>
+          <w:i w:val="1"/>
+          <w:iCs w:val="1"/>
+          <w:sz w:val="22"/>
+          <w:szCs w:val="22"/>
+          <w:rtl w:val="0"/>
+        </w:rPr>
+        <w:t xml:space="preserve">Node power:</w:t>
+      </w:r>
+      <w:r>
+        <w:rPr>
+          <w:b w:val="0"/>
+          <w:bCs w:val="0"/>
+          <w:i w:val="0"/>
+          <w:iCs w:val="0"/>
+          <w:sz w:val="22"/>
+          <w:szCs w:val="22"/>
+          <w:rtl w:val="0"/>
+        </w:rPr>
+        <w:t xml:space="preserve"> with </w:t>
+      </w:r>
+      <w:r>
+        <w:rPr>
+          <w:b w:val="0"/>
+          <w:bCs w:val="0"/>
+          <w:i w:val="1"/>
+          <w:iCs w:val="1"/>
+          <w:sz w:val="22"/>
+          <w:szCs w:val="22"/>
+          <w:rtl w:val="0"/>
+        </w:rPr>
+        <w:t xml:space="preserve">A</w:t>
+      </w:r>
+      <w:r>
+        <w:rPr>
+          <w:b w:val="0"/>
+          <w:bCs w:val="0"/>
+          <w:i w:val="0"/>
+          <w:iCs w:val="0"/>
+          <w:sz w:val="22"/>
+          <w:szCs w:val="22"/>
+          <w:rtl w:val="0"/>
+        </w:rPr>
+        <w:t xml:space="preserve"> acquisitions per day,</w:t>
       </w:r>
     </w:p>
     <w:p>
@@ -3199,14 +3559,164 @@
           <w:szCs w:val="22"/>
         </w:rPr>
         <w:tab/>
-        <w:t>Ī</w:t>
-      </w:r>
-      <w:r>
-        <w:rPr>
-          <w:sz w:val="22"/>
-          <w:szCs w:val="22"/>
+      </w:r>
+      <w:r>
+        <w:rPr>
+          <w:b w:val="0"/>
+          <w:bCs w:val="0"/>
+          <w:i w:val="1"/>
+          <w:iCs w:val="1"/>
+          <w:sz w:val="22"/>
+          <w:szCs w:val="22"/>
+          <w:rtl w:val="0"/>
+        </w:rPr>
+        <w:t xml:space="preserve">Ī</w:t>
+      </w:r>
+      <w:r>
+        <w:rPr>
+          <w:b w:val="0"/>
+          <w:bCs w:val="0"/>
+          <w:i w:val="0"/>
+          <w:iCs w:val="0"/>
+          <w:sz w:val="22"/>
+          <w:szCs w:val="22"/>
+          <w:rtl w:val="0"/>
         </w:rPr>
         <w:t xml:space="preserve"> = </w:t>
+      </w:r>
+      <w:r>
+        <w:rPr>
+          <w:b w:val="0"/>
+          <w:bCs w:val="0"/>
+          <w:i w:val="1"/>
+          <w:iCs w:val="1"/>
+          <w:sz w:val="22"/>
+          <w:szCs w:val="22"/>
+          <w:rtl w:val="0"/>
+        </w:rPr>
+        <w:t xml:space="preserve">I</w:t>
+      </w:r>
+      <w:r>
+        <w:rPr>
+          <w:b w:val="0"/>
+          <w:bCs w:val="0"/>
+          <w:i w:val="1"/>
+          <w:iCs w:val="1"/>
+          <w:sz w:val="22"/>
+          <w:szCs w:val="22"/>
+          <w:vertAlign w:val="subscript"/>
+          <w:rtl w:val="0"/>
+        </w:rPr>
+        <w:t xml:space="preserve">0</w:t>
+      </w:r>
+      <w:r>
+        <w:rPr>
+          <w:b w:val="0"/>
+          <w:bCs w:val="0"/>
+          <w:i w:val="0"/>
+          <w:iCs w:val="0"/>
+          <w:sz w:val="22"/>
+          <w:szCs w:val="22"/>
+          <w:rtl w:val="0"/>
+        </w:rPr>
+        <w:t xml:space="preserve"> + </w:t>
+      </w:r>
+      <w:r>
+        <w:rPr>
+          <w:b w:val="0"/>
+          <w:bCs w:val="0"/>
+          <w:i w:val="1"/>
+          <w:iCs w:val="1"/>
+          <w:sz w:val="22"/>
+          <w:szCs w:val="22"/>
+          <w:rtl w:val="0"/>
+        </w:rPr>
+        <w:t xml:space="preserve">A Q</w:t>
+      </w:r>
+      <w:r>
+        <w:rPr>
+          <w:b w:val="0"/>
+          <w:bCs w:val="0"/>
+          <w:i w:val="0"/>
+          <w:iCs w:val="0"/>
+          <w:sz w:val="22"/>
+          <w:szCs w:val="22"/>
+          <w:rtl w:val="0"/>
+        </w:rPr>
+        <w:t xml:space="preserve"> / 86 400 s,     </w:t>
+      </w:r>
+      <w:r>
+        <w:rPr>
+          <w:b w:val="0"/>
+          <w:bCs w:val="0"/>
+          <w:i w:val="1"/>
+          <w:iCs w:val="1"/>
+          <w:sz w:val="22"/>
+          <w:szCs w:val="22"/>
+          <w:rtl w:val="0"/>
+        </w:rPr>
+        <w:t xml:space="preserve">T</w:t>
+      </w:r>
+      <w:r>
+        <w:rPr>
+          <w:b w:val="0"/>
+          <w:bCs w:val="0"/>
+          <w:i w:val="0"/>
+          <w:iCs w:val="0"/>
+          <w:sz w:val="22"/>
+          <w:szCs w:val="22"/>
+          <w:vertAlign w:val="subscript"/>
+          <w:rtl w:val="0"/>
+        </w:rPr>
+        <w:t xml:space="preserve">life</w:t>
+      </w:r>
+      <w:r>
+        <w:rPr>
+          <w:b w:val="0"/>
+          <w:bCs w:val="0"/>
+          <w:i w:val="0"/>
+          <w:iCs w:val="0"/>
+          <w:sz w:val="22"/>
+          <w:szCs w:val="22"/>
+          <w:rtl w:val="0"/>
+        </w:rPr>
+        <w:t xml:space="preserve"> = </w:t>
+      </w:r>
+      <w:r>
+        <w:rPr>
+          <w:b w:val="0"/>
+          <w:bCs w:val="0"/>
+          <w:i w:val="1"/>
+          <w:iCs w:val="1"/>
+          <w:sz w:val="22"/>
+          <w:szCs w:val="22"/>
+          <w:rtl w:val="0"/>
+        </w:rPr>
+        <w:t xml:space="preserve">η C</w:t>
+      </w:r>
+      <w:r>
+        <w:rPr>
+          <w:b w:val="0"/>
+          <w:bCs w:val="0"/>
+          <w:i w:val="0"/>
+          <w:iCs w:val="0"/>
+          <w:sz w:val="22"/>
+          <w:szCs w:val="22"/>
+          <w:rtl w:val="0"/>
+        </w:rPr>
+        <w:t xml:space="preserve"> / </w:t>
+      </w:r>
+      <w:r>
+        <w:rPr>
+          <w:b w:val="0"/>
+          <w:bCs w:val="0"/>
+          <w:i w:val="1"/>
+          <w:iCs w:val="1"/>
+          <w:sz w:val="22"/>
+          <w:szCs w:val="22"/>
+          <w:rtl w:val="0"/>
+        </w:rPr>
+        <w:t xml:space="preserve">Ī</w:t>
       </w:r>
       <w:r>
         <w:rPr>
@@ -3215,105 +3725,19 @@
           <w:sz w:val="22"/>
           <w:szCs w:val="22"/>
         </w:rPr>
-        <w:t>I</w:t>
-      </w:r>
-      <w:r>
-        <w:rPr>
-          <w:i/>
-          <w:iCs/>
-          <w:sz w:val="22"/>
-          <w:szCs w:val="22"/>
-          <w:vertAlign w:val="subscript"/>
-        </w:rPr>
-        <w:t>0</w:t>
-      </w:r>
-      <w:r>
-        <w:rPr>
-          <w:sz w:val="22"/>
-          <w:szCs w:val="22"/>
-        </w:rPr>
-        <w:t xml:space="preserve"> + </w:t>
-      </w:r>
-      <w:r>
-        <w:rPr>
-          <w:i/>
-          <w:iCs/>
-          <w:sz w:val="22"/>
-          <w:szCs w:val="22"/>
-        </w:rPr>
-        <w:t>A Q</w:t>
-      </w:r>
-      <w:r>
-        <w:rPr>
-          <w:sz w:val="22"/>
-          <w:szCs w:val="22"/>
-        </w:rPr>
-        <w:t xml:space="preserve"> / 86 400 s,     </w:t>
-      </w:r>
-      <w:r>
-        <w:rPr>
-          <w:i/>
-          <w:iCs/>
-          <w:sz w:val="22"/>
-          <w:szCs w:val="22"/>
-        </w:rPr>
-        <w:t>T</w:t>
-      </w:r>
-      <w:r>
-        <w:rPr>
-          <w:sz w:val="22"/>
-          <w:szCs w:val="22"/>
-          <w:vertAlign w:val="subscript"/>
-        </w:rPr>
-        <w:t>life</w:t>
-      </w:r>
-      <w:r>
-        <w:rPr>
-          <w:sz w:val="22"/>
-          <w:szCs w:val="22"/>
-        </w:rPr>
-        <w:t xml:space="preserve"> = </w:t>
-      </w:r>
-      <w:r>
-        <w:rPr>
-          <w:i/>
-          <w:iCs/>
-          <w:sz w:val="22"/>
-          <w:szCs w:val="22"/>
-        </w:rPr>
-        <w:t>η C</w:t>
-      </w:r>
-      <w:r>
-        <w:rPr>
-          <w:sz w:val="22"/>
-          <w:szCs w:val="22"/>
-        </w:rPr>
-        <w:t xml:space="preserve"> / </w:t>
-      </w:r>
-      <w:r>
-        <w:rPr>
-          <w:i/>
-          <w:iCs/>
-          <w:sz w:val="22"/>
-          <w:szCs w:val="22"/>
-        </w:rPr>
-        <w:t>Ī</w:t>
-      </w:r>
-      <w:r>
-        <w:rPr>
-          <w:i/>
-          <w:iCs/>
-          <w:sz w:val="22"/>
-          <w:szCs w:val="22"/>
-        </w:rPr>
         <w:tab/>
       </w:r>
       <w:r>
         <w:rPr>
-          <w:sz w:val="22"/>
-          <w:szCs w:val="22"/>
-        </w:rPr>
-        <w:t>(3)</w:t>
+          <w:b w:val="0"/>
+          <w:bCs w:val="0"/>
+          <w:i w:val="0"/>
+          <w:iCs w:val="0"/>
+          <w:sz w:val="22"/>
+          <w:szCs w:val="22"/>
+          <w:rtl w:val="0"/>
+        </w:rPr>
+        <w:t xml:space="preserve">(3)</w:t>
       </w:r>
     </w:p>
     <w:p>
@@ -3327,194 +3751,233 @@
       </w:pPr>
       <w:r>
         <w:rPr>
-          <w:sz w:val="22"/>
-          <w:szCs w:val="22"/>
+          <w:b w:val="0"/>
+          <w:bCs w:val="0"/>
+          <w:i w:val="0"/>
+          <w:iCs w:val="0"/>
+          <w:sz w:val="22"/>
+          <w:szCs w:val="22"/>
+          <w:rtl w:val="0"/>
         </w:rPr>
         <w:t xml:space="preserve">where </w:t>
       </w:r>
       <w:r>
         <w:rPr>
-          <w:i/>
-          <w:iCs/>
-          <w:sz w:val="22"/>
-          <w:szCs w:val="22"/>
-        </w:rPr>
-        <w:t>Q</w:t>
-      </w:r>
-      <w:r>
-        <w:rPr>
-          <w:sz w:val="22"/>
-          <w:szCs w:val="22"/>
-        </w:rPr>
-        <w:t xml:space="preserve"> ≈ 0.3 A·s is the charge of one acquisition, mostly the processor during the 10 s recording [10], </w:t>
-      </w:r>
-      <w:r>
-        <w:rPr>
-          <w:i/>
-          <w:iCs/>
-          <w:sz w:val="22"/>
-          <w:szCs w:val="22"/>
-        </w:rPr>
-        <w:t>A</w:t>
-      </w:r>
-      <w:r>
-        <w:rPr>
-          <w:sz w:val="22"/>
-          <w:szCs w:val="22"/>
-        </w:rPr>
-        <w:t xml:space="preserve"> the number of acquisitions per day and </w:t>
-      </w:r>
-      <w:r>
-        <w:rPr>
-          <w:i/>
-          <w:iCs/>
-          <w:sz w:val="22"/>
-          <w:szCs w:val="22"/>
-        </w:rPr>
-        <w:t>I</w:t>
-      </w:r>
-      <w:r>
-        <w:rPr>
-          <w:i/>
-          <w:iCs/>
+          <w:b w:val="0"/>
+          <w:bCs w:val="0"/>
+          <w:i w:val="1"/>
+          <w:iCs w:val="1"/>
+          <w:sz w:val="22"/>
+          <w:szCs w:val="22"/>
+          <w:rtl w:val="0"/>
+        </w:rPr>
+        <w:t xml:space="preserve">Q</w:t>
+      </w:r>
+      <w:r>
+        <w:rPr>
+          <w:b w:val="0"/>
+          <w:bCs w:val="0"/>
+          <w:i w:val="0"/>
+          <w:iCs w:val="0"/>
+          <w:sz w:val="22"/>
+          <w:szCs w:val="22"/>
+          <w:rtl w:val="0"/>
+        </w:rPr>
+        <w:t xml:space="preserve"> ≈ 0.3 A·s per acquisition (datasheet estimate, mostly the processor during recording [11]) and </w:t>
+      </w:r>
+      <w:r>
+        <w:rPr>
+          <w:b w:val="0"/>
+          <w:bCs w:val="0"/>
+          <w:i w:val="1"/>
+          <w:iCs w:val="1"/>
+          <w:sz w:val="22"/>
+          <w:szCs w:val="22"/>
+          <w:rtl w:val="0"/>
+        </w:rPr>
+        <w:t xml:space="preserve">I</w:t>
+      </w:r>
+      <w:r>
+        <w:rPr>
+          <w:b w:val="0"/>
+          <w:bCs w:val="0"/>
+          <w:i w:val="1"/>
+          <w:iCs w:val="1"/>
           <w:sz w:val="22"/>
           <w:szCs w:val="22"/>
           <w:vertAlign w:val="subscript"/>
-        </w:rPr>
-        <w:t>0</w:t>
-      </w:r>
-      <w:r>
-        <w:rPr>
-          <w:sz w:val="22"/>
-          <w:szCs w:val="22"/>
-        </w:rPr>
-        <w:t xml:space="preserve"> ≈ 22 µA the sleep and wake-circuit current. With 96 periodic acquisitions per day, </w:t>
-      </w:r>
-      <w:r>
-        <w:rPr>
-          <w:i/>
-          <w:iCs/>
-          <w:sz w:val="22"/>
-          <w:szCs w:val="22"/>
-        </w:rPr>
-        <w:t>Ī</w:t>
-      </w:r>
-      <w:r>
-        <w:rPr>
-          <w:sz w:val="22"/>
-          <w:szCs w:val="22"/>
-        </w:rPr>
-        <w:t xml:space="preserve"> ≈ 0.35 mA, and one 3000 mAh cell (</w:t>
-      </w:r>
-      <w:r>
-        <w:rPr>
-          <w:i/>
-          <w:iCs/>
-          <w:sz w:val="22"/>
-          <w:szCs w:val="22"/>
-        </w:rPr>
-        <w:t>η</w:t>
-      </w:r>
-      <w:r>
-        <w:rPr>
-          <w:sz w:val="22"/>
-          <w:szCs w:val="22"/>
-        </w:rPr>
-        <w:t xml:space="preserve"> = 0.8) lasts about 285 days; the six-month </w:t>
-      </w:r>
-      <w:r>
-        <w:rPr>
-          <w:sz w:val="22"/>
-          <w:szCs w:val="22"/>
-        </w:rPr>
-        <w:lastRenderedPageBreak/>
-        <w:t xml:space="preserve">target holds up to about 60 event wakes per day (Fig. 2). </w:t>
-      </w:r>
-      <w:r>
-        <w:rPr>
-          <w:i/>
-          <w:iCs/>
-          <w:sz w:val="22"/>
-          <w:szCs w:val="22"/>
-        </w:rPr>
-        <w:t>Hub:</w:t>
-      </w:r>
-      <w:r>
-        <w:rPr>
-          <w:sz w:val="22"/>
-          <w:szCs w:val="22"/>
-        </w:rPr>
-        <w:t xml:space="preserve"> it draws about 0.5 W, well within the ≈45 Wh/day of the 15 W panel.</w:t>
-      </w:r>
-    </w:p>
-    <w:p>
-      <w:pPr>
-        <w:keepNext/>
-        <w:spacing w:before="40" w:after="0" w:line="240" w:lineRule="auto"/>
-        <w:jc w:val="center"/>
-        <w:rPr>
-          <w:sz w:val="22"/>
-          <w:szCs w:val="22"/>
-        </w:rPr>
-      </w:pPr>
-      <w:r>
-        <w:rPr>
-          <w:noProof/>
-          <w:sz w:val="22"/>
-          <w:szCs w:val="22"/>
-        </w:rPr>
-        <w:drawing>
-          <wp:inline distT="0" distB="0" distL="114300" distR="114300" wp14:anchorId="430EDE66" wp14:editId="2C76C30D">
-            <wp:extent cx="4572000" cy="1270000"/>
-            <wp:effectExtent l="0" t="0" r="0" b="0"/>
-            <wp:docPr id="5" name="image3.png"/>
-            <wp:cNvGraphicFramePr/>
-            <a:graphic xmlns:a="http://schemas.openxmlformats.org/drawingml/2006/main">
-              <a:graphicData uri="http://schemas.openxmlformats.org/drawingml/2006/picture">
-                <pic:pic xmlns:pic="http://schemas.openxmlformats.org/drawingml/2006/picture">
-                  <pic:nvPicPr>
-                    <pic:cNvPr id="0" name="image3.png"/>
-                    <pic:cNvPicPr preferRelativeResize="0"/>
-                  </pic:nvPicPr>
-                  <pic:blipFill>
-                    <a:blip r:embed="rId17"/>
-                    <a:srcRect/>
-                    <a:stretch>
-                      <a:fillRect/>
-                    </a:stretch>
-                  </pic:blipFill>
-                  <pic:spPr>
-                    <a:xfrm>
-                      <a:off x="0" y="0"/>
-                      <a:ext cx="4572000" cy="1270000"/>
-                    </a:xfrm>
-                    <a:prstGeom prst="rect">
-                      <a:avLst/>
-                    </a:prstGeom>
-                    <a:ln/>
-                  </pic:spPr>
-                </pic:pic>
-              </a:graphicData>
-            </a:graphic>
-          </wp:inline>
-        </w:drawing>
-      </w:r>
-    </w:p>
-    <w:p>
-      <w:pPr>
-        <w:spacing w:after="60" w:line="240" w:lineRule="auto"/>
-        <w:jc w:val="center"/>
-        <w:rPr>
-          <w:sz w:val="22"/>
-          <w:szCs w:val="22"/>
-        </w:rPr>
-      </w:pPr>
-      <w:r>
-        <w:rPr>
-          <w:sz w:val="18"/>
-          <w:szCs w:val="18"/>
-        </w:rPr>
-        <w:t>Fig. 2.  Estimated node battery life (one 18650 cell) vs. event wake-ups per day by (3) (datasheet-level estimates, to be measured).</w:t>
+          <w:rtl w:val="0"/>
+        </w:rPr>
+        <w:t xml:space="preserve">0</w:t>
+      </w:r>
+      <w:r>
+        <w:rPr>
+          <w:b w:val="0"/>
+          <w:bCs w:val="0"/>
+          <w:i w:val="0"/>
+          <w:iCs w:val="0"/>
+          <w:sz w:val="22"/>
+          <w:szCs w:val="22"/>
+          <w:rtl w:val="0"/>
+        </w:rPr>
+        <w:t xml:space="preserve"> ≈ 22 µA always-on (wake circuit, chip sleep, LDO, leakage). With </w:t>
+      </w:r>
+      <w:r>
+        <w:rPr>
+          <w:b w:val="0"/>
+          <w:bCs w:val="0"/>
+          <w:i w:val="1"/>
+          <w:iCs w:val="1"/>
+          <w:sz w:val="22"/>
+          <w:szCs w:val="22"/>
+          <w:rtl w:val="0"/>
+        </w:rPr>
+        <w:t xml:space="preserve">A</w:t>
+      </w:r>
+      <w:r>
+        <w:rPr>
+          <w:b w:val="0"/>
+          <w:bCs w:val="0"/>
+          <w:i w:val="0"/>
+          <w:iCs w:val="0"/>
+          <w:sz w:val="22"/>
+          <w:szCs w:val="22"/>
+          <w:rtl w:val="0"/>
+        </w:rPr>
+        <w:t xml:space="preserve"> = 96, </w:t>
+      </w:r>
+      <w:r>
+        <w:rPr>
+          <w:b w:val="0"/>
+          <w:bCs w:val="0"/>
+          <w:i w:val="1"/>
+          <w:iCs w:val="1"/>
+          <w:sz w:val="22"/>
+          <w:szCs w:val="22"/>
+          <w:rtl w:val="0"/>
+        </w:rPr>
+        <w:t xml:space="preserve">Ī</w:t>
+      </w:r>
+      <w:r>
+        <w:rPr>
+          <w:b w:val="0"/>
+          <w:bCs w:val="0"/>
+          <w:i w:val="0"/>
+          <w:iCs w:val="0"/>
+          <w:sz w:val="22"/>
+          <w:szCs w:val="22"/>
+          <w:rtl w:val="0"/>
+        </w:rPr>
+        <w:t xml:space="preserve"> ≈ 0.36 mA, and 2400 mAh usable (</w:t>
+      </w:r>
+      <w:r>
+        <w:rPr>
+          <w:b w:val="0"/>
+          <w:bCs w:val="0"/>
+          <w:i w:val="1"/>
+          <w:iCs w:val="1"/>
+          <w:sz w:val="22"/>
+          <w:szCs w:val="22"/>
+          <w:rtl w:val="0"/>
+        </w:rPr>
+        <w:t xml:space="preserve">η</w:t>
+      </w:r>
+      <w:r>
+        <w:rPr>
+          <w:b w:val="0"/>
+          <w:bCs w:val="0"/>
+          <w:i w:val="0"/>
+          <w:iCs w:val="0"/>
+          <w:sz w:val="22"/>
+          <w:szCs w:val="22"/>
+          <w:rtl w:val="0"/>
+        </w:rPr>
+        <w:t xml:space="preserve"> = 0.8 of 3000 mAh) lasts ≈280 days; six months with a 20% margin holds up to ≈30 event wakes per day. </w:t>
+      </w:r>
+      <w:r>
+        <w:rPr>
+          <w:b w:val="0"/>
+          <w:bCs w:val="0"/>
+          <w:i w:val="1"/>
+          <w:iCs w:val="1"/>
+          <w:sz w:val="22"/>
+          <w:szCs w:val="22"/>
+          <w:rtl w:val="0"/>
+        </w:rPr>
+        <w:t xml:space="preserve">Q</w:t>
+      </w:r>
+      <w:r>
+        <w:rPr>
+          <w:b w:val="0"/>
+          <w:bCs w:val="0"/>
+          <w:i w:val="0"/>
+          <w:iCs w:val="0"/>
+          <w:sz w:val="22"/>
+          <w:szCs w:val="22"/>
+          <w:rtl w:val="0"/>
+        </w:rPr>
+        <w:t xml:space="preserve"> and </w:t>
+      </w:r>
+      <w:r>
+        <w:rPr>
+          <w:b w:val="0"/>
+          <w:bCs w:val="0"/>
+          <w:i w:val="1"/>
+          <w:iCs w:val="1"/>
+          <w:sz w:val="22"/>
+          <w:szCs w:val="22"/>
+          <w:rtl w:val="0"/>
+        </w:rPr>
+        <w:t xml:space="preserve">I</w:t>
+      </w:r>
+      <w:r>
+        <w:rPr>
+          <w:b w:val="0"/>
+          <w:bCs w:val="0"/>
+          <w:i w:val="1"/>
+          <w:iCs w:val="1"/>
+          <w:sz w:val="22"/>
+          <w:szCs w:val="22"/>
+          <w:vertAlign w:val="subscript"/>
+          <w:rtl w:val="0"/>
+        </w:rPr>
+        <w:t xml:space="preserve">0</w:t>
+      </w:r>
+      <w:r>
+        <w:rPr>
+          <w:b w:val="0"/>
+          <w:bCs w:val="0"/>
+          <w:i w:val="0"/>
+          <w:iCs w:val="0"/>
+          <w:sz w:val="22"/>
+          <w:szCs w:val="22"/>
+          <w:rtl w:val="0"/>
+        </w:rPr>
+        <w:t xml:space="preserve"> are then measured over complete cycles, including regulator losses, LEDs and retries. </w:t>
+      </w:r>
+      <w:r>
+        <w:rPr>
+          <w:b w:val="0"/>
+          <w:bCs w:val="0"/>
+          <w:i w:val="1"/>
+          <w:iCs w:val="1"/>
+          <w:sz w:val="22"/>
+          <w:szCs w:val="22"/>
+          <w:rtl w:val="0"/>
+        </w:rPr>
+        <w:t xml:space="preserve">Hub:</w:t>
+      </w:r>
+      <w:r>
+        <w:rPr>
+          <w:b w:val="0"/>
+          <w:bCs w:val="0"/>
+          <w:i w:val="0"/>
+          <w:iCs w:val="0"/>
+          <w:sz w:val="22"/>
+          <w:szCs w:val="22"/>
+          <w:rtl w:val="0"/>
+        </w:rPr>
+        <w:t xml:space="preserve"> ≈0.5 W (≈12 Wh/day) against ≈45 Wh/day from the panel, assuming 5 peak-sun hours and 60% conversion; three 18650 cells give about two days without sun, checked by logging the hub battery. Per hive (10 per hub) BeeSense draws ≈50 mW vs. ≈4.2 W in [6], mainly due to intermittent rather than continuous acquisition.</w:t>
       </w:r>
     </w:p>
     <w:p>
@@ -3530,10 +3993,13 @@
         <w:rPr>
           <w:b/>
           <w:bCs/>
-          <w:sz w:val="22"/>
-          <w:szCs w:val="22"/>
-        </w:rPr>
-        <w:t>3.3 Evaluation Plan</w:t>
+          <w:i w:val="0"/>
+          <w:iCs w:val="0"/>
+          <w:sz w:val="22"/>
+          <w:szCs w:val="22"/>
+          <w:rtl w:val="0"/>
+        </w:rPr>
+        <w:t xml:space="preserve">3.4 Evaluation Plan</w:t>
       </w:r>
     </w:p>
     <w:p>
@@ -3547,67 +4013,195 @@
       </w:pPr>
       <w:r>
         <w:rPr>
-          <w:i/>
-          <w:iCs/>
-          <w:sz w:val="22"/>
-          <w:szCs w:val="22"/>
-        </w:rPr>
-        <w:t>Lab:</w:t>
-      </w:r>
-      <w:r>
-        <w:rPr>
-          <w:sz w:val="22"/>
-          <w:szCs w:val="22"/>
-        </w:rPr>
-        <w:t xml:space="preserve"> weighing with reference masses and a temperature sweep; piezo and wake circuit with known tones and bursts on a frame; average current with a power analyzer. </w:t>
-      </w:r>
-      <w:r>
-        <w:rPr>
-          <w:i/>
-          <w:iCs/>
-          <w:sz w:val="22"/>
-          <w:szCs w:val="22"/>
-        </w:rPr>
-        <w:t>Field:</w:t>
-      </w:r>
-      <w:r>
-        <w:rPr>
-          <w:sz w:val="22"/>
-          <w:szCs w:val="22"/>
-        </w:rPr>
-        <w:t xml:space="preserve"> 3–5 instrumented hives and one empty control platform at the cooperating apiary, Zippory Honey, through the spring swarming season, starting with a night-time recording that compares the hive signal with the circuit noise. Ground truth comes from weekly inspections (queen cells, brood, queen presence) and the beekeeper's reports. A swarm is labeled by an observed departure or by capped queen cells; an alert is a true positive if it precedes the swarm, giving precision </w:t>
-      </w:r>
-      <w:r>
-        <w:rPr>
-          <w:i/>
-          <w:iCs/>
-          <w:sz w:val="22"/>
-          <w:szCs w:val="22"/>
-        </w:rPr>
-        <w:t>P</w:t>
-      </w:r>
-      <w:r>
-        <w:rPr>
-          <w:sz w:val="22"/>
-          <w:szCs w:val="22"/>
+          <w:b w:val="0"/>
+          <w:bCs w:val="0"/>
+          <w:i w:val="1"/>
+          <w:iCs w:val="1"/>
+          <w:sz w:val="22"/>
+          <w:szCs w:val="22"/>
+          <w:rtl w:val="0"/>
+        </w:rPr>
+        <w:t xml:space="preserve">Stages:</w:t>
+      </w:r>
+      <w:r>
+        <w:rPr>
+          <w:b w:val="0"/>
+          <w:bCs w:val="0"/>
+          <w:i w:val="0"/>
+          <w:iCs w:val="0"/>
+          <w:sz w:val="22"/>
+          <w:szCs w:val="22"/>
+          <w:rtl w:val="0"/>
+        </w:rPr>
+        <w:t xml:space="preserve"> bench characterization; a short real-hive pilot to fix mounting, features, thresholds and logging; then the system is frozen and prospective data are collected on 3–5 hives at Zippory Honey through spring. </w:t>
+      </w:r>
+      <w:r>
+        <w:rPr>
+          <w:b w:val="0"/>
+          <w:bCs w:val="0"/>
+          <w:i w:val="1"/>
+          <w:iCs w:val="1"/>
+          <w:sz w:val="22"/>
+          <w:szCs w:val="22"/>
+          <w:rtl w:val="0"/>
+        </w:rPr>
+        <w:t xml:space="preserve">Labels:</w:t>
+      </w:r>
+      <w:r>
+        <w:rPr>
+          <w:b w:val="0"/>
+          <w:bCs w:val="0"/>
+          <w:i w:val="0"/>
+          <w:iCs w:val="0"/>
+          <w:sz w:val="22"/>
+          <w:szCs w:val="22"/>
+          <w:rtl w:val="0"/>
+        </w:rPr>
+        <w:t xml:space="preserve"> a field log records hive, inspection times, queen cells, observed departures, interventions, feeding and equipment changes, with uncertainty. Preparation (queen cells) and departure are separate labels; a departure is confirmed only by entrance video or documented observation, with an interval when the time is inexact. Colonies where the beekeeper prevents swarming are reported as </w:t>
+      </w:r>
+      <w:r>
+        <w:rPr>
+          <w:b w:val="0"/>
+          <w:bCs w:val="0"/>
+          <w:i w:val="1"/>
+          <w:iCs w:val="1"/>
+          <w:sz w:val="22"/>
+          <w:szCs w:val="22"/>
+          <w:rtl w:val="0"/>
+        </w:rPr>
+        <w:t xml:space="preserve">intervened</w:t>
+      </w:r>
+      <w:r>
+        <w:rPr>
+          <w:b w:val="0"/>
+          <w:bCs w:val="0"/>
+          <w:i w:val="0"/>
+          <w:iCs w:val="0"/>
+          <w:sz w:val="22"/>
+          <w:szCs w:val="22"/>
+          <w:rtl w:val="0"/>
+        </w:rPr>
+        <w:t xml:space="preserve">, not as false alarms. Controlled mass removal validates the weight-step response only. </w:t>
+      </w:r>
+      <w:r>
+        <w:rPr>
+          <w:b w:val="0"/>
+          <w:bCs w:val="0"/>
+          <w:i w:val="1"/>
+          <w:iCs w:val="1"/>
+          <w:sz w:val="22"/>
+          <w:szCs w:val="22"/>
+          <w:rtl w:val="0"/>
+        </w:rPr>
+        <w:t xml:space="preserve">Matching:</w:t>
+      </w:r>
+      <w:r>
+        <w:rPr>
+          <w:b w:val="0"/>
+          <w:bCs w:val="0"/>
+          <w:i w:val="0"/>
+          <w:iCs w:val="0"/>
+          <w:sz w:val="22"/>
+          <w:szCs w:val="22"/>
+          <w:rtl w:val="0"/>
+        </w:rPr>
+        <w:t xml:space="preserve"> the warning window (minimum actionable lead time to maximum horizon, e.g., 30 min–48 h) is agreed with the beekeeper and frozen before final testing. An episode inside the window of a confirmed departure is a TP, an unmatched eligible episode an FP, and an eligible departure without a valid warning an FN, matched one-to-one; precision </w:t>
+      </w:r>
+      <w:r>
+        <w:rPr>
+          <w:b w:val="0"/>
+          <w:bCs w:val="0"/>
+          <w:i w:val="1"/>
+          <w:iCs w:val="1"/>
+          <w:sz w:val="22"/>
+          <w:szCs w:val="22"/>
+          <w:rtl w:val="0"/>
+        </w:rPr>
+        <w:t xml:space="preserve">P</w:t>
+      </w:r>
+      <w:r>
+        <w:rPr>
+          <w:b w:val="0"/>
+          <w:bCs w:val="0"/>
+          <w:i w:val="0"/>
+          <w:iCs w:val="0"/>
+          <w:sz w:val="22"/>
+          <w:szCs w:val="22"/>
+          <w:rtl w:val="0"/>
         </w:rPr>
         <w:t xml:space="preserve"> = TP/(TP+FP) and recall </w:t>
       </w:r>
       <w:r>
         <w:rPr>
-          <w:i/>
-          <w:iCs/>
-          <w:sz w:val="22"/>
-          <w:szCs w:val="22"/>
-        </w:rPr>
-        <w:t>R</w:t>
-      </w:r>
-      <w:r>
-        <w:rPr>
-          <w:sz w:val="22"/>
-          <w:szCs w:val="22"/>
-        </w:rPr>
-        <w:t xml:space="preserve"> = TP/(TP+FN), with the lead time reported. The departure rule is also tested by removing known masses (0.5–2 kg). Thresholds are tuned in the first weeks, and the targets in Table I are frozen before the field evaluation.</w:t>
+          <w:b w:val="0"/>
+          <w:bCs w:val="0"/>
+          <w:i w:val="1"/>
+          <w:iCs w:val="1"/>
+          <w:sz w:val="22"/>
+          <w:szCs w:val="22"/>
+          <w:rtl w:val="0"/>
+        </w:rPr>
+        <w:t xml:space="preserve">R</w:t>
+      </w:r>
+      <w:r>
+        <w:rPr>
+          <w:b w:val="0"/>
+          <w:bCs w:val="0"/>
+          <w:i w:val="0"/>
+          <w:iCs w:val="0"/>
+          <w:sz w:val="22"/>
+          <w:szCs w:val="22"/>
+          <w:rtl w:val="0"/>
+        </w:rPr>
+        <w:t xml:space="preserve"> = TP/(TP+FN). Outages and periods without reliable labels are not eligible, and total coverage is reported. </w:t>
+      </w:r>
+      <w:r>
+        <w:rPr>
+          <w:b w:val="0"/>
+          <w:bCs w:val="0"/>
+          <w:i w:val="1"/>
+          <w:iCs w:val="1"/>
+          <w:sz w:val="22"/>
+          <w:szCs w:val="22"/>
+          <w:rtl w:val="0"/>
+        </w:rPr>
+        <w:t xml:space="preserve">Evidence:</w:t>
+      </w:r>
+      <w:r>
+        <w:rPr>
+          <w:b w:val="0"/>
+          <w:bCs w:val="0"/>
+          <w:i w:val="0"/>
+          <w:iCs w:val="0"/>
+          <w:sz w:val="22"/>
+          <w:szCs w:val="22"/>
+          <w:rtl w:val="0"/>
+        </w:rPr>
+        <w:t xml:space="preserve"> results list hives, confirmed events, episodes and hive-days. With few events uncertainty is large: detecting 5 of 5 departures gives a one-sided 95% lower bound on recall of ≈55%, so the study may conclude that too few events occurred. </w:t>
+      </w:r>
+      <w:r>
+        <w:rPr>
+          <w:b w:val="0"/>
+          <w:bCs w:val="0"/>
+          <w:i w:val="1"/>
+          <w:iCs w:val="1"/>
+          <w:sz w:val="22"/>
+          <w:szCs w:val="22"/>
+          <w:rtl w:val="0"/>
+        </w:rPr>
+        <w:t xml:space="preserve">Baselines:</w:t>
+      </w:r>
+      <w:r>
+        <w:rPr>
+          <w:b w:val="0"/>
+          <w:bCs w:val="0"/>
+          <w:i w:val="0"/>
+          <w:iCs w:val="0"/>
+          <w:sz w:val="22"/>
+          <w:szCs w:val="22"/>
+          <w:rtl w:val="0"/>
+        </w:rPr>
+        <w:t xml:space="preserve"> weight-only, vibration/audio-only and fused rules, and scheduled-only vs. scheduled + event acquisition, on the same events; later periods of the same hives are reported separately from held-out hives.</w:t>
       </w:r>
     </w:p>
     <w:p>
@@ -3832,25 +4426,6 @@
     </w:p>
     <w:p>
       <w:pPr>
-        <w:keepNext/>
-        <w:spacing w:before="120" w:after="80" w:line="360" w:lineRule="auto"/>
-        <w:rPr>
-          <w:sz w:val="22"/>
-          <w:szCs w:val="22"/>
-        </w:rPr>
-      </w:pPr>
-      <w:r>
-        <w:rPr>
-          <w:b/>
-          <w:bCs/>
-          <w:sz w:val="20"/>
-          <w:szCs w:val="20"/>
-        </w:rPr>
-        <w:t>Existing hive-monitoring systems</w:t>
-      </w:r>
-    </w:p>
-    <w:p>
-      <w:pPr>
         <w:tabs>
           <w:tab w:val="left" w:pos="510"/>
         </w:tabs>
@@ -3864,10 +4439,15 @@
       </w:pPr>
       <w:r>
         <w:rPr>
+          <w:b w:val="0"/>
+          <w:bCs w:val="0"/>
+          <w:i w:val="0"/>
+          <w:iCs w:val="0"/>
           <w:sz w:val="20"/>
           <w:szCs w:val="20"/>
-        </w:rPr>
-        <w:t>[5]</w:t>
+          <w:rtl w:val="0"/>
+        </w:rPr>
+        <w:t xml:space="preserve">[5]</w:t>
       </w:r>
       <w:r>
         <w:rPr>
@@ -3875,23 +4455,61 @@
           <w:szCs w:val="20"/>
         </w:rPr>
         <w:tab/>
-        <w:t xml:space="preserve">S. Cecchi, S. Spinsante, A. Terenzi, and S. Orcioni, "A smart sensor-based measurement system for advanced bee hive monitoring," </w:t>
-      </w:r>
-      <w:r>
-        <w:rPr>
-          <w:i/>
-          <w:iCs/>
+      </w:r>
+      <w:r>
+        <w:rPr>
+          <w:b w:val="0"/>
+          <w:bCs w:val="0"/>
+          <w:i w:val="0"/>
+          <w:iCs w:val="0"/>
           <w:sz w:val="20"/>
           <w:szCs w:val="20"/>
-        </w:rPr>
-        <w:t>Sensors</w:t>
-      </w:r>
-      <w:r>
-        <w:rPr>
+          <w:rtl w:val="0"/>
+        </w:rPr>
+        <w:t xml:space="preserve">K. Iqbal, B. Alabdullah, N. Al Mudawi, A. Algarni, A. Jalal, and J. Park, "Empirical analysis of honeybees acoustics as biosensors signals for swarm prediction in beehives," </w:t>
+      </w:r>
+      <w:r>
+        <w:rPr>
+          <w:b w:val="0"/>
+          <w:bCs w:val="0"/>
+          <w:i w:val="1"/>
+          <w:iCs w:val="1"/>
           <w:sz w:val="20"/>
           <w:szCs w:val="20"/>
-        </w:rPr>
-        <w:t>, vol. 20, no. 9, Art. no. 2726, May 2020, doi: 10.3390/s20092726.</w:t>
+          <w:rtl w:val="0"/>
+        </w:rPr>
+        <w:t xml:space="preserve">IEEE Access</w:t>
+      </w:r>
+      <w:r>
+        <w:rPr>
+          <w:b w:val="0"/>
+          <w:bCs w:val="0"/>
+          <w:i w:val="0"/>
+          <w:iCs w:val="0"/>
+          <w:sz w:val="20"/>
+          <w:szCs w:val="20"/>
+          <w:rtl w:val="0"/>
+        </w:rPr>
+        <w:t xml:space="preserve">, vol. 12, pp. 148405–148421, 2024, doi: 10.1109/ACCESS.2024.3471895.</w:t>
+      </w:r>
+    </w:p>
+    <w:p>
+      <w:pPr>
+        <w:keepNext/>
+        <w:spacing w:before="120" w:after="80" w:line="360" w:lineRule="auto"/>
+        <w:rPr>
+          <w:sz w:val="22"/>
+          <w:szCs w:val="22"/>
+        </w:rPr>
+      </w:pPr>
+      <w:r>
+        <w:rPr>
+          <w:b/>
+          <w:bCs/>
+          <w:sz w:val="20"/>
+          <w:szCs w:val="20"/>
+        </w:rPr>
+        <w:t>Existing hive-monitoring systems</w:t>
       </w:r>
     </w:p>
     <w:p>
@@ -3920,26 +4538,23 @@
           <w:szCs w:val="20"/>
         </w:rPr>
         <w:tab/>
-        <w:t>BeeHero, "Technology." [Online]. Available: https://www.beehero.io/technology</w:t>
-      </w:r>
-    </w:p>
-    <w:p>
-      <w:pPr>
-        <w:keepNext/>
-        <w:spacing w:before="120" w:after="80" w:line="360" w:lineRule="auto"/>
-        <w:rPr>
-          <w:sz w:val="22"/>
-          <w:szCs w:val="22"/>
-        </w:rPr>
-      </w:pPr>
-      <w:r>
-        <w:rPr>
-          <w:b/>
-          <w:bCs/>
+        <w:t xml:space="preserve">S. Cecchi, S. Spinsante, A. Terenzi, and S. Orcioni, "A smart sensor-based measurement system for advanced bee hive monitoring," </w:t>
+      </w:r>
+      <w:r>
+        <w:rPr>
+          <w:i/>
+          <w:iCs/>
           <w:sz w:val="20"/>
           <w:szCs w:val="20"/>
         </w:rPr>
-        <w:t>Design data: signal levels, communication and components</w:t>
+        <w:t>Sensors</w:t>
+      </w:r>
+      <w:r>
+        <w:rPr>
+          <w:sz w:val="20"/>
+          <w:szCs w:val="20"/>
+        </w:rPr>
+        <w:t>, vol. 20, no. 9, Art. no. 2726, May 2020, doi: 10.3390/s20092726.</w:t>
       </w:r>
     </w:p>
     <w:p>
@@ -3968,23 +4583,26 @@
           <w:szCs w:val="20"/>
         </w:rPr>
         <w:tab/>
-        <w:t xml:space="preserve">M. Bencsik, Y. Le Conte, M. Reyes, M. Pioz, D. Whittaker, D. Crauser, N. Simon Delso, and M. I. Newton, "Honeybee colony vibrational measurements to highlight the brood cycle," </w:t>
-      </w:r>
-      <w:r>
-        <w:rPr>
-          <w:i/>
-          <w:iCs/>
+        <w:t>BeeHero, "Technology." [Online]. Available: https://www.beehero.io/technology</w:t>
+      </w:r>
+    </w:p>
+    <w:p>
+      <w:pPr>
+        <w:keepNext/>
+        <w:spacing w:before="120" w:after="80" w:line="360" w:lineRule="auto"/>
+        <w:rPr>
+          <w:sz w:val="22"/>
+          <w:szCs w:val="22"/>
+        </w:rPr>
+      </w:pPr>
+      <w:r>
+        <w:rPr>
+          <w:b/>
+          <w:bCs/>
           <w:sz w:val="20"/>
           <w:szCs w:val="20"/>
         </w:rPr>
-        <w:t>PLoS ONE</w:t>
-      </w:r>
-      <w:r>
-        <w:rPr>
-          <w:sz w:val="20"/>
-          <w:szCs w:val="20"/>
-        </w:rPr>
-        <w:t>, vol. 10, no. 11, Art. no. e0141926, Nov. 2015, doi: 10.1371/journal.pone.0141926.</w:t>
+        <w:t>Design data: signal levels, communication and components</w:t>
       </w:r>
     </w:p>
     <w:p>
@@ -4013,7 +4631,7 @@
           <w:szCs w:val="20"/>
         </w:rPr>
         <w:tab/>
-        <w:t xml:space="preserve">Espressif Systems, "ESP-NOW," in </w:t>
+        <w:t xml:space="preserve">M. Bencsik, Y. Le Conte, M. Reyes, M. Pioz, D. Whittaker, D. Crauser, N. Simon Delso, and M. I. Newton, "Honeybee colony vibrational measurements to highlight the brood cycle," </w:t>
       </w:r>
       <w:r>
         <w:rPr>
@@ -4022,14 +4640,14 @@
           <w:sz w:val="20"/>
           <w:szCs w:val="20"/>
         </w:rPr>
-        <w:t>ESP-IDF Programming Guide (ESP32-C3), v5.3.2</w:t>
+        <w:t>PLoS ONE</w:t>
       </w:r>
       <w:r>
         <w:rPr>
           <w:sz w:val="20"/>
           <w:szCs w:val="20"/>
         </w:rPr>
-        <w:t>. [Online]. Available: https://docs.espressif.com/projects/esp-idf/en/v5.3.2/esp32c3/api-reference/network/esp_now.html</w:t>
+        <w:t>, vol. 10, no. 11, Art. no. e0141926, Nov. 2015, doi: 10.1371/journal.pone.0141926.</w:t>
       </w:r>
     </w:p>
     <w:p>
@@ -4058,7 +4676,23 @@
           <w:szCs w:val="20"/>
         </w:rPr>
         <w:tab/>
-        <w:t>Avia Semiconductor, "HX711: 24-bit analog-to-digital converter (ADC) for weigh scales," datasheet.</w:t>
+        <w:t xml:space="preserve">Espressif Systems, "ESP-NOW," in </w:t>
+      </w:r>
+      <w:r>
+        <w:rPr>
+          <w:i/>
+          <w:iCs/>
+          <w:sz w:val="20"/>
+          <w:szCs w:val="20"/>
+        </w:rPr>
+        <w:t>ESP-IDF Programming Guide (ESP32-C3), v5.3.2</w:t>
+      </w:r>
+      <w:r>
+        <w:rPr>
+          <w:sz w:val="20"/>
+          <w:szCs w:val="20"/>
+        </w:rPr>
+        <w:t>. [Online]. Available: https://docs.espressif.com/projects/esp-idf/en/v5.3.2/esp32c3/api-reference/network/esp_now.html</w:t>
       </w:r>
     </w:p>
     <w:p>
@@ -4080,6 +4714,35 @@
           <w:szCs w:val="20"/>
         </w:rPr>
         <w:t>[10]</w:t>
+      </w:r>
+      <w:r>
+        <w:rPr>
+          <w:sz w:val="20"/>
+          <w:szCs w:val="20"/>
+        </w:rPr>
+        <w:tab/>
+        <w:t>Avia Semiconductor, "HX711: 24-bit analog-to-digital converter (ADC) for weigh scales," datasheet.</w:t>
+      </w:r>
+    </w:p>
+    <w:p>
+      <w:pPr>
+        <w:tabs>
+          <w:tab w:val="left" w:pos="510"/>
+        </w:tabs>
+        <w:spacing w:after="80" w:line="360" w:lineRule="auto"/>
+        <w:ind w:left="510" w:hanging="510"/>
+        <w:jc w:val="both"/>
+        <w:rPr>
+          <w:sz w:val="22"/>
+          <w:szCs w:val="22"/>
+        </w:rPr>
+      </w:pPr>
+      <w:r>
+        <w:rPr>
+          <w:sz w:val="20"/>
+          <w:szCs w:val="20"/>
+        </w:rPr>
+        <w:t>[11]</w:t>
       </w:r>
       <w:r>
         <w:rPr>

</xml_diff>

<commit_message>
vault backup: 2026-10-31 21:24:52
Affected files:
.obsidian/plugins/word-reader/data.json
docs/pdr-2027-165.docx
docs/~WRL0005.tmp
</commit_message>
<xml_diff>
--- a/docs/pdr-2027-165.docx
+++ b/docs/pdr-2027-165.docx
@@ -659,13 +659,9 @@
       </w:pPr>
       <w:r>
         <w:rPr>
-          <w:b w:val="0"/>
-          <w:bCs w:val="0"/>
-          <w:i/>
-          <w:iCs w:val="0"/>
-          <w:rtl w:val="0"/>
-        </w:rPr>
-        <w:t xml:space="preserve">drorbe@post.bgu.ac.il, dancoop@post.bgu.ac.il</w:t>
+          <w:i/>
+        </w:rPr>
+        <w:t>drorbe@post.bgu.ac.il, dancoop@post.bgu.ac.il</w:t>
       </w:r>
     </w:p>
     <w:p>
@@ -721,159 +717,144 @@
       </w:pPr>
       <w:r>
         <w:rPr>
-          <w:b w:val="0"/>
-          <w:bCs w:val="0"/>
-          <w:i w:val="0"/>
-          <w:iCs w:val="0"/>
-          <w:sz w:val="22"/>
-          <w:szCs w:val="22"/>
-          <w:rtl w:val="1"/>
+          <w:sz w:val="22"/>
+          <w:szCs w:val="22"/>
+          <w:rtl/>
         </w:rPr>
         <w:t xml:space="preserve">בי-סנס הוא אב-טיפוס אוטונומי לניטור מושבות דבורי דבש במכוורות ללא חשמל וללא </w:t>
       </w:r>
       <w:r>
         <w:rPr>
-          <w:b w:val="0"/>
-          <w:bCs w:val="0"/>
-          <w:i w:val="0"/>
-          <w:iCs w:val="0"/>
-          <w:sz w:val="22"/>
-          <w:szCs w:val="22"/>
-          <w:rtl w:val="0"/>
-        </w:rPr>
-        <w:t xml:space="preserve">Wi-Fi</w:t>
-      </w:r>
-      <w:r>
-        <w:rPr>
-          <w:b w:val="0"/>
-          <w:bCs w:val="0"/>
-          <w:i w:val="0"/>
-          <w:iCs w:val="0"/>
-          <w:sz w:val="22"/>
-          <w:szCs w:val="22"/>
-          <w:rtl w:val="1"/>
-        </w:rPr>
-        <w:t xml:space="preserve">. צמתים סוללתיים בכוורות אוספים מדידות רטט וקול, מתוזמנות ומונעות-אירועים, יחד עם משקל וטמפרטורה. עיבוד משובץ מחלץ מאפיינים ספקטרליים, הנשלחים למרכזייה סולארית עם חיבור סלולרי ומוצגים בממשק אינטרנט (</w:t>
-      </w:r>
-      <w:r>
-        <w:rPr>
-          <w:b w:val="0"/>
-          <w:bCs w:val="0"/>
-          <w:i w:val="0"/>
-          <w:iCs w:val="0"/>
-          <w:sz w:val="22"/>
-          <w:szCs w:val="22"/>
-          <w:rtl w:val="0"/>
-        </w:rPr>
-        <w:t xml:space="preserve">Web</w:t>
-      </w:r>
-      <w:r>
-        <w:rPr>
-          <w:b w:val="0"/>
-          <w:bCs w:val="0"/>
-          <w:i w:val="0"/>
-          <w:iCs w:val="0"/>
-          <w:sz w:val="22"/>
-          <w:szCs w:val="22"/>
-          <w:rtl w:val="1"/>
-        </w:rPr>
-        <w:t xml:space="preserve">) לכל כוורת. ההערכה ההנדסית תאפיין, על השולחן ובשטח, את איכות האות, ביצועי השקילה, קליטת החבילות ברמת היישום, צריכת האנרגיה וזמינות המערכת בשטח. מחקר פרוספקטיבי על שלוש עד חמש כוורות במכוורת </w:t>
-      </w:r>
-      <w:r>
-        <w:rPr>
-          <w:b w:val="0"/>
-          <w:bCs w:val="0"/>
-          <w:i w:val="0"/>
-          <w:iCs w:val="0"/>
-          <w:sz w:val="22"/>
-          <w:szCs w:val="22"/>
-          <w:rtl w:val="0"/>
-        </w:rPr>
-        <w:t xml:space="preserve">Zippory Honey</w:t>
-      </w:r>
-      <w:r>
-        <w:rPr>
-          <w:b w:val="0"/>
-          <w:bCs w:val="0"/>
-          <w:i w:val="0"/>
-          <w:iCs w:val="0"/>
-          <w:sz w:val="22"/>
-          <w:szCs w:val="22"/>
-          <w:rtl w:val="1"/>
+          <w:sz w:val="22"/>
+          <w:szCs w:val="22"/>
+        </w:rPr>
+        <w:t>Wi-Fi</w:t>
+      </w:r>
+      <w:r>
+        <w:rPr>
+          <w:sz w:val="22"/>
+          <w:szCs w:val="22"/>
+          <w:rtl/>
+        </w:rPr>
+        <w:t xml:space="preserve">. צמתים סוללתיים בכוורות אוספים מדידות רטט וקול, מתוזמנות ומונעות-אירועים, יחד עם משקל וטמפרטורה. </w:t>
+      </w:r>
+      <w:r>
+        <w:rPr>
+          <w:sz w:val="22"/>
+          <w:szCs w:val="22"/>
+          <w:rtl/>
+        </w:rPr>
+        <w:t>הבקר בכל צומת מחשב בעצמו אילו תדרים בולטים בזמזום ושולח את התוצאות למרכזייה סולארית עם חיבור סלולרי, והן מוצגות בממשק אינטרנט</w:t>
+      </w:r>
+      <w:r>
+        <w:rPr>
+          <w:sz w:val="22"/>
+          <w:szCs w:val="22"/>
+        </w:rPr>
+        <w:t xml:space="preserve"> (Web) </w:t>
+      </w:r>
+      <w:r>
+        <w:rPr>
+          <w:sz w:val="22"/>
+          <w:szCs w:val="22"/>
+          <w:rtl/>
+        </w:rPr>
+        <w:t>לכל כוורת</w:t>
+      </w:r>
+      <w:r>
+        <w:rPr>
+          <w:sz w:val="22"/>
+          <w:szCs w:val="22"/>
+        </w:rPr>
+        <w:t>.</w:t>
+      </w:r>
+      <w:r>
+        <w:rPr>
+          <w:sz w:val="22"/>
+          <w:szCs w:val="22"/>
+          <w:rtl/>
+        </w:rPr>
+        <w:t xml:space="preserve"> ההערכה ההנדסית תאפיין את איכות האות, ביצועי השקילה, קליטת החבילות ברמת היישום, צריכת האנרגיה ו</w:t>
+      </w:r>
+      <w:r>
+        <w:rPr>
+          <w:rFonts w:hint="cs"/>
+          <w:sz w:val="22"/>
+          <w:szCs w:val="22"/>
+          <w:rtl/>
+        </w:rPr>
+        <w:t>אמינות</w:t>
+      </w:r>
+      <w:r>
+        <w:rPr>
+          <w:sz w:val="22"/>
+          <w:szCs w:val="22"/>
+          <w:rtl/>
+        </w:rPr>
+        <w:t xml:space="preserve"> המערכת בשטח. מחקר פרוספקטיבי על שלוש עד חמש כוורות במכוורת </w:t>
+      </w:r>
+      <w:r>
+        <w:rPr>
+          <w:rFonts w:hint="cs"/>
+          <w:sz w:val="22"/>
+          <w:szCs w:val="22"/>
+          <w:rtl/>
+          <w:lang w:val="en-US"/>
+        </w:rPr>
+        <w:t>"דבש פרחי ציפורי"</w:t>
+      </w:r>
+      <w:r>
+        <w:rPr>
+          <w:sz w:val="22"/>
+          <w:szCs w:val="22"/>
+          <w:rtl/>
         </w:rPr>
         <w:t xml:space="preserve">, לאורך עונת הנחילה באביב </w:t>
       </w:r>
       <w:r>
         <w:rPr>
-          <w:b w:val="0"/>
-          <w:bCs w:val="0"/>
-          <w:i w:val="0"/>
-          <w:iCs w:val="0"/>
-          <w:sz w:val="22"/>
-          <w:szCs w:val="22"/>
-          <w:rtl w:val="0"/>
-        </w:rPr>
-        <w:t xml:space="preserve">2027</w:t>
-      </w:r>
-      <w:r>
-        <w:rPr>
-          <w:b w:val="0"/>
-          <w:bCs w:val="0"/>
-          <w:i w:val="0"/>
-          <w:iCs w:val="0"/>
-          <w:sz w:val="22"/>
-          <w:szCs w:val="22"/>
-          <w:rtl w:val="1"/>
-        </w:rPr>
-        <w:t xml:space="preserve">, יבחן אם המאפיינים הנמדדים מספקים התרעה מוקדמת ושימושית על נחילות שאושרו באופן בלתי תלוי. ביצועי החיזוי ידווחו לפי כלל התאמה שנקבע מראש בין התרעות לאירועים: התרעות שווא לכוורת לשבוע, דיוק (</w:t>
-      </w:r>
-      <w:r>
-        <w:rPr>
-          <w:b w:val="0"/>
-          <w:bCs w:val="0"/>
-          <w:i w:val="0"/>
-          <w:iCs w:val="0"/>
-          <w:sz w:val="22"/>
-          <w:szCs w:val="22"/>
-          <w:rtl w:val="0"/>
-        </w:rPr>
-        <w:t xml:space="preserve">Precision</w:t>
-      </w:r>
-      <w:r>
-        <w:rPr>
-          <w:b w:val="0"/>
-          <w:bCs w:val="0"/>
-          <w:i w:val="0"/>
-          <w:iCs w:val="0"/>
-          <w:sz w:val="22"/>
-          <w:szCs w:val="22"/>
-          <w:rtl w:val="1"/>
-        </w:rPr>
-        <w:t xml:space="preserve">) ורגישות (</w:t>
-      </w:r>
-      <w:r>
-        <w:rPr>
-          <w:b w:val="0"/>
-          <w:bCs w:val="0"/>
-          <w:i w:val="0"/>
-          <w:iCs w:val="0"/>
-          <w:sz w:val="22"/>
-          <w:szCs w:val="22"/>
-          <w:rtl w:val="0"/>
-        </w:rPr>
-        <w:t xml:space="preserve">Recall</w:t>
-      </w:r>
-      <w:r>
-        <w:rPr>
-          <w:b w:val="0"/>
-          <w:bCs w:val="0"/>
-          <w:i w:val="0"/>
-          <w:iCs w:val="0"/>
-          <w:sz w:val="22"/>
-          <w:szCs w:val="22"/>
-          <w:rtl w:val="1"/>
-        </w:rPr>
-        <w:t xml:space="preserve">) ברמת האירוע וזמן ההתרעה המוקדמת, בכפוף למספר האירועים שייצפו. השוואה לחישה פשוטה יותר ולדגימה מתוזמנת בלבד תבחן את התועלת של שילוב החיישנים ושל הדגימה מונעת-האירועים. חצי שנה של פעולת צומת על סוללה היא יעד ראשוני, שיגובה בפרופילי צריכה מדודים.</w:t>
+          <w:sz w:val="22"/>
+          <w:szCs w:val="22"/>
+        </w:rPr>
+        <w:t>2027</w:t>
+      </w:r>
+      <w:r>
+        <w:rPr>
+          <w:sz w:val="22"/>
+          <w:szCs w:val="22"/>
+          <w:rtl/>
+        </w:rPr>
+        <w:t>, יבחן אם המאפיינים הנמדדים מספקים התרעה מוקדמת ושימושית על נחילות שאושרו באופן בלתי תלוי. ביצועי החיזוי ידווחו לפי כלל התאמה שנקבע מראש בין התרעות לאירועים: התרעות שווא לכוורת לשבוע, דיוק (</w:t>
+      </w:r>
+      <w:r>
+        <w:rPr>
+          <w:sz w:val="22"/>
+          <w:szCs w:val="22"/>
+        </w:rPr>
+        <w:t>Precision</w:t>
+      </w:r>
+      <w:r>
+        <w:rPr>
+          <w:sz w:val="22"/>
+          <w:szCs w:val="22"/>
+          <w:rtl/>
+        </w:rPr>
+        <w:t>) ורגישות (</w:t>
+      </w:r>
+      <w:r>
+        <w:rPr>
+          <w:sz w:val="22"/>
+          <w:szCs w:val="22"/>
+        </w:rPr>
+        <w:t>Recall</w:t>
+      </w:r>
+      <w:r>
+        <w:rPr>
+          <w:sz w:val="22"/>
+          <w:szCs w:val="22"/>
+          <w:rtl/>
+        </w:rPr>
+        <w:t>) ברמת האירוע וזמן ההתרעה המוקדמת, בכפוף למספר האירועים שייצפו. השוואה לחישה פשוטה יותר ולדגימה מתוזמנת בלבד תבחן את התועלת של שילוב החיישנים ושל הדגימה מונעת-האירועים. חצי שנה של פעולת צומת על סוללה היא יעד ראשוני, שיגובה בפרופילי צריכה מדודים.</w:t>
       </w:r>
     </w:p>
     <w:p>
@@ -888,51 +869,36 @@
       </w:pPr>
       <w:r>
         <w:rPr>
-          <w:b w:val="1"/>
-          <w:bCs w:val="1"/>
-          <w:i w:val="0"/>
-          <w:iCs w:val="0"/>
-          <w:sz w:val="22"/>
-          <w:szCs w:val="22"/>
-          <w:rtl w:val="1"/>
-        </w:rPr>
-        <w:t xml:space="preserve">מילות מפתח:</w:t>
-      </w:r>
-      <w:r>
-        <w:rPr>
-          <w:b w:val="0"/>
-          <w:bCs w:val="0"/>
-          <w:i w:val="0"/>
-          <w:iCs w:val="0"/>
-          <w:sz w:val="22"/>
-          <w:szCs w:val="22"/>
-          <w:rtl w:val="1"/>
+          <w:b/>
+          <w:bCs/>
+          <w:sz w:val="22"/>
+          <w:szCs w:val="22"/>
+          <w:rtl/>
+        </w:rPr>
+        <w:t>מילות מפתח:</w:t>
+      </w:r>
+      <w:r>
+        <w:rPr>
+          <w:sz w:val="22"/>
+          <w:szCs w:val="22"/>
+          <w:rtl/>
         </w:rPr>
         <w:t xml:space="preserve"> האינטרנט של הדברים, ניטור כוורות, דבורת הדבש, חיזוי נחילה, חיישן פיאזואלקטרי, דגימה מונעת-אירועים, עיבוד אותות, תאי עומס, מערכות משובצות בהספק נמוך, </w:t>
       </w:r>
       <w:r>
         <w:rPr>
-          <w:b w:val="0"/>
-          <w:bCs w:val="0"/>
-          <w:i w:val="0"/>
-          <w:iCs w:val="0"/>
-          <w:sz w:val="22"/>
-          <w:szCs w:val="22"/>
-          <w:rtl w:val="0"/>
-        </w:rPr>
-        <w:t xml:space="preserve">ESP-NOW</w:t>
-      </w:r>
-      <w:r>
-        <w:rPr>
-          <w:b w:val="0"/>
-          <w:bCs w:val="0"/>
-          <w:i w:val="0"/>
-          <w:iCs w:val="0"/>
-          <w:sz w:val="22"/>
-          <w:szCs w:val="22"/>
-          <w:rtl w:val="1"/>
-        </w:rPr>
-        <w:t xml:space="preserve">.</w:t>
+          <w:sz w:val="22"/>
+          <w:szCs w:val="22"/>
+        </w:rPr>
+        <w:t>ESP-NOW</w:t>
+      </w:r>
+      <w:r>
+        <w:rPr>
+          <w:sz w:val="22"/>
+          <w:szCs w:val="22"/>
+          <w:rtl/>
+        </w:rPr>
+        <w:t>.</w:t>
       </w:r>
     </w:p>
     <w:p>
@@ -984,13 +950,9 @@
       </w:pPr>
       <w:r>
         <w:rPr>
-          <w:b w:val="0"/>
-          <w:bCs w:val="0"/>
-          <w:i/>
-          <w:iCs w:val="0"/>
-          <w:rtl w:val="0"/>
-        </w:rPr>
-        <w:t xml:space="preserve">drorbe@post.bgu.ac.il, dancoop@post.bgu.ac.il</w:t>
+          <w:i/>
+        </w:rPr>
+        <w:t>drorbe@post.bgu.ac.il, dancoop@post.bgu.ac.il</w:t>
       </w:r>
     </w:p>
     <w:p>
@@ -1014,14 +976,7 @@
           <w:sz w:val="22"/>
           <w:szCs w:val="22"/>
         </w:rPr>
-        <w:t xml:space="preserve"> </w:t>
-      </w:r>
-      <w:r>
-        <w:rPr>
-          <w:sz w:val="22"/>
-          <w:szCs w:val="22"/>
-        </w:rPr>
-        <w:t>Vilenchik</w:t>
+        <w:t xml:space="preserve"> Vilenchik</w:t>
       </w:r>
     </w:p>
     <w:p>
@@ -1054,15 +1009,24 @@
       </w:pPr>
       <w:r>
         <w:rPr>
-          <w:b w:val="0"/>
-          <w:bCs w:val="0"/>
-          <w:i w:val="0"/>
-          <w:iCs w:val="0"/>
-          <w:sz w:val="22"/>
-          <w:szCs w:val="22"/>
-          <w:rtl w:val="0"/>
-        </w:rPr>
-        <w:t xml:space="preserve">BeeSense is an autonomous monitoring prototype for honeybee colonies at apiaries without mains power or Wi-Fi. Battery-powered hive nodes collect scheduled and event-triggered vibration and acoustic measurements together with weight and temperature. Embedded processing extracts spectral features, which are transmitted to a solar-powered cellular gateway and displayed on a per-hive dashboard. The engineering evaluation will characterize signal quality, weighing performance, application-level packet delivery, energy consumption, and field availability. A prospective study on three to five hives at the Zippory Honey apiary will investigate whether the measured features provide actionable advance warning of independently confirmed swarming events. Prediction performance will be reported using a predefined alert-matching policy, false alerts per hive-week, event-level precision and recall, and warning lead time, subject to the number of observed events. Comparisons with simpler sensing and scheduled-only acquisition will assess the value of sensor fusion and event-driven operation. Six-month node autonomy is an initial target to be supported by measured operating profiles.</w:t>
+          <w:sz w:val="22"/>
+          <w:szCs w:val="22"/>
+        </w:rPr>
+        <w:t xml:space="preserve">BeeSense is an autonomous monitoring prototype for honeybee colonies at apiaries without mains power or Wi-Fi. Battery-powered hive nodes collect scheduled and event-triggered vibration and acoustic measurements together with weight and temperature. Embedded processing extracts spectral features, which are transmitted to a solar-powered cellular gateway and displayed on a per-hive dashboard. The engineering evaluation will characterize signal quality, weighing performance, application-level packet delivery, energy consumption, and field </w:t>
+      </w:r>
+      <w:r>
+        <w:rPr>
+          <w:sz w:val="22"/>
+          <w:szCs w:val="22"/>
+        </w:rPr>
+        <w:t>real</w:t>
+      </w:r>
+      <w:r>
+        <w:rPr>
+          <w:sz w:val="22"/>
+          <w:szCs w:val="22"/>
+        </w:rPr>
+        <w:t>ailability. A prospective study on three to five hives at the Zippory Honey apiary will investigate whether the measured features provide actionable advance warning of independently confirmed swarming events. Prediction performance will be reported using a predefined alert-matching policy, false alerts per hive-week, event-level precision and recall, and warning lead time, subject to the number of observed events. Comparisons with simpler sensing and scheduled-only acquisition will assess the value of sensor fusion and event-driven operation. Six-month node autonomy is an initial target to be supported by measured operating profiles.</w:t>
       </w:r>
     </w:p>
     <w:p>
@@ -1074,8 +1038,8 @@
           <w:szCs w:val="22"/>
         </w:rPr>
         <w:sectPr>
-          <w:headerReference w:type="default" r:id="rId14"/>
-          <w:footerReference w:type="default" r:id="rId15"/>
+          <w:headerReference w:type="default" r:id="rId12"/>
+          <w:footerReference w:type="default" r:id="rId13"/>
           <w:pgSz w:w="11906" w:h="16838"/>
           <w:pgMar w:top="1417" w:right="1417" w:bottom="1417" w:left="1417" w:header="709" w:footer="709" w:gutter="0"/>
           <w:pgNumType w:fmt="lowerRoman" w:start="1"/>
@@ -1084,25 +1048,17 @@
       </w:pPr>
       <w:r>
         <w:rPr>
-          <w:b w:val="1"/>
-          <w:bCs w:val="1"/>
-          <w:i w:val="0"/>
-          <w:iCs w:val="0"/>
-          <w:sz w:val="22"/>
-          <w:szCs w:val="22"/>
-          <w:rtl w:val="0"/>
-        </w:rPr>
-        <w:t xml:space="preserve">Keywords:</w:t>
-      </w:r>
-      <w:r>
-        <w:rPr>
-          <w:b w:val="0"/>
-          <w:bCs w:val="0"/>
-          <w:i w:val="0"/>
-          <w:iCs w:val="0"/>
-          <w:sz w:val="22"/>
-          <w:szCs w:val="22"/>
-          <w:rtl w:val="0"/>
+          <w:b/>
+          <w:bCs/>
+          <w:sz w:val="22"/>
+          <w:szCs w:val="22"/>
+        </w:rPr>
+        <w:t>Keywords:</w:t>
+      </w:r>
+      <w:r>
+        <w:rPr>
+          <w:sz w:val="22"/>
+          <w:szCs w:val="22"/>
         </w:rPr>
         <w:t xml:space="preserve"> Internet of Things, Hive Monitoring, Honeybees, Swarm Prediction, Piezoelectric Sensor, Event-Driven Acquisition, Signal Processing, Load Cells, Low-Power Embedded Systems, ESP-NOW.</w:t>
       </w:r>
@@ -1159,13 +1115,10 @@
         <w:rPr>
           <w:b/>
           <w:bCs/>
-          <w:i w:val="0"/>
-          <w:iCs w:val="0"/>
-          <w:sz w:val="22"/>
-          <w:szCs w:val="22"/>
-          <w:rtl w:val="0"/>
-        </w:rPr>
-        <w:t xml:space="preserve">1.1 Motivation, Use Case and Value</w:t>
+          <w:sz w:val="22"/>
+          <w:szCs w:val="22"/>
+        </w:rPr>
+        <w:t>1.1 Motivation, Use Case and Value</w:t>
       </w:r>
     </w:p>
     <w:p>
@@ -1179,61 +1132,40 @@
       </w:pPr>
       <w:r>
         <w:rPr>
-          <w:b w:val="0"/>
-          <w:bCs w:val="0"/>
-          <w:i w:val="0"/>
-          <w:iCs w:val="0"/>
-          <w:sz w:val="22"/>
-          <w:szCs w:val="22"/>
-          <w:rtl w:val="0"/>
+          <w:sz w:val="22"/>
+          <w:szCs w:val="22"/>
         </w:rPr>
         <w:t xml:space="preserve">Beekeepers check colonies by opening the hives at intervals that depend on season and management, and between visits they cannot see what happens inside. Precision beekeeping proposes sensor-based monitoring to support such decisions [1]. Swarming is a costly blind spot: the colony prepares for one to two weeks, then the swarm leaves with a large part of the workforce, clusters nearby for a few hours and is lost. Hive vibrations change before swarming [2], [3], and continuous weight reveals foraging and swarm departures [4]. </w:t>
       </w:r>
       <w:r>
         <w:rPr>
-          <w:b w:val="0"/>
-          <w:bCs w:val="0"/>
-          <w:i w:val="1"/>
-          <w:iCs w:val="1"/>
-          <w:sz w:val="22"/>
-          <w:szCs w:val="22"/>
-          <w:rtl w:val="0"/>
-        </w:rPr>
-        <w:t xml:space="preserve">Use case:</w:t>
-      </w:r>
-      <w:r>
-        <w:rPr>
-          <w:b w:val="0"/>
-          <w:bCs w:val="0"/>
-          <w:i w:val="0"/>
-          <w:iCs w:val="0"/>
-          <w:sz w:val="22"/>
-          <w:szCs w:val="22"/>
-          <w:rtl w:val="0"/>
+          <w:i/>
+          <w:iCs/>
+          <w:sz w:val="22"/>
+          <w:szCs w:val="22"/>
+        </w:rPr>
+        <w:t>Use case:</w:t>
+      </w:r>
+      <w:r>
+        <w:rPr>
+          <w:sz w:val="22"/>
+          <w:szCs w:val="22"/>
         </w:rPr>
         <w:t xml:space="preserve"> the Zippory Honey apiary, with many hives close together and no mains power or Wi-Fi. </w:t>
       </w:r>
       <w:r>
         <w:rPr>
-          <w:b w:val="0"/>
-          <w:bCs w:val="0"/>
-          <w:i w:val="1"/>
-          <w:iCs w:val="1"/>
-          <w:sz w:val="22"/>
-          <w:szCs w:val="22"/>
-          <w:rtl w:val="0"/>
-        </w:rPr>
-        <w:t xml:space="preserve">Decision supported:</w:t>
-      </w:r>
-      <w:r>
-        <w:rPr>
-          <w:b w:val="0"/>
-          <w:bCs w:val="0"/>
-          <w:i w:val="0"/>
-          <w:iCs w:val="0"/>
-          <w:sz w:val="22"/>
-          <w:szCs w:val="22"/>
-          <w:rtl w:val="0"/>
+          <w:i/>
+          <w:iCs/>
+          <w:sz w:val="22"/>
+          <w:szCs w:val="22"/>
+        </w:rPr>
+        <w:t>Decision supported:</w:t>
+      </w:r>
+      <w:r>
+        <w:rPr>
+          <w:sz w:val="22"/>
+          <w:szCs w:val="22"/>
         </w:rPr>
         <w:t xml:space="preserve"> which hive to inspect, and when. An alert must come early enough to reach the apiary and act (e.g., split the colony), but not so early or persistently that it causes needless visits. The beekeeper will document actual inspection intervals, response time, connectivity and preventable losses; these local data set the warning window (Section 3.4).</w:t>
       </w:r>
@@ -1268,49 +1200,33 @@
       </w:pPr>
       <w:r>
         <w:rPr>
-          <w:b w:val="1"/>
-          <w:bCs w:val="1"/>
-          <w:i w:val="0"/>
-          <w:iCs w:val="0"/>
-          <w:sz w:val="22"/>
-          <w:szCs w:val="22"/>
-          <w:rtl w:val="0"/>
-        </w:rPr>
-        <w:t xml:space="preserve">Goal:</w:t>
-      </w:r>
-      <w:r>
-        <w:rPr>
-          <w:b w:val="0"/>
-          <w:bCs w:val="0"/>
-          <w:i w:val="0"/>
-          <w:iCs w:val="0"/>
-          <w:sz w:val="22"/>
-          <w:szCs w:val="22"/>
-          <w:rtl w:val="0"/>
+          <w:b/>
+          <w:bCs/>
+          <w:sz w:val="22"/>
+          <w:szCs w:val="22"/>
+        </w:rPr>
+        <w:t>Goal:</w:t>
+      </w:r>
+      <w:r>
+        <w:rPr>
+          <w:sz w:val="22"/>
+          <w:szCs w:val="22"/>
         </w:rPr>
         <w:t xml:space="preserve"> an autonomous, characterized monitoring system for a small group of hives without mains power or Wi-Fi. </w:t>
       </w:r>
       <w:r>
         <w:rPr>
-          <w:b w:val="1"/>
-          <w:bCs w:val="1"/>
-          <w:i w:val="0"/>
-          <w:iCs w:val="0"/>
-          <w:sz w:val="22"/>
-          <w:szCs w:val="22"/>
-          <w:rtl w:val="0"/>
-        </w:rPr>
-        <w:t xml:space="preserve">Engineering objectives (committed, Table I):</w:t>
-      </w:r>
-      <w:r>
-        <w:rPr>
-          <w:b w:val="0"/>
-          <w:bCs w:val="0"/>
-          <w:i w:val="0"/>
-          <w:iCs w:val="0"/>
-          <w:sz w:val="22"/>
-          <w:szCs w:val="22"/>
-          <w:rtl w:val="0"/>
+          <w:b/>
+          <w:bCs/>
+          <w:sz w:val="22"/>
+          <w:szCs w:val="22"/>
+        </w:rPr>
+        <w:t>Engineering objectives (committed, Table I):</w:t>
+      </w:r>
+      <w:r>
+        <w:rPr>
+          <w:sz w:val="22"/>
+          <w:szCs w:val="22"/>
         </w:rPr>
         <w:t xml:space="preserve"> (E1) scheduled and event-triggered acquisition of vibration, audio, weight and temperature with validated signal quality; (E2) delivery of features from every hive to a solar-powered cellular gateway and a per-hive dashboard, with measured application-level delivery and availability; (E3) a node energy budget, measured over complete operating cycles, that projects at least six months per battery.</w:t>
       </w:r>
@@ -1326,25 +1242,17 @@
       </w:pPr>
       <w:r>
         <w:rPr>
-          <w:b w:val="1"/>
-          <w:bCs w:val="1"/>
-          <w:i w:val="0"/>
-          <w:iCs w:val="0"/>
-          <w:sz w:val="22"/>
-          <w:szCs w:val="22"/>
-          <w:rtl w:val="0"/>
-        </w:rPr>
-        <w:t xml:space="preserve">Research objective (reported with its evidence):</w:t>
-      </w:r>
-      <w:r>
-        <w:rPr>
-          <w:b w:val="0"/>
-          <w:bCs w:val="0"/>
-          <w:i w:val="0"/>
-          <w:iCs w:val="0"/>
-          <w:sz w:val="22"/>
-          <w:szCs w:val="22"/>
-          <w:rtl w:val="0"/>
+          <w:b/>
+          <w:bCs/>
+          <w:sz w:val="22"/>
+          <w:szCs w:val="22"/>
+        </w:rPr>
+        <w:t>Research objective (reported with its evidence):</w:t>
+      </w:r>
+      <w:r>
+        <w:rPr>
+          <w:sz w:val="22"/>
+          <w:szCs w:val="22"/>
         </w:rPr>
         <w:t xml:space="preserve"> (R1) determine whether the measured signals give actionable advance warning of independently confirmed swarming, and whether sensor fusion and event-triggered acquisition improve detection or energy use over simpler baselines.</w:t>
       </w:r>
@@ -1360,25 +1268,17 @@
       </w:pPr>
       <w:r>
         <w:rPr>
-          <w:b w:val="1"/>
-          <w:bCs w:val="1"/>
-          <w:i w:val="0"/>
-          <w:iCs w:val="0"/>
-          <w:sz w:val="22"/>
-          <w:szCs w:val="22"/>
-          <w:rtl w:val="0"/>
-        </w:rPr>
-        <w:t xml:space="preserve">Stages:</w:t>
-      </w:r>
-      <w:r>
-        <w:rPr>
-          <w:b w:val="0"/>
-          <w:bCs w:val="0"/>
-          <w:i w:val="0"/>
-          <w:iCs w:val="0"/>
-          <w:sz w:val="22"/>
-          <w:szCs w:val="22"/>
-          <w:rtl w:val="0"/>
+          <w:b/>
+          <w:bCs/>
+          <w:sz w:val="22"/>
+          <w:szCs w:val="22"/>
+        </w:rPr>
+        <w:t>Stages:</w:t>
+      </w:r>
+      <w:r>
+        <w:rPr>
+          <w:sz w:val="22"/>
+          <w:szCs w:val="22"/>
         </w:rPr>
         <w:t xml:space="preserve"> (1) bench characterization of each sensor chain, timing, delivery and power (Nov.–Dec. 2026); (2) real-hive feasibility gate by 31 Dec. 2026: piezo and microphone spectra vs. electronics noise and measured node energy on one hive, and the LoRa decision; (3) fix mounting, features, thresholds and logging, then freeze the system (Jan.–Feb. 2027); (4) prospective field evaluation on 3–5 hives through the swarming season.</w:t>
       </w:r>
@@ -1396,13 +1296,10 @@
         <w:rPr>
           <w:b/>
           <w:bCs/>
-          <w:i w:val="0"/>
-          <w:iCs w:val="0"/>
-          <w:sz w:val="22"/>
-          <w:szCs w:val="22"/>
-          <w:rtl w:val="0"/>
-        </w:rPr>
-        <w:t xml:space="preserve">1.3 Technology, Interfaces and Cost</w:t>
+          <w:sz w:val="22"/>
+          <w:szCs w:val="22"/>
+        </w:rPr>
+        <w:t>1.3 Technology, Interfaces and Cost</w:t>
       </w:r>
     </w:p>
     <w:p>
@@ -1416,97 +1313,73 @@
       </w:pPr>
       <w:r>
         <w:rPr>
-          <w:b w:val="0"/>
-          <w:bCs w:val="0"/>
-          <w:i w:val="1"/>
-          <w:iCs w:val="1"/>
-          <w:sz w:val="22"/>
-          <w:szCs w:val="22"/>
-          <w:rtl w:val="0"/>
-        </w:rPr>
-        <w:t xml:space="preserve">Hive node:</w:t>
-      </w:r>
-      <w:r>
-        <w:rPr>
-          <w:b w:val="0"/>
-          <w:bCs w:val="0"/>
-          <w:i w:val="0"/>
-          <w:iCs w:val="0"/>
-          <w:sz w:val="22"/>
-          <w:szCs w:val="22"/>
-          <w:rtl w:val="0"/>
+          <w:i/>
+          <w:iCs/>
+          <w:sz w:val="22"/>
+          <w:szCs w:val="22"/>
+        </w:rPr>
+        <w:t>Hive node:</w:t>
+      </w:r>
+      <w:r>
+        <w:rPr>
+          <w:sz w:val="22"/>
+          <w:szCs w:val="22"/>
         </w:rPr>
         <w:t xml:space="preserve"> an ESP32-C3 board and one 18650 Li-ion cell with (a) a 27 mm piezo disc on a dedicated brood frame, sealed against wax, propolis and humidity and wired through a connector at the top bar, so the frame can still be lifted for inspection; (b) an I²S MEMS microphone inside the hive behind a mesh; (c) four 50 kg load cells under a hive platform with an HX711 ADC; (d) DS18B20 probes inside and outside. An op-amp front end (bias, protection, gain, ≈800 Hz anti-alias low-pass) is powered only while recording; a separate always-on wake circuit (≈2 µA, datasheet estimate) watches the piezo envelope. </w:t>
       </w:r>
       <w:r>
         <w:rPr>
-          <w:b w:val="0"/>
-          <w:bCs w:val="0"/>
-          <w:i w:val="1"/>
-          <w:iCs w:val="1"/>
-          <w:sz w:val="22"/>
-          <w:szCs w:val="22"/>
-          <w:rtl w:val="0"/>
-        </w:rPr>
-        <w:t xml:space="preserve">Hub:</w:t>
-      </w:r>
-      <w:r>
-        <w:rPr>
-          <w:b w:val="0"/>
-          <w:bCs w:val="0"/>
-          <w:i w:val="0"/>
-          <w:iCs w:val="0"/>
-          <w:sz w:val="22"/>
-          <w:szCs w:val="22"/>
-          <w:rtl w:val="0"/>
-        </w:rPr>
-        <w:t xml:space="preserve"> an ESP32-S3 board with a SIMCom A7608E-H LTE modem, an 18 V / 15 W solar panel, an MPPT charger and a Li-ion pack; one hub serves a group of nearby hives. </w:t>
-      </w:r>
-      <w:r>
-        <w:rPr>
-          <w:b w:val="0"/>
-          <w:bCs w:val="0"/>
-          <w:i w:val="1"/>
-          <w:iCs w:val="1"/>
-          <w:sz w:val="22"/>
-          <w:szCs w:val="22"/>
-          <w:rtl w:val="0"/>
-        </w:rPr>
-        <w:t xml:space="preserve">Interfaces:</w:t>
-      </w:r>
-      <w:r>
-        <w:rPr>
-          <w:b w:val="0"/>
-          <w:bCs w:val="0"/>
-          <w:i w:val="0"/>
-          <w:iCs w:val="0"/>
-          <w:sz w:val="22"/>
-          <w:szCs w:val="22"/>
-          <w:rtl w:val="0"/>
+          <w:i/>
+          <w:iCs/>
+          <w:sz w:val="22"/>
+          <w:szCs w:val="22"/>
+        </w:rPr>
+        <w:t>Hub:</w:t>
+      </w:r>
+      <w:r>
+        <w:rPr>
+          <w:sz w:val="22"/>
+          <w:szCs w:val="22"/>
+        </w:rPr>
+        <w:t xml:space="preserve"> an ESP32-S3 board with a SIMCom A7608E-H LTE modem, an 18 V / 15 W solar panel, an </w:t>
+      </w:r>
+      <w:r>
+        <w:rPr>
+          <w:sz w:val="22"/>
+          <w:szCs w:val="22"/>
+        </w:rPr>
+        <w:lastRenderedPageBreak/>
+        <w:t xml:space="preserve">MPPT charger and a Li-ion pack; one hub serves a group of nearby hives. </w:t>
+      </w:r>
+      <w:r>
+        <w:rPr>
+          <w:i/>
+          <w:iCs/>
+          <w:sz w:val="22"/>
+          <w:szCs w:val="22"/>
+        </w:rPr>
+        <w:t>Interfaces:</w:t>
+      </w:r>
+      <w:r>
+        <w:rPr>
+          <w:sz w:val="22"/>
+          <w:szCs w:val="22"/>
         </w:rPr>
         <w:t xml:space="preserve"> ADC, I²S, two-wire serial (HX711), 1-Wire, GPIO wake, ESP-NOW (node–hub), LTE (hub–cloud). </w:t>
       </w:r>
       <w:r>
         <w:rPr>
-          <w:b w:val="0"/>
-          <w:bCs w:val="0"/>
-          <w:i w:val="1"/>
-          <w:iCs w:val="1"/>
-          <w:sz w:val="22"/>
-          <w:szCs w:val="22"/>
-          <w:rtl w:val="0"/>
-        </w:rPr>
-        <w:t xml:space="preserve">Cost (estimate; itemized bill of materials in the preliminary report):</w:t>
-      </w:r>
-      <w:r>
-        <w:rPr>
-          <w:b w:val="0"/>
-          <w:bCs w:val="0"/>
-          <w:i w:val="0"/>
-          <w:iCs w:val="0"/>
-          <w:sz w:val="22"/>
-          <w:szCs w:val="22"/>
-          <w:rtl w:val="0"/>
+          <w:i/>
+          <w:iCs/>
+          <w:sz w:val="22"/>
+          <w:szCs w:val="22"/>
+        </w:rPr>
+        <w:t>Cost (estimate; itemized bill of materials in the preliminary report):</w:t>
+      </w:r>
+      <w:r>
+        <w:rPr>
+          <w:sz w:val="22"/>
+          <w:szCs w:val="22"/>
         </w:rPr>
         <w:t xml:space="preserve"> ≈$40 per node including platform and enclosure, ≈$100 per hub, plus a data SIM, i.e. ≈$50 per hive at 10 hives per hub.</w:t>
       </w:r>
@@ -1540,7 +1413,7 @@
                     <pic:cNvPicPr preferRelativeResize="0"/>
                   </pic:nvPicPr>
                   <pic:blipFill>
-                    <a:blip r:embed="rId16"/>
+                    <a:blip r:embed="rId14"/>
                     <a:srcRect/>
                     <a:stretch>
                       <a:fillRect/>
@@ -1611,15 +1484,10 @@
       </w:pPr>
       <w:r>
         <w:rPr>
-          <w:b w:val="0"/>
-          <w:bCs w:val="0"/>
-          <w:i w:val="0"/>
-          <w:iCs w:val="0"/>
           <w:sz w:val="20"/>
           <w:szCs w:val="20"/>
-          <w:rtl w:val="0"/>
-        </w:rPr>
-        <w:t xml:space="preserve">TABLE I.  SPECIFICATION: ENGINEERING ACCEPTANCE (E) AND RESEARCH TARGETS (R)</w:t>
+        </w:rPr>
+        <w:t>TABLE I.  SPECIFICATION: ENGINEERING ACCEPTANCE (E) AND RESEARCH TARGETS (R)</w:t>
       </w:r>
     </w:p>
     <w:tbl>
@@ -1640,9 +1508,9 @@
         <w:tblLook w:val="0400" w:firstRow="0" w:lastRow="0" w:firstColumn="0" w:lastColumn="0" w:noHBand="0" w:noVBand="1"/>
       </w:tblPr>
       <w:tblGrid>
-        <w:gridCol w:w="1750"/>
-        <w:gridCol w:w="3900"/>
-        <w:gridCol w:w="3350"/>
+        <w:gridCol w:w="1624"/>
+        <w:gridCol w:w="3593"/>
+        <w:gridCol w:w="3090"/>
       </w:tblGrid>
       <w:tr>
         <w:trPr>
@@ -1667,13 +1535,10 @@
               <w:rPr>
                 <w:b/>
                 <w:bCs/>
-                <w:i w:val="0"/>
-                <w:iCs w:val="0"/>
                 <w:sz w:val="20"/>
                 <w:szCs w:val="20"/>
-                <w:rtl w:val="0"/>
-              </w:rPr>
-              <w:t xml:space="preserve">Area</w:t>
+              </w:rPr>
+              <w:t>Area</w:t>
             </w:r>
           </w:p>
         </w:tc>
@@ -1696,13 +1561,10 @@
               <w:rPr>
                 <w:b/>
                 <w:bCs/>
-                <w:i w:val="0"/>
-                <w:iCs w:val="0"/>
                 <w:sz w:val="20"/>
                 <w:szCs w:val="20"/>
-                <w:rtl w:val="0"/>
-              </w:rPr>
-              <w:t xml:space="preserve">Specification and test</w:t>
+              </w:rPr>
+              <w:t>Specification and test</w:t>
             </w:r>
           </w:p>
         </w:tc>
@@ -1725,13 +1587,10 @@
               <w:rPr>
                 <w:b/>
                 <w:bCs/>
-                <w:i w:val="0"/>
-                <w:iCs w:val="0"/>
                 <w:sz w:val="20"/>
                 <w:szCs w:val="20"/>
-                <w:rtl w:val="0"/>
-              </w:rPr>
-              <w:t xml:space="preserve">Target / evidence</w:t>
+              </w:rPr>
+              <w:t>Target / evidence</w:t>
             </w:r>
           </w:p>
         </w:tc>
@@ -1756,13 +1615,10 @@
             </w:pPr>
             <w:r>
               <w:rPr>
-                <w:i w:val="0"/>
-                <w:iCs w:val="0"/>
                 <w:sz w:val="20"/>
                 <w:szCs w:val="20"/>
-                <w:rtl w:val="0"/>
-              </w:rPr>
-              <w:t xml:space="preserve">E – Signal quality</w:t>
+              </w:rPr>
+              <w:t>E – Signal quality</w:t>
             </w:r>
           </w:p>
         </w:tc>
@@ -1782,13 +1638,10 @@
             </w:pPr>
             <w:r>
               <w:rPr>
-                <w:i w:val="0"/>
-                <w:iCs w:val="0"/>
                 <w:sz w:val="20"/>
                 <w:szCs w:val="20"/>
-                <w:rtl w:val="0"/>
-              </w:rPr>
-              <w:t xml:space="preserve">Hive spectra vs. electronics noise; remount repeatability; invalid recordings</w:t>
+              </w:rPr>
+              <w:t>Hive spectra vs. electronics noise; remount repeatability; invalid recordings</w:t>
             </w:r>
           </w:p>
         </w:tc>
@@ -1808,13 +1661,10 @@
             </w:pPr>
             <w:r>
               <w:rPr>
-                <w:i w:val="0"/>
-                <w:iCs w:val="0"/>
                 <w:sz w:val="20"/>
                 <w:szCs w:val="20"/>
-                <w:rtl w:val="0"/>
-              </w:rPr>
-              <w:t xml:space="preserve">Signal above noise in 50–800 Hz; invalid rate</w:t>
+              </w:rPr>
+              <w:t>Signal above noise in 50–800 Hz; invalid rate</w:t>
             </w:r>
           </w:p>
         </w:tc>
@@ -1839,13 +1689,10 @@
             </w:pPr>
             <w:r>
               <w:rPr>
-                <w:i w:val="0"/>
-                <w:iCs w:val="0"/>
                 <w:sz w:val="20"/>
                 <w:szCs w:val="20"/>
-                <w:rtl w:val="0"/>
-              </w:rPr>
-              <w:t xml:space="preserve">E – Weighing</w:t>
+              </w:rPr>
+              <w:t>E – Weighing</w:t>
             </w:r>
           </w:p>
         </w:tc>
@@ -1865,13 +1712,10 @@
             </w:pPr>
             <w:r>
               <w:rPr>
-                <w:i w:val="0"/>
-                <w:iCs w:val="0"/>
                 <w:sz w:val="20"/>
                 <w:szCs w:val="20"/>
-                <w:rtl w:val="0"/>
-              </w:rPr>
-              <w:t xml:space="preserve">30-min change at several loads, off-center, −5…40 °C; absolute error and drift reported</w:t>
+              </w:rPr>
+              <w:t>30-min change at several loads, off-center, −5…40 °C; absolute error and drift reported</w:t>
             </w:r>
           </w:p>
         </w:tc>
@@ -1891,13 +1735,10 @@
             </w:pPr>
             <w:r>
               <w:rPr>
-                <w:i w:val="0"/>
-                <w:iCs w:val="0"/>
                 <w:sz w:val="20"/>
                 <w:szCs w:val="20"/>
-                <w:rtl w:val="0"/>
-              </w:rPr>
-              <w:t xml:space="preserve">Change error ≤ ±20 g</w:t>
+              </w:rPr>
+              <w:t>Change error ≤ ±20 g</w:t>
             </w:r>
           </w:p>
         </w:tc>
@@ -1922,13 +1763,10 @@
             </w:pPr>
             <w:r>
               <w:rPr>
-                <w:i w:val="0"/>
-                <w:iCs w:val="0"/>
                 <w:sz w:val="20"/>
                 <w:szCs w:val="20"/>
-                <w:rtl w:val="0"/>
-              </w:rPr>
-              <w:t xml:space="preserve">E – Event wake</w:t>
+              </w:rPr>
+              <w:t>E – Event wake</w:t>
             </w:r>
           </w:p>
         </w:tc>
@@ -1948,13 +1786,10 @@
             </w:pPr>
             <w:r>
               <w:rPr>
-                <w:i w:val="0"/>
-                <w:iCs w:val="0"/>
                 <w:sz w:val="20"/>
                 <w:szCs w:val="20"/>
-                <w:rtl w:val="0"/>
-              </w:rPr>
-              <w:t xml:space="preserve">Annotated trials (bursts, wind, rain, handling) vs. scheduled reference</w:t>
+              </w:rPr>
+              <w:t>Annotated trials (bursts, wind, rain, handling) vs. scheduled reference</w:t>
             </w:r>
           </w:p>
         </w:tc>
@@ -1974,13 +1809,10 @@
             </w:pPr>
             <w:r>
               <w:rPr>
-                <w:i w:val="0"/>
-                <w:iCs w:val="0"/>
                 <w:sz w:val="20"/>
                 <w:szCs w:val="20"/>
-                <w:rtl w:val="0"/>
-              </w:rPr>
-              <w:t xml:space="preserve">Useful-event capture; ≤ 20 false wakes per hive-day (provisional)</w:t>
+              </w:rPr>
+              <w:t>Useful-event capture; ≤ 20 false wakes per hive-day (provisional)</w:t>
             </w:r>
           </w:p>
         </w:tc>
@@ -2005,13 +1837,10 @@
             </w:pPr>
             <w:r>
               <w:rPr>
-                <w:i w:val="0"/>
-                <w:iCs w:val="0"/>
                 <w:sz w:val="20"/>
                 <w:szCs w:val="20"/>
-                <w:rtl w:val="0"/>
-              </w:rPr>
-              <w:t xml:space="preserve">E – Delivery</w:t>
+              </w:rPr>
+              <w:t>E – Delivery</w:t>
             </w:r>
           </w:p>
         </w:tc>
@@ -2031,13 +1860,10 @@
             </w:pPr>
             <w:r>
               <w:rPr>
-                <w:i w:val="0"/>
-                <w:iCs w:val="0"/>
                 <w:sz w:val="20"/>
                 <w:szCs w:val="20"/>
-                <w:rtl w:val="0"/>
-              </w:rPr>
-              <w:t xml:space="preserve">Hub-application receipts / sent (sequence numbers), all nodes on site</w:t>
+              </w:rPr>
+              <w:t>Hub-application receipts / sent (sequence numbers), all nodes on site</w:t>
             </w:r>
           </w:p>
         </w:tc>
@@ -2057,13 +1883,10 @@
             </w:pPr>
             <w:r>
               <w:rPr>
-                <w:i w:val="0"/>
-                <w:iCs w:val="0"/>
                 <w:sz w:val="20"/>
                 <w:szCs w:val="20"/>
-                <w:rtl w:val="0"/>
-              </w:rPr>
-              <w:t xml:space="preserve">≥ 95%; alert latency ≤ 30 min</w:t>
+              </w:rPr>
+              <w:t>≥ 95%; alert latency ≤ 30 min</w:t>
             </w:r>
           </w:p>
         </w:tc>
@@ -2088,13 +1911,10 @@
             </w:pPr>
             <w:r>
               <w:rPr>
-                <w:i w:val="0"/>
-                <w:iCs w:val="0"/>
                 <w:sz w:val="20"/>
                 <w:szCs w:val="20"/>
-                <w:rtl w:val="0"/>
-              </w:rPr>
-              <w:t xml:space="preserve">E – Node energy</w:t>
+              </w:rPr>
+              <w:t>E – Node energy</w:t>
             </w:r>
           </w:p>
         </w:tc>
@@ -2114,13 +1934,10 @@
             </w:pPr>
             <w:r>
               <w:rPr>
-                <w:i w:val="0"/>
-                <w:iCs w:val="0"/>
                 <w:sz w:val="20"/>
                 <w:szCs w:val="20"/>
-                <w:rtl w:val="0"/>
-              </w:rPr>
-              <w:t xml:space="preserve">Measured full-cycle profiles; nominal and adverse (events, retries) cases</w:t>
+              </w:rPr>
+              <w:t>Measured full-cycle profiles; nominal and adverse (events, retries) cases</w:t>
             </w:r>
           </w:p>
         </w:tc>
@@ -2140,13 +1957,10 @@
             </w:pPr>
             <w:r>
               <w:rPr>
-                <w:i w:val="0"/>
-                <w:iCs w:val="0"/>
                 <w:sz w:val="20"/>
                 <w:szCs w:val="20"/>
-                <w:rtl w:val="0"/>
-              </w:rPr>
-              <w:t xml:space="preserve">≥ 6 months projected, 20% margin</w:t>
+              </w:rPr>
+              <w:t>≥ 6 months projected, 20% margin</w:t>
             </w:r>
           </w:p>
         </w:tc>
@@ -2170,13 +1984,10 @@
             </w:pPr>
             <w:r>
               <w:rPr>
-                <w:i w:val="0"/>
-                <w:iCs w:val="0"/>
                 <w:sz w:val="20"/>
                 <w:szCs w:val="20"/>
-                <w:rtl w:val="0"/>
-              </w:rPr>
-              <w:t xml:space="preserve">E – Availability</w:t>
+              </w:rPr>
+              <w:t>E – Availability</w:t>
             </w:r>
           </w:p>
         </w:tc>
@@ -2195,13 +2006,10 @@
             </w:pPr>
             <w:r>
               <w:rPr>
-                <w:i w:val="0"/>
-                <w:iCs w:val="0"/>
                 <w:sz w:val="20"/>
                 <w:szCs w:val="20"/>
-                <w:rtl w:val="0"/>
-              </w:rPr>
-              <w:t xml:space="preserve">Log of uptime, resets, data gaps, interventions, solar and battery</w:t>
+              </w:rPr>
+              <w:t>Log of uptime, resets, data gaps, interventions, solar and battery</w:t>
             </w:r>
           </w:p>
         </w:tc>
@@ -2220,13 +2028,10 @@
             </w:pPr>
             <w:r>
               <w:rPr>
-                <w:i w:val="0"/>
-                <w:iCs w:val="0"/>
                 <w:sz w:val="20"/>
                 <w:szCs w:val="20"/>
-                <w:rtl w:val="0"/>
-              </w:rPr>
-              <w:t xml:space="preserve">≥ 30 days without maintenance</w:t>
+              </w:rPr>
+              <w:t>≥ 30 days without maintenance</w:t>
             </w:r>
           </w:p>
         </w:tc>
@@ -2250,13 +2055,10 @@
             </w:pPr>
             <w:r>
               <w:rPr>
-                <w:i w:val="0"/>
-                <w:iCs w:val="0"/>
                 <w:sz w:val="20"/>
                 <w:szCs w:val="20"/>
-                <w:rtl w:val="0"/>
-              </w:rPr>
-              <w:t xml:space="preserve">E – Cost</w:t>
+              </w:rPr>
+              <w:t>E – Cost</w:t>
             </w:r>
           </w:p>
         </w:tc>
@@ -2275,13 +2077,10 @@
             </w:pPr>
             <w:r>
               <w:rPr>
-                <w:i w:val="0"/>
-                <w:iCs w:val="0"/>
                 <w:sz w:val="20"/>
                 <w:szCs w:val="20"/>
-                <w:rtl w:val="0"/>
-              </w:rPr>
-              <w:t xml:space="preserve">Bill of materials per node and hub; recurring SIM fee</w:t>
+              </w:rPr>
+              <w:t>Bill of materials per node and hub; recurring SIM fee</w:t>
             </w:r>
           </w:p>
         </w:tc>
@@ -2300,13 +2099,10 @@
             </w:pPr>
             <w:r>
               <w:rPr>
-                <w:i w:val="0"/>
-                <w:iCs w:val="0"/>
                 <w:sz w:val="20"/>
                 <w:szCs w:val="20"/>
-                <w:rtl w:val="0"/>
-              </w:rPr>
-              <w:t xml:space="preserve">Per hive at 10 hives per hub</w:t>
+              </w:rPr>
+              <w:t>Per hive at 10 hives per hub</w:t>
             </w:r>
           </w:p>
         </w:tc>
@@ -2330,13 +2126,10 @@
             </w:pPr>
             <w:r>
               <w:rPr>
-                <w:i w:val="0"/>
-                <w:iCs w:val="0"/>
                 <w:sz w:val="20"/>
                 <w:szCs w:val="20"/>
-                <w:rtl w:val="0"/>
-              </w:rPr>
-              <w:t xml:space="preserve">R – Advance warning</w:t>
+              </w:rPr>
+              <w:t>R – Advance warning</w:t>
             </w:r>
           </w:p>
         </w:tc>
@@ -2355,13 +2148,10 @@
             </w:pPr>
             <w:r>
               <w:rPr>
-                <w:i w:val="0"/>
-                <w:iCs w:val="0"/>
                 <w:sz w:val="20"/>
                 <w:szCs w:val="20"/>
-                <w:rtl w:val="0"/>
-              </w:rPr>
-              <w:t xml:space="preserve">Episodes matched to confirmed departures in the frozen window (Section 3.4)</w:t>
+              </w:rPr>
+              <w:t>Episodes matched to confirmed departures in the frozen window (Section 3.4)</w:t>
             </w:r>
           </w:p>
         </w:tc>
@@ -2380,13 +2170,10 @@
             </w:pPr>
             <w:r>
               <w:rPr>
-                <w:i w:val="0"/>
-                <w:iCs w:val="0"/>
                 <w:sz w:val="20"/>
                 <w:szCs w:val="20"/>
-                <w:rtl w:val="0"/>
-              </w:rPr>
-              <w:t xml:space="preserve">P, R (goal &gt; 90%), lead time, ≤ 1 false episode per hive-week; counts and uncertainty</w:t>
+              </w:rPr>
+              <w:t>P, R (goal &gt; 90%), lead time, ≤ 1 false episode per hive-week; counts and uncertainty</w:t>
             </w:r>
           </w:p>
         </w:tc>
@@ -2410,13 +2197,10 @@
             </w:pPr>
             <w:r>
               <w:rPr>
-                <w:i w:val="0"/>
-                <w:iCs w:val="0"/>
                 <w:sz w:val="20"/>
                 <w:szCs w:val="20"/>
-                <w:rtl w:val="0"/>
-              </w:rPr>
-              <w:t xml:space="preserve">R – Sensor fusion</w:t>
+              </w:rPr>
+              <w:t>R – Sensor fusion</w:t>
             </w:r>
           </w:p>
         </w:tc>
@@ -2435,13 +2219,10 @@
             </w:pPr>
             <w:r>
               <w:rPr>
-                <w:i w:val="0"/>
-                <w:iCs w:val="0"/>
                 <w:sz w:val="20"/>
                 <w:szCs w:val="20"/>
-                <w:rtl w:val="0"/>
-              </w:rPr>
-              <w:t xml:space="preserve">Weight-only, vibration/audio-only and fused; scheduled-only vs. + event</w:t>
+              </w:rPr>
+              <w:t>Weight-only, vibration/audio-only and fused; scheduled-only vs. + event</w:t>
             </w:r>
           </w:p>
         </w:tc>
@@ -2460,13 +2241,10 @@
             </w:pPr>
             <w:r>
               <w:rPr>
-                <w:i w:val="0"/>
-                <w:iCs w:val="0"/>
                 <w:sz w:val="20"/>
                 <w:szCs w:val="20"/>
-                <w:rtl w:val="0"/>
-              </w:rPr>
-              <w:t xml:space="preserve">Same eligible events and hive-days</w:t>
+              </w:rPr>
+              <w:t>Same eligible events and hive-days</w:t>
             </w:r>
           </w:p>
         </w:tc>
@@ -2502,15 +2280,18 @@
       </w:pPr>
       <w:r>
         <w:rPr>
-          <w:b w:val="0"/>
-          <w:bCs w:val="0"/>
-          <w:i w:val="0"/>
-          <w:iCs w:val="0"/>
-          <w:sz w:val="22"/>
-          <w:szCs w:val="22"/>
-          <w:rtl w:val="0"/>
-        </w:rPr>
-        <w:t xml:space="preserve">Ferrari et al. reported, with in-hive microphones and temperature sensors on three hives, a rise in spectral power near 110 Hz shifting toward 300 Hz before swarming [2]. Ramsey et al. placed accelerometers in the comb and, using learned spectral discrimination and spectral-history analysis, identified colonies preparing to swarm with more than 90% accuracy, up to 30 days ahead [3]. Iqbal et al. compared acoustic classifiers for swarm prediction on public hive recordings [5], a candidate offline baseline. Cecchi et al. built a multi-sensor hive with microphones and four load cells, each hive unit drawing about 4.2 W from mains power [6]. Commercially, BeeHero sensors measure acoustics and climate and report over Bluetooth Low Energy to a cellular gateway in a closed system [7].</w:t>
+          <w:sz w:val="22"/>
+          <w:szCs w:val="22"/>
+        </w:rPr>
+        <w:t xml:space="preserve">Ferrari et al. reported, with in-hive microphones and temperature sensors on three hives, a rise in spectral power near 110 Hz shifting toward 300 Hz before swarming [2]. Ramsey et al. placed accelerometers in the comb and, using learned spectral discrimination and spectral-history analysis, identified colonies preparing to swarm with more than 90% accuracy, up to 30 days ahead [3]. Iqbal et al. compared acoustic classifiers for swarm prediction on public hive recordings [5], a candidate offline baseline. Cecchi et al. built a multi-sensor hive with microphones and four load cells, each hive unit drawing about 4.2 W from </w:t>
+      </w:r>
+      <w:r>
+        <w:rPr>
+          <w:sz w:val="22"/>
+          <w:szCs w:val="22"/>
+        </w:rPr>
+        <w:lastRenderedPageBreak/>
+        <w:t>mains power [6]. Commercially, BeeHero sensors measure acoustics and climate and report over Bluetooth Low Energy to a cellular gateway in a closed system [7].</w:t>
       </w:r>
     </w:p>
     <w:p>
@@ -2545,13 +2326,10 @@
         <w:rPr>
           <w:b/>
           <w:bCs/>
-          <w:i w:val="0"/>
-          <w:iCs w:val="0"/>
-          <w:sz w:val="22"/>
-          <w:szCs w:val="22"/>
-          <w:rtl w:val="0"/>
-        </w:rPr>
-        <w:t xml:space="preserve">3.1 Acquisition and Features</w:t>
+          <w:sz w:val="22"/>
+          <w:szCs w:val="22"/>
+        </w:rPr>
+        <w:t>3.1 Acquisition and Features</w:t>
       </w:r>
     </w:p>
     <w:p>
@@ -2565,15 +2343,10 @@
       </w:pPr>
       <w:r>
         <w:rPr>
-          <w:b w:val="0"/>
-          <w:bCs w:val="0"/>
-          <w:i w:val="0"/>
-          <w:iCs w:val="0"/>
-          <w:sz w:val="22"/>
-          <w:szCs w:val="22"/>
-          <w:rtl w:val="0"/>
-        </w:rPr>
-        <w:t xml:space="preserve">Scheduled acquisitions every 15 min are the baseline; the wake circuit adds acquisitions on vibration bursts, and its 20-min hold-off blocks only further event wakes, never scheduled ones. The wake circuit compares the piezo envelope with a slow running average; it reacts to amplitude, so gradual spectral changes are expected in the scheduled recordings, and the added value of event wakes is evaluated. Each acquisition records 10 s of piezo signal (ADC, fs = 2 kHz) and microphone signal (I²S, decimated to 2 kHz), then the weight after the HX711 settles and the temperatures. Welch's method (1024-point Hann windows, 50% overlap, ≈38 averages, Δf ≈ 2 Hz) gives S(f); the FFT is Q15 fixed-point, validated offline against a floating-point reference. S(f) is summed into K = 24 logarithmically spaced bands Bk in B = 50–800 Hz, ≈6 Hz wide at 50 Hz, ≈13 Hz near 110 Hz and ≈90 Hz near 800 Hz. Absolute band powers are kept together with the normalized energies (1), which remove a common gain but not frequency-dependent coupling; both are compared, and recordings near the noise floor are flagged. During development each node also keeps one raw recording per night (≈80 kB), retrieved by the hub to diagnose aliasing, coupling and noise.</w:t>
+          <w:sz w:val="22"/>
+          <w:szCs w:val="22"/>
+        </w:rPr>
+        <w:t>Scheduled acquisitions every 15 min are the baseline; the wake circuit adds acquisitions on vibration bursts, and its 20-min hold-off blocks only further event wakes, never scheduled ones. The wake circuit compares the piezo envelope with a slow running average; it reacts to amplitude, so gradual spectral changes are expected in the scheduled recordings, and the added value of event wakes is evaluated. Each acquisition records 10 s of piezo signal (ADC, fs = 2 kHz) and microphone signal (I²S, decimated to 2 kHz), then the weight after the HX711 settles and the temperatures. Welch's method (1024-point Hann windows, 50% overlap, ≈38 averages, Δf ≈ 2 Hz) gives S(f); the FFT is Q15 fixed-point, validated offline against a floating-point reference. S(f) is summed into K = 24 logarithmically spaced bands Bk in B = 50–800 Hz, ≈6 Hz wide at 50 Hz, ≈13 Hz near 110 Hz and ≈90 Hz near 800 Hz. Absolute band powers are kept together with the normalized energies (1), which remove a common gain but not frequency-dependent coupling; both are compared, and recordings near the noise floor are flagged. During development each node also keeps one raw recording per night (≈80 kB), retrieved by the hub to diagnose aliasing, coupling and noise.</w:t>
       </w:r>
     </w:p>
     <w:p>
@@ -2768,13 +2541,10 @@
         <w:rPr>
           <w:b/>
           <w:bCs/>
-          <w:i w:val="0"/>
-          <w:iCs w:val="0"/>
-          <w:sz w:val="22"/>
-          <w:szCs w:val="22"/>
-          <w:rtl w:val="0"/>
-        </w:rPr>
-        <w:t xml:space="preserve">3.2 Detection Rule (Hypothesis)</w:t>
+          <w:sz w:val="22"/>
+          <w:szCs w:val="22"/>
+        </w:rPr>
+        <w:t>3.2 Detection Rule (Hypothesis)</w:t>
       </w:r>
     </w:p>
     <w:p>
@@ -2797,296 +2567,194 @@
           <w:szCs w:val="22"/>
         </w:rPr>
         <w:tab/>
-      </w:r>
-      <w:r>
-        <w:rPr>
-          <w:b w:val="0"/>
-          <w:bCs w:val="0"/>
-          <w:i w:val="1"/>
-          <w:iCs w:val="1"/>
-          <w:sz w:val="22"/>
-          <w:szCs w:val="22"/>
-          <w:rtl w:val="0"/>
-        </w:rPr>
-        <w:t xml:space="preserve">z</w:t>
-      </w:r>
-      <w:r>
-        <w:rPr>
-          <w:b w:val="0"/>
-          <w:bCs w:val="0"/>
-          <w:i w:val="0"/>
-          <w:iCs w:val="0"/>
-          <w:sz w:val="22"/>
-          <w:szCs w:val="22"/>
-          <w:rtl w:val="0"/>
+        <w:t>z</w:t>
+      </w:r>
+      <w:r>
+        <w:rPr>
+          <w:sz w:val="22"/>
+          <w:szCs w:val="22"/>
         </w:rPr>
         <w:t xml:space="preserve"> = (</w:t>
       </w:r>
       <w:r>
         <w:rPr>
-          <w:b w:val="0"/>
-          <w:bCs w:val="0"/>
-          <w:i w:val="1"/>
-          <w:iCs w:val="1"/>
-          <w:sz w:val="22"/>
-          <w:szCs w:val="22"/>
-          <w:rtl w:val="0"/>
-        </w:rPr>
-        <w:t xml:space="preserve">x</w:t>
-      </w:r>
-      <w:r>
-        <w:rPr>
-          <w:b w:val="0"/>
-          <w:bCs w:val="0"/>
-          <w:i w:val="0"/>
-          <w:iCs w:val="0"/>
-          <w:sz w:val="22"/>
-          <w:szCs w:val="22"/>
-          <w:rtl w:val="0"/>
+          <w:i/>
+          <w:iCs/>
+          <w:sz w:val="22"/>
+          <w:szCs w:val="22"/>
+        </w:rPr>
+        <w:t>x</w:t>
+      </w:r>
+      <w:r>
+        <w:rPr>
+          <w:sz w:val="22"/>
+          <w:szCs w:val="22"/>
         </w:rPr>
         <w:t xml:space="preserve"> − </w:t>
       </w:r>
       <w:r>
         <w:rPr>
-          <w:b w:val="0"/>
-          <w:bCs w:val="0"/>
-          <w:i w:val="1"/>
-          <w:iCs w:val="1"/>
-          <w:sz w:val="22"/>
-          <w:szCs w:val="22"/>
-          <w:rtl w:val="0"/>
-        </w:rPr>
-        <w:t xml:space="preserve">μ</w:t>
-      </w:r>
-      <w:r>
-        <w:rPr>
-          <w:b w:val="0"/>
-          <w:bCs w:val="0"/>
-          <w:i w:val="1"/>
-          <w:iCs w:val="1"/>
+          <w:i/>
+          <w:iCs/>
+          <w:sz w:val="22"/>
+          <w:szCs w:val="22"/>
+        </w:rPr>
+        <w:t>μ</w:t>
+      </w:r>
+      <w:r>
+        <w:rPr>
+          <w:i/>
+          <w:iCs/>
           <w:sz w:val="22"/>
           <w:szCs w:val="22"/>
           <w:vertAlign w:val="subscript"/>
-          <w:rtl w:val="0"/>
-        </w:rPr>
-        <w:t xml:space="preserve">h</w:t>
-      </w:r>
-      <w:r>
-        <w:rPr>
-          <w:b w:val="0"/>
-          <w:bCs w:val="0"/>
-          <w:i w:val="0"/>
-          <w:iCs w:val="0"/>
-          <w:sz w:val="22"/>
-          <w:szCs w:val="22"/>
-          <w:rtl w:val="0"/>
+        </w:rPr>
+        <w:t>h</w:t>
+      </w:r>
+      <w:r>
+        <w:rPr>
+          <w:sz w:val="22"/>
+          <w:szCs w:val="22"/>
         </w:rPr>
         <w:t xml:space="preserve">) / </w:t>
       </w:r>
       <w:r>
         <w:rPr>
-          <w:b w:val="0"/>
-          <w:bCs w:val="0"/>
-          <w:i w:val="1"/>
-          <w:iCs w:val="1"/>
-          <w:sz w:val="22"/>
-          <w:szCs w:val="22"/>
-          <w:rtl w:val="0"/>
-        </w:rPr>
-        <w:t xml:space="preserve">σ</w:t>
-      </w:r>
-      <w:r>
-        <w:rPr>
-          <w:b w:val="0"/>
-          <w:bCs w:val="0"/>
-          <w:i w:val="1"/>
-          <w:iCs w:val="1"/>
+          <w:i/>
+          <w:iCs/>
+          <w:sz w:val="22"/>
+          <w:szCs w:val="22"/>
+        </w:rPr>
+        <w:t>σ</w:t>
+      </w:r>
+      <w:r>
+        <w:rPr>
+          <w:i/>
+          <w:iCs/>
           <w:sz w:val="22"/>
           <w:szCs w:val="22"/>
           <w:vertAlign w:val="subscript"/>
-          <w:rtl w:val="0"/>
-        </w:rPr>
-        <w:t xml:space="preserve">h</w:t>
-      </w:r>
-      <w:r>
-        <w:rPr>
-          <w:b w:val="0"/>
-          <w:bCs w:val="0"/>
-          <w:i w:val="0"/>
-          <w:iCs w:val="0"/>
-          <w:sz w:val="22"/>
-          <w:szCs w:val="22"/>
-          <w:rtl w:val="0"/>
-        </w:rPr>
-        <w:t xml:space="preserve">,     Δ</w:t>
-      </w:r>
-      <w:r>
-        <w:rPr>
-          <w:b w:val="0"/>
-          <w:bCs w:val="0"/>
-          <w:i w:val="1"/>
-          <w:iCs w:val="1"/>
-          <w:sz w:val="22"/>
-          <w:szCs w:val="22"/>
-          <w:rtl w:val="0"/>
-        </w:rPr>
-        <w:t xml:space="preserve">W</w:t>
-      </w:r>
-      <w:r>
-        <w:rPr>
-          <w:b w:val="0"/>
-          <w:bCs w:val="0"/>
-          <w:i w:val="0"/>
-          <w:iCs w:val="0"/>
-          <w:sz w:val="22"/>
-          <w:szCs w:val="22"/>
-          <w:rtl w:val="0"/>
-        </w:rPr>
-        <w:t xml:space="preserve">(</w:t>
-      </w:r>
-      <w:r>
-        <w:rPr>
-          <w:b w:val="0"/>
-          <w:bCs w:val="0"/>
-          <w:i w:val="1"/>
-          <w:iCs w:val="1"/>
-          <w:sz w:val="22"/>
-          <w:szCs w:val="22"/>
-          <w:rtl w:val="0"/>
-        </w:rPr>
-        <w:t xml:space="preserve">t</w:t>
-      </w:r>
-      <w:r>
-        <w:rPr>
-          <w:b w:val="0"/>
-          <w:bCs w:val="0"/>
-          <w:i w:val="0"/>
-          <w:iCs w:val="0"/>
-          <w:sz w:val="22"/>
-          <w:szCs w:val="22"/>
-          <w:rtl w:val="0"/>
+        </w:rPr>
+        <w:t>h</w:t>
+      </w:r>
+      <w:r>
+        <w:rPr>
+          <w:sz w:val="22"/>
+          <w:szCs w:val="22"/>
+        </w:rPr>
+        <w:t>,     Δ</w:t>
+      </w:r>
+      <w:r>
+        <w:rPr>
+          <w:i/>
+          <w:iCs/>
+          <w:sz w:val="22"/>
+          <w:szCs w:val="22"/>
+        </w:rPr>
+        <w:t>W</w:t>
+      </w:r>
+      <w:r>
+        <w:rPr>
+          <w:sz w:val="22"/>
+          <w:szCs w:val="22"/>
+        </w:rPr>
+        <w:t>(</w:t>
+      </w:r>
+      <w:r>
+        <w:rPr>
+          <w:i/>
+          <w:iCs/>
+          <w:sz w:val="22"/>
+          <w:szCs w:val="22"/>
+        </w:rPr>
+        <w:t>t</w:t>
+      </w:r>
+      <w:r>
+        <w:rPr>
+          <w:sz w:val="22"/>
+          <w:szCs w:val="22"/>
         </w:rPr>
         <w:t xml:space="preserve">) = </w:t>
       </w:r>
       <w:r>
         <w:rPr>
-          <w:b w:val="0"/>
-          <w:bCs w:val="0"/>
-          <w:i w:val="1"/>
-          <w:iCs w:val="1"/>
-          <w:sz w:val="22"/>
-          <w:szCs w:val="22"/>
-          <w:rtl w:val="0"/>
-        </w:rPr>
-        <w:t xml:space="preserve">W</w:t>
-      </w:r>
-      <w:r>
-        <w:rPr>
-          <w:b w:val="0"/>
-          <w:bCs w:val="0"/>
-          <w:i w:val="0"/>
-          <w:iCs w:val="0"/>
-          <w:sz w:val="22"/>
-          <w:szCs w:val="22"/>
-          <w:rtl w:val="0"/>
-        </w:rPr>
-        <w:t xml:space="preserve">(</w:t>
-      </w:r>
-      <w:r>
-        <w:rPr>
-          <w:b w:val="0"/>
-          <w:bCs w:val="0"/>
-          <w:i w:val="1"/>
-          <w:iCs w:val="1"/>
-          <w:sz w:val="22"/>
-          <w:szCs w:val="22"/>
-          <w:rtl w:val="0"/>
-        </w:rPr>
-        <w:t xml:space="preserve">t</w:t>
-      </w:r>
-      <w:r>
-        <w:rPr>
-          <w:b w:val="0"/>
-          <w:bCs w:val="0"/>
-          <w:i w:val="0"/>
-          <w:iCs w:val="0"/>
-          <w:sz w:val="22"/>
-          <w:szCs w:val="22"/>
-          <w:rtl w:val="0"/>
+          <w:i/>
+          <w:iCs/>
+          <w:sz w:val="22"/>
+          <w:szCs w:val="22"/>
+        </w:rPr>
+        <w:t>W</w:t>
+      </w:r>
+      <w:r>
+        <w:rPr>
+          <w:sz w:val="22"/>
+          <w:szCs w:val="22"/>
+        </w:rPr>
+        <w:t>(</w:t>
+      </w:r>
+      <w:r>
+        <w:rPr>
+          <w:i/>
+          <w:iCs/>
+          <w:sz w:val="22"/>
+          <w:szCs w:val="22"/>
+        </w:rPr>
+        <w:t>t</w:t>
+      </w:r>
+      <w:r>
+        <w:rPr>
+          <w:sz w:val="22"/>
+          <w:szCs w:val="22"/>
         </w:rPr>
         <w:t xml:space="preserve">) − </w:t>
       </w:r>
       <w:r>
         <w:rPr>
-          <w:b w:val="0"/>
-          <w:bCs w:val="0"/>
-          <w:i w:val="1"/>
-          <w:iCs w:val="1"/>
-          <w:sz w:val="22"/>
-          <w:szCs w:val="22"/>
-          <w:rtl w:val="0"/>
-        </w:rPr>
-        <w:t xml:space="preserve">W</w:t>
-      </w:r>
-      <w:r>
-        <w:rPr>
-          <w:b w:val="0"/>
-          <w:bCs w:val="0"/>
-          <w:i w:val="0"/>
-          <w:iCs w:val="0"/>
-          <w:sz w:val="22"/>
-          <w:szCs w:val="22"/>
-          <w:rtl w:val="0"/>
-        </w:rPr>
-        <w:t xml:space="preserve">(</w:t>
-      </w:r>
-      <w:r>
-        <w:rPr>
-          <w:b w:val="0"/>
-          <w:bCs w:val="0"/>
-          <w:i w:val="1"/>
-          <w:iCs w:val="1"/>
-          <w:sz w:val="22"/>
-          <w:szCs w:val="22"/>
-          <w:rtl w:val="0"/>
-        </w:rPr>
-        <w:t xml:space="preserve">t</w:t>
-      </w:r>
-      <w:r>
-        <w:rPr>
-          <w:b w:val="0"/>
-          <w:bCs w:val="0"/>
-          <w:i w:val="0"/>
-          <w:iCs w:val="0"/>
-          <w:sz w:val="22"/>
-          <w:szCs w:val="22"/>
-          <w:rtl w:val="0"/>
+          <w:i/>
+          <w:iCs/>
+          <w:sz w:val="22"/>
+          <w:szCs w:val="22"/>
+        </w:rPr>
+        <w:t>W</w:t>
+      </w:r>
+      <w:r>
+        <w:rPr>
+          <w:sz w:val="22"/>
+          <w:szCs w:val="22"/>
+        </w:rPr>
+        <w:t>(</w:t>
+      </w:r>
+      <w:r>
+        <w:rPr>
+          <w:i/>
+          <w:iCs/>
+          <w:sz w:val="22"/>
+          <w:szCs w:val="22"/>
+        </w:rPr>
+        <w:t>t</w:t>
+      </w:r>
+      <w:r>
+        <w:rPr>
+          <w:sz w:val="22"/>
+          <w:szCs w:val="22"/>
         </w:rPr>
         <w:t xml:space="preserve"> − </w:t>
       </w:r>
       <w:r>
         <w:rPr>
-          <w:b w:val="0"/>
-          <w:bCs w:val="0"/>
-          <w:i w:val="1"/>
-          <w:iCs w:val="1"/>
-          <w:sz w:val="22"/>
-          <w:szCs w:val="22"/>
-          <w:rtl w:val="0"/>
-        </w:rPr>
-        <w:t xml:space="preserve">τ</w:t>
-      </w:r>
-      <w:r>
-        <w:rPr>
-          <w:b w:val="0"/>
-          <w:bCs w:val="0"/>
-          <w:i w:val="0"/>
-          <w:iCs w:val="0"/>
-          <w:sz w:val="22"/>
-          <w:szCs w:val="22"/>
-          <w:rtl w:val="0"/>
-        </w:rPr>
-        <w:t xml:space="preserve">)</w:t>
+          <w:i/>
+          <w:iCs/>
+          <w:sz w:val="22"/>
+          <w:szCs w:val="22"/>
+        </w:rPr>
+        <w:t>τ</w:t>
+      </w:r>
+      <w:r>
+        <w:rPr>
+          <w:sz w:val="22"/>
+          <w:szCs w:val="22"/>
+        </w:rPr>
+        <w:t>)</w:t>
       </w:r>
       <w:r>
         <w:rPr>
@@ -3099,15 +2767,10 @@
       </w:r>
       <w:r>
         <w:rPr>
-          <w:b w:val="0"/>
-          <w:bCs w:val="0"/>
-          <w:i w:val="0"/>
-          <w:iCs w:val="0"/>
-          <w:sz w:val="22"/>
-          <w:szCs w:val="22"/>
-          <w:rtl w:val="0"/>
-        </w:rPr>
-        <w:t xml:space="preserve">(2)</w:t>
+          <w:sz w:val="22"/>
+          <w:szCs w:val="22"/>
+        </w:rPr>
+        <w:t>(2)</w:t>
       </w:r>
     </w:p>
     <w:p>
@@ -3121,268 +2784,182 @@
       </w:pPr>
       <w:r>
         <w:rPr>
-          <w:b w:val="0"/>
-          <w:bCs w:val="0"/>
-          <w:i w:val="0"/>
-          <w:iCs w:val="0"/>
-          <w:sz w:val="22"/>
-          <w:szCs w:val="22"/>
-          <w:rtl w:val="0"/>
+          <w:sz w:val="22"/>
+          <w:szCs w:val="22"/>
         </w:rPr>
         <w:t xml:space="preserve">The hub compares each feature </w:t>
       </w:r>
       <w:r>
         <w:rPr>
-          <w:b w:val="0"/>
-          <w:bCs w:val="0"/>
-          <w:i w:val="1"/>
-          <w:iCs w:val="1"/>
-          <w:sz w:val="22"/>
-          <w:szCs w:val="22"/>
-          <w:rtl w:val="0"/>
-        </w:rPr>
-        <w:t xml:space="preserve">x</w:t>
-      </w:r>
-      <w:r>
-        <w:rPr>
-          <w:b w:val="0"/>
-          <w:bCs w:val="0"/>
-          <w:i w:val="0"/>
-          <w:iCs w:val="0"/>
-          <w:sz w:val="22"/>
-          <w:szCs w:val="22"/>
-          <w:rtl w:val="0"/>
+          <w:i/>
+          <w:iCs/>
+          <w:sz w:val="22"/>
+          <w:szCs w:val="22"/>
+        </w:rPr>
+        <w:t>x</w:t>
+      </w:r>
+      <w:r>
+        <w:rPr>
+          <w:sz w:val="22"/>
+          <w:szCs w:val="22"/>
         </w:rPr>
         <w:t xml:space="preserve"> with the same hive's mean </w:t>
       </w:r>
       <w:r>
         <w:rPr>
-          <w:b w:val="0"/>
-          <w:bCs w:val="0"/>
-          <w:i w:val="1"/>
-          <w:iCs w:val="1"/>
-          <w:sz w:val="22"/>
-          <w:szCs w:val="22"/>
-          <w:rtl w:val="0"/>
-        </w:rPr>
-        <w:t xml:space="preserve">μ</w:t>
-      </w:r>
-      <w:r>
-        <w:rPr>
-          <w:b w:val="0"/>
-          <w:bCs w:val="0"/>
-          <w:i w:val="1"/>
-          <w:iCs w:val="1"/>
+          <w:i/>
+          <w:iCs/>
+          <w:sz w:val="22"/>
+          <w:szCs w:val="22"/>
+        </w:rPr>
+        <w:t>μ</w:t>
+      </w:r>
+      <w:r>
+        <w:rPr>
+          <w:i/>
+          <w:iCs/>
           <w:sz w:val="22"/>
           <w:szCs w:val="22"/>
           <w:vertAlign w:val="subscript"/>
-          <w:rtl w:val="0"/>
-        </w:rPr>
-        <w:t xml:space="preserve">h</w:t>
-      </w:r>
-      <w:r>
-        <w:rPr>
-          <w:b w:val="0"/>
-          <w:bCs w:val="0"/>
-          <w:i w:val="0"/>
-          <w:iCs w:val="0"/>
-          <w:sz w:val="22"/>
-          <w:szCs w:val="22"/>
-          <w:rtl w:val="0"/>
+        </w:rPr>
+        <w:t>h</w:t>
+      </w:r>
+      <w:r>
+        <w:rPr>
+          <w:sz w:val="22"/>
+          <w:szCs w:val="22"/>
         </w:rPr>
         <w:t xml:space="preserve"> and deviation </w:t>
       </w:r>
       <w:r>
         <w:rPr>
-          <w:b w:val="0"/>
-          <w:bCs w:val="0"/>
-          <w:i w:val="1"/>
-          <w:iCs w:val="1"/>
-          <w:sz w:val="22"/>
-          <w:szCs w:val="22"/>
-          <w:rtl w:val="0"/>
-        </w:rPr>
-        <w:t xml:space="preserve">σ</w:t>
-      </w:r>
-      <w:r>
-        <w:rPr>
-          <w:b w:val="0"/>
-          <w:bCs w:val="0"/>
-          <w:i w:val="1"/>
-          <w:iCs w:val="1"/>
+          <w:i/>
+          <w:iCs/>
+          <w:sz w:val="22"/>
+          <w:szCs w:val="22"/>
+        </w:rPr>
+        <w:t>σ</w:t>
+      </w:r>
+      <w:r>
+        <w:rPr>
+          <w:i/>
+          <w:iCs/>
           <w:sz w:val="22"/>
           <w:szCs w:val="22"/>
           <w:vertAlign w:val="subscript"/>
-          <w:rtl w:val="0"/>
-        </w:rPr>
-        <w:t xml:space="preserve">h</w:t>
-      </w:r>
-      <w:r>
-        <w:rPr>
-          <w:b w:val="0"/>
-          <w:bCs w:val="0"/>
-          <w:i w:val="0"/>
-          <w:iCs w:val="0"/>
-          <w:sz w:val="22"/>
-          <w:szCs w:val="22"/>
-          <w:rtl w:val="0"/>
+        </w:rPr>
+        <w:t>h</w:t>
+      </w:r>
+      <w:r>
+        <w:rPr>
+          <w:sz w:val="22"/>
+          <w:szCs w:val="22"/>
         </w:rPr>
         <w:t xml:space="preserve"> at the same hour over the previous 7 days, excluding the current sample; </w:t>
       </w:r>
       <w:r>
         <w:rPr>
-          <w:b w:val="0"/>
-          <w:bCs w:val="0"/>
-          <w:i w:val="1"/>
-          <w:iCs w:val="1"/>
-          <w:sz w:val="22"/>
-          <w:szCs w:val="22"/>
-          <w:rtl w:val="0"/>
-        </w:rPr>
-        <w:t xml:space="preserve">σ</w:t>
-      </w:r>
-      <w:r>
-        <w:rPr>
-          <w:b w:val="0"/>
-          <w:bCs w:val="0"/>
-          <w:i w:val="1"/>
-          <w:iCs w:val="1"/>
+          <w:i/>
+          <w:iCs/>
+          <w:sz w:val="22"/>
+          <w:szCs w:val="22"/>
+        </w:rPr>
+        <w:t>σ</w:t>
+      </w:r>
+      <w:r>
+        <w:rPr>
+          <w:i/>
+          <w:iCs/>
           <w:sz w:val="22"/>
           <w:szCs w:val="22"/>
           <w:vertAlign w:val="subscript"/>
-          <w:rtl w:val="0"/>
-        </w:rPr>
-        <w:t xml:space="preserve">h</w:t>
-      </w:r>
-      <w:r>
-        <w:rPr>
-          <w:b w:val="0"/>
-          <w:bCs w:val="0"/>
-          <w:i w:val="0"/>
-          <w:iCs w:val="0"/>
-          <w:sz w:val="22"/>
-          <w:szCs w:val="22"/>
-          <w:rtl w:val="0"/>
+        </w:rPr>
+        <w:t>h</w:t>
+      </w:r>
+      <w:r>
+        <w:rPr>
+          <w:sz w:val="22"/>
+          <w:szCs w:val="22"/>
         </w:rPr>
         <w:t xml:space="preserve"> has a floor set by the noise level, and no alerts are issued in the first week or for hours with fewer than four valid samples. The hypothesis, inspired by [2] and not a validated implementation of [2] or [3], is that a sustained increase of the 100–300 Hz band energy together with in-hive temperature indicates preparation: a </w:t>
       </w:r>
       <w:r>
         <w:rPr>
-          <w:b w:val="0"/>
-          <w:bCs w:val="0"/>
-          <w:i w:val="1"/>
-          <w:iCs w:val="1"/>
-          <w:sz w:val="22"/>
-          <w:szCs w:val="22"/>
-          <w:rtl w:val="0"/>
-        </w:rPr>
-        <w:t xml:space="preserve">pre-swarm alert</w:t>
-      </w:r>
-      <w:r>
-        <w:rPr>
-          <w:b w:val="0"/>
-          <w:bCs w:val="0"/>
-          <w:i w:val="0"/>
-          <w:iCs w:val="0"/>
-          <w:sz w:val="22"/>
-          <w:szCs w:val="22"/>
-          <w:rtl w:val="0"/>
+          <w:i/>
+          <w:iCs/>
+          <w:sz w:val="22"/>
+          <w:szCs w:val="22"/>
+        </w:rPr>
+        <w:t>pre-swarm alert</w:t>
+      </w:r>
+      <w:r>
+        <w:rPr>
+          <w:sz w:val="22"/>
+          <w:szCs w:val="22"/>
         </w:rPr>
         <w:t xml:space="preserve"> is raised when </w:t>
       </w:r>
       <w:r>
         <w:rPr>
-          <w:b w:val="0"/>
-          <w:bCs w:val="0"/>
-          <w:i w:val="1"/>
-          <w:iCs w:val="1"/>
-          <w:sz w:val="22"/>
-          <w:szCs w:val="22"/>
-          <w:rtl w:val="0"/>
-        </w:rPr>
-        <w:t xml:space="preserve">z</w:t>
-      </w:r>
-      <w:r>
-        <w:rPr>
-          <w:b w:val="0"/>
-          <w:bCs w:val="0"/>
-          <w:i w:val="0"/>
-          <w:iCs w:val="0"/>
-          <w:sz w:val="22"/>
-          <w:szCs w:val="22"/>
-          <w:rtl w:val="0"/>
+          <w:i/>
+          <w:iCs/>
+          <w:sz w:val="22"/>
+          <w:szCs w:val="22"/>
+        </w:rPr>
+        <w:t>z</w:t>
+      </w:r>
+      <w:r>
+        <w:rPr>
+          <w:sz w:val="22"/>
+          <w:szCs w:val="22"/>
         </w:rPr>
         <w:t xml:space="preserve"> &gt; 3 for both in three consecutive scheduled reports. Outside temperature and logged management are recorded as confounders, and a fixed pre-season baseline is also tested, since an adaptive one may absorb a gradual precursor. Alerts are grouped into episodes that end after 24 h without a new alert. A separate </w:t>
       </w:r>
       <w:r>
         <w:rPr>
-          <w:b w:val="0"/>
-          <w:bCs w:val="0"/>
-          <w:i w:val="1"/>
-          <w:iCs w:val="1"/>
-          <w:sz w:val="22"/>
-          <w:szCs w:val="22"/>
-          <w:rtl w:val="0"/>
-        </w:rPr>
-        <w:t xml:space="preserve">departure detector</w:t>
-      </w:r>
-      <w:r>
-        <w:rPr>
-          <w:b w:val="0"/>
-          <w:bCs w:val="0"/>
-          <w:i w:val="0"/>
-          <w:iCs w:val="0"/>
-          <w:sz w:val="22"/>
-          <w:szCs w:val="22"/>
-          <w:rtl w:val="0"/>
+          <w:i/>
+          <w:iCs/>
+          <w:sz w:val="22"/>
+          <w:szCs w:val="22"/>
+        </w:rPr>
+        <w:t>departure detector</w:t>
+      </w:r>
+      <w:r>
+        <w:rPr>
+          <w:sz w:val="22"/>
+          <w:szCs w:val="22"/>
         </w:rPr>
         <w:t xml:space="preserve"> flags Δ</w:t>
       </w:r>
       <w:r>
         <w:rPr>
-          <w:b w:val="0"/>
-          <w:bCs w:val="0"/>
-          <w:i w:val="1"/>
-          <w:iCs w:val="1"/>
-          <w:sz w:val="22"/>
-          <w:szCs w:val="22"/>
-          <w:rtl w:val="0"/>
-        </w:rPr>
-        <w:t xml:space="preserve">W</w:t>
-      </w:r>
-      <w:r>
-        <w:rPr>
-          <w:b w:val="0"/>
-          <w:bCs w:val="0"/>
-          <w:i w:val="0"/>
-          <w:iCs w:val="0"/>
-          <w:sz w:val="22"/>
-          <w:szCs w:val="22"/>
-          <w:rtl w:val="0"/>
+          <w:i/>
+          <w:iCs/>
+          <w:sz w:val="22"/>
+          <w:szCs w:val="22"/>
+        </w:rPr>
+        <w:t>W</w:t>
+      </w:r>
+      <w:r>
+        <w:rPr>
+          <w:sz w:val="22"/>
+          <w:szCs w:val="22"/>
         </w:rPr>
         <w:t xml:space="preserve"> &lt; −0.8 kg within </w:t>
       </w:r>
       <w:r>
         <w:rPr>
-          <w:b w:val="0"/>
-          <w:bCs w:val="0"/>
-          <w:i w:val="1"/>
-          <w:iCs w:val="1"/>
-          <w:sz w:val="22"/>
-          <w:szCs w:val="22"/>
-          <w:rtl w:val="0"/>
-        </w:rPr>
-        <w:t xml:space="preserve">τ</w:t>
-      </w:r>
-      <w:r>
-        <w:rPr>
-          <w:b w:val="0"/>
-          <w:bCs w:val="0"/>
-          <w:i w:val="0"/>
-          <w:iCs w:val="0"/>
-          <w:sz w:val="22"/>
-          <w:szCs w:val="22"/>
-          <w:rtl w:val="0"/>
+          <w:i/>
+          <w:iCs/>
+          <w:sz w:val="22"/>
+          <w:szCs w:val="22"/>
+        </w:rPr>
+        <w:t>τ</w:t>
+      </w:r>
+      <w:r>
+        <w:rPr>
+          <w:sz w:val="22"/>
+          <w:szCs w:val="22"/>
         </w:rPr>
         <w:t xml:space="preserve"> = 30 min together with a vibration burst; it is evaluated on its own and never used as ground truth.</w:t>
       </w:r>
@@ -3400,13 +2977,10 @@
         <w:rPr>
           <w:b/>
           <w:bCs/>
-          <w:i w:val="0"/>
-          <w:iCs w:val="0"/>
-          <w:sz w:val="22"/>
-          <w:szCs w:val="22"/>
-          <w:rtl w:val="0"/>
-        </w:rPr>
-        <w:t xml:space="preserve">3.3 Feasibility</w:t>
+          <w:sz w:val="22"/>
+          <w:szCs w:val="22"/>
+        </w:rPr>
+        <w:t>3.3 Feasibility</w:t>
       </w:r>
     </w:p>
     <w:p>
@@ -3420,121 +2994,82 @@
       </w:pPr>
       <w:r>
         <w:rPr>
-          <w:b w:val="0"/>
-          <w:bCs w:val="0"/>
-          <w:i w:val="1"/>
-          <w:iCs w:val="1"/>
-          <w:sz w:val="22"/>
-          <w:szCs w:val="22"/>
-          <w:rtl w:val="0"/>
-        </w:rPr>
-        <w:t xml:space="preserve">Sensitivity (not yet established):</w:t>
-      </w:r>
-      <w:r>
-        <w:rPr>
-          <w:b w:val="0"/>
-          <w:bCs w:val="0"/>
-          <w:i w:val="0"/>
-          <w:iCs w:val="0"/>
-          <w:sz w:val="22"/>
-          <w:szCs w:val="22"/>
-          <w:rtl w:val="0"/>
+          <w:i/>
+          <w:iCs/>
+          <w:sz w:val="22"/>
+          <w:szCs w:val="22"/>
+        </w:rPr>
+        <w:t>Sensitivity (not yet established):</w:t>
+      </w:r>
+      <w:r>
+        <w:rPr>
+          <w:sz w:val="22"/>
+          <w:szCs w:val="22"/>
         </w:rPr>
         <w:t xml:space="preserve"> comb vibration at night is only 1–5 µm/s² per bin with calibrated accelerometers and ten times weaker on the hive wall [8]. A piezo disc responds through its mounting, loading and input impedance, so the chain is characterized on the bench (controlled excitation, noise, saturation, transfer response, remount repeatability) and on a real hive at night in Stage 2, the go/no-go gate; the microphone, as used in [2], is the second channel and an external audio ADC the fallback. </w:t>
       </w:r>
       <w:r>
         <w:rPr>
-          <w:b w:val="0"/>
-          <w:bCs w:val="0"/>
-          <w:i w:val="1"/>
-          <w:iCs w:val="1"/>
-          <w:sz w:val="22"/>
-          <w:szCs w:val="22"/>
-          <w:rtl w:val="0"/>
-        </w:rPr>
-        <w:t xml:space="preserve">Link:</w:t>
-      </w:r>
-      <w:r>
-        <w:rPr>
-          <w:b w:val="0"/>
-          <w:bCs w:val="0"/>
-          <w:i w:val="0"/>
-          <w:iCs w:val="0"/>
-          <w:sz w:val="22"/>
-          <w:szCs w:val="22"/>
-          <w:rtl w:val="0"/>
+          <w:i/>
+          <w:iCs/>
+          <w:sz w:val="22"/>
+          <w:szCs w:val="22"/>
+        </w:rPr>
+        <w:lastRenderedPageBreak/>
+        <w:t>Link:</w:t>
+      </w:r>
+      <w:r>
+        <w:rPr>
+          <w:sz w:val="22"/>
+          <w:szCs w:val="22"/>
         </w:rPr>
         <w:t xml:space="preserve"> each report (hive ID, timestamp, sequence number, firmware version, quality flags, features) is one ESP-NOW frame; the send callback confirms only MAC-level delivery [9], so the hub returns an application acknowledgement and the node retries up to three times. The hub buffers data during cellular outages and marks stale hives on the dashboard. </w:t>
       </w:r>
       <w:r>
         <w:rPr>
-          <w:b w:val="0"/>
-          <w:bCs w:val="0"/>
-          <w:i w:val="1"/>
-          <w:iCs w:val="1"/>
-          <w:sz w:val="22"/>
-          <w:szCs w:val="22"/>
-          <w:rtl w:val="0"/>
-        </w:rPr>
-        <w:t xml:space="preserve">Weighing:</w:t>
-      </w:r>
-      <w:r>
-        <w:rPr>
-          <w:b w:val="0"/>
-          <w:bCs w:val="0"/>
-          <w:i w:val="0"/>
-          <w:iCs w:val="0"/>
-          <w:sz w:val="22"/>
-          <w:szCs w:val="22"/>
-          <w:rtl w:val="0"/>
+          <w:i/>
+          <w:iCs/>
+          <w:sz w:val="22"/>
+          <w:szCs w:val="22"/>
+        </w:rPr>
+        <w:t>Weighing:</w:t>
+      </w:r>
+      <w:r>
+        <w:rPr>
+          <w:sz w:val="22"/>
+          <w:szCs w:val="22"/>
         </w:rPr>
         <w:t xml:space="preserve"> HX711 noise (≈3 g [10]) is only one contributor; load-cell tolerance, creep, temperature, corner loading, platform stiffness and settling dominate. Detecting a ≥ 0.8 kg drop needs a stable 30-min change, so the ±20 g target applies to change; absolute accuracy is reported. </w:t>
       </w:r>
       <w:r>
         <w:rPr>
-          <w:b w:val="0"/>
-          <w:bCs w:val="0"/>
-          <w:i w:val="1"/>
-          <w:iCs w:val="1"/>
-          <w:sz w:val="22"/>
-          <w:szCs w:val="22"/>
-          <w:rtl w:val="0"/>
-        </w:rPr>
-        <w:t xml:space="preserve">Node power:</w:t>
-      </w:r>
-      <w:r>
-        <w:rPr>
-          <w:b w:val="0"/>
-          <w:bCs w:val="0"/>
-          <w:i w:val="0"/>
-          <w:iCs w:val="0"/>
-          <w:sz w:val="22"/>
-          <w:szCs w:val="22"/>
-          <w:rtl w:val="0"/>
+          <w:i/>
+          <w:iCs/>
+          <w:sz w:val="22"/>
+          <w:szCs w:val="22"/>
+        </w:rPr>
+        <w:t>Node power:</w:t>
+      </w:r>
+      <w:r>
+        <w:rPr>
+          <w:sz w:val="22"/>
+          <w:szCs w:val="22"/>
         </w:rPr>
         <w:t xml:space="preserve"> with </w:t>
       </w:r>
       <w:r>
         <w:rPr>
-          <w:b w:val="0"/>
-          <w:bCs w:val="0"/>
-          <w:i w:val="1"/>
-          <w:iCs w:val="1"/>
-          <w:sz w:val="22"/>
-          <w:szCs w:val="22"/>
-          <w:rtl w:val="0"/>
-        </w:rPr>
-        <w:t xml:space="preserve">A</w:t>
-      </w:r>
-      <w:r>
-        <w:rPr>
-          <w:b w:val="0"/>
-          <w:bCs w:val="0"/>
-          <w:i w:val="0"/>
-          <w:iCs w:val="0"/>
-          <w:sz w:val="22"/>
-          <w:szCs w:val="22"/>
-          <w:rtl w:val="0"/>
+          <w:i/>
+          <w:iCs/>
+          <w:sz w:val="22"/>
+          <w:szCs w:val="22"/>
+        </w:rPr>
+        <w:t>A</w:t>
+      </w:r>
+      <w:r>
+        <w:rPr>
+          <w:sz w:val="22"/>
+          <w:szCs w:val="22"/>
         </w:rPr>
         <w:t xml:space="preserve"> acquisitions per day,</w:t>
       </w:r>
@@ -3559,164 +3094,105 @@
           <w:szCs w:val="22"/>
         </w:rPr>
         <w:tab/>
-      </w:r>
-      <w:r>
-        <w:rPr>
-          <w:b w:val="0"/>
-          <w:bCs w:val="0"/>
-          <w:i w:val="1"/>
-          <w:iCs w:val="1"/>
-          <w:sz w:val="22"/>
-          <w:szCs w:val="22"/>
-          <w:rtl w:val="0"/>
-        </w:rPr>
-        <w:t xml:space="preserve">Ī</w:t>
-      </w:r>
-      <w:r>
-        <w:rPr>
-          <w:b w:val="0"/>
-          <w:bCs w:val="0"/>
-          <w:i w:val="0"/>
-          <w:iCs w:val="0"/>
-          <w:sz w:val="22"/>
-          <w:szCs w:val="22"/>
-          <w:rtl w:val="0"/>
+        <w:t>Ī</w:t>
+      </w:r>
+      <w:r>
+        <w:rPr>
+          <w:sz w:val="22"/>
+          <w:szCs w:val="22"/>
         </w:rPr>
         <w:t xml:space="preserve"> = </w:t>
       </w:r>
       <w:r>
         <w:rPr>
-          <w:b w:val="0"/>
-          <w:bCs w:val="0"/>
-          <w:i w:val="1"/>
-          <w:iCs w:val="1"/>
-          <w:sz w:val="22"/>
-          <w:szCs w:val="22"/>
-          <w:rtl w:val="0"/>
-        </w:rPr>
-        <w:t xml:space="preserve">I</w:t>
-      </w:r>
-      <w:r>
-        <w:rPr>
-          <w:b w:val="0"/>
-          <w:bCs w:val="0"/>
-          <w:i w:val="1"/>
-          <w:iCs w:val="1"/>
+          <w:i/>
+          <w:iCs/>
+          <w:sz w:val="22"/>
+          <w:szCs w:val="22"/>
+        </w:rPr>
+        <w:t>I</w:t>
+      </w:r>
+      <w:r>
+        <w:rPr>
+          <w:i/>
+          <w:iCs/>
           <w:sz w:val="22"/>
           <w:szCs w:val="22"/>
           <w:vertAlign w:val="subscript"/>
-          <w:rtl w:val="0"/>
-        </w:rPr>
-        <w:t xml:space="preserve">0</w:t>
-      </w:r>
-      <w:r>
-        <w:rPr>
-          <w:b w:val="0"/>
-          <w:bCs w:val="0"/>
-          <w:i w:val="0"/>
-          <w:iCs w:val="0"/>
-          <w:sz w:val="22"/>
-          <w:szCs w:val="22"/>
-          <w:rtl w:val="0"/>
+        </w:rPr>
+        <w:t>0</w:t>
+      </w:r>
+      <w:r>
+        <w:rPr>
+          <w:sz w:val="22"/>
+          <w:szCs w:val="22"/>
         </w:rPr>
         <w:t xml:space="preserve"> + </w:t>
       </w:r>
       <w:r>
         <w:rPr>
-          <w:b w:val="0"/>
-          <w:bCs w:val="0"/>
-          <w:i w:val="1"/>
-          <w:iCs w:val="1"/>
-          <w:sz w:val="22"/>
-          <w:szCs w:val="22"/>
-          <w:rtl w:val="0"/>
-        </w:rPr>
-        <w:t xml:space="preserve">A Q</w:t>
-      </w:r>
-      <w:r>
-        <w:rPr>
-          <w:b w:val="0"/>
-          <w:bCs w:val="0"/>
-          <w:i w:val="0"/>
-          <w:iCs w:val="0"/>
-          <w:sz w:val="22"/>
-          <w:szCs w:val="22"/>
-          <w:rtl w:val="0"/>
+          <w:i/>
+          <w:iCs/>
+          <w:sz w:val="22"/>
+          <w:szCs w:val="22"/>
+        </w:rPr>
+        <w:t>A Q</w:t>
+      </w:r>
+      <w:r>
+        <w:rPr>
+          <w:sz w:val="22"/>
+          <w:szCs w:val="22"/>
         </w:rPr>
         <w:t xml:space="preserve"> / 86 400 s,     </w:t>
       </w:r>
       <w:r>
         <w:rPr>
-          <w:b w:val="0"/>
-          <w:bCs w:val="0"/>
-          <w:i w:val="1"/>
-          <w:iCs w:val="1"/>
-          <w:sz w:val="22"/>
-          <w:szCs w:val="22"/>
-          <w:rtl w:val="0"/>
-        </w:rPr>
-        <w:t xml:space="preserve">T</w:t>
-      </w:r>
-      <w:r>
-        <w:rPr>
-          <w:b w:val="0"/>
-          <w:bCs w:val="0"/>
-          <w:i w:val="0"/>
-          <w:iCs w:val="0"/>
+          <w:i/>
+          <w:iCs/>
+          <w:sz w:val="22"/>
+          <w:szCs w:val="22"/>
+        </w:rPr>
+        <w:t>T</w:t>
+      </w:r>
+      <w:r>
+        <w:rPr>
           <w:sz w:val="22"/>
           <w:szCs w:val="22"/>
           <w:vertAlign w:val="subscript"/>
-          <w:rtl w:val="0"/>
-        </w:rPr>
-        <w:t xml:space="preserve">life</w:t>
-      </w:r>
-      <w:r>
-        <w:rPr>
-          <w:b w:val="0"/>
-          <w:bCs w:val="0"/>
-          <w:i w:val="0"/>
-          <w:iCs w:val="0"/>
-          <w:sz w:val="22"/>
-          <w:szCs w:val="22"/>
-          <w:rtl w:val="0"/>
+        </w:rPr>
+        <w:t>life</w:t>
+      </w:r>
+      <w:r>
+        <w:rPr>
+          <w:sz w:val="22"/>
+          <w:szCs w:val="22"/>
         </w:rPr>
         <w:t xml:space="preserve"> = </w:t>
       </w:r>
       <w:r>
         <w:rPr>
-          <w:b w:val="0"/>
-          <w:bCs w:val="0"/>
-          <w:i w:val="1"/>
-          <w:iCs w:val="1"/>
-          <w:sz w:val="22"/>
-          <w:szCs w:val="22"/>
-          <w:rtl w:val="0"/>
-        </w:rPr>
-        <w:t xml:space="preserve">η C</w:t>
-      </w:r>
-      <w:r>
-        <w:rPr>
-          <w:b w:val="0"/>
-          <w:bCs w:val="0"/>
-          <w:i w:val="0"/>
-          <w:iCs w:val="0"/>
-          <w:sz w:val="22"/>
-          <w:szCs w:val="22"/>
-          <w:rtl w:val="0"/>
+          <w:i/>
+          <w:iCs/>
+          <w:sz w:val="22"/>
+          <w:szCs w:val="22"/>
+        </w:rPr>
+        <w:t>η C</w:t>
+      </w:r>
+      <w:r>
+        <w:rPr>
+          <w:sz w:val="22"/>
+          <w:szCs w:val="22"/>
         </w:rPr>
         <w:t xml:space="preserve"> / </w:t>
       </w:r>
       <w:r>
         <w:rPr>
-          <w:b w:val="0"/>
-          <w:bCs w:val="0"/>
-          <w:i w:val="1"/>
-          <w:iCs w:val="1"/>
-          <w:sz w:val="22"/>
-          <w:szCs w:val="22"/>
-          <w:rtl w:val="0"/>
-        </w:rPr>
-        <w:t xml:space="preserve">Ī</w:t>
+          <w:i/>
+          <w:iCs/>
+          <w:sz w:val="22"/>
+          <w:szCs w:val="22"/>
+        </w:rPr>
+        <w:t>Ī</w:t>
       </w:r>
       <w:r>
         <w:rPr>
@@ -3729,15 +3205,10 @@
       </w:r>
       <w:r>
         <w:rPr>
-          <w:b w:val="0"/>
-          <w:bCs w:val="0"/>
-          <w:i w:val="0"/>
-          <w:iCs w:val="0"/>
-          <w:sz w:val="22"/>
-          <w:szCs w:val="22"/>
-          <w:rtl w:val="0"/>
-        </w:rPr>
-        <w:t xml:space="preserve">(3)</w:t>
+          <w:sz w:val="22"/>
+          <w:szCs w:val="22"/>
+        </w:rPr>
+        <w:t>(3)</w:t>
       </w:r>
     </w:p>
     <w:p>
@@ -3751,231 +3222,156 @@
       </w:pPr>
       <w:r>
         <w:rPr>
-          <w:b w:val="0"/>
-          <w:bCs w:val="0"/>
-          <w:i w:val="0"/>
-          <w:iCs w:val="0"/>
-          <w:sz w:val="22"/>
-          <w:szCs w:val="22"/>
-          <w:rtl w:val="0"/>
+          <w:sz w:val="22"/>
+          <w:szCs w:val="22"/>
         </w:rPr>
         <w:t xml:space="preserve">where </w:t>
       </w:r>
       <w:r>
         <w:rPr>
-          <w:b w:val="0"/>
-          <w:bCs w:val="0"/>
-          <w:i w:val="1"/>
-          <w:iCs w:val="1"/>
-          <w:sz w:val="22"/>
-          <w:szCs w:val="22"/>
-          <w:rtl w:val="0"/>
-        </w:rPr>
-        <w:t xml:space="preserve">Q</w:t>
-      </w:r>
-      <w:r>
-        <w:rPr>
-          <w:b w:val="0"/>
-          <w:bCs w:val="0"/>
-          <w:i w:val="0"/>
-          <w:iCs w:val="0"/>
-          <w:sz w:val="22"/>
-          <w:szCs w:val="22"/>
-          <w:rtl w:val="0"/>
+          <w:i/>
+          <w:iCs/>
+          <w:sz w:val="22"/>
+          <w:szCs w:val="22"/>
+        </w:rPr>
+        <w:t>Q</w:t>
+      </w:r>
+      <w:r>
+        <w:rPr>
+          <w:sz w:val="22"/>
+          <w:szCs w:val="22"/>
         </w:rPr>
         <w:t xml:space="preserve"> ≈ 0.3 A·s per acquisition (datasheet estimate, mostly the processor during recording [11]) and </w:t>
       </w:r>
       <w:r>
         <w:rPr>
-          <w:b w:val="0"/>
-          <w:bCs w:val="0"/>
-          <w:i w:val="1"/>
-          <w:iCs w:val="1"/>
-          <w:sz w:val="22"/>
-          <w:szCs w:val="22"/>
-          <w:rtl w:val="0"/>
-        </w:rPr>
-        <w:t xml:space="preserve">I</w:t>
-      </w:r>
-      <w:r>
-        <w:rPr>
-          <w:b w:val="0"/>
-          <w:bCs w:val="0"/>
-          <w:i w:val="1"/>
-          <w:iCs w:val="1"/>
+          <w:i/>
+          <w:iCs/>
+          <w:sz w:val="22"/>
+          <w:szCs w:val="22"/>
+        </w:rPr>
+        <w:t>I</w:t>
+      </w:r>
+      <w:r>
+        <w:rPr>
+          <w:i/>
+          <w:iCs/>
           <w:sz w:val="22"/>
           <w:szCs w:val="22"/>
           <w:vertAlign w:val="subscript"/>
-          <w:rtl w:val="0"/>
-        </w:rPr>
-        <w:t xml:space="preserve">0</w:t>
-      </w:r>
-      <w:r>
-        <w:rPr>
-          <w:b w:val="0"/>
-          <w:bCs w:val="0"/>
-          <w:i w:val="0"/>
-          <w:iCs w:val="0"/>
-          <w:sz w:val="22"/>
-          <w:szCs w:val="22"/>
-          <w:rtl w:val="0"/>
+        </w:rPr>
+        <w:t>0</w:t>
+      </w:r>
+      <w:r>
+        <w:rPr>
+          <w:sz w:val="22"/>
+          <w:szCs w:val="22"/>
         </w:rPr>
         <w:t xml:space="preserve"> ≈ 22 µA always-on (wake circuit, chip sleep, LDO, leakage). With </w:t>
       </w:r>
       <w:r>
         <w:rPr>
-          <w:b w:val="0"/>
-          <w:bCs w:val="0"/>
-          <w:i w:val="1"/>
-          <w:iCs w:val="1"/>
-          <w:sz w:val="22"/>
-          <w:szCs w:val="22"/>
-          <w:rtl w:val="0"/>
-        </w:rPr>
-        <w:t xml:space="preserve">A</w:t>
-      </w:r>
-      <w:r>
-        <w:rPr>
-          <w:b w:val="0"/>
-          <w:bCs w:val="0"/>
-          <w:i w:val="0"/>
-          <w:iCs w:val="0"/>
-          <w:sz w:val="22"/>
-          <w:szCs w:val="22"/>
-          <w:rtl w:val="0"/>
+          <w:i/>
+          <w:iCs/>
+          <w:sz w:val="22"/>
+          <w:szCs w:val="22"/>
+        </w:rPr>
+        <w:t>A</w:t>
+      </w:r>
+      <w:r>
+        <w:rPr>
+          <w:sz w:val="22"/>
+          <w:szCs w:val="22"/>
         </w:rPr>
         <w:t xml:space="preserve"> = 96, </w:t>
       </w:r>
       <w:r>
         <w:rPr>
-          <w:b w:val="0"/>
-          <w:bCs w:val="0"/>
-          <w:i w:val="1"/>
-          <w:iCs w:val="1"/>
-          <w:sz w:val="22"/>
-          <w:szCs w:val="22"/>
-          <w:rtl w:val="0"/>
-        </w:rPr>
-        <w:t xml:space="preserve">Ī</w:t>
-      </w:r>
-      <w:r>
-        <w:rPr>
-          <w:b w:val="0"/>
-          <w:bCs w:val="0"/>
-          <w:i w:val="0"/>
-          <w:iCs w:val="0"/>
-          <w:sz w:val="22"/>
-          <w:szCs w:val="22"/>
-          <w:rtl w:val="0"/>
+          <w:i/>
+          <w:iCs/>
+          <w:sz w:val="22"/>
+          <w:szCs w:val="22"/>
+        </w:rPr>
+        <w:t>Ī</w:t>
+      </w:r>
+      <w:r>
+        <w:rPr>
+          <w:sz w:val="22"/>
+          <w:szCs w:val="22"/>
         </w:rPr>
         <w:t xml:space="preserve"> ≈ 0.36 mA, and 2400 mAh usable (</w:t>
       </w:r>
       <w:r>
         <w:rPr>
-          <w:b w:val="0"/>
-          <w:bCs w:val="0"/>
-          <w:i w:val="1"/>
-          <w:iCs w:val="1"/>
-          <w:sz w:val="22"/>
-          <w:szCs w:val="22"/>
-          <w:rtl w:val="0"/>
-        </w:rPr>
-        <w:t xml:space="preserve">η</w:t>
-      </w:r>
-      <w:r>
-        <w:rPr>
-          <w:b w:val="0"/>
-          <w:bCs w:val="0"/>
-          <w:i w:val="0"/>
-          <w:iCs w:val="0"/>
-          <w:sz w:val="22"/>
-          <w:szCs w:val="22"/>
-          <w:rtl w:val="0"/>
+          <w:i/>
+          <w:iCs/>
+          <w:sz w:val="22"/>
+          <w:szCs w:val="22"/>
+        </w:rPr>
+        <w:t>η</w:t>
+      </w:r>
+      <w:r>
+        <w:rPr>
+          <w:sz w:val="22"/>
+          <w:szCs w:val="22"/>
         </w:rPr>
         <w:t xml:space="preserve"> = 0.8 of 3000 mAh) lasts ≈280 days; six months with a 20% margin holds up to ≈30 event wakes per day. </w:t>
       </w:r>
       <w:r>
         <w:rPr>
-          <w:b w:val="0"/>
-          <w:bCs w:val="0"/>
-          <w:i w:val="1"/>
-          <w:iCs w:val="1"/>
-          <w:sz w:val="22"/>
-          <w:szCs w:val="22"/>
-          <w:rtl w:val="0"/>
-        </w:rPr>
-        <w:t xml:space="preserve">Q</w:t>
-      </w:r>
-      <w:r>
-        <w:rPr>
-          <w:b w:val="0"/>
-          <w:bCs w:val="0"/>
-          <w:i w:val="0"/>
-          <w:iCs w:val="0"/>
-          <w:sz w:val="22"/>
-          <w:szCs w:val="22"/>
-          <w:rtl w:val="0"/>
+          <w:i/>
+          <w:iCs/>
+          <w:sz w:val="22"/>
+          <w:szCs w:val="22"/>
+        </w:rPr>
+        <w:t>Q</w:t>
+      </w:r>
+      <w:r>
+        <w:rPr>
+          <w:sz w:val="22"/>
+          <w:szCs w:val="22"/>
         </w:rPr>
         <w:t xml:space="preserve"> and </w:t>
       </w:r>
       <w:r>
         <w:rPr>
-          <w:b w:val="0"/>
-          <w:bCs w:val="0"/>
-          <w:i w:val="1"/>
-          <w:iCs w:val="1"/>
-          <w:sz w:val="22"/>
-          <w:szCs w:val="22"/>
-          <w:rtl w:val="0"/>
-        </w:rPr>
-        <w:t xml:space="preserve">I</w:t>
-      </w:r>
-      <w:r>
-        <w:rPr>
-          <w:b w:val="0"/>
-          <w:bCs w:val="0"/>
-          <w:i w:val="1"/>
-          <w:iCs w:val="1"/>
+          <w:i/>
+          <w:iCs/>
+          <w:sz w:val="22"/>
+          <w:szCs w:val="22"/>
+        </w:rPr>
+        <w:t>I</w:t>
+      </w:r>
+      <w:r>
+        <w:rPr>
+          <w:i/>
+          <w:iCs/>
           <w:sz w:val="22"/>
           <w:szCs w:val="22"/>
           <w:vertAlign w:val="subscript"/>
-          <w:rtl w:val="0"/>
-        </w:rPr>
-        <w:t xml:space="preserve">0</w:t>
-      </w:r>
-      <w:r>
-        <w:rPr>
-          <w:b w:val="0"/>
-          <w:bCs w:val="0"/>
-          <w:i w:val="0"/>
-          <w:iCs w:val="0"/>
-          <w:sz w:val="22"/>
-          <w:szCs w:val="22"/>
-          <w:rtl w:val="0"/>
+        </w:rPr>
+        <w:t>0</w:t>
+      </w:r>
+      <w:r>
+        <w:rPr>
+          <w:sz w:val="22"/>
+          <w:szCs w:val="22"/>
         </w:rPr>
         <w:t xml:space="preserve"> are then measured over complete cycles, including regulator losses, LEDs and retries. </w:t>
       </w:r>
       <w:r>
         <w:rPr>
-          <w:b w:val="0"/>
-          <w:bCs w:val="0"/>
-          <w:i w:val="1"/>
-          <w:iCs w:val="1"/>
-          <w:sz w:val="22"/>
-          <w:szCs w:val="22"/>
-          <w:rtl w:val="0"/>
-        </w:rPr>
-        <w:t xml:space="preserve">Hub:</w:t>
-      </w:r>
-      <w:r>
-        <w:rPr>
-          <w:b w:val="0"/>
-          <w:bCs w:val="0"/>
-          <w:i w:val="0"/>
-          <w:iCs w:val="0"/>
-          <w:sz w:val="22"/>
-          <w:szCs w:val="22"/>
-          <w:rtl w:val="0"/>
+          <w:i/>
+          <w:iCs/>
+          <w:sz w:val="22"/>
+          <w:szCs w:val="22"/>
+        </w:rPr>
+        <w:t>Hub:</w:t>
+      </w:r>
+      <w:r>
+        <w:rPr>
+          <w:sz w:val="22"/>
+          <w:szCs w:val="22"/>
         </w:rPr>
         <w:t xml:space="preserve"> ≈0.5 W (≈12 Wh/day) against ≈45 Wh/day from the panel, assuming 5 peak-sun hours and 60% conversion; three 18650 cells give about two days without sun, checked by logging the hub battery. Per hive (10 per hub) BeeSense draws ≈50 mW vs. ≈4.2 W in [6], mainly due to intermittent rather than continuous acquisition.</w:t>
       </w:r>
@@ -3993,13 +3389,10 @@
         <w:rPr>
           <w:b/>
           <w:bCs/>
-          <w:i w:val="0"/>
-          <w:iCs w:val="0"/>
-          <w:sz w:val="22"/>
-          <w:szCs w:val="22"/>
-          <w:rtl w:val="0"/>
-        </w:rPr>
-        <w:t xml:space="preserve">3.4 Evaluation Plan</w:t>
+          <w:sz w:val="22"/>
+          <w:szCs w:val="22"/>
+        </w:rPr>
+        <w:t>3.4 Evaluation Plan</w:t>
       </w:r>
     </w:p>
     <w:p>
@@ -4013,193 +3406,129 @@
       </w:pPr>
       <w:r>
         <w:rPr>
-          <w:b w:val="0"/>
-          <w:bCs w:val="0"/>
-          <w:i w:val="1"/>
-          <w:iCs w:val="1"/>
-          <w:sz w:val="22"/>
-          <w:szCs w:val="22"/>
-          <w:rtl w:val="0"/>
-        </w:rPr>
-        <w:t xml:space="preserve">Stages:</w:t>
-      </w:r>
-      <w:r>
-        <w:rPr>
-          <w:b w:val="0"/>
-          <w:bCs w:val="0"/>
-          <w:i w:val="0"/>
-          <w:iCs w:val="0"/>
-          <w:sz w:val="22"/>
-          <w:szCs w:val="22"/>
-          <w:rtl w:val="0"/>
+          <w:i/>
+          <w:iCs/>
+          <w:sz w:val="22"/>
+          <w:szCs w:val="22"/>
+        </w:rPr>
+        <w:t>Stages:</w:t>
+      </w:r>
+      <w:r>
+        <w:rPr>
+          <w:sz w:val="22"/>
+          <w:szCs w:val="22"/>
         </w:rPr>
         <w:t xml:space="preserve"> bench characterization; a short real-hive pilot to fix mounting, features, thresholds and logging; then the system is frozen and prospective data are collected on 3–5 hives at Zippory Honey through spring. </w:t>
       </w:r>
       <w:r>
         <w:rPr>
-          <w:b w:val="0"/>
-          <w:bCs w:val="0"/>
-          <w:i w:val="1"/>
-          <w:iCs w:val="1"/>
-          <w:sz w:val="22"/>
-          <w:szCs w:val="22"/>
-          <w:rtl w:val="0"/>
-        </w:rPr>
-        <w:t xml:space="preserve">Labels:</w:t>
-      </w:r>
-      <w:r>
-        <w:rPr>
-          <w:b w:val="0"/>
-          <w:bCs w:val="0"/>
-          <w:i w:val="0"/>
-          <w:iCs w:val="0"/>
-          <w:sz w:val="22"/>
-          <w:szCs w:val="22"/>
-          <w:rtl w:val="0"/>
+          <w:i/>
+          <w:iCs/>
+          <w:sz w:val="22"/>
+          <w:szCs w:val="22"/>
+        </w:rPr>
+        <w:t>Labels:</w:t>
+      </w:r>
+      <w:r>
+        <w:rPr>
+          <w:sz w:val="22"/>
+          <w:szCs w:val="22"/>
         </w:rPr>
         <w:t xml:space="preserve"> a field log records hive, inspection times, queen cells, observed departures, interventions, feeding and equipment changes, with uncertainty. Preparation (queen cells) and departure are separate labels; a departure is confirmed only by entrance video or documented observation, with an interval when the time is inexact. Colonies where the beekeeper prevents swarming are reported as </w:t>
       </w:r>
       <w:r>
         <w:rPr>
-          <w:b w:val="0"/>
-          <w:bCs w:val="0"/>
-          <w:i w:val="1"/>
-          <w:iCs w:val="1"/>
-          <w:sz w:val="22"/>
-          <w:szCs w:val="22"/>
-          <w:rtl w:val="0"/>
-        </w:rPr>
-        <w:t xml:space="preserve">intervened</w:t>
-      </w:r>
-      <w:r>
-        <w:rPr>
-          <w:b w:val="0"/>
-          <w:bCs w:val="0"/>
-          <w:i w:val="0"/>
-          <w:iCs w:val="0"/>
-          <w:sz w:val="22"/>
-          <w:szCs w:val="22"/>
-          <w:rtl w:val="0"/>
+          <w:i/>
+          <w:iCs/>
+          <w:sz w:val="22"/>
+          <w:szCs w:val="22"/>
+        </w:rPr>
+        <w:t>intervened</w:t>
+      </w:r>
+      <w:r>
+        <w:rPr>
+          <w:sz w:val="22"/>
+          <w:szCs w:val="22"/>
         </w:rPr>
         <w:t xml:space="preserve">, not as false alarms. Controlled mass removal validates the weight-step response only. </w:t>
       </w:r>
       <w:r>
         <w:rPr>
-          <w:b w:val="0"/>
-          <w:bCs w:val="0"/>
-          <w:i w:val="1"/>
-          <w:iCs w:val="1"/>
-          <w:sz w:val="22"/>
-          <w:szCs w:val="22"/>
-          <w:rtl w:val="0"/>
-        </w:rPr>
-        <w:t xml:space="preserve">Matching:</w:t>
-      </w:r>
-      <w:r>
-        <w:rPr>
-          <w:b w:val="0"/>
-          <w:bCs w:val="0"/>
-          <w:i w:val="0"/>
-          <w:iCs w:val="0"/>
-          <w:sz w:val="22"/>
-          <w:szCs w:val="22"/>
-          <w:rtl w:val="0"/>
+          <w:i/>
+          <w:iCs/>
+          <w:sz w:val="22"/>
+          <w:szCs w:val="22"/>
+        </w:rPr>
+        <w:t>Matching:</w:t>
+      </w:r>
+      <w:r>
+        <w:rPr>
+          <w:sz w:val="22"/>
+          <w:szCs w:val="22"/>
         </w:rPr>
         <w:t xml:space="preserve"> the warning window (minimum actionable lead time to maximum horizon, e.g., 30 min–48 h) is agreed with the beekeeper and frozen before final testing. An episode inside the window of a confirmed departure is a TP, an unmatched eligible episode an FP, and an eligible departure without a valid warning an FN, matched one-to-one; precision </w:t>
       </w:r>
       <w:r>
         <w:rPr>
-          <w:b w:val="0"/>
-          <w:bCs w:val="0"/>
-          <w:i w:val="1"/>
-          <w:iCs w:val="1"/>
-          <w:sz w:val="22"/>
-          <w:szCs w:val="22"/>
-          <w:rtl w:val="0"/>
-        </w:rPr>
-        <w:t xml:space="preserve">P</w:t>
-      </w:r>
-      <w:r>
-        <w:rPr>
-          <w:b w:val="0"/>
-          <w:bCs w:val="0"/>
-          <w:i w:val="0"/>
-          <w:iCs w:val="0"/>
-          <w:sz w:val="22"/>
-          <w:szCs w:val="22"/>
-          <w:rtl w:val="0"/>
+          <w:i/>
+          <w:iCs/>
+          <w:sz w:val="22"/>
+          <w:szCs w:val="22"/>
+        </w:rPr>
+        <w:t>P</w:t>
+      </w:r>
+      <w:r>
+        <w:rPr>
+          <w:sz w:val="22"/>
+          <w:szCs w:val="22"/>
         </w:rPr>
         <w:t xml:space="preserve"> = TP/(TP+FP) and recall </w:t>
       </w:r>
       <w:r>
         <w:rPr>
-          <w:b w:val="0"/>
-          <w:bCs w:val="0"/>
-          <w:i w:val="1"/>
-          <w:iCs w:val="1"/>
-          <w:sz w:val="22"/>
-          <w:szCs w:val="22"/>
-          <w:rtl w:val="0"/>
-        </w:rPr>
-        <w:t xml:space="preserve">R</w:t>
-      </w:r>
-      <w:r>
-        <w:rPr>
-          <w:b w:val="0"/>
-          <w:bCs w:val="0"/>
-          <w:i w:val="0"/>
-          <w:iCs w:val="0"/>
-          <w:sz w:val="22"/>
-          <w:szCs w:val="22"/>
-          <w:rtl w:val="0"/>
+          <w:i/>
+          <w:iCs/>
+          <w:sz w:val="22"/>
+          <w:szCs w:val="22"/>
+        </w:rPr>
+        <w:t>R</w:t>
+      </w:r>
+      <w:r>
+        <w:rPr>
+          <w:sz w:val="22"/>
+          <w:szCs w:val="22"/>
         </w:rPr>
         <w:t xml:space="preserve"> = TP/(TP+FN). Outages and periods without reliable labels are not eligible, and total coverage is reported. </w:t>
       </w:r>
       <w:r>
         <w:rPr>
-          <w:b w:val="0"/>
-          <w:bCs w:val="0"/>
-          <w:i w:val="1"/>
-          <w:iCs w:val="1"/>
-          <w:sz w:val="22"/>
-          <w:szCs w:val="22"/>
-          <w:rtl w:val="0"/>
-        </w:rPr>
-        <w:t xml:space="preserve">Evidence:</w:t>
-      </w:r>
-      <w:r>
-        <w:rPr>
-          <w:b w:val="0"/>
-          <w:bCs w:val="0"/>
-          <w:i w:val="0"/>
-          <w:iCs w:val="0"/>
-          <w:sz w:val="22"/>
-          <w:szCs w:val="22"/>
-          <w:rtl w:val="0"/>
+          <w:i/>
+          <w:iCs/>
+          <w:sz w:val="22"/>
+          <w:szCs w:val="22"/>
+        </w:rPr>
+        <w:t>Evidence:</w:t>
+      </w:r>
+      <w:r>
+        <w:rPr>
+          <w:sz w:val="22"/>
+          <w:szCs w:val="22"/>
         </w:rPr>
         <w:t xml:space="preserve"> results list hives, confirmed events, episodes and hive-days. With few events uncertainty is large: detecting 5 of 5 departures gives a one-sided 95% lower bound on recall of ≈55%, so the study may conclude that too few events occurred. </w:t>
       </w:r>
       <w:r>
         <w:rPr>
-          <w:b w:val="0"/>
-          <w:bCs w:val="0"/>
-          <w:i w:val="1"/>
-          <w:iCs w:val="1"/>
-          <w:sz w:val="22"/>
-          <w:szCs w:val="22"/>
-          <w:rtl w:val="0"/>
-        </w:rPr>
-        <w:t xml:space="preserve">Baselines:</w:t>
-      </w:r>
-      <w:r>
-        <w:rPr>
-          <w:b w:val="0"/>
-          <w:bCs w:val="0"/>
-          <w:i w:val="0"/>
-          <w:iCs w:val="0"/>
-          <w:sz w:val="22"/>
-          <w:szCs w:val="22"/>
-          <w:rtl w:val="0"/>
+          <w:i/>
+          <w:iCs/>
+          <w:sz w:val="22"/>
+          <w:szCs w:val="22"/>
+        </w:rPr>
+        <w:t>Baselines:</w:t>
+      </w:r>
+      <w:r>
+        <w:rPr>
+          <w:sz w:val="22"/>
+          <w:szCs w:val="22"/>
         </w:rPr>
         <w:t xml:space="preserve"> weight-only, vibration/audio-only and fused rules, and scheduled-only vs. scheduled + event acquisition, on the same events; later periods of the same hives are reported separately from held-out hives.</w:t>
       </w:r>
@@ -4439,15 +3768,10 @@
       </w:pPr>
       <w:r>
         <w:rPr>
-          <w:b w:val="0"/>
-          <w:bCs w:val="0"/>
-          <w:i w:val="0"/>
-          <w:iCs w:val="0"/>
           <w:sz w:val="20"/>
           <w:szCs w:val="20"/>
-          <w:rtl w:val="0"/>
-        </w:rPr>
-        <w:t xml:space="preserve">[5]</w:t>
+        </w:rPr>
+        <w:t>[5]</w:t>
       </w:r>
       <w:r>
         <w:rPr>
@@ -4455,42 +3779,23 @@
           <w:szCs w:val="20"/>
         </w:rPr>
         <w:tab/>
-      </w:r>
-      <w:r>
-        <w:rPr>
-          <w:b w:val="0"/>
-          <w:bCs w:val="0"/>
-          <w:i w:val="0"/>
-          <w:iCs w:val="0"/>
+        <w:t xml:space="preserve">K. Iqbal, B. Alabdullah, N. Al Mudawi, A. Algarni, A. Jalal, and J. Park, "Empirical analysis of honeybees acoustics as biosensors signals for swarm prediction in beehives," </w:t>
+      </w:r>
+      <w:r>
+        <w:rPr>
+          <w:i/>
+          <w:iCs/>
           <w:sz w:val="20"/>
           <w:szCs w:val="20"/>
-          <w:rtl w:val="0"/>
-        </w:rPr>
-        <w:t xml:space="preserve">K. Iqbal, B. Alabdullah, N. Al Mudawi, A. Algarni, A. Jalal, and J. Park, "Empirical analysis of honeybees acoustics as biosensors signals for swarm prediction in beehives," </w:t>
-      </w:r>
-      <w:r>
-        <w:rPr>
-          <w:b w:val="0"/>
-          <w:bCs w:val="0"/>
-          <w:i w:val="1"/>
-          <w:iCs w:val="1"/>
+        </w:rPr>
+        <w:t>IEEE Access</w:t>
+      </w:r>
+      <w:r>
+        <w:rPr>
           <w:sz w:val="20"/>
           <w:szCs w:val="20"/>
-          <w:rtl w:val="0"/>
-        </w:rPr>
-        <w:t xml:space="preserve">IEEE Access</w:t>
-      </w:r>
-      <w:r>
-        <w:rPr>
-          <w:b w:val="0"/>
-          <w:bCs w:val="0"/>
-          <w:i w:val="0"/>
-          <w:iCs w:val="0"/>
-          <w:sz w:val="20"/>
-          <w:szCs w:val="20"/>
-          <w:rtl w:val="0"/>
-        </w:rPr>
-        <w:t xml:space="preserve">, vol. 12, pp. 148405–148421, 2024, doi: 10.1109/ACCESS.2024.3471895.</w:t>
+        </w:rPr>
+        <w:t>, vol. 12, pp. 148405–148421, 2024, doi: 10.1109/ACCESS.2024.3471895.</w:t>
       </w:r>
     </w:p>
     <w:p>
@@ -7579,7 +6884,6 @@
   <w:style w:type="character" w:default="1" w:styleId="DefaultParagraphFont">
     <w:name w:val="Default Paragraph Font"/>
     <w:uiPriority w:val="1"/>
-    <w:semiHidden/>
     <w:unhideWhenUsed/>
   </w:style>
   <w:style w:type="table" w:default="1" w:styleId="TableNormal">

</xml_diff>